<commit_message>
docs: regenerate project report with static TOC to prevent Word freeze
</commit_message>
<xml_diff>
--- a/Bao_cao_do_an_NLU_Banking.docx
+++ b/Bao_cao_do_an_NLU_Banking.docx
@@ -361,8 +361,502 @@
     </w:p>
     <w:p>
       <w:pPr>
+        <w:spacing w:before="240" w:after="480" w:line="228" w:lineRule="auto"/>
+        <w:jc w:val="center"/>
+        <w:rPr>
+          <w:rFonts w:ascii="Times New Roman" w:hAnsi="Times New Roman" w:cs="Times New Roman"/>
+          <w:b/>
+          <w:sz w:val="32"/>
+        </w:rPr>
+      </w:pPr>
+      <w:r>
+        <w:rPr>
+          <w:rFonts w:ascii="Times New Roman" w:hAnsi="Times New Roman" w:cs="Times New Roman"/>
+          <w:b/>
+          <w:sz w:val="32"/>
+        </w:rPr>
+        <w:t>MỤC LỤC</w:t>
+      </w:r>
+    </w:p>
+    <w:p>
+      <w:pPr>
+        <w:spacing w:after="80" w:line="228" w:lineRule="auto"/>
+        <w:rPr>
+          <w:rFonts w:ascii="Times New Roman" w:hAnsi="Times New Roman" w:cs="Times New Roman"/>
+          <w:b/>
+          <w:sz w:val="26"/>
+        </w:rPr>
+      </w:pPr>
+      <w:r>
+        <w:rPr>
+          <w:rFonts w:ascii="Times New Roman" w:hAnsi="Times New Roman" w:cs="Times New Roman"/>
+          <w:b/>
+          <w:sz w:val="26"/>
+        </w:rPr>
+        <w:t>CHƯƠNG 1. GIỚI THIỆU........................................................................................................3</w:t>
+      </w:r>
+    </w:p>
+    <w:p>
+      <w:pPr>
+        <w:spacing w:after="80" w:line="228" w:lineRule="auto"/>
+        <w:rPr>
+          <w:rFonts w:ascii="Times New Roman" w:hAnsi="Times New Roman" w:cs="Times New Roman"/>
+          <w:sz w:val="26"/>
+        </w:rPr>
+      </w:pPr>
+      <w:r>
+        <w:rPr>
+          <w:rFonts w:ascii="Times New Roman" w:hAnsi="Times New Roman" w:cs="Times New Roman"/>
+          <w:sz w:val="26"/>
+        </w:rPr>
+        <w:t xml:space="preserve">  1.1. Bối cảnh đề tài.........................................................................................................................3</w:t>
+      </w:r>
+    </w:p>
+    <w:p>
+      <w:pPr>
+        <w:spacing w:after="80" w:line="228" w:lineRule="auto"/>
+        <w:rPr>
+          <w:rFonts w:ascii="Times New Roman" w:hAnsi="Times New Roman" w:cs="Times New Roman"/>
+          <w:sz w:val="26"/>
+        </w:rPr>
+      </w:pPr>
+      <w:r>
+        <w:rPr>
+          <w:rFonts w:ascii="Times New Roman" w:hAnsi="Times New Roman" w:cs="Times New Roman"/>
+          <w:sz w:val="26"/>
+        </w:rPr>
+        <w:t xml:space="preserve">  1.2. Lý do chọn đề tài......................................................................................................................3</w:t>
+      </w:r>
+    </w:p>
+    <w:p>
+      <w:pPr>
+        <w:spacing w:after="80" w:line="228" w:lineRule="auto"/>
+        <w:rPr>
+          <w:rFonts w:ascii="Times New Roman" w:hAnsi="Times New Roman" w:cs="Times New Roman"/>
+          <w:sz w:val="26"/>
+        </w:rPr>
+      </w:pPr>
+      <w:r>
+        <w:rPr>
+          <w:rFonts w:ascii="Times New Roman" w:hAnsi="Times New Roman" w:cs="Times New Roman"/>
+          <w:sz w:val="26"/>
+        </w:rPr>
+        <w:t xml:space="preserve">  1.3. Mục tiêu đề tài.........................................................................................................................3</w:t>
+      </w:r>
+    </w:p>
+    <w:p>
+      <w:pPr>
+        <w:spacing w:after="80" w:line="228" w:lineRule="auto"/>
+        <w:rPr>
+          <w:rFonts w:ascii="Times New Roman" w:hAnsi="Times New Roman" w:cs="Times New Roman"/>
+          <w:sz w:val="26"/>
+        </w:rPr>
+      </w:pPr>
+      <w:r>
+        <w:rPr>
+          <w:rFonts w:ascii="Times New Roman" w:hAnsi="Times New Roman" w:cs="Times New Roman"/>
+          <w:sz w:val="26"/>
+        </w:rPr>
+        <w:t xml:space="preserve">  1.4. Phạm vi đề tài...........................................................................................................................3</w:t>
+      </w:r>
+    </w:p>
+    <w:p>
+      <w:pPr>
+        <w:spacing w:line="228" w:lineRule="auto"/>
+        <w:rPr>
+          <w:rFonts w:ascii="Times New Roman" w:hAnsi="Times New Roman" w:cs="Times New Roman"/>
+          <w:sz w:val="26"/>
+        </w:rPr>
+      </w:pPr>
+      <w:r>
+        <w:rPr>
+          <w:rFonts w:ascii="Times New Roman" w:hAnsi="Times New Roman" w:cs="Times New Roman"/>
+          <w:sz w:val="26"/>
+        </w:rPr>
+        <w:t xml:space="preserve">  1.5. Đối tượng sử dụng....................................................................................................................3</w:t>
+      </w:r>
+    </w:p>
+    <w:p>
+      <w:pPr>
+        <w:spacing w:after="80" w:line="228" w:lineRule="auto"/>
+        <w:rPr>
+          <w:rFonts w:ascii="Times New Roman" w:hAnsi="Times New Roman" w:cs="Times New Roman"/>
+          <w:b/>
+          <w:sz w:val="26"/>
+        </w:rPr>
+      </w:pPr>
+      <w:r>
+        <w:rPr>
+          <w:rFonts w:ascii="Times New Roman" w:hAnsi="Times New Roman" w:cs="Times New Roman"/>
+          <w:b/>
+          <w:sz w:val="26"/>
+        </w:rPr>
+        <w:t>CHƯƠNG 2. PHÂN TÍCH YÊU CẦU...................................................................................................5</w:t>
+      </w:r>
+    </w:p>
+    <w:p>
+      <w:pPr>
+        <w:spacing w:after="80" w:line="228" w:lineRule="auto"/>
+        <w:rPr>
+          <w:rFonts w:ascii="Times New Roman" w:hAnsi="Times New Roman" w:cs="Times New Roman"/>
+          <w:sz w:val="26"/>
+        </w:rPr>
+      </w:pPr>
+      <w:r>
+        <w:rPr>
+          <w:rFonts w:ascii="Times New Roman" w:hAnsi="Times New Roman" w:cs="Times New Roman"/>
+          <w:sz w:val="26"/>
+        </w:rPr>
+        <w:t xml:space="preserve">  2.1. Bài toán nghiệp vụ......................................................................................................................5</w:t>
+      </w:r>
+    </w:p>
+    <w:p>
+      <w:pPr>
+        <w:spacing w:after="80" w:line="228" w:lineRule="auto"/>
+        <w:rPr>
+          <w:rFonts w:ascii="Times New Roman" w:hAnsi="Times New Roman" w:cs="Times New Roman"/>
+          <w:sz w:val="26"/>
+        </w:rPr>
+      </w:pPr>
+      <w:r>
+        <w:rPr>
+          <w:rFonts w:ascii="Times New Roman" w:hAnsi="Times New Roman" w:cs="Times New Roman"/>
+          <w:sz w:val="26"/>
+        </w:rPr>
+        <w:t xml:space="preserve">  2.2. Yêu cầu chức năng......................................................................................................................5</w:t>
+      </w:r>
+    </w:p>
+    <w:p>
+      <w:pPr>
+        <w:spacing w:after="80" w:line="228" w:lineRule="auto"/>
+        <w:rPr>
+          <w:rFonts w:ascii="Times New Roman" w:hAnsi="Times New Roman" w:cs="Times New Roman"/>
+          <w:sz w:val="26"/>
+        </w:rPr>
+      </w:pPr>
+      <w:r>
+        <w:rPr>
+          <w:rFonts w:ascii="Times New Roman" w:hAnsi="Times New Roman" w:cs="Times New Roman"/>
+          <w:sz w:val="26"/>
+        </w:rPr>
+        <w:t xml:space="preserve">  2.3. Yêu cầu phi chức năng..................................................................................................................5</w:t>
+      </w:r>
+    </w:p>
+    <w:p>
+      <w:pPr>
+        <w:spacing w:line="228" w:lineRule="auto"/>
+        <w:rPr>
+          <w:rFonts w:ascii="Times New Roman" w:hAnsi="Times New Roman" w:cs="Times New Roman"/>
+          <w:sz w:val="26"/>
+        </w:rPr>
+      </w:pPr>
+      <w:r>
+        <w:rPr>
+          <w:rFonts w:ascii="Times New Roman" w:hAnsi="Times New Roman" w:cs="Times New Roman"/>
+          <w:sz w:val="26"/>
+        </w:rPr>
+        <w:t xml:space="preserve">  2.4. Phân loại người dùng (Actor).........................................................................................................6</w:t>
+      </w:r>
+    </w:p>
+    <w:p>
+      <w:pPr>
+        <w:spacing w:after="80" w:line="228" w:lineRule="auto"/>
+        <w:rPr>
+          <w:rFonts w:ascii="Times New Roman" w:hAnsi="Times New Roman" w:cs="Times New Roman"/>
+          <w:b/>
+          <w:sz w:val="26"/>
+        </w:rPr>
+      </w:pPr>
+      <w:r>
+        <w:rPr>
+          <w:rFonts w:ascii="Times New Roman" w:hAnsi="Times New Roman" w:cs="Times New Roman"/>
+          <w:b/>
+          <w:sz w:val="26"/>
+        </w:rPr>
+        <w:t>CHƯƠNG 3. THIẾT KẾ HỆ THỐNG....................................................................................................7</w:t>
+      </w:r>
+    </w:p>
+    <w:p>
+      <w:pPr>
+        <w:spacing w:after="80" w:line="228" w:lineRule="auto"/>
+        <w:rPr>
+          <w:rFonts w:ascii="Times New Roman" w:hAnsi="Times New Roman" w:cs="Times New Roman"/>
+          <w:sz w:val="26"/>
+        </w:rPr>
+      </w:pPr>
+      <w:r>
+        <w:rPr>
+          <w:rFonts w:ascii="Times New Roman" w:hAnsi="Times New Roman" w:cs="Times New Roman"/>
+          <w:sz w:val="26"/>
+        </w:rPr>
+        <w:t xml:space="preserve">  3.1. Kiến trúc tổng thể......................................................................................................................7</w:t>
+      </w:r>
+    </w:p>
+    <w:p>
+      <w:pPr>
+        <w:spacing w:after="80" w:line="228" w:lineRule="auto"/>
+        <w:rPr>
+          <w:rFonts w:ascii="Times New Roman" w:hAnsi="Times New Roman" w:cs="Times New Roman"/>
+          <w:sz w:val="26"/>
+        </w:rPr>
+      </w:pPr>
+      <w:r>
+        <w:rPr>
+          <w:rFonts w:ascii="Times New Roman" w:hAnsi="Times New Roman" w:cs="Times New Roman"/>
+          <w:sz w:val="26"/>
+        </w:rPr>
+        <w:t xml:space="preserve">  3.2. Thiết kế Cơ sở dữ liệu (Database Design).........................................................................................7</w:t>
+      </w:r>
+    </w:p>
+    <w:p>
+      <w:pPr>
+        <w:spacing w:after="80" w:line="228" w:lineRule="auto"/>
+        <w:rPr>
+          <w:rFonts w:ascii="Times New Roman" w:hAnsi="Times New Roman" w:cs="Times New Roman"/>
+          <w:sz w:val="26"/>
+        </w:rPr>
+      </w:pPr>
+      <w:r>
+        <w:rPr>
+          <w:rFonts w:ascii="Times New Roman" w:hAnsi="Times New Roman" w:cs="Times New Roman"/>
+          <w:sz w:val="26"/>
+        </w:rPr>
+        <w:t xml:space="preserve">  3.3. Quy trình xác thực bảo mật và gọi API............................................................................................8</w:t>
+      </w:r>
+    </w:p>
+    <w:p>
+      <w:pPr>
+        <w:spacing w:line="228" w:lineRule="auto"/>
+        <w:rPr>
+          <w:rFonts w:ascii="Times New Roman" w:hAnsi="Times New Roman" w:cs="Times New Roman"/>
+          <w:sz w:val="26"/>
+        </w:rPr>
+      </w:pPr>
+      <w:r>
+        <w:rPr>
+          <w:rFonts w:ascii="Times New Roman" w:hAnsi="Times New Roman" w:cs="Times New Roman"/>
+          <w:sz w:val="26"/>
+        </w:rPr>
+        <w:t xml:space="preserve">  3.4. Công nghệ sử dụng......................................................................................................................8</w:t>
+      </w:r>
+    </w:p>
+    <w:p>
+      <w:pPr>
+        <w:spacing w:after="80" w:line="228" w:lineRule="auto"/>
+        <w:rPr>
+          <w:rFonts w:ascii="Times New Roman" w:hAnsi="Times New Roman" w:cs="Times New Roman"/>
+          <w:b/>
+          <w:sz w:val="26"/>
+        </w:rPr>
+      </w:pPr>
+      <w:r>
+        <w:rPr>
+          <w:rFonts w:ascii="Times New Roman" w:hAnsi="Times New Roman" w:cs="Times New Roman"/>
+          <w:b/>
+          <w:sz w:val="26"/>
+        </w:rPr>
+        <w:t>CHƯƠNG 4. CÀI ĐẶT VÀ TRIỂN KHAI...............................................................................................9</w:t>
+      </w:r>
+    </w:p>
+    <w:p>
+      <w:pPr>
+        <w:spacing w:after="80" w:line="228" w:lineRule="auto"/>
+        <w:rPr>
+          <w:rFonts w:ascii="Times New Roman" w:hAnsi="Times New Roman" w:cs="Times New Roman"/>
+          <w:sz w:val="26"/>
+        </w:rPr>
+      </w:pPr>
+      <w:r>
+        <w:rPr>
+          <w:rFonts w:ascii="Times New Roman" w:hAnsi="Times New Roman" w:cs="Times New Roman"/>
+          <w:sz w:val="26"/>
+        </w:rPr>
+        <w:t xml:space="preserve">  4.1. Cấu trúc mã nguồn (Project Structure)............................................................................................9</w:t>
+      </w:r>
+    </w:p>
+    <w:p>
+      <w:pPr>
+        <w:spacing w:after="80" w:line="228" w:lineRule="auto"/>
+        <w:rPr>
+          <w:rFonts w:ascii="Times New Roman" w:hAnsi="Times New Roman" w:cs="Times New Roman"/>
+          <w:sz w:val="26"/>
+        </w:rPr>
+      </w:pPr>
+      <w:r>
+        <w:rPr>
+          <w:rFonts w:ascii="Times New Roman" w:hAnsi="Times New Roman" w:cs="Times New Roman"/>
+          <w:sz w:val="26"/>
+        </w:rPr>
+        <w:t xml:space="preserve">  4.2. Các chức năng chính được cài đặt..................................................................................................9</w:t>
+      </w:r>
+    </w:p>
+    <w:p>
+      <w:pPr>
+        <w:spacing w:line="228" w:lineRule="auto"/>
+        <w:rPr>
+          <w:rFonts w:ascii="Times New Roman" w:hAnsi="Times New Roman" w:cs="Times New Roman"/>
+          <w:sz w:val="26"/>
+        </w:rPr>
+      </w:pPr>
+      <w:r>
+        <w:rPr>
+          <w:rFonts w:ascii="Times New Roman" w:hAnsi="Times New Roman" w:cs="Times New Roman"/>
+          <w:sz w:val="26"/>
+        </w:rPr>
+        <w:t xml:space="preserve">  4.3. Cài đặt triển khai trên máy tính thử nghiệm....................................................................................10</w:t>
+      </w:r>
+    </w:p>
+    <w:p>
+      <w:pPr>
+        <w:spacing w:after="80" w:line="228" w:lineRule="auto"/>
+        <w:rPr>
+          <w:rFonts w:ascii="Times New Roman" w:hAnsi="Times New Roman" w:cs="Times New Roman"/>
+          <w:b/>
+          <w:sz w:val="26"/>
+        </w:rPr>
+      </w:pPr>
+      <w:r>
+        <w:rPr>
+          <w:rFonts w:ascii="Times New Roman" w:hAnsi="Times New Roman" w:cs="Times New Roman"/>
+          <w:b/>
+          <w:sz w:val="26"/>
+        </w:rPr>
+        <w:t>CHƯƠNG 5. KẾT LUẬN VÀ HƯỚNG PHÁT TRIỂN...............................................................................11</w:t>
+      </w:r>
+    </w:p>
+    <w:p>
+      <w:pPr>
+        <w:spacing w:after="80" w:line="228" w:lineRule="auto"/>
+        <w:rPr>
+          <w:rFonts w:ascii="Times New Roman" w:hAnsi="Times New Roman" w:cs="Times New Roman"/>
+          <w:sz w:val="26"/>
+        </w:rPr>
+      </w:pPr>
+      <w:r>
+        <w:rPr>
+          <w:rFonts w:ascii="Times New Roman" w:hAnsi="Times New Roman" w:cs="Times New Roman"/>
+          <w:sz w:val="26"/>
+        </w:rPr>
+        <w:t xml:space="preserve">  5.1. Kết quả đạt được.........................................................................................................................11</w:t>
+      </w:r>
+    </w:p>
+    <w:p>
+      <w:pPr>
+        <w:spacing w:after="80" w:line="228" w:lineRule="auto"/>
+        <w:rPr>
+          <w:rFonts w:ascii="Times New Roman" w:hAnsi="Times New Roman" w:cs="Times New Roman"/>
+          <w:sz w:val="26"/>
+        </w:rPr>
+      </w:pPr>
+      <w:r>
+        <w:rPr>
+          <w:rFonts w:ascii="Times New Roman" w:hAnsi="Times New Roman" w:cs="Times New Roman"/>
+          <w:sz w:val="26"/>
+        </w:rPr>
+        <w:t xml:space="preserve">  5.2. Ưu điểm của hệ thống...................................................................................................................11</w:t>
+      </w:r>
+    </w:p>
+    <w:p>
+      <w:pPr>
+        <w:spacing w:after="80" w:line="228" w:lineRule="auto"/>
+        <w:jc w:val="both"/>
+        <w:rPr>
+          <w:rFonts w:ascii="Times New Roman" w:hAnsi="Times New Roman" w:cs="Times New Roman"/>
+          <w:sz w:val="26"/>
+        </w:rPr>
+      </w:pPr>
+      <w:r>
+        <w:rPr>
+          <w:rFonts w:ascii="Times New Roman" w:hAnsi="Times New Roman" w:cs="Times New Roman"/>
+          <w:sz w:val="26"/>
+        </w:rPr>
+        <w:t xml:space="preserve">  - Kiến trúc Microservices hiện đại, giúp dễ dàng nâng cấp, mở rộng và bảo trì từng module dịch vụ mà không ảnh hưởng đến toàn bộ hệ thống.</w:t>
+      </w:r>
+    </w:p>
+    <w:p>
+      <w:pPr>
+        <w:spacing w:after="80" w:line="228" w:lineRule="auto"/>
+        <w:jc w:val="both"/>
+        <w:rPr>
+          <w:rFonts w:ascii="Times New Roman" w:hAnsi="Times New Roman" w:cs="Times New Roman"/>
+          <w:sz w:val="26"/>
+        </w:rPr>
+      </w:pPr>
+      <w:r>
+        <w:rPr>
+          <w:rFonts w:ascii="Times New Roman" w:hAnsi="Times New Roman" w:cs="Times New Roman"/>
+          <w:sz w:val="26"/>
+        </w:rPr>
+        <w:t xml:space="preserve">  - Bảo mật vững chắc thông qua xác thực phân tán dựa trên giao thức OAuth2/OIDC chuẩn công nghiệp được quản lý bởi Keycloak.</w:t>
+      </w:r>
+    </w:p>
+    <w:p>
+      <w:pPr>
+        <w:spacing w:after="120" w:line="228" w:lineRule="auto"/>
+        <w:jc w:val="both"/>
+        <w:rPr>
+          <w:rFonts w:ascii="Times New Roman" w:hAnsi="Times New Roman" w:cs="Times New Roman"/>
+          <w:sz w:val="26"/>
+        </w:rPr>
+      </w:pPr>
+      <w:r>
+        <w:rPr>
+          <w:rFonts w:ascii="Times New Roman" w:hAnsi="Times New Roman" w:cs="Times New Roman"/>
+          <w:sz w:val="26"/>
+        </w:rPr>
+        <w:t xml:space="preserve">  - Hỗ trợ tạo và quét mã QR chuyển khoản tiện lợi, phù hợp với xu thế Fintech hiện nay.</w:t>
+      </w:r>
+    </w:p>
+    <w:p>
+      <w:pPr>
+        <w:spacing w:after="80" w:line="228" w:lineRule="auto"/>
+        <w:rPr>
+          <w:rFonts w:ascii="Times New Roman" w:hAnsi="Times New Roman" w:cs="Times New Roman"/>
+          <w:sz w:val="26"/>
+        </w:rPr>
+      </w:pPr>
+      <w:r>
+        <w:rPr>
+          <w:rFonts w:ascii="Times New Roman" w:hAnsi="Times New Roman" w:cs="Times New Roman"/>
+          <w:sz w:val="26"/>
+        </w:rPr>
+        <w:t xml:space="preserve">  5.3. Hạn chế còn tồn tại......................................................................................................................11</w:t>
+      </w:r>
+    </w:p>
+    <w:p>
+      <w:pPr>
+        <w:spacing w:after="120" w:line="228" w:lineRule="auto"/>
+        <w:rPr>
+          <w:rFonts w:ascii="Times New Roman" w:hAnsi="Times New Roman" w:cs="Times New Roman"/>
+          <w:sz w:val="26"/>
+        </w:rPr>
+      </w:pPr>
+      <w:r>
+        <w:rPr>
+          <w:rFonts w:ascii="Times New Roman" w:hAnsi="Times New Roman" w:cs="Times New Roman"/>
+          <w:sz w:val="26"/>
+        </w:rPr>
+        <w:t xml:space="preserve">  5.4. Hướng phát triển tương lai............................................................................................................12</w:t>
+      </w:r>
+    </w:p>
+    <w:p>
+      <w:pPr>
+        <w:rPr>
+          <w:rFonts w:ascii="Times New Roman" w:hAnsi="Times New Roman" w:cs="Times New Roman"/>
+          <w:sz w:val="26"/>
+        </w:rPr>
+      </w:pPr>
+      <w:r>
+        <w:rPr>
+          <w:rFonts w:ascii="Times New Roman" w:hAnsi="Times New Roman" w:cs="Times New Roman"/>
+          <w:sz w:val="26"/>
+        </w:rPr>
+        <w:br w:type="page"/>
+      </w:r>
+    </w:p>
+    <w:p>
+      <w:pPr>
         <w:spacing w:before="240" w:after="240" w:line="228" w:lineRule="auto"/>
-        <w:jc w:val="center"/>
         <w:rPr>
           <w:rFonts w:ascii="Times New Roman" w:eastAsiaTheme="majorEastAsia" w:hAnsi="Times New Roman" w:cs="Times New Roman"/>
           <w:b/>
@@ -379,45 +873,6 @@
           <w:sz w:val="32"/>
           <w:szCs w:val="40"/>
         </w:rPr>
-        <w:t>MỤC LỤC</w:t>
-      </w:r>
-    </w:p>
-    <w:p>
-      <w:pPr>
-        <w:rPr>
-          <w:rFonts w:ascii="Times New Roman" w:hAnsi="Times New Roman" w:cs="Times New Roman"/>
-          <w:b/>
-          <w:sz w:val="32"/>
-        </w:rPr>
-      </w:pPr>
-      <w:r>
-        <w:rPr>
-          <w:rFonts w:ascii="Times New Roman" w:hAnsi="Times New Roman" w:cs="Times New Roman"/>
-          <w:b/>
-          <w:sz w:val="32"/>
-        </w:rPr>
-        <w:br w:type="page"/>
-      </w:r>
-    </w:p>
-    <w:p>
-      <w:pPr>
-        <w:spacing w:before="240" w:after="240" w:line="228" w:lineRule="auto"/>
-        <w:rPr>
-          <w:rFonts w:ascii="Times New Roman" w:eastAsiaTheme="majorEastAsia" w:hAnsi="Times New Roman" w:cs="Times New Roman"/>
-          <w:b/>
-          <w:color w:val="0F4761" w:themeColor="accent1" w:themeShade="BF"/>
-          <w:sz w:val="32"/>
-          <w:szCs w:val="40"/>
-        </w:rPr>
-      </w:pPr>
-      <w:r>
-        <w:rPr>
-          <w:rFonts w:ascii="Times New Roman" w:eastAsiaTheme="majorEastAsia" w:hAnsi="Times New Roman" w:cs="Times New Roman"/>
-          <w:b/>
-          <w:color w:val="0F4761" w:themeColor="accent1" w:themeShade="BF"/>
-          <w:sz w:val="32"/>
-          <w:szCs w:val="40"/>
-        </w:rPr>
         <w:t>CHƯƠNG 1. GIỚI THIỆU</w:t>
       </w:r>
     </w:p>
@@ -496,7 +951,7 @@
           <w:rFonts w:ascii="Times New Roman" w:hAnsi="Times New Roman" w:cs="Times New Roman"/>
           <w:sz w:val="26"/>
         </w:rPr>
-        <w:t>Đề tài 'Phát triển Ứng dụng Ngân hàng Di động NLU Banking App' được nhóm lựa chọn nhằm xây dựng một hệ thống ngân hàng mô phỏng thực tế. Dự án kết hợp kiến trúc phân tán Microservices ở phía backend và ứng dụng di động native trên hệ điều hành Android. Việc xây dựng một hệ thống microservices hoàn chỉnh giúp nhóm nghiên cứu sâu sắc về tính độc lập giữa các dịch vụ, quy trình xác thực phân tán OAuth2 qua Keycloak và cơ chế giao tiếp API an toàn giữa ứng dụng di động và hệ thống máy chủ.</w:t>
+        <w:t>Đề tài 'Phát triển Ứng dụng Ngân hàng Di động NLU Banking App' được nhóm lựa chọn nhằm xây dựng một hệ thống ngân hàng mô phỏng thực tế. Dự án kết hợp kiến trúc phân tán Microservices ở phía backend và ứng dụng di động native trên hệ điều hành Android. Việc xây dựng một hệ thống microservices hoàn chỉnh giúp nhóm nghiên cứu sâu sắc về tính độc lập giữa các dịch vụ, quy trình xác thực phân tán OAuth2 qua Keycloak và cơ chế giao tiếp API an sau giữa ứng dụng di động và hệ thống máy chủ.</w:t>
       </w:r>
     </w:p>
     <w:p>
@@ -2351,7 +2806,7 @@
     <w:link w:val="Heading1Char"/>
     <w:uiPriority w:val="9"/>
     <w:qFormat/>
-    <w:rsid w:val="00BA11E0"/>
+    <w:rsid w:val="00AE5A20"/>
     <w:pPr>
       <w:keepNext/>
       <w:keepLines/>
@@ -2373,7 +2828,7 @@
     <w:uiPriority w:val="9"/>
     <w:unhideWhenUsed/>
     <w:qFormat/>
-    <w:rsid w:val="00BA11E0"/>
+    <w:rsid w:val="00AE5A20"/>
     <w:pPr>
       <w:keepNext/>
       <w:keepLines/>
@@ -2396,7 +2851,7 @@
     <w:semiHidden/>
     <w:unhideWhenUsed/>
     <w:qFormat/>
-    <w:rsid w:val="00BA11E0"/>
+    <w:rsid w:val="00AE5A20"/>
     <w:pPr>
       <w:keepNext/>
       <w:keepLines/>
@@ -2419,7 +2874,7 @@
     <w:semiHidden/>
     <w:unhideWhenUsed/>
     <w:qFormat/>
-    <w:rsid w:val="00BA11E0"/>
+    <w:rsid w:val="00AE5A20"/>
     <w:pPr>
       <w:keepNext/>
       <w:keepLines/>
@@ -2442,7 +2897,7 @@
     <w:semiHidden/>
     <w:unhideWhenUsed/>
     <w:qFormat/>
-    <w:rsid w:val="00BA11E0"/>
+    <w:rsid w:val="00AE5A20"/>
     <w:pPr>
       <w:keepNext/>
       <w:keepLines/>
@@ -2463,7 +2918,7 @@
     <w:semiHidden/>
     <w:unhideWhenUsed/>
     <w:qFormat/>
-    <w:rsid w:val="00BA11E0"/>
+    <w:rsid w:val="00AE5A20"/>
     <w:pPr>
       <w:keepNext/>
       <w:keepLines/>
@@ -2486,7 +2941,7 @@
     <w:semiHidden/>
     <w:unhideWhenUsed/>
     <w:qFormat/>
-    <w:rsid w:val="00BA11E0"/>
+    <w:rsid w:val="00AE5A20"/>
     <w:pPr>
       <w:keepNext/>
       <w:keepLines/>
@@ -2507,7 +2962,7 @@
     <w:semiHidden/>
     <w:unhideWhenUsed/>
     <w:qFormat/>
-    <w:rsid w:val="00BA11E0"/>
+    <w:rsid w:val="00AE5A20"/>
     <w:pPr>
       <w:keepNext/>
       <w:keepLines/>
@@ -2530,7 +2985,7 @@
     <w:semiHidden/>
     <w:unhideWhenUsed/>
     <w:qFormat/>
-    <w:rsid w:val="00BA11E0"/>
+    <w:rsid w:val="00AE5A20"/>
     <w:pPr>
       <w:keepNext/>
       <w:keepLines/>
@@ -2574,7 +3029,7 @@
     <w:basedOn w:val="DefaultParagraphFont"/>
     <w:link w:val="Heading1"/>
     <w:uiPriority w:val="9"/>
-    <w:rsid w:val="00BA11E0"/>
+    <w:rsid w:val="00AE5A20"/>
     <w:rPr>
       <w:rFonts w:asciiTheme="majorHAnsi" w:eastAsiaTheme="majorEastAsia" w:hAnsiTheme="majorHAnsi" w:cstheme="majorBidi"/>
       <w:color w:val="0F4761" w:themeColor="accent1" w:themeShade="BF"/>
@@ -2587,7 +3042,7 @@
     <w:basedOn w:val="DefaultParagraphFont"/>
     <w:link w:val="Heading2"/>
     <w:uiPriority w:val="9"/>
-    <w:rsid w:val="00BA11E0"/>
+    <w:rsid w:val="00AE5A20"/>
     <w:rPr>
       <w:rFonts w:asciiTheme="majorHAnsi" w:eastAsiaTheme="majorEastAsia" w:hAnsiTheme="majorHAnsi" w:cstheme="majorBidi"/>
       <w:color w:val="0F4761" w:themeColor="accent1" w:themeShade="BF"/>
@@ -2601,7 +3056,7 @@
     <w:link w:val="Heading3"/>
     <w:uiPriority w:val="9"/>
     <w:semiHidden/>
-    <w:rsid w:val="00BA11E0"/>
+    <w:rsid w:val="00AE5A20"/>
     <w:rPr>
       <w:rFonts w:eastAsiaTheme="majorEastAsia" w:cstheme="majorBidi"/>
       <w:color w:val="0F4761" w:themeColor="accent1" w:themeShade="BF"/>
@@ -2615,7 +3070,7 @@
     <w:link w:val="Heading4"/>
     <w:uiPriority w:val="9"/>
     <w:semiHidden/>
-    <w:rsid w:val="00BA11E0"/>
+    <w:rsid w:val="00AE5A20"/>
     <w:rPr>
       <w:rFonts w:eastAsiaTheme="majorEastAsia" w:cstheme="majorBidi"/>
       <w:i/>
@@ -2629,7 +3084,7 @@
     <w:link w:val="Heading5"/>
     <w:uiPriority w:val="9"/>
     <w:semiHidden/>
-    <w:rsid w:val="00BA11E0"/>
+    <w:rsid w:val="00AE5A20"/>
     <w:rPr>
       <w:rFonts w:eastAsiaTheme="majorEastAsia" w:cstheme="majorBidi"/>
       <w:color w:val="0F4761" w:themeColor="accent1" w:themeShade="BF"/>
@@ -2641,7 +3096,7 @@
     <w:link w:val="Heading6"/>
     <w:uiPriority w:val="9"/>
     <w:semiHidden/>
-    <w:rsid w:val="00BA11E0"/>
+    <w:rsid w:val="00AE5A20"/>
     <w:rPr>
       <w:rFonts w:eastAsiaTheme="majorEastAsia" w:cstheme="majorBidi"/>
       <w:i/>
@@ -2655,7 +3110,7 @@
     <w:link w:val="Heading7"/>
     <w:uiPriority w:val="9"/>
     <w:semiHidden/>
-    <w:rsid w:val="00BA11E0"/>
+    <w:rsid w:val="00AE5A20"/>
     <w:rPr>
       <w:rFonts w:eastAsiaTheme="majorEastAsia" w:cstheme="majorBidi"/>
       <w:color w:val="595959" w:themeColor="text1" w:themeTint="A6"/>
@@ -2667,7 +3122,7 @@
     <w:link w:val="Heading8"/>
     <w:uiPriority w:val="9"/>
     <w:semiHidden/>
-    <w:rsid w:val="00BA11E0"/>
+    <w:rsid w:val="00AE5A20"/>
     <w:rPr>
       <w:rFonts w:eastAsiaTheme="majorEastAsia" w:cstheme="majorBidi"/>
       <w:i/>
@@ -2681,7 +3136,7 @@
     <w:link w:val="Heading9"/>
     <w:uiPriority w:val="9"/>
     <w:semiHidden/>
-    <w:rsid w:val="00BA11E0"/>
+    <w:rsid w:val="00AE5A20"/>
     <w:rPr>
       <w:rFonts w:eastAsiaTheme="majorEastAsia" w:cstheme="majorBidi"/>
       <w:color w:val="272727" w:themeColor="text1" w:themeTint="D8"/>
@@ -2694,7 +3149,7 @@
     <w:link w:val="TitleChar"/>
     <w:uiPriority w:val="10"/>
     <w:qFormat/>
-    <w:rsid w:val="00BA11E0"/>
+    <w:rsid w:val="00AE5A20"/>
     <w:pPr>
       <w:spacing w:after="80" w:line="240" w:lineRule="auto"/>
       <w:contextualSpacing/>
@@ -2712,7 +3167,7 @@
     <w:basedOn w:val="DefaultParagraphFont"/>
     <w:link w:val="Title"/>
     <w:uiPriority w:val="10"/>
-    <w:rsid w:val="00BA11E0"/>
+    <w:rsid w:val="00AE5A20"/>
     <w:rPr>
       <w:rFonts w:asciiTheme="majorHAnsi" w:eastAsiaTheme="majorEastAsia" w:hAnsiTheme="majorHAnsi" w:cstheme="majorBidi"/>
       <w:spacing w:val="-10"/>
@@ -2728,7 +3183,7 @@
     <w:link w:val="SubtitleChar"/>
     <w:uiPriority w:val="11"/>
     <w:qFormat/>
-    <w:rsid w:val="00BA11E0"/>
+    <w:rsid w:val="00AE5A20"/>
     <w:pPr>
       <w:numPr>
         <w:ilvl w:val="1"/>
@@ -2747,7 +3202,7 @@
     <w:basedOn w:val="DefaultParagraphFont"/>
     <w:link w:val="Subtitle"/>
     <w:uiPriority w:val="11"/>
-    <w:rsid w:val="00BA11E0"/>
+    <w:rsid w:val="00AE5A20"/>
     <w:rPr>
       <w:rFonts w:eastAsiaTheme="majorEastAsia" w:cstheme="majorBidi"/>
       <w:color w:val="595959" w:themeColor="text1" w:themeTint="A6"/>
@@ -2763,7 +3218,7 @@
     <w:link w:val="QuoteChar"/>
     <w:uiPriority w:val="29"/>
     <w:qFormat/>
-    <w:rsid w:val="00BA11E0"/>
+    <w:rsid w:val="00AE5A20"/>
     <w:pPr>
       <w:spacing w:before="160"/>
       <w:jc w:val="center"/>
@@ -2779,7 +3234,7 @@
     <w:basedOn w:val="DefaultParagraphFont"/>
     <w:link w:val="Quote"/>
     <w:uiPriority w:val="29"/>
-    <w:rsid w:val="00BA11E0"/>
+    <w:rsid w:val="00AE5A20"/>
     <w:rPr>
       <w:i/>
       <w:iCs/>
@@ -2791,7 +3246,7 @@
     <w:basedOn w:val="Normal"/>
     <w:uiPriority w:val="34"/>
     <w:qFormat/>
-    <w:rsid w:val="00BA11E0"/>
+    <w:rsid w:val="00AE5A20"/>
     <w:pPr>
       <w:ind w:left="720"/>
       <w:contextualSpacing/>
@@ -2802,7 +3257,7 @@
     <w:basedOn w:val="DefaultParagraphFont"/>
     <w:uiPriority w:val="21"/>
     <w:qFormat/>
-    <w:rsid w:val="00BA11E0"/>
+    <w:rsid w:val="00AE5A20"/>
     <w:rPr>
       <w:i/>
       <w:iCs/>
@@ -2816,7 +3271,7 @@
     <w:link w:val="IntenseQuoteChar"/>
     <w:uiPriority w:val="30"/>
     <w:qFormat/>
-    <w:rsid w:val="00BA11E0"/>
+    <w:rsid w:val="00AE5A20"/>
     <w:pPr>
       <w:pBdr>
         <w:top w:val="single" w:sz="4" w:space="10" w:color="0F4761" w:themeColor="accent1" w:themeShade="BF"/>
@@ -2837,7 +3292,7 @@
     <w:basedOn w:val="DefaultParagraphFont"/>
     <w:link w:val="IntenseQuote"/>
     <w:uiPriority w:val="30"/>
-    <w:rsid w:val="00BA11E0"/>
+    <w:rsid w:val="00AE5A20"/>
     <w:rPr>
       <w:i/>
       <w:iCs/>
@@ -2849,7 +3304,7 @@
     <w:basedOn w:val="DefaultParagraphFont"/>
     <w:uiPriority w:val="32"/>
     <w:qFormat/>
-    <w:rsid w:val="00BA11E0"/>
+    <w:rsid w:val="00AE5A20"/>
     <w:rPr>
       <w:b/>
       <w:bCs/>

</xml_diff>

<commit_message>
docs: generate clean direct Banking App report
</commit_message>
<xml_diff>
--- a/Bao_cao_do_an_NLU_Banking.docx
+++ b/Bao_cao_do_an_NLU_Banking.docx
@@ -412,7 +412,6 @@
                 <w:i/>
                 <w:sz w:val="26"/>
               </w:rPr>
-              <w:lastRenderedPageBreak/>
               <w:t xml:space="preserve">  2. Trần Hoàng Quân</w:t>
             </w:r>
           </w:p>
@@ -557,39 +556,19 @@
     </w:tbl>
     <w:p>
       <w:pPr>
-        <w:spacing w:after="960" w:line="248" w:lineRule="auto"/>
+        <w:spacing w:before="1134" w:after="960" w:line="248" w:lineRule="auto"/>
         <w:jc w:val="center"/>
         <w:rPr>
           <w:rFonts w:ascii="Times New Roman" w:hAnsi="Times New Roman" w:cs="Times New Roman"/>
+          <w:b/>
           <w:i/>
-          <w:sz w:val="26"/>
-        </w:rPr>
-      </w:pPr>
-    </w:p>
-    <w:p>
-      <w:pPr>
-        <w:spacing w:after="960" w:line="248" w:lineRule="auto"/>
-        <w:jc w:val="center"/>
-        <w:rPr>
-          <w:rFonts w:ascii="Times New Roman" w:hAnsi="Times New Roman" w:cs="Times New Roman"/>
+        </w:rPr>
+      </w:pPr>
+      <w:r>
+        <w:rPr>
+          <w:rFonts w:ascii="Times New Roman" w:hAnsi="Times New Roman" w:cs="Times New Roman"/>
+          <w:b/>
           <w:i/>
-          <w:sz w:val="26"/>
-        </w:rPr>
-      </w:pPr>
-    </w:p>
-    <w:p>
-      <w:pPr>
-        <w:spacing w:before="720" w:after="120" w:line="248" w:lineRule="auto"/>
-        <w:jc w:val="center"/>
-        <w:rPr>
-          <w:rFonts w:ascii="Times New Roman" w:hAnsi="Times New Roman" w:cs="Times New Roman"/>
-          <w:b/>
-        </w:rPr>
-      </w:pPr>
-      <w:r>
-        <w:rPr>
-          <w:rFonts w:ascii="Times New Roman" w:hAnsi="Times New Roman" w:cs="Times New Roman"/>
-          <w:b/>
         </w:rPr>
         <w:t>TP. HỒ CHÍ MINH, THÁNG 7 NĂM 2026</w:t>
       </w:r>
@@ -599,31 +578,17 @@
         <w:rPr>
           <w:rFonts w:ascii="Times New Roman" w:hAnsi="Times New Roman" w:cs="Times New Roman"/>
           <w:b/>
-        </w:rPr>
-      </w:pPr>
-      <w:r>
-        <w:rPr>
-          <w:rFonts w:ascii="Times New Roman" w:hAnsi="Times New Roman" w:cs="Times New Roman"/>
-          <w:b/>
+          <w:i/>
+        </w:rPr>
+      </w:pPr>
+      <w:r>
+        <w:rPr>
+          <w:rFonts w:ascii="Times New Roman" w:hAnsi="Times New Roman" w:cs="Times New Roman"/>
+          <w:b/>
+          <w:i/>
         </w:rPr>
         <w:br w:type="page"/>
       </w:r>
-    </w:p>
-    <w:p>
-      <w:pPr>
-        <w:spacing w:before="720" w:after="120" w:line="248" w:lineRule="auto"/>
-        <w:jc w:val="center"/>
-        <w:rPr>
-          <w:rFonts w:ascii="Times New Roman" w:hAnsi="Times New Roman" w:cs="Times New Roman"/>
-          <w:b/>
-        </w:rPr>
-        <w:sectPr>
-          <w:pgSz w:w="12240" w:h="15840"/>
-          <w:pgMar w:top="1417" w:right="1134" w:bottom="1417" w:left="1701" w:header="720" w:footer="720" w:gutter="0"/>
-          <w:cols w:space="720"/>
-          <w:docGrid w:linePitch="360"/>
-        </w:sectPr>
-      </w:pPr>
     </w:p>
     <w:p>
       <w:pPr>
@@ -641,7 +606,6 @@
           <w:b/>
           <w:sz w:val="32"/>
         </w:rPr>
-        <w:lastRenderedPageBreak/>
         <w:t>MỤC LỤC</w:t>
       </w:r>
     </w:p>
@@ -1929,7 +1893,7 @@
           <w:rFonts w:ascii="Times New Roman" w:hAnsi="Times New Roman" w:cs="Times New Roman"/>
           <w:sz w:val="26"/>
         </w:rPr>
-        <w:t>Trong thời đại kỷ nguyên số phát triển vượt bậc, ngành công nghệ tài chính (Fintech) đã và đang thay đổi hoàn toàn thói quen giao dịch của người dùng. Sự bùng nổ của thanh toán không dùng tiền mặt tại Việt Nam thông qua mã QR và các ứng dụng ngân hàng di động đòi hỏi các ngân hàng phải phát triển các ứng dụng di động an toàn, có khả năng mở rộng tốt và thiết kế kiến trúc backend linh hoạt. Đề tài 'Phát triển Ứng dụng Ngân hàng Di động NLU Banking App' được nhóm lựa chọn nhằm xây dựng một hệ thống ngân hàng mô phỏng thực tế, kết hợp kiến trúc phân tán Microservices ở backend và ứng dụng di động native trên hệ điều hành Android. Việc xây dựng một hệ thống microservices hoàn chỉnh giúp nhóm nghiên cứu sâu sắc về tính độc lập giữa các dịch vụ, quy trình xác thực phân tán OAuth2 qua Keycloak và cơ chế giao tiếp API an toàn.</w:t>
+        <w:t>Trong thời đại cách mạng công nghiệp 4.0, sự phát triển vượt bậc của các nền tảng tài chính số (Fintech) đã thúc đẩy cuộc chuyển dịch mạnh mẽ từ các phương thức giao dịch truyền thống tại quầy sang giao dịch điện tử. Tại Việt Nam, nhu cầu thanh toán trực tuyến qua mã QR, quản lý thẻ, và chuyển khoản nhanh qua di động của khách hàng đang tăng trưởng nhanh chóng. Điều này đặt ra bài toán tối ưu về bảo mật hệ thống và kiến trúc phần mềm cho các ứng dụng ngân hàng di động. Nhóm chúng tôi đã quyết định chọn đề tài 'Phát triển Ứng dụng Ngân hàng Di động NLU Banking App' nhằm áp dụng kiến trúc phân tán Microservices cho phía backend và xây dựng ứng dụng di động native trên hệ điều hành Android. Sự kết hợp này mang lại cơ hội nghiên cứu sâu sắc về khả năng tự động hóa, tính độc lập của từng module dịch vụ và cơ chế bảo mật xác thực phân tán qua Keycloak.</w:t>
       </w:r>
     </w:p>
     <w:p>
@@ -1968,7 +1932,7 @@
           <w:rFonts w:ascii="Times New Roman" w:hAnsi="Times New Roman" w:cs="Times New Roman"/>
           <w:sz w:val="26"/>
         </w:rPr>
-        <w:t>Mục tiêu chính của đồ án bao gồm: (1) Xây dựng ứng dụng di động Android có giao diện hiện đại, tối ưu trải nghiệm khách hàng sử dụng ngôn ngữ lập trình Java. (2) Thiết kế và cài đặt hệ thống backend gồm các microservices độc lập được quản lý bởi Service Registry (Eureka) và điều hướng thông qua API Gateway. (3) Tích hợp máy chủ xác thực Keycloak để bảo mật hệ thống, quản lý phiên đăng nhập và bảo vệ các API giao dịch quan trọng. (4) Thực hiện các luồng nghiệp vụ ngân hàng cốt lõi như đăng ký tài khoản mới kèm xác thực OTP, nạp tiền, rút tiền, chuyển tiền nội bộ bảo mật, xem lịch sử giao dịch và tích hợp quét mã QR thanh toán.</w:t>
+        <w:t>Đồ án hướng tới việc thiết kế và xây dựng một hệ thống ngân hàng di động giả lập hoàn chỉnh, đạt được các mục tiêu khoa học và thực tiễn sau: (1) Thiết kế giao diện di động native trên hệ điều hành Android trực quan, mượt mà bằng ngôn ngữ Java, tập trung tối ưu trải nghiệm người dùng cuối. (2) Triển khai hệ thống backend gồm các microservices độc lập, giao tiếp thông qua RESTful API và quản lý tập trung bởi API Gateway kết hợp Eureka Service Registry. (3) Tích hợp máy chủ xác thực Keycloak (OAuth2/OIDC) để bảo mật hệ thống, quản lý phiên đăng nhập và bảo vệ dữ liệu khách hàng. (4) Cài đặt thành công các nghiệp vụ giao dịch ngân hàng cốt lõi bao gồm: đăng ký và kích hoạt tài khoản bằng mã OTP gửi qua email, truy vấn số dư tài khoản, nạp/rút tiền, chuyển khoản nội bộ bảo mật, xem lịch sử biến động số dư và chuyển khoản bằng mã QR.</w:t>
       </w:r>
     </w:p>
     <w:p>
@@ -2007,7 +1971,7 @@
           <w:rFonts w:ascii="Times New Roman" w:hAnsi="Times New Roman" w:cs="Times New Roman"/>
           <w:sz w:val="26"/>
         </w:rPr>
-        <w:t>Dự án tập trung vào các luồng giao dịch nội bộ của ngân hàng NLU Banking, chưa mở rộng ra các giao dịch liên ngân hàng. Ứng dụng di động hoạt động tốt trên các thiết bị Android từ phiên bản 8.0 trở lên. Cơ sở dữ liệu được triển khai cục bộ và được phân tách riêng biệt cho từng dịch vụ để tuân thủ kiến trúc microservices.</w:t>
+        <w:t>Đồ án tập trung nghiên cứu kiến trúc microservices và xác thực tập trung. Về nghiệp vụ, ứng dụng chỉ tập trung vào các giao dịch nội bộ trong ngân hàng NLU Banking, chưa kết nối trực tiếp với hệ thống thanh toán liên ngân hàng thực tế. Về mặt triển khai, ứng dụng di động Android chạy ổn định trên các phiên bản Android 8.0 trở lên. Backend và cơ sở dữ liệu được cấu hình triển khai cục bộ (local) trên máy chủ thử nghiệm thông qua Docker Compose.</w:t>
       </w:r>
     </w:p>
     <w:p>
@@ -2068,7 +2032,7 @@
           <w:rFonts w:ascii="Times New Roman" w:hAnsi="Times New Roman" w:cs="Times New Roman"/>
           <w:sz w:val="26"/>
         </w:rPr>
-        <w:t>Dựa trên mã nguồn thực tế của dự án, hệ thống đáp ứng các nhóm chức năng chính sau:</w:t>
+        <w:t>Hệ thống đáp ứng đầy đủ các chức năng nghiệp vụ tài chính của một ngân hàng di động hiện đại bao gồm:</w:t>
       </w:r>
     </w:p>
     <w:p>
@@ -2085,7 +2049,7 @@
           <w:rFonts w:ascii="Times New Roman" w:hAnsi="Times New Roman" w:cs="Times New Roman"/>
           <w:sz w:val="26"/>
         </w:rPr>
-        <w:t xml:space="preserve">  - Đăng ký và kích hoạt tài khoản: Người dùng nhập hồ sơ (Họ tên, SĐT, Email, CCCD), hệ thống tạo tài khoản tạm thời và gửi mã OTP kích hoạt qua Email. Sau khi nhập đúng OTP, tài khoản Keycloak và tài khoản ngân hàng sẽ được khởi tạo chính thức.</w:t>
+        <w:t xml:space="preserve">  - Luồng đăng ký tài khoản mới: Người dùng điền đầy đủ thông tin cá nhân (Họ tên, Số điện thoại, Email, Số CCCD). Hệ thống sẽ tạo hồ sơ tạm thời, tự động sinh mã OTP 6 chữ số và gửi qua email để kích hoạt. Người dùng nhập đúng OTP sẽ kích hoạt tài khoản chính thức trên hệ thống ngân hàng và Keycloak Server.</w:t>
       </w:r>
     </w:p>
     <w:p>
@@ -2102,7 +2066,7 @@
           <w:rFonts w:ascii="Times New Roman" w:hAnsi="Times New Roman" w:cs="Times New Roman"/>
           <w:sz w:val="26"/>
         </w:rPr>
-        <w:t xml:space="preserve">  - Đăng nhập hệ thống: Hỗ trợ xác thực tài khoản qua email và mật khẩu bằng giao thức bảo mật OIDC (Keycloak). Ứng dụng Android lưu trữ Access Token và Refresh Token để duy trì trạng thái đăng nhập.</w:t>
+        <w:t xml:space="preserve">  - Xác thực đăng nhập: Đăng nhập an toàn qua Keycloak Server bằng tài khoản email và mật khẩu đã đăng ký, hệ thống sẽ trả về mã Access Token và Refresh Token cho ứng dụng Android.</w:t>
       </w:r>
     </w:p>
     <w:p>
@@ -2119,7 +2083,7 @@
           <w:rFonts w:ascii="Times New Roman" w:hAnsi="Times New Roman" w:cs="Times New Roman"/>
           <w:sz w:val="26"/>
         </w:rPr>
-        <w:t xml:space="preserve">  - Quản lý tài khoản: Truy vấn số tài khoản và hiển thị số dư khả dụng theo thời gian thực.</w:t>
+        <w:t xml:space="preserve">  - Truy vấn số dư: Xem thông tin số tài khoản thanh toán và số dư khả dụng thực tế theo thời gian thực.</w:t>
       </w:r>
     </w:p>
     <w:p>
@@ -2136,7 +2100,7 @@
           <w:rFonts w:ascii="Times New Roman" w:hAnsi="Times New Roman" w:cs="Times New Roman"/>
           <w:sz w:val="26"/>
         </w:rPr>
-        <w:t xml:space="preserve">  - Chuyển tiền nội bộ: Nhập số tài khoản đích, hệ thống tự động gọi API kiểm tra họ tên người nhận để xác nhận trước khi cho phép nhập số tiền và nội dung chuyển tiền. Sau khi nhập mã OTP gửi qua Email, giao dịch mới được phê duyệt và hoàn tất.</w:t>
+        <w:t xml:space="preserve">  - Giao dịch chuyển tiền nội bộ: Nhập số tài khoản đích, hệ thống tự động kiểm tra sự tồn tại và trả về họ tên chủ tài khoản thụ hưởng để người dùng xác nhận trước khi chuyển khoản. Giao dịch yêu cầu người dùng nhập đúng mã OTP gửi qua email để trừ tiền tài khoản nguồn và cộng tiền tài khoản đích.</w:t>
       </w:r>
     </w:p>
     <w:p>
@@ -2153,7 +2117,24 @@
           <w:rFonts w:ascii="Times New Roman" w:hAnsi="Times New Roman" w:cs="Times New Roman"/>
           <w:sz w:val="26"/>
         </w:rPr>
-        <w:t xml:space="preserve">  - Biến động số dư: Truy vấn toàn bộ các hoạt động nạp, rút tiền, chuyển khoản đi và nhận tiền đến kèm lịch sử biến động số dư chi tiết.</w:t>
+        <w:t xml:space="preserve">  - Giao dịch nạp/rút tiền: Hỗ trợ nạp tiền vào tài khoản và rút tiền trực tiếp mô phỏng giao dịch tại cây ATM.</w:t>
+      </w:r>
+    </w:p>
+    <w:p>
+      <w:pPr>
+        <w:spacing w:after="80" w:line="248" w:lineRule="auto"/>
+        <w:jc w:val="both"/>
+        <w:rPr>
+          <w:rFonts w:ascii="Times New Roman" w:hAnsi="Times New Roman" w:cs="Times New Roman"/>
+          <w:sz w:val="26"/>
+        </w:rPr>
+      </w:pPr>
+      <w:r>
+        <w:rPr>
+          <w:rFonts w:ascii="Times New Roman" w:hAnsi="Times New Roman" w:cs="Times New Roman"/>
+          <w:sz w:val="26"/>
+        </w:rPr>
+        <w:t xml:space="preserve">  - Lịch sử giao dịch: Lưu trữ và cho phép hiển thị đầy đủ lịch sử giao dịch chuyển khoản, nạp/rút tiền kèm thông tin chi tiết về thời gian, số tiền và nội dung giao dịch.</w:t>
       </w:r>
     </w:p>
     <w:p>
@@ -2170,7 +2151,7 @@
           <w:rFonts w:ascii="Times New Roman" w:hAnsi="Times New Roman" w:cs="Times New Roman"/>
           <w:sz w:val="26"/>
         </w:rPr>
-        <w:t xml:space="preserve">  - Giao dịch qua mã QR: Cho phép khách hàng hiển thị mã QR chứa thông tin số tài khoản cá nhân và quét mã QR của người khác để chuyển khoản nhanh mà không cần nhập số tài khoản thủ công.</w:t>
+        <w:t xml:space="preserve">  - Chuyển khoản bằng mã QR: Tạo mã QR tài khoản cá nhân, và quét mã QR tài khoản khác để tự động điền số tài khoản nhận mà không cần nhập thủ công.</w:t>
       </w:r>
     </w:p>
     <w:p>
@@ -2197,6 +2178,162 @@
     </w:p>
     <w:p>
       <w:pPr>
+        <w:spacing w:after="120" w:line="248" w:lineRule="auto"/>
+        <w:jc w:val="both"/>
+        <w:rPr>
+          <w:rFonts w:ascii="Times New Roman" w:hAnsi="Times New Roman" w:cs="Times New Roman"/>
+          <w:sz w:val="26"/>
+        </w:rPr>
+      </w:pPr>
+      <w:r>
+        <w:rPr>
+          <w:rFonts w:ascii="Times New Roman" w:hAnsi="Times New Roman" w:cs="Times New Roman"/>
+          <w:sz w:val="26"/>
+        </w:rPr>
+        <w:t>Hệ thống đáp ứng các yêu cầu phi chức năng sau: (1) Tính bảo mật (Security): Mật khẩu người dùng được mã hoá và lưu trực tiếp trong Keycloak DB. Các API backend được bảo vệ qua JWT Token. (2) Tính khả dụng (Usability): Giao diện Android dễ tiếp cận, trực quan, tốc độ phản hồi nhanh chóng dưới 2 giây. (3) Tính nhất quán (Consistency): Đảm bảo các giao dịch tài chính tuân thủ quy chuẩn ACID, không xảy ra lỗi lệch số dư khi xảy ra sự cố mạng giữa các microservices.</w:t>
+      </w:r>
+    </w:p>
+    <w:p>
+      <w:pPr>
+        <w:spacing w:before="120" w:after="120" w:line="248" w:lineRule="auto"/>
+        <w:rPr>
+          <w:rFonts w:ascii="Times New Roman" w:eastAsiaTheme="majorEastAsia" w:hAnsi="Times New Roman" w:cs="Times New Roman"/>
+          <w:b/>
+          <w:color w:val="0F4761" w:themeColor="accent1" w:themeShade="BF"/>
+          <w:sz w:val="28"/>
+          <w:szCs w:val="32"/>
+        </w:rPr>
+      </w:pPr>
+      <w:r>
+        <w:rPr>
+          <w:rFonts w:ascii="Times New Roman" w:eastAsiaTheme="majorEastAsia" w:hAnsi="Times New Roman" w:cs="Times New Roman"/>
+          <w:b/>
+          <w:color w:val="0F4761" w:themeColor="accent1" w:themeShade="BF"/>
+          <w:sz w:val="28"/>
+          <w:szCs w:val="32"/>
+        </w:rPr>
+        <w:t>2.3. Tác nhân hệ thống và Use Cases chính</w:t>
+      </w:r>
+    </w:p>
+    <w:p>
+      <w:pPr>
+        <w:spacing w:after="120" w:line="248" w:lineRule="auto"/>
+        <w:jc w:val="both"/>
+        <w:rPr>
+          <w:rFonts w:ascii="Times New Roman" w:hAnsi="Times New Roman" w:cs="Times New Roman"/>
+          <w:sz w:val="26"/>
+        </w:rPr>
+      </w:pPr>
+      <w:r>
+        <w:rPr>
+          <w:rFonts w:ascii="Times New Roman" w:hAnsi="Times New Roman" w:cs="Times New Roman"/>
+          <w:sz w:val="26"/>
+        </w:rPr>
+        <w:t>Hệ thống phục vụ hai nhóm tác nhân chính: Khách hàng (Customer) sử dụng ứng dụng di động Android để đăng ký, đăng nhập, nạp/rút tiền, chuyển tiền, xem lịch sử giao dịch và quét QR code; và Quản trị viên (Keycloak Admin) quản lý thông tin Client, quản lý người dùng, phân quyền và giám sát trạng thái hệ thống xác thực. Các Use Case cốt lõi bao gồm Use Case Đăng ký, Use Case Đăng nhập, và Use Case Chuyển khoản nội bộ.</w:t>
+      </w:r>
+    </w:p>
+    <w:p>
+      <w:pPr>
+        <w:spacing w:before="240" w:after="240" w:line="248" w:lineRule="auto"/>
+        <w:rPr>
+          <w:rFonts w:ascii="Times New Roman" w:eastAsiaTheme="majorEastAsia" w:hAnsi="Times New Roman" w:cs="Times New Roman"/>
+          <w:b/>
+          <w:color w:val="0F4761" w:themeColor="accent1" w:themeShade="BF"/>
+          <w:sz w:val="32"/>
+          <w:szCs w:val="40"/>
+        </w:rPr>
+      </w:pPr>
+      <w:r>
+        <w:rPr>
+          <w:rFonts w:ascii="Times New Roman" w:eastAsiaTheme="majorEastAsia" w:hAnsi="Times New Roman" w:cs="Times New Roman"/>
+          <w:b/>
+          <w:color w:val="0F4761" w:themeColor="accent1" w:themeShade="BF"/>
+          <w:sz w:val="32"/>
+          <w:szCs w:val="40"/>
+        </w:rPr>
+        <w:t>CHƯƠNG 3. THIẾT KẾ KIẾN TRÚC VÀ CƠ SỞ DỮ LIỆU</w:t>
+      </w:r>
+    </w:p>
+    <w:p>
+      <w:pPr>
+        <w:spacing w:before="120" w:after="120" w:line="248" w:lineRule="auto"/>
+        <w:rPr>
+          <w:rFonts w:ascii="Times New Roman" w:eastAsiaTheme="majorEastAsia" w:hAnsi="Times New Roman" w:cs="Times New Roman"/>
+          <w:b/>
+          <w:color w:val="0F4761" w:themeColor="accent1" w:themeShade="BF"/>
+          <w:sz w:val="28"/>
+          <w:szCs w:val="32"/>
+        </w:rPr>
+      </w:pPr>
+      <w:r>
+        <w:rPr>
+          <w:rFonts w:ascii="Times New Roman" w:eastAsiaTheme="majorEastAsia" w:hAnsi="Times New Roman" w:cs="Times New Roman"/>
+          <w:b/>
+          <w:color w:val="0F4761" w:themeColor="accent1" w:themeShade="BF"/>
+          <w:sz w:val="28"/>
+          <w:szCs w:val="32"/>
+        </w:rPr>
+        <w:t>3.1. Kiến trúc hệ thống Microservices</w:t>
+      </w:r>
+    </w:p>
+    <w:p>
+      <w:pPr>
+        <w:spacing w:after="120" w:line="248" w:lineRule="auto"/>
+        <w:jc w:val="both"/>
+        <w:rPr>
+          <w:rFonts w:ascii="Times New Roman" w:hAnsi="Times New Roman" w:cs="Times New Roman"/>
+          <w:sz w:val="26"/>
+        </w:rPr>
+      </w:pPr>
+      <w:r>
+        <w:rPr>
+          <w:rFonts w:ascii="Times New Roman" w:hAnsi="Times New Roman" w:cs="Times New Roman"/>
+          <w:sz w:val="26"/>
+        </w:rPr>
+        <w:t>Hệ thống được thiết kế theo kiến trúc Microservices phân tán hiện đại, giúp dễ dàng mở rộng và bảo trì. Sơ đồ kết nối luồng hoạt động chính bao gồm: Android Client -&gt; API Gateway (Port 8080) -&gt; Các dịch vụ con đăng ký trên Eureka Service Registry (Port 8761). API Gateway chặn mọi yêu cầu gọi API từ client, liên hệ Keycloak Server (Port 8571) để xác thực token JWT, sau đó mới điều hướng yêu cầu đến microservice đích thích hợp.</w:t>
+      </w:r>
+    </w:p>
+    <w:p>
+      <w:pPr>
+        <w:spacing w:before="120" w:after="120" w:line="248" w:lineRule="auto"/>
+        <w:rPr>
+          <w:rFonts w:ascii="Times New Roman" w:eastAsiaTheme="majorEastAsia" w:hAnsi="Times New Roman" w:cs="Times New Roman"/>
+          <w:b/>
+          <w:color w:val="0F4761" w:themeColor="accent1" w:themeShade="BF"/>
+          <w:sz w:val="28"/>
+          <w:szCs w:val="32"/>
+        </w:rPr>
+      </w:pPr>
+      <w:r>
+        <w:rPr>
+          <w:rFonts w:ascii="Times New Roman" w:eastAsiaTheme="majorEastAsia" w:hAnsi="Times New Roman" w:cs="Times New Roman"/>
+          <w:b/>
+          <w:color w:val="0F4761" w:themeColor="accent1" w:themeShade="BF"/>
+          <w:sz w:val="28"/>
+          <w:szCs w:val="32"/>
+        </w:rPr>
+        <w:t>3.2. Thiết kế Cơ sở dữ liệu chi tiết</w:t>
+      </w:r>
+    </w:p>
+    <w:p>
+      <w:pPr>
+        <w:spacing w:after="120" w:line="248" w:lineRule="auto"/>
+        <w:jc w:val="both"/>
+        <w:rPr>
+          <w:rFonts w:ascii="Times New Roman" w:hAnsi="Times New Roman" w:cs="Times New Roman"/>
+          <w:sz w:val="26"/>
+        </w:rPr>
+      </w:pPr>
+      <w:r>
+        <w:rPr>
+          <w:rFonts w:ascii="Times New Roman" w:hAnsi="Times New Roman" w:cs="Times New Roman"/>
+          <w:sz w:val="26"/>
+        </w:rPr>
+        <w:t>Dự án áp dụng mô hình thiết kế 'Database per Service' để cô lập dữ liệu. Có 5 cơ sở dữ liệu riêng biệt tương ứng với các microservice được thiết kế như sau:</w:t>
+      </w:r>
+    </w:p>
+    <w:p>
+      <w:pPr>
         <w:spacing w:after="80" w:line="248" w:lineRule="auto"/>
         <w:jc w:val="both"/>
         <w:rPr>
@@ -2209,7 +2346,7 @@
           <w:rFonts w:ascii="Times New Roman" w:hAnsi="Times New Roman" w:cs="Times New Roman"/>
           <w:sz w:val="26"/>
         </w:rPr>
-        <w:t xml:space="preserve">  - Bảo mật (Security): Toàn bộ mật khẩu của người dùng được mã hoá một chiều và lưu trữ trên cơ sở dữ liệu của Keycloak. Các API nghiệp vụ ở backend được bảo vệ, chỉ chấp nhận các cuộc gọi chứa mã xác thực JWT Token hợp lệ từ API Gateway.</w:t>
+        <w:t xml:space="preserve">  - user_service (Bảng user): Lưu thông tin định danh và OTP của khách hàng gồm các trường: userId (PK), emailId (Email đăng ký), contactNo (SĐT), identificationNumber (CCCD), authId (ID liên kết Keycloak), emailVerified (Trạng thái kích hoạt), emailOtp (Mã OTP email), emailOtpExpiredAt (Hạn sử dụng OTP), paymentOtp (Mã OTP giao dịch).</w:t>
       </w:r>
     </w:p>
     <w:p>
@@ -2226,7 +2363,41 @@
           <w:rFonts w:ascii="Times New Roman" w:hAnsi="Times New Roman" w:cs="Times New Roman"/>
           <w:sz w:val="26"/>
         </w:rPr>
-        <w:t xml:space="preserve">  - Tính khả dụng (Usability): Giao diện thân thiện, tương thích tốt với nhiều kích cỡ màn hình Android. Phản hồi API nhanh chóng dưới 2 giây để tránh gây cảm giác chờ đợi cho người dùng.</w:t>
+        <w:t xml:space="preserve">  - account_service (Bảng account): Lưu tài khoản ngân hàng của khách hàng: accountId (PK), accountNumber (Số tài khoản), accountType (Loại tài khoản), accountStatus (Trạng thái), openingDate (Ngày tạo), availableBalance (Số dư), userId (FK liên kết người dùng).</w:t>
+      </w:r>
+    </w:p>
+    <w:p>
+      <w:pPr>
+        <w:spacing w:after="80" w:line="248" w:lineRule="auto"/>
+        <w:jc w:val="both"/>
+        <w:rPr>
+          <w:rFonts w:ascii="Times New Roman" w:hAnsi="Times New Roman" w:cs="Times New Roman"/>
+          <w:sz w:val="26"/>
+        </w:rPr>
+      </w:pPr>
+      <w:r>
+        <w:rPr>
+          <w:rFonts w:ascii="Times New Roman" w:hAnsi="Times New Roman" w:cs="Times New Roman"/>
+          <w:sz w:val="26"/>
+        </w:rPr>
+        <w:t xml:space="preserve">  - transaction_service (Bảng transaction): Lưu lịch sử nạp/rút tiền: id (PK), accountId (Tài khoản thực hiện), transactionType (Nạp hoặc Rút), amount (Số tiền), comments (Nội dung), referenceId (Mã tham chiếu), transactionDate (Thời gian giao dịch).</w:t>
+      </w:r>
+    </w:p>
+    <w:p>
+      <w:pPr>
+        <w:spacing w:after="80" w:line="248" w:lineRule="auto"/>
+        <w:jc w:val="both"/>
+        <w:rPr>
+          <w:rFonts w:ascii="Times New Roman" w:hAnsi="Times New Roman" w:cs="Times New Roman"/>
+          <w:sz w:val="26"/>
+        </w:rPr>
+      </w:pPr>
+      <w:r>
+        <w:rPr>
+          <w:rFonts w:ascii="Times New Roman" w:hAnsi="Times New Roman" w:cs="Times New Roman"/>
+          <w:sz w:val="26"/>
+        </w:rPr>
+        <w:t xml:space="preserve">  - fund_transfer_service (Bảng fund_transfer): Lưu lịch sử chuyển tiền nội bộ: fundTransferId (PK), transactionReference (Mã tham chiếu), fromAccount (Tài khoản chuyển), toAccount (Tài khoản nhận), amount (Số tiền), status (Trạng thái), transferType (Kiểu chuyển tiền), transferredOn (Thời gian).</w:t>
       </w:r>
     </w:p>
     <w:p>
@@ -2243,7 +2414,7 @@
           <w:rFonts w:ascii="Times New Roman" w:hAnsi="Times New Roman" w:cs="Times New Roman"/>
           <w:sz w:val="26"/>
         </w:rPr>
-        <w:t xml:space="preserve">  - Tính nhất quán dữ liệu (Consistency): Đảm bảo các giao dịch tài chính tuân thủ thuộc tính ACID, không xảy ra sai lệch số dư giữa tài khoản gửi và nhận trong môi trường microservices phân tán.</w:t>
+        <w:t xml:space="preserve">  - sequence_generator (Bảng sequence): Lưu trữ số thứ tự tự động tăng để phục vụ tạo số tài khoản ngân hàng duy nhất trên toàn hệ thống.</w:t>
       </w:r>
     </w:p>
     <w:p>
@@ -2265,7 +2436,7 @@
           <w:sz w:val="28"/>
           <w:szCs w:val="32"/>
         </w:rPr>
-        <w:t>2.3. Tác nhân hệ thống và Use Cases chính</w:t>
+        <w:t>3.3. Quy trình xác thực phân tán qua Keycloak</w:t>
       </w:r>
     </w:p>
     <w:p>
@@ -2282,7 +2453,46 @@
           <w:rFonts w:ascii="Times New Roman" w:hAnsi="Times New Roman" w:cs="Times New Roman"/>
           <w:sz w:val="26"/>
         </w:rPr>
-        <w:t>Hệ thống phục vụ hai nhóm đối tượng tác nhân: Khách hàng (Customer) sử dụng ứng dụng Android để thực hiện đăng ký, đăng nhập, nạp tiền, rút tiền, chuyển khoản, quét mã QR; và Quản trị viên (Keycloak Admin) quản lý các cấu hình bảo mật, kiểm tra thông tin Client, quản lý danh sách tài khoản định danh trên Keycloak Admin Console. Các Use Case chính bao gồm Đăng ký tài khoản mới (Xác thực OTP), Đăng nhập (Lấy Access Token), và Chuyển khoản nội bộ (Kiểm tra tài khoản nhận -&gt; Nhập tiền -&gt; Xác thực OTP -&gt; Giao dịch).</w:t>
+        <w:t>Quy trình xác thực được thiết kế bảo mật chặt chẽ: (1) Khách hàng thực hiện đăng nhập trên ứng dụng Android bằng email và mật khẩu. (2) Ứng dụng gọi API gửi thông tin đăng nhập đến API Gateway, API Gateway chuyển tiếp yêu cầu đến Keycloak Server. (3) Keycloak xác thực thông tin và trả về Access Token JWT kèm Refresh Token. (4) Trong các yêu cầu giao dịch sau đó, ứng dụng Android đính kèm token này trong Header của API. API Gateway chặn cuộc gọi, kiểm tra chữ ký token JWT qua Keycloak. Nếu hợp lệ, gateway sẽ chuyển tiếp cuộc gọi đến dịch vụ đích tương ứng; nếu không, sẽ trả về mã lỗi 401 Unauthorized.</w:t>
+      </w:r>
+    </w:p>
+    <w:p>
+      <w:pPr>
+        <w:spacing w:before="120" w:after="120" w:line="248" w:lineRule="auto"/>
+        <w:rPr>
+          <w:rFonts w:ascii="Times New Roman" w:eastAsiaTheme="majorEastAsia" w:hAnsi="Times New Roman" w:cs="Times New Roman"/>
+          <w:b/>
+          <w:color w:val="0F4761" w:themeColor="accent1" w:themeShade="BF"/>
+          <w:sz w:val="28"/>
+          <w:szCs w:val="32"/>
+        </w:rPr>
+      </w:pPr>
+      <w:r>
+        <w:rPr>
+          <w:rFonts w:ascii="Times New Roman" w:eastAsiaTheme="majorEastAsia" w:hAnsi="Times New Roman" w:cs="Times New Roman"/>
+          <w:b/>
+          <w:color w:val="0F4761" w:themeColor="accent1" w:themeShade="BF"/>
+          <w:sz w:val="28"/>
+          <w:szCs w:val="32"/>
+        </w:rPr>
+        <w:t>3.4. Các công nghệ cốt lõi sử dụng</w:t>
+      </w:r>
+    </w:p>
+    <w:p>
+      <w:pPr>
+        <w:spacing w:after="120" w:line="248" w:lineRule="auto"/>
+        <w:jc w:val="both"/>
+        <w:rPr>
+          <w:rFonts w:ascii="Times New Roman" w:hAnsi="Times New Roman" w:cs="Times New Roman"/>
+          <w:sz w:val="26"/>
+        </w:rPr>
+      </w:pPr>
+      <w:r>
+        <w:rPr>
+          <w:rFonts w:ascii="Times New Roman" w:hAnsi="Times New Roman" w:cs="Times New Roman"/>
+          <w:sz w:val="26"/>
+        </w:rPr>
+        <w:t>Các công nghệ chính được tích hợp bao gồm: Phía Backend được phát triển bằng framework Spring Boot 2.7.x, Spring Cloud Gateway, Spring Cloud Discovery (Eureka Server), Keycloak Admin Client để tương tác trực tiếp với Keycloak từ java code, Hibernate và Spring Data JPA để truy xuất MySQL Database. Phía Frontend được phát triển bằng Android SDK (Java), thư viện Retrofit 2 kết hợp OkHttp3 để cấu hình kết nối mạng, và thư viện tạo/quét mã QR ZXing.</w:t>
       </w:r>
     </w:p>
     <w:p>
@@ -2304,7 +2514,7 @@
           <w:sz w:val="32"/>
           <w:szCs w:val="40"/>
         </w:rPr>
-        <w:t>CHƯƠNG 3. THIẾT KẾ KIẾN TRÚC VÀ CƠ SỞ DỮ LIỆU</w:t>
+        <w:t>CHƯƠNG 4. CÀI ĐẶT CHI TIẾT VÀ VẬN HÀNH</w:t>
       </w:r>
     </w:p>
     <w:p>
@@ -2326,7 +2536,7 @@
           <w:sz w:val="28"/>
           <w:szCs w:val="32"/>
         </w:rPr>
-        <w:t>3.1. Kiến trúc hệ thống Microservices</w:t>
+        <w:t>4.1. Cấu trúc dự án di động Android</w:t>
       </w:r>
     </w:p>
     <w:p>
@@ -2343,7 +2553,7 @@
           <w:rFonts w:ascii="Times New Roman" w:hAnsi="Times New Roman" w:cs="Times New Roman"/>
           <w:sz w:val="26"/>
         </w:rPr>
-        <w:t>Hệ thống được thiết kế theo kiến trúc Microservices phân tán giúp nâng cao tính sẵn sàng và khả năng mở rộng độc lập của từng module dịch vụ. Sơ đồ kết nối luồng hoạt động chính bao gồm: Android Client -&gt; API Gateway (Port 8080) -&gt; Các dịch vụ con được đăng ký trên Eureka Service Registry (Port 8761). Gateway đóng vai trò làm cổng kết nối duy nhất và kiểm tra tính hợp lệ của Token bảo mật trước khi chuyển tiếp yêu cầu.</w:t>
+        <w:t>Dự án được phân tách rõ ràng thành hai phần chính độc lập: Backend chứa 7 thư mục Microservices được quản lý mã nguồn bằng Maven; và Android Frontend nằm trong thư mục 'BankingMobileApp' được quản lý bằng Gradle. Mã nguồn Android được tổ chức theo kiến trúc chuẩn gồm các Activity (WelcomeActivity, RegisterActivity, TransferActivity, TransactionActivity, MyQrActivity), các lớp Fragment quản lý tab hiển thị, các lớp DTO để định dạng dữ liệu truyền tải qua API, và các service kết nối Retrofit.</w:t>
       </w:r>
     </w:p>
     <w:p>
@@ -2365,7 +2575,7 @@
           <w:sz w:val="28"/>
           <w:szCs w:val="32"/>
         </w:rPr>
-        <w:t>3.2. Thiết kế Cơ sở dữ liệu chi tiết</w:t>
+        <w:t>4.2. Các màn hình chức năng chính trên ứng dụng di động</w:t>
       </w:r>
     </w:p>
     <w:p>
@@ -2382,7 +2592,7 @@
           <w:rFonts w:ascii="Times New Roman" w:hAnsi="Times New Roman" w:cs="Times New Roman"/>
           <w:sz w:val="26"/>
         </w:rPr>
-        <w:t>Dự án áp dụng mô hình 'Database per Service' để đảm bảo tính độc lập dữ liệu. Cơ sở dữ liệu gồm các thực thể chính sau:</w:t>
+        <w:t>Các màn hình chính của ứng dụng di động bao gồm:</w:t>
       </w:r>
     </w:p>
     <w:p>
@@ -2399,7 +2609,7 @@
           <w:rFonts w:ascii="Times New Roman" w:hAnsi="Times New Roman" w:cs="Times New Roman"/>
           <w:sz w:val="26"/>
         </w:rPr>
-        <w:t xml:space="preserve">  - user_service (Bảng user): Lưu trữ thông tin hồ sơ người dùng gồm các trường (userId, emailId, contactNo, cccd, authId kết nối Keycloak, emailVerified, emailOtp, emailOtpExpiredAt, paymentOtp).</w:t>
+        <w:t xml:space="preserve">  - Welcome &amp; Login (WelcomeActivity): Giao diện khởi động và đăng nhập. Kiểm tra tính hợp lệ của email và mật khẩu trước khi gửi yêu cầu lên Keycloak.</w:t>
       </w:r>
     </w:p>
     <w:p>
@@ -2416,7 +2626,7 @@
           <w:rFonts w:ascii="Times New Roman" w:hAnsi="Times New Roman" w:cs="Times New Roman"/>
           <w:sz w:val="26"/>
         </w:rPr>
-        <w:t xml:space="preserve">  - account_service (Bảng account): Lưu trữ tài khoản ngân hàng của khách hàng (accountId, accountNumber, accountType, accountStatus, openingDate, availableBalance, userId).</w:t>
+        <w:t xml:space="preserve">  - Register &amp; OTP (RegisterActivity): Giao diện đăng ký tài khoản. Ràng buộc trường số định danh (CCCD) phải đủ 12 chữ số. Sau khi điền đủ thông tin, hệ thống tự động gọi API kích hoạt email và hiện hộp thoại nhập mã OTP. Khi mã OTP chính xác, tài khoản sẽ được đăng ký thành công.</w:t>
       </w:r>
     </w:p>
     <w:p>
@@ -2433,7 +2643,7 @@
           <w:rFonts w:ascii="Times New Roman" w:hAnsi="Times New Roman" w:cs="Times New Roman"/>
           <w:sz w:val="26"/>
         </w:rPr>
-        <w:t xml:space="preserve">  - transaction_service (Bảng transaction): Lưu trữ lịch sử giao dịch nạp/rút trực tiếp (id, accountId, transactionType, amount, comments, referenceId, transactionDate).</w:t>
+        <w:t xml:space="preserve">  - Transfer (TransferActivity): Giao diện chuyển tiền nội bộ. Khi người dùng nhập số tài khoản nhận, ứng dụng tự động kích hoạt tiến trình gọi API của Account-Service để truy vấn tên chủ tài khoản thụ hưởng. Người dùng nhập số tiền, nội dung và mã OTP giao dịch được gửi đến email để xác nhận chuyển khoản.</w:t>
       </w:r>
     </w:p>
     <w:p>
@@ -2450,7 +2660,7 @@
           <w:rFonts w:ascii="Times New Roman" w:hAnsi="Times New Roman" w:cs="Times New Roman"/>
           <w:sz w:val="26"/>
         </w:rPr>
-        <w:t xml:space="preserve">  - fund_transfer_service (Bảng fund_transfer): Lưu trữ các giao dịch chuyển khoản nội bộ (fundTransferId, transactionReference, fromAccount, toAccount, amount, status, transferType, transferredOn).</w:t>
+        <w:t xml:space="preserve">  - History (TransactionActivity): Hiển thị danh sách lịch sử biến động số dư chi tiết bao gồm ngày giao dịch, số tiền chuyển/nhận và nội dung giao dịch.</w:t>
       </w:r>
     </w:p>
     <w:p>
@@ -2467,7 +2677,7 @@
           <w:rFonts w:ascii="Times New Roman" w:hAnsi="Times New Roman" w:cs="Times New Roman"/>
           <w:sz w:val="26"/>
         </w:rPr>
-        <w:t xml:space="preserve">  - sequence_generator (Bảng sequence): Quản lý số thứ tự tự động tăng để tạo ra mã tài khoản ngân hàng duy nhất trên toàn hệ thống.</w:t>
+        <w:t xml:space="preserve">  - QR Code (MyQrActivity): Giao diện tạo mã QR chứa số tài khoản của người dùng và hỗ trợ quét mã QR của người khác để thực hiện chuyển khoản nhanh.</w:t>
       </w:r>
     </w:p>
     <w:p>
@@ -2489,7 +2699,7 @@
           <w:sz w:val="28"/>
           <w:szCs w:val="32"/>
         </w:rPr>
-        <w:t>3.3. Quy trình xác thực phân tán qua Keycloak</w:t>
+        <w:t>4.3. Cài đặt triển khai trên máy tính thử nghiệm</w:t>
       </w:r>
     </w:p>
     <w:p>
@@ -2506,7 +2716,29 @@
           <w:rFonts w:ascii="Times New Roman" w:hAnsi="Times New Roman" w:cs="Times New Roman"/>
           <w:sz w:val="26"/>
         </w:rPr>
-        <w:t>Mọi yêu cầu gửi từ ứng dụng di động Android đều phải đi qua API Gateway. Đối với các API được bảo vệ (như chuyển tiền, xem lịch sử giao dịch), ứng dụng Android đính kèm mã xác thực JWT trong Header (Authorization: Bearer &lt;token&gt;). API Gateway chặn yêu cầu và liên hệ trực tiếp với máy chủ Keycloak để xác thực chữ ký và tính hợp lệ của Token. Nếu Token hợp lệ, Gateway chuyển tiếp đến microservice nghiệp vụ tương ứng ở phía sau; ngược lại, hệ thống trả về mã lỗi 401 Unauthorized.</w:t>
+        <w:t>Quy trình triển khai chạy ứng dụng thực tế gồm 4 bước chính: (1) Khởi động cơ sở dữ liệu MySQL và máy chủ xác thực Keycloak qua lệnh Docker Compose: 'docker-compose up -d'. Docker tự động chạy script 'init-db.sql' để khởi tạo trước các schema cơ sở dữ liệu. (2) Truy cập quản trị Keycloak Admin Console tại địa chỉ http://localhost:8571 để tạo Realm 'banking-service', tạo Client 'banking-service-api-client' và cấu hình service account cấp quyền tương tác với người dùng. (3) Chạy tệp tin script 'run-services.cmd' tại thư mục gốc để khởi động đồng loạt 7 microservices theo trình tự tối ưu (Registry -&gt; Gateway -&gt; các nghiệp vụ dịch vụ con). (4) Mở và biên dịch ứng dụng Android trên Android Studio, cài đặt và chạy thử nghiệm trên máy ảo Android Emulator.</w:t>
+      </w:r>
+    </w:p>
+    <w:p>
+      <w:pPr>
+        <w:spacing w:before="240" w:after="240" w:line="248" w:lineRule="auto"/>
+        <w:rPr>
+          <w:rFonts w:ascii="Times New Roman" w:eastAsiaTheme="majorEastAsia" w:hAnsi="Times New Roman" w:cs="Times New Roman"/>
+          <w:b/>
+          <w:color w:val="0F4761" w:themeColor="accent1" w:themeShade="BF"/>
+          <w:sz w:val="32"/>
+          <w:szCs w:val="40"/>
+        </w:rPr>
+      </w:pPr>
+      <w:r>
+        <w:rPr>
+          <w:rFonts w:ascii="Times New Roman" w:eastAsiaTheme="majorEastAsia" w:hAnsi="Times New Roman" w:cs="Times New Roman"/>
+          <w:b/>
+          <w:color w:val="0F4761" w:themeColor="accent1" w:themeShade="BF"/>
+          <w:sz w:val="32"/>
+          <w:szCs w:val="40"/>
+        </w:rPr>
+        <w:t>CHƯƠNG 5. TỔNG KẾT VÀ HƯỚNG PHÁT TRIỂN</w:t>
       </w:r>
     </w:p>
     <w:p>
@@ -2528,7 +2760,7 @@
           <w:sz w:val="28"/>
           <w:szCs w:val="32"/>
         </w:rPr>
-        <w:t>3.4. Các công nghệ cốt lõi sử dụng</w:t>
+        <w:t>5.1. Kết quả đạt được của đồ án</w:t>
       </w:r>
     </w:p>
     <w:p>
@@ -2545,29 +2777,7 @@
           <w:rFonts w:ascii="Times New Roman" w:hAnsi="Times New Roman" w:cs="Times New Roman"/>
           <w:sz w:val="26"/>
         </w:rPr>
-        <w:t>Hệ thống sử dụng các công nghệ hiện đại bao gồm: Backend sử dụng Spring Boot 2.7.x, Spring Cloud Gateway, Spring Cloud Netflix Eureka Server, Keycloak Admin Client, Spring Data JPA, Hibernate, và cơ sở dữ liệu MySQL. Frontend sử dụng Android SDK (Java), Retrofit 2 làm HTTP Client gọi API, OkHttp3 để cấu hình header và timeout, và thư viện ZXing hỗ trợ tạo và quét mã QR chuyển khoản nhanh.</w:t>
-      </w:r>
-    </w:p>
-    <w:p>
-      <w:pPr>
-        <w:spacing w:before="240" w:after="240" w:line="248" w:lineRule="auto"/>
-        <w:rPr>
-          <w:rFonts w:ascii="Times New Roman" w:eastAsiaTheme="majorEastAsia" w:hAnsi="Times New Roman" w:cs="Times New Roman"/>
-          <w:b/>
-          <w:color w:val="0F4761" w:themeColor="accent1" w:themeShade="BF"/>
-          <w:sz w:val="32"/>
-          <w:szCs w:val="40"/>
-        </w:rPr>
-      </w:pPr>
-      <w:r>
-        <w:rPr>
-          <w:rFonts w:ascii="Times New Roman" w:eastAsiaTheme="majorEastAsia" w:hAnsi="Times New Roman" w:cs="Times New Roman"/>
-          <w:b/>
-          <w:color w:val="0F4761" w:themeColor="accent1" w:themeShade="BF"/>
-          <w:sz w:val="32"/>
-          <w:szCs w:val="40"/>
-        </w:rPr>
-        <w:t>CHƯƠNG 4. CÀI ĐẶT CHI TIẾT VÀ VẬN HÀNH</w:t>
+        <w:t>Đồ án đã thiết kế và triển khai thành công ứng dụng ngân hàng di động 'NLU Banking App' đáp ứng toàn bộ các yêu cầu nghiệp vụ cơ bản. Hệ thống microservices ở backend giao tiếp ổn định thông qua API Gateway, cơ chế xác thực phân tán tích hợp Keycloak hoạt động mượt mà và an toàn. Khách hàng thực hiện đăng ký tài khoản, nạp/rút tiền, chuyển khoản và quét mã QR thành công, đảm bảo tính nhất quán dữ liệu số dư.</w:t>
       </w:r>
     </w:p>
     <w:p>
@@ -2589,7 +2799,7 @@
           <w:sz w:val="28"/>
           <w:szCs w:val="32"/>
         </w:rPr>
-        <w:t>4.1. Cấu trúc dự án di động Android</w:t>
+        <w:t>5.2. Ưu điểm và Hạn chế còn tồn tại</w:t>
       </w:r>
     </w:p>
     <w:p>
@@ -2606,7 +2816,7 @@
           <w:rFonts w:ascii="Times New Roman" w:hAnsi="Times New Roman" w:cs="Times New Roman"/>
           <w:sz w:val="26"/>
         </w:rPr>
-        <w:t>Mã nguồn dự án được thiết kế khoa học, phân chia rõ ràng. Phía Backend gồm 7 thư mục microservice độc lập chứa tệp cấu hình Maven (pom.xml), tệp cấu hình ứng dụng (application.yml) và mã nguồn Java tổ chức theo các lớp controller, service, repository, và model. Phía Android App tổ chức theo cấu trúc chuẩn của Android Studio. Các màn hình chức năng kế thừa từ Activity và Fragment giao tiếp với các DTOs thông qua thư viện Retrofit.</w:t>
+        <w:t>Ưu điểm của hệ thống là sử dụng kiến trúc Microservices hiện đại, giúp cô lập lỗi và dễ dàng bảo trì nâng cấp; tích hợp Keycloak giúp bảo mật thông tin người dùng chuẩn công nghiệp mà không cần tự phát triển hệ thống xác thực phức tạp; ứng dụng Android có giao diện tối giản, tích hợp công nghệ QR tiện lợi. Hạn chế còn tồn tại là do triển khai mô hình cô lập dữ liệu (Database per Service), việc tạo các truy vấn thống kê báo cáo chéo giữa các microservices gặp nhiều khó khăn, đòi hỏi các giải pháp đồng bộ dữ liệu phức tạp hơn.</w:t>
       </w:r>
     </w:p>
     <w:p>
@@ -2628,7 +2838,7 @@
           <w:sz w:val="28"/>
           <w:szCs w:val="32"/>
         </w:rPr>
-        <w:t>4.2. Các màn hình chức năng chính trên ứng dụng di động</w:t>
+        <w:t>5.3. Hướng phát triển tương lai</w:t>
       </w:r>
     </w:p>
     <w:p>
@@ -2645,253 +2855,7 @@
           <w:rFonts w:ascii="Times New Roman" w:hAnsi="Times New Roman" w:cs="Times New Roman"/>
           <w:sz w:val="26"/>
         </w:rPr>
-        <w:t>Các màn hình chính trên Android App bao gồm:</w:t>
-      </w:r>
-    </w:p>
-    <w:p>
-      <w:pPr>
-        <w:spacing w:after="80" w:line="248" w:lineRule="auto"/>
-        <w:jc w:val="both"/>
-        <w:rPr>
-          <w:rFonts w:ascii="Times New Roman" w:hAnsi="Times New Roman" w:cs="Times New Roman"/>
-          <w:sz w:val="26"/>
-        </w:rPr>
-      </w:pPr>
-      <w:r>
-        <w:rPr>
-          <w:rFonts w:ascii="Times New Roman" w:hAnsi="Times New Roman" w:cs="Times New Roman"/>
-          <w:sz w:val="26"/>
-        </w:rPr>
-        <w:t xml:space="preserve">  - Màn hình Đăng ký (RegisterActivity): Cho phép người dùng nhập thông tin và kiểm tra định dạng CCCD (12 chữ số), định dạng SĐT và Email.</w:t>
-      </w:r>
-    </w:p>
-    <w:p>
-      <w:pPr>
-        <w:spacing w:after="80" w:line="248" w:lineRule="auto"/>
-        <w:jc w:val="both"/>
-        <w:rPr>
-          <w:rFonts w:ascii="Times New Roman" w:hAnsi="Times New Roman" w:cs="Times New Roman"/>
-          <w:sz w:val="26"/>
-        </w:rPr>
-      </w:pPr>
-      <w:r>
-        <w:rPr>
-          <w:rFonts w:ascii="Times New Roman" w:hAnsi="Times New Roman" w:cs="Times New Roman"/>
-          <w:sz w:val="26"/>
-        </w:rPr>
-        <w:t xml:space="preserve">  - Màn hình Chuyển khoản (TransferActivity): Hỗ trợ nhập số tài khoản đích và kiểm tra tên người thụ hưởng trước khi xác nhận chuyển khoản. Mã OTP giao dịch được gửi đến email người chuyển để xác thực trước khi kết thúc giao dịch.</w:t>
-      </w:r>
-    </w:p>
-    <w:p>
-      <w:pPr>
-        <w:spacing w:after="80" w:line="248" w:lineRule="auto"/>
-        <w:jc w:val="both"/>
-        <w:rPr>
-          <w:rFonts w:ascii="Times New Roman" w:hAnsi="Times New Roman" w:cs="Times New Roman"/>
-          <w:sz w:val="26"/>
-        </w:rPr>
-      </w:pPr>
-      <w:r>
-        <w:rPr>
-          <w:rFonts w:ascii="Times New Roman" w:hAnsi="Times New Roman" w:cs="Times New Roman"/>
-          <w:sz w:val="26"/>
-        </w:rPr>
-        <w:t xml:space="preserve">  - Màn hình Lịch sử giao dịch (TransactionActivity): Hiển thị danh sách các giao dịch được phân trang chi tiết từ Transaction-Service.</w:t>
-      </w:r>
-    </w:p>
-    <w:p>
-      <w:pPr>
-        <w:spacing w:after="120" w:line="248" w:lineRule="auto"/>
-        <w:jc w:val="both"/>
-        <w:rPr>
-          <w:rFonts w:ascii="Times New Roman" w:hAnsi="Times New Roman" w:cs="Times New Roman"/>
-          <w:sz w:val="26"/>
-        </w:rPr>
-      </w:pPr>
-      <w:r>
-        <w:rPr>
-          <w:rFonts w:ascii="Times New Roman" w:hAnsi="Times New Roman" w:cs="Times New Roman"/>
-          <w:sz w:val="26"/>
-        </w:rPr>
-        <w:t xml:space="preserve">  - Màn hình Quét QR (MyQrActivity): Hiển thị mã QR tài khoản cá nhân để người khác quét, và mở camera quét mã QR của tài khoản khác để điền nhanh thông tin giao dịch.</w:t>
-      </w:r>
-    </w:p>
-    <w:p>
-      <w:pPr>
-        <w:spacing w:before="120" w:after="120" w:line="248" w:lineRule="auto"/>
-        <w:rPr>
-          <w:rFonts w:ascii="Times New Roman" w:eastAsiaTheme="majorEastAsia" w:hAnsi="Times New Roman" w:cs="Times New Roman"/>
-          <w:b/>
-          <w:color w:val="0F4761" w:themeColor="accent1" w:themeShade="BF"/>
-          <w:sz w:val="28"/>
-          <w:szCs w:val="32"/>
-        </w:rPr>
-      </w:pPr>
-      <w:r>
-        <w:rPr>
-          <w:rFonts w:ascii="Times New Roman" w:eastAsiaTheme="majorEastAsia" w:hAnsi="Times New Roman" w:cs="Times New Roman"/>
-          <w:b/>
-          <w:color w:val="0F4761" w:themeColor="accent1" w:themeShade="BF"/>
-          <w:sz w:val="28"/>
-          <w:szCs w:val="32"/>
-        </w:rPr>
-        <w:t>4.3. Cài đặt triển khai trên máy tính thử nghiệm</w:t>
-      </w:r>
-    </w:p>
-    <w:p>
-      <w:pPr>
-        <w:spacing w:after="120" w:line="248" w:lineRule="auto"/>
-        <w:jc w:val="both"/>
-        <w:rPr>
-          <w:rFonts w:ascii="Times New Roman" w:hAnsi="Times New Roman" w:cs="Times New Roman"/>
-          <w:sz w:val="26"/>
-        </w:rPr>
-      </w:pPr>
-      <w:r>
-        <w:rPr>
-          <w:rFonts w:ascii="Times New Roman" w:hAnsi="Times New Roman" w:cs="Times New Roman"/>
-          <w:sz w:val="26"/>
-        </w:rPr>
-        <w:t>Quy trình triển khai chạy hệ thống gồm các bước đơn giản: (1) Khởi động MySQL và Keycloak nhanh chóng thông qua lệnh Docker: 'docker-compose up -d'. Tệp cấu hình này tự động liên kết với 'init-db.sql' để tạo trước toàn bộ cơ sở dữ liệu. (2) Khởi tạo cấu hình trên trang quản trị Keycloak Admin Console: Tạo Realm tên 'banking-service', tạo Client tên 'banking-service-api-client' và gán các quyền service account 'manage-users', 'view-users', 'query-users' cho client. (3) Chạy tệp tin script 'run-services.cmd' duy nhất tại thư mục gốc để tự động mở các cửa sổ dòng lệnh riêng biệt và chạy toàn bộ 7 dịch vụ Spring Boot thông qua Maven Wrapper. (4) Mở ứng dụng Android trên Android Studio, kết nối máy ảo và chạy ứng dụng.</w:t>
-      </w:r>
-    </w:p>
-    <w:p>
-      <w:pPr>
-        <w:spacing w:before="240" w:after="240" w:line="248" w:lineRule="auto"/>
-        <w:rPr>
-          <w:rFonts w:ascii="Times New Roman" w:eastAsiaTheme="majorEastAsia" w:hAnsi="Times New Roman" w:cs="Times New Roman"/>
-          <w:b/>
-          <w:color w:val="0F4761" w:themeColor="accent1" w:themeShade="BF"/>
-          <w:sz w:val="32"/>
-          <w:szCs w:val="40"/>
-        </w:rPr>
-      </w:pPr>
-      <w:r>
-        <w:rPr>
-          <w:rFonts w:ascii="Times New Roman" w:eastAsiaTheme="majorEastAsia" w:hAnsi="Times New Roman" w:cs="Times New Roman"/>
-          <w:b/>
-          <w:color w:val="0F4761" w:themeColor="accent1" w:themeShade="BF"/>
-          <w:sz w:val="32"/>
-          <w:szCs w:val="40"/>
-        </w:rPr>
-        <w:t>CHƯƠNG 5. TỔNG KẾT VÀ HƯỚNG PHÁT TRIỂN</w:t>
-      </w:r>
-    </w:p>
-    <w:p>
-      <w:pPr>
-        <w:spacing w:before="120" w:after="120" w:line="248" w:lineRule="auto"/>
-        <w:rPr>
-          <w:rFonts w:ascii="Times New Roman" w:eastAsiaTheme="majorEastAsia" w:hAnsi="Times New Roman" w:cs="Times New Roman"/>
-          <w:b/>
-          <w:color w:val="0F4761" w:themeColor="accent1" w:themeShade="BF"/>
-          <w:sz w:val="28"/>
-          <w:szCs w:val="32"/>
-        </w:rPr>
-      </w:pPr>
-      <w:r>
-        <w:rPr>
-          <w:rFonts w:ascii="Times New Roman" w:eastAsiaTheme="majorEastAsia" w:hAnsi="Times New Roman" w:cs="Times New Roman"/>
-          <w:b/>
-          <w:color w:val="0F4761" w:themeColor="accent1" w:themeShade="BF"/>
-          <w:sz w:val="28"/>
-          <w:szCs w:val="32"/>
-        </w:rPr>
-        <w:t>5.1. Kết quả đạt được của đồ án</w:t>
-      </w:r>
-    </w:p>
-    <w:p>
-      <w:pPr>
-        <w:spacing w:after="120" w:line="248" w:lineRule="auto"/>
-        <w:jc w:val="both"/>
-        <w:rPr>
-          <w:rFonts w:ascii="Times New Roman" w:hAnsi="Times New Roman" w:cs="Times New Roman"/>
-          <w:sz w:val="26"/>
-        </w:rPr>
-      </w:pPr>
-      <w:r>
-        <w:rPr>
-          <w:rFonts w:ascii="Times New Roman" w:hAnsi="Times New Roman" w:cs="Times New Roman"/>
-          <w:sz w:val="26"/>
-        </w:rPr>
-        <w:t>Dự án xây dựng thành công ứng dụng ngân hàng di động 'NLU Banking App' đáp ứng đầy đủ các yêu cầu nghiệp vụ ngân hàng cơ bản của môn học. Hệ thống microservices hoạt động ổn định, bảo mật cao nhờ tích hợp Keycloak, thông tin giao dịch tài chính nhất quán nhờ áp dụng cơ chế đồng bộ số dư giữa các microservices.</w:t>
-      </w:r>
-    </w:p>
-    <w:p>
-      <w:pPr>
-        <w:spacing w:before="120" w:after="120" w:line="248" w:lineRule="auto"/>
-        <w:rPr>
-          <w:rFonts w:ascii="Times New Roman" w:eastAsiaTheme="majorEastAsia" w:hAnsi="Times New Roman" w:cs="Times New Roman"/>
-          <w:b/>
-          <w:color w:val="0F4761" w:themeColor="accent1" w:themeShade="BF"/>
-          <w:sz w:val="28"/>
-          <w:szCs w:val="32"/>
-        </w:rPr>
-      </w:pPr>
-      <w:r>
-        <w:rPr>
-          <w:rFonts w:ascii="Times New Roman" w:eastAsiaTheme="majorEastAsia" w:hAnsi="Times New Roman" w:cs="Times New Roman"/>
-          <w:b/>
-          <w:color w:val="0F4761" w:themeColor="accent1" w:themeShade="BF"/>
-          <w:sz w:val="28"/>
-          <w:szCs w:val="32"/>
-        </w:rPr>
-        <w:t>5.2. Ưu điểm và Hạn chế còn tồn tại</w:t>
-      </w:r>
-    </w:p>
-    <w:p>
-      <w:pPr>
-        <w:spacing w:after="120" w:line="248" w:lineRule="auto"/>
-        <w:jc w:val="both"/>
-        <w:rPr>
-          <w:rFonts w:ascii="Times New Roman" w:hAnsi="Times New Roman" w:cs="Times New Roman"/>
-          <w:sz w:val="26"/>
-        </w:rPr>
-      </w:pPr>
-      <w:r>
-        <w:rPr>
-          <w:rFonts w:ascii="Times New Roman" w:hAnsi="Times New Roman" w:cs="Times New Roman"/>
-          <w:sz w:val="26"/>
-        </w:rPr>
-        <w:t>Ưu điểm nổi bật là kiến trúc Microservices hiện đại, giúp dễ dàng nâng cấp, mở rộng và bảo trì từng module dịch vụ mà không ảnh hưởng đến toàn bộ hệ thống; bảo mật vững chắc thông qua xác thực phân tán dựa trên giao thức OAuth2/OIDC chuẩn công nghiệp; hỗ trợ tạo và quét mã QR tiện lợi. Hạn chế là do triển khai mô hình dữ liệu riêng biệt 'Database per Service', việc thực hiện các thống kê, báo cáo giao dịch tổng hợp đòi hỏi phải thực hiện các truy vấn phức tạp hoặc tích hợp các công nghệ đồng bộ dữ liệu chéo.</w:t>
-      </w:r>
-    </w:p>
-    <w:p>
-      <w:pPr>
-        <w:spacing w:before="120" w:after="120" w:line="248" w:lineRule="auto"/>
-        <w:rPr>
-          <w:rFonts w:ascii="Times New Roman" w:eastAsiaTheme="majorEastAsia" w:hAnsi="Times New Roman" w:cs="Times New Roman"/>
-          <w:b/>
-          <w:color w:val="0F4761" w:themeColor="accent1" w:themeShade="BF"/>
-          <w:sz w:val="28"/>
-          <w:szCs w:val="32"/>
-        </w:rPr>
-      </w:pPr>
-      <w:r>
-        <w:rPr>
-          <w:rFonts w:ascii="Times New Roman" w:eastAsiaTheme="majorEastAsia" w:hAnsi="Times New Roman" w:cs="Times New Roman"/>
-          <w:b/>
-          <w:color w:val="0F4761" w:themeColor="accent1" w:themeShade="BF"/>
-          <w:sz w:val="28"/>
-          <w:szCs w:val="32"/>
-        </w:rPr>
-        <w:t>5.3. Hướng phát triển tương lai</w:t>
-      </w:r>
-    </w:p>
-    <w:p>
-      <w:pPr>
-        <w:spacing w:after="120" w:line="248" w:lineRule="auto"/>
-        <w:jc w:val="both"/>
-        <w:rPr>
-          <w:rFonts w:ascii="Times New Roman" w:hAnsi="Times New Roman" w:cs="Times New Roman"/>
-          <w:sz w:val="26"/>
-        </w:rPr>
-      </w:pPr>
-      <w:r>
-        <w:rPr>
-          <w:rFonts w:ascii="Times New Roman" w:hAnsi="Times New Roman" w:cs="Times New Roman"/>
-          <w:sz w:val="26"/>
-        </w:rPr>
-        <w:t>Hướng phát triển tương lai bao gồm: (1) Tích hợp thêm các phương thức xác thực sinh trắc học hiện đại (như vân tay, khuôn mặt) trực tiếp trên Android App. (2) Tích hợp cơ chế Message Broker (Apache Kafka) để đồng bộ dữ liệu phi tập trung giữa các dịch vụ một cách bất đồng bộ. (3) Mở rộng chức năng chuyển tiền liên ngân hàng và liên kết với các cổng thanh toán điện tử lớn tại Việt Nam.</w:t>
+        <w:t>Để phát triển hệ thống trong tương lai, nhóm dự kiến thực hiện các nâng cấp sau: (1) Tích hợp các phương thức xác thực sinh trắc học như vân tay hoặc khuôn mặt (Biometrics) để tăng trải nghiệm đăng nhập nhanh trên Android. (2) Sử dụng hệ thống Message Broker (ví dụ Apache Kafka) để truyền tải và đồng bộ dữ liệu bất đồng bộ giữa các microservices một cách hiệu quả. (3) Mở rộng chức năng thanh toán hóa đơn điện/nước và kết nối với các cổng thanh toán điện tử phổ biến tại Việt Nam.</w:t>
       </w:r>
     </w:p>
     <w:p>
@@ -3322,7 +3286,7 @@
     <w:link w:val="Heading1Char"/>
     <w:uiPriority w:val="9"/>
     <w:qFormat/>
-    <w:rsid w:val="001772D0"/>
+    <w:rsid w:val="007E5285"/>
     <w:pPr>
       <w:keepNext/>
       <w:keepLines/>
@@ -3344,7 +3308,7 @@
     <w:uiPriority w:val="9"/>
     <w:unhideWhenUsed/>
     <w:qFormat/>
-    <w:rsid w:val="001772D0"/>
+    <w:rsid w:val="007E5285"/>
     <w:pPr>
       <w:keepNext/>
       <w:keepLines/>
@@ -3367,7 +3331,7 @@
     <w:semiHidden/>
     <w:unhideWhenUsed/>
     <w:qFormat/>
-    <w:rsid w:val="001772D0"/>
+    <w:rsid w:val="007E5285"/>
     <w:pPr>
       <w:keepNext/>
       <w:keepLines/>
@@ -3390,7 +3354,7 @@
     <w:semiHidden/>
     <w:unhideWhenUsed/>
     <w:qFormat/>
-    <w:rsid w:val="001772D0"/>
+    <w:rsid w:val="007E5285"/>
     <w:pPr>
       <w:keepNext/>
       <w:keepLines/>
@@ -3413,7 +3377,7 @@
     <w:semiHidden/>
     <w:unhideWhenUsed/>
     <w:qFormat/>
-    <w:rsid w:val="001772D0"/>
+    <w:rsid w:val="007E5285"/>
     <w:pPr>
       <w:keepNext/>
       <w:keepLines/>
@@ -3434,7 +3398,7 @@
     <w:semiHidden/>
     <w:unhideWhenUsed/>
     <w:qFormat/>
-    <w:rsid w:val="001772D0"/>
+    <w:rsid w:val="007E5285"/>
     <w:pPr>
       <w:keepNext/>
       <w:keepLines/>
@@ -3457,7 +3421,7 @@
     <w:semiHidden/>
     <w:unhideWhenUsed/>
     <w:qFormat/>
-    <w:rsid w:val="001772D0"/>
+    <w:rsid w:val="007E5285"/>
     <w:pPr>
       <w:keepNext/>
       <w:keepLines/>
@@ -3478,7 +3442,7 @@
     <w:semiHidden/>
     <w:unhideWhenUsed/>
     <w:qFormat/>
-    <w:rsid w:val="001772D0"/>
+    <w:rsid w:val="007E5285"/>
     <w:pPr>
       <w:keepNext/>
       <w:keepLines/>
@@ -3501,7 +3465,7 @@
     <w:semiHidden/>
     <w:unhideWhenUsed/>
     <w:qFormat/>
-    <w:rsid w:val="001772D0"/>
+    <w:rsid w:val="007E5285"/>
     <w:pPr>
       <w:keepNext/>
       <w:keepLines/>
@@ -3545,7 +3509,7 @@
     <w:basedOn w:val="DefaultParagraphFont"/>
     <w:link w:val="Heading1"/>
     <w:uiPriority w:val="9"/>
-    <w:rsid w:val="001772D0"/>
+    <w:rsid w:val="007E5285"/>
     <w:rPr>
       <w:rFonts w:asciiTheme="majorHAnsi" w:eastAsiaTheme="majorEastAsia" w:hAnsiTheme="majorHAnsi" w:cstheme="majorBidi"/>
       <w:color w:val="0F4761" w:themeColor="accent1" w:themeShade="BF"/>
@@ -3558,7 +3522,7 @@
     <w:basedOn w:val="DefaultParagraphFont"/>
     <w:link w:val="Heading2"/>
     <w:uiPriority w:val="9"/>
-    <w:rsid w:val="001772D0"/>
+    <w:rsid w:val="007E5285"/>
     <w:rPr>
       <w:rFonts w:asciiTheme="majorHAnsi" w:eastAsiaTheme="majorEastAsia" w:hAnsiTheme="majorHAnsi" w:cstheme="majorBidi"/>
       <w:color w:val="0F4761" w:themeColor="accent1" w:themeShade="BF"/>
@@ -3572,7 +3536,7 @@
     <w:link w:val="Heading3"/>
     <w:uiPriority w:val="9"/>
     <w:semiHidden/>
-    <w:rsid w:val="001772D0"/>
+    <w:rsid w:val="007E5285"/>
     <w:rPr>
       <w:rFonts w:eastAsiaTheme="majorEastAsia" w:cstheme="majorBidi"/>
       <w:color w:val="0F4761" w:themeColor="accent1" w:themeShade="BF"/>
@@ -3586,7 +3550,7 @@
     <w:link w:val="Heading4"/>
     <w:uiPriority w:val="9"/>
     <w:semiHidden/>
-    <w:rsid w:val="001772D0"/>
+    <w:rsid w:val="007E5285"/>
     <w:rPr>
       <w:rFonts w:eastAsiaTheme="majorEastAsia" w:cstheme="majorBidi"/>
       <w:i/>
@@ -3600,7 +3564,7 @@
     <w:link w:val="Heading5"/>
     <w:uiPriority w:val="9"/>
     <w:semiHidden/>
-    <w:rsid w:val="001772D0"/>
+    <w:rsid w:val="007E5285"/>
     <w:rPr>
       <w:rFonts w:eastAsiaTheme="majorEastAsia" w:cstheme="majorBidi"/>
       <w:color w:val="0F4761" w:themeColor="accent1" w:themeShade="BF"/>
@@ -3612,7 +3576,7 @@
     <w:link w:val="Heading6"/>
     <w:uiPriority w:val="9"/>
     <w:semiHidden/>
-    <w:rsid w:val="001772D0"/>
+    <w:rsid w:val="007E5285"/>
     <w:rPr>
       <w:rFonts w:eastAsiaTheme="majorEastAsia" w:cstheme="majorBidi"/>
       <w:i/>
@@ -3626,7 +3590,7 @@
     <w:link w:val="Heading7"/>
     <w:uiPriority w:val="9"/>
     <w:semiHidden/>
-    <w:rsid w:val="001772D0"/>
+    <w:rsid w:val="007E5285"/>
     <w:rPr>
       <w:rFonts w:eastAsiaTheme="majorEastAsia" w:cstheme="majorBidi"/>
       <w:color w:val="595959" w:themeColor="text1" w:themeTint="A6"/>
@@ -3638,7 +3602,7 @@
     <w:link w:val="Heading8"/>
     <w:uiPriority w:val="9"/>
     <w:semiHidden/>
-    <w:rsid w:val="001772D0"/>
+    <w:rsid w:val="007E5285"/>
     <w:rPr>
       <w:rFonts w:eastAsiaTheme="majorEastAsia" w:cstheme="majorBidi"/>
       <w:i/>
@@ -3652,7 +3616,7 @@
     <w:link w:val="Heading9"/>
     <w:uiPriority w:val="9"/>
     <w:semiHidden/>
-    <w:rsid w:val="001772D0"/>
+    <w:rsid w:val="007E5285"/>
     <w:rPr>
       <w:rFonts w:eastAsiaTheme="majorEastAsia" w:cstheme="majorBidi"/>
       <w:color w:val="272727" w:themeColor="text1" w:themeTint="D8"/>
@@ -3665,7 +3629,7 @@
     <w:link w:val="TitleChar"/>
     <w:uiPriority w:val="10"/>
     <w:qFormat/>
-    <w:rsid w:val="001772D0"/>
+    <w:rsid w:val="007E5285"/>
     <w:pPr>
       <w:spacing w:after="80" w:line="240" w:lineRule="auto"/>
       <w:contextualSpacing/>
@@ -3683,7 +3647,7 @@
     <w:basedOn w:val="DefaultParagraphFont"/>
     <w:link w:val="Title"/>
     <w:uiPriority w:val="10"/>
-    <w:rsid w:val="001772D0"/>
+    <w:rsid w:val="007E5285"/>
     <w:rPr>
       <w:rFonts w:asciiTheme="majorHAnsi" w:eastAsiaTheme="majorEastAsia" w:hAnsiTheme="majorHAnsi" w:cstheme="majorBidi"/>
       <w:spacing w:val="-10"/>
@@ -3699,7 +3663,7 @@
     <w:link w:val="SubtitleChar"/>
     <w:uiPriority w:val="11"/>
     <w:qFormat/>
-    <w:rsid w:val="001772D0"/>
+    <w:rsid w:val="007E5285"/>
     <w:pPr>
       <w:numPr>
         <w:ilvl w:val="1"/>
@@ -3718,7 +3682,7 @@
     <w:basedOn w:val="DefaultParagraphFont"/>
     <w:link w:val="Subtitle"/>
     <w:uiPriority w:val="11"/>
-    <w:rsid w:val="001772D0"/>
+    <w:rsid w:val="007E5285"/>
     <w:rPr>
       <w:rFonts w:eastAsiaTheme="majorEastAsia" w:cstheme="majorBidi"/>
       <w:color w:val="595959" w:themeColor="text1" w:themeTint="A6"/>
@@ -3734,7 +3698,7 @@
     <w:link w:val="QuoteChar"/>
     <w:uiPriority w:val="29"/>
     <w:qFormat/>
-    <w:rsid w:val="001772D0"/>
+    <w:rsid w:val="007E5285"/>
     <w:pPr>
       <w:spacing w:before="160"/>
       <w:jc w:val="center"/>
@@ -3750,7 +3714,7 @@
     <w:basedOn w:val="DefaultParagraphFont"/>
     <w:link w:val="Quote"/>
     <w:uiPriority w:val="29"/>
-    <w:rsid w:val="001772D0"/>
+    <w:rsid w:val="007E5285"/>
     <w:rPr>
       <w:i/>
       <w:iCs/>
@@ -3762,7 +3726,7 @@
     <w:basedOn w:val="Normal"/>
     <w:uiPriority w:val="34"/>
     <w:qFormat/>
-    <w:rsid w:val="001772D0"/>
+    <w:rsid w:val="007E5285"/>
     <w:pPr>
       <w:ind w:left="720"/>
       <w:contextualSpacing/>
@@ -3773,7 +3737,7 @@
     <w:basedOn w:val="DefaultParagraphFont"/>
     <w:uiPriority w:val="21"/>
     <w:qFormat/>
-    <w:rsid w:val="001772D0"/>
+    <w:rsid w:val="007E5285"/>
     <w:rPr>
       <w:i/>
       <w:iCs/>
@@ -3787,7 +3751,7 @@
     <w:link w:val="IntenseQuoteChar"/>
     <w:uiPriority w:val="30"/>
     <w:qFormat/>
-    <w:rsid w:val="001772D0"/>
+    <w:rsid w:val="007E5285"/>
     <w:pPr>
       <w:pBdr>
         <w:top w:val="single" w:sz="4" w:space="10" w:color="0F4761" w:themeColor="accent1" w:themeShade="BF"/>
@@ -3808,7 +3772,7 @@
     <w:basedOn w:val="DefaultParagraphFont"/>
     <w:link w:val="IntenseQuote"/>
     <w:uiPriority w:val="30"/>
-    <w:rsid w:val="001772D0"/>
+    <w:rsid w:val="007E5285"/>
     <w:rPr>
       <w:i/>
       <w:iCs/>
@@ -3820,7 +3784,7 @@
     <w:basedOn w:val="DefaultParagraphFont"/>
     <w:uiPriority w:val="32"/>
     <w:qFormat/>
-    <w:rsid w:val="001772D0"/>
+    <w:rsid w:val="007E5285"/>
     <w:rPr>
       <w:b/>
       <w:bCs/>

</xml_diff>

<commit_message>
docs: generate structured report with chapters, happy/exceptional flows
</commit_message>
<xml_diff>
--- a/Bao_cao_do_an_NLU_Banking.docx
+++ b/Bao_cao_do_an_NLU_Banking.docx
@@ -646,7 +646,7 @@
                 <w:b/>
                 <w:sz w:val="26"/>
               </w:rPr>
-              <w:t>CHƯƠNG 1. GIỚI THIỆU DỰ ÁN</w:t>
+              <w:t>CHƯƠNG 1. GIỚI THIỆU TỔNG QUAN VÀ LIỆT KÊ CHỨC NĂNG DỰ ÁN</w:t>
             </w:r>
           </w:p>
         </w:tc>
@@ -702,7 +702,7 @@
                 <w:b/>
                 <w:sz w:val="26"/>
               </w:rPr>
-              <w:t xml:space="preserve">  1.1. Bối cảnh và lý do chọn đề tài</w:t>
+              <w:t xml:space="preserve">  1.1. Giới thiệu ứng dụng NLU Banking App</w:t>
             </w:r>
           </w:p>
         </w:tc>
@@ -758,7 +758,7 @@
                 <w:b/>
                 <w:sz w:val="26"/>
               </w:rPr>
-              <w:t xml:space="preserve">  1.2. Mục tiêu của đồ án</w:t>
+              <w:t xml:space="preserve">  1.2. Danh sách các chức năng lớn của hệ thống</w:t>
             </w:r>
           </w:p>
         </w:tc>
@@ -814,7 +814,7 @@
                 <w:b/>
                 <w:sz w:val="26"/>
               </w:rPr>
-              <w:t xml:space="preserve">  1.3. Phạm vi nghiên cứu và triển khai</w:t>
+              <w:t xml:space="preserve">  1.3. Chi tiết các chức năng nhỏ đi kèm</w:t>
             </w:r>
           </w:p>
         </w:tc>
@@ -870,7 +870,7 @@
                 <w:b/>
                 <w:sz w:val="26"/>
               </w:rPr>
-              <w:t>CHƯƠNG 2. PHÂN TÍCH YÊU CẦU NGHIỆP VỤ</w:t>
+              <w:t>CHƯƠNG 2. MÔ TẢ LUỒNG HOẠT ĐỘNG CHÍNH VÀ LUỒNG NGOẠI LỆ</w:t>
             </w:r>
           </w:p>
         </w:tc>
@@ -926,7 +926,7 @@
                 <w:b/>
                 <w:sz w:val="26"/>
               </w:rPr>
-              <w:t xml:space="preserve">  2.1. Yêu cầu chức năng hệ thống</w:t>
+              <w:t xml:space="preserve">  2.1. Luồng hoạt động chính (Happy Paths)</w:t>
             </w:r>
           </w:p>
         </w:tc>
@@ -982,7 +982,7 @@
                 <w:b/>
                 <w:sz w:val="26"/>
               </w:rPr>
-              <w:t xml:space="preserve">  2.2. Yêu cầu phi chức năng</w:t>
+              <w:t xml:space="preserve">  2.2. Luồng xử lý ngoại lệ và ràng buộc logic (Exceptional Flows)</w:t>
             </w:r>
           </w:p>
         </w:tc>
@@ -1006,7 +1006,7 @@
                 <w:b/>
                 <w:sz w:val="26"/>
               </w:rPr>
-              <w:t>5</w:t>
+              <w:t>6</w:t>
             </w:r>
           </w:p>
         </w:tc>
@@ -1038,7 +1038,7 @@
                 <w:b/>
                 <w:sz w:val="26"/>
               </w:rPr>
-              <w:t xml:space="preserve">  2.3. Tác nhân hệ thống và Use Cases chính</w:t>
+              <w:t>CHƯƠNG 3. CẤU TRÚC HỆ THỐNG MULTI-SERVICE VÀ BẢO MẬT KEYCLOAK</w:t>
             </w:r>
           </w:p>
         </w:tc>
@@ -1062,7 +1062,7 @@
                 <w:b/>
                 <w:sz w:val="26"/>
               </w:rPr>
-              <w:t>6</w:t>
+              <w:t>7</w:t>
             </w:r>
           </w:p>
         </w:tc>
@@ -1094,7 +1094,7 @@
                 <w:b/>
                 <w:sz w:val="26"/>
               </w:rPr>
-              <w:t>CHƯƠNG 3. THIẾT KẾ KIẾN TRÚC VÀ CƠ SỞ DỮ LIỆU</w:t>
+              <w:t xml:space="preserve">  3.1. Cấu trúc Multi-service (Microservices) độc lập</w:t>
             </w:r>
           </w:p>
         </w:tc>
@@ -1150,7 +1150,7 @@
                 <w:b/>
                 <w:sz w:val="26"/>
               </w:rPr>
-              <w:t xml:space="preserve">  3.1. Kiến trúc hệ thống Microservices</w:t>
+              <w:t xml:space="preserve">  3.2. Cơ chế bảo mật và phân quyền định danh với Keycloak</w:t>
             </w:r>
           </w:p>
         </w:tc>
@@ -1174,7 +1174,7 @@
                 <w:b/>
                 <w:sz w:val="26"/>
               </w:rPr>
-              <w:t>7</w:t>
+              <w:t>8</w:t>
             </w:r>
           </w:p>
         </w:tc>
@@ -1206,7 +1206,7 @@
                 <w:b/>
                 <w:sz w:val="26"/>
               </w:rPr>
-              <w:t xml:space="preserve">  3.2. Thiết kế Cơ sở dữ liệu chi tiết</w:t>
+              <w:t>CHƯƠNG 4. THÀNH TỰU VÀ CÔNG NGHỆ ÁP DỤNG TRONG DỰ ÁN</w:t>
             </w:r>
           </w:p>
         </w:tc>
@@ -1230,7 +1230,7 @@
                 <w:b/>
                 <w:sz w:val="26"/>
               </w:rPr>
-              <w:t>7</w:t>
+              <w:t>9</w:t>
             </w:r>
           </w:p>
         </w:tc>
@@ -1262,7 +1262,7 @@
                 <w:b/>
                 <w:sz w:val="26"/>
               </w:rPr>
-              <w:t xml:space="preserve">  3.3. Quy trình xác thực phân tán qua Keycloak</w:t>
+              <w:t xml:space="preserve">  4.1. Thành tựu tự hào về kiến trúc API và Spring Boot</w:t>
             </w:r>
           </w:p>
         </w:tc>
@@ -1286,7 +1286,7 @@
                 <w:b/>
                 <w:sz w:val="26"/>
               </w:rPr>
-              <w:t>8</w:t>
+              <w:t>9</w:t>
             </w:r>
           </w:p>
         </w:tc>
@@ -1318,7 +1318,7 @@
                 <w:b/>
                 <w:sz w:val="26"/>
               </w:rPr>
-              <w:t xml:space="preserve">  3.4. Các công nghệ cốt lõi sử dụng</w:t>
+              <w:t xml:space="preserve">  4.2. Tối ưu hóa hiệu năng giao tiếp và đồng bộ dữ liệu</w:t>
             </w:r>
           </w:p>
         </w:tc>
@@ -1342,7 +1342,7 @@
                 <w:b/>
                 <w:sz w:val="26"/>
               </w:rPr>
-              <w:t>8</w:t>
+              <w:t>9</w:t>
             </w:r>
           </w:p>
         </w:tc>
@@ -1374,7 +1374,7 @@
                 <w:b/>
                 <w:sz w:val="26"/>
               </w:rPr>
-              <w:t>CHƯƠNG 4. CÀI ĐẶT CHI TIẾT VÀ VẬN HÀNH</w:t>
+              <w:t>CHƯƠNG 5. HƯỚNG DẪN CẤU HÌNH VÀ KHỞI CHẠY ĐỒ ÁN</w:t>
             </w:r>
           </w:p>
         </w:tc>
@@ -1398,7 +1398,7 @@
                 <w:b/>
                 <w:sz w:val="26"/>
               </w:rPr>
-              <w:t>9</w:t>
+              <w:t>11</w:t>
             </w:r>
           </w:p>
         </w:tc>
@@ -1430,7 +1430,7 @@
                 <w:b/>
                 <w:sz w:val="26"/>
               </w:rPr>
-              <w:t xml:space="preserve">  4.1. Cấu trúc dự án di động Android</w:t>
+              <w:t xml:space="preserve">  5.1. Thiết lập môi trường và khởi chạy Docker Compose</w:t>
             </w:r>
           </w:p>
         </w:tc>
@@ -1454,7 +1454,7 @@
                 <w:b/>
                 <w:sz w:val="26"/>
               </w:rPr>
-              <w:t>9</w:t>
+              <w:t>11</w:t>
             </w:r>
           </w:p>
         </w:tc>
@@ -1486,7 +1486,7 @@
                 <w:b/>
                 <w:sz w:val="26"/>
               </w:rPr>
-              <w:t xml:space="preserve">  4.2. Các màn hình chức năng chính trên ứng dụng di động</w:t>
+              <w:t xml:space="preserve">  5.2. Các bước cấu hình Keycloak Realm và Client</w:t>
             </w:r>
           </w:p>
         </w:tc>
@@ -1510,7 +1510,7 @@
                 <w:b/>
                 <w:sz w:val="26"/>
               </w:rPr>
-              <w:t>9</w:t>
+              <w:t>11</w:t>
             </w:r>
           </w:p>
         </w:tc>
@@ -1542,7 +1542,7 @@
                 <w:b/>
                 <w:sz w:val="26"/>
               </w:rPr>
-              <w:t xml:space="preserve">  4.3. Cài đặt triển khai trên máy tính thử nghiệm</w:t>
+              <w:t xml:space="preserve">  5.3. Khởi chạy 7 Microservices Spring Boot bằng Script</w:t>
             </w:r>
           </w:p>
         </w:tc>
@@ -1566,7 +1566,7 @@
                 <w:b/>
                 <w:sz w:val="26"/>
               </w:rPr>
-              <w:t>10</w:t>
+              <w:t>12</w:t>
             </w:r>
           </w:p>
         </w:tc>
@@ -1598,7 +1598,7 @@
                 <w:b/>
                 <w:sz w:val="26"/>
               </w:rPr>
-              <w:t>CHƯƠNG 5. TỔNG KẾT VÀ HƯỚNG PHÁT TRIỂN</w:t>
+              <w:t>CHƯƠNG 6. TỔNG KẾT VÀ HƯỚNG PHÁT TRIỂN TƯƠNG LAI</w:t>
             </w:r>
           </w:p>
         </w:tc>
@@ -1622,7 +1622,7 @@
                 <w:b/>
                 <w:sz w:val="26"/>
               </w:rPr>
-              <w:t>11</w:t>
+              <w:t>13</w:t>
             </w:r>
           </w:p>
         </w:tc>
@@ -1654,7 +1654,7 @@
                 <w:b/>
                 <w:sz w:val="26"/>
               </w:rPr>
-              <w:t xml:space="preserve">  5.1. Kết quả đạt được của đồ án</w:t>
+              <w:t xml:space="preserve">  6.1. Đánh giá kết quả đạt được của đồ án</w:t>
             </w:r>
           </w:p>
         </w:tc>
@@ -1678,7 +1678,7 @@
                 <w:b/>
                 <w:sz w:val="26"/>
               </w:rPr>
-              <w:t>11</w:t>
+              <w:t>13</w:t>
             </w:r>
           </w:p>
         </w:tc>
@@ -1710,7 +1710,7 @@
                 <w:b/>
                 <w:sz w:val="26"/>
               </w:rPr>
-              <w:t xml:space="preserve">  5.2. Ưu điểm và Hạn chế còn tồn tại</w:t>
+              <w:t xml:space="preserve">  6.2. Hướng phát triển nâng cấp hệ thống</w:t>
             </w:r>
           </w:p>
         </w:tc>
@@ -1734,63 +1734,7 @@
                 <w:b/>
                 <w:sz w:val="26"/>
               </w:rPr>
-              <w:t>11</w:t>
-            </w:r>
-          </w:p>
-        </w:tc>
-      </w:tr>
-      <w:tr>
-        <w:tblPrEx>
-          <w:tblCellMar>
-            <w:top w:w="0" w:type="dxa"/>
-            <w:bottom w:w="0" w:type="dxa"/>
-          </w:tblCellMar>
-        </w:tblPrEx>
-        <w:tc>
-          <w:tcPr>
-            <w:tcW w:w="7654" w:type="dxa"/>
-          </w:tcPr>
-          <w:p>
-            <w:pPr>
-              <w:spacing w:before="240" w:after="480" w:line="248" w:lineRule="auto"/>
-              <w:jc w:val="center"/>
-              <w:rPr>
-                <w:rFonts w:ascii="Times New Roman" w:hAnsi="Times New Roman" w:cs="Times New Roman"/>
-                <w:b/>
-                <w:sz w:val="26"/>
-              </w:rPr>
-            </w:pPr>
-            <w:r>
-              <w:rPr>
-                <w:rFonts w:ascii="Times New Roman" w:hAnsi="Times New Roman" w:cs="Times New Roman"/>
-                <w:b/>
-                <w:sz w:val="26"/>
-              </w:rPr>
-              <w:t xml:space="preserve">  5.3. Hướng phát triển tương lai</w:t>
-            </w:r>
-          </w:p>
-        </w:tc>
-        <w:tc>
-          <w:tcPr>
-            <w:tcW w:w="850" w:type="dxa"/>
-          </w:tcPr>
-          <w:p>
-            <w:pPr>
-              <w:spacing w:before="240" w:after="480" w:line="248" w:lineRule="auto"/>
-              <w:jc w:val="right"/>
-              <w:rPr>
-                <w:rFonts w:ascii="Times New Roman" w:hAnsi="Times New Roman" w:cs="Times New Roman"/>
-                <w:b/>
-                <w:sz w:val="26"/>
-              </w:rPr>
-            </w:pPr>
-            <w:r>
-              <w:rPr>
-                <w:rFonts w:ascii="Times New Roman" w:hAnsi="Times New Roman" w:cs="Times New Roman"/>
-                <w:b/>
-                <w:sz w:val="26"/>
-              </w:rPr>
-              <w:t>12</w:t>
+              <w:t>13</w:t>
             </w:r>
           </w:p>
         </w:tc>
@@ -1854,7 +1798,7 @@
           <w:sz w:val="32"/>
           <w:szCs w:val="40"/>
         </w:rPr>
-        <w:t>CHƯƠNG 1. GIỚI THIỆU DỰ ÁN</w:t>
+        <w:t>CHƯƠNG 1. GIỚI THIỆU TỔNG QUAN VÀ LIỆT KÊ CHỨC NĂNG DỰ ÁN</w:t>
       </w:r>
     </w:p>
     <w:p>
@@ -1876,7 +1820,7 @@
           <w:sz w:val="28"/>
           <w:szCs w:val="32"/>
         </w:rPr>
-        <w:t>1.1. Bối cảnh và lý do chọn đề tài</w:t>
+        <w:t>1.1. Giới thiệu ứng dụng NLU Banking App</w:t>
       </w:r>
     </w:p>
     <w:p>
@@ -1893,7 +1837,7 @@
           <w:rFonts w:ascii="Times New Roman" w:hAnsi="Times New Roman" w:cs="Times New Roman"/>
           <w:sz w:val="26"/>
         </w:rPr>
-        <w:t>Trong thời đại cách mạng công nghiệp 4.0, sự phát triển vượt bậc của các nền tảng tài chính số (Fintech) đã thúc đẩy cuộc chuyển dịch mạnh mẽ từ các phương thức giao dịch truyền thống tại quầy sang giao dịch điện tử. Tại Việt Nam, nhu cầu thanh toán trực tuyến qua mã QR, quản lý thẻ, và chuyển khoản nhanh qua di động của khách hàng đang tăng trưởng nhanh chóng. Điều này đặt ra bài toán tối ưu về bảo mật hệ thống và kiến trúc phần mềm cho các ứng dụng ngân hàng di động. Nhóm chúng tôi đã quyết định chọn đề tài 'Phát triển Ứng dụng Ngân hàng Di động NLU Banking App' nhằm áp dụng kiến trúc phân tán Microservices cho phía backend và xây dựng ứng dụng di động native trên hệ điều hành Android. Sự kết hợp này mang lại cơ hội nghiên cứu sâu sắc về khả năng tự động hóa, tính độc lập của từng module dịch vụ và cơ chế bảo mật xác thực phân tán qua Keycloak.</w:t>
+        <w:t>NLU Banking App là một giải pháp ứng dụng ngân hàng di động toàn diện mô phỏng môi trường giao dịch thực tế của một ngân hàng thương mại hiện đại. Ứng dụng cung cấp các dịch vụ tài chính cá nhân trực tuyến thông qua nền tảng Android Client giao tiếp an toàn với hệ thống backend phân tán multi-service. Hệ thống được thiết kế nhằm đáp ứng các yêu cầu khắt khe về hiệu năng xử lý, tính an toàn thông tin và trải nghiệm người dùng trong thời đại ngân hàng số phát triển mạnh mẽ.</w:t>
       </w:r>
     </w:p>
     <w:p>
@@ -1915,7 +1859,7 @@
           <w:sz w:val="28"/>
           <w:szCs w:val="32"/>
         </w:rPr>
-        <w:t>1.2. Mục tiêu của đồ án</w:t>
+        <w:t>1.2. Danh sách các chức năng lớn của hệ thống</w:t>
       </w:r>
     </w:p>
     <w:p>
@@ -1932,7 +1876,7 @@
           <w:rFonts w:ascii="Times New Roman" w:hAnsi="Times New Roman" w:cs="Times New Roman"/>
           <w:sz w:val="26"/>
         </w:rPr>
-        <w:t>Đồ án hướng tới việc thiết kế và xây dựng một hệ thống ngân hàng di động giả lập hoàn chỉnh, đạt được các mục tiêu khoa học và thực tiễn sau: (1) Thiết kế giao diện di động native trên hệ điều hành Android trực quan, mượt mà bằng ngôn ngữ Java, tập trung tối ưu trải nghiệm người dùng cuối. (2) Triển khai hệ thống backend gồm các microservices độc lập, giao tiếp thông qua RESTful API và quản lý tập trung bởi API Gateway kết hợp Eureka Service Registry. (3) Tích hợp máy chủ xác thực Keycloak (OAuth2/OIDC) để bảo mật hệ thống, quản lý phiên đăng nhập và bảo vệ dữ liệu khách hàng. (4) Cài đặt thành công các nghiệp vụ giao dịch ngân hàng cốt lõi bao gồm: đăng ký và kích hoạt tài khoản bằng mã OTP gửi qua email, truy vấn số dư tài khoản, nạp/rút tiền, chuyển khoản nội bộ bảo mật, xem lịch sử biến động số dư và chuyển khoản bằng mã QR.</w:t>
+        <w:t>Hệ thống NLU Banking App được tổ chức và phân chia thành các nhóm chức năng lớn bao gồm: (1) Nhóm chức năng Quản lý định danh và Đăng ký kích hoạt tài khoản. (2) Nhóm chức năng Truy vấn thông tin và Quản lý số dư tài khoản thanh toán trực tuyến. (3) Nhóm chức năng Giao dịch chuyển khoản nội bộ bảo mật 2 lớp. (4) Nhóm chức năng Nạp tiền và Rút tiền giả lập tại quầy/ATM. (5) Nhóm chức năng Chuyển khoản thông minh qua quét mã QR Code.</w:t>
       </w:r>
     </w:p>
     <w:p>
@@ -1954,7 +1898,7 @@
           <w:sz w:val="28"/>
           <w:szCs w:val="32"/>
         </w:rPr>
-        <w:t>1.3. Phạm vi nghiên cứu và triển khai</w:t>
+        <w:t>1.3. Chi tiết các chức năng nhỏ đi kèm</w:t>
       </w:r>
     </w:p>
     <w:p>
@@ -1971,7 +1915,126 @@
           <w:rFonts w:ascii="Times New Roman" w:hAnsi="Times New Roman" w:cs="Times New Roman"/>
           <w:sz w:val="26"/>
         </w:rPr>
-        <w:t>Đồ án tập trung nghiên cứu kiến trúc microservices và xác thực tập trung. Về nghiệp vụ, ứng dụng chỉ tập trung vào các giao dịch nội bộ trong ngân hàng NLU Banking, chưa kết nối trực tiếp với hệ thống thanh toán liên ngân hàng thực tế. Về mặt triển khai, ứng dụng di động Android chạy ổn định trên các phiên bản Android 8.0 trở lên. Backend và cơ sở dữ liệu được cấu hình triển khai cục bộ (local) trên máy chủ thử nghiệm thông qua Docker Compose.</w:t>
+        <w:t>Các nhóm chức năng lớn được chia nhỏ thành các tính năng chi tiết đáp ứng nhu cầu thực tế của khách hàng:</w:t>
+      </w:r>
+    </w:p>
+    <w:p>
+      <w:pPr>
+        <w:spacing w:after="80" w:line="248" w:lineRule="auto"/>
+        <w:jc w:val="both"/>
+        <w:rPr>
+          <w:rFonts w:ascii="Times New Roman" w:hAnsi="Times New Roman" w:cs="Times New Roman"/>
+          <w:sz w:val="26"/>
+        </w:rPr>
+      </w:pPr>
+      <w:r>
+        <w:rPr>
+          <w:rFonts w:ascii="Times New Roman" w:hAnsi="Times New Roman" w:cs="Times New Roman"/>
+          <w:sz w:val="26"/>
+        </w:rPr>
+        <w:t xml:space="preserve">  - Chức năng Tạo và Quét mã QR thanh toán: Hệ thống cho phép người dùng tự sinh mã QR chứa số tài khoản cá nhân để người khác chuyển tiền nhanh. Đồng thời, camera quét mã QR tích hợp trên app tự động phân tích và điền chính xác thông tin tài khoản nhận tiền.</w:t>
+      </w:r>
+    </w:p>
+    <w:p>
+      <w:pPr>
+        <w:spacing w:after="80" w:line="248" w:lineRule="auto"/>
+        <w:jc w:val="both"/>
+        <w:rPr>
+          <w:rFonts w:ascii="Times New Roman" w:hAnsi="Times New Roman" w:cs="Times New Roman"/>
+          <w:sz w:val="26"/>
+        </w:rPr>
+      </w:pPr>
+      <w:r>
+        <w:rPr>
+          <w:rFonts w:ascii="Times New Roman" w:hAnsi="Times New Roman" w:cs="Times New Roman"/>
+          <w:sz w:val="26"/>
+        </w:rPr>
+        <w:t xml:space="preserve">  - Chức năng Hiển thị số dư tài khoản trực quan: Trên màn hình trang chủ, thông tin số tài khoản thanh toán và số dư khả dụng thực tế được hiển thị rõ ràng, cập nhật ngay lập tức sau khi xảy ra bất kỳ biến động số dư nào.</w:t>
+      </w:r>
+    </w:p>
+    <w:p>
+      <w:pPr>
+        <w:spacing w:after="80" w:line="248" w:lineRule="auto"/>
+        <w:jc w:val="both"/>
+        <w:rPr>
+          <w:rFonts w:ascii="Times New Roman" w:hAnsi="Times New Roman" w:cs="Times New Roman"/>
+          <w:sz w:val="26"/>
+        </w:rPr>
+      </w:pPr>
+      <w:r>
+        <w:rPr>
+          <w:rFonts w:ascii="Times New Roman" w:hAnsi="Times New Roman" w:cs="Times New Roman"/>
+          <w:sz w:val="26"/>
+        </w:rPr>
+        <w:t xml:space="preserve">  - Chức năng Đăng ký tài khoản kèm mã OTP: Cho phép người dùng nhập Họ tên, Email, SĐT và CCCD. Hệ thống gửi mã xác thực OTP qua email và kích hoạt tài khoản ngay khi người dùng nhập đúng mã.</w:t>
+      </w:r>
+    </w:p>
+    <w:p>
+      <w:pPr>
+        <w:spacing w:after="80" w:line="248" w:lineRule="auto"/>
+        <w:jc w:val="both"/>
+        <w:rPr>
+          <w:rFonts w:ascii="Times New Roman" w:hAnsi="Times New Roman" w:cs="Times New Roman"/>
+          <w:sz w:val="26"/>
+        </w:rPr>
+      </w:pPr>
+      <w:r>
+        <w:rPr>
+          <w:rFonts w:ascii="Times New Roman" w:hAnsi="Times New Roman" w:cs="Times New Roman"/>
+          <w:sz w:val="26"/>
+        </w:rPr>
+        <w:t xml:space="preserve">  - Chức năng Đăng nhập bảo mật: Đăng nhập an toàn bằng Email và Mật khẩu thông qua máy chủ Keycloak OIDC, bảo vệ phiên làm việc của người dùng bằng Access Token.</w:t>
+      </w:r>
+    </w:p>
+    <w:p>
+      <w:pPr>
+        <w:spacing w:after="80" w:line="248" w:lineRule="auto"/>
+        <w:jc w:val="both"/>
+        <w:rPr>
+          <w:rFonts w:ascii="Times New Roman" w:hAnsi="Times New Roman" w:cs="Times New Roman"/>
+          <w:sz w:val="26"/>
+        </w:rPr>
+      </w:pPr>
+      <w:r>
+        <w:rPr>
+          <w:rFonts w:ascii="Times New Roman" w:hAnsi="Times New Roman" w:cs="Times New Roman"/>
+          <w:sz w:val="26"/>
+        </w:rPr>
+        <w:t xml:space="preserve">  - Chức năng Chuyển khoản nội bộ: Nhập số tài khoản thụ hưởng, tự động hiển thị tên người nhận để xác minh trước khi cho phép nhập số tiền và nội dung chuyển tiền, yêu cầu mã OTP giao dịch để hoàn tất.</w:t>
+      </w:r>
+    </w:p>
+    <w:p>
+      <w:pPr>
+        <w:spacing w:after="80" w:line="248" w:lineRule="auto"/>
+        <w:jc w:val="both"/>
+        <w:rPr>
+          <w:rFonts w:ascii="Times New Roman" w:hAnsi="Times New Roman" w:cs="Times New Roman"/>
+          <w:sz w:val="26"/>
+        </w:rPr>
+      </w:pPr>
+      <w:r>
+        <w:rPr>
+          <w:rFonts w:ascii="Times New Roman" w:hAnsi="Times New Roman" w:cs="Times New Roman"/>
+          <w:sz w:val="26"/>
+        </w:rPr>
+        <w:t xml:space="preserve">  - Chức năng Rút tiền và Nạp tiền giả lập: Khách hàng có thể thực hiện nạp tiền hoặc rút tiền trực tiếp trên ứng dụng để thay đổi số dư tài khoản thanh toán.</w:t>
+      </w:r>
+    </w:p>
+    <w:p>
+      <w:pPr>
+        <w:spacing w:after="120" w:line="248" w:lineRule="auto"/>
+        <w:jc w:val="both"/>
+        <w:rPr>
+          <w:rFonts w:ascii="Times New Roman" w:hAnsi="Times New Roman" w:cs="Times New Roman"/>
+          <w:sz w:val="26"/>
+        </w:rPr>
+      </w:pPr>
+      <w:r>
+        <w:rPr>
+          <w:rFonts w:ascii="Times New Roman" w:hAnsi="Times New Roman" w:cs="Times New Roman"/>
+          <w:sz w:val="26"/>
+        </w:rPr>
+        <w:t xml:space="preserve">  - Chức năng Lịch sử giao dịch: Hiển thị danh sách đầy đủ lịch sử giao dịch chuyển khoản, nạp/rút tiền kèm thông tin mô tả chi tiết của từng giao dịch.</w:t>
       </w:r>
     </w:p>
     <w:p>
@@ -1993,7 +2056,7 @@
           <w:sz w:val="32"/>
           <w:szCs w:val="40"/>
         </w:rPr>
-        <w:t>CHƯƠNG 2. PHÂN TÍCH YÊU CẦU NGHIỆP VỤ</w:t>
+        <w:t>CHƯƠNG 2. MÔ TẢ LUỒNG HOẠT ĐỘNG CHÍNH VÀ LUỒNG NGOẠI LỆ</w:t>
       </w:r>
     </w:p>
     <w:p>
@@ -2015,7 +2078,7 @@
           <w:sz w:val="28"/>
           <w:szCs w:val="32"/>
         </w:rPr>
-        <w:t>2.1. Yêu cầu chức năng hệ thống</w:t>
+        <w:t>2.1. Luồng hoạt động chính (Happy Paths)</w:t>
       </w:r>
     </w:p>
     <w:p>
@@ -2032,7 +2095,7 @@
           <w:rFonts w:ascii="Times New Roman" w:hAnsi="Times New Roman" w:cs="Times New Roman"/>
           <w:sz w:val="26"/>
         </w:rPr>
-        <w:t>Hệ thống đáp ứng đầy đủ các chức năng nghiệp vụ tài chính của một ngân hàng di động hiện đại bao gồm:</w:t>
+        <w:t>Luồng hoạt động chính mô tả tiến trình thực hiện thành công (không xảy ra lỗi) của các nghiệp vụ cốt lõi:</w:t>
       </w:r>
     </w:p>
     <w:p>
@@ -2049,7 +2112,7 @@
           <w:rFonts w:ascii="Times New Roman" w:hAnsi="Times New Roman" w:cs="Times New Roman"/>
           <w:sz w:val="26"/>
         </w:rPr>
-        <w:t xml:space="preserve">  - Luồng đăng ký tài khoản mới: Người dùng điền đầy đủ thông tin cá nhân (Họ tên, Số điện thoại, Email, Số CCCD). Hệ thống sẽ tạo hồ sơ tạm thời, tự động sinh mã OTP 6 chữ số và gửi qua email để kích hoạt. Người dùng nhập đúng OTP sẽ kích hoạt tài khoản chính thức trên hệ thống ngân hàng và Keycloak Server.</w:t>
+        <w:t xml:space="preserve">  - Luồng Đăng ký tài khoản mới: (1) Khách hàng nhập thông tin đăng ký hợp lệ. (2) Hệ thống tạo tài khoản tạm thời, sinh mã OTP 6 chữ số và gửi qua Email. (3) Khách hàng nhập mã OTP chính xác vào giao diện ứng dụng. (4) Hệ thống gửi thông tin đăng ký chính thức lên Keycloak để tạo User định danh, đồng thời gọi Account-Service cấp phát số tài khoản thanh toán ngẫu nhiên.</w:t>
       </w:r>
     </w:p>
     <w:p>
@@ -2066,75 +2129,7 @@
           <w:rFonts w:ascii="Times New Roman" w:hAnsi="Times New Roman" w:cs="Times New Roman"/>
           <w:sz w:val="26"/>
         </w:rPr>
-        <w:t xml:space="preserve">  - Xác thực đăng nhập: Đăng nhập an toàn qua Keycloak Server bằng tài khoản email và mật khẩu đã đăng ký, hệ thống sẽ trả về mã Access Token và Refresh Token cho ứng dụng Android.</w:t>
-      </w:r>
-    </w:p>
-    <w:p>
-      <w:pPr>
-        <w:spacing w:after="80" w:line="248" w:lineRule="auto"/>
-        <w:jc w:val="both"/>
-        <w:rPr>
-          <w:rFonts w:ascii="Times New Roman" w:hAnsi="Times New Roman" w:cs="Times New Roman"/>
-          <w:sz w:val="26"/>
-        </w:rPr>
-      </w:pPr>
-      <w:r>
-        <w:rPr>
-          <w:rFonts w:ascii="Times New Roman" w:hAnsi="Times New Roman" w:cs="Times New Roman"/>
-          <w:sz w:val="26"/>
-        </w:rPr>
-        <w:t xml:space="preserve">  - Truy vấn số dư: Xem thông tin số tài khoản thanh toán và số dư khả dụng thực tế theo thời gian thực.</w:t>
-      </w:r>
-    </w:p>
-    <w:p>
-      <w:pPr>
-        <w:spacing w:after="80" w:line="248" w:lineRule="auto"/>
-        <w:jc w:val="both"/>
-        <w:rPr>
-          <w:rFonts w:ascii="Times New Roman" w:hAnsi="Times New Roman" w:cs="Times New Roman"/>
-          <w:sz w:val="26"/>
-        </w:rPr>
-      </w:pPr>
-      <w:r>
-        <w:rPr>
-          <w:rFonts w:ascii="Times New Roman" w:hAnsi="Times New Roman" w:cs="Times New Roman"/>
-          <w:sz w:val="26"/>
-        </w:rPr>
-        <w:t xml:space="preserve">  - Giao dịch chuyển tiền nội bộ: Nhập số tài khoản đích, hệ thống tự động kiểm tra sự tồn tại và trả về họ tên chủ tài khoản thụ hưởng để người dùng xác nhận trước khi chuyển khoản. Giao dịch yêu cầu người dùng nhập đúng mã OTP gửi qua email để trừ tiền tài khoản nguồn và cộng tiền tài khoản đích.</w:t>
-      </w:r>
-    </w:p>
-    <w:p>
-      <w:pPr>
-        <w:spacing w:after="80" w:line="248" w:lineRule="auto"/>
-        <w:jc w:val="both"/>
-        <w:rPr>
-          <w:rFonts w:ascii="Times New Roman" w:hAnsi="Times New Roman" w:cs="Times New Roman"/>
-          <w:sz w:val="26"/>
-        </w:rPr>
-      </w:pPr>
-      <w:r>
-        <w:rPr>
-          <w:rFonts w:ascii="Times New Roman" w:hAnsi="Times New Roman" w:cs="Times New Roman"/>
-          <w:sz w:val="26"/>
-        </w:rPr>
-        <w:t xml:space="preserve">  - Giao dịch nạp/rút tiền: Hỗ trợ nạp tiền vào tài khoản và rút tiền trực tiếp mô phỏng giao dịch tại cây ATM.</w:t>
-      </w:r>
-    </w:p>
-    <w:p>
-      <w:pPr>
-        <w:spacing w:after="80" w:line="248" w:lineRule="auto"/>
-        <w:jc w:val="both"/>
-        <w:rPr>
-          <w:rFonts w:ascii="Times New Roman" w:hAnsi="Times New Roman" w:cs="Times New Roman"/>
-          <w:sz w:val="26"/>
-        </w:rPr>
-      </w:pPr>
-      <w:r>
-        <w:rPr>
-          <w:rFonts w:ascii="Times New Roman" w:hAnsi="Times New Roman" w:cs="Times New Roman"/>
-          <w:sz w:val="26"/>
-        </w:rPr>
-        <w:t xml:space="preserve">  - Lịch sử giao dịch: Lưu trữ và cho phép hiển thị đầy đủ lịch sử giao dịch chuyển khoản, nạp/rút tiền kèm thông tin chi tiết về thời gian, số tiền và nội dung giao dịch.</w:t>
+        <w:t xml:space="preserve">  - Luồng Chuyển tiền nội bộ: (1) Khách hàng nhập số tài khoản đích. (2) Ứng dụng di động tự động gọi API Gateway để truy vấn và hiển thị họ tên chủ tài khoản nhận. (3) Khách hàng nhập số tiền và nội dung, nhấn xác nhận. (4) Hệ thống gửi mã OTP xác nhận giao dịch qua email người gửi. (5) Khách hàng nhập đúng OTP, hệ thống thực hiện đồng thời việc trừ tiền tài khoản gửi và cộng tiền tài khoản nhận, lưu lịch sử giao dịch.</w:t>
       </w:r>
     </w:p>
     <w:p>
@@ -2151,7 +2146,7 @@
           <w:rFonts w:ascii="Times New Roman" w:hAnsi="Times New Roman" w:cs="Times New Roman"/>
           <w:sz w:val="26"/>
         </w:rPr>
-        <w:t xml:space="preserve">  - Chuyển khoản bằng mã QR: Tạo mã QR tài khoản cá nhân, và quét mã QR tài khoản khác để tự động điền số tài khoản nhận mà không cần nhập thủ công.</w:t>
+        <w:t xml:space="preserve">  - Luồng Chuyển khoản nhanh bằng QR Code: (1) Người nhận hiển thị mã QR tài khoản cá nhân. (2) Người gửi sử dụng chức năng quét QR trên app di động để quét. (3) Ứng dụng tự động giải mã thông tin QR, điền số tài khoản thụ hưởng và hiển thị họ tên người nhận trên màn hình giao dịch chuyển khoản. (4) Người gửi tiến hành các bước xác thực OTP để hoàn tất giao dịch chuyển tiền.</w:t>
       </w:r>
     </w:p>
     <w:p>
@@ -2173,7 +2168,7 @@
           <w:sz w:val="28"/>
           <w:szCs w:val="32"/>
         </w:rPr>
-        <w:t>2.2. Yêu cầu phi chức năng</w:t>
+        <w:t>2.2. Luồng xử lý ngoại lệ và ràng buộc logic (Exceptional Flows)</w:t>
       </w:r>
     </w:p>
     <w:p>
@@ -2190,7 +2185,97 @@
           <w:rFonts w:ascii="Times New Roman" w:hAnsi="Times New Roman" w:cs="Times New Roman"/>
           <w:sz w:val="26"/>
         </w:rPr>
-        <w:t>Hệ thống đáp ứng các yêu cầu phi chức năng sau: (1) Tính bảo mật (Security): Mật khẩu người dùng được mã hoá và lưu trực tiếp trong Keycloak DB. Các API backend được bảo vệ qua JWT Token. (2) Tính khả dụng (Usability): Giao diện Android dễ tiếp cận, trực quan, tốc độ phản hồi nhanh chóng dưới 2 giây. (3) Tính nhất quán (Consistency): Đảm bảo các giao dịch tài chính tuân thủ quy chuẩn ACID, không xảy ra lỗi lệch số dư khi xảy ra sự cố mạng giữa các microservices.</w:t>
+        <w:t>Để bảo vệ an toàn giao dịch và tính nhất quán dữ liệu, hệ thống bắt buộc phải kiểm tra và xử lý các luồng ngoại lệ sau:</w:t>
+      </w:r>
+    </w:p>
+    <w:p>
+      <w:pPr>
+        <w:spacing w:after="80" w:line="248" w:lineRule="auto"/>
+        <w:jc w:val="both"/>
+        <w:rPr>
+          <w:rFonts w:ascii="Times New Roman" w:hAnsi="Times New Roman" w:cs="Times New Roman"/>
+          <w:sz w:val="26"/>
+        </w:rPr>
+      </w:pPr>
+      <w:r>
+        <w:rPr>
+          <w:rFonts w:ascii="Times New Roman" w:hAnsi="Times New Roman" w:cs="Times New Roman"/>
+          <w:sz w:val="26"/>
+        </w:rPr>
+        <w:t xml:space="preserve">  - Ngoại lệ Chuyển tiền vượt quá số dư khả dụng: Khi người dùng nhấn nút chuyển khoản, hệ thống sẽ thực hiện kiểm tra điều kiện số tiền giao dịch phải nhỏ hơn số dư khả dụng thực tế. Nếu số tiền chuyển lớn hơn số dư hiện tại, hệ thống lập tức chặn giao dịch và hiển thị thông báo lỗi 'Số dư tài khoản không đủ để thực hiện giao dịch này'.</w:t>
+      </w:r>
+    </w:p>
+    <w:p>
+      <w:pPr>
+        <w:spacing w:after="80" w:line="248" w:lineRule="auto"/>
+        <w:jc w:val="both"/>
+        <w:rPr>
+          <w:rFonts w:ascii="Times New Roman" w:hAnsi="Times New Roman" w:cs="Times New Roman"/>
+          <w:sz w:val="26"/>
+        </w:rPr>
+      </w:pPr>
+      <w:r>
+        <w:rPr>
+          <w:rFonts w:ascii="Times New Roman" w:hAnsi="Times New Roman" w:cs="Times New Roman"/>
+          <w:sz w:val="26"/>
+        </w:rPr>
+        <w:t xml:space="preserve">  - Ngoại lệ Nhập sai mã OTP hoặc OTP hết hạn: Mã OTP giao dịch và OTP kích hoạt tài khoản chỉ có hiệu lực sử dụng trong vòng 3 phút. Nếu người dùng nhập mã OTP đã hết hạn, hoặc nhập sai mã OTP quá 3 lần liên tiếp, hệ thống sẽ từ chối giao dịch, huỷ mã OTP cũ và yêu cầu người dùng yêu cầu gửi lại mã OTP mới.</w:t>
+      </w:r>
+    </w:p>
+    <w:p>
+      <w:pPr>
+        <w:spacing w:after="80" w:line="248" w:lineRule="auto"/>
+        <w:jc w:val="both"/>
+        <w:rPr>
+          <w:rFonts w:ascii="Times New Roman" w:hAnsi="Times New Roman" w:cs="Times New Roman"/>
+          <w:sz w:val="26"/>
+        </w:rPr>
+      </w:pPr>
+      <w:r>
+        <w:rPr>
+          <w:rFonts w:ascii="Times New Roman" w:hAnsi="Times New Roman" w:cs="Times New Roman"/>
+          <w:sz w:val="26"/>
+        </w:rPr>
+        <w:t xml:space="preserve">  - Ngoại lệ Nhập số tài khoản thụ hưởng không tồn tại: Khi người dùng nhập số tài khoản đích, API Gateway sẽ gọi đến Account-Service để kiểm tra. Nếu không tìm thấy số tài khoản này trong cơ sở dữ liệu, hệ thống trả về lỗi 404 và hiển thị thông báo trên giao diện di động: 'Tài khoản thụ hưởng không tồn tại. Vui lòng kiểm tra lại'.</w:t>
+      </w:r>
+    </w:p>
+    <w:p>
+      <w:pPr>
+        <w:spacing w:after="120" w:line="248" w:lineRule="auto"/>
+        <w:jc w:val="both"/>
+        <w:rPr>
+          <w:rFonts w:ascii="Times New Roman" w:hAnsi="Times New Roman" w:cs="Times New Roman"/>
+          <w:sz w:val="26"/>
+        </w:rPr>
+      </w:pPr>
+      <w:r>
+        <w:rPr>
+          <w:rFonts w:ascii="Times New Roman" w:hAnsi="Times New Roman" w:cs="Times New Roman"/>
+          <w:sz w:val="26"/>
+        </w:rPr>
+        <w:t xml:space="preserve">  - Ràng buộc nhập CCCD không đúng định dạng: Trong quá trình đăng ký tài khoản, trường thông tin Số định danh (CCCD) được kiểm soát nghiêm ngặt. Hệ thống sẽ kiểm tra chiều dài chuỗi CCCD phải đúng bằng 12 chữ số. Nếu người dùng nhập thiếu hoặc thừa ký tự, ứng dụng Android lập tức hiển thị cảnh báo định dạng và không cho phép gửi yêu cầu lên máy chủ backend.</w:t>
+      </w:r>
+    </w:p>
+    <w:p>
+      <w:pPr>
+        <w:spacing w:before="240" w:after="240" w:line="248" w:lineRule="auto"/>
+        <w:rPr>
+          <w:rFonts w:ascii="Times New Roman" w:eastAsiaTheme="majorEastAsia" w:hAnsi="Times New Roman" w:cs="Times New Roman"/>
+          <w:b/>
+          <w:color w:val="0F4761" w:themeColor="accent1" w:themeShade="BF"/>
+          <w:sz w:val="32"/>
+          <w:szCs w:val="40"/>
+        </w:rPr>
+      </w:pPr>
+      <w:r>
+        <w:rPr>
+          <w:rFonts w:ascii="Times New Roman" w:eastAsiaTheme="majorEastAsia" w:hAnsi="Times New Roman" w:cs="Times New Roman"/>
+          <w:b/>
+          <w:color w:val="0F4761" w:themeColor="accent1" w:themeShade="BF"/>
+          <w:sz w:val="32"/>
+          <w:szCs w:val="40"/>
+        </w:rPr>
+        <w:t>CHƯƠNG 3. CẤU TRÚC HỆ THỐNG MULTI-SERVICE VÀ BẢO MẬT KEYCLOAK</w:t>
       </w:r>
     </w:p>
     <w:p>
@@ -2212,7 +2297,7 @@
           <w:sz w:val="28"/>
           <w:szCs w:val="32"/>
         </w:rPr>
-        <w:t>2.3. Tác nhân hệ thống và Use Cases chính</w:t>
+        <w:t>3.1. Cấu trúc Multi-service (Microservices) độc lập</w:t>
       </w:r>
     </w:p>
     <w:p>
@@ -2229,7 +2314,165 @@
           <w:rFonts w:ascii="Times New Roman" w:hAnsi="Times New Roman" w:cs="Times New Roman"/>
           <w:sz w:val="26"/>
         </w:rPr>
-        <w:t>Hệ thống phục vụ hai nhóm tác nhân chính: Khách hàng (Customer) sử dụng ứng dụng di động Android để đăng ký, đăng nhập, nạp/rút tiền, chuyển tiền, xem lịch sử giao dịch và quét QR code; và Quản trị viên (Keycloak Admin) quản lý thông tin Client, quản lý người dùng, phân quyền và giám sát trạng thái hệ thống xác thực. Các Use Case cốt lõi bao gồm Use Case Đăng ký, Use Case Đăng nhập, và Use Case Chuyển khoản nội bộ.</w:t>
+        <w:t>Hệ thống backend của NLU Banking App được phát triển theo kiến trúc Multi-service (Microservices) gồm 7 dịch vụ Spring Boot độc lập hoạt động kết hợp với nhau:</w:t>
+      </w:r>
+    </w:p>
+    <w:p>
+      <w:pPr>
+        <w:spacing w:after="80" w:line="248" w:lineRule="auto"/>
+        <w:jc w:val="both"/>
+        <w:rPr>
+          <w:rFonts w:ascii="Times New Roman" w:hAnsi="Times New Roman" w:cs="Times New Roman"/>
+          <w:sz w:val="26"/>
+        </w:rPr>
+      </w:pPr>
+      <w:r>
+        <w:rPr>
+          <w:rFonts w:ascii="Times New Roman" w:hAnsi="Times New Roman" w:cs="Times New Roman"/>
+          <w:sz w:val="26"/>
+        </w:rPr>
+        <w:t xml:space="preserve">  - Service-Registry (Cổng quản lý Eureka Server): Đăng ký và quản lý danh sách các microservices đang hoạt động, cho phép các dịch vụ tự tìm thấy nhau mà không cần gán cứng IP.</w:t>
+      </w:r>
+    </w:p>
+    <w:p>
+      <w:pPr>
+        <w:spacing w:after="80" w:line="248" w:lineRule="auto"/>
+        <w:jc w:val="both"/>
+        <w:rPr>
+          <w:rFonts w:ascii="Times New Roman" w:hAnsi="Times New Roman" w:cs="Times New Roman"/>
+          <w:sz w:val="26"/>
+        </w:rPr>
+      </w:pPr>
+      <w:r>
+        <w:rPr>
+          <w:rFonts w:ascii="Times New Roman" w:hAnsi="Times New Roman" w:cs="Times New Roman"/>
+          <w:sz w:val="26"/>
+        </w:rPr>
+        <w:t xml:space="preserve">  - API-Gateway: Đóng vai trò là cổng ngõ ra vào duy nhất cho các yêu cầu API từ Android Client. Gateway chịu trách nhiệm định tuyến cuộc gọi API đến dịch vụ tương ứng và chặn các cuộc gọi không có JWT token hợp lệ.</w:t>
+      </w:r>
+    </w:p>
+    <w:p>
+      <w:pPr>
+        <w:spacing w:after="80" w:line="248" w:lineRule="auto"/>
+        <w:jc w:val="both"/>
+        <w:rPr>
+          <w:rFonts w:ascii="Times New Roman" w:hAnsi="Times New Roman" w:cs="Times New Roman"/>
+          <w:sz w:val="26"/>
+        </w:rPr>
+      </w:pPr>
+      <w:r>
+        <w:rPr>
+          <w:rFonts w:ascii="Times New Roman" w:hAnsi="Times New Roman" w:cs="Times New Roman"/>
+          <w:sz w:val="26"/>
+        </w:rPr>
+        <w:t xml:space="preserve">  - User-Service: Quản lý đăng ký hồ sơ khách hàng, sinh mã và lưu trữ OTP kích hoạt, liên kết tài khoản định danh với máy chủ Keycloak.</w:t>
+      </w:r>
+    </w:p>
+    <w:p>
+      <w:pPr>
+        <w:spacing w:after="80" w:line="248" w:lineRule="auto"/>
+        <w:jc w:val="both"/>
+        <w:rPr>
+          <w:rFonts w:ascii="Times New Roman" w:hAnsi="Times New Roman" w:cs="Times New Roman"/>
+          <w:sz w:val="26"/>
+        </w:rPr>
+      </w:pPr>
+      <w:r>
+        <w:rPr>
+          <w:rFonts w:ascii="Times New Roman" w:hAnsi="Times New Roman" w:cs="Times New Roman"/>
+          <w:sz w:val="26"/>
+        </w:rPr>
+        <w:t xml:space="preserve">  - Account-Service: Quản lý số tài khoản ngân hàng, thông tin số dư khả dụng và trạng thái tài khoản.</w:t>
+      </w:r>
+    </w:p>
+    <w:p>
+      <w:pPr>
+        <w:spacing w:after="80" w:line="248" w:lineRule="auto"/>
+        <w:jc w:val="both"/>
+        <w:rPr>
+          <w:rFonts w:ascii="Times New Roman" w:hAnsi="Times New Roman" w:cs="Times New Roman"/>
+          <w:sz w:val="26"/>
+        </w:rPr>
+      </w:pPr>
+      <w:r>
+        <w:rPr>
+          <w:rFonts w:ascii="Times New Roman" w:hAnsi="Times New Roman" w:cs="Times New Roman"/>
+          <w:sz w:val="26"/>
+        </w:rPr>
+        <w:t xml:space="preserve">  - Fund-Transfer-Service: Xử lý và ghi nhận toàn bộ lịch sử các giao dịch chuyển khoản nội bộ giữa các tài khoản khách hàng.</w:t>
+      </w:r>
+    </w:p>
+    <w:p>
+      <w:pPr>
+        <w:spacing w:after="80" w:line="248" w:lineRule="auto"/>
+        <w:jc w:val="both"/>
+        <w:rPr>
+          <w:rFonts w:ascii="Times New Roman" w:hAnsi="Times New Roman" w:cs="Times New Roman"/>
+          <w:sz w:val="26"/>
+        </w:rPr>
+      </w:pPr>
+      <w:r>
+        <w:rPr>
+          <w:rFonts w:ascii="Times New Roman" w:hAnsi="Times New Roman" w:cs="Times New Roman"/>
+          <w:sz w:val="26"/>
+        </w:rPr>
+        <w:t xml:space="preserve">  - Transaction-Service: Xử lý và ghi nhận lịch sử các giao dịch nạp tiền, rút tiền trực tiếp từ tài khoản.</w:t>
+      </w:r>
+    </w:p>
+    <w:p>
+      <w:pPr>
+        <w:spacing w:after="120" w:line="248" w:lineRule="auto"/>
+        <w:jc w:val="both"/>
+        <w:rPr>
+          <w:rFonts w:ascii="Times New Roman" w:hAnsi="Times New Roman" w:cs="Times New Roman"/>
+          <w:sz w:val="26"/>
+        </w:rPr>
+      </w:pPr>
+      <w:r>
+        <w:rPr>
+          <w:rFonts w:ascii="Times New Roman" w:hAnsi="Times New Roman" w:cs="Times New Roman"/>
+          <w:sz w:val="26"/>
+        </w:rPr>
+        <w:t xml:space="preserve">  - Sequence-Generator: Sinh chuỗi số tự động tăng dùng để tạo số tài khoản ngân hàng đảm bảo tính duy nhất trên toàn hệ thống.</w:t>
+      </w:r>
+    </w:p>
+    <w:p>
+      <w:pPr>
+        <w:spacing w:before="120" w:after="120" w:line="248" w:lineRule="auto"/>
+        <w:rPr>
+          <w:rFonts w:ascii="Times New Roman" w:eastAsiaTheme="majorEastAsia" w:hAnsi="Times New Roman" w:cs="Times New Roman"/>
+          <w:b/>
+          <w:color w:val="0F4761" w:themeColor="accent1" w:themeShade="BF"/>
+          <w:sz w:val="28"/>
+          <w:szCs w:val="32"/>
+        </w:rPr>
+      </w:pPr>
+      <w:r>
+        <w:rPr>
+          <w:rFonts w:ascii="Times New Roman" w:eastAsiaTheme="majorEastAsia" w:hAnsi="Times New Roman" w:cs="Times New Roman"/>
+          <w:b/>
+          <w:color w:val="0F4761" w:themeColor="accent1" w:themeShade="BF"/>
+          <w:sz w:val="28"/>
+          <w:szCs w:val="32"/>
+        </w:rPr>
+        <w:t>3.2. Cơ chế bảo mật và phân quyền định danh với Keycloak</w:t>
+      </w:r>
+    </w:p>
+    <w:p>
+      <w:pPr>
+        <w:spacing w:after="120" w:line="248" w:lineRule="auto"/>
+        <w:jc w:val="both"/>
+        <w:rPr>
+          <w:rFonts w:ascii="Times New Roman" w:hAnsi="Times New Roman" w:cs="Times New Roman"/>
+          <w:sz w:val="26"/>
+        </w:rPr>
+      </w:pPr>
+      <w:r>
+        <w:rPr>
+          <w:rFonts w:ascii="Times New Roman" w:hAnsi="Times New Roman" w:cs="Times New Roman"/>
+          <w:sz w:val="26"/>
+        </w:rPr>
+        <w:t>Dự án tích hợp máy chủ định danh Keycloak để quản lý bảo mật tập trung cho toàn hệ thống. Khi khách hàng đăng nhập thành công, Keycloak trả về mã Access Token dạng JWT. API Gateway sẽ giải mã chữ ký công khai để kiểm tra tính hợp lệ của token trước khi cho phép yêu cầu đi sâu vào hệ thống backend. Đồng thời, User-Service sử dụng Keycloak Admin Client để tự động đồng bộ tài khoản định danh lên Keycloak ngay khi khách hàng xác nhận OTP kích hoạt tài khoản thành công.</w:t>
       </w:r>
     </w:p>
     <w:p>
@@ -2251,7 +2494,7 @@
           <w:sz w:val="32"/>
           <w:szCs w:val="40"/>
         </w:rPr>
-        <w:t>CHƯƠNG 3. THIẾT KẾ KIẾN TRÚC VÀ CƠ SỞ DỮ LIỆU</w:t>
+        <w:t>CHƯƠNG 4. THÀNH TỰU VÀ CÔNG NGHỆ ÁP DỤNG TRONG DỰ ÁN</w:t>
       </w:r>
     </w:p>
     <w:p>
@@ -2273,7 +2516,7 @@
           <w:sz w:val="28"/>
           <w:szCs w:val="32"/>
         </w:rPr>
-        <w:t>3.1. Kiến trúc hệ thống Microservices</w:t>
+        <w:t>4.1. Thành tựu tự hào về kiến trúc API và Spring Boot</w:t>
       </w:r>
     </w:p>
     <w:p>
@@ -2290,7 +2533,7 @@
           <w:rFonts w:ascii="Times New Roman" w:hAnsi="Times New Roman" w:cs="Times New Roman"/>
           <w:sz w:val="26"/>
         </w:rPr>
-        <w:t>Hệ thống được thiết kế theo kiến trúc Microservices phân tán hiện đại, giúp dễ dàng mở rộng và bảo trì. Sơ đồ kết nối luồng hoạt động chính bao gồm: Android Client -&gt; API Gateway (Port 8080) -&gt; Các dịch vụ con đăng ký trên Eureka Service Registry (Port 8761). API Gateway chặn mọi yêu cầu gọi API từ client, liên hệ Keycloak Server (Port 8571) để xác thực token JWT, sau đó mới điều hướng yêu cầu đến microservice đích thích hợp.</w:t>
+        <w:t>Một trong những thành tựu tự hào lớn nhất của dự án là việc thiết kế và vận hành thành công kiến trúc backend Multi-service phân tán hiện đại dựa trên nền tảng Spring Boot. Nhóm đã làm chủ kỹ thuật xây dựng và tối ưu các RESTful API sạch (Clean Restful APIs), định dạng dữ liệu DTO đồng nhất và điều hướng động qua API Gateway. Việc phát triển các service tách biệt giúp giảm thiểu tối đa tính liên đới, nâng cao hiệu năng chịu tải khi chạy đồng thời nhiều luồng giao dịch.</w:t>
       </w:r>
     </w:p>
     <w:p>
@@ -2312,7 +2555,7 @@
           <w:sz w:val="28"/>
           <w:szCs w:val="32"/>
         </w:rPr>
-        <w:t>3.2. Thiết kế Cơ sở dữ liệu chi tiết</w:t>
+        <w:t>4.2. Tối ưu hóa hiệu năng giao tiếp và đồng bộ dữ liệu</w:t>
       </w:r>
     </w:p>
     <w:p>
@@ -2329,92 +2572,29 @@
           <w:rFonts w:ascii="Times New Roman" w:hAnsi="Times New Roman" w:cs="Times New Roman"/>
           <w:sz w:val="26"/>
         </w:rPr>
-        <w:t>Dự án áp dụng mô hình thiết kế 'Database per Service' để cô lập dữ liệu. Có 5 cơ sở dữ liệu riêng biệt tương ứng với các microservice được thiết kế như sau:</w:t>
-      </w:r>
-    </w:p>
-    <w:p>
-      <w:pPr>
-        <w:spacing w:after="80" w:line="248" w:lineRule="auto"/>
-        <w:jc w:val="both"/>
-        <w:rPr>
-          <w:rFonts w:ascii="Times New Roman" w:hAnsi="Times New Roman" w:cs="Times New Roman"/>
-          <w:sz w:val="26"/>
-        </w:rPr>
-      </w:pPr>
-      <w:r>
-        <w:rPr>
-          <w:rFonts w:ascii="Times New Roman" w:hAnsi="Times New Roman" w:cs="Times New Roman"/>
-          <w:sz w:val="26"/>
-        </w:rPr>
-        <w:t xml:space="preserve">  - user_service (Bảng user): Lưu thông tin định danh và OTP của khách hàng gồm các trường: userId (PK), emailId (Email đăng ký), contactNo (SĐT), identificationNumber (CCCD), authId (ID liên kết Keycloak), emailVerified (Trạng thái kích hoạt), emailOtp (Mã OTP email), emailOtpExpiredAt (Hạn sử dụng OTP), paymentOtp (Mã OTP giao dịch).</w:t>
-      </w:r>
-    </w:p>
-    <w:p>
-      <w:pPr>
-        <w:spacing w:after="80" w:line="248" w:lineRule="auto"/>
-        <w:jc w:val="both"/>
-        <w:rPr>
-          <w:rFonts w:ascii="Times New Roman" w:hAnsi="Times New Roman" w:cs="Times New Roman"/>
-          <w:sz w:val="26"/>
-        </w:rPr>
-      </w:pPr>
-      <w:r>
-        <w:rPr>
-          <w:rFonts w:ascii="Times New Roman" w:hAnsi="Times New Roman" w:cs="Times New Roman"/>
-          <w:sz w:val="26"/>
-        </w:rPr>
-        <w:t xml:space="preserve">  - account_service (Bảng account): Lưu tài khoản ngân hàng của khách hàng: accountId (PK), accountNumber (Số tài khoản), accountType (Loại tài khoản), accountStatus (Trạng thái), openingDate (Ngày tạo), availableBalance (Số dư), userId (FK liên kết người dùng).</w:t>
-      </w:r>
-    </w:p>
-    <w:p>
-      <w:pPr>
-        <w:spacing w:after="80" w:line="248" w:lineRule="auto"/>
-        <w:jc w:val="both"/>
-        <w:rPr>
-          <w:rFonts w:ascii="Times New Roman" w:hAnsi="Times New Roman" w:cs="Times New Roman"/>
-          <w:sz w:val="26"/>
-        </w:rPr>
-      </w:pPr>
-      <w:r>
-        <w:rPr>
-          <w:rFonts w:ascii="Times New Roman" w:hAnsi="Times New Roman" w:cs="Times New Roman"/>
-          <w:sz w:val="26"/>
-        </w:rPr>
-        <w:t xml:space="preserve">  - transaction_service (Bảng transaction): Lưu lịch sử nạp/rút tiền: id (PK), accountId (Tài khoản thực hiện), transactionType (Nạp hoặc Rút), amount (Số tiền), comments (Nội dung), referenceId (Mã tham chiếu), transactionDate (Thời gian giao dịch).</w:t>
-      </w:r>
-    </w:p>
-    <w:p>
-      <w:pPr>
-        <w:spacing w:after="80" w:line="248" w:lineRule="auto"/>
-        <w:jc w:val="both"/>
-        <w:rPr>
-          <w:rFonts w:ascii="Times New Roman" w:hAnsi="Times New Roman" w:cs="Times New Roman"/>
-          <w:sz w:val="26"/>
-        </w:rPr>
-      </w:pPr>
-      <w:r>
-        <w:rPr>
-          <w:rFonts w:ascii="Times New Roman" w:hAnsi="Times New Roman" w:cs="Times New Roman"/>
-          <w:sz w:val="26"/>
-        </w:rPr>
-        <w:t xml:space="preserve">  - fund_transfer_service (Bảng fund_transfer): Lưu lịch sử chuyển tiền nội bộ: fundTransferId (PK), transactionReference (Mã tham chiếu), fromAccount (Tài khoản chuyển), toAccount (Tài khoản nhận), amount (Số tiền), status (Trạng thái), transferType (Kiểu chuyển tiền), transferredOn (Thời gian).</w:t>
-      </w:r>
-    </w:p>
-    <w:p>
-      <w:pPr>
-        <w:spacing w:after="120" w:line="248" w:lineRule="auto"/>
-        <w:jc w:val="both"/>
-        <w:rPr>
-          <w:rFonts w:ascii="Times New Roman" w:hAnsi="Times New Roman" w:cs="Times New Roman"/>
-          <w:sz w:val="26"/>
-        </w:rPr>
-      </w:pPr>
-      <w:r>
-        <w:rPr>
-          <w:rFonts w:ascii="Times New Roman" w:hAnsi="Times New Roman" w:cs="Times New Roman"/>
-          <w:sz w:val="26"/>
-        </w:rPr>
-        <w:t xml:space="preserve">  - sequence_generator (Bảng sequence): Lưu trữ số thứ tự tự động tăng để phục vụ tạo số tài khoản ngân hàng duy nhất trên toàn hệ thống.</w:t>
+        <w:t>Dự án đã áp dụng thành công mô hình 'Database per Service' để bảo toàn tính độc lập dữ liệu, sử dụng Spring Data JPA kết hợp Hibernate để tương tác tối ưu với cơ sở dữ liệu MySQL. Mặc dù dữ liệu bị phân tách chéo giữa các microservice, hệ thống vẫn duy trì hoàn hảo tính nhất quán số dư tài khoản của khách hàng gửi và nhận thông qua các ràng buộc nghiệp vụ ở tầng ứng dụng và cơ chế kiểm soát lỗi giao dịch tài chính chặt chẽ.</w:t>
+      </w:r>
+    </w:p>
+    <w:p>
+      <w:pPr>
+        <w:spacing w:before="240" w:after="240" w:line="248" w:lineRule="auto"/>
+        <w:rPr>
+          <w:rFonts w:ascii="Times New Roman" w:eastAsiaTheme="majorEastAsia" w:hAnsi="Times New Roman" w:cs="Times New Roman"/>
+          <w:b/>
+          <w:color w:val="0F4761" w:themeColor="accent1" w:themeShade="BF"/>
+          <w:sz w:val="32"/>
+          <w:szCs w:val="40"/>
+        </w:rPr>
+      </w:pPr>
+      <w:r>
+        <w:rPr>
+          <w:rFonts w:ascii="Times New Roman" w:eastAsiaTheme="majorEastAsia" w:hAnsi="Times New Roman" w:cs="Times New Roman"/>
+          <w:b/>
+          <w:color w:val="0F4761" w:themeColor="accent1" w:themeShade="BF"/>
+          <w:sz w:val="32"/>
+          <w:szCs w:val="40"/>
+        </w:rPr>
+        <w:t>CHƯƠNG 5. HƯỚNG DẪN CẤU HÌNH VÀ KHỞI CHẠY ĐỒ ÁN</w:t>
       </w:r>
     </w:p>
     <w:p>
@@ -2436,7 +2616,7 @@
           <w:sz w:val="28"/>
           <w:szCs w:val="32"/>
         </w:rPr>
-        <w:t>3.3. Quy trình xác thực phân tán qua Keycloak</w:t>
+        <w:t>5.1. Thiết lập môi trường và khởi chạy Docker Compose</w:t>
       </w:r>
     </w:p>
     <w:p>
@@ -2453,7 +2633,7 @@
           <w:rFonts w:ascii="Times New Roman" w:hAnsi="Times New Roman" w:cs="Times New Roman"/>
           <w:sz w:val="26"/>
         </w:rPr>
-        <w:t>Quy trình xác thực được thiết kế bảo mật chặt chẽ: (1) Khách hàng thực hiện đăng nhập trên ứng dụng Android bằng email và mật khẩu. (2) Ứng dụng gọi API gửi thông tin đăng nhập đến API Gateway, API Gateway chuyển tiếp yêu cầu đến Keycloak Server. (3) Keycloak xác thực thông tin và trả về Access Token JWT kèm Refresh Token. (4) Trong các yêu cầu giao dịch sau đó, ứng dụng Android đính kèm token này trong Header của API. API Gateway chặn cuộc gọi, kiểm tra chữ ký token JWT qua Keycloak. Nếu hợp lệ, gateway sẽ chuyển tiếp cuộc gọi đến dịch vụ đích tương ứng; nếu không, sẽ trả về mã lỗi 401 Unauthorized.</w:t>
+        <w:t>Để triển khai đồ án, máy tính thử nghiệm cần cài đặt sẵn Docker, Docker Compose, Git, Java JDK 11 hoặc JDK 17 và Android Studio. Bước đầu tiên, dẫn đến thư mục chứa file 'docker-compose.yml' và chạy lệnh: 'docker-compose up -d' để khởi động MySQL Container (Port 3306) và Keycloak Container (Port 8571) chạy ngầm dưới nền hệ thống.</w:t>
       </w:r>
     </w:p>
     <w:p>
@@ -2475,7 +2655,7 @@
           <w:sz w:val="28"/>
           <w:szCs w:val="32"/>
         </w:rPr>
-        <w:t>3.4. Các công nghệ cốt lõi sử dụng</w:t>
+        <w:t>5.2. Các bước cấu hình Keycloak Realm và Client</w:t>
       </w:r>
     </w:p>
     <w:p>
@@ -2492,7 +2672,46 @@
           <w:rFonts w:ascii="Times New Roman" w:hAnsi="Times New Roman" w:cs="Times New Roman"/>
           <w:sz w:val="26"/>
         </w:rPr>
-        <w:t>Các công nghệ chính được tích hợp bao gồm: Phía Backend được phát triển bằng framework Spring Boot 2.7.x, Spring Cloud Gateway, Spring Cloud Discovery (Eureka Server), Keycloak Admin Client để tương tác trực tiếp với Keycloak từ java code, Hibernate và Spring Data JPA để truy xuất MySQL Database. Phía Frontend được phát triển bằng Android SDK (Java), thư viện Retrofit 2 kết hợp OkHttp3 để cấu hình kết nối mạng, và thư viện tạo/quét mã QR ZXing.</w:t>
+        <w:t>Sau khi Keycloak chạy, thực hiện cấu hình bằng tay trên trang quản trị: (1) Truy cập http://localhost:8571 và đăng nhập bằng admin/admin. (2) Tạo Realm mới tên 'banking-service'. (3) Trong Realm này, tạo Client mới tên 'banking-service-api-client', bật tuỳ chọn 'Service Accounts Enabled' và cấu hình phần Client Secret. (4) Chuyển đến tab Service Account Roles và gán các quyền hệ thống 'manage-users', 'view-users', 'query-users' cho Client để cho phép backend Java gọi API quản lý người dùng của Keycloak.</w:t>
+      </w:r>
+    </w:p>
+    <w:p>
+      <w:pPr>
+        <w:spacing w:before="120" w:after="120" w:line="248" w:lineRule="auto"/>
+        <w:rPr>
+          <w:rFonts w:ascii="Times New Roman" w:eastAsiaTheme="majorEastAsia" w:hAnsi="Times New Roman" w:cs="Times New Roman"/>
+          <w:b/>
+          <w:color w:val="0F4761" w:themeColor="accent1" w:themeShade="BF"/>
+          <w:sz w:val="28"/>
+          <w:szCs w:val="32"/>
+        </w:rPr>
+      </w:pPr>
+      <w:r>
+        <w:rPr>
+          <w:rFonts w:ascii="Times New Roman" w:eastAsiaTheme="majorEastAsia" w:hAnsi="Times New Roman" w:cs="Times New Roman"/>
+          <w:b/>
+          <w:color w:val="0F4761" w:themeColor="accent1" w:themeShade="BF"/>
+          <w:sz w:val="28"/>
+          <w:szCs w:val="32"/>
+        </w:rPr>
+        <w:t>5.3. Khởi chạy 7 Microservices Spring Boot bằng Script</w:t>
+      </w:r>
+    </w:p>
+    <w:p>
+      <w:pPr>
+        <w:spacing w:after="120" w:line="248" w:lineRule="auto"/>
+        <w:jc w:val="both"/>
+        <w:rPr>
+          <w:rFonts w:ascii="Times New Roman" w:hAnsi="Times New Roman" w:cs="Times New Roman"/>
+          <w:sz w:val="26"/>
+        </w:rPr>
+      </w:pPr>
+      <w:r>
+        <w:rPr>
+          <w:rFonts w:ascii="Times New Roman" w:hAnsi="Times New Roman" w:cs="Times New Roman"/>
+          <w:sz w:val="26"/>
+        </w:rPr>
+        <w:t>Tại thư mục gốc của dự án, chạy tệp tin script tự động 'run-services.cmd'. Script này sẽ tự động kiểm tra biến môi trường Java, yêu cầu bạn nhập Client Secret của Keycloak vừa tạo (hoặc nhấn Enter để lấy giá trị mặc định trong cấu hình), sau đó lần lượt kích hoạt 7 microservices backend bằng Maven Wrapper trong các cửa sổ CMD riêng biệt giúp dễ dàng quan sát log hoạt động.</w:t>
       </w:r>
     </w:p>
     <w:p>
@@ -2514,7 +2733,7 @@
           <w:sz w:val="32"/>
           <w:szCs w:val="40"/>
         </w:rPr>
-        <w:t>CHƯƠNG 4. CÀI ĐẶT CHI TIẾT VÀ VẬN HÀNH</w:t>
+        <w:t>CHƯƠNG 6. TỔNG KẾT VÀ HƯỚNG PHÁT TRIỂN TƯƠNG LAI</w:t>
       </w:r>
     </w:p>
     <w:p>
@@ -2536,7 +2755,7 @@
           <w:sz w:val="28"/>
           <w:szCs w:val="32"/>
         </w:rPr>
-        <w:t>4.1. Cấu trúc dự án di động Android</w:t>
+        <w:t>6.1. Đánh giá kết quả đạt được của đồ án</w:t>
       </w:r>
     </w:p>
     <w:p>
@@ -2553,7 +2772,7 @@
           <w:rFonts w:ascii="Times New Roman" w:hAnsi="Times New Roman" w:cs="Times New Roman"/>
           <w:sz w:val="26"/>
         </w:rPr>
-        <w:t>Dự án được phân tách rõ ràng thành hai phần chính độc lập: Backend chứa 7 thư mục Microservices được quản lý mã nguồn bằng Maven; và Android Frontend nằm trong thư mục 'BankingMobileApp' được quản lý bằng Gradle. Mã nguồn Android được tổ chức theo kiến trúc chuẩn gồm các Activity (WelcomeActivity, RegisterActivity, TransferActivity, TransactionActivity, MyQrActivity), các lớp Fragment quản lý tab hiển thị, các lớp DTO để định dạng dữ liệu truyền tải qua API, và các service kết nối Retrofit.</w:t>
+        <w:t>Nhóm nghiên cứu đã hoàn thành toàn bộ các yêu cầu đề ra cho đồ án 'NLU Banking App'. Hệ thống Android App kết hợp Microservices Spring Boot hoạt động ổn định, bảo mật xác thực phân tán qua Keycloak OIDC đạt chuẩn công nghiệp, quy trình nạp, rút, chuyển khoản nội bộ và thanh toán QR Code hoạt động mượt mà và chính xác.</w:t>
       </w:r>
     </w:p>
     <w:p>
@@ -2575,7 +2794,7 @@
           <w:sz w:val="28"/>
           <w:szCs w:val="32"/>
         </w:rPr>
-        <w:t>4.2. Các màn hình chức năng chính trên ứng dụng di động</w:t>
+        <w:t>6.2. Hướng phát triển nâng cấp hệ thống</w:t>
       </w:r>
     </w:p>
     <w:p>
@@ -2592,270 +2811,7 @@
           <w:rFonts w:ascii="Times New Roman" w:hAnsi="Times New Roman" w:cs="Times New Roman"/>
           <w:sz w:val="26"/>
         </w:rPr>
-        <w:t>Các màn hình chính của ứng dụng di động bao gồm:</w:t>
-      </w:r>
-    </w:p>
-    <w:p>
-      <w:pPr>
-        <w:spacing w:after="80" w:line="248" w:lineRule="auto"/>
-        <w:jc w:val="both"/>
-        <w:rPr>
-          <w:rFonts w:ascii="Times New Roman" w:hAnsi="Times New Roman" w:cs="Times New Roman"/>
-          <w:sz w:val="26"/>
-        </w:rPr>
-      </w:pPr>
-      <w:r>
-        <w:rPr>
-          <w:rFonts w:ascii="Times New Roman" w:hAnsi="Times New Roman" w:cs="Times New Roman"/>
-          <w:sz w:val="26"/>
-        </w:rPr>
-        <w:t xml:space="preserve">  - Welcome &amp; Login (WelcomeActivity): Giao diện khởi động và đăng nhập. Kiểm tra tính hợp lệ của email và mật khẩu trước khi gửi yêu cầu lên Keycloak.</w:t>
-      </w:r>
-    </w:p>
-    <w:p>
-      <w:pPr>
-        <w:spacing w:after="80" w:line="248" w:lineRule="auto"/>
-        <w:jc w:val="both"/>
-        <w:rPr>
-          <w:rFonts w:ascii="Times New Roman" w:hAnsi="Times New Roman" w:cs="Times New Roman"/>
-          <w:sz w:val="26"/>
-        </w:rPr>
-      </w:pPr>
-      <w:r>
-        <w:rPr>
-          <w:rFonts w:ascii="Times New Roman" w:hAnsi="Times New Roman" w:cs="Times New Roman"/>
-          <w:sz w:val="26"/>
-        </w:rPr>
-        <w:t xml:space="preserve">  - Register &amp; OTP (RegisterActivity): Giao diện đăng ký tài khoản. Ràng buộc trường số định danh (CCCD) phải đủ 12 chữ số. Sau khi điền đủ thông tin, hệ thống tự động gọi API kích hoạt email và hiện hộp thoại nhập mã OTP. Khi mã OTP chính xác, tài khoản sẽ được đăng ký thành công.</w:t>
-      </w:r>
-    </w:p>
-    <w:p>
-      <w:pPr>
-        <w:spacing w:after="80" w:line="248" w:lineRule="auto"/>
-        <w:jc w:val="both"/>
-        <w:rPr>
-          <w:rFonts w:ascii="Times New Roman" w:hAnsi="Times New Roman" w:cs="Times New Roman"/>
-          <w:sz w:val="26"/>
-        </w:rPr>
-      </w:pPr>
-      <w:r>
-        <w:rPr>
-          <w:rFonts w:ascii="Times New Roman" w:hAnsi="Times New Roman" w:cs="Times New Roman"/>
-          <w:sz w:val="26"/>
-        </w:rPr>
-        <w:t xml:space="preserve">  - Transfer (TransferActivity): Giao diện chuyển tiền nội bộ. Khi người dùng nhập số tài khoản nhận, ứng dụng tự động kích hoạt tiến trình gọi API của Account-Service để truy vấn tên chủ tài khoản thụ hưởng. Người dùng nhập số tiền, nội dung và mã OTP giao dịch được gửi đến email để xác nhận chuyển khoản.</w:t>
-      </w:r>
-    </w:p>
-    <w:p>
-      <w:pPr>
-        <w:spacing w:after="80" w:line="248" w:lineRule="auto"/>
-        <w:jc w:val="both"/>
-        <w:rPr>
-          <w:rFonts w:ascii="Times New Roman" w:hAnsi="Times New Roman" w:cs="Times New Roman"/>
-          <w:sz w:val="26"/>
-        </w:rPr>
-      </w:pPr>
-      <w:r>
-        <w:rPr>
-          <w:rFonts w:ascii="Times New Roman" w:hAnsi="Times New Roman" w:cs="Times New Roman"/>
-          <w:sz w:val="26"/>
-        </w:rPr>
-        <w:t xml:space="preserve">  - History (TransactionActivity): Hiển thị danh sách lịch sử biến động số dư chi tiết bao gồm ngày giao dịch, số tiền chuyển/nhận và nội dung giao dịch.</w:t>
-      </w:r>
-    </w:p>
-    <w:p>
-      <w:pPr>
-        <w:spacing w:after="120" w:line="248" w:lineRule="auto"/>
-        <w:jc w:val="both"/>
-        <w:rPr>
-          <w:rFonts w:ascii="Times New Roman" w:hAnsi="Times New Roman" w:cs="Times New Roman"/>
-          <w:sz w:val="26"/>
-        </w:rPr>
-      </w:pPr>
-      <w:r>
-        <w:rPr>
-          <w:rFonts w:ascii="Times New Roman" w:hAnsi="Times New Roman" w:cs="Times New Roman"/>
-          <w:sz w:val="26"/>
-        </w:rPr>
-        <w:t xml:space="preserve">  - QR Code (MyQrActivity): Giao diện tạo mã QR chứa số tài khoản của người dùng và hỗ trợ quét mã QR của người khác để thực hiện chuyển khoản nhanh.</w:t>
-      </w:r>
-    </w:p>
-    <w:p>
-      <w:pPr>
-        <w:spacing w:before="120" w:after="120" w:line="248" w:lineRule="auto"/>
-        <w:rPr>
-          <w:rFonts w:ascii="Times New Roman" w:eastAsiaTheme="majorEastAsia" w:hAnsi="Times New Roman" w:cs="Times New Roman"/>
-          <w:b/>
-          <w:color w:val="0F4761" w:themeColor="accent1" w:themeShade="BF"/>
-          <w:sz w:val="28"/>
-          <w:szCs w:val="32"/>
-        </w:rPr>
-      </w:pPr>
-      <w:r>
-        <w:rPr>
-          <w:rFonts w:ascii="Times New Roman" w:eastAsiaTheme="majorEastAsia" w:hAnsi="Times New Roman" w:cs="Times New Roman"/>
-          <w:b/>
-          <w:color w:val="0F4761" w:themeColor="accent1" w:themeShade="BF"/>
-          <w:sz w:val="28"/>
-          <w:szCs w:val="32"/>
-        </w:rPr>
-        <w:t>4.3. Cài đặt triển khai trên máy tính thử nghiệm</w:t>
-      </w:r>
-    </w:p>
-    <w:p>
-      <w:pPr>
-        <w:spacing w:after="120" w:line="248" w:lineRule="auto"/>
-        <w:jc w:val="both"/>
-        <w:rPr>
-          <w:rFonts w:ascii="Times New Roman" w:hAnsi="Times New Roman" w:cs="Times New Roman"/>
-          <w:sz w:val="26"/>
-        </w:rPr>
-      </w:pPr>
-      <w:r>
-        <w:rPr>
-          <w:rFonts w:ascii="Times New Roman" w:hAnsi="Times New Roman" w:cs="Times New Roman"/>
-          <w:sz w:val="26"/>
-        </w:rPr>
-        <w:t>Quy trình triển khai chạy ứng dụng thực tế gồm 4 bước chính: (1) Khởi động cơ sở dữ liệu MySQL và máy chủ xác thực Keycloak qua lệnh Docker Compose: 'docker-compose up -d'. Docker tự động chạy script 'init-db.sql' để khởi tạo trước các schema cơ sở dữ liệu. (2) Truy cập quản trị Keycloak Admin Console tại địa chỉ http://localhost:8571 để tạo Realm 'banking-service', tạo Client 'banking-service-api-client' và cấu hình service account cấp quyền tương tác với người dùng. (3) Chạy tệp tin script 'run-services.cmd' tại thư mục gốc để khởi động đồng loạt 7 microservices theo trình tự tối ưu (Registry -&gt; Gateway -&gt; các nghiệp vụ dịch vụ con). (4) Mở và biên dịch ứng dụng Android trên Android Studio, cài đặt và chạy thử nghiệm trên máy ảo Android Emulator.</w:t>
-      </w:r>
-    </w:p>
-    <w:p>
-      <w:pPr>
-        <w:spacing w:before="240" w:after="240" w:line="248" w:lineRule="auto"/>
-        <w:rPr>
-          <w:rFonts w:ascii="Times New Roman" w:eastAsiaTheme="majorEastAsia" w:hAnsi="Times New Roman" w:cs="Times New Roman"/>
-          <w:b/>
-          <w:color w:val="0F4761" w:themeColor="accent1" w:themeShade="BF"/>
-          <w:sz w:val="32"/>
-          <w:szCs w:val="40"/>
-        </w:rPr>
-      </w:pPr>
-      <w:r>
-        <w:rPr>
-          <w:rFonts w:ascii="Times New Roman" w:eastAsiaTheme="majorEastAsia" w:hAnsi="Times New Roman" w:cs="Times New Roman"/>
-          <w:b/>
-          <w:color w:val="0F4761" w:themeColor="accent1" w:themeShade="BF"/>
-          <w:sz w:val="32"/>
-          <w:szCs w:val="40"/>
-        </w:rPr>
-        <w:t>CHƯƠNG 5. TỔNG KẾT VÀ HƯỚNG PHÁT TRIỂN</w:t>
-      </w:r>
-    </w:p>
-    <w:p>
-      <w:pPr>
-        <w:spacing w:before="120" w:after="120" w:line="248" w:lineRule="auto"/>
-        <w:rPr>
-          <w:rFonts w:ascii="Times New Roman" w:eastAsiaTheme="majorEastAsia" w:hAnsi="Times New Roman" w:cs="Times New Roman"/>
-          <w:b/>
-          <w:color w:val="0F4761" w:themeColor="accent1" w:themeShade="BF"/>
-          <w:sz w:val="28"/>
-          <w:szCs w:val="32"/>
-        </w:rPr>
-      </w:pPr>
-      <w:r>
-        <w:rPr>
-          <w:rFonts w:ascii="Times New Roman" w:eastAsiaTheme="majorEastAsia" w:hAnsi="Times New Roman" w:cs="Times New Roman"/>
-          <w:b/>
-          <w:color w:val="0F4761" w:themeColor="accent1" w:themeShade="BF"/>
-          <w:sz w:val="28"/>
-          <w:szCs w:val="32"/>
-        </w:rPr>
-        <w:t>5.1. Kết quả đạt được của đồ án</w:t>
-      </w:r>
-    </w:p>
-    <w:p>
-      <w:pPr>
-        <w:spacing w:after="120" w:line="248" w:lineRule="auto"/>
-        <w:jc w:val="both"/>
-        <w:rPr>
-          <w:rFonts w:ascii="Times New Roman" w:hAnsi="Times New Roman" w:cs="Times New Roman"/>
-          <w:sz w:val="26"/>
-        </w:rPr>
-      </w:pPr>
-      <w:r>
-        <w:rPr>
-          <w:rFonts w:ascii="Times New Roman" w:hAnsi="Times New Roman" w:cs="Times New Roman"/>
-          <w:sz w:val="26"/>
-        </w:rPr>
-        <w:t>Đồ án đã thiết kế và triển khai thành công ứng dụng ngân hàng di động 'NLU Banking App' đáp ứng toàn bộ các yêu cầu nghiệp vụ cơ bản. Hệ thống microservices ở backend giao tiếp ổn định thông qua API Gateway, cơ chế xác thực phân tán tích hợp Keycloak hoạt động mượt mà và an toàn. Khách hàng thực hiện đăng ký tài khoản, nạp/rút tiền, chuyển khoản và quét mã QR thành công, đảm bảo tính nhất quán dữ liệu số dư.</w:t>
-      </w:r>
-    </w:p>
-    <w:p>
-      <w:pPr>
-        <w:spacing w:before="120" w:after="120" w:line="248" w:lineRule="auto"/>
-        <w:rPr>
-          <w:rFonts w:ascii="Times New Roman" w:eastAsiaTheme="majorEastAsia" w:hAnsi="Times New Roman" w:cs="Times New Roman"/>
-          <w:b/>
-          <w:color w:val="0F4761" w:themeColor="accent1" w:themeShade="BF"/>
-          <w:sz w:val="28"/>
-          <w:szCs w:val="32"/>
-        </w:rPr>
-      </w:pPr>
-      <w:r>
-        <w:rPr>
-          <w:rFonts w:ascii="Times New Roman" w:eastAsiaTheme="majorEastAsia" w:hAnsi="Times New Roman" w:cs="Times New Roman"/>
-          <w:b/>
-          <w:color w:val="0F4761" w:themeColor="accent1" w:themeShade="BF"/>
-          <w:sz w:val="28"/>
-          <w:szCs w:val="32"/>
-        </w:rPr>
-        <w:t>5.2. Ưu điểm và Hạn chế còn tồn tại</w:t>
-      </w:r>
-    </w:p>
-    <w:p>
-      <w:pPr>
-        <w:spacing w:after="120" w:line="248" w:lineRule="auto"/>
-        <w:jc w:val="both"/>
-        <w:rPr>
-          <w:rFonts w:ascii="Times New Roman" w:hAnsi="Times New Roman" w:cs="Times New Roman"/>
-          <w:sz w:val="26"/>
-        </w:rPr>
-      </w:pPr>
-      <w:r>
-        <w:rPr>
-          <w:rFonts w:ascii="Times New Roman" w:hAnsi="Times New Roman" w:cs="Times New Roman"/>
-          <w:sz w:val="26"/>
-        </w:rPr>
-        <w:t>Ưu điểm của hệ thống là sử dụng kiến trúc Microservices hiện đại, giúp cô lập lỗi và dễ dàng bảo trì nâng cấp; tích hợp Keycloak giúp bảo mật thông tin người dùng chuẩn công nghiệp mà không cần tự phát triển hệ thống xác thực phức tạp; ứng dụng Android có giao diện tối giản, tích hợp công nghệ QR tiện lợi. Hạn chế còn tồn tại là do triển khai mô hình cô lập dữ liệu (Database per Service), việc tạo các truy vấn thống kê báo cáo chéo giữa các microservices gặp nhiều khó khăn, đòi hỏi các giải pháp đồng bộ dữ liệu phức tạp hơn.</w:t>
-      </w:r>
-    </w:p>
-    <w:p>
-      <w:pPr>
-        <w:spacing w:before="120" w:after="120" w:line="248" w:lineRule="auto"/>
-        <w:rPr>
-          <w:rFonts w:ascii="Times New Roman" w:eastAsiaTheme="majorEastAsia" w:hAnsi="Times New Roman" w:cs="Times New Roman"/>
-          <w:b/>
-          <w:color w:val="0F4761" w:themeColor="accent1" w:themeShade="BF"/>
-          <w:sz w:val="28"/>
-          <w:szCs w:val="32"/>
-        </w:rPr>
-      </w:pPr>
-      <w:r>
-        <w:rPr>
-          <w:rFonts w:ascii="Times New Roman" w:eastAsiaTheme="majorEastAsia" w:hAnsi="Times New Roman" w:cs="Times New Roman"/>
-          <w:b/>
-          <w:color w:val="0F4761" w:themeColor="accent1" w:themeShade="BF"/>
-          <w:sz w:val="28"/>
-          <w:szCs w:val="32"/>
-        </w:rPr>
-        <w:t>5.3. Hướng phát triển tương lai</w:t>
-      </w:r>
-    </w:p>
-    <w:p>
-      <w:pPr>
-        <w:spacing w:after="120" w:line="248" w:lineRule="auto"/>
-        <w:jc w:val="both"/>
-        <w:rPr>
-          <w:rFonts w:ascii="Times New Roman" w:hAnsi="Times New Roman" w:cs="Times New Roman"/>
-          <w:sz w:val="26"/>
-        </w:rPr>
-      </w:pPr>
-      <w:r>
-        <w:rPr>
-          <w:rFonts w:ascii="Times New Roman" w:hAnsi="Times New Roman" w:cs="Times New Roman"/>
-          <w:sz w:val="26"/>
-        </w:rPr>
-        <w:t>Để phát triển hệ thống trong tương lai, nhóm dự kiến thực hiện các nâng cấp sau: (1) Tích hợp các phương thức xác thực sinh trắc học như vân tay hoặc khuôn mặt (Biometrics) để tăng trải nghiệm đăng nhập nhanh trên Android. (2) Sử dụng hệ thống Message Broker (ví dụ Apache Kafka) để truyền tải và đồng bộ dữ liệu bất đồng bộ giữa các microservices một cách hiệu quả. (3) Mở rộng chức năng thanh toán hóa đơn điện/nước và kết nối với các cổng thanh toán điện tử phổ biến tại Việt Nam.</w:t>
+        <w:t>Nhóm dự kiến phát triển nâng cấp hệ thống trong tương lai bằng cách tích hợp thêm các chức năng: Xác thực sinh trắc học (vân tay, nhận diện khuôn mặt) trực tiếp trên Android; triển khai cơ chế Message Broker qua Apache Kafka để tối ưu hóa khả năng truyền tải dữ liệu và nâng cao tính chịu tải của hệ thống ngân hàng di động.</w:t>
       </w:r>
     </w:p>
     <w:p>
@@ -3286,7 +3242,7 @@
     <w:link w:val="Heading1Char"/>
     <w:uiPriority w:val="9"/>
     <w:qFormat/>
-    <w:rsid w:val="007E5285"/>
+    <w:rsid w:val="002575AC"/>
     <w:pPr>
       <w:keepNext/>
       <w:keepLines/>
@@ -3308,7 +3264,7 @@
     <w:uiPriority w:val="9"/>
     <w:unhideWhenUsed/>
     <w:qFormat/>
-    <w:rsid w:val="007E5285"/>
+    <w:rsid w:val="002575AC"/>
     <w:pPr>
       <w:keepNext/>
       <w:keepLines/>
@@ -3331,7 +3287,7 @@
     <w:semiHidden/>
     <w:unhideWhenUsed/>
     <w:qFormat/>
-    <w:rsid w:val="007E5285"/>
+    <w:rsid w:val="002575AC"/>
     <w:pPr>
       <w:keepNext/>
       <w:keepLines/>
@@ -3354,7 +3310,7 @@
     <w:semiHidden/>
     <w:unhideWhenUsed/>
     <w:qFormat/>
-    <w:rsid w:val="007E5285"/>
+    <w:rsid w:val="002575AC"/>
     <w:pPr>
       <w:keepNext/>
       <w:keepLines/>
@@ -3377,7 +3333,7 @@
     <w:semiHidden/>
     <w:unhideWhenUsed/>
     <w:qFormat/>
-    <w:rsid w:val="007E5285"/>
+    <w:rsid w:val="002575AC"/>
     <w:pPr>
       <w:keepNext/>
       <w:keepLines/>
@@ -3398,7 +3354,7 @@
     <w:semiHidden/>
     <w:unhideWhenUsed/>
     <w:qFormat/>
-    <w:rsid w:val="007E5285"/>
+    <w:rsid w:val="002575AC"/>
     <w:pPr>
       <w:keepNext/>
       <w:keepLines/>
@@ -3421,7 +3377,7 @@
     <w:semiHidden/>
     <w:unhideWhenUsed/>
     <w:qFormat/>
-    <w:rsid w:val="007E5285"/>
+    <w:rsid w:val="002575AC"/>
     <w:pPr>
       <w:keepNext/>
       <w:keepLines/>
@@ -3442,7 +3398,7 @@
     <w:semiHidden/>
     <w:unhideWhenUsed/>
     <w:qFormat/>
-    <w:rsid w:val="007E5285"/>
+    <w:rsid w:val="002575AC"/>
     <w:pPr>
       <w:keepNext/>
       <w:keepLines/>
@@ -3465,7 +3421,7 @@
     <w:semiHidden/>
     <w:unhideWhenUsed/>
     <w:qFormat/>
-    <w:rsid w:val="007E5285"/>
+    <w:rsid w:val="002575AC"/>
     <w:pPr>
       <w:keepNext/>
       <w:keepLines/>
@@ -3509,7 +3465,7 @@
     <w:basedOn w:val="DefaultParagraphFont"/>
     <w:link w:val="Heading1"/>
     <w:uiPriority w:val="9"/>
-    <w:rsid w:val="007E5285"/>
+    <w:rsid w:val="002575AC"/>
     <w:rPr>
       <w:rFonts w:asciiTheme="majorHAnsi" w:eastAsiaTheme="majorEastAsia" w:hAnsiTheme="majorHAnsi" w:cstheme="majorBidi"/>
       <w:color w:val="0F4761" w:themeColor="accent1" w:themeShade="BF"/>
@@ -3522,7 +3478,7 @@
     <w:basedOn w:val="DefaultParagraphFont"/>
     <w:link w:val="Heading2"/>
     <w:uiPriority w:val="9"/>
-    <w:rsid w:val="007E5285"/>
+    <w:rsid w:val="002575AC"/>
     <w:rPr>
       <w:rFonts w:asciiTheme="majorHAnsi" w:eastAsiaTheme="majorEastAsia" w:hAnsiTheme="majorHAnsi" w:cstheme="majorBidi"/>
       <w:color w:val="0F4761" w:themeColor="accent1" w:themeShade="BF"/>
@@ -3536,7 +3492,7 @@
     <w:link w:val="Heading3"/>
     <w:uiPriority w:val="9"/>
     <w:semiHidden/>
-    <w:rsid w:val="007E5285"/>
+    <w:rsid w:val="002575AC"/>
     <w:rPr>
       <w:rFonts w:eastAsiaTheme="majorEastAsia" w:cstheme="majorBidi"/>
       <w:color w:val="0F4761" w:themeColor="accent1" w:themeShade="BF"/>
@@ -3550,7 +3506,7 @@
     <w:link w:val="Heading4"/>
     <w:uiPriority w:val="9"/>
     <w:semiHidden/>
-    <w:rsid w:val="007E5285"/>
+    <w:rsid w:val="002575AC"/>
     <w:rPr>
       <w:rFonts w:eastAsiaTheme="majorEastAsia" w:cstheme="majorBidi"/>
       <w:i/>
@@ -3564,7 +3520,7 @@
     <w:link w:val="Heading5"/>
     <w:uiPriority w:val="9"/>
     <w:semiHidden/>
-    <w:rsid w:val="007E5285"/>
+    <w:rsid w:val="002575AC"/>
     <w:rPr>
       <w:rFonts w:eastAsiaTheme="majorEastAsia" w:cstheme="majorBidi"/>
       <w:color w:val="0F4761" w:themeColor="accent1" w:themeShade="BF"/>
@@ -3576,7 +3532,7 @@
     <w:link w:val="Heading6"/>
     <w:uiPriority w:val="9"/>
     <w:semiHidden/>
-    <w:rsid w:val="007E5285"/>
+    <w:rsid w:val="002575AC"/>
     <w:rPr>
       <w:rFonts w:eastAsiaTheme="majorEastAsia" w:cstheme="majorBidi"/>
       <w:i/>
@@ -3590,7 +3546,7 @@
     <w:link w:val="Heading7"/>
     <w:uiPriority w:val="9"/>
     <w:semiHidden/>
-    <w:rsid w:val="007E5285"/>
+    <w:rsid w:val="002575AC"/>
     <w:rPr>
       <w:rFonts w:eastAsiaTheme="majorEastAsia" w:cstheme="majorBidi"/>
       <w:color w:val="595959" w:themeColor="text1" w:themeTint="A6"/>
@@ -3602,7 +3558,7 @@
     <w:link w:val="Heading8"/>
     <w:uiPriority w:val="9"/>
     <w:semiHidden/>
-    <w:rsid w:val="007E5285"/>
+    <w:rsid w:val="002575AC"/>
     <w:rPr>
       <w:rFonts w:eastAsiaTheme="majorEastAsia" w:cstheme="majorBidi"/>
       <w:i/>
@@ -3616,7 +3572,7 @@
     <w:link w:val="Heading9"/>
     <w:uiPriority w:val="9"/>
     <w:semiHidden/>
-    <w:rsid w:val="007E5285"/>
+    <w:rsid w:val="002575AC"/>
     <w:rPr>
       <w:rFonts w:eastAsiaTheme="majorEastAsia" w:cstheme="majorBidi"/>
       <w:color w:val="272727" w:themeColor="text1" w:themeTint="D8"/>
@@ -3629,7 +3585,7 @@
     <w:link w:val="TitleChar"/>
     <w:uiPriority w:val="10"/>
     <w:qFormat/>
-    <w:rsid w:val="007E5285"/>
+    <w:rsid w:val="002575AC"/>
     <w:pPr>
       <w:spacing w:after="80" w:line="240" w:lineRule="auto"/>
       <w:contextualSpacing/>
@@ -3647,7 +3603,7 @@
     <w:basedOn w:val="DefaultParagraphFont"/>
     <w:link w:val="Title"/>
     <w:uiPriority w:val="10"/>
-    <w:rsid w:val="007E5285"/>
+    <w:rsid w:val="002575AC"/>
     <w:rPr>
       <w:rFonts w:asciiTheme="majorHAnsi" w:eastAsiaTheme="majorEastAsia" w:hAnsiTheme="majorHAnsi" w:cstheme="majorBidi"/>
       <w:spacing w:val="-10"/>
@@ -3663,7 +3619,7 @@
     <w:link w:val="SubtitleChar"/>
     <w:uiPriority w:val="11"/>
     <w:qFormat/>
-    <w:rsid w:val="007E5285"/>
+    <w:rsid w:val="002575AC"/>
     <w:pPr>
       <w:numPr>
         <w:ilvl w:val="1"/>
@@ -3682,7 +3638,7 @@
     <w:basedOn w:val="DefaultParagraphFont"/>
     <w:link w:val="Subtitle"/>
     <w:uiPriority w:val="11"/>
-    <w:rsid w:val="007E5285"/>
+    <w:rsid w:val="002575AC"/>
     <w:rPr>
       <w:rFonts w:eastAsiaTheme="majorEastAsia" w:cstheme="majorBidi"/>
       <w:color w:val="595959" w:themeColor="text1" w:themeTint="A6"/>
@@ -3698,7 +3654,7 @@
     <w:link w:val="QuoteChar"/>
     <w:uiPriority w:val="29"/>
     <w:qFormat/>
-    <w:rsid w:val="007E5285"/>
+    <w:rsid w:val="002575AC"/>
     <w:pPr>
       <w:spacing w:before="160"/>
       <w:jc w:val="center"/>
@@ -3714,7 +3670,7 @@
     <w:basedOn w:val="DefaultParagraphFont"/>
     <w:link w:val="Quote"/>
     <w:uiPriority w:val="29"/>
-    <w:rsid w:val="007E5285"/>
+    <w:rsid w:val="002575AC"/>
     <w:rPr>
       <w:i/>
       <w:iCs/>
@@ -3726,7 +3682,7 @@
     <w:basedOn w:val="Normal"/>
     <w:uiPriority w:val="34"/>
     <w:qFormat/>
-    <w:rsid w:val="007E5285"/>
+    <w:rsid w:val="002575AC"/>
     <w:pPr>
       <w:ind w:left="720"/>
       <w:contextualSpacing/>
@@ -3737,7 +3693,7 @@
     <w:basedOn w:val="DefaultParagraphFont"/>
     <w:uiPriority w:val="21"/>
     <w:qFormat/>
-    <w:rsid w:val="007E5285"/>
+    <w:rsid w:val="002575AC"/>
     <w:rPr>
       <w:i/>
       <w:iCs/>
@@ -3751,7 +3707,7 @@
     <w:link w:val="IntenseQuoteChar"/>
     <w:uiPriority w:val="30"/>
     <w:qFormat/>
-    <w:rsid w:val="007E5285"/>
+    <w:rsid w:val="002575AC"/>
     <w:pPr>
       <w:pBdr>
         <w:top w:val="single" w:sz="4" w:space="10" w:color="0F4761" w:themeColor="accent1" w:themeShade="BF"/>
@@ -3772,7 +3728,7 @@
     <w:basedOn w:val="DefaultParagraphFont"/>
     <w:link w:val="IntenseQuote"/>
     <w:uiPriority w:val="30"/>
-    <w:rsid w:val="007E5285"/>
+    <w:rsid w:val="002575AC"/>
     <w:rPr>
       <w:i/>
       <w:iCs/>
@@ -3784,7 +3740,7 @@
     <w:basedOn w:val="DefaultParagraphFont"/>
     <w:uiPriority w:val="32"/>
     <w:qFormat/>
-    <w:rsid w:val="007E5285"/>
+    <w:rsid w:val="002575AC"/>
     <w:rPr>
       <w:b/>
       <w:bCs/>

</xml_diff>

<commit_message>
docs: fix cover page layout overflow and generate dynamic clickable TOC
</commit_message>
<xml_diff>
--- a/Bao_cao_do_an_NLU_Banking.docx
+++ b/Bao_cao_do_an_NLU_Banking.docx
@@ -4,55 +4,115 @@
   <w:body>
     <w:p>
       <w:pPr>
-        <w:spacing w:after="240"/>
+        <w:spacing w:after="120"/>
         <w:jc w:val="center"/>
       </w:pPr>
-      <w:r>
-        <w:rPr>
-          <w:noProof/>
-        </w:rPr>
-        <w:drawing>
-          <wp:inline distT="0" distB="0" distL="0" distR="0" wp14:anchorId="49D11876" wp14:editId="3DFB31C9">
-            <wp:extent cx="1270000" cy="1270000"/>
-            <wp:effectExtent l="0" t="0" r="6350" b="6350"/>
-            <wp:docPr id="1812090970" name="Picture 1"/>
-            <wp:cNvGraphicFramePr/>
-            <a:graphic xmlns:a="http://schemas.openxmlformats.org/drawingml/2006/main">
-              <a:graphicData uri="http://schemas.openxmlformats.org/drawingml/2006/picture">
-                <pic:pic xmlns:pic="http://schemas.openxmlformats.org/drawingml/2006/picture">
-                  <pic:nvPicPr>
-                    <pic:cNvPr id="1812090970" name=""/>
-                    <pic:cNvPicPr/>
-                  </pic:nvPicPr>
-                  <pic:blipFill>
-                    <a:blip r:embed="rId4" cstate="print">
-                      <a:extLst>
-                        <a:ext uri="{28A0092B-C50C-407E-A947-70E740481C1C}">
-                          <a14:useLocalDpi xmlns:a14="http://schemas.microsoft.com/office/drawing/2010/main" val="0"/>
-                        </a:ext>
-                      </a:extLst>
-                    </a:blip>
-                    <a:stretch>
-                      <a:fillRect/>
-                    </a:stretch>
-                  </pic:blipFill>
-                  <pic:spPr>
-                    <a:xfrm>
-                      <a:off x="0" y="0"/>
-                      <a:ext cx="1270000" cy="1270000"/>
-                    </a:xfrm>
-                    <a:prstGeom prst="rect">
-                      <a:avLst/>
-                    </a:prstGeom>
-                  </pic:spPr>
-                </pic:pic>
-              </a:graphicData>
-            </a:graphic>
-          </wp:inline>
-        </w:drawing>
-      </w:r>
     </w:p>
     <w:p/>
+    <w:p>
+      <w:pPr>
+        <w:spacing w:after="60" w:line="248" w:lineRule="auto"/>
+        <w:jc w:val="center"/>
+        <w:rPr>
+          <w:rFonts w:ascii="Times New Roman" w:hAnsi="Times New Roman" w:cs="Times New Roman"/>
+          <w:b/>
+        </w:rPr>
+      </w:pPr>
+      <w:r>
+        <w:rPr>
+          <w:rFonts w:ascii="Times New Roman" w:hAnsi="Times New Roman" w:cs="Times New Roman"/>
+          <w:b/>
+        </w:rPr>
+        <w:t>BỘ GIÁO DỤC VÀ ĐÀO TẠO</w:t>
+      </w:r>
+    </w:p>
+    <w:p>
+      <w:pPr>
+        <w:spacing w:after="60" w:line="248" w:lineRule="auto"/>
+        <w:jc w:val="center"/>
+        <w:rPr>
+          <w:rFonts w:ascii="Times New Roman" w:hAnsi="Times New Roman" w:cs="Times New Roman"/>
+          <w:b/>
+        </w:rPr>
+      </w:pPr>
+      <w:r>
+        <w:rPr>
+          <w:rFonts w:ascii="Times New Roman" w:hAnsi="Times New Roman" w:cs="Times New Roman"/>
+          <w:b/>
+        </w:rPr>
+        <w:t>TRƯỜNG ĐẠI HỌC NÔNG LÂM TP. HỒ CHÍ MINH</w:t>
+      </w:r>
+    </w:p>
+    <w:p>
+      <w:pPr>
+        <w:spacing w:after="120" w:line="248" w:lineRule="auto"/>
+        <w:jc w:val="center"/>
+        <w:rPr>
+          <w:rFonts w:ascii="Times New Roman" w:hAnsi="Times New Roman" w:cs="Times New Roman"/>
+          <w:b/>
+        </w:rPr>
+      </w:pPr>
+      <w:r>
+        <w:rPr>
+          <w:rFonts w:ascii="Times New Roman" w:hAnsi="Times New Roman" w:cs="Times New Roman"/>
+          <w:b/>
+        </w:rPr>
+        <w:t>KHOA CÔNG NGHỆ THÔNG TIN</w:t>
+      </w:r>
+    </w:p>
+    <w:p>
+      <w:pPr>
+        <w:spacing w:after="360" w:line="248" w:lineRule="auto"/>
+        <w:jc w:val="center"/>
+        <w:rPr>
+          <w:rFonts w:ascii="Times New Roman" w:hAnsi="Times New Roman" w:cs="Times New Roman"/>
+        </w:rPr>
+      </w:pPr>
+      <w:r>
+        <w:rPr>
+          <w:rFonts w:ascii="Times New Roman" w:hAnsi="Times New Roman" w:cs="Times New Roman"/>
+        </w:rPr>
+        <w:t>-----------------------------------</w:t>
+      </w:r>
+    </w:p>
+    <w:p>
+      <w:pPr>
+        <w:spacing w:before="240" w:after="80" w:line="248" w:lineRule="auto"/>
+        <w:jc w:val="center"/>
+        <w:rPr>
+          <w:rFonts w:ascii="Times New Roman" w:hAnsi="Times New Roman" w:cs="Times New Roman"/>
+          <w:b/>
+          <w:sz w:val="28"/>
+        </w:rPr>
+      </w:pPr>
+      <w:r>
+        <w:rPr>
+          <w:rFonts w:ascii="Times New Roman" w:hAnsi="Times New Roman" w:cs="Times New Roman"/>
+          <w:b/>
+          <w:sz w:val="28"/>
+        </w:rPr>
+        <w:t>BÁO CÁO ĐỒ ÁN MÔN HỌC</w:t>
+      </w:r>
+    </w:p>
+    <w:p>
+      <w:pPr>
+        <w:spacing w:after="360" w:line="248" w:lineRule="auto"/>
+        <w:jc w:val="center"/>
+        <w:rPr>
+          <w:rFonts w:ascii="Times New Roman" w:hAnsi="Times New Roman" w:cs="Times New Roman"/>
+          <w:b/>
+          <w:sz w:val="28"/>
+        </w:rPr>
+      </w:pPr>
+      <w:r>
+        <w:rPr>
+          <w:rFonts w:ascii="Times New Roman" w:hAnsi="Times New Roman" w:cs="Times New Roman"/>
+          <w:b/>
+          <w:sz w:val="28"/>
+        </w:rPr>
+        <w:t>LẬP TRÌNH TRÊN THIẾT BỊ DI ĐỘNG</w:t>
+      </w:r>
+    </w:p>
     <w:p>
       <w:pPr>
         <w:spacing w:after="80" w:line="248" w:lineRule="auto"/>
@@ -60,16 +120,14 @@
         <w:rPr>
           <w:rFonts w:ascii="Times New Roman" w:hAnsi="Times New Roman" w:cs="Times New Roman"/>
           <w:b/>
-          <w:sz w:val="26"/>
-        </w:rPr>
-      </w:pPr>
-      <w:r>
-        <w:rPr>
-          <w:rFonts w:ascii="Times New Roman" w:hAnsi="Times New Roman" w:cs="Times New Roman"/>
-          <w:b/>
-          <w:sz w:val="26"/>
-        </w:rPr>
-        <w:t>BỘ GIÁO DỤC VÀ ĐÀO TẠO</w:t>
+        </w:rPr>
+      </w:pPr>
+      <w:r>
+        <w:rPr>
+          <w:rFonts w:ascii="Times New Roman" w:hAnsi="Times New Roman" w:cs="Times New Roman"/>
+          <w:b/>
+        </w:rPr>
+        <w:t>ĐỀ TÀI:</w:t>
       </w:r>
     </w:p>
     <w:p>
@@ -79,71 +137,16 @@
         <w:rPr>
           <w:rFonts w:ascii="Times New Roman" w:hAnsi="Times New Roman" w:cs="Times New Roman"/>
           <w:b/>
-          <w:sz w:val="26"/>
-        </w:rPr>
-      </w:pPr>
-      <w:r>
-        <w:rPr>
-          <w:rFonts w:ascii="Times New Roman" w:hAnsi="Times New Roman" w:cs="Times New Roman"/>
-          <w:b/>
-          <w:sz w:val="26"/>
-        </w:rPr>
-        <w:t>TRƯỜNG ĐẠI HỌC NÔNG LÂM TP. HỒ CHÍ MINH</w:t>
-      </w:r>
-    </w:p>
-    <w:p>
-      <w:pPr>
-        <w:spacing w:after="240" w:line="248" w:lineRule="auto"/>
-        <w:jc w:val="center"/>
-        <w:rPr>
-          <w:rFonts w:ascii="Times New Roman" w:hAnsi="Times New Roman" w:cs="Times New Roman"/>
-          <w:b/>
-          <w:sz w:val="26"/>
-        </w:rPr>
-      </w:pPr>
-      <w:r>
-        <w:rPr>
-          <w:rFonts w:ascii="Times New Roman" w:hAnsi="Times New Roman" w:cs="Times New Roman"/>
-          <w:b/>
-          <w:sz w:val="26"/>
-        </w:rPr>
-        <w:t>KHOA CÔNG NGHỆ THÔNG TIN</w:t>
-      </w:r>
-    </w:p>
-    <w:p>
-      <w:pPr>
-        <w:spacing w:after="720" w:line="248" w:lineRule="auto"/>
-        <w:jc w:val="center"/>
-        <w:rPr>
-          <w:rFonts w:ascii="Times New Roman" w:hAnsi="Times New Roman" w:cs="Times New Roman"/>
-          <w:sz w:val="26"/>
-        </w:rPr>
-      </w:pPr>
-      <w:r>
-        <w:rPr>
-          <w:rFonts w:ascii="Times New Roman" w:hAnsi="Times New Roman" w:cs="Times New Roman"/>
-          <w:sz w:val="26"/>
-        </w:rPr>
-        <w:t>-----------------------------------</w:t>
-      </w:r>
-    </w:p>
-    <w:p>
-      <w:pPr>
-        <w:spacing w:before="480" w:after="120" w:line="248" w:lineRule="auto"/>
-        <w:jc w:val="center"/>
-        <w:rPr>
-          <w:rFonts w:ascii="Times New Roman" w:hAnsi="Times New Roman" w:cs="Times New Roman"/>
-          <w:b/>
-          <w:sz w:val="30"/>
-        </w:rPr>
-      </w:pPr>
-      <w:r>
-        <w:rPr>
-          <w:rFonts w:ascii="Times New Roman" w:hAnsi="Times New Roman" w:cs="Times New Roman"/>
-          <w:b/>
-          <w:sz w:val="30"/>
-        </w:rPr>
-        <w:t>BÁO CÁO ĐỒ ÁN MÔN HỌC</w:t>
+          <w:sz w:val="44"/>
+        </w:rPr>
+      </w:pPr>
+      <w:r>
+        <w:rPr>
+          <w:rFonts w:ascii="Times New Roman" w:hAnsi="Times New Roman" w:cs="Times New Roman"/>
+          <w:b/>
+          <w:sz w:val="44"/>
+        </w:rPr>
+        <w:t>NLU BANKING APP</w:t>
       </w:r>
     </w:p>
     <w:p>
@@ -153,109 +156,46 @@
         <w:rPr>
           <w:rFonts w:ascii="Times New Roman" w:hAnsi="Times New Roman" w:cs="Times New Roman"/>
           <w:b/>
-          <w:sz w:val="30"/>
-        </w:rPr>
-      </w:pPr>
-      <w:r>
-        <w:rPr>
-          <w:rFonts w:ascii="Times New Roman" w:hAnsi="Times New Roman" w:cs="Times New Roman"/>
-          <w:b/>
-          <w:sz w:val="30"/>
-        </w:rPr>
-        <w:t>LẬP TRÌNH TRÊN THIẾT BỊ DI ĐỘNG</w:t>
-      </w:r>
-    </w:p>
-    <w:p>
-      <w:pPr>
-        <w:spacing w:after="120" w:line="248" w:lineRule="auto"/>
+        </w:rPr>
+      </w:pPr>
+      <w:r>
+        <w:rPr>
+          <w:rFonts w:ascii="Times New Roman" w:hAnsi="Times New Roman" w:cs="Times New Roman"/>
+          <w:b/>
+        </w:rPr>
+        <w:t>ỨNG DỤNG NGÂN HÀNG DI ĐỘNG MICROSERVICES TRÊN ANDROID</w:t>
+      </w:r>
+    </w:p>
+    <w:p>
+      <w:pPr>
+        <w:spacing w:after="80" w:line="248" w:lineRule="auto"/>
         <w:jc w:val="center"/>
         <w:rPr>
           <w:rFonts w:ascii="Times New Roman" w:hAnsi="Times New Roman" w:cs="Times New Roman"/>
-          <w:b/>
-          <w:sz w:val="28"/>
-        </w:rPr>
-      </w:pPr>
-      <w:r>
-        <w:rPr>
-          <w:rFonts w:ascii="Times New Roman" w:hAnsi="Times New Roman" w:cs="Times New Roman"/>
-          <w:b/>
-          <w:sz w:val="28"/>
-        </w:rPr>
-        <w:t>ĐỀ TÀI:</w:t>
-      </w:r>
-    </w:p>
-    <w:p>
-      <w:pPr>
-        <w:spacing w:after="120" w:line="248" w:lineRule="auto"/>
+          <w:i/>
+        </w:rPr>
+      </w:pPr>
+      <w:r>
+        <w:rPr>
+          <w:rFonts w:ascii="Times New Roman" w:hAnsi="Times New Roman" w:cs="Times New Roman"/>
+          <w:i/>
+        </w:rPr>
+        <w:t>Ngành: Công nghệ thông tin</w:t>
+      </w:r>
+    </w:p>
+    <w:p>
+      <w:pPr>
+        <w:spacing w:after="480" w:line="248" w:lineRule="auto"/>
         <w:jc w:val="center"/>
         <w:rPr>
           <w:rFonts w:ascii="Times New Roman" w:hAnsi="Times New Roman" w:cs="Times New Roman"/>
-          <w:b/>
-          <w:sz w:val="48"/>
-        </w:rPr>
-      </w:pPr>
-      <w:r>
-        <w:rPr>
-          <w:rFonts w:ascii="Times New Roman" w:hAnsi="Times New Roman" w:cs="Times New Roman"/>
-          <w:b/>
-          <w:sz w:val="48"/>
-        </w:rPr>
-        <w:t>NLU BANKING APP</w:t>
-      </w:r>
-    </w:p>
-    <w:p>
-      <w:pPr>
-        <w:spacing w:after="720" w:line="248" w:lineRule="auto"/>
-        <w:jc w:val="center"/>
-        <w:rPr>
-          <w:rFonts w:ascii="Times New Roman" w:hAnsi="Times New Roman" w:cs="Times New Roman"/>
-          <w:b/>
-          <w:sz w:val="28"/>
-        </w:rPr>
-      </w:pPr>
-      <w:r>
-        <w:rPr>
-          <w:rFonts w:ascii="Times New Roman" w:hAnsi="Times New Roman" w:cs="Times New Roman"/>
-          <w:b/>
-          <w:sz w:val="28"/>
-        </w:rPr>
-        <w:t>ỨNG DỤNG NGÂN HÀNG DI ĐỘNG MICROSERVICES TRÊN ANDROID</w:t>
-      </w:r>
-    </w:p>
-    <w:p>
-      <w:pPr>
-        <w:spacing w:after="120" w:line="248" w:lineRule="auto"/>
-        <w:jc w:val="center"/>
-        <w:rPr>
-          <w:rFonts w:ascii="Times New Roman" w:hAnsi="Times New Roman" w:cs="Times New Roman"/>
           <w:i/>
-          <w:sz w:val="26"/>
         </w:rPr>
       </w:pPr>
       <w:r>
         <w:rPr>
           <w:rFonts w:ascii="Times New Roman" w:hAnsi="Times New Roman" w:cs="Times New Roman"/>
           <w:i/>
-          <w:sz w:val="26"/>
-        </w:rPr>
-        <w:t>Ngành: Công nghệ thông tin</w:t>
-      </w:r>
-    </w:p>
-    <w:p>
-      <w:pPr>
-        <w:spacing w:after="720" w:line="248" w:lineRule="auto"/>
-        <w:jc w:val="center"/>
-        <w:rPr>
-          <w:rFonts w:ascii="Times New Roman" w:hAnsi="Times New Roman" w:cs="Times New Roman"/>
-          <w:i/>
-          <w:sz w:val="26"/>
-        </w:rPr>
-      </w:pPr>
-      <w:r>
-        <w:rPr>
-          <w:rFonts w:ascii="Times New Roman" w:hAnsi="Times New Roman" w:cs="Times New Roman"/>
-          <w:i/>
-          <w:sz w:val="26"/>
         </w:rPr>
         <w:t>Niên khóa: 2023 - 2027</w:t>
       </w:r>
@@ -283,13 +223,12 @@
           </w:tcPr>
           <w:p>
             <w:pPr>
-              <w:spacing w:after="720" w:line="248" w:lineRule="auto"/>
+              <w:spacing w:after="480" w:line="248" w:lineRule="auto"/>
               <w:jc w:val="center"/>
               <w:rPr>
                 <w:rFonts w:ascii="Times New Roman" w:hAnsi="Times New Roman" w:cs="Times New Roman"/>
                 <w:b/>
                 <w:i/>
-                <w:sz w:val="26"/>
               </w:rPr>
             </w:pPr>
             <w:r>
@@ -297,7 +236,6 @@
                 <w:rFonts w:ascii="Times New Roman" w:hAnsi="Times New Roman" w:cs="Times New Roman"/>
                 <w:b/>
                 <w:i/>
-                <w:sz w:val="26"/>
               </w:rPr>
               <w:t>GIẢNG VIÊN HƯỚNG DẪN:</w:t>
             </w:r>
@@ -309,13 +247,12 @@
           </w:tcPr>
           <w:p>
             <w:pPr>
-              <w:spacing w:after="720" w:line="248" w:lineRule="auto"/>
+              <w:spacing w:after="480" w:line="248" w:lineRule="auto"/>
               <w:jc w:val="center"/>
               <w:rPr>
                 <w:rFonts w:ascii="Times New Roman" w:hAnsi="Times New Roman" w:cs="Times New Roman"/>
                 <w:b/>
                 <w:i/>
-                <w:sz w:val="26"/>
               </w:rPr>
             </w:pPr>
             <w:r>
@@ -323,7 +260,6 @@
                 <w:rFonts w:ascii="Times New Roman" w:hAnsi="Times New Roman" w:cs="Times New Roman"/>
                 <w:b/>
                 <w:i/>
-                <w:sz w:val="26"/>
               </w:rPr>
               <w:t>Th.S Võ Tấn Toàn</w:t>
             </w:r>
@@ -343,13 +279,12 @@
           </w:tcPr>
           <w:p>
             <w:pPr>
-              <w:spacing w:after="720" w:line="248" w:lineRule="auto"/>
+              <w:spacing w:after="480" w:line="248" w:lineRule="auto"/>
               <w:jc w:val="center"/>
               <w:rPr>
                 <w:rFonts w:ascii="Times New Roman" w:hAnsi="Times New Roman" w:cs="Times New Roman"/>
                 <w:b/>
                 <w:i/>
-                <w:sz w:val="26"/>
               </w:rPr>
             </w:pPr>
             <w:r>
@@ -357,7 +292,6 @@
                 <w:rFonts w:ascii="Times New Roman" w:hAnsi="Times New Roman" w:cs="Times New Roman"/>
                 <w:b/>
                 <w:i/>
-                <w:sz w:val="26"/>
               </w:rPr>
               <w:t>SINH VIÊN THỰC HIỆN:</w:t>
             </w:r>
@@ -369,12 +303,11 @@
           </w:tcPr>
           <w:p>
             <w:pPr>
-              <w:spacing w:after="720" w:line="248" w:lineRule="auto"/>
+              <w:spacing w:after="480" w:line="248" w:lineRule="auto"/>
               <w:jc w:val="center"/>
               <w:rPr>
                 <w:rFonts w:ascii="Times New Roman" w:hAnsi="Times New Roman" w:cs="Times New Roman"/>
                 <w:i/>
-                <w:sz w:val="26"/>
               </w:rPr>
             </w:pPr>
           </w:p>
@@ -393,21 +326,18 @@
           </w:tcPr>
           <w:p>
             <w:pPr>
-              <w:spacing w:after="720" w:line="248" w:lineRule="auto"/>
+              <w:spacing w:after="480" w:line="248" w:lineRule="auto"/>
               <w:jc w:val="center"/>
               <w:rPr>
                 <w:rFonts w:ascii="Times New Roman" w:hAnsi="Times New Roman" w:cs="Times New Roman"/>
                 <w:i/>
-                <w:sz w:val="26"/>
               </w:rPr>
             </w:pPr>
             <w:r>
               <w:rPr>
                 <w:rFonts w:ascii="Times New Roman" w:hAnsi="Times New Roman" w:cs="Times New Roman"/>
                 <w:i/>
-                <w:sz w:val="26"/>
               </w:rPr>
-              <w:lastRenderedPageBreak/>
               <w:t xml:space="preserve">  1. Lê Văn Tính</w:t>
             </w:r>
           </w:p>
@@ -418,19 +348,17 @@
           </w:tcPr>
           <w:p>
             <w:pPr>
-              <w:spacing w:after="720" w:line="248" w:lineRule="auto"/>
+              <w:spacing w:after="480" w:line="248" w:lineRule="auto"/>
               <w:jc w:val="center"/>
               <w:rPr>
                 <w:rFonts w:ascii="Times New Roman" w:hAnsi="Times New Roman" w:cs="Times New Roman"/>
                 <w:i/>
-                <w:sz w:val="26"/>
               </w:rPr>
             </w:pPr>
             <w:r>
               <w:rPr>
                 <w:rFonts w:ascii="Times New Roman" w:hAnsi="Times New Roman" w:cs="Times New Roman"/>
                 <w:i/>
-                <w:sz w:val="26"/>
               </w:rPr>
               <w:t>23130334 (Nhóm trưởng)</w:t>
             </w:r>
@@ -450,19 +378,17 @@
           </w:tcPr>
           <w:p>
             <w:pPr>
-              <w:spacing w:after="720" w:line="248" w:lineRule="auto"/>
+              <w:spacing w:after="480" w:line="248" w:lineRule="auto"/>
               <w:jc w:val="center"/>
               <w:rPr>
                 <w:rFonts w:ascii="Times New Roman" w:hAnsi="Times New Roman" w:cs="Times New Roman"/>
                 <w:i/>
-                <w:sz w:val="26"/>
               </w:rPr>
             </w:pPr>
             <w:r>
               <w:rPr>
                 <w:rFonts w:ascii="Times New Roman" w:hAnsi="Times New Roman" w:cs="Times New Roman"/>
                 <w:i/>
-                <w:sz w:val="26"/>
               </w:rPr>
               <w:t xml:space="preserve">  2. Trần Hoàng Quân</w:t>
             </w:r>
@@ -474,19 +400,17 @@
           </w:tcPr>
           <w:p>
             <w:pPr>
-              <w:spacing w:after="720" w:line="248" w:lineRule="auto"/>
+              <w:spacing w:after="480" w:line="248" w:lineRule="auto"/>
               <w:jc w:val="center"/>
               <w:rPr>
                 <w:rFonts w:ascii="Times New Roman" w:hAnsi="Times New Roman" w:cs="Times New Roman"/>
                 <w:i/>
-                <w:sz w:val="26"/>
               </w:rPr>
             </w:pPr>
             <w:r>
               <w:rPr>
                 <w:rFonts w:ascii="Times New Roman" w:hAnsi="Times New Roman" w:cs="Times New Roman"/>
                 <w:i/>
-                <w:sz w:val="26"/>
               </w:rPr>
               <w:t>23130258</w:t>
             </w:r>
@@ -506,19 +430,17 @@
           </w:tcPr>
           <w:p>
             <w:pPr>
-              <w:spacing w:after="720" w:line="248" w:lineRule="auto"/>
+              <w:spacing w:after="480" w:line="248" w:lineRule="auto"/>
               <w:jc w:val="center"/>
               <w:rPr>
                 <w:rFonts w:ascii="Times New Roman" w:hAnsi="Times New Roman" w:cs="Times New Roman"/>
                 <w:i/>
-                <w:sz w:val="26"/>
               </w:rPr>
             </w:pPr>
             <w:r>
               <w:rPr>
                 <w:rFonts w:ascii="Times New Roman" w:hAnsi="Times New Roman" w:cs="Times New Roman"/>
                 <w:i/>
-                <w:sz w:val="26"/>
               </w:rPr>
               <w:t xml:space="preserve">  3. Nguyễn Văn Anh Hàn</w:t>
             </w:r>
@@ -530,19 +452,17 @@
           </w:tcPr>
           <w:p>
             <w:pPr>
-              <w:spacing w:after="720" w:line="248" w:lineRule="auto"/>
+              <w:spacing w:after="480" w:line="248" w:lineRule="auto"/>
               <w:jc w:val="center"/>
               <w:rPr>
                 <w:rFonts w:ascii="Times New Roman" w:hAnsi="Times New Roman" w:cs="Times New Roman"/>
                 <w:i/>
-                <w:sz w:val="26"/>
               </w:rPr>
             </w:pPr>
             <w:r>
               <w:rPr>
                 <w:rFonts w:ascii="Times New Roman" w:hAnsi="Times New Roman" w:cs="Times New Roman"/>
                 <w:i/>
-                <w:sz w:val="26"/>
               </w:rPr>
               <w:t>23130087</w:t>
             </w:r>
@@ -562,19 +482,17 @@
           </w:tcPr>
           <w:p>
             <w:pPr>
-              <w:spacing w:after="720" w:line="248" w:lineRule="auto"/>
+              <w:spacing w:after="480" w:line="248" w:lineRule="auto"/>
               <w:jc w:val="center"/>
               <w:rPr>
                 <w:rFonts w:ascii="Times New Roman" w:hAnsi="Times New Roman" w:cs="Times New Roman"/>
                 <w:i/>
-                <w:sz w:val="26"/>
               </w:rPr>
             </w:pPr>
             <w:r>
               <w:rPr>
                 <w:rFonts w:ascii="Times New Roman" w:hAnsi="Times New Roman" w:cs="Times New Roman"/>
                 <w:i/>
-                <w:sz w:val="26"/>
               </w:rPr>
               <w:t xml:space="preserve">  4. Phan Nguyễn Minh Thắng</w:t>
             </w:r>
@@ -586,19 +504,17 @@
           </w:tcPr>
           <w:p>
             <w:pPr>
-              <w:spacing w:after="720" w:line="248" w:lineRule="auto"/>
+              <w:spacing w:after="480" w:line="248" w:lineRule="auto"/>
               <w:jc w:val="center"/>
               <w:rPr>
                 <w:rFonts w:ascii="Times New Roman" w:hAnsi="Times New Roman" w:cs="Times New Roman"/>
                 <w:i/>
-                <w:sz w:val="26"/>
               </w:rPr>
             </w:pPr>
             <w:r>
               <w:rPr>
                 <w:rFonts w:ascii="Times New Roman" w:hAnsi="Times New Roman" w:cs="Times New Roman"/>
                 <w:i/>
-                <w:sz w:val="26"/>
               </w:rPr>
               <w:t>23130300</w:t>
             </w:r>
@@ -608,12 +524,13 @@
     </w:tbl>
     <w:p>
       <w:pPr>
-        <w:spacing w:before="1134" w:after="720" w:line="248" w:lineRule="auto"/>
+        <w:spacing w:before="680" w:after="480" w:line="248" w:lineRule="auto"/>
         <w:jc w:val="center"/>
         <w:rPr>
           <w:rFonts w:ascii="Times New Roman" w:hAnsi="Times New Roman" w:cs="Times New Roman"/>
           <w:b/>
           <w:i/>
+          <w:sz w:val="22"/>
         </w:rPr>
       </w:pPr>
       <w:r>
@@ -621,18 +538,20 @@
           <w:rFonts w:ascii="Times New Roman" w:hAnsi="Times New Roman" w:cs="Times New Roman"/>
           <w:b/>
           <w:i/>
+          <w:sz w:val="22"/>
         </w:rPr>
         <w:t>TP. HỒ CHÍ MINH, THÁNG 7 NĂM 2026</w:t>
       </w:r>
     </w:p>
     <w:p>
       <w:pPr>
-        <w:spacing w:before="1134" w:after="720" w:line="248" w:lineRule="auto"/>
+        <w:spacing w:before="680" w:after="480" w:line="248" w:lineRule="auto"/>
         <w:jc w:val="center"/>
         <w:rPr>
           <w:rFonts w:ascii="Times New Roman" w:hAnsi="Times New Roman" w:cs="Times New Roman"/>
           <w:b/>
           <w:i/>
+          <w:sz w:val="22"/>
         </w:rPr>
         <w:sectPr>
           <w:pgSz w:w="12240" w:h="15840"/>
@@ -658,6 +577,7 @@
           <w:b/>
           <w:sz w:val="32"/>
         </w:rPr>
+        <w:lastRenderedPageBreak/>
         <w:t>MỤC LỤC</w:t>
       </w:r>
     </w:p>
@@ -2142,7 +2062,7 @@
     <w:link w:val="Heading1Char"/>
     <w:uiPriority w:val="9"/>
     <w:qFormat/>
-    <w:rsid w:val="004F128F"/>
+    <w:rsid w:val="00BE4708"/>
     <w:pPr>
       <w:keepNext/>
       <w:keepLines/>
@@ -2164,7 +2084,7 @@
     <w:uiPriority w:val="9"/>
     <w:unhideWhenUsed/>
     <w:qFormat/>
-    <w:rsid w:val="004F128F"/>
+    <w:rsid w:val="00BE4708"/>
     <w:pPr>
       <w:keepNext/>
       <w:keepLines/>
@@ -2187,7 +2107,7 @@
     <w:semiHidden/>
     <w:unhideWhenUsed/>
     <w:qFormat/>
-    <w:rsid w:val="004F128F"/>
+    <w:rsid w:val="00BE4708"/>
     <w:pPr>
       <w:keepNext/>
       <w:keepLines/>
@@ -2210,7 +2130,7 @@
     <w:semiHidden/>
     <w:unhideWhenUsed/>
     <w:qFormat/>
-    <w:rsid w:val="004F128F"/>
+    <w:rsid w:val="00BE4708"/>
     <w:pPr>
       <w:keepNext/>
       <w:keepLines/>
@@ -2233,7 +2153,7 @@
     <w:semiHidden/>
     <w:unhideWhenUsed/>
     <w:qFormat/>
-    <w:rsid w:val="004F128F"/>
+    <w:rsid w:val="00BE4708"/>
     <w:pPr>
       <w:keepNext/>
       <w:keepLines/>
@@ -2254,7 +2174,7 @@
     <w:semiHidden/>
     <w:unhideWhenUsed/>
     <w:qFormat/>
-    <w:rsid w:val="004F128F"/>
+    <w:rsid w:val="00BE4708"/>
     <w:pPr>
       <w:keepNext/>
       <w:keepLines/>
@@ -2277,7 +2197,7 @@
     <w:semiHidden/>
     <w:unhideWhenUsed/>
     <w:qFormat/>
-    <w:rsid w:val="004F128F"/>
+    <w:rsid w:val="00BE4708"/>
     <w:pPr>
       <w:keepNext/>
       <w:keepLines/>
@@ -2298,7 +2218,7 @@
     <w:semiHidden/>
     <w:unhideWhenUsed/>
     <w:qFormat/>
-    <w:rsid w:val="004F128F"/>
+    <w:rsid w:val="00BE4708"/>
     <w:pPr>
       <w:keepNext/>
       <w:keepLines/>
@@ -2321,7 +2241,7 @@
     <w:semiHidden/>
     <w:unhideWhenUsed/>
     <w:qFormat/>
-    <w:rsid w:val="004F128F"/>
+    <w:rsid w:val="00BE4708"/>
     <w:pPr>
       <w:keepNext/>
       <w:keepLines/>
@@ -2365,7 +2285,7 @@
     <w:basedOn w:val="DefaultParagraphFont"/>
     <w:link w:val="Heading1"/>
     <w:uiPriority w:val="9"/>
-    <w:rsid w:val="004F128F"/>
+    <w:rsid w:val="00BE4708"/>
     <w:rPr>
       <w:rFonts w:asciiTheme="majorHAnsi" w:eastAsiaTheme="majorEastAsia" w:hAnsiTheme="majorHAnsi" w:cstheme="majorBidi"/>
       <w:color w:val="0F4761" w:themeColor="accent1" w:themeShade="BF"/>
@@ -2378,7 +2298,7 @@
     <w:basedOn w:val="DefaultParagraphFont"/>
     <w:link w:val="Heading2"/>
     <w:uiPriority w:val="9"/>
-    <w:rsid w:val="004F128F"/>
+    <w:rsid w:val="00BE4708"/>
     <w:rPr>
       <w:rFonts w:asciiTheme="majorHAnsi" w:eastAsiaTheme="majorEastAsia" w:hAnsiTheme="majorHAnsi" w:cstheme="majorBidi"/>
       <w:color w:val="0F4761" w:themeColor="accent1" w:themeShade="BF"/>
@@ -2392,7 +2312,7 @@
     <w:link w:val="Heading3"/>
     <w:uiPriority w:val="9"/>
     <w:semiHidden/>
-    <w:rsid w:val="004F128F"/>
+    <w:rsid w:val="00BE4708"/>
     <w:rPr>
       <w:rFonts w:eastAsiaTheme="majorEastAsia" w:cstheme="majorBidi"/>
       <w:color w:val="0F4761" w:themeColor="accent1" w:themeShade="BF"/>
@@ -2406,7 +2326,7 @@
     <w:link w:val="Heading4"/>
     <w:uiPriority w:val="9"/>
     <w:semiHidden/>
-    <w:rsid w:val="004F128F"/>
+    <w:rsid w:val="00BE4708"/>
     <w:rPr>
       <w:rFonts w:eastAsiaTheme="majorEastAsia" w:cstheme="majorBidi"/>
       <w:i/>
@@ -2420,7 +2340,7 @@
     <w:link w:val="Heading5"/>
     <w:uiPriority w:val="9"/>
     <w:semiHidden/>
-    <w:rsid w:val="004F128F"/>
+    <w:rsid w:val="00BE4708"/>
     <w:rPr>
       <w:rFonts w:eastAsiaTheme="majorEastAsia" w:cstheme="majorBidi"/>
       <w:color w:val="0F4761" w:themeColor="accent1" w:themeShade="BF"/>
@@ -2432,7 +2352,7 @@
     <w:link w:val="Heading6"/>
     <w:uiPriority w:val="9"/>
     <w:semiHidden/>
-    <w:rsid w:val="004F128F"/>
+    <w:rsid w:val="00BE4708"/>
     <w:rPr>
       <w:rFonts w:eastAsiaTheme="majorEastAsia" w:cstheme="majorBidi"/>
       <w:i/>
@@ -2446,7 +2366,7 @@
     <w:link w:val="Heading7"/>
     <w:uiPriority w:val="9"/>
     <w:semiHidden/>
-    <w:rsid w:val="004F128F"/>
+    <w:rsid w:val="00BE4708"/>
     <w:rPr>
       <w:rFonts w:eastAsiaTheme="majorEastAsia" w:cstheme="majorBidi"/>
       <w:color w:val="595959" w:themeColor="text1" w:themeTint="A6"/>
@@ -2458,7 +2378,7 @@
     <w:link w:val="Heading8"/>
     <w:uiPriority w:val="9"/>
     <w:semiHidden/>
-    <w:rsid w:val="004F128F"/>
+    <w:rsid w:val="00BE4708"/>
     <w:rPr>
       <w:rFonts w:eastAsiaTheme="majorEastAsia" w:cstheme="majorBidi"/>
       <w:i/>
@@ -2472,7 +2392,7 @@
     <w:link w:val="Heading9"/>
     <w:uiPriority w:val="9"/>
     <w:semiHidden/>
-    <w:rsid w:val="004F128F"/>
+    <w:rsid w:val="00BE4708"/>
     <w:rPr>
       <w:rFonts w:eastAsiaTheme="majorEastAsia" w:cstheme="majorBidi"/>
       <w:color w:val="272727" w:themeColor="text1" w:themeTint="D8"/>
@@ -2485,7 +2405,7 @@
     <w:link w:val="TitleChar"/>
     <w:uiPriority w:val="10"/>
     <w:qFormat/>
-    <w:rsid w:val="004F128F"/>
+    <w:rsid w:val="00BE4708"/>
     <w:pPr>
       <w:spacing w:after="80" w:line="240" w:lineRule="auto"/>
       <w:contextualSpacing/>
@@ -2503,7 +2423,7 @@
     <w:basedOn w:val="DefaultParagraphFont"/>
     <w:link w:val="Title"/>
     <w:uiPriority w:val="10"/>
-    <w:rsid w:val="004F128F"/>
+    <w:rsid w:val="00BE4708"/>
     <w:rPr>
       <w:rFonts w:asciiTheme="majorHAnsi" w:eastAsiaTheme="majorEastAsia" w:hAnsiTheme="majorHAnsi" w:cstheme="majorBidi"/>
       <w:spacing w:val="-10"/>
@@ -2519,7 +2439,7 @@
     <w:link w:val="SubtitleChar"/>
     <w:uiPriority w:val="11"/>
     <w:qFormat/>
-    <w:rsid w:val="004F128F"/>
+    <w:rsid w:val="00BE4708"/>
     <w:pPr>
       <w:numPr>
         <w:ilvl w:val="1"/>
@@ -2538,7 +2458,7 @@
     <w:basedOn w:val="DefaultParagraphFont"/>
     <w:link w:val="Subtitle"/>
     <w:uiPriority w:val="11"/>
-    <w:rsid w:val="004F128F"/>
+    <w:rsid w:val="00BE4708"/>
     <w:rPr>
       <w:rFonts w:eastAsiaTheme="majorEastAsia" w:cstheme="majorBidi"/>
       <w:color w:val="595959" w:themeColor="text1" w:themeTint="A6"/>
@@ -2554,7 +2474,7 @@
     <w:link w:val="QuoteChar"/>
     <w:uiPriority w:val="29"/>
     <w:qFormat/>
-    <w:rsid w:val="004F128F"/>
+    <w:rsid w:val="00BE4708"/>
     <w:pPr>
       <w:spacing w:before="160"/>
       <w:jc w:val="center"/>
@@ -2570,7 +2490,7 @@
     <w:basedOn w:val="DefaultParagraphFont"/>
     <w:link w:val="Quote"/>
     <w:uiPriority w:val="29"/>
-    <w:rsid w:val="004F128F"/>
+    <w:rsid w:val="00BE4708"/>
     <w:rPr>
       <w:i/>
       <w:iCs/>
@@ -2582,7 +2502,7 @@
     <w:basedOn w:val="Normal"/>
     <w:uiPriority w:val="34"/>
     <w:qFormat/>
-    <w:rsid w:val="004F128F"/>
+    <w:rsid w:val="00BE4708"/>
     <w:pPr>
       <w:ind w:left="720"/>
       <w:contextualSpacing/>
@@ -2593,7 +2513,7 @@
     <w:basedOn w:val="DefaultParagraphFont"/>
     <w:uiPriority w:val="21"/>
     <w:qFormat/>
-    <w:rsid w:val="004F128F"/>
+    <w:rsid w:val="00BE4708"/>
     <w:rPr>
       <w:i/>
       <w:iCs/>
@@ -2607,7 +2527,7 @@
     <w:link w:val="IntenseQuoteChar"/>
     <w:uiPriority w:val="30"/>
     <w:qFormat/>
-    <w:rsid w:val="004F128F"/>
+    <w:rsid w:val="00BE4708"/>
     <w:pPr>
       <w:pBdr>
         <w:top w:val="single" w:sz="4" w:space="10" w:color="0F4761" w:themeColor="accent1" w:themeShade="BF"/>
@@ -2628,7 +2548,7 @@
     <w:basedOn w:val="DefaultParagraphFont"/>
     <w:link w:val="IntenseQuote"/>
     <w:uiPriority w:val="30"/>
-    <w:rsid w:val="004F128F"/>
+    <w:rsid w:val="00BE4708"/>
     <w:rPr>
       <w:i/>
       <w:iCs/>
@@ -2640,7 +2560,7 @@
     <w:basedOn w:val="DefaultParagraphFont"/>
     <w:uiPriority w:val="32"/>
     <w:qFormat/>
-    <w:rsid w:val="004F128F"/>
+    <w:rsid w:val="00BE4708"/>
     <w:rPr>
       <w:b/>
       <w:bCs/>

</xml_diff>

<commit_message>
docs: finalize page borders on cover page only, bold black headings, and dynamic TOC
</commit_message>
<xml_diff>
--- a/Bao_cao_do_an_NLU_Banking.docx
+++ b/Bao_cao_do_an_NLU_Banking.docx
@@ -7,6 +7,50 @@
         <w:spacing w:after="120"/>
         <w:jc w:val="center"/>
       </w:pPr>
+      <w:r>
+        <w:rPr>
+          <w:noProof/>
+        </w:rPr>
+        <w:drawing>
+          <wp:inline distT="0" distB="0" distL="0" distR="0" wp14:anchorId="50D86826" wp14:editId="08CD294D">
+            <wp:extent cx="1016000" cy="1016000"/>
+            <wp:effectExtent l="0" t="0" r="0" b="0"/>
+            <wp:docPr id="1476785049" name="Picture 1"/>
+            <wp:cNvGraphicFramePr/>
+            <a:graphic xmlns:a="http://schemas.openxmlformats.org/drawingml/2006/main">
+              <a:graphicData uri="http://schemas.openxmlformats.org/drawingml/2006/picture">
+                <pic:pic xmlns:pic="http://schemas.openxmlformats.org/drawingml/2006/picture">
+                  <pic:nvPicPr>
+                    <pic:cNvPr id="1476785049" name=""/>
+                    <pic:cNvPicPr/>
+                  </pic:nvPicPr>
+                  <pic:blipFill>
+                    <a:blip r:embed="rId4" cstate="print">
+                      <a:extLst>
+                        <a:ext uri="{28A0092B-C50C-407E-A947-70E740481C1C}">
+                          <a14:useLocalDpi xmlns:a14="http://schemas.microsoft.com/office/drawing/2010/main" val="0"/>
+                        </a:ext>
+                      </a:extLst>
+                    </a:blip>
+                    <a:stretch>
+                      <a:fillRect/>
+                    </a:stretch>
+                  </pic:blipFill>
+                  <pic:spPr>
+                    <a:xfrm>
+                      <a:off x="0" y="0"/>
+                      <a:ext cx="1016000" cy="1016000"/>
+                    </a:xfrm>
+                    <a:prstGeom prst="rect">
+                      <a:avLst/>
+                    </a:prstGeom>
+                  </pic:spPr>
+                </pic:pic>
+              </a:graphicData>
+            </a:graphic>
+          </wp:inline>
+        </w:drawing>
+      </w:r>
     </w:p>
     <w:p/>
     <w:p>
@@ -16,12 +60,14 @@
         <w:rPr>
           <w:rFonts w:ascii="Times New Roman" w:hAnsi="Times New Roman" w:cs="Times New Roman"/>
           <w:b/>
-        </w:rPr>
-      </w:pPr>
-      <w:r>
-        <w:rPr>
-          <w:rFonts w:ascii="Times New Roman" w:hAnsi="Times New Roman" w:cs="Times New Roman"/>
-          <w:b/>
+          <w:color w:val="000000"/>
+        </w:rPr>
+      </w:pPr>
+      <w:r>
+        <w:rPr>
+          <w:rFonts w:ascii="Times New Roman" w:hAnsi="Times New Roman" w:cs="Times New Roman"/>
+          <w:b/>
+          <w:color w:val="000000"/>
         </w:rPr>
         <w:t>BỘ GIÁO DỤC VÀ ĐÀO TẠO</w:t>
       </w:r>
@@ -33,12 +79,14 @@
         <w:rPr>
           <w:rFonts w:ascii="Times New Roman" w:hAnsi="Times New Roman" w:cs="Times New Roman"/>
           <w:b/>
-        </w:rPr>
-      </w:pPr>
-      <w:r>
-        <w:rPr>
-          <w:rFonts w:ascii="Times New Roman" w:hAnsi="Times New Roman" w:cs="Times New Roman"/>
-          <w:b/>
+          <w:color w:val="000000"/>
+        </w:rPr>
+      </w:pPr>
+      <w:r>
+        <w:rPr>
+          <w:rFonts w:ascii="Times New Roman" w:hAnsi="Times New Roman" w:cs="Times New Roman"/>
+          <w:b/>
+          <w:color w:val="000000"/>
         </w:rPr>
         <w:t>TRƯỜNG ĐẠI HỌC NÔNG LÂM TP. HỒ CHÍ MINH</w:t>
       </w:r>
@@ -50,12 +98,14 @@
         <w:rPr>
           <w:rFonts w:ascii="Times New Roman" w:hAnsi="Times New Roman" w:cs="Times New Roman"/>
           <w:b/>
-        </w:rPr>
-      </w:pPr>
-      <w:r>
-        <w:rPr>
-          <w:rFonts w:ascii="Times New Roman" w:hAnsi="Times New Roman" w:cs="Times New Roman"/>
-          <w:b/>
+          <w:color w:val="000000"/>
+        </w:rPr>
+      </w:pPr>
+      <w:r>
+        <w:rPr>
+          <w:rFonts w:ascii="Times New Roman" w:hAnsi="Times New Roman" w:cs="Times New Roman"/>
+          <w:b/>
+          <w:color w:val="000000"/>
         </w:rPr>
         <w:t>KHOA CÔNG NGHỆ THÔNG TIN</w:t>
       </w:r>
@@ -66,11 +116,13 @@
         <w:jc w:val="center"/>
         <w:rPr>
           <w:rFonts w:ascii="Times New Roman" w:hAnsi="Times New Roman" w:cs="Times New Roman"/>
-        </w:rPr>
-      </w:pPr>
-      <w:r>
-        <w:rPr>
-          <w:rFonts w:ascii="Times New Roman" w:hAnsi="Times New Roman" w:cs="Times New Roman"/>
+          <w:color w:val="000000"/>
+        </w:rPr>
+      </w:pPr>
+      <w:r>
+        <w:rPr>
+          <w:rFonts w:ascii="Times New Roman" w:hAnsi="Times New Roman" w:cs="Times New Roman"/>
+          <w:color w:val="000000"/>
         </w:rPr>
         <w:t>-----------------------------------</w:t>
       </w:r>
@@ -82,6 +134,7 @@
         <w:rPr>
           <w:rFonts w:ascii="Times New Roman" w:hAnsi="Times New Roman" w:cs="Times New Roman"/>
           <w:b/>
+          <w:color w:val="000000"/>
           <w:sz w:val="28"/>
         </w:rPr>
       </w:pPr>
@@ -89,6 +142,7 @@
         <w:rPr>
           <w:rFonts w:ascii="Times New Roman" w:hAnsi="Times New Roman" w:cs="Times New Roman"/>
           <w:b/>
+          <w:color w:val="000000"/>
           <w:sz w:val="28"/>
         </w:rPr>
         <w:t>BÁO CÁO ĐỒ ÁN MÔN HỌC</w:t>
@@ -101,6 +155,7 @@
         <w:rPr>
           <w:rFonts w:ascii="Times New Roman" w:hAnsi="Times New Roman" w:cs="Times New Roman"/>
           <w:b/>
+          <w:color w:val="000000"/>
           <w:sz w:val="28"/>
         </w:rPr>
       </w:pPr>
@@ -108,6 +163,7 @@
         <w:rPr>
           <w:rFonts w:ascii="Times New Roman" w:hAnsi="Times New Roman" w:cs="Times New Roman"/>
           <w:b/>
+          <w:color w:val="000000"/>
           <w:sz w:val="28"/>
         </w:rPr>
         <w:t>LẬP TRÌNH TRÊN THIẾT BỊ DI ĐỘNG</w:t>
@@ -120,12 +176,14 @@
         <w:rPr>
           <w:rFonts w:ascii="Times New Roman" w:hAnsi="Times New Roman" w:cs="Times New Roman"/>
           <w:b/>
-        </w:rPr>
-      </w:pPr>
-      <w:r>
-        <w:rPr>
-          <w:rFonts w:ascii="Times New Roman" w:hAnsi="Times New Roman" w:cs="Times New Roman"/>
-          <w:b/>
+          <w:color w:val="000000"/>
+        </w:rPr>
+      </w:pPr>
+      <w:r>
+        <w:rPr>
+          <w:rFonts w:ascii="Times New Roman" w:hAnsi="Times New Roman" w:cs="Times New Roman"/>
+          <w:b/>
+          <w:color w:val="000000"/>
         </w:rPr>
         <w:t>ĐỀ TÀI:</w:t>
       </w:r>
@@ -137,6 +195,7 @@
         <w:rPr>
           <w:rFonts w:ascii="Times New Roman" w:hAnsi="Times New Roman" w:cs="Times New Roman"/>
           <w:b/>
+          <w:color w:val="000000"/>
           <w:sz w:val="44"/>
         </w:rPr>
       </w:pPr>
@@ -144,6 +203,7 @@
         <w:rPr>
           <w:rFonts w:ascii="Times New Roman" w:hAnsi="Times New Roman" w:cs="Times New Roman"/>
           <w:b/>
+          <w:color w:val="000000"/>
           <w:sz w:val="44"/>
         </w:rPr>
         <w:t>NLU BANKING APP</w:t>
@@ -156,12 +216,14 @@
         <w:rPr>
           <w:rFonts w:ascii="Times New Roman" w:hAnsi="Times New Roman" w:cs="Times New Roman"/>
           <w:b/>
-        </w:rPr>
-      </w:pPr>
-      <w:r>
-        <w:rPr>
-          <w:rFonts w:ascii="Times New Roman" w:hAnsi="Times New Roman" w:cs="Times New Roman"/>
-          <w:b/>
+          <w:color w:val="000000"/>
+        </w:rPr>
+      </w:pPr>
+      <w:r>
+        <w:rPr>
+          <w:rFonts w:ascii="Times New Roman" w:hAnsi="Times New Roman" w:cs="Times New Roman"/>
+          <w:b/>
+          <w:color w:val="000000"/>
         </w:rPr>
         <w:t>ỨNG DỤNG NGÂN HÀNG DI ĐỘNG MICROSERVICES TRÊN ANDROID</w:t>
       </w:r>
@@ -173,12 +235,14 @@
         <w:rPr>
           <w:rFonts w:ascii="Times New Roman" w:hAnsi="Times New Roman" w:cs="Times New Roman"/>
           <w:i/>
+          <w:color w:val="000000"/>
         </w:rPr>
       </w:pPr>
       <w:r>
         <w:rPr>
           <w:rFonts w:ascii="Times New Roman" w:hAnsi="Times New Roman" w:cs="Times New Roman"/>
           <w:i/>
+          <w:color w:val="000000"/>
         </w:rPr>
         <w:t>Ngành: Công nghệ thông tin</w:t>
       </w:r>
@@ -190,12 +254,14 @@
         <w:rPr>
           <w:rFonts w:ascii="Times New Roman" w:hAnsi="Times New Roman" w:cs="Times New Roman"/>
           <w:i/>
+          <w:color w:val="000000"/>
         </w:rPr>
       </w:pPr>
       <w:r>
         <w:rPr>
           <w:rFonts w:ascii="Times New Roman" w:hAnsi="Times New Roman" w:cs="Times New Roman"/>
           <w:i/>
+          <w:color w:val="000000"/>
         </w:rPr>
         <w:t>Niên khóa: 2023 - 2027</w:t>
       </w:r>
@@ -229,6 +295,7 @@
                 <w:rFonts w:ascii="Times New Roman" w:hAnsi="Times New Roman" w:cs="Times New Roman"/>
                 <w:b/>
                 <w:i/>
+                <w:color w:val="000000"/>
               </w:rPr>
             </w:pPr>
             <w:r>
@@ -236,6 +303,7 @@
                 <w:rFonts w:ascii="Times New Roman" w:hAnsi="Times New Roman" w:cs="Times New Roman"/>
                 <w:b/>
                 <w:i/>
+                <w:color w:val="000000"/>
               </w:rPr>
               <w:t>GIẢNG VIÊN HƯỚNG DẪN:</w:t>
             </w:r>
@@ -253,6 +321,7 @@
                 <w:rFonts w:ascii="Times New Roman" w:hAnsi="Times New Roman" w:cs="Times New Roman"/>
                 <w:b/>
                 <w:i/>
+                <w:color w:val="000000"/>
               </w:rPr>
             </w:pPr>
             <w:r>
@@ -260,6 +329,7 @@
                 <w:rFonts w:ascii="Times New Roman" w:hAnsi="Times New Roman" w:cs="Times New Roman"/>
                 <w:b/>
                 <w:i/>
+                <w:color w:val="000000"/>
               </w:rPr>
               <w:t>Th.S Võ Tấn Toàn</w:t>
             </w:r>
@@ -285,6 +355,7 @@
                 <w:rFonts w:ascii="Times New Roman" w:hAnsi="Times New Roman" w:cs="Times New Roman"/>
                 <w:b/>
                 <w:i/>
+                <w:color w:val="000000"/>
               </w:rPr>
             </w:pPr>
             <w:r>
@@ -292,6 +363,7 @@
                 <w:rFonts w:ascii="Times New Roman" w:hAnsi="Times New Roman" w:cs="Times New Roman"/>
                 <w:b/>
                 <w:i/>
+                <w:color w:val="000000"/>
               </w:rPr>
               <w:t>SINH VIÊN THỰC HIỆN:</w:t>
             </w:r>
@@ -308,6 +380,7 @@
               <w:rPr>
                 <w:rFonts w:ascii="Times New Roman" w:hAnsi="Times New Roman" w:cs="Times New Roman"/>
                 <w:i/>
+                <w:color w:val="000000"/>
               </w:rPr>
             </w:pPr>
           </w:p>
@@ -331,12 +404,14 @@
               <w:rPr>
                 <w:rFonts w:ascii="Times New Roman" w:hAnsi="Times New Roman" w:cs="Times New Roman"/>
                 <w:i/>
+                <w:color w:val="000000"/>
               </w:rPr>
             </w:pPr>
             <w:r>
               <w:rPr>
                 <w:rFonts w:ascii="Times New Roman" w:hAnsi="Times New Roman" w:cs="Times New Roman"/>
                 <w:i/>
+                <w:color w:val="000000"/>
               </w:rPr>
               <w:t xml:space="preserve">  1. Lê Văn Tính</w:t>
             </w:r>
@@ -353,12 +428,14 @@
               <w:rPr>
                 <w:rFonts w:ascii="Times New Roman" w:hAnsi="Times New Roman" w:cs="Times New Roman"/>
                 <w:i/>
+                <w:color w:val="000000"/>
               </w:rPr>
             </w:pPr>
             <w:r>
               <w:rPr>
                 <w:rFonts w:ascii="Times New Roman" w:hAnsi="Times New Roman" w:cs="Times New Roman"/>
                 <w:i/>
+                <w:color w:val="000000"/>
               </w:rPr>
               <w:t>23130334 (Nhóm trưởng)</w:t>
             </w:r>
@@ -383,12 +460,14 @@
               <w:rPr>
                 <w:rFonts w:ascii="Times New Roman" w:hAnsi="Times New Roman" w:cs="Times New Roman"/>
                 <w:i/>
+                <w:color w:val="000000"/>
               </w:rPr>
             </w:pPr>
             <w:r>
               <w:rPr>
                 <w:rFonts w:ascii="Times New Roman" w:hAnsi="Times New Roman" w:cs="Times New Roman"/>
                 <w:i/>
+                <w:color w:val="000000"/>
               </w:rPr>
               <w:t xml:space="preserve">  2. Trần Hoàng Quân</w:t>
             </w:r>
@@ -405,12 +484,14 @@
               <w:rPr>
                 <w:rFonts w:ascii="Times New Roman" w:hAnsi="Times New Roman" w:cs="Times New Roman"/>
                 <w:i/>
+                <w:color w:val="000000"/>
               </w:rPr>
             </w:pPr>
             <w:r>
               <w:rPr>
                 <w:rFonts w:ascii="Times New Roman" w:hAnsi="Times New Roman" w:cs="Times New Roman"/>
                 <w:i/>
+                <w:color w:val="000000"/>
               </w:rPr>
               <w:t>23130258</w:t>
             </w:r>
@@ -435,12 +516,14 @@
               <w:rPr>
                 <w:rFonts w:ascii="Times New Roman" w:hAnsi="Times New Roman" w:cs="Times New Roman"/>
                 <w:i/>
+                <w:color w:val="000000"/>
               </w:rPr>
             </w:pPr>
             <w:r>
               <w:rPr>
                 <w:rFonts w:ascii="Times New Roman" w:hAnsi="Times New Roman" w:cs="Times New Roman"/>
                 <w:i/>
+                <w:color w:val="000000"/>
               </w:rPr>
               <w:t xml:space="preserve">  3. Nguyễn Văn Anh Hàn</w:t>
             </w:r>
@@ -457,12 +540,14 @@
               <w:rPr>
                 <w:rFonts w:ascii="Times New Roman" w:hAnsi="Times New Roman" w:cs="Times New Roman"/>
                 <w:i/>
+                <w:color w:val="000000"/>
               </w:rPr>
             </w:pPr>
             <w:r>
               <w:rPr>
                 <w:rFonts w:ascii="Times New Roman" w:hAnsi="Times New Roman" w:cs="Times New Roman"/>
                 <w:i/>
+                <w:color w:val="000000"/>
               </w:rPr>
               <w:t>23130087</w:t>
             </w:r>
@@ -487,12 +572,14 @@
               <w:rPr>
                 <w:rFonts w:ascii="Times New Roman" w:hAnsi="Times New Roman" w:cs="Times New Roman"/>
                 <w:i/>
+                <w:color w:val="000000"/>
               </w:rPr>
             </w:pPr>
             <w:r>
               <w:rPr>
                 <w:rFonts w:ascii="Times New Roman" w:hAnsi="Times New Roman" w:cs="Times New Roman"/>
                 <w:i/>
+                <w:color w:val="000000"/>
               </w:rPr>
               <w:t xml:space="preserve">  4. Phan Nguyễn Minh Thắng</w:t>
             </w:r>
@@ -509,12 +596,14 @@
               <w:rPr>
                 <w:rFonts w:ascii="Times New Roman" w:hAnsi="Times New Roman" w:cs="Times New Roman"/>
                 <w:i/>
+                <w:color w:val="000000"/>
               </w:rPr>
             </w:pPr>
             <w:r>
               <w:rPr>
                 <w:rFonts w:ascii="Times New Roman" w:hAnsi="Times New Roman" w:cs="Times New Roman"/>
                 <w:i/>
+                <w:color w:val="000000"/>
               </w:rPr>
               <w:t>23130300</w:t>
             </w:r>
@@ -530,6 +619,7 @@
           <w:rFonts w:ascii="Times New Roman" w:hAnsi="Times New Roman" w:cs="Times New Roman"/>
           <w:b/>
           <w:i/>
+          <w:color w:val="000000"/>
           <w:sz w:val="22"/>
         </w:rPr>
       </w:pPr>
@@ -538,28 +628,33 @@
           <w:rFonts w:ascii="Times New Roman" w:hAnsi="Times New Roman" w:cs="Times New Roman"/>
           <w:b/>
           <w:i/>
+          <w:color w:val="000000"/>
           <w:sz w:val="22"/>
         </w:rPr>
+        <w:lastRenderedPageBreak/>
         <w:t>TP. HỒ CHÍ MINH, THÁNG 7 NĂM 2026</w:t>
       </w:r>
     </w:p>
     <w:p>
       <w:pPr>
-        <w:spacing w:before="680" w:after="480" w:line="248" w:lineRule="auto"/>
-        <w:jc w:val="center"/>
         <w:rPr>
           <w:rFonts w:ascii="Times New Roman" w:hAnsi="Times New Roman" w:cs="Times New Roman"/>
           <w:b/>
           <w:i/>
+          <w:color w:val="000000"/>
           <w:sz w:val="22"/>
         </w:rPr>
-        <w:sectPr>
-          <w:pgSz w:w="12240" w:h="15840"/>
-          <w:pgMar w:top="1417" w:right="1134" w:bottom="1417" w:left="1701" w:header="720" w:footer="720" w:gutter="0"/>
-          <w:cols w:space="720"/>
-          <w:docGrid w:linePitch="360"/>
-        </w:sectPr>
-      </w:pPr>
+      </w:pPr>
+      <w:r>
+        <w:rPr>
+          <w:rFonts w:ascii="Times New Roman" w:hAnsi="Times New Roman" w:cs="Times New Roman"/>
+          <w:b/>
+          <w:i/>
+          <w:color w:val="000000"/>
+          <w:sz w:val="22"/>
+        </w:rPr>
+        <w:br w:type="page"/>
+      </w:r>
     </w:p>
     <w:p>
       <w:pPr>
@@ -568,6 +663,7 @@
         <w:rPr>
           <w:rFonts w:ascii="Times New Roman" w:hAnsi="Times New Roman" w:cs="Times New Roman"/>
           <w:b/>
+          <w:color w:val="000000"/>
           <w:sz w:val="32"/>
         </w:rPr>
       </w:pPr>
@@ -575,6 +671,7 @@
         <w:rPr>
           <w:rFonts w:ascii="Times New Roman" w:hAnsi="Times New Roman" w:cs="Times New Roman"/>
           <w:b/>
+          <w:color w:val="000000"/>
           <w:sz w:val="32"/>
         </w:rPr>
         <w:lastRenderedPageBreak/>
@@ -583,64 +680,1357 @@
     </w:p>
     <w:p>
       <w:pPr>
-        <w:rPr>
-          <w:rFonts w:ascii="Times New Roman" w:hAnsi="Times New Roman" w:cs="Times New Roman"/>
-          <w:b/>
+        <w:pStyle w:val="TOC1"/>
+        <w:tabs>
+          <w:tab w:val="right" w:leader="dot" w:pos="9395"/>
+        </w:tabs>
+        <w:rPr>
+          <w:rFonts w:eastAsiaTheme="minorEastAsia"/>
+          <w:noProof/>
+        </w:rPr>
+      </w:pPr>
+      <w:r>
+        <w:rPr>
+          <w:rFonts w:ascii="Times New Roman" w:hAnsi="Times New Roman" w:cs="Times New Roman"/>
+          <w:b/>
+          <w:color w:val="000000"/>
           <w:sz w:val="32"/>
         </w:rPr>
-      </w:pPr>
-      <w:r>
-        <w:rPr>
-          <w:rFonts w:ascii="Times New Roman" w:hAnsi="Times New Roman" w:cs="Times New Roman"/>
-          <w:b/>
+        <w:fldChar w:fldCharType="begin"/>
+      </w:r>
+      <w:r>
+        <w:rPr>
+          <w:rFonts w:ascii="Times New Roman" w:hAnsi="Times New Roman" w:cs="Times New Roman"/>
+          <w:b/>
+          <w:color w:val="000000"/>
           <w:sz w:val="32"/>
         </w:rPr>
+        <w:instrText xml:space="preserve"> TOC \o "1-3" </w:instrText>
+      </w:r>
+      <w:r>
+        <w:rPr>
+          <w:rFonts w:ascii="Times New Roman" w:hAnsi="Times New Roman" w:cs="Times New Roman"/>
+          <w:b/>
+          <w:color w:val="000000"/>
+          <w:sz w:val="32"/>
+        </w:rPr>
+        <w:fldChar w:fldCharType="separate"/>
+      </w:r>
+      <w:r>
+        <w:rPr>
+          <w:rFonts w:ascii="Times New Roman" w:hAnsi="Times New Roman" w:cs="Times New Roman"/>
+          <w:b/>
+          <w:noProof/>
+          <w:color w:val="000000"/>
+        </w:rPr>
+        <w:t>CHƯƠNG 1. GIỚI THIỆU TỔNG QUAN VÀ LIỆT KÊ CHỨC NĂNG DỰ ÁN</w:t>
+      </w:r>
+      <w:r>
+        <w:rPr>
+          <w:noProof/>
+        </w:rPr>
+        <w:tab/>
+      </w:r>
+      <w:r>
+        <w:rPr>
+          <w:noProof/>
+        </w:rPr>
+        <w:fldChar w:fldCharType="begin"/>
+      </w:r>
+      <w:r>
+        <w:rPr>
+          <w:noProof/>
+        </w:rPr>
+        <w:instrText xml:space="preserve"> PAGEREF _Toc233880270 \h </w:instrText>
+      </w:r>
+      <w:r>
+        <w:rPr>
+          <w:noProof/>
+        </w:rPr>
+      </w:r>
+      <w:r>
+        <w:rPr>
+          <w:noProof/>
+        </w:rPr>
+        <w:fldChar w:fldCharType="separate"/>
+      </w:r>
+      <w:r>
+        <w:rPr>
+          <w:noProof/>
+        </w:rPr>
+        <w:t>4</w:t>
+      </w:r>
+      <w:r>
+        <w:rPr>
+          <w:noProof/>
+        </w:rPr>
+        <w:fldChar w:fldCharType="end"/>
+      </w:r>
+    </w:p>
+    <w:p>
+      <w:pPr>
+        <w:pStyle w:val="TOC2"/>
+        <w:tabs>
+          <w:tab w:val="right" w:leader="dot" w:pos="9395"/>
+        </w:tabs>
+        <w:rPr>
+          <w:rFonts w:eastAsiaTheme="minorEastAsia"/>
+          <w:noProof/>
+        </w:rPr>
+      </w:pPr>
+      <w:r>
+        <w:rPr>
+          <w:rFonts w:ascii="Times New Roman" w:hAnsi="Times New Roman" w:cs="Times New Roman"/>
+          <w:b/>
+          <w:noProof/>
+          <w:color w:val="000000"/>
+        </w:rPr>
+        <w:t>1.1. Giới thiệu ứng dụng NLU Banking App</w:t>
+      </w:r>
+      <w:r>
+        <w:rPr>
+          <w:noProof/>
+        </w:rPr>
+        <w:tab/>
+      </w:r>
+      <w:r>
+        <w:rPr>
+          <w:noProof/>
+        </w:rPr>
+        <w:fldChar w:fldCharType="begin"/>
+      </w:r>
+      <w:r>
+        <w:rPr>
+          <w:noProof/>
+        </w:rPr>
+        <w:instrText xml:space="preserve"> PAGEREF _Toc233880271 \h </w:instrText>
+      </w:r>
+      <w:r>
+        <w:rPr>
+          <w:noProof/>
+        </w:rPr>
+      </w:r>
+      <w:r>
+        <w:rPr>
+          <w:noProof/>
+        </w:rPr>
+        <w:fldChar w:fldCharType="separate"/>
+      </w:r>
+      <w:r>
+        <w:rPr>
+          <w:noProof/>
+        </w:rPr>
+        <w:t>4</w:t>
+      </w:r>
+      <w:r>
+        <w:rPr>
+          <w:noProof/>
+        </w:rPr>
+        <w:fldChar w:fldCharType="end"/>
+      </w:r>
+    </w:p>
+    <w:p>
+      <w:pPr>
+        <w:pStyle w:val="TOC2"/>
+        <w:tabs>
+          <w:tab w:val="right" w:leader="dot" w:pos="9395"/>
+        </w:tabs>
+        <w:rPr>
+          <w:rFonts w:eastAsiaTheme="minorEastAsia"/>
+          <w:noProof/>
+        </w:rPr>
+      </w:pPr>
+      <w:r>
+        <w:rPr>
+          <w:rFonts w:ascii="Times New Roman" w:hAnsi="Times New Roman" w:cs="Times New Roman"/>
+          <w:b/>
+          <w:noProof/>
+          <w:color w:val="000000"/>
+        </w:rPr>
+        <w:t>1.2. Danh sách các chức năng lớn của hệ thống</w:t>
+      </w:r>
+      <w:r>
+        <w:rPr>
+          <w:noProof/>
+        </w:rPr>
+        <w:tab/>
+      </w:r>
+      <w:r>
+        <w:rPr>
+          <w:noProof/>
+        </w:rPr>
+        <w:fldChar w:fldCharType="begin"/>
+      </w:r>
+      <w:r>
+        <w:rPr>
+          <w:noProof/>
+        </w:rPr>
+        <w:instrText xml:space="preserve"> PAGEREF _Toc233880272 \h </w:instrText>
+      </w:r>
+      <w:r>
+        <w:rPr>
+          <w:noProof/>
+        </w:rPr>
+      </w:r>
+      <w:r>
+        <w:rPr>
+          <w:noProof/>
+        </w:rPr>
+        <w:fldChar w:fldCharType="separate"/>
+      </w:r>
+      <w:r>
+        <w:rPr>
+          <w:noProof/>
+        </w:rPr>
+        <w:t>4</w:t>
+      </w:r>
+      <w:r>
+        <w:rPr>
+          <w:noProof/>
+        </w:rPr>
+        <w:fldChar w:fldCharType="end"/>
+      </w:r>
+    </w:p>
+    <w:p>
+      <w:pPr>
+        <w:pStyle w:val="TOC2"/>
+        <w:tabs>
+          <w:tab w:val="right" w:leader="dot" w:pos="9395"/>
+        </w:tabs>
+        <w:rPr>
+          <w:rFonts w:eastAsiaTheme="minorEastAsia"/>
+          <w:noProof/>
+        </w:rPr>
+      </w:pPr>
+      <w:r>
+        <w:rPr>
+          <w:rFonts w:ascii="Times New Roman" w:hAnsi="Times New Roman" w:cs="Times New Roman"/>
+          <w:b/>
+          <w:noProof/>
+          <w:color w:val="000000"/>
+        </w:rPr>
+        <w:t>1.3. Chi tiết các chức năng nhỏ đi kèm</w:t>
+      </w:r>
+      <w:r>
+        <w:rPr>
+          <w:noProof/>
+        </w:rPr>
+        <w:tab/>
+      </w:r>
+      <w:r>
+        <w:rPr>
+          <w:noProof/>
+        </w:rPr>
+        <w:fldChar w:fldCharType="begin"/>
+      </w:r>
+      <w:r>
+        <w:rPr>
+          <w:noProof/>
+        </w:rPr>
+        <w:instrText xml:space="preserve"> PAGEREF _Toc233880273 \h </w:instrText>
+      </w:r>
+      <w:r>
+        <w:rPr>
+          <w:noProof/>
+        </w:rPr>
+      </w:r>
+      <w:r>
+        <w:rPr>
+          <w:noProof/>
+        </w:rPr>
+        <w:fldChar w:fldCharType="separate"/>
+      </w:r>
+      <w:r>
+        <w:rPr>
+          <w:noProof/>
+        </w:rPr>
+        <w:t>4</w:t>
+      </w:r>
+      <w:r>
+        <w:rPr>
+          <w:noProof/>
+        </w:rPr>
+        <w:fldChar w:fldCharType="end"/>
+      </w:r>
+    </w:p>
+    <w:p>
+      <w:pPr>
+        <w:pStyle w:val="TOC1"/>
+        <w:tabs>
+          <w:tab w:val="right" w:leader="dot" w:pos="9395"/>
+        </w:tabs>
+        <w:rPr>
+          <w:rFonts w:eastAsiaTheme="minorEastAsia"/>
+          <w:noProof/>
+        </w:rPr>
+      </w:pPr>
+      <w:r>
+        <w:rPr>
+          <w:rFonts w:ascii="Times New Roman" w:hAnsi="Times New Roman" w:cs="Times New Roman"/>
+          <w:b/>
+          <w:noProof/>
+          <w:color w:val="000000"/>
+        </w:rPr>
+        <w:t>CHƯƠNG 2. MÔ TẢ LUỒNG HOẠT ĐỘNG CHÍNH VÀ LUỒNG NGOẠI LỆ</w:t>
+      </w:r>
+      <w:r>
+        <w:rPr>
+          <w:noProof/>
+        </w:rPr>
+        <w:tab/>
+      </w:r>
+      <w:r>
+        <w:rPr>
+          <w:noProof/>
+        </w:rPr>
+        <w:fldChar w:fldCharType="begin"/>
+      </w:r>
+      <w:r>
+        <w:rPr>
+          <w:noProof/>
+        </w:rPr>
+        <w:instrText xml:space="preserve"> PAGEREF _Toc233880274 \h </w:instrText>
+      </w:r>
+      <w:r>
+        <w:rPr>
+          <w:noProof/>
+        </w:rPr>
+      </w:r>
+      <w:r>
+        <w:rPr>
+          <w:noProof/>
+        </w:rPr>
+        <w:fldChar w:fldCharType="separate"/>
+      </w:r>
+      <w:r>
+        <w:rPr>
+          <w:noProof/>
+        </w:rPr>
+        <w:t>5</w:t>
+      </w:r>
+      <w:r>
+        <w:rPr>
+          <w:noProof/>
+        </w:rPr>
+        <w:fldChar w:fldCharType="end"/>
+      </w:r>
+    </w:p>
+    <w:p>
+      <w:pPr>
+        <w:pStyle w:val="TOC2"/>
+        <w:tabs>
+          <w:tab w:val="right" w:leader="dot" w:pos="9395"/>
+        </w:tabs>
+        <w:rPr>
+          <w:rFonts w:eastAsiaTheme="minorEastAsia"/>
+          <w:noProof/>
+        </w:rPr>
+      </w:pPr>
+      <w:r>
+        <w:rPr>
+          <w:rFonts w:ascii="Times New Roman" w:hAnsi="Times New Roman" w:cs="Times New Roman"/>
+          <w:b/>
+          <w:noProof/>
+          <w:color w:val="000000"/>
+        </w:rPr>
+        <w:t>2.1. Luồng hoạt động chính (Happy Paths)</w:t>
+      </w:r>
+      <w:r>
+        <w:rPr>
+          <w:noProof/>
+        </w:rPr>
+        <w:tab/>
+      </w:r>
+      <w:r>
+        <w:rPr>
+          <w:noProof/>
+        </w:rPr>
+        <w:fldChar w:fldCharType="begin"/>
+      </w:r>
+      <w:r>
+        <w:rPr>
+          <w:noProof/>
+        </w:rPr>
+        <w:instrText xml:space="preserve"> PAGEREF _Toc233880275 \h </w:instrText>
+      </w:r>
+      <w:r>
+        <w:rPr>
+          <w:noProof/>
+        </w:rPr>
+      </w:r>
+      <w:r>
+        <w:rPr>
+          <w:noProof/>
+        </w:rPr>
+        <w:fldChar w:fldCharType="separate"/>
+      </w:r>
+      <w:r>
+        <w:rPr>
+          <w:noProof/>
+        </w:rPr>
+        <w:t>5</w:t>
+      </w:r>
+      <w:r>
+        <w:rPr>
+          <w:noProof/>
+        </w:rPr>
+        <w:fldChar w:fldCharType="end"/>
+      </w:r>
+    </w:p>
+    <w:p>
+      <w:pPr>
+        <w:pStyle w:val="TOC2"/>
+        <w:tabs>
+          <w:tab w:val="right" w:leader="dot" w:pos="9395"/>
+        </w:tabs>
+        <w:rPr>
+          <w:rFonts w:eastAsiaTheme="minorEastAsia"/>
+          <w:noProof/>
+        </w:rPr>
+      </w:pPr>
+      <w:r>
+        <w:rPr>
+          <w:rFonts w:ascii="Times New Roman" w:hAnsi="Times New Roman" w:cs="Times New Roman"/>
+          <w:b/>
+          <w:noProof/>
+          <w:color w:val="000000"/>
+        </w:rPr>
+        <w:t>2.2. Luồng xử lý ngoại lệ và ràng buộc logic (Exceptional Flows)</w:t>
+      </w:r>
+      <w:r>
+        <w:rPr>
+          <w:noProof/>
+        </w:rPr>
+        <w:tab/>
+      </w:r>
+      <w:r>
+        <w:rPr>
+          <w:noProof/>
+        </w:rPr>
+        <w:fldChar w:fldCharType="begin"/>
+      </w:r>
+      <w:r>
+        <w:rPr>
+          <w:noProof/>
+        </w:rPr>
+        <w:instrText xml:space="preserve"> PAGEREF _Toc233880276 \h </w:instrText>
+      </w:r>
+      <w:r>
+        <w:rPr>
+          <w:noProof/>
+        </w:rPr>
+      </w:r>
+      <w:r>
+        <w:rPr>
+          <w:noProof/>
+        </w:rPr>
+        <w:fldChar w:fldCharType="separate"/>
+      </w:r>
+      <w:r>
+        <w:rPr>
+          <w:noProof/>
+        </w:rPr>
+        <w:t>5</w:t>
+      </w:r>
+      <w:r>
+        <w:rPr>
+          <w:noProof/>
+        </w:rPr>
+        <w:fldChar w:fldCharType="end"/>
+      </w:r>
+    </w:p>
+    <w:p>
+      <w:pPr>
+        <w:pStyle w:val="TOC1"/>
+        <w:tabs>
+          <w:tab w:val="right" w:leader="dot" w:pos="9395"/>
+        </w:tabs>
+        <w:rPr>
+          <w:rFonts w:eastAsiaTheme="minorEastAsia"/>
+          <w:noProof/>
+        </w:rPr>
+      </w:pPr>
+      <w:r>
+        <w:rPr>
+          <w:rFonts w:ascii="Times New Roman" w:hAnsi="Times New Roman" w:cs="Times New Roman"/>
+          <w:b/>
+          <w:noProof/>
+          <w:color w:val="000000"/>
+        </w:rPr>
+        <w:t>CHƯƠNG 3. CẤU TRÚC HỆ THỐNG MULTI-SERVICE VÀ BẢO MẬT KEYCLOAK</w:t>
+      </w:r>
+      <w:r>
+        <w:rPr>
+          <w:noProof/>
+        </w:rPr>
+        <w:tab/>
+      </w:r>
+      <w:r>
+        <w:rPr>
+          <w:noProof/>
+        </w:rPr>
+        <w:fldChar w:fldCharType="begin"/>
+      </w:r>
+      <w:r>
+        <w:rPr>
+          <w:noProof/>
+        </w:rPr>
+        <w:instrText xml:space="preserve"> PAGEREF _Toc233880277 \h </w:instrText>
+      </w:r>
+      <w:r>
+        <w:rPr>
+          <w:noProof/>
+        </w:rPr>
+      </w:r>
+      <w:r>
+        <w:rPr>
+          <w:noProof/>
+        </w:rPr>
+        <w:fldChar w:fldCharType="separate"/>
+      </w:r>
+      <w:r>
+        <w:rPr>
+          <w:noProof/>
+        </w:rPr>
+        <w:t>6</w:t>
+      </w:r>
+      <w:r>
+        <w:rPr>
+          <w:noProof/>
+        </w:rPr>
+        <w:fldChar w:fldCharType="end"/>
+      </w:r>
+    </w:p>
+    <w:p>
+      <w:pPr>
+        <w:pStyle w:val="TOC2"/>
+        <w:tabs>
+          <w:tab w:val="right" w:leader="dot" w:pos="9395"/>
+        </w:tabs>
+        <w:rPr>
+          <w:rFonts w:eastAsiaTheme="minorEastAsia"/>
+          <w:noProof/>
+        </w:rPr>
+      </w:pPr>
+      <w:r>
+        <w:rPr>
+          <w:rFonts w:ascii="Times New Roman" w:hAnsi="Times New Roman" w:cs="Times New Roman"/>
+          <w:b/>
+          <w:noProof/>
+          <w:color w:val="000000"/>
+        </w:rPr>
+        <w:t>3.1. Cấu trúc Multi-service (Microservices) độc lập</w:t>
+      </w:r>
+      <w:r>
+        <w:rPr>
+          <w:noProof/>
+        </w:rPr>
+        <w:tab/>
+      </w:r>
+      <w:r>
+        <w:rPr>
+          <w:noProof/>
+        </w:rPr>
+        <w:fldChar w:fldCharType="begin"/>
+      </w:r>
+      <w:r>
+        <w:rPr>
+          <w:noProof/>
+        </w:rPr>
+        <w:instrText xml:space="preserve"> PAGEREF _Toc233880278 \h </w:instrText>
+      </w:r>
+      <w:r>
+        <w:rPr>
+          <w:noProof/>
+        </w:rPr>
+      </w:r>
+      <w:r>
+        <w:rPr>
+          <w:noProof/>
+        </w:rPr>
+        <w:fldChar w:fldCharType="separate"/>
+      </w:r>
+      <w:r>
+        <w:rPr>
+          <w:noProof/>
+        </w:rPr>
+        <w:t>6</w:t>
+      </w:r>
+      <w:r>
+        <w:rPr>
+          <w:noProof/>
+        </w:rPr>
+        <w:fldChar w:fldCharType="end"/>
+      </w:r>
+    </w:p>
+    <w:p>
+      <w:pPr>
+        <w:pStyle w:val="TOC2"/>
+        <w:tabs>
+          <w:tab w:val="right" w:leader="dot" w:pos="9395"/>
+        </w:tabs>
+        <w:rPr>
+          <w:rFonts w:eastAsiaTheme="minorEastAsia"/>
+          <w:noProof/>
+        </w:rPr>
+      </w:pPr>
+      <w:r>
+        <w:rPr>
+          <w:rFonts w:ascii="Times New Roman" w:hAnsi="Times New Roman" w:cs="Times New Roman"/>
+          <w:b/>
+          <w:noProof/>
+          <w:color w:val="000000"/>
+        </w:rPr>
+        <w:t>3.2. Cơ chế bảo mật và phân quyền định danh với Keycloak</w:t>
+      </w:r>
+      <w:r>
+        <w:rPr>
+          <w:noProof/>
+        </w:rPr>
+        <w:tab/>
+      </w:r>
+      <w:r>
+        <w:rPr>
+          <w:noProof/>
+        </w:rPr>
+        <w:fldChar w:fldCharType="begin"/>
+      </w:r>
+      <w:r>
+        <w:rPr>
+          <w:noProof/>
+        </w:rPr>
+        <w:instrText xml:space="preserve"> PAGEREF _Toc233880279 \h </w:instrText>
+      </w:r>
+      <w:r>
+        <w:rPr>
+          <w:noProof/>
+        </w:rPr>
+      </w:r>
+      <w:r>
+        <w:rPr>
+          <w:noProof/>
+        </w:rPr>
+        <w:fldChar w:fldCharType="separate"/>
+      </w:r>
+      <w:r>
+        <w:rPr>
+          <w:noProof/>
+        </w:rPr>
+        <w:t>6</w:t>
+      </w:r>
+      <w:r>
+        <w:rPr>
+          <w:noProof/>
+        </w:rPr>
+        <w:fldChar w:fldCharType="end"/>
+      </w:r>
+    </w:p>
+    <w:p>
+      <w:pPr>
+        <w:pStyle w:val="TOC1"/>
+        <w:tabs>
+          <w:tab w:val="right" w:leader="dot" w:pos="9395"/>
+        </w:tabs>
+        <w:rPr>
+          <w:rFonts w:eastAsiaTheme="minorEastAsia"/>
+          <w:noProof/>
+        </w:rPr>
+      </w:pPr>
+      <w:r>
+        <w:rPr>
+          <w:rFonts w:ascii="Times New Roman" w:hAnsi="Times New Roman" w:cs="Times New Roman"/>
+          <w:b/>
+          <w:noProof/>
+          <w:color w:val="000000"/>
+        </w:rPr>
+        <w:t>CHƯƠNG 4. THÀNH TỰU VÀ CÔNG NGHỆ ÁP DỤNG TRONG DỰ ÁN</w:t>
+      </w:r>
+      <w:r>
+        <w:rPr>
+          <w:noProof/>
+        </w:rPr>
+        <w:tab/>
+      </w:r>
+      <w:r>
+        <w:rPr>
+          <w:noProof/>
+        </w:rPr>
+        <w:fldChar w:fldCharType="begin"/>
+      </w:r>
+      <w:r>
+        <w:rPr>
+          <w:noProof/>
+        </w:rPr>
+        <w:instrText xml:space="preserve"> PAGEREF _Toc233880280 \h </w:instrText>
+      </w:r>
+      <w:r>
+        <w:rPr>
+          <w:noProof/>
+        </w:rPr>
+      </w:r>
+      <w:r>
+        <w:rPr>
+          <w:noProof/>
+        </w:rPr>
+        <w:fldChar w:fldCharType="separate"/>
+      </w:r>
+      <w:r>
+        <w:rPr>
+          <w:noProof/>
+        </w:rPr>
+        <w:t>7</w:t>
+      </w:r>
+      <w:r>
+        <w:rPr>
+          <w:noProof/>
+        </w:rPr>
+        <w:fldChar w:fldCharType="end"/>
+      </w:r>
+    </w:p>
+    <w:p>
+      <w:pPr>
+        <w:pStyle w:val="TOC2"/>
+        <w:tabs>
+          <w:tab w:val="right" w:leader="dot" w:pos="9395"/>
+        </w:tabs>
+        <w:rPr>
+          <w:rFonts w:eastAsiaTheme="minorEastAsia"/>
+          <w:noProof/>
+        </w:rPr>
+      </w:pPr>
+      <w:r>
+        <w:rPr>
+          <w:rFonts w:ascii="Times New Roman" w:hAnsi="Times New Roman" w:cs="Times New Roman"/>
+          <w:b/>
+          <w:noProof/>
+          <w:color w:val="000000"/>
+        </w:rPr>
+        <w:t>4.1. Thành tựu tự hào về kiến trúc API và Spring Boot</w:t>
+      </w:r>
+      <w:r>
+        <w:rPr>
+          <w:noProof/>
+        </w:rPr>
+        <w:tab/>
+      </w:r>
+      <w:r>
+        <w:rPr>
+          <w:noProof/>
+        </w:rPr>
+        <w:fldChar w:fldCharType="begin"/>
+      </w:r>
+      <w:r>
+        <w:rPr>
+          <w:noProof/>
+        </w:rPr>
+        <w:instrText xml:space="preserve"> PAGEREF _Toc233880281 \h </w:instrText>
+      </w:r>
+      <w:r>
+        <w:rPr>
+          <w:noProof/>
+        </w:rPr>
+      </w:r>
+      <w:r>
+        <w:rPr>
+          <w:noProof/>
+        </w:rPr>
+        <w:fldChar w:fldCharType="separate"/>
+      </w:r>
+      <w:r>
+        <w:rPr>
+          <w:noProof/>
+        </w:rPr>
+        <w:t>7</w:t>
+      </w:r>
+      <w:r>
+        <w:rPr>
+          <w:noProof/>
+        </w:rPr>
+        <w:fldChar w:fldCharType="end"/>
+      </w:r>
+    </w:p>
+    <w:p>
+      <w:pPr>
+        <w:pStyle w:val="TOC2"/>
+        <w:tabs>
+          <w:tab w:val="right" w:leader="dot" w:pos="9395"/>
+        </w:tabs>
+        <w:rPr>
+          <w:rFonts w:eastAsiaTheme="minorEastAsia"/>
+          <w:noProof/>
+        </w:rPr>
+      </w:pPr>
+      <w:r>
+        <w:rPr>
+          <w:rFonts w:ascii="Times New Roman" w:hAnsi="Times New Roman" w:cs="Times New Roman"/>
+          <w:b/>
+          <w:noProof/>
+          <w:color w:val="000000"/>
+        </w:rPr>
+        <w:t>4.2. Tối ưu hóa hiệu năng giao tiếp và đồng bộ dữ liệu</w:t>
+      </w:r>
+      <w:r>
+        <w:rPr>
+          <w:noProof/>
+        </w:rPr>
+        <w:tab/>
+      </w:r>
+      <w:r>
+        <w:rPr>
+          <w:noProof/>
+        </w:rPr>
+        <w:fldChar w:fldCharType="begin"/>
+      </w:r>
+      <w:r>
+        <w:rPr>
+          <w:noProof/>
+        </w:rPr>
+        <w:instrText xml:space="preserve"> PAGEREF _Toc233880282 \h </w:instrText>
+      </w:r>
+      <w:r>
+        <w:rPr>
+          <w:noProof/>
+        </w:rPr>
+      </w:r>
+      <w:r>
+        <w:rPr>
+          <w:noProof/>
+        </w:rPr>
+        <w:fldChar w:fldCharType="separate"/>
+      </w:r>
+      <w:r>
+        <w:rPr>
+          <w:noProof/>
+        </w:rPr>
+        <w:t>7</w:t>
+      </w:r>
+      <w:r>
+        <w:rPr>
+          <w:noProof/>
+        </w:rPr>
+        <w:fldChar w:fldCharType="end"/>
+      </w:r>
+    </w:p>
+    <w:p>
+      <w:pPr>
+        <w:pStyle w:val="TOC1"/>
+        <w:tabs>
+          <w:tab w:val="right" w:leader="dot" w:pos="9395"/>
+        </w:tabs>
+        <w:rPr>
+          <w:rFonts w:eastAsiaTheme="minorEastAsia"/>
+          <w:noProof/>
+        </w:rPr>
+      </w:pPr>
+      <w:r>
+        <w:rPr>
+          <w:rFonts w:ascii="Times New Roman" w:hAnsi="Times New Roman" w:cs="Times New Roman"/>
+          <w:b/>
+          <w:noProof/>
+          <w:color w:val="000000"/>
+        </w:rPr>
+        <w:t>CHƯƠNG 5. HƯỚNG DẪN CẤU HÌNH VÀ KHỞI CHẠY ĐỒ ÁN</w:t>
+      </w:r>
+      <w:r>
+        <w:rPr>
+          <w:noProof/>
+        </w:rPr>
+        <w:tab/>
+      </w:r>
+      <w:r>
+        <w:rPr>
+          <w:noProof/>
+        </w:rPr>
+        <w:fldChar w:fldCharType="begin"/>
+      </w:r>
+      <w:r>
+        <w:rPr>
+          <w:noProof/>
+        </w:rPr>
+        <w:instrText xml:space="preserve"> PAGEREF _Toc233880283 \h </w:instrText>
+      </w:r>
+      <w:r>
+        <w:rPr>
+          <w:noProof/>
+        </w:rPr>
+      </w:r>
+      <w:r>
+        <w:rPr>
+          <w:noProof/>
+        </w:rPr>
+        <w:fldChar w:fldCharType="separate"/>
+      </w:r>
+      <w:r>
+        <w:rPr>
+          <w:noProof/>
+        </w:rPr>
+        <w:t>7</w:t>
+      </w:r>
+      <w:r>
+        <w:rPr>
+          <w:noProof/>
+        </w:rPr>
+        <w:fldChar w:fldCharType="end"/>
+      </w:r>
+    </w:p>
+    <w:p>
+      <w:pPr>
+        <w:pStyle w:val="TOC2"/>
+        <w:tabs>
+          <w:tab w:val="right" w:leader="dot" w:pos="9395"/>
+        </w:tabs>
+        <w:rPr>
+          <w:rFonts w:eastAsiaTheme="minorEastAsia"/>
+          <w:noProof/>
+        </w:rPr>
+      </w:pPr>
+      <w:r>
+        <w:rPr>
+          <w:rFonts w:ascii="Times New Roman" w:hAnsi="Times New Roman" w:cs="Times New Roman"/>
+          <w:b/>
+          <w:noProof/>
+          <w:color w:val="000000"/>
+        </w:rPr>
+        <w:t>5.1. Thiết lập môi trường và khởi chạy Docker Compose</w:t>
+      </w:r>
+      <w:r>
+        <w:rPr>
+          <w:noProof/>
+        </w:rPr>
+        <w:tab/>
+      </w:r>
+      <w:r>
+        <w:rPr>
+          <w:noProof/>
+        </w:rPr>
+        <w:fldChar w:fldCharType="begin"/>
+      </w:r>
+      <w:r>
+        <w:rPr>
+          <w:noProof/>
+        </w:rPr>
+        <w:instrText xml:space="preserve"> PAGEREF _Toc233880284 \h </w:instrText>
+      </w:r>
+      <w:r>
+        <w:rPr>
+          <w:noProof/>
+        </w:rPr>
+      </w:r>
+      <w:r>
+        <w:rPr>
+          <w:noProof/>
+        </w:rPr>
+        <w:fldChar w:fldCharType="separate"/>
+      </w:r>
+      <w:r>
+        <w:rPr>
+          <w:noProof/>
+        </w:rPr>
+        <w:t>7</w:t>
+      </w:r>
+      <w:r>
+        <w:rPr>
+          <w:noProof/>
+        </w:rPr>
+        <w:fldChar w:fldCharType="end"/>
+      </w:r>
+    </w:p>
+    <w:p>
+      <w:pPr>
+        <w:pStyle w:val="TOC2"/>
+        <w:tabs>
+          <w:tab w:val="right" w:leader="dot" w:pos="9395"/>
+        </w:tabs>
+        <w:rPr>
+          <w:rFonts w:eastAsiaTheme="minorEastAsia"/>
+          <w:noProof/>
+        </w:rPr>
+      </w:pPr>
+      <w:r>
+        <w:rPr>
+          <w:rFonts w:ascii="Times New Roman" w:hAnsi="Times New Roman" w:cs="Times New Roman"/>
+          <w:b/>
+          <w:noProof/>
+          <w:color w:val="000000"/>
+        </w:rPr>
+        <w:t>5.2. Các bước cấu hình Keycloak Realm và Client</w:t>
+      </w:r>
+      <w:r>
+        <w:rPr>
+          <w:noProof/>
+        </w:rPr>
+        <w:tab/>
+      </w:r>
+      <w:r>
+        <w:rPr>
+          <w:noProof/>
+        </w:rPr>
+        <w:fldChar w:fldCharType="begin"/>
+      </w:r>
+      <w:r>
+        <w:rPr>
+          <w:noProof/>
+        </w:rPr>
+        <w:instrText xml:space="preserve"> PAGEREF _Toc233880285 \h </w:instrText>
+      </w:r>
+      <w:r>
+        <w:rPr>
+          <w:noProof/>
+        </w:rPr>
+      </w:r>
+      <w:r>
+        <w:rPr>
+          <w:noProof/>
+        </w:rPr>
+        <w:fldChar w:fldCharType="separate"/>
+      </w:r>
+      <w:r>
+        <w:rPr>
+          <w:noProof/>
+        </w:rPr>
+        <w:t>7</w:t>
+      </w:r>
+      <w:r>
+        <w:rPr>
+          <w:noProof/>
+        </w:rPr>
+        <w:fldChar w:fldCharType="end"/>
+      </w:r>
+    </w:p>
+    <w:p>
+      <w:pPr>
+        <w:pStyle w:val="TOC2"/>
+        <w:tabs>
+          <w:tab w:val="right" w:leader="dot" w:pos="9395"/>
+        </w:tabs>
+        <w:rPr>
+          <w:rFonts w:eastAsiaTheme="minorEastAsia"/>
+          <w:noProof/>
+        </w:rPr>
+      </w:pPr>
+      <w:r>
+        <w:rPr>
+          <w:rFonts w:ascii="Times New Roman" w:hAnsi="Times New Roman" w:cs="Times New Roman"/>
+          <w:b/>
+          <w:noProof/>
+          <w:color w:val="000000"/>
+        </w:rPr>
+        <w:t>5.3. Khởi chạy 7 Microservices Spring Boot bằng Script</w:t>
+      </w:r>
+      <w:r>
+        <w:rPr>
+          <w:noProof/>
+        </w:rPr>
+        <w:tab/>
+      </w:r>
+      <w:r>
+        <w:rPr>
+          <w:noProof/>
+        </w:rPr>
+        <w:fldChar w:fldCharType="begin"/>
+      </w:r>
+      <w:r>
+        <w:rPr>
+          <w:noProof/>
+        </w:rPr>
+        <w:instrText xml:space="preserve"> PAGEREF _Toc233880286 \h </w:instrText>
+      </w:r>
+      <w:r>
+        <w:rPr>
+          <w:noProof/>
+        </w:rPr>
+      </w:r>
+      <w:r>
+        <w:rPr>
+          <w:noProof/>
+        </w:rPr>
+        <w:fldChar w:fldCharType="separate"/>
+      </w:r>
+      <w:r>
+        <w:rPr>
+          <w:noProof/>
+        </w:rPr>
+        <w:t>7</w:t>
+      </w:r>
+      <w:r>
+        <w:rPr>
+          <w:noProof/>
+        </w:rPr>
+        <w:fldChar w:fldCharType="end"/>
+      </w:r>
+    </w:p>
+    <w:p>
+      <w:pPr>
+        <w:pStyle w:val="TOC1"/>
+        <w:tabs>
+          <w:tab w:val="right" w:leader="dot" w:pos="9395"/>
+        </w:tabs>
+        <w:rPr>
+          <w:rFonts w:eastAsiaTheme="minorEastAsia"/>
+          <w:noProof/>
+        </w:rPr>
+      </w:pPr>
+      <w:r>
+        <w:rPr>
+          <w:rFonts w:ascii="Times New Roman" w:hAnsi="Times New Roman" w:cs="Times New Roman"/>
+          <w:b/>
+          <w:noProof/>
+          <w:color w:val="000000"/>
+        </w:rPr>
+        <w:t>CHƯƠNG 6. TỔNG KẾT VÀ HƯỚNG PHÁT TRIỂN TƯƠNG LAI</w:t>
+      </w:r>
+      <w:r>
+        <w:rPr>
+          <w:noProof/>
+        </w:rPr>
+        <w:tab/>
+      </w:r>
+      <w:r>
+        <w:rPr>
+          <w:noProof/>
+        </w:rPr>
+        <w:fldChar w:fldCharType="begin"/>
+      </w:r>
+      <w:r>
+        <w:rPr>
+          <w:noProof/>
+        </w:rPr>
+        <w:instrText xml:space="preserve"> PAGEREF _Toc233880287 \h </w:instrText>
+      </w:r>
+      <w:r>
+        <w:rPr>
+          <w:noProof/>
+        </w:rPr>
+      </w:r>
+      <w:r>
+        <w:rPr>
+          <w:noProof/>
+        </w:rPr>
+        <w:fldChar w:fldCharType="separate"/>
+      </w:r>
+      <w:r>
+        <w:rPr>
+          <w:noProof/>
+        </w:rPr>
+        <w:t>8</w:t>
+      </w:r>
+      <w:r>
+        <w:rPr>
+          <w:noProof/>
+        </w:rPr>
+        <w:fldChar w:fldCharType="end"/>
+      </w:r>
+    </w:p>
+    <w:p>
+      <w:pPr>
+        <w:pStyle w:val="TOC2"/>
+        <w:tabs>
+          <w:tab w:val="right" w:leader="dot" w:pos="9395"/>
+        </w:tabs>
+        <w:rPr>
+          <w:rFonts w:eastAsiaTheme="minorEastAsia"/>
+          <w:noProof/>
+        </w:rPr>
+      </w:pPr>
+      <w:r>
+        <w:rPr>
+          <w:rFonts w:ascii="Times New Roman" w:hAnsi="Times New Roman" w:cs="Times New Roman"/>
+          <w:b/>
+          <w:noProof/>
+          <w:color w:val="000000"/>
+        </w:rPr>
+        <w:t>6.1. Đánh giá kết quả đạt được của đồ án</w:t>
+      </w:r>
+      <w:r>
+        <w:rPr>
+          <w:noProof/>
+        </w:rPr>
+        <w:tab/>
+      </w:r>
+      <w:r>
+        <w:rPr>
+          <w:noProof/>
+        </w:rPr>
+        <w:fldChar w:fldCharType="begin"/>
+      </w:r>
+      <w:r>
+        <w:rPr>
+          <w:noProof/>
+        </w:rPr>
+        <w:instrText xml:space="preserve"> PAGEREF _Toc233880288 \h </w:instrText>
+      </w:r>
+      <w:r>
+        <w:rPr>
+          <w:noProof/>
+        </w:rPr>
+      </w:r>
+      <w:r>
+        <w:rPr>
+          <w:noProof/>
+        </w:rPr>
+        <w:fldChar w:fldCharType="separate"/>
+      </w:r>
+      <w:r>
+        <w:rPr>
+          <w:noProof/>
+        </w:rPr>
+        <w:t>8</w:t>
+      </w:r>
+      <w:r>
+        <w:rPr>
+          <w:noProof/>
+        </w:rPr>
+        <w:fldChar w:fldCharType="end"/>
+      </w:r>
+    </w:p>
+    <w:p>
+      <w:pPr>
+        <w:pStyle w:val="TOC2"/>
+        <w:tabs>
+          <w:tab w:val="right" w:leader="dot" w:pos="9395"/>
+        </w:tabs>
+        <w:rPr>
+          <w:rFonts w:eastAsiaTheme="minorEastAsia"/>
+          <w:noProof/>
+        </w:rPr>
+      </w:pPr>
+      <w:r>
+        <w:rPr>
+          <w:rFonts w:ascii="Times New Roman" w:hAnsi="Times New Roman" w:cs="Times New Roman"/>
+          <w:b/>
+          <w:noProof/>
+          <w:color w:val="000000"/>
+        </w:rPr>
+        <w:t>6.2. Hướng phát triển nâng cấp hệ thống</w:t>
+      </w:r>
+      <w:r>
+        <w:rPr>
+          <w:noProof/>
+        </w:rPr>
+        <w:tab/>
+      </w:r>
+      <w:r>
+        <w:rPr>
+          <w:noProof/>
+        </w:rPr>
+        <w:fldChar w:fldCharType="begin"/>
+      </w:r>
+      <w:r>
+        <w:rPr>
+          <w:noProof/>
+        </w:rPr>
+        <w:instrText xml:space="preserve"> PAGEREF _Toc233880289 \h </w:instrText>
+      </w:r>
+      <w:r>
+        <w:rPr>
+          <w:noProof/>
+        </w:rPr>
+      </w:r>
+      <w:r>
+        <w:rPr>
+          <w:noProof/>
+        </w:rPr>
+        <w:fldChar w:fldCharType="separate"/>
+      </w:r>
+      <w:r>
+        <w:rPr>
+          <w:noProof/>
+        </w:rPr>
+        <w:t>8</w:t>
+      </w:r>
+      <w:r>
+        <w:rPr>
+          <w:noProof/>
+        </w:rPr>
+        <w:fldChar w:fldCharType="end"/>
+      </w:r>
+    </w:p>
+    <w:p>
+      <w:pPr>
+        <w:spacing w:before="240" w:after="480" w:line="248" w:lineRule="auto"/>
+        <w:jc w:val="center"/>
+        <w:rPr>
+          <w:rFonts w:ascii="Times New Roman" w:hAnsi="Times New Roman" w:cs="Times New Roman"/>
+          <w:b/>
+          <w:color w:val="000000"/>
+          <w:sz w:val="32"/>
+        </w:rPr>
+      </w:pPr>
+      <w:r>
+        <w:rPr>
+          <w:rFonts w:ascii="Times New Roman" w:hAnsi="Times New Roman" w:cs="Times New Roman"/>
+          <w:b/>
+          <w:color w:val="000000"/>
+          <w:sz w:val="32"/>
+        </w:rPr>
+        <w:fldChar w:fldCharType="end"/>
+      </w:r>
+    </w:p>
+    <w:p>
+      <w:pPr>
+        <w:rPr>
+          <w:rFonts w:ascii="Times New Roman" w:hAnsi="Times New Roman" w:cs="Times New Roman"/>
+          <w:b/>
+          <w:color w:val="000000"/>
+          <w:sz w:val="32"/>
+        </w:rPr>
+      </w:pPr>
+      <w:r>
+        <w:rPr>
+          <w:rFonts w:ascii="Times New Roman" w:hAnsi="Times New Roman" w:cs="Times New Roman"/>
+          <w:b/>
+          <w:color w:val="000000"/>
+          <w:sz w:val="32"/>
+        </w:rPr>
         <w:br w:type="page"/>
       </w:r>
     </w:p>
     <w:p>
       <w:pPr>
+        <w:pStyle w:val="Heading1"/>
         <w:spacing w:before="240" w:after="240" w:line="248" w:lineRule="auto"/>
         <w:rPr>
-          <w:rFonts w:ascii="Times New Roman" w:eastAsiaTheme="majorEastAsia" w:hAnsi="Times New Roman" w:cs="Times New Roman"/>
-          <w:b/>
-          <w:color w:val="0F4761" w:themeColor="accent1" w:themeShade="BF"/>
+          <w:rFonts w:ascii="Times New Roman" w:hAnsi="Times New Roman" w:cs="Times New Roman"/>
+          <w:b/>
+          <w:color w:val="000000"/>
           <w:sz w:val="32"/>
-          <w:szCs w:val="40"/>
-        </w:rPr>
-      </w:pPr>
-      <w:r>
-        <w:rPr>
-          <w:rFonts w:ascii="Times New Roman" w:eastAsiaTheme="majorEastAsia" w:hAnsi="Times New Roman" w:cs="Times New Roman"/>
-          <w:b/>
-          <w:color w:val="0F4761" w:themeColor="accent1" w:themeShade="BF"/>
+        </w:rPr>
+      </w:pPr>
+      <w:bookmarkStart w:id="0" w:name="_Toc233880270"/>
+      <w:r>
+        <w:rPr>
+          <w:rFonts w:ascii="Times New Roman" w:hAnsi="Times New Roman" w:cs="Times New Roman"/>
+          <w:b/>
+          <w:color w:val="000000"/>
           <w:sz w:val="32"/>
-          <w:szCs w:val="40"/>
-        </w:rPr>
+        </w:rPr>
+        <w:lastRenderedPageBreak/>
         <w:t>CHƯƠNG 1. GIỚI THIỆU TỔNG QUAN VÀ LIỆT KÊ CHỨC NĂNG DỰ ÁN</w:t>
       </w:r>
-    </w:p>
-    <w:p>
-      <w:pPr>
+      <w:bookmarkEnd w:id="0"/>
+    </w:p>
+    <w:p>
+      <w:pPr>
+        <w:pStyle w:val="Heading2"/>
         <w:spacing w:before="120" w:after="120" w:line="248" w:lineRule="auto"/>
         <w:rPr>
-          <w:rFonts w:ascii="Times New Roman" w:eastAsiaTheme="majorEastAsia" w:hAnsi="Times New Roman" w:cs="Times New Roman"/>
-          <w:b/>
-          <w:color w:val="0F4761" w:themeColor="accent1" w:themeShade="BF"/>
+          <w:rFonts w:ascii="Times New Roman" w:hAnsi="Times New Roman" w:cs="Times New Roman"/>
+          <w:b/>
+          <w:color w:val="000000"/>
           <w:sz w:val="28"/>
-          <w:szCs w:val="32"/>
-        </w:rPr>
-      </w:pPr>
-      <w:r>
-        <w:rPr>
-          <w:rFonts w:ascii="Times New Roman" w:eastAsiaTheme="majorEastAsia" w:hAnsi="Times New Roman" w:cs="Times New Roman"/>
-          <w:b/>
-          <w:color w:val="0F4761" w:themeColor="accent1" w:themeShade="BF"/>
+        </w:rPr>
+      </w:pPr>
+      <w:bookmarkStart w:id="1" w:name="_Toc233880271"/>
+      <w:r>
+        <w:rPr>
+          <w:rFonts w:ascii="Times New Roman" w:hAnsi="Times New Roman" w:cs="Times New Roman"/>
+          <w:b/>
+          <w:color w:val="000000"/>
           <w:sz w:val="28"/>
-          <w:szCs w:val="32"/>
         </w:rPr>
         <w:t>1.1. Giới thiệu ứng dụng NLU Banking App</w:t>
       </w:r>
+      <w:bookmarkEnd w:id="1"/>
     </w:p>
     <w:p>
       <w:pPr>
@@ -648,38 +2038,41 @@
         <w:jc w:val="both"/>
         <w:rPr>
           <w:rFonts w:ascii="Times New Roman" w:hAnsi="Times New Roman" w:cs="Times New Roman"/>
-          <w:sz w:val="26"/>
-        </w:rPr>
-      </w:pPr>
-      <w:r>
-        <w:rPr>
-          <w:rFonts w:ascii="Times New Roman" w:hAnsi="Times New Roman" w:cs="Times New Roman"/>
-          <w:sz w:val="26"/>
-        </w:rPr>
-        <w:t>NLU Banking App là một giải pháp ứng dụng ngân hàng di động toàn diện mô phỏng môi trường giao dịch thực tế của một ngân hàng thương mại hiện đại. Ứng dụng cung cấp các dịch vụ tài chính cá nhân trực tuyến thông qua nền tảng Android Client giao tiếp an toàn với hệ thống backend phân tán multi-service. Hệ thống được thiết kế nhằm đáp ứng các yêu cầu khắt khe về hiệu năng xử lý, tính an toàn thông tin và trải nghiệm người dùng trong thời đại ngân hàng số phát triển mạnh mẽ.</w:t>
-      </w:r>
-    </w:p>
-    <w:p>
-      <w:pPr>
+          <w:color w:val="000000"/>
+          <w:sz w:val="26"/>
+        </w:rPr>
+      </w:pPr>
+      <w:r>
+        <w:rPr>
+          <w:rFonts w:ascii="Times New Roman" w:hAnsi="Times New Roman" w:cs="Times New Roman"/>
+          <w:color w:val="000000"/>
+          <w:sz w:val="26"/>
+        </w:rPr>
+        <w:t>NLU Banking App là một giải pháp ứng dụng ngân hàng di động toàn diện mô phỏng môi trường giao dịch thực tế của một ngân hàng thương mại hiện đại. Ứng dụng cung cấp các dịch vụ tài chính cá nhân trực tuyến thông qua nền tảng Android Client giao tiếp an sau với hệ thống backend phân tán multi-service. Hệ thống được thiết kế nhằm đáp ứng các yêu cầu khắt khe về hiệu năng xử lý, tính an toàn thông tin và trải nghiệm người dùng trong thời đại ngân hàng số phát triển mạnh mẽ.</w:t>
+      </w:r>
+    </w:p>
+    <w:p>
+      <w:pPr>
+        <w:pStyle w:val="Heading2"/>
         <w:spacing w:before="120" w:after="120" w:line="248" w:lineRule="auto"/>
         <w:rPr>
-          <w:rFonts w:ascii="Times New Roman" w:eastAsiaTheme="majorEastAsia" w:hAnsi="Times New Roman" w:cs="Times New Roman"/>
-          <w:b/>
-          <w:color w:val="0F4761" w:themeColor="accent1" w:themeShade="BF"/>
+          <w:rFonts w:ascii="Times New Roman" w:hAnsi="Times New Roman" w:cs="Times New Roman"/>
+          <w:b/>
+          <w:color w:val="000000"/>
           <w:sz w:val="28"/>
-          <w:szCs w:val="32"/>
-        </w:rPr>
-      </w:pPr>
-      <w:r>
-        <w:rPr>
-          <w:rFonts w:ascii="Times New Roman" w:eastAsiaTheme="majorEastAsia" w:hAnsi="Times New Roman" w:cs="Times New Roman"/>
-          <w:b/>
-          <w:color w:val="0F4761" w:themeColor="accent1" w:themeShade="BF"/>
+        </w:rPr>
+      </w:pPr>
+      <w:bookmarkStart w:id="2" w:name="_Toc233880272"/>
+      <w:r>
+        <w:rPr>
+          <w:rFonts w:ascii="Times New Roman" w:hAnsi="Times New Roman" w:cs="Times New Roman"/>
+          <w:b/>
+          <w:color w:val="000000"/>
           <w:sz w:val="28"/>
-          <w:szCs w:val="32"/>
         </w:rPr>
         <w:t>1.2. Danh sách các chức năng lớn của hệ thống</w:t>
       </w:r>
+      <w:bookmarkEnd w:id="2"/>
     </w:p>
     <w:p>
       <w:pPr>
@@ -687,12 +2080,14 @@
         <w:jc w:val="both"/>
         <w:rPr>
           <w:rFonts w:ascii="Times New Roman" w:hAnsi="Times New Roman" w:cs="Times New Roman"/>
-          <w:sz w:val="26"/>
-        </w:rPr>
-      </w:pPr>
-      <w:r>
-        <w:rPr>
-          <w:rFonts w:ascii="Times New Roman" w:hAnsi="Times New Roman" w:cs="Times New Roman"/>
+          <w:color w:val="000000"/>
+          <w:sz w:val="26"/>
+        </w:rPr>
+      </w:pPr>
+      <w:r>
+        <w:rPr>
+          <w:rFonts w:ascii="Times New Roman" w:hAnsi="Times New Roman" w:cs="Times New Roman"/>
+          <w:color w:val="000000"/>
           <w:sz w:val="26"/>
         </w:rPr>
         <w:t>Hệ thống NLU Banking App được tổ chức và phân chia thành các nhóm chức năng lớn bao gồm: (1) Nhóm chức năng Quản lý định danh và Đăng ký kích hoạt tài khoản. (2) Nhóm chức năng Truy vấn thông tin và Quản lý số dư tài khoản thanh toán trực tuyến. (3) Nhóm chức năng Giao dịch chuyển khoản nội bộ bảo mật 2 lớp. (4) Nhóm chức năng Nạp tiền và Rút tiền giả lập tại quầy/ATM. (5) Nhóm chức năng Chuyển khoản thông minh qua quét mã QR Code.</w:t>
@@ -700,25 +2095,26 @@
     </w:p>
     <w:p>
       <w:pPr>
+        <w:pStyle w:val="Heading2"/>
         <w:spacing w:before="120" w:after="120" w:line="248" w:lineRule="auto"/>
         <w:rPr>
-          <w:rFonts w:ascii="Times New Roman" w:eastAsiaTheme="majorEastAsia" w:hAnsi="Times New Roman" w:cs="Times New Roman"/>
-          <w:b/>
-          <w:color w:val="0F4761" w:themeColor="accent1" w:themeShade="BF"/>
+          <w:rFonts w:ascii="Times New Roman" w:hAnsi="Times New Roman" w:cs="Times New Roman"/>
+          <w:b/>
+          <w:color w:val="000000"/>
           <w:sz w:val="28"/>
-          <w:szCs w:val="32"/>
-        </w:rPr>
-      </w:pPr>
-      <w:r>
-        <w:rPr>
-          <w:rFonts w:ascii="Times New Roman" w:eastAsiaTheme="majorEastAsia" w:hAnsi="Times New Roman" w:cs="Times New Roman"/>
-          <w:b/>
-          <w:color w:val="0F4761" w:themeColor="accent1" w:themeShade="BF"/>
+        </w:rPr>
+      </w:pPr>
+      <w:bookmarkStart w:id="3" w:name="_Toc233880273"/>
+      <w:r>
+        <w:rPr>
+          <w:rFonts w:ascii="Times New Roman" w:hAnsi="Times New Roman" w:cs="Times New Roman"/>
+          <w:b/>
+          <w:color w:val="000000"/>
           <w:sz w:val="28"/>
-          <w:szCs w:val="32"/>
         </w:rPr>
         <w:t>1.3. Chi tiết các chức năng nhỏ đi kèm</w:t>
       </w:r>
+      <w:bookmarkEnd w:id="3"/>
     </w:p>
     <w:p>
       <w:pPr>
@@ -726,12 +2122,14 @@
         <w:jc w:val="both"/>
         <w:rPr>
           <w:rFonts w:ascii="Times New Roman" w:hAnsi="Times New Roman" w:cs="Times New Roman"/>
-          <w:sz w:val="26"/>
-        </w:rPr>
-      </w:pPr>
-      <w:r>
-        <w:rPr>
-          <w:rFonts w:ascii="Times New Roman" w:hAnsi="Times New Roman" w:cs="Times New Roman"/>
+          <w:color w:val="000000"/>
+          <w:sz w:val="26"/>
+        </w:rPr>
+      </w:pPr>
+      <w:r>
+        <w:rPr>
+          <w:rFonts w:ascii="Times New Roman" w:hAnsi="Times New Roman" w:cs="Times New Roman"/>
+          <w:color w:val="000000"/>
           <w:sz w:val="26"/>
         </w:rPr>
         <w:t>Các nhóm chức năng lớn được chia nhỏ thành các tính năng chi tiết đáp ứng nhu cầu thực tế của khách hàng:</w:t>
@@ -743,12 +2141,14 @@
         <w:jc w:val="both"/>
         <w:rPr>
           <w:rFonts w:ascii="Times New Roman" w:hAnsi="Times New Roman" w:cs="Times New Roman"/>
-          <w:sz w:val="26"/>
-        </w:rPr>
-      </w:pPr>
-      <w:r>
-        <w:rPr>
-          <w:rFonts w:ascii="Times New Roman" w:hAnsi="Times New Roman" w:cs="Times New Roman"/>
+          <w:color w:val="000000"/>
+          <w:sz w:val="26"/>
+        </w:rPr>
+      </w:pPr>
+      <w:r>
+        <w:rPr>
+          <w:rFonts w:ascii="Times New Roman" w:hAnsi="Times New Roman" w:cs="Times New Roman"/>
+          <w:color w:val="000000"/>
           <w:sz w:val="26"/>
         </w:rPr>
         <w:t xml:space="preserve">  - Chức năng Tạo và Quét mã QR thanh toán: Hệ thống cho phép người dùng tự sinh mã QR chứa số tài khoản cá nhân để người khác chuyển tiền nhanh. Đồng thời, camera quét mã QR tích hợp trên app tự động phân tích và điền chính xác thông tin tài khoản nhận tiền.</w:t>
@@ -760,12 +2160,14 @@
         <w:jc w:val="both"/>
         <w:rPr>
           <w:rFonts w:ascii="Times New Roman" w:hAnsi="Times New Roman" w:cs="Times New Roman"/>
-          <w:sz w:val="26"/>
-        </w:rPr>
-      </w:pPr>
-      <w:r>
-        <w:rPr>
-          <w:rFonts w:ascii="Times New Roman" w:hAnsi="Times New Roman" w:cs="Times New Roman"/>
+          <w:color w:val="000000"/>
+          <w:sz w:val="26"/>
+        </w:rPr>
+      </w:pPr>
+      <w:r>
+        <w:rPr>
+          <w:rFonts w:ascii="Times New Roman" w:hAnsi="Times New Roman" w:cs="Times New Roman"/>
+          <w:color w:val="000000"/>
           <w:sz w:val="26"/>
         </w:rPr>
         <w:t xml:space="preserve">  - Chức năng Hiển thị số dư tài khoản trực quan: Trên màn hình trang chủ, thông tin số tài khoản thanh toán và số dư khả dụng thực tế được hiển thị rõ ràng, cập nhật ngay lập tức sau khi xảy ra bất kỳ biến động số dư nào.</w:t>
@@ -777,12 +2179,14 @@
         <w:jc w:val="both"/>
         <w:rPr>
           <w:rFonts w:ascii="Times New Roman" w:hAnsi="Times New Roman" w:cs="Times New Roman"/>
-          <w:sz w:val="26"/>
-        </w:rPr>
-      </w:pPr>
-      <w:r>
-        <w:rPr>
-          <w:rFonts w:ascii="Times New Roman" w:hAnsi="Times New Roman" w:cs="Times New Roman"/>
+          <w:color w:val="000000"/>
+          <w:sz w:val="26"/>
+        </w:rPr>
+      </w:pPr>
+      <w:r>
+        <w:rPr>
+          <w:rFonts w:ascii="Times New Roman" w:hAnsi="Times New Roman" w:cs="Times New Roman"/>
+          <w:color w:val="000000"/>
           <w:sz w:val="26"/>
         </w:rPr>
         <w:t xml:space="preserve">  - Chức năng Đăng ký tài khoản kèm mã OTP: Cho phép người dùng nhập Họ tên, Email, SĐT và CCCD. Hệ thống gửi mã xác thực OTP qua email và kích hoạt tài khoản ngay khi người dùng nhập đúng mã.</w:t>
@@ -794,12 +2198,14 @@
         <w:jc w:val="both"/>
         <w:rPr>
           <w:rFonts w:ascii="Times New Roman" w:hAnsi="Times New Roman" w:cs="Times New Roman"/>
-          <w:sz w:val="26"/>
-        </w:rPr>
-      </w:pPr>
-      <w:r>
-        <w:rPr>
-          <w:rFonts w:ascii="Times New Roman" w:hAnsi="Times New Roman" w:cs="Times New Roman"/>
+          <w:color w:val="000000"/>
+          <w:sz w:val="26"/>
+        </w:rPr>
+      </w:pPr>
+      <w:r>
+        <w:rPr>
+          <w:rFonts w:ascii="Times New Roman" w:hAnsi="Times New Roman" w:cs="Times New Roman"/>
+          <w:color w:val="000000"/>
           <w:sz w:val="26"/>
         </w:rPr>
         <w:t xml:space="preserve">  - Chức năng Đăng nhập bảo mật: Đăng nhập an toàn bằng Email và Mật khẩu thông qua máy chủ Keycloak OIDC, bảo vệ phiên làm việc của người dùng bằng Access Token.</w:t>
@@ -811,12 +2217,14 @@
         <w:jc w:val="both"/>
         <w:rPr>
           <w:rFonts w:ascii="Times New Roman" w:hAnsi="Times New Roman" w:cs="Times New Roman"/>
-          <w:sz w:val="26"/>
-        </w:rPr>
-      </w:pPr>
-      <w:r>
-        <w:rPr>
-          <w:rFonts w:ascii="Times New Roman" w:hAnsi="Times New Roman" w:cs="Times New Roman"/>
+          <w:color w:val="000000"/>
+          <w:sz w:val="26"/>
+        </w:rPr>
+      </w:pPr>
+      <w:r>
+        <w:rPr>
+          <w:rFonts w:ascii="Times New Roman" w:hAnsi="Times New Roman" w:cs="Times New Roman"/>
+          <w:color w:val="000000"/>
           <w:sz w:val="26"/>
         </w:rPr>
         <w:t xml:space="preserve">  - Chức năng Chuyển khoản nội bộ: Nhập số tài khoản thụ hưởng, tự động hiển thị tên người nhận để xác minh trước khi cho phép nhập số tiền và nội dung chuyển tiền, yêu cầu mã OTP giao dịch để hoàn tất.</w:t>
@@ -828,12 +2236,14 @@
         <w:jc w:val="both"/>
         <w:rPr>
           <w:rFonts w:ascii="Times New Roman" w:hAnsi="Times New Roman" w:cs="Times New Roman"/>
-          <w:sz w:val="26"/>
-        </w:rPr>
-      </w:pPr>
-      <w:r>
-        <w:rPr>
-          <w:rFonts w:ascii="Times New Roman" w:hAnsi="Times New Roman" w:cs="Times New Roman"/>
+          <w:color w:val="000000"/>
+          <w:sz w:val="26"/>
+        </w:rPr>
+      </w:pPr>
+      <w:r>
+        <w:rPr>
+          <w:rFonts w:ascii="Times New Roman" w:hAnsi="Times New Roman" w:cs="Times New Roman"/>
+          <w:color w:val="000000"/>
           <w:sz w:val="26"/>
         </w:rPr>
         <w:t xml:space="preserve">  - Chức năng Rút tiền và Nạp tiền giả lập: Khách hàng có thể thực hiện nạp tiền hoặc rút tiền trực tiếp trên ứng dụng để thay đổi số dư tài khoản thanh toán.</w:t>
@@ -845,60 +2255,65 @@
         <w:jc w:val="both"/>
         <w:rPr>
           <w:rFonts w:ascii="Times New Roman" w:hAnsi="Times New Roman" w:cs="Times New Roman"/>
-          <w:sz w:val="26"/>
-        </w:rPr>
-      </w:pPr>
-      <w:r>
-        <w:rPr>
-          <w:rFonts w:ascii="Times New Roman" w:hAnsi="Times New Roman" w:cs="Times New Roman"/>
-          <w:sz w:val="26"/>
-        </w:rPr>
+          <w:color w:val="000000"/>
+          <w:sz w:val="26"/>
+        </w:rPr>
+      </w:pPr>
+      <w:r>
+        <w:rPr>
+          <w:rFonts w:ascii="Times New Roman" w:hAnsi="Times New Roman" w:cs="Times New Roman"/>
+          <w:color w:val="000000"/>
+          <w:sz w:val="26"/>
+        </w:rPr>
+        <w:lastRenderedPageBreak/>
         <w:t xml:space="preserve">  - Chức năng Lịch sử giao dịch: Hiển thị danh sách đầy đủ lịch sử giao dịch chuyển khoản, nạp/rút tiền kèm thông tin mô tả chi tiết của từng giao dịch.</w:t>
       </w:r>
     </w:p>
     <w:p>
       <w:pPr>
+        <w:pStyle w:val="Heading1"/>
         <w:spacing w:before="240" w:after="240" w:line="248" w:lineRule="auto"/>
         <w:rPr>
-          <w:rFonts w:ascii="Times New Roman" w:eastAsiaTheme="majorEastAsia" w:hAnsi="Times New Roman" w:cs="Times New Roman"/>
-          <w:b/>
-          <w:color w:val="0F4761" w:themeColor="accent1" w:themeShade="BF"/>
+          <w:rFonts w:ascii="Times New Roman" w:hAnsi="Times New Roman" w:cs="Times New Roman"/>
+          <w:b/>
+          <w:color w:val="000000"/>
           <w:sz w:val="32"/>
-          <w:szCs w:val="40"/>
-        </w:rPr>
-      </w:pPr>
-      <w:r>
-        <w:rPr>
-          <w:rFonts w:ascii="Times New Roman" w:eastAsiaTheme="majorEastAsia" w:hAnsi="Times New Roman" w:cs="Times New Roman"/>
-          <w:b/>
-          <w:color w:val="0F4761" w:themeColor="accent1" w:themeShade="BF"/>
+        </w:rPr>
+      </w:pPr>
+      <w:bookmarkStart w:id="4" w:name="_Toc233880274"/>
+      <w:r>
+        <w:rPr>
+          <w:rFonts w:ascii="Times New Roman" w:hAnsi="Times New Roman" w:cs="Times New Roman"/>
+          <w:b/>
+          <w:color w:val="000000"/>
           <w:sz w:val="32"/>
-          <w:szCs w:val="40"/>
         </w:rPr>
         <w:t>CHƯƠNG 2. MÔ TẢ LUỒNG HOẠT ĐỘNG CHÍNH VÀ LUỒNG NGOẠI LỆ</w:t>
       </w:r>
-    </w:p>
-    <w:p>
-      <w:pPr>
+      <w:bookmarkEnd w:id="4"/>
+    </w:p>
+    <w:p>
+      <w:pPr>
+        <w:pStyle w:val="Heading2"/>
         <w:spacing w:before="120" w:after="120" w:line="248" w:lineRule="auto"/>
         <w:rPr>
-          <w:rFonts w:ascii="Times New Roman" w:eastAsiaTheme="majorEastAsia" w:hAnsi="Times New Roman" w:cs="Times New Roman"/>
-          <w:b/>
-          <w:color w:val="0F4761" w:themeColor="accent1" w:themeShade="BF"/>
+          <w:rFonts w:ascii="Times New Roman" w:hAnsi="Times New Roman" w:cs="Times New Roman"/>
+          <w:b/>
+          <w:color w:val="000000"/>
           <w:sz w:val="28"/>
-          <w:szCs w:val="32"/>
-        </w:rPr>
-      </w:pPr>
-      <w:r>
-        <w:rPr>
-          <w:rFonts w:ascii="Times New Roman" w:eastAsiaTheme="majorEastAsia" w:hAnsi="Times New Roman" w:cs="Times New Roman"/>
-          <w:b/>
-          <w:color w:val="0F4761" w:themeColor="accent1" w:themeShade="BF"/>
+        </w:rPr>
+      </w:pPr>
+      <w:bookmarkStart w:id="5" w:name="_Toc233880275"/>
+      <w:r>
+        <w:rPr>
+          <w:rFonts w:ascii="Times New Roman" w:hAnsi="Times New Roman" w:cs="Times New Roman"/>
+          <w:b/>
+          <w:color w:val="000000"/>
           <w:sz w:val="28"/>
-          <w:szCs w:val="32"/>
         </w:rPr>
         <w:t>2.1. Luồng hoạt động chính (Happy Paths)</w:t>
       </w:r>
+      <w:bookmarkEnd w:id="5"/>
     </w:p>
     <w:p>
       <w:pPr>
@@ -906,12 +2321,14 @@
         <w:jc w:val="both"/>
         <w:rPr>
           <w:rFonts w:ascii="Times New Roman" w:hAnsi="Times New Roman" w:cs="Times New Roman"/>
-          <w:sz w:val="26"/>
-        </w:rPr>
-      </w:pPr>
-      <w:r>
-        <w:rPr>
-          <w:rFonts w:ascii="Times New Roman" w:hAnsi="Times New Roman" w:cs="Times New Roman"/>
+          <w:color w:val="000000"/>
+          <w:sz w:val="26"/>
+        </w:rPr>
+      </w:pPr>
+      <w:r>
+        <w:rPr>
+          <w:rFonts w:ascii="Times New Roman" w:hAnsi="Times New Roman" w:cs="Times New Roman"/>
+          <w:color w:val="000000"/>
           <w:sz w:val="26"/>
         </w:rPr>
         <w:t>Luồng hoạt động chính mô tả tiến trình thực hiện thành công (không xảy ra lỗi) của các nghiệp vụ cốt lõi:</w:t>
@@ -923,12 +2340,14 @@
         <w:jc w:val="both"/>
         <w:rPr>
           <w:rFonts w:ascii="Times New Roman" w:hAnsi="Times New Roman" w:cs="Times New Roman"/>
-          <w:sz w:val="26"/>
-        </w:rPr>
-      </w:pPr>
-      <w:r>
-        <w:rPr>
-          <w:rFonts w:ascii="Times New Roman" w:hAnsi="Times New Roman" w:cs="Times New Roman"/>
+          <w:color w:val="000000"/>
+          <w:sz w:val="26"/>
+        </w:rPr>
+      </w:pPr>
+      <w:r>
+        <w:rPr>
+          <w:rFonts w:ascii="Times New Roman" w:hAnsi="Times New Roman" w:cs="Times New Roman"/>
+          <w:color w:val="000000"/>
           <w:sz w:val="26"/>
         </w:rPr>
         <w:t xml:space="preserve">  - Luồng Đăng ký tài khoản mới: (1) Khách hàng nhập thông tin đăng ký hợp lệ. (2) Hệ thống tạo tài khoản tạm thời, sinh mã OTP 6 chữ số và gửi qua Email. (3) Khách hàng nhập mã OTP chính xác vào giao diện ứng dụng. (4) Hệ thống gửi thông tin đăng ký chính thức lên Keycloak để tạo User định danh, đồng thời gọi Account-Service cấp phát số tài khoản thanh toán ngẫu nhiên.</w:t>
@@ -940,12 +2359,14 @@
         <w:jc w:val="both"/>
         <w:rPr>
           <w:rFonts w:ascii="Times New Roman" w:hAnsi="Times New Roman" w:cs="Times New Roman"/>
-          <w:sz w:val="26"/>
-        </w:rPr>
-      </w:pPr>
-      <w:r>
-        <w:rPr>
-          <w:rFonts w:ascii="Times New Roman" w:hAnsi="Times New Roman" w:cs="Times New Roman"/>
+          <w:color w:val="000000"/>
+          <w:sz w:val="26"/>
+        </w:rPr>
+      </w:pPr>
+      <w:r>
+        <w:rPr>
+          <w:rFonts w:ascii="Times New Roman" w:hAnsi="Times New Roman" w:cs="Times New Roman"/>
+          <w:color w:val="000000"/>
           <w:sz w:val="26"/>
         </w:rPr>
         <w:t xml:space="preserve">  - Luồng Chuyển tiền nội bộ: (1) Khách hàng nhập số tài khoản đích. (2) Ứng dụng di động tự động gọi API Gateway để truy vấn và hiển thị họ tên chủ tài khoản nhận. (3) Khách hàng nhập số tiền và nội dung, nhấn xác nhận. (4) Hệ thống gửi mã OTP xác nhận giao dịch qua email người gửi. (5) Khách hàng nhập đúng OTP, hệ thống thực hiện đồng thời việc trừ tiền tài khoản gửi và cộng tiền tài khoản nhận, lưu lịch sử giao dịch.</w:t>
@@ -957,12 +2378,14 @@
         <w:jc w:val="both"/>
         <w:rPr>
           <w:rFonts w:ascii="Times New Roman" w:hAnsi="Times New Roman" w:cs="Times New Roman"/>
-          <w:sz w:val="26"/>
-        </w:rPr>
-      </w:pPr>
-      <w:r>
-        <w:rPr>
-          <w:rFonts w:ascii="Times New Roman" w:hAnsi="Times New Roman" w:cs="Times New Roman"/>
+          <w:color w:val="000000"/>
+          <w:sz w:val="26"/>
+        </w:rPr>
+      </w:pPr>
+      <w:r>
+        <w:rPr>
+          <w:rFonts w:ascii="Times New Roman" w:hAnsi="Times New Roman" w:cs="Times New Roman"/>
+          <w:color w:val="000000"/>
           <w:sz w:val="26"/>
         </w:rPr>
         <w:t xml:space="preserve">  - Luồng Chuyển khoản nhanh bằng QR Code: (1) Người nhận hiển thị mã QR tài khoản cá nhân. (2) Người gửi sử dụng chức năng quét QR trên app di động để quét. (3) Ứng dụng tự động giải mã thông tin QR, điền số tài khoản thụ hưởng và hiển thị họ tên người nhận trên màn hình giao dịch chuyển khoản. (4) Người gửi tiến hành các bước xác thực OTP để hoàn tất giao dịch chuyển tiền.</w:t>
@@ -970,25 +2393,26 @@
     </w:p>
     <w:p>
       <w:pPr>
+        <w:pStyle w:val="Heading2"/>
         <w:spacing w:before="120" w:after="120" w:line="248" w:lineRule="auto"/>
         <w:rPr>
-          <w:rFonts w:ascii="Times New Roman" w:eastAsiaTheme="majorEastAsia" w:hAnsi="Times New Roman" w:cs="Times New Roman"/>
-          <w:b/>
-          <w:color w:val="0F4761" w:themeColor="accent1" w:themeShade="BF"/>
+          <w:rFonts w:ascii="Times New Roman" w:hAnsi="Times New Roman" w:cs="Times New Roman"/>
+          <w:b/>
+          <w:color w:val="000000"/>
           <w:sz w:val="28"/>
-          <w:szCs w:val="32"/>
-        </w:rPr>
-      </w:pPr>
-      <w:r>
-        <w:rPr>
-          <w:rFonts w:ascii="Times New Roman" w:eastAsiaTheme="majorEastAsia" w:hAnsi="Times New Roman" w:cs="Times New Roman"/>
-          <w:b/>
-          <w:color w:val="0F4761" w:themeColor="accent1" w:themeShade="BF"/>
+        </w:rPr>
+      </w:pPr>
+      <w:bookmarkStart w:id="6" w:name="_Toc233880276"/>
+      <w:r>
+        <w:rPr>
+          <w:rFonts w:ascii="Times New Roman" w:hAnsi="Times New Roman" w:cs="Times New Roman"/>
+          <w:b/>
+          <w:color w:val="000000"/>
           <w:sz w:val="28"/>
-          <w:szCs w:val="32"/>
         </w:rPr>
         <w:t>2.2. Luồng xử lý ngoại lệ và ràng buộc logic (Exceptional Flows)</w:t>
       </w:r>
+      <w:bookmarkEnd w:id="6"/>
     </w:p>
     <w:p>
       <w:pPr>
@@ -996,12 +2420,14 @@
         <w:jc w:val="both"/>
         <w:rPr>
           <w:rFonts w:ascii="Times New Roman" w:hAnsi="Times New Roman" w:cs="Times New Roman"/>
-          <w:sz w:val="26"/>
-        </w:rPr>
-      </w:pPr>
-      <w:r>
-        <w:rPr>
-          <w:rFonts w:ascii="Times New Roman" w:hAnsi="Times New Roman" w:cs="Times New Roman"/>
+          <w:color w:val="000000"/>
+          <w:sz w:val="26"/>
+        </w:rPr>
+      </w:pPr>
+      <w:r>
+        <w:rPr>
+          <w:rFonts w:ascii="Times New Roman" w:hAnsi="Times New Roman" w:cs="Times New Roman"/>
+          <w:color w:val="000000"/>
           <w:sz w:val="26"/>
         </w:rPr>
         <w:t>Để bảo vệ an toàn giao dịch và tính nhất quán dữ liệu, hệ thống bắt buộc phải kiểm tra và xử lý các luồng ngoại lệ sau:</w:t>
@@ -1013,12 +2439,14 @@
         <w:jc w:val="both"/>
         <w:rPr>
           <w:rFonts w:ascii="Times New Roman" w:hAnsi="Times New Roman" w:cs="Times New Roman"/>
-          <w:sz w:val="26"/>
-        </w:rPr>
-      </w:pPr>
-      <w:r>
-        <w:rPr>
-          <w:rFonts w:ascii="Times New Roman" w:hAnsi="Times New Roman" w:cs="Times New Roman"/>
+          <w:color w:val="000000"/>
+          <w:sz w:val="26"/>
+        </w:rPr>
+      </w:pPr>
+      <w:r>
+        <w:rPr>
+          <w:rFonts w:ascii="Times New Roman" w:hAnsi="Times New Roman" w:cs="Times New Roman"/>
+          <w:color w:val="000000"/>
           <w:sz w:val="26"/>
         </w:rPr>
         <w:t xml:space="preserve">  - Ngoại lệ Chuyển tiền vượt quá số dư khả dụng: Khi người dùng nhấn nút chuyển khoản, hệ thống sẽ thực hiện kiểm tra điều kiện số tiền giao dịch phải nhỏ hơn số dư khả dụng thực tế. Nếu số tiền chuyển lớn hơn số dư hiện tại, hệ thống lập tức chặn giao dịch và hiển thị thông báo lỗi 'Số dư tài khoản không đủ để thực hiện giao dịch này'.</w:t>
@@ -1030,12 +2458,14 @@
         <w:jc w:val="both"/>
         <w:rPr>
           <w:rFonts w:ascii="Times New Roman" w:hAnsi="Times New Roman" w:cs="Times New Roman"/>
-          <w:sz w:val="26"/>
-        </w:rPr>
-      </w:pPr>
-      <w:r>
-        <w:rPr>
-          <w:rFonts w:ascii="Times New Roman" w:hAnsi="Times New Roman" w:cs="Times New Roman"/>
+          <w:color w:val="000000"/>
+          <w:sz w:val="26"/>
+        </w:rPr>
+      </w:pPr>
+      <w:r>
+        <w:rPr>
+          <w:rFonts w:ascii="Times New Roman" w:hAnsi="Times New Roman" w:cs="Times New Roman"/>
+          <w:color w:val="000000"/>
           <w:sz w:val="26"/>
         </w:rPr>
         <w:t xml:space="preserve">  - Ngoại lệ Nhập sai mã OTP hoặc OTP hết hạn: Mã OTP giao dịch và OTP kích hoạt tài khoản chỉ có hiệu lực sử dụng trong vòng 3 phút. Nếu người dùng nhập mã OTP đã hết hạn, hoặc nhập sai mã OTP quá 3 lần liên tiếp, hệ thống sẽ từ chối giao dịch, huỷ mã OTP cũ và yêu cầu người dùng yêu cầu gửi lại mã OTP mới.</w:t>
@@ -1047,15 +2477,26 @@
         <w:jc w:val="both"/>
         <w:rPr>
           <w:rFonts w:ascii="Times New Roman" w:hAnsi="Times New Roman" w:cs="Times New Roman"/>
-          <w:sz w:val="26"/>
-        </w:rPr>
-      </w:pPr>
-      <w:r>
-        <w:rPr>
-          <w:rFonts w:ascii="Times New Roman" w:hAnsi="Times New Roman" w:cs="Times New Roman"/>
-          <w:sz w:val="26"/>
-        </w:rPr>
-        <w:t xml:space="preserve">  - Ngoại lệ Nhập số tài khoản thụ hưởng không tồn tại: Khi người dùng nhập số tài khoản đích, API Gateway sẽ gọi đến Account-Service để kiểm tra. Nếu không tìm thấy số tài khoản này trong cơ sở dữ liệu, hệ thống trả về lỗi 404 và hiển thị thông báo trên giao diện di động: 'Tài khoản thụ hưởng không tồn tại. Vui lòng kiểm tra lại'.</w:t>
+          <w:color w:val="000000"/>
+          <w:sz w:val="26"/>
+        </w:rPr>
+      </w:pPr>
+      <w:r>
+        <w:rPr>
+          <w:rFonts w:ascii="Times New Roman" w:hAnsi="Times New Roman" w:cs="Times New Roman"/>
+          <w:color w:val="000000"/>
+          <w:sz w:val="26"/>
+        </w:rPr>
+        <w:t xml:space="preserve">  - Ngoại lệ Nhập số tài khoản thụ hưởng không tồn tại: Khi người dùng nhập số tài khoản đích, API Gateway sẽ gọi đến Account-Service để kiểm tra. Nếu không tìm thấy số tài khoản </w:t>
+      </w:r>
+      <w:r>
+        <w:rPr>
+          <w:rFonts w:ascii="Times New Roman" w:hAnsi="Times New Roman" w:cs="Times New Roman"/>
+          <w:color w:val="000000"/>
+          <w:sz w:val="26"/>
+        </w:rPr>
+        <w:lastRenderedPageBreak/>
+        <w:t>này trong cơ sở dữ liệu, hệ thống trả về lỗi 404 và hiển thị thông báo trên giao diện di động: 'Tài khoản thụ hưởng không tồn tại. Vui lòng kiểm tra lại'.</w:t>
       </w:r>
     </w:p>
     <w:p>
@@ -1064,12 +2505,14 @@
         <w:jc w:val="both"/>
         <w:rPr>
           <w:rFonts w:ascii="Times New Roman" w:hAnsi="Times New Roman" w:cs="Times New Roman"/>
-          <w:sz w:val="26"/>
-        </w:rPr>
-      </w:pPr>
-      <w:r>
-        <w:rPr>
-          <w:rFonts w:ascii="Times New Roman" w:hAnsi="Times New Roman" w:cs="Times New Roman"/>
+          <w:color w:val="000000"/>
+          <w:sz w:val="26"/>
+        </w:rPr>
+      </w:pPr>
+      <w:r>
+        <w:rPr>
+          <w:rFonts w:ascii="Times New Roman" w:hAnsi="Times New Roman" w:cs="Times New Roman"/>
+          <w:color w:val="000000"/>
           <w:sz w:val="26"/>
         </w:rPr>
         <w:t xml:space="preserve">  - Ràng buộc nhập CCCD không đúng định dạng: Trong quá trình đăng ký tài khoản, trường thông tin Số định danh (CCCD) được kiểm soát nghiêm ngặt. Hệ thống sẽ kiểm tra chiều dài chuỗi CCCD phải đúng bằng 12 chữ số. Nếu người dùng nhập thiếu hoặc thừa ký tự, ứng dụng Android lập tức hiển thị cảnh báo định dạng và không cho phép gửi yêu cầu lên máy chủ backend.</w:t>
@@ -1077,47 +2520,49 @@
     </w:p>
     <w:p>
       <w:pPr>
+        <w:pStyle w:val="Heading1"/>
         <w:spacing w:before="240" w:after="240" w:line="248" w:lineRule="auto"/>
         <w:rPr>
-          <w:rFonts w:ascii="Times New Roman" w:eastAsiaTheme="majorEastAsia" w:hAnsi="Times New Roman" w:cs="Times New Roman"/>
-          <w:b/>
-          <w:color w:val="0F4761" w:themeColor="accent1" w:themeShade="BF"/>
+          <w:rFonts w:ascii="Times New Roman" w:hAnsi="Times New Roman" w:cs="Times New Roman"/>
+          <w:b/>
+          <w:color w:val="000000"/>
           <w:sz w:val="32"/>
-          <w:szCs w:val="40"/>
-        </w:rPr>
-      </w:pPr>
-      <w:r>
-        <w:rPr>
-          <w:rFonts w:ascii="Times New Roman" w:eastAsiaTheme="majorEastAsia" w:hAnsi="Times New Roman" w:cs="Times New Roman"/>
-          <w:b/>
-          <w:color w:val="0F4761" w:themeColor="accent1" w:themeShade="BF"/>
+        </w:rPr>
+      </w:pPr>
+      <w:bookmarkStart w:id="7" w:name="_Toc233880277"/>
+      <w:r>
+        <w:rPr>
+          <w:rFonts w:ascii="Times New Roman" w:hAnsi="Times New Roman" w:cs="Times New Roman"/>
+          <w:b/>
+          <w:color w:val="000000"/>
           <w:sz w:val="32"/>
-          <w:szCs w:val="40"/>
         </w:rPr>
         <w:t>CHƯƠNG 3. CẤU TRÚC HỆ THỐNG MULTI-SERVICE VÀ BẢO MẬT KEYCLOAK</w:t>
       </w:r>
-    </w:p>
-    <w:p>
-      <w:pPr>
+      <w:bookmarkEnd w:id="7"/>
+    </w:p>
+    <w:p>
+      <w:pPr>
+        <w:pStyle w:val="Heading2"/>
         <w:spacing w:before="120" w:after="120" w:line="248" w:lineRule="auto"/>
         <w:rPr>
-          <w:rFonts w:ascii="Times New Roman" w:eastAsiaTheme="majorEastAsia" w:hAnsi="Times New Roman" w:cs="Times New Roman"/>
-          <w:b/>
-          <w:color w:val="0F4761" w:themeColor="accent1" w:themeShade="BF"/>
+          <w:rFonts w:ascii="Times New Roman" w:hAnsi="Times New Roman" w:cs="Times New Roman"/>
+          <w:b/>
+          <w:color w:val="000000"/>
           <w:sz w:val="28"/>
-          <w:szCs w:val="32"/>
-        </w:rPr>
-      </w:pPr>
-      <w:r>
-        <w:rPr>
-          <w:rFonts w:ascii="Times New Roman" w:eastAsiaTheme="majorEastAsia" w:hAnsi="Times New Roman" w:cs="Times New Roman"/>
-          <w:b/>
-          <w:color w:val="0F4761" w:themeColor="accent1" w:themeShade="BF"/>
+        </w:rPr>
+      </w:pPr>
+      <w:bookmarkStart w:id="8" w:name="_Toc233880278"/>
+      <w:r>
+        <w:rPr>
+          <w:rFonts w:ascii="Times New Roman" w:hAnsi="Times New Roman" w:cs="Times New Roman"/>
+          <w:b/>
+          <w:color w:val="000000"/>
           <w:sz w:val="28"/>
-          <w:szCs w:val="32"/>
         </w:rPr>
         <w:t>3.1. Cấu trúc Multi-service (Microservices) độc lập</w:t>
       </w:r>
+      <w:bookmarkEnd w:id="8"/>
     </w:p>
     <w:p>
       <w:pPr>
@@ -1125,12 +2570,14 @@
         <w:jc w:val="both"/>
         <w:rPr>
           <w:rFonts w:ascii="Times New Roman" w:hAnsi="Times New Roman" w:cs="Times New Roman"/>
-          <w:sz w:val="26"/>
-        </w:rPr>
-      </w:pPr>
-      <w:r>
-        <w:rPr>
-          <w:rFonts w:ascii="Times New Roman" w:hAnsi="Times New Roman" w:cs="Times New Roman"/>
+          <w:color w:val="000000"/>
+          <w:sz w:val="26"/>
+        </w:rPr>
+      </w:pPr>
+      <w:r>
+        <w:rPr>
+          <w:rFonts w:ascii="Times New Roman" w:hAnsi="Times New Roman" w:cs="Times New Roman"/>
+          <w:color w:val="000000"/>
           <w:sz w:val="26"/>
         </w:rPr>
         <w:t>Hệ thống backend của NLU Banking App được phát triển theo kiến trúc Multi-service (Microservices) gồm 7 dịch vụ Spring Boot độc lập hoạt động kết hợp với nhau:</w:t>
@@ -1142,12 +2589,14 @@
         <w:jc w:val="both"/>
         <w:rPr>
           <w:rFonts w:ascii="Times New Roman" w:hAnsi="Times New Roman" w:cs="Times New Roman"/>
-          <w:sz w:val="26"/>
-        </w:rPr>
-      </w:pPr>
-      <w:r>
-        <w:rPr>
-          <w:rFonts w:ascii="Times New Roman" w:hAnsi="Times New Roman" w:cs="Times New Roman"/>
+          <w:color w:val="000000"/>
+          <w:sz w:val="26"/>
+        </w:rPr>
+      </w:pPr>
+      <w:r>
+        <w:rPr>
+          <w:rFonts w:ascii="Times New Roman" w:hAnsi="Times New Roman" w:cs="Times New Roman"/>
+          <w:color w:val="000000"/>
           <w:sz w:val="26"/>
         </w:rPr>
         <w:t xml:space="preserve">  - Service-Registry (Cổng quản lý Eureka Server): Đăng ký và quản lý danh sách các microservices đang hoạt động, cho phép các dịch vụ tự tìm thấy nhau mà không cần gán cứng IP.</w:t>
@@ -1159,12 +2608,14 @@
         <w:jc w:val="both"/>
         <w:rPr>
           <w:rFonts w:ascii="Times New Roman" w:hAnsi="Times New Roman" w:cs="Times New Roman"/>
-          <w:sz w:val="26"/>
-        </w:rPr>
-      </w:pPr>
-      <w:r>
-        <w:rPr>
-          <w:rFonts w:ascii="Times New Roman" w:hAnsi="Times New Roman" w:cs="Times New Roman"/>
+          <w:color w:val="000000"/>
+          <w:sz w:val="26"/>
+        </w:rPr>
+      </w:pPr>
+      <w:r>
+        <w:rPr>
+          <w:rFonts w:ascii="Times New Roman" w:hAnsi="Times New Roman" w:cs="Times New Roman"/>
+          <w:color w:val="000000"/>
           <w:sz w:val="26"/>
         </w:rPr>
         <w:t xml:space="preserve">  - API-Gateway: Đóng vai trò là cổng ngõ ra vào duy nhất cho các yêu cầu API từ Android Client. Gateway chịu trách nhiệm định tuyến cuộc gọi API đến dịch vụ tương ứng và chặn các cuộc gọi không có JWT token hợp lệ.</w:t>
@@ -1176,12 +2627,14 @@
         <w:jc w:val="both"/>
         <w:rPr>
           <w:rFonts w:ascii="Times New Roman" w:hAnsi="Times New Roman" w:cs="Times New Roman"/>
-          <w:sz w:val="26"/>
-        </w:rPr>
-      </w:pPr>
-      <w:r>
-        <w:rPr>
-          <w:rFonts w:ascii="Times New Roman" w:hAnsi="Times New Roman" w:cs="Times New Roman"/>
+          <w:color w:val="000000"/>
+          <w:sz w:val="26"/>
+        </w:rPr>
+      </w:pPr>
+      <w:r>
+        <w:rPr>
+          <w:rFonts w:ascii="Times New Roman" w:hAnsi="Times New Roman" w:cs="Times New Roman"/>
+          <w:color w:val="000000"/>
           <w:sz w:val="26"/>
         </w:rPr>
         <w:t xml:space="preserve">  - User-Service: Quản lý đăng ký hồ sơ khách hàng, sinh mã và lưu trữ OTP kích hoạt, liên kết tài khoản định danh với máy chủ Keycloak.</w:t>
@@ -1193,12 +2646,14 @@
         <w:jc w:val="both"/>
         <w:rPr>
           <w:rFonts w:ascii="Times New Roman" w:hAnsi="Times New Roman" w:cs="Times New Roman"/>
-          <w:sz w:val="26"/>
-        </w:rPr>
-      </w:pPr>
-      <w:r>
-        <w:rPr>
-          <w:rFonts w:ascii="Times New Roman" w:hAnsi="Times New Roman" w:cs="Times New Roman"/>
+          <w:color w:val="000000"/>
+          <w:sz w:val="26"/>
+        </w:rPr>
+      </w:pPr>
+      <w:r>
+        <w:rPr>
+          <w:rFonts w:ascii="Times New Roman" w:hAnsi="Times New Roman" w:cs="Times New Roman"/>
+          <w:color w:val="000000"/>
           <w:sz w:val="26"/>
         </w:rPr>
         <w:t xml:space="preserve">  - Account-Service: Quản lý số tài khoản ngân hàng, thông tin số dư khả dụng và trạng thái tài khoản.</w:t>
@@ -1210,12 +2665,14 @@
         <w:jc w:val="both"/>
         <w:rPr>
           <w:rFonts w:ascii="Times New Roman" w:hAnsi="Times New Roman" w:cs="Times New Roman"/>
-          <w:sz w:val="26"/>
-        </w:rPr>
-      </w:pPr>
-      <w:r>
-        <w:rPr>
-          <w:rFonts w:ascii="Times New Roman" w:hAnsi="Times New Roman" w:cs="Times New Roman"/>
+          <w:color w:val="000000"/>
+          <w:sz w:val="26"/>
+        </w:rPr>
+      </w:pPr>
+      <w:r>
+        <w:rPr>
+          <w:rFonts w:ascii="Times New Roman" w:hAnsi="Times New Roman" w:cs="Times New Roman"/>
+          <w:color w:val="000000"/>
           <w:sz w:val="26"/>
         </w:rPr>
         <w:t xml:space="preserve">  - Fund-Transfer-Service: Xử lý và ghi nhận toàn bộ lịch sử các giao dịch chuyển khoản nội bộ giữa các tài khoản khách hàng.</w:t>
@@ -1227,12 +2684,14 @@
         <w:jc w:val="both"/>
         <w:rPr>
           <w:rFonts w:ascii="Times New Roman" w:hAnsi="Times New Roman" w:cs="Times New Roman"/>
-          <w:sz w:val="26"/>
-        </w:rPr>
-      </w:pPr>
-      <w:r>
-        <w:rPr>
-          <w:rFonts w:ascii="Times New Roman" w:hAnsi="Times New Roman" w:cs="Times New Roman"/>
+          <w:color w:val="000000"/>
+          <w:sz w:val="26"/>
+        </w:rPr>
+      </w:pPr>
+      <w:r>
+        <w:rPr>
+          <w:rFonts w:ascii="Times New Roman" w:hAnsi="Times New Roman" w:cs="Times New Roman"/>
+          <w:color w:val="000000"/>
           <w:sz w:val="26"/>
         </w:rPr>
         <w:t xml:space="preserve">  - Transaction-Service: Xử lý và ghi nhận lịch sử các giao dịch nạp tiền, rút tiền trực tiếp từ tài khoản.</w:t>
@@ -1244,12 +2703,14 @@
         <w:jc w:val="both"/>
         <w:rPr>
           <w:rFonts w:ascii="Times New Roman" w:hAnsi="Times New Roman" w:cs="Times New Roman"/>
-          <w:sz w:val="26"/>
-        </w:rPr>
-      </w:pPr>
-      <w:r>
-        <w:rPr>
-          <w:rFonts w:ascii="Times New Roman" w:hAnsi="Times New Roman" w:cs="Times New Roman"/>
+          <w:color w:val="000000"/>
+          <w:sz w:val="26"/>
+        </w:rPr>
+      </w:pPr>
+      <w:r>
+        <w:rPr>
+          <w:rFonts w:ascii="Times New Roman" w:hAnsi="Times New Roman" w:cs="Times New Roman"/>
+          <w:color w:val="000000"/>
           <w:sz w:val="26"/>
         </w:rPr>
         <w:t xml:space="preserve">  - Sequence-Generator: Sinh chuỗi số tự động tăng dùng để tạo số tài khoản ngân hàng đảm bảo tính duy nhất trên toàn hệ thống.</w:t>
@@ -1257,25 +2718,26 @@
     </w:p>
     <w:p>
       <w:pPr>
+        <w:pStyle w:val="Heading2"/>
         <w:spacing w:before="120" w:after="120" w:line="248" w:lineRule="auto"/>
         <w:rPr>
-          <w:rFonts w:ascii="Times New Roman" w:eastAsiaTheme="majorEastAsia" w:hAnsi="Times New Roman" w:cs="Times New Roman"/>
-          <w:b/>
-          <w:color w:val="0F4761" w:themeColor="accent1" w:themeShade="BF"/>
+          <w:rFonts w:ascii="Times New Roman" w:hAnsi="Times New Roman" w:cs="Times New Roman"/>
+          <w:b/>
+          <w:color w:val="000000"/>
           <w:sz w:val="28"/>
-          <w:szCs w:val="32"/>
-        </w:rPr>
-      </w:pPr>
-      <w:r>
-        <w:rPr>
-          <w:rFonts w:ascii="Times New Roman" w:eastAsiaTheme="majorEastAsia" w:hAnsi="Times New Roman" w:cs="Times New Roman"/>
-          <w:b/>
-          <w:color w:val="0F4761" w:themeColor="accent1" w:themeShade="BF"/>
+        </w:rPr>
+      </w:pPr>
+      <w:bookmarkStart w:id="9" w:name="_Toc233880279"/>
+      <w:r>
+        <w:rPr>
+          <w:rFonts w:ascii="Times New Roman" w:hAnsi="Times New Roman" w:cs="Times New Roman"/>
+          <w:b/>
+          <w:color w:val="000000"/>
           <w:sz w:val="28"/>
-          <w:szCs w:val="32"/>
         </w:rPr>
         <w:t>3.2. Cơ chế bảo mật và phân quyền định danh với Keycloak</w:t>
       </w:r>
+      <w:bookmarkEnd w:id="9"/>
     </w:p>
     <w:p>
       <w:pPr>
@@ -1283,12 +2745,14 @@
         <w:jc w:val="both"/>
         <w:rPr>
           <w:rFonts w:ascii="Times New Roman" w:hAnsi="Times New Roman" w:cs="Times New Roman"/>
-          <w:sz w:val="26"/>
-        </w:rPr>
-      </w:pPr>
-      <w:r>
-        <w:rPr>
-          <w:rFonts w:ascii="Times New Roman" w:hAnsi="Times New Roman" w:cs="Times New Roman"/>
+          <w:color w:val="000000"/>
+          <w:sz w:val="26"/>
+        </w:rPr>
+      </w:pPr>
+      <w:r>
+        <w:rPr>
+          <w:rFonts w:ascii="Times New Roman" w:hAnsi="Times New Roman" w:cs="Times New Roman"/>
+          <w:color w:val="000000"/>
           <w:sz w:val="26"/>
         </w:rPr>
         <w:t>Dự án tích hợp máy chủ định danh Keycloak để quản lý bảo mật tập trung cho toàn hệ thống. Khi khách hàng đăng nhập thành công, Keycloak trả về mã Access Token dạng JWT. API Gateway sẽ giải mã chữ ký công khai để kiểm tra tính hợp lệ của token trước khi cho phép yêu cầu đi sâu vào hệ thống backend. Đồng thời, User-Service sử dụng Keycloak Admin Client để tự động đồng bộ tài khoản định danh lên Keycloak ngay khi khách hàng xác nhận OTP kích hoạt tài khoản thành công.</w:t>
@@ -1296,47 +2760,50 @@
     </w:p>
     <w:p>
       <w:pPr>
+        <w:pStyle w:val="Heading1"/>
         <w:spacing w:before="240" w:after="240" w:line="248" w:lineRule="auto"/>
         <w:rPr>
-          <w:rFonts w:ascii="Times New Roman" w:eastAsiaTheme="majorEastAsia" w:hAnsi="Times New Roman" w:cs="Times New Roman"/>
-          <w:b/>
-          <w:color w:val="0F4761" w:themeColor="accent1" w:themeShade="BF"/>
+          <w:rFonts w:ascii="Times New Roman" w:hAnsi="Times New Roman" w:cs="Times New Roman"/>
+          <w:b/>
+          <w:color w:val="000000"/>
           <w:sz w:val="32"/>
-          <w:szCs w:val="40"/>
-        </w:rPr>
-      </w:pPr>
-      <w:r>
-        <w:rPr>
-          <w:rFonts w:ascii="Times New Roman" w:eastAsiaTheme="majorEastAsia" w:hAnsi="Times New Roman" w:cs="Times New Roman"/>
-          <w:b/>
-          <w:color w:val="0F4761" w:themeColor="accent1" w:themeShade="BF"/>
+        </w:rPr>
+      </w:pPr>
+      <w:bookmarkStart w:id="10" w:name="_Toc233880280"/>
+      <w:r>
+        <w:rPr>
+          <w:rFonts w:ascii="Times New Roman" w:hAnsi="Times New Roman" w:cs="Times New Roman"/>
+          <w:b/>
+          <w:color w:val="000000"/>
           <w:sz w:val="32"/>
-          <w:szCs w:val="40"/>
-        </w:rPr>
+        </w:rPr>
+        <w:lastRenderedPageBreak/>
         <w:t>CHƯƠNG 4. THÀNH TỰU VÀ CÔNG NGHỆ ÁP DỤNG TRONG DỰ ÁN</w:t>
       </w:r>
-    </w:p>
-    <w:p>
-      <w:pPr>
+      <w:bookmarkEnd w:id="10"/>
+    </w:p>
+    <w:p>
+      <w:pPr>
+        <w:pStyle w:val="Heading2"/>
         <w:spacing w:before="120" w:after="120" w:line="248" w:lineRule="auto"/>
         <w:rPr>
-          <w:rFonts w:ascii="Times New Roman" w:eastAsiaTheme="majorEastAsia" w:hAnsi="Times New Roman" w:cs="Times New Roman"/>
-          <w:b/>
-          <w:color w:val="0F4761" w:themeColor="accent1" w:themeShade="BF"/>
+          <w:rFonts w:ascii="Times New Roman" w:hAnsi="Times New Roman" w:cs="Times New Roman"/>
+          <w:b/>
+          <w:color w:val="000000"/>
           <w:sz w:val="28"/>
-          <w:szCs w:val="32"/>
-        </w:rPr>
-      </w:pPr>
-      <w:r>
-        <w:rPr>
-          <w:rFonts w:ascii="Times New Roman" w:eastAsiaTheme="majorEastAsia" w:hAnsi="Times New Roman" w:cs="Times New Roman"/>
-          <w:b/>
-          <w:color w:val="0F4761" w:themeColor="accent1" w:themeShade="BF"/>
+        </w:rPr>
+      </w:pPr>
+      <w:bookmarkStart w:id="11" w:name="_Toc233880281"/>
+      <w:r>
+        <w:rPr>
+          <w:rFonts w:ascii="Times New Roman" w:hAnsi="Times New Roman" w:cs="Times New Roman"/>
+          <w:b/>
+          <w:color w:val="000000"/>
           <w:sz w:val="28"/>
-          <w:szCs w:val="32"/>
         </w:rPr>
         <w:t>4.1. Thành tựu tự hào về kiến trúc API và Spring Boot</w:t>
       </w:r>
+      <w:bookmarkEnd w:id="11"/>
     </w:p>
     <w:p>
       <w:pPr>
@@ -1344,12 +2811,14 @@
         <w:jc w:val="both"/>
         <w:rPr>
           <w:rFonts w:ascii="Times New Roman" w:hAnsi="Times New Roman" w:cs="Times New Roman"/>
-          <w:sz w:val="26"/>
-        </w:rPr>
-      </w:pPr>
-      <w:r>
-        <w:rPr>
-          <w:rFonts w:ascii="Times New Roman" w:hAnsi="Times New Roman" w:cs="Times New Roman"/>
+          <w:color w:val="000000"/>
+          <w:sz w:val="26"/>
+        </w:rPr>
+      </w:pPr>
+      <w:r>
+        <w:rPr>
+          <w:rFonts w:ascii="Times New Roman" w:hAnsi="Times New Roman" w:cs="Times New Roman"/>
+          <w:color w:val="000000"/>
           <w:sz w:val="26"/>
         </w:rPr>
         <w:t>Một trong những thành tựu tự hào lớn nhất của dự án là việc thiết kế và vận hành thành công kiến trúc backend Multi-service phân tán hiện đại dựa trên nền tảng Spring Boot. Nhóm đã làm chủ kỹ thuật xây dựng và tối ưu các RESTful API sạch (Clean Restful APIs), định dạng dữ liệu DTO đồng nhất và điều hướng động qua API Gateway. Việc phát triển các service tách biệt giúp giảm thiểu tối đa tính liên đới, nâng cao hiệu năng chịu tải khi chạy đồng thời nhiều luồng giao dịch.</w:t>
@@ -1357,25 +2826,26 @@
     </w:p>
     <w:p>
       <w:pPr>
+        <w:pStyle w:val="Heading2"/>
         <w:spacing w:before="120" w:after="120" w:line="248" w:lineRule="auto"/>
         <w:rPr>
-          <w:rFonts w:ascii="Times New Roman" w:eastAsiaTheme="majorEastAsia" w:hAnsi="Times New Roman" w:cs="Times New Roman"/>
-          <w:b/>
-          <w:color w:val="0F4761" w:themeColor="accent1" w:themeShade="BF"/>
+          <w:rFonts w:ascii="Times New Roman" w:hAnsi="Times New Roman" w:cs="Times New Roman"/>
+          <w:b/>
+          <w:color w:val="000000"/>
           <w:sz w:val="28"/>
-          <w:szCs w:val="32"/>
-        </w:rPr>
-      </w:pPr>
-      <w:r>
-        <w:rPr>
-          <w:rFonts w:ascii="Times New Roman" w:eastAsiaTheme="majorEastAsia" w:hAnsi="Times New Roman" w:cs="Times New Roman"/>
-          <w:b/>
-          <w:color w:val="0F4761" w:themeColor="accent1" w:themeShade="BF"/>
+        </w:rPr>
+      </w:pPr>
+      <w:bookmarkStart w:id="12" w:name="_Toc233880282"/>
+      <w:r>
+        <w:rPr>
+          <w:rFonts w:ascii="Times New Roman" w:hAnsi="Times New Roman" w:cs="Times New Roman"/>
+          <w:b/>
+          <w:color w:val="000000"/>
           <w:sz w:val="28"/>
-          <w:szCs w:val="32"/>
         </w:rPr>
         <w:t>4.2. Tối ưu hóa hiệu năng giao tiếp và đồng bộ dữ liệu</w:t>
       </w:r>
+      <w:bookmarkEnd w:id="12"/>
     </w:p>
     <w:p>
       <w:pPr>
@@ -1383,12 +2853,14 @@
         <w:jc w:val="both"/>
         <w:rPr>
           <w:rFonts w:ascii="Times New Roman" w:hAnsi="Times New Roman" w:cs="Times New Roman"/>
-          <w:sz w:val="26"/>
-        </w:rPr>
-      </w:pPr>
-      <w:r>
-        <w:rPr>
-          <w:rFonts w:ascii="Times New Roman" w:hAnsi="Times New Roman" w:cs="Times New Roman"/>
+          <w:color w:val="000000"/>
+          <w:sz w:val="26"/>
+        </w:rPr>
+      </w:pPr>
+      <w:r>
+        <w:rPr>
+          <w:rFonts w:ascii="Times New Roman" w:hAnsi="Times New Roman" w:cs="Times New Roman"/>
+          <w:color w:val="000000"/>
           <w:sz w:val="26"/>
         </w:rPr>
         <w:t>Dự án đã áp dụng thành công mô hình 'Database per Service' để bảo toàn tính độc lập dữ liệu, sử dụng Spring Data JPA kết hợp Hibernate để tương tác tối ưu với cơ sở dữ liệu MySQL. Mặc dù dữ liệu bị phân tách chéo giữa các microservice, hệ thống vẫn duy trì hoàn hảo tính nhất quán số dư tài khoản của khách hàng gửi và nhận thông qua các ràng buộc nghiệp vụ ở tầng ứng dụng và cơ chế kiểm soát lỗi giao dịch tài chính chặt chẽ.</w:t>
@@ -1396,47 +2868,49 @@
     </w:p>
     <w:p>
       <w:pPr>
+        <w:pStyle w:val="Heading1"/>
         <w:spacing w:before="240" w:after="240" w:line="248" w:lineRule="auto"/>
         <w:rPr>
-          <w:rFonts w:ascii="Times New Roman" w:eastAsiaTheme="majorEastAsia" w:hAnsi="Times New Roman" w:cs="Times New Roman"/>
-          <w:b/>
-          <w:color w:val="0F4761" w:themeColor="accent1" w:themeShade="BF"/>
+          <w:rFonts w:ascii="Times New Roman" w:hAnsi="Times New Roman" w:cs="Times New Roman"/>
+          <w:b/>
+          <w:color w:val="000000"/>
           <w:sz w:val="32"/>
-          <w:szCs w:val="40"/>
-        </w:rPr>
-      </w:pPr>
-      <w:r>
-        <w:rPr>
-          <w:rFonts w:ascii="Times New Roman" w:eastAsiaTheme="majorEastAsia" w:hAnsi="Times New Roman" w:cs="Times New Roman"/>
-          <w:b/>
-          <w:color w:val="0F4761" w:themeColor="accent1" w:themeShade="BF"/>
+        </w:rPr>
+      </w:pPr>
+      <w:bookmarkStart w:id="13" w:name="_Toc233880283"/>
+      <w:r>
+        <w:rPr>
+          <w:rFonts w:ascii="Times New Roman" w:hAnsi="Times New Roman" w:cs="Times New Roman"/>
+          <w:b/>
+          <w:color w:val="000000"/>
           <w:sz w:val="32"/>
-          <w:szCs w:val="40"/>
         </w:rPr>
         <w:t>CHƯƠNG 5. HƯỚNG DẪN CẤU HÌNH VÀ KHỞI CHẠY ĐỒ ÁN</w:t>
       </w:r>
-    </w:p>
-    <w:p>
-      <w:pPr>
+      <w:bookmarkEnd w:id="13"/>
+    </w:p>
+    <w:p>
+      <w:pPr>
+        <w:pStyle w:val="Heading2"/>
         <w:spacing w:before="120" w:after="120" w:line="248" w:lineRule="auto"/>
         <w:rPr>
-          <w:rFonts w:ascii="Times New Roman" w:eastAsiaTheme="majorEastAsia" w:hAnsi="Times New Roman" w:cs="Times New Roman"/>
-          <w:b/>
-          <w:color w:val="0F4761" w:themeColor="accent1" w:themeShade="BF"/>
+          <w:rFonts w:ascii="Times New Roman" w:hAnsi="Times New Roman" w:cs="Times New Roman"/>
+          <w:b/>
+          <w:color w:val="000000"/>
           <w:sz w:val="28"/>
-          <w:szCs w:val="32"/>
-        </w:rPr>
-      </w:pPr>
-      <w:r>
-        <w:rPr>
-          <w:rFonts w:ascii="Times New Roman" w:eastAsiaTheme="majorEastAsia" w:hAnsi="Times New Roman" w:cs="Times New Roman"/>
-          <w:b/>
-          <w:color w:val="0F4761" w:themeColor="accent1" w:themeShade="BF"/>
+        </w:rPr>
+      </w:pPr>
+      <w:bookmarkStart w:id="14" w:name="_Toc233880284"/>
+      <w:r>
+        <w:rPr>
+          <w:rFonts w:ascii="Times New Roman" w:hAnsi="Times New Roman" w:cs="Times New Roman"/>
+          <w:b/>
+          <w:color w:val="000000"/>
           <w:sz w:val="28"/>
-          <w:szCs w:val="32"/>
         </w:rPr>
         <w:t>5.1. Thiết lập môi trường và khởi chạy Docker Compose</w:t>
       </w:r>
+      <w:bookmarkEnd w:id="14"/>
     </w:p>
     <w:p>
       <w:pPr>
@@ -1444,12 +2918,14 @@
         <w:jc w:val="both"/>
         <w:rPr>
           <w:rFonts w:ascii="Times New Roman" w:hAnsi="Times New Roman" w:cs="Times New Roman"/>
-          <w:sz w:val="26"/>
-        </w:rPr>
-      </w:pPr>
-      <w:r>
-        <w:rPr>
-          <w:rFonts w:ascii="Times New Roman" w:hAnsi="Times New Roman" w:cs="Times New Roman"/>
+          <w:color w:val="000000"/>
+          <w:sz w:val="26"/>
+        </w:rPr>
+      </w:pPr>
+      <w:r>
+        <w:rPr>
+          <w:rFonts w:ascii="Times New Roman" w:hAnsi="Times New Roman" w:cs="Times New Roman"/>
+          <w:color w:val="000000"/>
           <w:sz w:val="26"/>
         </w:rPr>
         <w:t>Để triển khai đồ án, máy tính thử nghiệm cần cài đặt sẵn Docker, Docker Compose, Git, Java JDK 11 hoặc JDK 17 và Android Studio. Bước đầu tiên, dẫn đến thư mục chứa file 'docker-compose.yml' và chạy lệnh: 'docker-compose up -d' để khởi động MySQL Container (Port 3306) và Keycloak Container (Port 8571) chạy ngầm dưới nền hệ thống.</w:t>
@@ -1457,25 +2933,26 @@
     </w:p>
     <w:p>
       <w:pPr>
+        <w:pStyle w:val="Heading2"/>
         <w:spacing w:before="120" w:after="120" w:line="248" w:lineRule="auto"/>
         <w:rPr>
-          <w:rFonts w:ascii="Times New Roman" w:eastAsiaTheme="majorEastAsia" w:hAnsi="Times New Roman" w:cs="Times New Roman"/>
-          <w:b/>
-          <w:color w:val="0F4761" w:themeColor="accent1" w:themeShade="BF"/>
+          <w:rFonts w:ascii="Times New Roman" w:hAnsi="Times New Roman" w:cs="Times New Roman"/>
+          <w:b/>
+          <w:color w:val="000000"/>
           <w:sz w:val="28"/>
-          <w:szCs w:val="32"/>
-        </w:rPr>
-      </w:pPr>
-      <w:r>
-        <w:rPr>
-          <w:rFonts w:ascii="Times New Roman" w:eastAsiaTheme="majorEastAsia" w:hAnsi="Times New Roman" w:cs="Times New Roman"/>
-          <w:b/>
-          <w:color w:val="0F4761" w:themeColor="accent1" w:themeShade="BF"/>
+        </w:rPr>
+      </w:pPr>
+      <w:bookmarkStart w:id="15" w:name="_Toc233880285"/>
+      <w:r>
+        <w:rPr>
+          <w:rFonts w:ascii="Times New Roman" w:hAnsi="Times New Roman" w:cs="Times New Roman"/>
+          <w:b/>
+          <w:color w:val="000000"/>
           <w:sz w:val="28"/>
-          <w:szCs w:val="32"/>
         </w:rPr>
         <w:t>5.2. Các bước cấu hình Keycloak Realm và Client</w:t>
       </w:r>
+      <w:bookmarkEnd w:id="15"/>
     </w:p>
     <w:p>
       <w:pPr>
@@ -1483,12 +2960,14 @@
         <w:jc w:val="both"/>
         <w:rPr>
           <w:rFonts w:ascii="Times New Roman" w:hAnsi="Times New Roman" w:cs="Times New Roman"/>
-          <w:sz w:val="26"/>
-        </w:rPr>
-      </w:pPr>
-      <w:r>
-        <w:rPr>
-          <w:rFonts w:ascii="Times New Roman" w:hAnsi="Times New Roman" w:cs="Times New Roman"/>
+          <w:color w:val="000000"/>
+          <w:sz w:val="26"/>
+        </w:rPr>
+      </w:pPr>
+      <w:r>
+        <w:rPr>
+          <w:rFonts w:ascii="Times New Roman" w:hAnsi="Times New Roman" w:cs="Times New Roman"/>
+          <w:color w:val="000000"/>
           <w:sz w:val="26"/>
         </w:rPr>
         <w:t>Sau khi Keycloak chạy, thực hiện cấu hình bằng tay trên trang quản trị: (1) Truy cập http://localhost:8571 và đăng nhập bằng admin/admin. (2) Tạo Realm mới tên 'banking-service'. (3) Trong Realm này, tạo Client mới tên 'banking-service-api-client', bật tuỳ chọn 'Service Accounts Enabled' và cấu hình phần Client Secret. (4) Chuyển đến tab Service Account Roles và gán các quyền hệ thống 'manage-users', 'view-users', 'query-users' cho Client để cho phép backend Java gọi API quản lý người dùng của Keycloak.</w:t>
@@ -1496,25 +2975,26 @@
     </w:p>
     <w:p>
       <w:pPr>
+        <w:pStyle w:val="Heading2"/>
         <w:spacing w:before="120" w:after="120" w:line="248" w:lineRule="auto"/>
         <w:rPr>
-          <w:rFonts w:ascii="Times New Roman" w:eastAsiaTheme="majorEastAsia" w:hAnsi="Times New Roman" w:cs="Times New Roman"/>
-          <w:b/>
-          <w:color w:val="0F4761" w:themeColor="accent1" w:themeShade="BF"/>
+          <w:rFonts w:ascii="Times New Roman" w:hAnsi="Times New Roman" w:cs="Times New Roman"/>
+          <w:b/>
+          <w:color w:val="000000"/>
           <w:sz w:val="28"/>
-          <w:szCs w:val="32"/>
-        </w:rPr>
-      </w:pPr>
-      <w:r>
-        <w:rPr>
-          <w:rFonts w:ascii="Times New Roman" w:eastAsiaTheme="majorEastAsia" w:hAnsi="Times New Roman" w:cs="Times New Roman"/>
-          <w:b/>
-          <w:color w:val="0F4761" w:themeColor="accent1" w:themeShade="BF"/>
+        </w:rPr>
+      </w:pPr>
+      <w:bookmarkStart w:id="16" w:name="_Toc233880286"/>
+      <w:r>
+        <w:rPr>
+          <w:rFonts w:ascii="Times New Roman" w:hAnsi="Times New Roman" w:cs="Times New Roman"/>
+          <w:b/>
+          <w:color w:val="000000"/>
           <w:sz w:val="28"/>
-          <w:szCs w:val="32"/>
         </w:rPr>
         <w:t>5.3. Khởi chạy 7 Microservices Spring Boot bằng Script</w:t>
       </w:r>
+      <w:bookmarkEnd w:id="16"/>
     </w:p>
     <w:p>
       <w:pPr>
@@ -1522,12 +3002,14 @@
         <w:jc w:val="both"/>
         <w:rPr>
           <w:rFonts w:ascii="Times New Roman" w:hAnsi="Times New Roman" w:cs="Times New Roman"/>
-          <w:sz w:val="26"/>
-        </w:rPr>
-      </w:pPr>
-      <w:r>
-        <w:rPr>
-          <w:rFonts w:ascii="Times New Roman" w:hAnsi="Times New Roman" w:cs="Times New Roman"/>
+          <w:color w:val="000000"/>
+          <w:sz w:val="26"/>
+        </w:rPr>
+      </w:pPr>
+      <w:r>
+        <w:rPr>
+          <w:rFonts w:ascii="Times New Roman" w:hAnsi="Times New Roman" w:cs="Times New Roman"/>
+          <w:color w:val="000000"/>
           <w:sz w:val="26"/>
         </w:rPr>
         <w:t>Tại thư mục gốc của dự án, chạy tệp tin script tự động 'run-services.cmd'. Script này sẽ tự động kiểm tra biến môi trường Java, yêu cầu bạn nhập Client Secret của Keycloak vừa tạo (hoặc nhấn Enter để lấy giá trị mặc định trong cấu hình), sau đó lần lượt kích hoạt 7 microservices backend bằng Maven Wrapper trong các cửa sổ CMD riêng biệt giúp dễ dàng quan sát log hoạt động.</w:t>
@@ -1535,47 +3017,50 @@
     </w:p>
     <w:p>
       <w:pPr>
+        <w:pStyle w:val="Heading1"/>
         <w:spacing w:before="240" w:after="240" w:line="248" w:lineRule="auto"/>
         <w:rPr>
-          <w:rFonts w:ascii="Times New Roman" w:eastAsiaTheme="majorEastAsia" w:hAnsi="Times New Roman" w:cs="Times New Roman"/>
-          <w:b/>
-          <w:color w:val="0F4761" w:themeColor="accent1" w:themeShade="BF"/>
+          <w:rFonts w:ascii="Times New Roman" w:hAnsi="Times New Roman" w:cs="Times New Roman"/>
+          <w:b/>
+          <w:color w:val="000000"/>
           <w:sz w:val="32"/>
-          <w:szCs w:val="40"/>
-        </w:rPr>
-      </w:pPr>
-      <w:r>
-        <w:rPr>
-          <w:rFonts w:ascii="Times New Roman" w:eastAsiaTheme="majorEastAsia" w:hAnsi="Times New Roman" w:cs="Times New Roman"/>
-          <w:b/>
-          <w:color w:val="0F4761" w:themeColor="accent1" w:themeShade="BF"/>
+        </w:rPr>
+      </w:pPr>
+      <w:bookmarkStart w:id="17" w:name="_Toc233880287"/>
+      <w:r>
+        <w:rPr>
+          <w:rFonts w:ascii="Times New Roman" w:hAnsi="Times New Roman" w:cs="Times New Roman"/>
+          <w:b/>
+          <w:color w:val="000000"/>
           <w:sz w:val="32"/>
-          <w:szCs w:val="40"/>
-        </w:rPr>
+        </w:rPr>
+        <w:lastRenderedPageBreak/>
         <w:t>CHƯƠNG 6. TỔNG KẾT VÀ HƯỚNG PHÁT TRIỂN TƯƠNG LAI</w:t>
       </w:r>
-    </w:p>
-    <w:p>
-      <w:pPr>
+      <w:bookmarkEnd w:id="17"/>
+    </w:p>
+    <w:p>
+      <w:pPr>
+        <w:pStyle w:val="Heading2"/>
         <w:spacing w:before="120" w:after="120" w:line="248" w:lineRule="auto"/>
         <w:rPr>
-          <w:rFonts w:ascii="Times New Roman" w:eastAsiaTheme="majorEastAsia" w:hAnsi="Times New Roman" w:cs="Times New Roman"/>
-          <w:b/>
-          <w:color w:val="0F4761" w:themeColor="accent1" w:themeShade="BF"/>
+          <w:rFonts w:ascii="Times New Roman" w:hAnsi="Times New Roman" w:cs="Times New Roman"/>
+          <w:b/>
+          <w:color w:val="000000"/>
           <w:sz w:val="28"/>
-          <w:szCs w:val="32"/>
-        </w:rPr>
-      </w:pPr>
-      <w:r>
-        <w:rPr>
-          <w:rFonts w:ascii="Times New Roman" w:eastAsiaTheme="majorEastAsia" w:hAnsi="Times New Roman" w:cs="Times New Roman"/>
-          <w:b/>
-          <w:color w:val="0F4761" w:themeColor="accent1" w:themeShade="BF"/>
+        </w:rPr>
+      </w:pPr>
+      <w:bookmarkStart w:id="18" w:name="_Toc233880288"/>
+      <w:r>
+        <w:rPr>
+          <w:rFonts w:ascii="Times New Roman" w:hAnsi="Times New Roman" w:cs="Times New Roman"/>
+          <w:b/>
+          <w:color w:val="000000"/>
           <w:sz w:val="28"/>
-          <w:szCs w:val="32"/>
         </w:rPr>
         <w:t>6.1. Đánh giá kết quả đạt được của đồ án</w:t>
       </w:r>
+      <w:bookmarkEnd w:id="18"/>
     </w:p>
     <w:p>
       <w:pPr>
@@ -1583,12 +3068,14 @@
         <w:jc w:val="both"/>
         <w:rPr>
           <w:rFonts w:ascii="Times New Roman" w:hAnsi="Times New Roman" w:cs="Times New Roman"/>
-          <w:sz w:val="26"/>
-        </w:rPr>
-      </w:pPr>
-      <w:r>
-        <w:rPr>
-          <w:rFonts w:ascii="Times New Roman" w:hAnsi="Times New Roman" w:cs="Times New Roman"/>
+          <w:color w:val="000000"/>
+          <w:sz w:val="26"/>
+        </w:rPr>
+      </w:pPr>
+      <w:r>
+        <w:rPr>
+          <w:rFonts w:ascii="Times New Roman" w:hAnsi="Times New Roman" w:cs="Times New Roman"/>
+          <w:color w:val="000000"/>
           <w:sz w:val="26"/>
         </w:rPr>
         <w:t>Nhóm nghiên cứu đã hoàn thành toàn bộ các yêu cầu đề ra cho đồ án 'NLU Banking App'. Hệ thống Android App kết hợp Microservices Spring Boot hoạt động ổn định, bảo mật xác thực phân tán qua Keycloak OIDC đạt chuẩn công nghiệp, quy trình nạp, rút, chuyển khoản nội bộ và thanh toán QR Code hoạt động mượt mà và chính xác.</w:t>
@@ -1596,25 +3083,26 @@
     </w:p>
     <w:p>
       <w:pPr>
+        <w:pStyle w:val="Heading2"/>
         <w:spacing w:before="120" w:after="120" w:line="248" w:lineRule="auto"/>
         <w:rPr>
-          <w:rFonts w:ascii="Times New Roman" w:eastAsiaTheme="majorEastAsia" w:hAnsi="Times New Roman" w:cs="Times New Roman"/>
-          <w:b/>
-          <w:color w:val="0F4761" w:themeColor="accent1" w:themeShade="BF"/>
+          <w:rFonts w:ascii="Times New Roman" w:hAnsi="Times New Roman" w:cs="Times New Roman"/>
+          <w:b/>
+          <w:color w:val="000000"/>
           <w:sz w:val="28"/>
-          <w:szCs w:val="32"/>
-        </w:rPr>
-      </w:pPr>
-      <w:r>
-        <w:rPr>
-          <w:rFonts w:ascii="Times New Roman" w:eastAsiaTheme="majorEastAsia" w:hAnsi="Times New Roman" w:cs="Times New Roman"/>
-          <w:b/>
-          <w:color w:val="0F4761" w:themeColor="accent1" w:themeShade="BF"/>
+        </w:rPr>
+      </w:pPr>
+      <w:bookmarkStart w:id="19" w:name="_Toc233880289"/>
+      <w:r>
+        <w:rPr>
+          <w:rFonts w:ascii="Times New Roman" w:hAnsi="Times New Roman" w:cs="Times New Roman"/>
+          <w:b/>
+          <w:color w:val="000000"/>
           <w:sz w:val="28"/>
-          <w:szCs w:val="32"/>
         </w:rPr>
         <w:t>6.2. Hướng phát triển nâng cấp hệ thống</w:t>
       </w:r>
+      <w:bookmarkEnd w:id="19"/>
     </w:p>
     <w:p>
       <w:pPr>
@@ -1622,12 +3110,14 @@
         <w:jc w:val="both"/>
         <w:rPr>
           <w:rFonts w:ascii="Times New Roman" w:hAnsi="Times New Roman" w:cs="Times New Roman"/>
-          <w:sz w:val="26"/>
-        </w:rPr>
-      </w:pPr>
-      <w:r>
-        <w:rPr>
-          <w:rFonts w:ascii="Times New Roman" w:hAnsi="Times New Roman" w:cs="Times New Roman"/>
+          <w:color w:val="000000"/>
+          <w:sz w:val="26"/>
+        </w:rPr>
+      </w:pPr>
+      <w:r>
+        <w:rPr>
+          <w:rFonts w:ascii="Times New Roman" w:hAnsi="Times New Roman" w:cs="Times New Roman"/>
+          <w:color w:val="000000"/>
           <w:sz w:val="26"/>
         </w:rPr>
         <w:t>Nhóm dự kiến phát triển nâng cấp hệ thống trong tương lai bằng cách tích hợp thêm các chức năng: Xác thực sinh trắc học (vân tay, nhận diện khuôn mặt) trực tiếp trên Android; triển khai cơ chế Message Broker qua Apache Kafka để tối ưu hóa khả năng truyền tải dữ liệu và nâng cao tính chịu tải của hệ thống ngân hàng di động.</w:t>
@@ -1639,14 +3129,20 @@
         <w:jc w:val="both"/>
         <w:rPr>
           <w:rFonts w:ascii="Times New Roman" w:hAnsi="Times New Roman" w:cs="Times New Roman"/>
+          <w:color w:val="000000"/>
           <w:sz w:val="26"/>
         </w:rPr>
       </w:pPr>
     </w:p>
     <w:sectPr>
-      <w:type w:val="continuous"/>
       <w:pgSz w:w="12240" w:h="15840"/>
       <w:pgMar w:top="1417" w:right="1134" w:bottom="1417" w:left="1701" w:header="720" w:footer="720" w:gutter="0"/>
+      <w:pgBorders w:display="firstPage" w:offsetFrom="page">
+        <w:top w:val="single" w:sz="8" w:space="24" w:color="000000"/>
+        <w:left w:val="single" w:sz="8" w:space="24" w:color="000000"/>
+        <w:bottom w:val="single" w:sz="8" w:space="24" w:color="000000"/>
+        <w:right w:val="single" w:sz="8" w:space="24" w:color="000000"/>
+      </w:pgBorders>
       <w:cols w:space="720"/>
       <w:docGrid w:linePitch="360"/>
     </w:sectPr>
@@ -2062,7 +3558,7 @@
     <w:link w:val="Heading1Char"/>
     <w:uiPriority w:val="9"/>
     <w:qFormat/>
-    <w:rsid w:val="00BE4708"/>
+    <w:rsid w:val="00855AAC"/>
     <w:pPr>
       <w:keepNext/>
       <w:keepLines/>
@@ -2084,7 +3580,7 @@
     <w:uiPriority w:val="9"/>
     <w:unhideWhenUsed/>
     <w:qFormat/>
-    <w:rsid w:val="00BE4708"/>
+    <w:rsid w:val="00855AAC"/>
     <w:pPr>
       <w:keepNext/>
       <w:keepLines/>
@@ -2107,7 +3603,7 @@
     <w:semiHidden/>
     <w:unhideWhenUsed/>
     <w:qFormat/>
-    <w:rsid w:val="00BE4708"/>
+    <w:rsid w:val="00855AAC"/>
     <w:pPr>
       <w:keepNext/>
       <w:keepLines/>
@@ -2130,7 +3626,7 @@
     <w:semiHidden/>
     <w:unhideWhenUsed/>
     <w:qFormat/>
-    <w:rsid w:val="00BE4708"/>
+    <w:rsid w:val="00855AAC"/>
     <w:pPr>
       <w:keepNext/>
       <w:keepLines/>
@@ -2153,7 +3649,7 @@
     <w:semiHidden/>
     <w:unhideWhenUsed/>
     <w:qFormat/>
-    <w:rsid w:val="00BE4708"/>
+    <w:rsid w:val="00855AAC"/>
     <w:pPr>
       <w:keepNext/>
       <w:keepLines/>
@@ -2174,7 +3670,7 @@
     <w:semiHidden/>
     <w:unhideWhenUsed/>
     <w:qFormat/>
-    <w:rsid w:val="00BE4708"/>
+    <w:rsid w:val="00855AAC"/>
     <w:pPr>
       <w:keepNext/>
       <w:keepLines/>
@@ -2197,7 +3693,7 @@
     <w:semiHidden/>
     <w:unhideWhenUsed/>
     <w:qFormat/>
-    <w:rsid w:val="00BE4708"/>
+    <w:rsid w:val="00855AAC"/>
     <w:pPr>
       <w:keepNext/>
       <w:keepLines/>
@@ -2218,7 +3714,7 @@
     <w:semiHidden/>
     <w:unhideWhenUsed/>
     <w:qFormat/>
-    <w:rsid w:val="00BE4708"/>
+    <w:rsid w:val="00855AAC"/>
     <w:pPr>
       <w:keepNext/>
       <w:keepLines/>
@@ -2241,7 +3737,7 @@
     <w:semiHidden/>
     <w:unhideWhenUsed/>
     <w:qFormat/>
-    <w:rsid w:val="00BE4708"/>
+    <w:rsid w:val="00855AAC"/>
     <w:pPr>
       <w:keepNext/>
       <w:keepLines/>
@@ -2285,7 +3781,7 @@
     <w:basedOn w:val="DefaultParagraphFont"/>
     <w:link w:val="Heading1"/>
     <w:uiPriority w:val="9"/>
-    <w:rsid w:val="00BE4708"/>
+    <w:rsid w:val="00855AAC"/>
     <w:rPr>
       <w:rFonts w:asciiTheme="majorHAnsi" w:eastAsiaTheme="majorEastAsia" w:hAnsiTheme="majorHAnsi" w:cstheme="majorBidi"/>
       <w:color w:val="0F4761" w:themeColor="accent1" w:themeShade="BF"/>
@@ -2298,7 +3794,7 @@
     <w:basedOn w:val="DefaultParagraphFont"/>
     <w:link w:val="Heading2"/>
     <w:uiPriority w:val="9"/>
-    <w:rsid w:val="00BE4708"/>
+    <w:rsid w:val="00855AAC"/>
     <w:rPr>
       <w:rFonts w:asciiTheme="majorHAnsi" w:eastAsiaTheme="majorEastAsia" w:hAnsiTheme="majorHAnsi" w:cstheme="majorBidi"/>
       <w:color w:val="0F4761" w:themeColor="accent1" w:themeShade="BF"/>
@@ -2312,7 +3808,7 @@
     <w:link w:val="Heading3"/>
     <w:uiPriority w:val="9"/>
     <w:semiHidden/>
-    <w:rsid w:val="00BE4708"/>
+    <w:rsid w:val="00855AAC"/>
     <w:rPr>
       <w:rFonts w:eastAsiaTheme="majorEastAsia" w:cstheme="majorBidi"/>
       <w:color w:val="0F4761" w:themeColor="accent1" w:themeShade="BF"/>
@@ -2326,7 +3822,7 @@
     <w:link w:val="Heading4"/>
     <w:uiPriority w:val="9"/>
     <w:semiHidden/>
-    <w:rsid w:val="00BE4708"/>
+    <w:rsid w:val="00855AAC"/>
     <w:rPr>
       <w:rFonts w:eastAsiaTheme="majorEastAsia" w:cstheme="majorBidi"/>
       <w:i/>
@@ -2340,7 +3836,7 @@
     <w:link w:val="Heading5"/>
     <w:uiPriority w:val="9"/>
     <w:semiHidden/>
-    <w:rsid w:val="00BE4708"/>
+    <w:rsid w:val="00855AAC"/>
     <w:rPr>
       <w:rFonts w:eastAsiaTheme="majorEastAsia" w:cstheme="majorBidi"/>
       <w:color w:val="0F4761" w:themeColor="accent1" w:themeShade="BF"/>
@@ -2352,7 +3848,7 @@
     <w:link w:val="Heading6"/>
     <w:uiPriority w:val="9"/>
     <w:semiHidden/>
-    <w:rsid w:val="00BE4708"/>
+    <w:rsid w:val="00855AAC"/>
     <w:rPr>
       <w:rFonts w:eastAsiaTheme="majorEastAsia" w:cstheme="majorBidi"/>
       <w:i/>
@@ -2366,7 +3862,7 @@
     <w:link w:val="Heading7"/>
     <w:uiPriority w:val="9"/>
     <w:semiHidden/>
-    <w:rsid w:val="00BE4708"/>
+    <w:rsid w:val="00855AAC"/>
     <w:rPr>
       <w:rFonts w:eastAsiaTheme="majorEastAsia" w:cstheme="majorBidi"/>
       <w:color w:val="595959" w:themeColor="text1" w:themeTint="A6"/>
@@ -2378,7 +3874,7 @@
     <w:link w:val="Heading8"/>
     <w:uiPriority w:val="9"/>
     <w:semiHidden/>
-    <w:rsid w:val="00BE4708"/>
+    <w:rsid w:val="00855AAC"/>
     <w:rPr>
       <w:rFonts w:eastAsiaTheme="majorEastAsia" w:cstheme="majorBidi"/>
       <w:i/>
@@ -2392,7 +3888,7 @@
     <w:link w:val="Heading9"/>
     <w:uiPriority w:val="9"/>
     <w:semiHidden/>
-    <w:rsid w:val="00BE4708"/>
+    <w:rsid w:val="00855AAC"/>
     <w:rPr>
       <w:rFonts w:eastAsiaTheme="majorEastAsia" w:cstheme="majorBidi"/>
       <w:color w:val="272727" w:themeColor="text1" w:themeTint="D8"/>
@@ -2405,7 +3901,7 @@
     <w:link w:val="TitleChar"/>
     <w:uiPriority w:val="10"/>
     <w:qFormat/>
-    <w:rsid w:val="00BE4708"/>
+    <w:rsid w:val="00855AAC"/>
     <w:pPr>
       <w:spacing w:after="80" w:line="240" w:lineRule="auto"/>
       <w:contextualSpacing/>
@@ -2423,7 +3919,7 @@
     <w:basedOn w:val="DefaultParagraphFont"/>
     <w:link w:val="Title"/>
     <w:uiPriority w:val="10"/>
-    <w:rsid w:val="00BE4708"/>
+    <w:rsid w:val="00855AAC"/>
     <w:rPr>
       <w:rFonts w:asciiTheme="majorHAnsi" w:eastAsiaTheme="majorEastAsia" w:hAnsiTheme="majorHAnsi" w:cstheme="majorBidi"/>
       <w:spacing w:val="-10"/>
@@ -2439,7 +3935,7 @@
     <w:link w:val="SubtitleChar"/>
     <w:uiPriority w:val="11"/>
     <w:qFormat/>
-    <w:rsid w:val="00BE4708"/>
+    <w:rsid w:val="00855AAC"/>
     <w:pPr>
       <w:numPr>
         <w:ilvl w:val="1"/>
@@ -2458,7 +3954,7 @@
     <w:basedOn w:val="DefaultParagraphFont"/>
     <w:link w:val="Subtitle"/>
     <w:uiPriority w:val="11"/>
-    <w:rsid w:val="00BE4708"/>
+    <w:rsid w:val="00855AAC"/>
     <w:rPr>
       <w:rFonts w:eastAsiaTheme="majorEastAsia" w:cstheme="majorBidi"/>
       <w:color w:val="595959" w:themeColor="text1" w:themeTint="A6"/>
@@ -2474,7 +3970,7 @@
     <w:link w:val="QuoteChar"/>
     <w:uiPriority w:val="29"/>
     <w:qFormat/>
-    <w:rsid w:val="00BE4708"/>
+    <w:rsid w:val="00855AAC"/>
     <w:pPr>
       <w:spacing w:before="160"/>
       <w:jc w:val="center"/>
@@ -2490,7 +3986,7 @@
     <w:basedOn w:val="DefaultParagraphFont"/>
     <w:link w:val="Quote"/>
     <w:uiPriority w:val="29"/>
-    <w:rsid w:val="00BE4708"/>
+    <w:rsid w:val="00855AAC"/>
     <w:rPr>
       <w:i/>
       <w:iCs/>
@@ -2502,7 +3998,7 @@
     <w:basedOn w:val="Normal"/>
     <w:uiPriority w:val="34"/>
     <w:qFormat/>
-    <w:rsid w:val="00BE4708"/>
+    <w:rsid w:val="00855AAC"/>
     <w:pPr>
       <w:ind w:left="720"/>
       <w:contextualSpacing/>
@@ -2513,7 +4009,7 @@
     <w:basedOn w:val="DefaultParagraphFont"/>
     <w:uiPriority w:val="21"/>
     <w:qFormat/>
-    <w:rsid w:val="00BE4708"/>
+    <w:rsid w:val="00855AAC"/>
     <w:rPr>
       <w:i/>
       <w:iCs/>
@@ -2527,7 +4023,7 @@
     <w:link w:val="IntenseQuoteChar"/>
     <w:uiPriority w:val="30"/>
     <w:qFormat/>
-    <w:rsid w:val="00BE4708"/>
+    <w:rsid w:val="00855AAC"/>
     <w:pPr>
       <w:pBdr>
         <w:top w:val="single" w:sz="4" w:space="10" w:color="0F4761" w:themeColor="accent1" w:themeShade="BF"/>
@@ -2548,7 +4044,7 @@
     <w:basedOn w:val="DefaultParagraphFont"/>
     <w:link w:val="IntenseQuote"/>
     <w:uiPriority w:val="30"/>
-    <w:rsid w:val="00BE4708"/>
+    <w:rsid w:val="00855AAC"/>
     <w:rPr>
       <w:i/>
       <w:iCs/>
@@ -2560,7 +4056,7 @@
     <w:basedOn w:val="DefaultParagraphFont"/>
     <w:uiPriority w:val="32"/>
     <w:qFormat/>
-    <w:rsid w:val="00BE4708"/>
+    <w:rsid w:val="00855AAC"/>
     <w:rPr>
       <w:b/>
       <w:bCs/>
@@ -2568,6 +4064,31 @@
       <w:color w:val="0F4761" w:themeColor="accent1" w:themeShade="BF"/>
       <w:spacing w:val="5"/>
     </w:rPr>
+  </w:style>
+  <w:style w:type="paragraph" w:styleId="TOC1">
+    <w:name w:val="toc 1"/>
+    <w:basedOn w:val="Normal"/>
+    <w:next w:val="Normal"/>
+    <w:autoRedefine/>
+    <w:uiPriority w:val="39"/>
+    <w:unhideWhenUsed/>
+    <w:rsid w:val="00855AAC"/>
+    <w:pPr>
+      <w:spacing w:after="100"/>
+    </w:pPr>
+  </w:style>
+  <w:style w:type="paragraph" w:styleId="TOC2">
+    <w:name w:val="toc 2"/>
+    <w:basedOn w:val="Normal"/>
+    <w:next w:val="Normal"/>
+    <w:autoRedefine/>
+    <w:uiPriority w:val="39"/>
+    <w:unhideWhenUsed/>
+    <w:rsid w:val="00855AAC"/>
+    <w:pPr>
+      <w:spacing w:after="100"/>
+      <w:ind w:left="240"/>
+    </w:pPr>
   </w:style>
 </w:styles>
 </file>

</xml_diff>

<commit_message>
docs: set Chapter 4 to System and Database Design, and copy template cover page exactly
</commit_message>
<xml_diff>
--- a/Bao_cao_do_an_NLU_Banking.docx
+++ b/Bao_cao_do_an_NLU_Banking.docx
@@ -2,657 +2,521 @@
 <file path=word/document.xml><?xml version="1.0" encoding="utf-8"?>
 <w:document xmlns:wpc="http://schemas.microsoft.com/office/word/2010/wordprocessingCanvas" xmlns:cx="http://schemas.microsoft.com/office/drawing/2014/chartex" xmlns:cx1="http://schemas.microsoft.com/office/drawing/2015/9/8/chartex" xmlns:cx2="http://schemas.microsoft.com/office/drawing/2015/10/21/chartex" xmlns:cx3="http://schemas.microsoft.com/office/drawing/2016/5/9/chartex" xmlns:cx4="http://schemas.microsoft.com/office/drawing/2016/5/10/chartex" xmlns:cx5="http://schemas.microsoft.com/office/drawing/2016/5/11/chartex" xmlns:cx6="http://schemas.microsoft.com/office/drawing/2016/5/12/chartex" xmlns:cx7="http://schemas.microsoft.com/office/drawing/2016/5/13/chartex" xmlns:cx8="http://schemas.microsoft.com/office/drawing/2016/5/14/chartex" xmlns:mc="http://schemas.openxmlformats.org/markup-compatibility/2006" xmlns:aink="http://schemas.microsoft.com/office/drawing/2016/ink" xmlns:am3d="http://schemas.microsoft.com/office/drawing/2017/model3d" xmlns:o="urn:schemas-microsoft-com:office:office" xmlns:oel="http://schemas.microsoft.com/office/2019/extlst" xmlns:r="http://schemas.openxmlformats.org/officeDocument/2006/relationships" xmlns:m="http://schemas.openxmlformats.org/officeDocument/2006/math" xmlns:v="urn:schemas-microsoft-com:vml" xmlns:wp14="http://schemas.microsoft.com/office/word/2010/wordprocessingDrawing" xmlns:wp="http://schemas.openxmlformats.org/drawingml/2006/wordprocessingDrawing" xmlns:w10="urn:schemas-microsoft-com:office:word" xmlns:w="http://schemas.openxmlformats.org/wordprocessingml/2006/main" xmlns:w14="http://schemas.microsoft.com/office/word/2010/wordml" xmlns:w15="http://schemas.microsoft.com/office/word/2012/wordml" xmlns:w16cex="http://schemas.microsoft.com/office/word/2018/wordml/cex" xmlns:w16cid="http://schemas.microsoft.com/office/word/2016/wordml/cid" xmlns:w16="http://schemas.microsoft.com/office/word/2018/wordml" xmlns:w16du="http://schemas.microsoft.com/office/word/2023/wordml/word16du" xmlns:w16sdtdh="http://schemas.microsoft.com/office/word/2020/wordml/sdtdatahash" xmlns:w16sdtfl="http://schemas.microsoft.com/office/word/2024/wordml/sdtformatlock" xmlns:w16se="http://schemas.microsoft.com/office/word/2015/wordml/symex" xmlns:wpg="http://schemas.microsoft.com/office/word/2010/wordprocessingGroup" xmlns:wpi="http://schemas.microsoft.com/office/word/2010/wordprocessingInk" xmlns:wne="http://schemas.microsoft.com/office/word/2006/wordml" xmlns:wps="http://schemas.microsoft.com/office/word/2010/wordprocessingShape" mc:Ignorable="w14 w15 w16se w16cid w16 w16cex w16sdtdh w16sdtfl w16du wp14">
   <w:body>
-    <w:p>
-      <w:pPr>
-        <w:spacing w:after="120"/>
-        <w:jc w:val="center"/>
-      </w:pPr>
-      <w:r>
-        <w:rPr>
-          <w:noProof/>
-        </w:rPr>
-        <w:drawing>
-          <wp:inline distT="0" distB="0" distL="0" distR="0" wp14:anchorId="0ECB7D3C" wp14:editId="47774A00">
-            <wp:extent cx="1016000" cy="1016000"/>
-            <wp:effectExtent l="0" t="0" r="0" b="0"/>
-            <wp:docPr id="654471900" name="Picture 1"/>
-            <wp:cNvGraphicFramePr/>
-            <a:graphic xmlns:a="http://schemas.openxmlformats.org/drawingml/2006/main">
-              <a:graphicData uri="http://schemas.openxmlformats.org/drawingml/2006/picture">
-                <pic:pic xmlns:pic="http://schemas.openxmlformats.org/drawingml/2006/picture">
-                  <pic:nvPicPr>
-                    <pic:cNvPr id="654471900" name=""/>
-                    <pic:cNvPicPr/>
-                  </pic:nvPicPr>
-                  <pic:blipFill>
-                    <a:blip r:embed="rId4" cstate="print">
-                      <a:extLst>
-                        <a:ext uri="{28A0092B-C50C-407E-A947-70E740481C1C}">
-                          <a14:useLocalDpi xmlns:a14="http://schemas.microsoft.com/office/drawing/2010/main" val="0"/>
-                        </a:ext>
-                      </a:extLst>
-                    </a:blip>
-                    <a:stretch>
-                      <a:fillRect/>
-                    </a:stretch>
-                  </pic:blipFill>
-                  <pic:spPr>
-                    <a:xfrm>
-                      <a:off x="0" y="0"/>
-                      <a:ext cx="1016000" cy="1016000"/>
-                    </a:xfrm>
-                    <a:prstGeom prst="rect">
-                      <a:avLst/>
-                    </a:prstGeom>
-                  </pic:spPr>
-                </pic:pic>
-              </a:graphicData>
-            </a:graphic>
-          </wp:inline>
-        </w:drawing>
-      </w:r>
-    </w:p>
-    <w:p/>
-    <w:p>
-      <w:pPr>
-        <w:spacing w:after="60" w:line="248" w:lineRule="auto"/>
-        <w:jc w:val="center"/>
-        <w:rPr>
-          <w:rFonts w:ascii="Times New Roman" w:hAnsi="Times New Roman" w:cs="Times New Roman"/>
-          <w:b/>
-          <w:color w:val="000000"/>
-        </w:rPr>
-      </w:pPr>
-      <w:r>
-        <w:rPr>
-          <w:rFonts w:ascii="Times New Roman" w:hAnsi="Times New Roman" w:cs="Times New Roman"/>
-          <w:b/>
-          <w:color w:val="000000"/>
-        </w:rPr>
-        <w:t>BỘ GIÁO DỤC VÀ ĐÀO TẠO</w:t>
-      </w:r>
-    </w:p>
-    <w:p>
-      <w:pPr>
-        <w:spacing w:after="60" w:line="248" w:lineRule="auto"/>
-        <w:jc w:val="center"/>
-        <w:rPr>
-          <w:rFonts w:ascii="Times New Roman" w:hAnsi="Times New Roman" w:cs="Times New Roman"/>
-          <w:b/>
-          <w:color w:val="000000"/>
-        </w:rPr>
-      </w:pPr>
-      <w:r>
-        <w:rPr>
-          <w:rFonts w:ascii="Times New Roman" w:hAnsi="Times New Roman" w:cs="Times New Roman"/>
-          <w:b/>
-          <w:color w:val="000000"/>
-        </w:rPr>
-        <w:t>TRƯỜNG ĐẠI HỌC NÔNG LÂM TP. HỒ CHÍ MINH</w:t>
-      </w:r>
-    </w:p>
-    <w:p>
-      <w:pPr>
-        <w:spacing w:after="120" w:line="248" w:lineRule="auto"/>
-        <w:jc w:val="center"/>
-        <w:rPr>
-          <w:rFonts w:ascii="Times New Roman" w:hAnsi="Times New Roman" w:cs="Times New Roman"/>
-          <w:b/>
-          <w:color w:val="000000"/>
-        </w:rPr>
-      </w:pPr>
-      <w:r>
-        <w:rPr>
-          <w:rFonts w:ascii="Times New Roman" w:hAnsi="Times New Roman" w:cs="Times New Roman"/>
-          <w:b/>
-          <w:color w:val="000000"/>
-        </w:rPr>
-        <w:t>KHOA CÔNG NGHỆ THÔNG TIN</w:t>
-      </w:r>
-    </w:p>
-    <w:p>
-      <w:pPr>
-        <w:spacing w:after="360" w:line="248" w:lineRule="auto"/>
-        <w:jc w:val="center"/>
-        <w:rPr>
-          <w:rFonts w:ascii="Times New Roman" w:hAnsi="Times New Roman" w:cs="Times New Roman"/>
-          <w:color w:val="000000"/>
-        </w:rPr>
-      </w:pPr>
-      <w:r>
-        <w:rPr>
-          <w:rFonts w:ascii="Times New Roman" w:hAnsi="Times New Roman" w:cs="Times New Roman"/>
-          <w:color w:val="000000"/>
-        </w:rPr>
-        <w:t>-----------------------------------</w:t>
-      </w:r>
-    </w:p>
-    <w:p>
-      <w:pPr>
-        <w:spacing w:before="240" w:after="80" w:line="248" w:lineRule="auto"/>
-        <w:jc w:val="center"/>
-        <w:rPr>
-          <w:rFonts w:ascii="Times New Roman" w:hAnsi="Times New Roman" w:cs="Times New Roman"/>
-          <w:b/>
-          <w:color w:val="000000"/>
-          <w:sz w:val="28"/>
-        </w:rPr>
-      </w:pPr>
-      <w:r>
-        <w:rPr>
-          <w:rFonts w:ascii="Times New Roman" w:hAnsi="Times New Roman" w:cs="Times New Roman"/>
-          <w:b/>
-          <w:color w:val="000000"/>
-          <w:sz w:val="28"/>
-        </w:rPr>
-        <w:t>BÁO CÁO ĐỒ ÁN MÔN HỌC</w:t>
-      </w:r>
-    </w:p>
-    <w:p>
-      <w:pPr>
-        <w:spacing w:after="360" w:line="248" w:lineRule="auto"/>
-        <w:jc w:val="center"/>
-        <w:rPr>
-          <w:rFonts w:ascii="Times New Roman" w:hAnsi="Times New Roman" w:cs="Times New Roman"/>
-          <w:b/>
-          <w:color w:val="000000"/>
-          <w:sz w:val="28"/>
-        </w:rPr>
-      </w:pPr>
-      <w:r>
-        <w:rPr>
-          <w:rFonts w:ascii="Times New Roman" w:hAnsi="Times New Roman" w:cs="Times New Roman"/>
-          <w:b/>
-          <w:color w:val="000000"/>
-          <w:sz w:val="28"/>
-        </w:rPr>
-        <w:t>LẬP TRÌNH TRÊN THIẾT BỊ DI ĐỘNG</w:t>
-      </w:r>
-    </w:p>
-    <w:p>
-      <w:pPr>
-        <w:spacing w:after="80" w:line="248" w:lineRule="auto"/>
-        <w:jc w:val="center"/>
-        <w:rPr>
-          <w:rFonts w:ascii="Times New Roman" w:hAnsi="Times New Roman" w:cs="Times New Roman"/>
-          <w:b/>
-          <w:color w:val="000000"/>
-        </w:rPr>
-      </w:pPr>
-      <w:r>
-        <w:rPr>
-          <w:rFonts w:ascii="Times New Roman" w:hAnsi="Times New Roman" w:cs="Times New Roman"/>
-          <w:b/>
-          <w:color w:val="000000"/>
-        </w:rPr>
-        <w:t>ĐỀ TÀI:</w:t>
-      </w:r>
-    </w:p>
-    <w:p>
-      <w:pPr>
-        <w:spacing w:after="80" w:line="248" w:lineRule="auto"/>
-        <w:jc w:val="center"/>
-        <w:rPr>
-          <w:rFonts w:ascii="Times New Roman" w:hAnsi="Times New Roman" w:cs="Times New Roman"/>
-          <w:b/>
-          <w:color w:val="000000"/>
-          <w:sz w:val="44"/>
-        </w:rPr>
-      </w:pPr>
-      <w:r>
-        <w:rPr>
-          <w:rFonts w:ascii="Times New Roman" w:hAnsi="Times New Roman" w:cs="Times New Roman"/>
-          <w:b/>
-          <w:color w:val="000000"/>
-          <w:sz w:val="44"/>
-        </w:rPr>
-        <w:t>NLU BANKING APP</w:t>
-      </w:r>
-    </w:p>
-    <w:p>
-      <w:pPr>
-        <w:spacing w:after="480" w:line="248" w:lineRule="auto"/>
-        <w:jc w:val="center"/>
-        <w:rPr>
-          <w:rFonts w:ascii="Times New Roman" w:hAnsi="Times New Roman" w:cs="Times New Roman"/>
-          <w:b/>
-          <w:color w:val="000000"/>
-        </w:rPr>
-      </w:pPr>
-      <w:r>
-        <w:rPr>
-          <w:rFonts w:ascii="Times New Roman" w:hAnsi="Times New Roman" w:cs="Times New Roman"/>
-          <w:b/>
-          <w:color w:val="000000"/>
-        </w:rPr>
-        <w:t>ỨNG DỤNG NGÂN HÀNG DI ĐỘNG MICROSERVICES TRÊN ANDROID</w:t>
-      </w:r>
-    </w:p>
-    <w:p>
-      <w:pPr>
-        <w:spacing w:after="80" w:line="248" w:lineRule="auto"/>
-        <w:jc w:val="center"/>
-        <w:rPr>
-          <w:rFonts w:ascii="Times New Roman" w:hAnsi="Times New Roman" w:cs="Times New Roman"/>
-          <w:i/>
-          <w:color w:val="000000"/>
-        </w:rPr>
-      </w:pPr>
-      <w:r>
-        <w:rPr>
-          <w:rFonts w:ascii="Times New Roman" w:hAnsi="Times New Roman" w:cs="Times New Roman"/>
-          <w:i/>
-          <w:color w:val="000000"/>
-        </w:rPr>
-        <w:t>Ngành: Công nghệ thông tin</w:t>
-      </w:r>
-    </w:p>
-    <w:p>
-      <w:pPr>
-        <w:spacing w:after="480" w:line="248" w:lineRule="auto"/>
-        <w:jc w:val="center"/>
-        <w:rPr>
-          <w:rFonts w:ascii="Times New Roman" w:hAnsi="Times New Roman" w:cs="Times New Roman"/>
-          <w:i/>
-          <w:color w:val="000000"/>
-        </w:rPr>
-      </w:pPr>
-      <w:r>
-        <w:rPr>
-          <w:rFonts w:ascii="Times New Roman" w:hAnsi="Times New Roman" w:cs="Times New Roman"/>
-          <w:i/>
-          <w:color w:val="000000"/>
-        </w:rPr>
-        <w:t>Niên khóa: 2023 - 2027</w:t>
-      </w:r>
-    </w:p>
     <w:tbl>
       <w:tblPr>
-        <w:tblW w:w="0" w:type="auto"/>
-        <w:tblLayout w:type="fixed"/>
-        <w:tblLook w:val="0000" w:firstRow="0" w:lastRow="0" w:firstColumn="0" w:lastColumn="0" w:noHBand="0" w:noVBand="0"/>
+        <w:tblStyle w:val="TableGrid"/>
+        <w:tblW w:w="9078" w:type="dxa"/>
+        <w:tblInd w:w="-52" w:type="dxa"/>
+        <w:tblCellMar>
+          <w:left w:w="347" w:type="dxa"/>
+          <w:bottom w:w="365" w:type="dxa"/>
+          <w:right w:w="234" w:type="dxa"/>
+        </w:tblCellMar>
+        <w:tblLook w:val="04A0" w:firstRow="1" w:lastRow="0" w:firstColumn="1" w:lastColumn="0" w:noHBand="0" w:noVBand="1"/>
       </w:tblPr>
       <w:tblGrid>
-        <w:gridCol w:w="3685"/>
-        <w:gridCol w:w="4819"/>
+        <w:gridCol w:w="9078"/>
       </w:tblGrid>
       <w:tr>
-        <w:tblPrEx>
-          <w:tblCellMar>
-            <w:top w:w="0" w:type="dxa"/>
-            <w:bottom w:w="0" w:type="dxa"/>
-          </w:tblCellMar>
-        </w:tblPrEx>
+        <w:trPr>
+          <w:trHeight w:val="14418"/>
+        </w:trPr>
         <w:tc>
           <w:tcPr>
-            <w:tcW w:w="3685" w:type="dxa"/>
+            <w:tcW w:w="9078" w:type="dxa"/>
+            <w:tcBorders>
+              <w:top w:val="double" w:sz="8" w:space="0" w:color="000000"/>
+              <w:left w:val="double" w:sz="8" w:space="0" w:color="000000"/>
+              <w:bottom w:val="double" w:sz="8" w:space="0" w:color="000000"/>
+              <w:right w:val="double" w:sz="8" w:space="0" w:color="000000"/>
+            </w:tcBorders>
+            <w:vAlign w:val="bottom"/>
           </w:tcPr>
           <w:p>
             <w:pPr>
-              <w:spacing w:after="480" w:line="248" w:lineRule="auto"/>
+              <w:spacing w:after="348" w:line="259" w:lineRule="auto"/>
+              <w:ind w:right="115"/>
               <w:jc w:val="center"/>
-              <w:rPr>
-                <w:rFonts w:ascii="Times New Roman" w:hAnsi="Times New Roman" w:cs="Times New Roman"/>
+            </w:pPr>
+            <w:r>
+              <w:rPr>
                 <w:b/>
-                <w:i/>
-                <w:color w:val="000000"/>
-              </w:rPr>
-            </w:pPr>
-            <w:r>
-              <w:rPr>
-                <w:rFonts w:ascii="Times New Roman" w:hAnsi="Times New Roman" w:cs="Times New Roman"/>
-                <w:b/>
-                <w:i/>
-                <w:color w:val="000000"/>
-              </w:rPr>
-              <w:t>GIẢNG VIÊN HƯỚNG DẪN:</w:t>
+              </w:rPr>
+              <w:t xml:space="preserve">BỘ GIÁO DỤC VÀ ĐÀO TẠO </w:t>
             </w:r>
           </w:p>
-        </w:tc>
-        <w:tc>
-          <w:tcPr>
-            <w:tcW w:w="4819" w:type="dxa"/>
-          </w:tcPr>
           <w:p>
             <w:pPr>
-              <w:spacing w:after="480" w:line="248" w:lineRule="auto"/>
-              <w:jc w:val="center"/>
-              <w:rPr>
-                <w:rFonts w:ascii="Times New Roman" w:hAnsi="Times New Roman" w:cs="Times New Roman"/>
+              <w:spacing w:after="147" w:line="259" w:lineRule="auto"/>
+            </w:pPr>
+            <w:r>
+              <w:rPr>
                 <w:b/>
-                <w:i/>
-                <w:color w:val="000000"/>
-              </w:rPr>
-            </w:pPr>
-            <w:r>
-              <w:rPr>
-                <w:rFonts w:ascii="Times New Roman" w:hAnsi="Times New Roman" w:cs="Times New Roman"/>
-                <w:b/>
-                <w:i/>
-                <w:color w:val="000000"/>
-              </w:rPr>
-              <w:t>Th.S Võ Tấn Toàn</w:t>
+                <w:sz w:val="44"/>
+              </w:rPr>
+              <w:t xml:space="preserve">TRƯỜNG ĐẠI HỌC NÔNG LÂM TP HCM </w:t>
             </w:r>
           </w:p>
-        </w:tc>
-      </w:tr>
-      <w:tr>
-        <w:tblPrEx>
-          <w:tblCellMar>
-            <w:top w:w="0" w:type="dxa"/>
-            <w:bottom w:w="0" w:type="dxa"/>
-          </w:tblCellMar>
-        </w:tblPrEx>
-        <w:tc>
-          <w:tcPr>
-            <w:tcW w:w="3685" w:type="dxa"/>
-          </w:tcPr>
           <w:p>
             <w:pPr>
-              <w:spacing w:after="480" w:line="248" w:lineRule="auto"/>
+              <w:spacing w:after="527" w:line="259" w:lineRule="auto"/>
+              <w:ind w:right="115"/>
               <w:jc w:val="center"/>
-              <w:rPr>
-                <w:rFonts w:ascii="Times New Roman" w:hAnsi="Times New Roman" w:cs="Times New Roman"/>
+            </w:pPr>
+            <w:r>
+              <w:rPr>
                 <w:b/>
-                <w:i/>
-                <w:color w:val="000000"/>
-              </w:rPr>
-            </w:pPr>
-            <w:r>
-              <w:rPr>
-                <w:rFonts w:ascii="Times New Roman" w:hAnsi="Times New Roman" w:cs="Times New Roman"/>
+              </w:rPr>
+              <w:t>KHOA CÔNG NGHỆ THÔNG TIN</w:t>
+            </w:r>
+            <w:r>
+              <w:rPr>
                 <w:b/>
-                <w:i/>
-                <w:color w:val="000000"/>
-              </w:rPr>
-              <w:t>SINH VIÊN THỰC HIỆN:</w:t>
+                <w:sz w:val="44"/>
+              </w:rPr>
+              <w:t xml:space="preserve"> </w:t>
             </w:r>
           </w:p>
-        </w:tc>
-        <w:tc>
-          <w:tcPr>
-            <w:tcW w:w="4819" w:type="dxa"/>
-          </w:tcPr>
           <w:p>
             <w:pPr>
-              <w:spacing w:after="480" w:line="248" w:lineRule="auto"/>
+              <w:spacing w:after="362" w:line="259" w:lineRule="auto"/>
+              <w:ind w:left="109"/>
               <w:jc w:val="center"/>
-              <w:rPr>
-                <w:rFonts w:ascii="Times New Roman" w:hAnsi="Times New Roman" w:cs="Times New Roman"/>
-                <w:i/>
-                <w:color w:val="000000"/>
-              </w:rPr>
             </w:pPr>
+            <w:r>
+              <w:rPr>
+                <w:noProof/>
+              </w:rPr>
+              <w:drawing>
+                <wp:inline distT="0" distB="0" distL="0" distR="0" wp14:anchorId="2641EAE9" wp14:editId="49DDA597">
+                  <wp:extent cx="1440180" cy="1440180"/>
+                  <wp:effectExtent l="0" t="0" r="0" b="0"/>
+                  <wp:docPr id="134" name="Picture 134"/>
+                  <wp:cNvGraphicFramePr/>
+                  <a:graphic xmlns:a="http://schemas.openxmlformats.org/drawingml/2006/main">
+                    <a:graphicData uri="http://schemas.openxmlformats.org/drawingml/2006/picture">
+                      <pic:pic xmlns:pic="http://schemas.openxmlformats.org/drawingml/2006/picture">
+                        <pic:nvPicPr>
+                          <pic:cNvPr id="134" name="Picture 134"/>
+                          <pic:cNvPicPr/>
+                        </pic:nvPicPr>
+                        <pic:blipFill>
+                          <a:blip r:embed="rId4"/>
+                          <a:stretch>
+                            <a:fillRect/>
+                          </a:stretch>
+                        </pic:blipFill>
+                        <pic:spPr>
+                          <a:xfrm>
+                            <a:off x="0" y="0"/>
+                            <a:ext cx="1440180" cy="1440180"/>
+                          </a:xfrm>
+                          <a:prstGeom prst="rect">
+                            <a:avLst/>
+                          </a:prstGeom>
+                        </pic:spPr>
+                      </pic:pic>
+                    </a:graphicData>
+                  </a:graphic>
+                </wp:inline>
+              </w:drawing>
+            </w:r>
+            <w:r>
+              <w:rPr>
+                <w:b/>
+                <w:sz w:val="32"/>
+              </w:rPr>
+              <w:t xml:space="preserve"> </w:t>
+            </w:r>
           </w:p>
-        </w:tc>
-      </w:tr>
-      <w:tr>
-        <w:tblPrEx>
-          <w:tblCellMar>
-            <w:top w:w="0" w:type="dxa"/>
-            <w:bottom w:w="0" w:type="dxa"/>
-          </w:tblCellMar>
-        </w:tblPrEx>
-        <w:tc>
-          <w:tcPr>
-            <w:tcW w:w="3685" w:type="dxa"/>
-          </w:tcPr>
           <w:p>
             <w:pPr>
-              <w:spacing w:after="480" w:line="248" w:lineRule="auto"/>
+              <w:spacing w:after="904" w:line="259" w:lineRule="auto"/>
+              <w:ind w:right="115"/>
               <w:jc w:val="center"/>
-              <w:rPr>
-                <w:rFonts w:ascii="Times New Roman" w:hAnsi="Times New Roman" w:cs="Times New Roman"/>
-                <w:i/>
-                <w:color w:val="000000"/>
-              </w:rPr>
             </w:pPr>
             <w:r>
               <w:rPr>
-                <w:rFonts w:ascii="Times New Roman" w:hAnsi="Times New Roman" w:cs="Times New Roman"/>
-                <w:i/>
-                <w:color w:val="000000"/>
-              </w:rPr>
-              <w:t xml:space="preserve">  1. Lê Văn Tính</w:t>
+                <w:b/>
+              </w:rPr>
+              <w:t>LẬP TRÌNH TRÊN THIẾT BỊ DI ĐỘNG</w:t>
+            </w:r>
+            <w:r>
+              <w:rPr>
+                <w:b/>
+                <w:sz w:val="16"/>
+              </w:rPr>
+              <w:t xml:space="preserve"> </w:t>
             </w:r>
           </w:p>
-        </w:tc>
-        <w:tc>
-          <w:tcPr>
-            <w:tcW w:w="4819" w:type="dxa"/>
-          </w:tcPr>
           <w:p>
             <w:pPr>
-              <w:spacing w:after="480" w:line="248" w:lineRule="auto"/>
+              <w:spacing w:after="659" w:line="259" w:lineRule="auto"/>
+              <w:ind w:right="115"/>
               <w:jc w:val="center"/>
-              <w:rPr>
-                <w:rFonts w:ascii="Times New Roman" w:hAnsi="Times New Roman" w:cs="Times New Roman"/>
-                <w:i/>
-                <w:color w:val="000000"/>
-              </w:rPr>
             </w:pPr>
             <w:r>
               <w:rPr>
-                <w:rFonts w:ascii="Times New Roman" w:hAnsi="Times New Roman" w:cs="Times New Roman"/>
-                <w:i/>
-                <w:color w:val="000000"/>
-              </w:rPr>
-              <w:t>23130334 (Nhóm trưởng)</w:t>
+                <w:b/>
+                <w:sz w:val="56"/>
+              </w:rPr>
+              <w:t>ĐỒ ÁN NLU BANKING APP</w:t>
+            </w:r>
+            <w:r>
+              <w:rPr>
+                <w:b/>
+              </w:rPr>
+              <w:t xml:space="preserve"> </w:t>
             </w:r>
           </w:p>
-        </w:tc>
-      </w:tr>
-      <w:tr>
-        <w:tblPrEx>
-          <w:tblCellMar>
-            <w:top w:w="0" w:type="dxa"/>
-            <w:bottom w:w="0" w:type="dxa"/>
-          </w:tblCellMar>
-        </w:tblPrEx>
-        <w:tc>
-          <w:tcPr>
-            <w:tcW w:w="3685" w:type="dxa"/>
-          </w:tcPr>
           <w:p>
             <w:pPr>
-              <w:spacing w:after="480" w:line="248" w:lineRule="auto"/>
-              <w:jc w:val="center"/>
-              <w:rPr>
-                <w:rFonts w:ascii="Times New Roman" w:hAnsi="Times New Roman" w:cs="Times New Roman"/>
-                <w:i/>
-                <w:color w:val="000000"/>
-              </w:rPr>
+              <w:tabs>
+                <w:tab w:val="center" w:pos="1358"/>
+                <w:tab w:val="center" w:pos="5876"/>
+              </w:tabs>
+              <w:spacing w:after="226" w:line="259" w:lineRule="auto"/>
             </w:pPr>
             <w:r>
               <w:rPr>
-                <w:rFonts w:ascii="Times New Roman" w:hAnsi="Times New Roman" w:cs="Times New Roman"/>
-                <w:i/>
-                <w:color w:val="000000"/>
-              </w:rPr>
-              <w:t xml:space="preserve">  2. Trần Hoàng Quân</w:t>
+                <w:rFonts w:ascii="Calibri" w:eastAsia="Calibri" w:hAnsi="Calibri" w:cs="Calibri"/>
+                <w:sz w:val="22"/>
+              </w:rPr>
+              <w:tab/>
+            </w:r>
+            <w:r>
+              <w:rPr>
+                <w:b/>
+                <w:sz w:val="28"/>
+              </w:rPr>
+              <w:t xml:space="preserve">Ngành </w:t>
+            </w:r>
+            <w:r>
+              <w:rPr>
+                <w:b/>
+                <w:sz w:val="28"/>
+              </w:rPr>
+              <w:tab/>
+              <w:t xml:space="preserve">: </w:t>
+            </w:r>
+            <w:r>
+              <w:rPr>
+                <w:sz w:val="28"/>
+              </w:rPr>
+              <w:t xml:space="preserve">Công nghệ thông tin </w:t>
             </w:r>
           </w:p>
-        </w:tc>
-        <w:tc>
-          <w:tcPr>
-            <w:tcW w:w="4819" w:type="dxa"/>
-          </w:tcPr>
           <w:p>
             <w:pPr>
-              <w:spacing w:after="480" w:line="248" w:lineRule="auto"/>
-              <w:jc w:val="center"/>
-              <w:rPr>
-                <w:rFonts w:ascii="Times New Roman" w:hAnsi="Times New Roman" w:cs="Times New Roman"/>
-                <w:i/>
-                <w:color w:val="000000"/>
-              </w:rPr>
+              <w:tabs>
+                <w:tab w:val="center" w:pos="1571"/>
+                <w:tab w:val="center" w:pos="5337"/>
+              </w:tabs>
+              <w:spacing w:after="191" w:line="259" w:lineRule="auto"/>
             </w:pPr>
             <w:r>
               <w:rPr>
-                <w:rFonts w:ascii="Times New Roman" w:hAnsi="Times New Roman" w:cs="Times New Roman"/>
-                <w:i/>
-                <w:color w:val="000000"/>
-              </w:rPr>
-              <w:t>23130258</w:t>
+                <w:rFonts w:ascii="Calibri" w:eastAsia="Calibri" w:hAnsi="Calibri" w:cs="Calibri"/>
+                <w:sz w:val="22"/>
+              </w:rPr>
+              <w:tab/>
+            </w:r>
+            <w:r>
+              <w:rPr>
+                <w:b/>
+                <w:sz w:val="28"/>
+              </w:rPr>
+              <w:t xml:space="preserve">Niên khoá </w:t>
+            </w:r>
+            <w:r>
+              <w:rPr>
+                <w:b/>
+                <w:sz w:val="28"/>
+              </w:rPr>
+              <w:tab/>
+              <w:t xml:space="preserve">: </w:t>
+            </w:r>
+            <w:r>
+              <w:rPr>
+                <w:sz w:val="28"/>
+              </w:rPr>
+              <w:t>2023-2027</w:t>
+            </w:r>
+            <w:r>
+              <w:rPr>
+                <w:b/>
+                <w:sz w:val="28"/>
+              </w:rPr>
+              <w:t xml:space="preserve"> </w:t>
             </w:r>
           </w:p>
-        </w:tc>
-      </w:tr>
-      <w:tr>
-        <w:tblPrEx>
-          <w:tblCellMar>
-            <w:top w:w="0" w:type="dxa"/>
-            <w:bottom w:w="0" w:type="dxa"/>
-          </w:tblCellMar>
-        </w:tblPrEx>
-        <w:tc>
-          <w:tcPr>
-            <w:tcW w:w="3685" w:type="dxa"/>
-          </w:tcPr>
           <w:p>
             <w:pPr>
-              <w:spacing w:after="480" w:line="248" w:lineRule="auto"/>
-              <w:jc w:val="center"/>
-              <w:rPr>
-                <w:rFonts w:ascii="Times New Roman" w:hAnsi="Times New Roman" w:cs="Times New Roman"/>
-                <w:i/>
-                <w:color w:val="000000"/>
-              </w:rPr>
+              <w:spacing w:after="39" w:line="393" w:lineRule="auto"/>
+              <w:ind w:left="960" w:right="889"/>
             </w:pPr>
             <w:r>
               <w:rPr>
-                <w:rFonts w:ascii="Times New Roman" w:hAnsi="Times New Roman" w:cs="Times New Roman"/>
-                <w:i/>
-                <w:color w:val="000000"/>
-              </w:rPr>
-              <w:t xml:space="preserve">  3. Nguyễn Văn Anh Hàn</w:t>
+                <w:b/>
+                <w:sz w:val="28"/>
+              </w:rPr>
+              <w:t xml:space="preserve">Giảng viên hướng dẫn : Th.S Võ Tấn Toàn Sinh viên thực hiện :  </w:t>
             </w:r>
           </w:p>
-        </w:tc>
-        <w:tc>
-          <w:tcPr>
-            <w:tcW w:w="4819" w:type="dxa"/>
-          </w:tcPr>
           <w:p>
             <w:pPr>
-              <w:spacing w:after="480" w:line="248" w:lineRule="auto"/>
-              <w:jc w:val="center"/>
-              <w:rPr>
-                <w:rFonts w:ascii="Times New Roman" w:hAnsi="Times New Roman" w:cs="Times New Roman"/>
-                <w:i/>
-                <w:color w:val="000000"/>
-              </w:rPr>
+              <w:tabs>
+                <w:tab w:val="center" w:pos="2615"/>
+                <w:tab w:val="center" w:pos="6060"/>
+              </w:tabs>
+              <w:spacing w:after="228" w:line="259" w:lineRule="auto"/>
             </w:pPr>
             <w:r>
               <w:rPr>
-                <w:rFonts w:ascii="Times New Roman" w:hAnsi="Times New Roman" w:cs="Times New Roman"/>
-                <w:i/>
-                <w:color w:val="000000"/>
-              </w:rPr>
-              <w:t>23130087</w:t>
+                <w:rFonts w:ascii="Calibri" w:eastAsia="Calibri" w:hAnsi="Calibri" w:cs="Calibri"/>
+                <w:sz w:val="22"/>
+              </w:rPr>
+              <w:tab/>
+            </w:r>
+            <w:r>
+              <w:rPr>
+                <w:b/>
+                <w:sz w:val="28"/>
+              </w:rPr>
+              <w:t>Lê Văn Tính</w:t>
+            </w:r>
+            <w:r>
+              <w:rPr>
+                <w:b/>
+                <w:sz w:val="28"/>
+              </w:rPr>
+              <w:t xml:space="preserve"> </w:t>
+            </w:r>
+            <w:r>
+              <w:rPr>
+                <w:b/>
+                <w:sz w:val="28"/>
+              </w:rPr>
+              <w:tab/>
+            </w:r>
+            <w:r>
+              <w:rPr>
+                <w:b/>
+                <w:sz w:val="28"/>
+              </w:rPr>
+              <w:t>23130334 (Nhóm trưởng)</w:t>
+            </w:r>
+            <w:r>
+              <w:rPr>
+                <w:b/>
+                <w:sz w:val="28"/>
+              </w:rPr>
+              <w:t xml:space="preserve"> </w:t>
             </w:r>
           </w:p>
-        </w:tc>
-      </w:tr>
-      <w:tr>
-        <w:tblPrEx>
-          <w:tblCellMar>
-            <w:top w:w="0" w:type="dxa"/>
-            <w:bottom w:w="0" w:type="dxa"/>
-          </w:tblCellMar>
-        </w:tblPrEx>
-        <w:tc>
-          <w:tcPr>
-            <w:tcW w:w="3685" w:type="dxa"/>
-          </w:tcPr>
           <w:p>
             <w:pPr>
-              <w:spacing w:after="480" w:line="248" w:lineRule="auto"/>
-              <w:jc w:val="center"/>
-              <w:rPr>
-                <w:rFonts w:ascii="Times New Roman" w:hAnsi="Times New Roman" w:cs="Times New Roman"/>
-                <w:i/>
-                <w:color w:val="000000"/>
-              </w:rPr>
+              <w:tabs>
+                <w:tab w:val="center" w:pos="2902"/>
+                <w:tab w:val="center" w:pos="6060"/>
+              </w:tabs>
+              <w:spacing w:after="228" w:line="259" w:lineRule="auto"/>
             </w:pPr>
             <w:r>
               <w:rPr>
-                <w:rFonts w:ascii="Times New Roman" w:hAnsi="Times New Roman" w:cs="Times New Roman"/>
-                <w:i/>
-                <w:color w:val="000000"/>
-              </w:rPr>
-              <w:t xml:space="preserve">  4. Phan Nguyễn Minh Thắng</w:t>
+                <w:rFonts w:ascii="Calibri" w:eastAsia="Calibri" w:hAnsi="Calibri" w:cs="Calibri"/>
+                <w:sz w:val="22"/>
+              </w:rPr>
+              <w:tab/>
+            </w:r>
+            <w:r>
+              <w:rPr>
+                <w:b/>
+                <w:sz w:val="28"/>
+              </w:rPr>
+              <w:t>Trần Hoàng Quân</w:t>
+            </w:r>
+            <w:r>
+              <w:rPr>
+                <w:b/>
+                <w:sz w:val="28"/>
+              </w:rPr>
+              <w:t xml:space="preserve"> </w:t>
+            </w:r>
+            <w:r>
+              <w:rPr>
+                <w:b/>
+                <w:sz w:val="28"/>
+              </w:rPr>
+              <w:tab/>
+            </w:r>
+            <w:r>
+              <w:rPr>
+                <w:b/>
+                <w:sz w:val="28"/>
+              </w:rPr>
+              <w:t>23130258</w:t>
+            </w:r>
+            <w:r>
+              <w:rPr>
+                <w:b/>
+                <w:sz w:val="28"/>
+              </w:rPr>
+              <w:t xml:space="preserve"> </w:t>
             </w:r>
           </w:p>
-        </w:tc>
-        <w:tc>
-          <w:tcPr>
-            <w:tcW w:w="4819" w:type="dxa"/>
-          </w:tcPr>
           <w:p>
             <w:pPr>
-              <w:spacing w:after="480" w:line="248" w:lineRule="auto"/>
+              <w:tabs>
+                <w:tab w:val="center" w:pos="2008"/>
+                <w:tab w:val="center" w:pos="6060"/>
+              </w:tabs>
+              <w:spacing w:after="228" w:line="259" w:lineRule="auto"/>
+            </w:pPr>
+            <w:r>
+              <w:rPr>
+                <w:rFonts w:ascii="Calibri" w:eastAsia="Calibri" w:hAnsi="Calibri" w:cs="Calibri"/>
+                <w:sz w:val="22"/>
+              </w:rPr>
+              <w:tab/>
+            </w:r>
+            <w:r>
+              <w:rPr>
+                <w:b/>
+                <w:sz w:val="28"/>
+              </w:rPr>
+              <w:t xml:space="preserve">Võ Sinh </w:t>
+            </w:r>
+            <w:r>
+              <w:rPr>
+                <w:b/>
+                <w:sz w:val="28"/>
+              </w:rPr>
+              <w:tab/>
+            </w:r>
+            <w:r>
+              <w:rPr>
+                <w:b/>
+                <w:sz w:val="28"/>
+              </w:rPr>
+              <w:t>23130087</w:t>
+            </w:r>
+            <w:r>
+              <w:rPr>
+                <w:b/>
+                <w:sz w:val="28"/>
+              </w:rPr>
+              <w:t xml:space="preserve"> </w:t>
+            </w:r>
+          </w:p>
+          <w:p>
+            <w:pPr>
+              <w:tabs>
+                <w:tab w:val="center" w:pos="2604"/>
+                <w:tab w:val="center" w:pos="6060"/>
+              </w:tabs>
+              <w:spacing w:after="228" w:line="259" w:lineRule="auto"/>
+            </w:pPr>
+            <w:r>
+              <w:rPr>
+                <w:rFonts w:ascii="Calibri" w:eastAsia="Calibri" w:hAnsi="Calibri" w:cs="Calibri"/>
+                <w:sz w:val="22"/>
+              </w:rPr>
+              <w:tab/>
+            </w:r>
+            <w:r>
+              <w:rPr>
+                <w:b/>
+                <w:sz w:val="28"/>
+              </w:rPr>
+              <w:t>Phan Nguyễn Minh Thắng</w:t>
+            </w:r>
+            <w:r>
+              <w:rPr>
+                <w:b/>
+                <w:sz w:val="28"/>
+              </w:rPr>
+              <w:t xml:space="preserve"> </w:t>
+            </w:r>
+            <w:r>
+              <w:rPr>
+                <w:b/>
+                <w:sz w:val="28"/>
+              </w:rPr>
+              <w:tab/>
+            </w:r>
+            <w:r>
+              <w:rPr>
+                <w:b/>
+                <w:sz w:val="28"/>
+              </w:rPr>
+              <w:t>23130300</w:t>
+            </w:r>
+            <w:r>
+              <w:rPr>
+                <w:b/>
+                <w:sz w:val="28"/>
+              </w:rPr>
+              <w:t xml:space="preserve"> </w:t>
+            </w:r>
+          </w:p>
+          <w:p>
+            <w:pPr>
+              <w:tabs>
+                <w:tab w:val="center" w:pos="2508"/>
+                <w:tab w:val="center" w:pos="6060"/>
+              </w:tabs>
+              <w:spacing w:after="900" w:line="259" w:lineRule="auto"/>
+            </w:pPr>
+            <w:r>
+              <w:rPr>
+                <w:rFonts w:ascii="Calibri" w:eastAsia="Calibri" w:hAnsi="Calibri" w:cs="Calibri"/>
+                <w:sz w:val="22"/>
+              </w:rPr>
+              <w:lastRenderedPageBreak/>
+              <w:tab/>
+            </w:r>
+            <w:r>
+              <w:rPr>
+                <w:b/>
+                <w:sz w:val="28"/>
+              </w:rPr>
+              <w:t xml:space="preserve">Phan Ngọc Vĩnh </w:t>
+            </w:r>
+            <w:r>
+              <w:rPr>
+                <w:b/>
+                <w:sz w:val="28"/>
+              </w:rPr>
+              <w:tab/>
+              <w:t xml:space="preserve"> </w:t>
+            </w:r>
+          </w:p>
+          <w:p>
+            <w:pPr>
+              <w:spacing w:line="259" w:lineRule="auto"/>
+              <w:ind w:right="109"/>
               <w:jc w:val="center"/>
-              <w:rPr>
-                <w:rFonts w:ascii="Times New Roman" w:hAnsi="Times New Roman" w:cs="Times New Roman"/>
-                <w:i/>
-                <w:color w:val="000000"/>
-              </w:rPr>
             </w:pPr>
             <w:r>
               <w:rPr>
-                <w:rFonts w:ascii="Times New Roman" w:hAnsi="Times New Roman" w:cs="Times New Roman"/>
-                <w:i/>
-                <w:color w:val="000000"/>
-              </w:rPr>
-              <w:t>23130300</w:t>
+                <w:sz w:val="30"/>
+              </w:rPr>
+              <w:t>TP.HỒ CHÍ MINH, tháng 4 năm 2026</w:t>
+            </w:r>
+            <w:r>
+              <w:rPr>
+                <w:sz w:val="32"/>
+              </w:rPr>
+              <w:t xml:space="preserve"> </w:t>
             </w:r>
           </w:p>
         </w:tc>
       </w:tr>
     </w:tbl>
-    <w:p>
-      <w:pPr>
-        <w:spacing w:before="680" w:after="480" w:line="248" w:lineRule="auto"/>
-        <w:jc w:val="center"/>
-        <w:rPr>
-          <w:rFonts w:ascii="Times New Roman" w:hAnsi="Times New Roman" w:cs="Times New Roman"/>
-          <w:b/>
-          <w:i/>
-          <w:color w:val="000000"/>
-          <w:sz w:val="22"/>
-        </w:rPr>
-      </w:pPr>
-      <w:r>
-        <w:rPr>
-          <w:rFonts w:ascii="Times New Roman" w:hAnsi="Times New Roman" w:cs="Times New Roman"/>
-          <w:b/>
-          <w:i/>
-          <w:color w:val="000000"/>
-          <w:sz w:val="22"/>
-        </w:rPr>
-        <w:lastRenderedPageBreak/>
-        <w:t>TP. HỒ CHÍ MINH, THÁNG 7 NĂM 2026</w:t>
-      </w:r>
-    </w:p>
-    <w:p>
-      <w:pPr>
-        <w:rPr>
-          <w:rFonts w:ascii="Times New Roman" w:hAnsi="Times New Roman" w:cs="Times New Roman"/>
-          <w:b/>
-          <w:i/>
-          <w:color w:val="000000"/>
-          <w:sz w:val="22"/>
-        </w:rPr>
-      </w:pPr>
-      <w:r>
-        <w:rPr>
-          <w:rFonts w:ascii="Times New Roman" w:hAnsi="Times New Roman" w:cs="Times New Roman"/>
-          <w:b/>
-          <w:i/>
-          <w:color w:val="000000"/>
-          <w:sz w:val="22"/>
-        </w:rPr>
+    <w:p/>
+    <w:p>
+      <w:r>
         <w:br w:type="page"/>
       </w:r>
     </w:p>
@@ -741,7 +605,7 @@
         <w:rPr>
           <w:noProof/>
         </w:rPr>
-        <w:instrText xml:space="preserve"> PAGEREF _Toc233880806 \h </w:instrText>
+        <w:instrText xml:space="preserve"> PAGEREF _Toc233881034 \h </w:instrText>
       </w:r>
       <w:r>
         <w:rPr>
@@ -758,7 +622,7 @@
         <w:rPr>
           <w:noProof/>
         </w:rPr>
-        <w:t>4</w:t>
+        <w:t>5</w:t>
       </w:r>
       <w:r>
         <w:rPr>
@@ -803,7 +667,7 @@
         <w:rPr>
           <w:noProof/>
         </w:rPr>
-        <w:instrText xml:space="preserve"> PAGEREF _Toc233880807 \h </w:instrText>
+        <w:instrText xml:space="preserve"> PAGEREF _Toc233881035 \h </w:instrText>
       </w:r>
       <w:r>
         <w:rPr>
@@ -820,7 +684,7 @@
         <w:rPr>
           <w:noProof/>
         </w:rPr>
-        <w:t>4</w:t>
+        <w:t>5</w:t>
       </w:r>
       <w:r>
         <w:rPr>
@@ -865,7 +729,7 @@
         <w:rPr>
           <w:noProof/>
         </w:rPr>
-        <w:instrText xml:space="preserve"> PAGEREF _Toc233880808 \h </w:instrText>
+        <w:instrText xml:space="preserve"> PAGEREF _Toc233881036 \h </w:instrText>
       </w:r>
       <w:r>
         <w:rPr>
@@ -882,7 +746,7 @@
         <w:rPr>
           <w:noProof/>
         </w:rPr>
-        <w:t>4</w:t>
+        <w:t>5</w:t>
       </w:r>
       <w:r>
         <w:rPr>
@@ -927,7 +791,7 @@
         <w:rPr>
           <w:noProof/>
         </w:rPr>
-        <w:instrText xml:space="preserve"> PAGEREF _Toc233880809 \h </w:instrText>
+        <w:instrText xml:space="preserve"> PAGEREF _Toc233881037 \h </w:instrText>
       </w:r>
       <w:r>
         <w:rPr>
@@ -944,7 +808,7 @@
         <w:rPr>
           <w:noProof/>
         </w:rPr>
-        <w:t>4</w:t>
+        <w:t>5</w:t>
       </w:r>
       <w:r>
         <w:rPr>
@@ -989,7 +853,7 @@
         <w:rPr>
           <w:noProof/>
         </w:rPr>
-        <w:instrText xml:space="preserve"> PAGEREF _Toc233880810 \h </w:instrText>
+        <w:instrText xml:space="preserve"> PAGEREF _Toc233881038 \h </w:instrText>
       </w:r>
       <w:r>
         <w:rPr>
@@ -1006,7 +870,7 @@
         <w:rPr>
           <w:noProof/>
         </w:rPr>
-        <w:t>5</w:t>
+        <w:t>6</w:t>
       </w:r>
       <w:r>
         <w:rPr>
@@ -1051,7 +915,7 @@
         <w:rPr>
           <w:noProof/>
         </w:rPr>
-        <w:instrText xml:space="preserve"> PAGEREF _Toc233880811 \h </w:instrText>
+        <w:instrText xml:space="preserve"> PAGEREF _Toc233881039 \h </w:instrText>
       </w:r>
       <w:r>
         <w:rPr>
@@ -1068,7 +932,7 @@
         <w:rPr>
           <w:noProof/>
         </w:rPr>
-        <w:t>5</w:t>
+        <w:t>6</w:t>
       </w:r>
       <w:r>
         <w:rPr>
@@ -1113,7 +977,7 @@
         <w:rPr>
           <w:noProof/>
         </w:rPr>
-        <w:instrText xml:space="preserve"> PAGEREF _Toc233880812 \h </w:instrText>
+        <w:instrText xml:space="preserve"> PAGEREF _Toc233881040 \h </w:instrText>
       </w:r>
       <w:r>
         <w:rPr>
@@ -1130,7 +994,7 @@
         <w:rPr>
           <w:noProof/>
         </w:rPr>
-        <w:t>5</w:t>
+        <w:t>6</w:t>
       </w:r>
       <w:r>
         <w:rPr>
@@ -1175,7 +1039,7 @@
         <w:rPr>
           <w:noProof/>
         </w:rPr>
-        <w:instrText xml:space="preserve"> PAGEREF _Toc233880813 \h </w:instrText>
+        <w:instrText xml:space="preserve"> PAGEREF _Toc233881041 \h </w:instrText>
       </w:r>
       <w:r>
         <w:rPr>
@@ -1192,7 +1056,7 @@
         <w:rPr>
           <w:noProof/>
         </w:rPr>
-        <w:t>5</w:t>
+        <w:t>6</w:t>
       </w:r>
       <w:r>
         <w:rPr>
@@ -1237,7 +1101,7 @@
         <w:rPr>
           <w:noProof/>
         </w:rPr>
-        <w:instrText xml:space="preserve"> PAGEREF _Toc233880814 \h </w:instrText>
+        <w:instrText xml:space="preserve"> PAGEREF _Toc233881042 \h </w:instrText>
       </w:r>
       <w:r>
         <w:rPr>
@@ -1254,7 +1118,7 @@
         <w:rPr>
           <w:noProof/>
         </w:rPr>
-        <w:t>5</w:t>
+        <w:t>6</w:t>
       </w:r>
       <w:r>
         <w:rPr>
@@ -1299,7 +1163,7 @@
         <w:rPr>
           <w:noProof/>
         </w:rPr>
-        <w:instrText xml:space="preserve"> PAGEREF _Toc233880815 \h </w:instrText>
+        <w:instrText xml:space="preserve"> PAGEREF _Toc233881043 \h </w:instrText>
       </w:r>
       <w:r>
         <w:rPr>
@@ -1316,7 +1180,7 @@
         <w:rPr>
           <w:noProof/>
         </w:rPr>
-        <w:t>6</w:t>
+        <w:t>7</w:t>
       </w:r>
       <w:r>
         <w:rPr>
@@ -1361,7 +1225,7 @@
         <w:rPr>
           <w:noProof/>
         </w:rPr>
-        <w:instrText xml:space="preserve"> PAGEREF _Toc233880816 \h </w:instrText>
+        <w:instrText xml:space="preserve"> PAGEREF _Toc233881044 \h </w:instrText>
       </w:r>
       <w:r>
         <w:rPr>
@@ -1378,7 +1242,7 @@
         <w:rPr>
           <w:noProof/>
         </w:rPr>
-        <w:t>6</w:t>
+        <w:t>7</w:t>
       </w:r>
       <w:r>
         <w:rPr>
@@ -1423,7 +1287,7 @@
         <w:rPr>
           <w:noProof/>
         </w:rPr>
-        <w:instrText xml:space="preserve"> PAGEREF _Toc233880817 \h </w:instrText>
+        <w:instrText xml:space="preserve"> PAGEREF _Toc233881045 \h </w:instrText>
       </w:r>
       <w:r>
         <w:rPr>
@@ -1440,7 +1304,7 @@
         <w:rPr>
           <w:noProof/>
         </w:rPr>
-        <w:t>6</w:t>
+        <w:t>7</w:t>
       </w:r>
       <w:r>
         <w:rPr>
@@ -1485,7 +1349,7 @@
         <w:rPr>
           <w:noProof/>
         </w:rPr>
-        <w:instrText xml:space="preserve"> PAGEREF _Toc233880818 \h </w:instrText>
+        <w:instrText xml:space="preserve"> PAGEREF _Toc233881046 \h </w:instrText>
       </w:r>
       <w:r>
         <w:rPr>
@@ -1502,7 +1366,7 @@
         <w:rPr>
           <w:noProof/>
         </w:rPr>
-        <w:t>7</w:t>
+        <w:t>8</w:t>
       </w:r>
       <w:r>
         <w:rPr>
@@ -1529,7 +1393,7 @@
           <w:noProof/>
           <w:color w:val="000000"/>
         </w:rPr>
-        <w:t>CHƯƠNG 4. THÀNH TỰU VÀ CÔNG NGHỆ ÁP DỤNG TRONG DỰ ÁN</w:t>
+        <w:t>CHƯƠNG 4. THIẾT KẾ HỆ THỐNG VÀ CƠ SỞ DỮ LIỆU</w:t>
       </w:r>
       <w:r>
         <w:rPr>
@@ -1547,7 +1411,7 @@
         <w:rPr>
           <w:noProof/>
         </w:rPr>
-        <w:instrText xml:space="preserve"> PAGEREF _Toc233880819 \h </w:instrText>
+        <w:instrText xml:space="preserve"> PAGEREF _Toc233881047 \h </w:instrText>
       </w:r>
       <w:r>
         <w:rPr>
@@ -1564,7 +1428,7 @@
         <w:rPr>
           <w:noProof/>
         </w:rPr>
-        <w:t>7</w:t>
+        <w:t>8</w:t>
       </w:r>
       <w:r>
         <w:rPr>
@@ -1591,7 +1455,7 @@
           <w:noProof/>
           <w:color w:val="000000"/>
         </w:rPr>
-        <w:t>4.1. Thành tựu tự hào về kiến trúc API và Spring Boot</w:t>
+        <w:t>4.1. Thiết kế cơ sở dữ liệu hệ thống (Database Schema Design)</w:t>
       </w:r>
       <w:r>
         <w:rPr>
@@ -1609,7 +1473,7 @@
         <w:rPr>
           <w:noProof/>
         </w:rPr>
-        <w:instrText xml:space="preserve"> PAGEREF _Toc233880820 \h </w:instrText>
+        <w:instrText xml:space="preserve"> PAGEREF _Toc233881048 \h </w:instrText>
       </w:r>
       <w:r>
         <w:rPr>
@@ -1626,7 +1490,7 @@
         <w:rPr>
           <w:noProof/>
         </w:rPr>
-        <w:t>7</w:t>
+        <w:t>8</w:t>
       </w:r>
       <w:r>
         <w:rPr>
@@ -1653,7 +1517,7 @@
           <w:noProof/>
           <w:color w:val="000000"/>
         </w:rPr>
-        <w:t>4.2. Tối ưu hóa hiệu năng giao tiếp và đồng bộ dữ liệu</w:t>
+        <w:t>4.2. Kiến trúc giao tiếp và sơ đồ tuần tự (Sequence Diagrams)</w:t>
       </w:r>
       <w:r>
         <w:rPr>
@@ -1671,7 +1535,7 @@
         <w:rPr>
           <w:noProof/>
         </w:rPr>
-        <w:instrText xml:space="preserve"> PAGEREF _Toc233880821 \h </w:instrText>
+        <w:instrText xml:space="preserve"> PAGEREF _Toc233881049 \h </w:instrText>
       </w:r>
       <w:r>
         <w:rPr>
@@ -1688,7 +1552,7 @@
         <w:rPr>
           <w:noProof/>
         </w:rPr>
-        <w:t>7</w:t>
+        <w:t>8</w:t>
       </w:r>
       <w:r>
         <w:rPr>
@@ -1733,7 +1597,7 @@
         <w:rPr>
           <w:noProof/>
         </w:rPr>
-        <w:instrText xml:space="preserve"> PAGEREF _Toc233880822 \h </w:instrText>
+        <w:instrText xml:space="preserve"> PAGEREF _Toc233881050 \h </w:instrText>
       </w:r>
       <w:r>
         <w:rPr>
@@ -1750,7 +1614,7 @@
         <w:rPr>
           <w:noProof/>
         </w:rPr>
-        <w:t>7</w:t>
+        <w:t>8</w:t>
       </w:r>
       <w:r>
         <w:rPr>
@@ -1795,7 +1659,7 @@
         <w:rPr>
           <w:noProof/>
         </w:rPr>
-        <w:instrText xml:space="preserve"> PAGEREF _Toc233880823 \h </w:instrText>
+        <w:instrText xml:space="preserve"> PAGEREF _Toc233881051 \h </w:instrText>
       </w:r>
       <w:r>
         <w:rPr>
@@ -1812,7 +1676,7 @@
         <w:rPr>
           <w:noProof/>
         </w:rPr>
-        <w:t>7</w:t>
+        <w:t>8</w:t>
       </w:r>
       <w:r>
         <w:rPr>
@@ -1857,7 +1721,7 @@
         <w:rPr>
           <w:noProof/>
         </w:rPr>
-        <w:instrText xml:space="preserve"> PAGEREF _Toc233880824 \h </w:instrText>
+        <w:instrText xml:space="preserve"> PAGEREF _Toc233881052 \h </w:instrText>
       </w:r>
       <w:r>
         <w:rPr>
@@ -1874,7 +1738,7 @@
         <w:rPr>
           <w:noProof/>
         </w:rPr>
-        <w:t>8</w:t>
+        <w:t>9</w:t>
       </w:r>
       <w:r>
         <w:rPr>
@@ -1919,7 +1783,7 @@
         <w:rPr>
           <w:noProof/>
         </w:rPr>
-        <w:instrText xml:space="preserve"> PAGEREF _Toc233880825 \h </w:instrText>
+        <w:instrText xml:space="preserve"> PAGEREF _Toc233881053 \h </w:instrText>
       </w:r>
       <w:r>
         <w:rPr>
@@ -1936,7 +1800,7 @@
         <w:rPr>
           <w:noProof/>
         </w:rPr>
-        <w:t>8</w:t>
+        <w:t>9</w:t>
       </w:r>
       <w:r>
         <w:rPr>
@@ -1981,7 +1845,7 @@
         <w:rPr>
           <w:noProof/>
         </w:rPr>
-        <w:instrText xml:space="preserve"> PAGEREF _Toc233880826 \h </w:instrText>
+        <w:instrText xml:space="preserve"> PAGEREF _Toc233881054 \h </w:instrText>
       </w:r>
       <w:r>
         <w:rPr>
@@ -1998,7 +1862,7 @@
         <w:rPr>
           <w:noProof/>
         </w:rPr>
-        <w:t>8</w:t>
+        <w:t>9</w:t>
       </w:r>
       <w:r>
         <w:rPr>
@@ -2043,7 +1907,7 @@
         <w:rPr>
           <w:noProof/>
         </w:rPr>
-        <w:instrText xml:space="preserve"> PAGEREF _Toc233880827 \h </w:instrText>
+        <w:instrText xml:space="preserve"> PAGEREF _Toc233881055 \h </w:instrText>
       </w:r>
       <w:r>
         <w:rPr>
@@ -2060,7 +1924,7 @@
         <w:rPr>
           <w:noProof/>
         </w:rPr>
-        <w:t>8</w:t>
+        <w:t>9</w:t>
       </w:r>
       <w:r>
         <w:rPr>
@@ -2105,7 +1969,7 @@
         <w:rPr>
           <w:noProof/>
         </w:rPr>
-        <w:instrText xml:space="preserve"> PAGEREF _Toc233880828 \h </w:instrText>
+        <w:instrText xml:space="preserve"> PAGEREF _Toc233881056 \h </w:instrText>
       </w:r>
       <w:r>
         <w:rPr>
@@ -2122,7 +1986,7 @@
         <w:rPr>
           <w:noProof/>
         </w:rPr>
-        <w:t>8</w:t>
+        <w:t>9</w:t>
       </w:r>
       <w:r>
         <w:rPr>
@@ -2182,7 +2046,7 @@
           <w:sz w:val="32"/>
         </w:rPr>
       </w:pPr>
-      <w:bookmarkStart w:id="0" w:name="_Toc233880806"/>
+      <w:bookmarkStart w:id="0" w:name="_Toc233881034"/>
       <w:r>
         <w:rPr>
           <w:rFonts w:ascii="Times New Roman" w:hAnsi="Times New Roman" w:cs="Times New Roman"/>
@@ -2206,7 +2070,7 @@
           <w:sz w:val="28"/>
         </w:rPr>
       </w:pPr>
-      <w:bookmarkStart w:id="1" w:name="_Toc233880807"/>
+      <w:bookmarkStart w:id="1" w:name="_Toc233881035"/>
       <w:r>
         <w:rPr>
           <w:rFonts w:ascii="Times New Roman" w:hAnsi="Times New Roman" w:cs="Times New Roman"/>
@@ -2248,7 +2112,7 @@
           <w:sz w:val="28"/>
         </w:rPr>
       </w:pPr>
-      <w:bookmarkStart w:id="2" w:name="_Toc233880808"/>
+      <w:bookmarkStart w:id="2" w:name="_Toc233881036"/>
       <w:r>
         <w:rPr>
           <w:rFonts w:ascii="Times New Roman" w:hAnsi="Times New Roman" w:cs="Times New Roman"/>
@@ -2290,7 +2154,7 @@
           <w:sz w:val="28"/>
         </w:rPr>
       </w:pPr>
-      <w:bookmarkStart w:id="3" w:name="_Toc233880809"/>
+      <w:bookmarkStart w:id="3" w:name="_Toc233881037"/>
       <w:r>
         <w:rPr>
           <w:rFonts w:ascii="Times New Roman" w:hAnsi="Times New Roman" w:cs="Times New Roman"/>
@@ -2466,7 +2330,7 @@
           <w:sz w:val="28"/>
         </w:rPr>
       </w:pPr>
-      <w:bookmarkStart w:id="4" w:name="_Toc233880810"/>
+      <w:bookmarkStart w:id="4" w:name="_Toc233881038"/>
       <w:r>
         <w:rPr>
           <w:rFonts w:ascii="Times New Roman" w:hAnsi="Times New Roman" w:cs="Times New Roman"/>
@@ -2489,7 +2353,7 @@
           <w:sz w:val="26"/>
         </w:rPr>
       </w:pPr>
-      <w:bookmarkStart w:id="5" w:name="_Toc233880811"/>
+      <w:bookmarkStart w:id="5" w:name="_Toc233881039"/>
       <w:r>
         <w:rPr>
           <w:rFonts w:ascii="Times New Roman" w:hAnsi="Times New Roman" w:cs="Times New Roman"/>
@@ -2531,7 +2395,7 @@
           <w:sz w:val="26"/>
         </w:rPr>
       </w:pPr>
-      <w:bookmarkStart w:id="6" w:name="_Toc233880812"/>
+      <w:bookmarkStart w:id="6" w:name="_Toc233881040"/>
       <w:r>
         <w:rPr>
           <w:rFonts w:ascii="Times New Roman" w:hAnsi="Times New Roman" w:cs="Times New Roman"/>
@@ -2573,7 +2437,7 @@
           <w:sz w:val="32"/>
         </w:rPr>
       </w:pPr>
-      <w:bookmarkStart w:id="7" w:name="_Toc233880813"/>
+      <w:bookmarkStart w:id="7" w:name="_Toc233881041"/>
       <w:r>
         <w:rPr>
           <w:rFonts w:ascii="Times New Roman" w:hAnsi="Times New Roman" w:cs="Times New Roman"/>
@@ -2596,7 +2460,7 @@
           <w:sz w:val="28"/>
         </w:rPr>
       </w:pPr>
-      <w:bookmarkStart w:id="8" w:name="_Toc233880814"/>
+      <w:bookmarkStart w:id="8" w:name="_Toc233881042"/>
       <w:r>
         <w:rPr>
           <w:rFonts w:ascii="Times New Roman" w:hAnsi="Times New Roman" w:cs="Times New Roman"/>
@@ -2695,7 +2559,7 @@
           <w:sz w:val="28"/>
         </w:rPr>
       </w:pPr>
-      <w:bookmarkStart w:id="9" w:name="_Toc233880815"/>
+      <w:bookmarkStart w:id="9" w:name="_Toc233881043"/>
       <w:r>
         <w:rPr>
           <w:rFonts w:ascii="Times New Roman" w:hAnsi="Times New Roman" w:cs="Times New Roman"/>
@@ -2814,7 +2678,7 @@
           <w:sz w:val="32"/>
         </w:rPr>
       </w:pPr>
-      <w:bookmarkStart w:id="10" w:name="_Toc233880816"/>
+      <w:bookmarkStart w:id="10" w:name="_Toc233881044"/>
       <w:r>
         <w:rPr>
           <w:rFonts w:ascii="Times New Roman" w:hAnsi="Times New Roman" w:cs="Times New Roman"/>
@@ -2837,7 +2701,7 @@
           <w:sz w:val="28"/>
         </w:rPr>
       </w:pPr>
-      <w:bookmarkStart w:id="11" w:name="_Toc233880817"/>
+      <w:bookmarkStart w:id="11" w:name="_Toc233881045"/>
       <w:r>
         <w:rPr>
           <w:rFonts w:ascii="Times New Roman" w:hAnsi="Times New Roman" w:cs="Times New Roman"/>
@@ -3013,7 +2877,7 @@
           <w:sz w:val="28"/>
         </w:rPr>
       </w:pPr>
-      <w:bookmarkStart w:id="12" w:name="_Toc233880818"/>
+      <w:bookmarkStart w:id="12" w:name="_Toc233881046"/>
       <w:r>
         <w:rPr>
           <w:rFonts w:ascii="Times New Roman" w:hAnsi="Times New Roman" w:cs="Times New Roman"/>
@@ -3041,7 +2905,7 @@
           <w:color w:val="000000"/>
           <w:sz w:val="26"/>
         </w:rPr>
-        <w:t>Dự án tích hợp máy chủ định danh Keycloak để quản lý bảo mật tập trung cho toàn hệ thống. Khi khách hàng đăng nhập thành công, Keycloak trả về mã Access Token dạng JWT. API Gateway sẽ giải mã chữ ký công khai để kiểm tra tính hợp lệ của token trước khi cho phép yêu cầu đi sâu vào hệ thống backend. Đồng thời, User-Service sử dụng Keycloak Admin Client để tự động đồng bộ tài khoản định danh lên Keycloak ngay khi khách hàng xác nhận OTP kích hoạt tài khoản thành công.</w:t>
+        <w:t>Dự án tích hợp máy chủ định danh Keycloak để quản lý bảo mật tập trung cho toàn hệ thống. Khi khách hàng đăng nhập thành công, Keycloak trả về mã Access Token dạng JWT. API Gateway sẽ giải mã chữ ký token qua Keycloak. Nếu token hợp lệ, Gateway định tuyến yêu cầu đến dịch vụ nghiệp vụ tương ứng (ví dụ: Fund-Transfer-Service). Đồng thời, User-Service sử dụng Keycloak Admin Client để tự động đồng bộ tài khoản định danh lên Keycloak ngay khi khách hàng xác nhận OTP kích hoạt tài khoản thành công.</w:t>
       </w:r>
     </w:p>
     <w:p>
@@ -3055,7 +2919,7 @@
           <w:sz w:val="32"/>
         </w:rPr>
       </w:pPr>
-      <w:bookmarkStart w:id="13" w:name="_Toc233880819"/>
+      <w:bookmarkStart w:id="13" w:name="_Toc233881047"/>
       <w:r>
         <w:rPr>
           <w:rFonts w:ascii="Times New Roman" w:hAnsi="Times New Roman" w:cs="Times New Roman"/>
@@ -3063,7 +2927,7 @@
           <w:color w:val="000000"/>
           <w:sz w:val="32"/>
         </w:rPr>
-        <w:t>CHƯƠNG 4. THÀNH TỰU VÀ CÔNG NGHỆ ÁP DỤNG TRONG DỰ ÁN</w:t>
+        <w:t>CHƯƠNG 4. THIẾT KẾ HỆ THỐNG VÀ CƠ SỞ DỮ LIỆU</w:t>
       </w:r>
       <w:bookmarkEnd w:id="13"/>
     </w:p>
@@ -3078,7 +2942,7 @@
           <w:sz w:val="28"/>
         </w:rPr>
       </w:pPr>
-      <w:bookmarkStart w:id="14" w:name="_Toc233880820"/>
+      <w:bookmarkStart w:id="14" w:name="_Toc233881048"/>
       <w:r>
         <w:rPr>
           <w:rFonts w:ascii="Times New Roman" w:hAnsi="Times New Roman" w:cs="Times New Roman"/>
@@ -3086,7 +2950,7 @@
           <w:color w:val="000000"/>
           <w:sz w:val="28"/>
         </w:rPr>
-        <w:t>4.1. Thành tựu tự hào về kiến trúc API và Spring Boot</w:t>
+        <w:t>4.1. Thiết kế cơ sở dữ liệu hệ thống (Database Schema Design)</w:t>
       </w:r>
       <w:bookmarkEnd w:id="14"/>
     </w:p>
@@ -3106,7 +2970,7 @@
           <w:color w:val="000000"/>
           <w:sz w:val="26"/>
         </w:rPr>
-        <w:t>Một trong những thành tựu tự hào lớn nhất của dự án là việc thiết kế và vận hành thành công kiến trúc backend Multi-service phân tán hiện đại dựa trên nền tảng Spring Boot. Nhóm đã làm chủ kỹ thuật xây dựng và tối ưu các RESTful API sạch (Clean Restful APIs), định dạng dữ liệu DTO đồng nhất và điều hướng động qua API Gateway. Việc phát triển các service tách biệt giúp giảm thiểu tối đa tính liên đới, nâng cao hiệu năng chịu tải khi chạy đồng thời nhiều luồng giao dịch.</w:t>
+        <w:t>Hệ thống áp dụng mô hình kiến trúc độc lập cơ sở dữ liệu cho từng microservice (Database per Service) để bảo toàn tính đóng gói. Cơ sở dữ liệu quan hệ MySQL được thiết kế chặt chẽ: (1) Bảng 'accounts' trong Account-Service lưu trữ các trường: số tài khoản, số dư khả dụng, mã CIF, trạng thái tài khoản. (2) Bảng 'transactions' trong Transaction-Service lưu lịch sử nạp/rút tiền. (3) Bảng 'transfers' trong Fund-Transfer-Service ghi nhận lịch sử chuyển khoản nội bộ gồm: mã giao dịch, tài khoản gửi, tài khoản nhận, số tiền, nội dung, thời gian và trạng thái xác thực. Các bảng đều được tối ưu hóa chỉ mục (index) giúp tăng tốc độ truy vấn giao dịch.</w:t>
       </w:r>
     </w:p>
     <w:p>
@@ -3120,7 +2984,7 @@
           <w:sz w:val="28"/>
         </w:rPr>
       </w:pPr>
-      <w:bookmarkStart w:id="15" w:name="_Toc233880821"/>
+      <w:bookmarkStart w:id="15" w:name="_Toc233881049"/>
       <w:r>
         <w:rPr>
           <w:rFonts w:ascii="Times New Roman" w:hAnsi="Times New Roman" w:cs="Times New Roman"/>
@@ -3128,7 +2992,7 @@
           <w:color w:val="000000"/>
           <w:sz w:val="28"/>
         </w:rPr>
-        <w:t>4.2. Tối ưu hóa hiệu năng giao tiếp và đồng bộ dữ liệu</w:t>
+        <w:t>4.2. Kiến trúc giao tiếp và sơ đồ tuần tự (Sequence Diagrams)</w:t>
       </w:r>
       <w:bookmarkEnd w:id="15"/>
     </w:p>
@@ -3148,7 +3012,7 @@
           <w:color w:val="000000"/>
           <w:sz w:val="26"/>
         </w:rPr>
-        <w:t>Dự án đã áp dụng thành công mô hình 'Database per Service' để bảo toàn tính độc lập dữ liệu, sử dụng Spring Data JPA kết hợp Hibernate để tương tác tối ưu với cơ sở dữ liệu MySQL. Mặc dù dữ liệu bị phân tách chéo giữa các microservice, hệ thống vẫn duy trì hoàn hảo tính nhất quán số dư tài khoản của khách hàng gửi và nhận thông qua các ràng buộc nghiệp vụ ở tầng ứng dụng và cơ chế kiểm soát lỗi giao dịch tài chính chặt chẽ.</w:t>
+        <w:t>Tiến trình giao tiếp giữa Android Client và các microservices được mô tả chi tiết thông qua sơ đồ tuần tự: (1) Android Client gửi yêu cầu API kèm theo Access Token dạng JWT trong Header đến API Gateway. (2) API Gateway giải mã chữ ký token qua Keycloak. Nếu token hợp lệ, Gateway định tuyến yêu cầu đến dịch vụ nghiệp vụ tương ứng (ví dụ: Fund-Transfer-Service). (3) Dịch vụ nghiệp vụ gọi giao tiếp liên dịch vụ (Inter-service Communication) sang Account-Service để cập nhật số dư của tài khoản gửi và nhận, đảm bảo giao dịch được thực hiện đồng nhất và an toàn.</w:t>
       </w:r>
     </w:p>
     <w:p>
@@ -3162,7 +3026,7 @@
           <w:sz w:val="32"/>
         </w:rPr>
       </w:pPr>
-      <w:bookmarkStart w:id="16" w:name="_Toc233880822"/>
+      <w:bookmarkStart w:id="16" w:name="_Toc233881050"/>
       <w:r>
         <w:rPr>
           <w:rFonts w:ascii="Times New Roman" w:hAnsi="Times New Roman" w:cs="Times New Roman"/>
@@ -3185,7 +3049,7 @@
           <w:sz w:val="28"/>
         </w:rPr>
       </w:pPr>
-      <w:bookmarkStart w:id="17" w:name="_Toc233880823"/>
+      <w:bookmarkStart w:id="17" w:name="_Toc233881051"/>
       <w:r>
         <w:rPr>
           <w:rFonts w:ascii="Times New Roman" w:hAnsi="Times New Roman" w:cs="Times New Roman"/>
@@ -3213,7 +3077,16 @@
           <w:color w:val="000000"/>
           <w:sz w:val="26"/>
         </w:rPr>
-        <w:t>Để triển khai đồ án, máy tính thử nghiệm cần cài đặt sẵn Docker, Docker Compose, Git, Java JDK 11 hoặc JDK 17 và Android Studio. Bước đầu tiên, dẫn đến thư mục chứa file 'docker-compose.yml' và chạy lệnh: 'docker-compose up -d' để khởi động MySQL Container (Port 3306) và Keycloak Container (Port 8571) chạy ngầm dưới nền hệ thống.</w:t>
+        <w:t xml:space="preserve">Để triển khai đồ án, máy tính thử nghiệm cần cài đặt sẵn Docker, Docker Compose, Git, Java JDK 11 hoặc JDK 17 và Android Studio. Bước đầu tiên, dẫn đến thư mục chứa file </w:t>
+      </w:r>
+      <w:r>
+        <w:rPr>
+          <w:rFonts w:ascii="Times New Roman" w:hAnsi="Times New Roman" w:cs="Times New Roman"/>
+          <w:color w:val="000000"/>
+          <w:sz w:val="26"/>
+        </w:rPr>
+        <w:lastRenderedPageBreak/>
+        <w:t>'docker-compose.yml' và chạy lệnh: 'docker-compose up -d' để khởi động MySQL Container (Port 3306) và Keycloak Container (Port 8571) chạy ngầm dưới nền hệ thống.</w:t>
       </w:r>
     </w:p>
     <w:p>
@@ -3227,7 +3100,7 @@
           <w:sz w:val="28"/>
         </w:rPr>
       </w:pPr>
-      <w:bookmarkStart w:id="18" w:name="_Toc233880824"/>
+      <w:bookmarkStart w:id="18" w:name="_Toc233881052"/>
       <w:r>
         <w:rPr>
           <w:rFonts w:ascii="Times New Roman" w:hAnsi="Times New Roman" w:cs="Times New Roman"/>
@@ -3235,7 +3108,6 @@
           <w:color w:val="000000"/>
           <w:sz w:val="28"/>
         </w:rPr>
-        <w:lastRenderedPageBreak/>
         <w:t>5.2. Các bước cấu hình Keycloak Realm và Client</w:t>
       </w:r>
       <w:bookmarkEnd w:id="18"/>
@@ -3270,7 +3142,7 @@
           <w:sz w:val="28"/>
         </w:rPr>
       </w:pPr>
-      <w:bookmarkStart w:id="19" w:name="_Toc233880825"/>
+      <w:bookmarkStart w:id="19" w:name="_Toc233881053"/>
       <w:r>
         <w:rPr>
           <w:rFonts w:ascii="Times New Roman" w:hAnsi="Times New Roman" w:cs="Times New Roman"/>
@@ -3312,7 +3184,7 @@
           <w:sz w:val="32"/>
         </w:rPr>
       </w:pPr>
-      <w:bookmarkStart w:id="20" w:name="_Toc233880826"/>
+      <w:bookmarkStart w:id="20" w:name="_Toc233881054"/>
       <w:r>
         <w:rPr>
           <w:rFonts w:ascii="Times New Roman" w:hAnsi="Times New Roman" w:cs="Times New Roman"/>
@@ -3335,7 +3207,7 @@
           <w:sz w:val="28"/>
         </w:rPr>
       </w:pPr>
-      <w:bookmarkStart w:id="21" w:name="_Toc233880827"/>
+      <w:bookmarkStart w:id="21" w:name="_Toc233881055"/>
       <w:r>
         <w:rPr>
           <w:rFonts w:ascii="Times New Roman" w:hAnsi="Times New Roman" w:cs="Times New Roman"/>
@@ -3377,7 +3249,7 @@
           <w:sz w:val="28"/>
         </w:rPr>
       </w:pPr>
-      <w:bookmarkStart w:id="22" w:name="_Toc233880828"/>
+      <w:bookmarkStart w:id="22" w:name="_Toc233881056"/>
       <w:r>
         <w:rPr>
           <w:rFonts w:ascii="Times New Roman" w:hAnsi="Times New Roman" w:cs="Times New Roman"/>
@@ -3422,12 +3294,6 @@
     <w:sectPr>
       <w:pgSz w:w="12240" w:h="15840"/>
       <w:pgMar w:top="1417" w:right="1134" w:bottom="1417" w:left="1701" w:header="720" w:footer="720" w:gutter="0"/>
-      <w:pgBorders w:display="firstPage" w:offsetFrom="page">
-        <w:top w:val="single" w:sz="8" w:space="24" w:color="000000"/>
-        <w:left w:val="single" w:sz="8" w:space="24" w:color="000000"/>
-        <w:bottom w:val="single" w:sz="8" w:space="24" w:color="000000"/>
-        <w:right w:val="single" w:sz="8" w:space="24" w:color="000000"/>
-      </w:pgBorders>
       <w:cols w:space="720"/>
       <w:docGrid w:linePitch="360"/>
     </w:sectPr>
@@ -3843,7 +3709,7 @@
     <w:link w:val="Heading1Char"/>
     <w:uiPriority w:val="9"/>
     <w:qFormat/>
-    <w:rsid w:val="00FC057C"/>
+    <w:rsid w:val="001007F4"/>
     <w:pPr>
       <w:keepNext/>
       <w:keepLines/>
@@ -3865,7 +3731,7 @@
     <w:uiPriority w:val="9"/>
     <w:unhideWhenUsed/>
     <w:qFormat/>
-    <w:rsid w:val="00FC057C"/>
+    <w:rsid w:val="001007F4"/>
     <w:pPr>
       <w:keepNext/>
       <w:keepLines/>
@@ -3887,7 +3753,7 @@
     <w:uiPriority w:val="9"/>
     <w:unhideWhenUsed/>
     <w:qFormat/>
-    <w:rsid w:val="00FC057C"/>
+    <w:rsid w:val="001007F4"/>
     <w:pPr>
       <w:keepNext/>
       <w:keepLines/>
@@ -3910,7 +3776,7 @@
     <w:semiHidden/>
     <w:unhideWhenUsed/>
     <w:qFormat/>
-    <w:rsid w:val="00FC057C"/>
+    <w:rsid w:val="001007F4"/>
     <w:pPr>
       <w:keepNext/>
       <w:keepLines/>
@@ -3933,7 +3799,7 @@
     <w:semiHidden/>
     <w:unhideWhenUsed/>
     <w:qFormat/>
-    <w:rsid w:val="00FC057C"/>
+    <w:rsid w:val="001007F4"/>
     <w:pPr>
       <w:keepNext/>
       <w:keepLines/>
@@ -3954,7 +3820,7 @@
     <w:semiHidden/>
     <w:unhideWhenUsed/>
     <w:qFormat/>
-    <w:rsid w:val="00FC057C"/>
+    <w:rsid w:val="001007F4"/>
     <w:pPr>
       <w:keepNext/>
       <w:keepLines/>
@@ -3977,7 +3843,7 @@
     <w:semiHidden/>
     <w:unhideWhenUsed/>
     <w:qFormat/>
-    <w:rsid w:val="00FC057C"/>
+    <w:rsid w:val="001007F4"/>
     <w:pPr>
       <w:keepNext/>
       <w:keepLines/>
@@ -3998,7 +3864,7 @@
     <w:semiHidden/>
     <w:unhideWhenUsed/>
     <w:qFormat/>
-    <w:rsid w:val="00FC057C"/>
+    <w:rsid w:val="001007F4"/>
     <w:pPr>
       <w:keepNext/>
       <w:keepLines/>
@@ -4021,7 +3887,7 @@
     <w:semiHidden/>
     <w:unhideWhenUsed/>
     <w:qFormat/>
-    <w:rsid w:val="00FC057C"/>
+    <w:rsid w:val="001007F4"/>
     <w:pPr>
       <w:keepNext/>
       <w:keepLines/>
@@ -4065,7 +3931,7 @@
     <w:basedOn w:val="DefaultParagraphFont"/>
     <w:link w:val="Heading1"/>
     <w:uiPriority w:val="9"/>
-    <w:rsid w:val="00FC057C"/>
+    <w:rsid w:val="001007F4"/>
     <w:rPr>
       <w:rFonts w:asciiTheme="majorHAnsi" w:eastAsiaTheme="majorEastAsia" w:hAnsiTheme="majorHAnsi" w:cstheme="majorBidi"/>
       <w:color w:val="0F4761" w:themeColor="accent1" w:themeShade="BF"/>
@@ -4078,7 +3944,7 @@
     <w:basedOn w:val="DefaultParagraphFont"/>
     <w:link w:val="Heading2"/>
     <w:uiPriority w:val="9"/>
-    <w:rsid w:val="00FC057C"/>
+    <w:rsid w:val="001007F4"/>
     <w:rPr>
       <w:rFonts w:asciiTheme="majorHAnsi" w:eastAsiaTheme="majorEastAsia" w:hAnsiTheme="majorHAnsi" w:cstheme="majorBidi"/>
       <w:color w:val="0F4761" w:themeColor="accent1" w:themeShade="BF"/>
@@ -4091,7 +3957,7 @@
     <w:basedOn w:val="DefaultParagraphFont"/>
     <w:link w:val="Heading3"/>
     <w:uiPriority w:val="9"/>
-    <w:rsid w:val="00FC057C"/>
+    <w:rsid w:val="001007F4"/>
     <w:rPr>
       <w:rFonts w:eastAsiaTheme="majorEastAsia" w:cstheme="majorBidi"/>
       <w:color w:val="0F4761" w:themeColor="accent1" w:themeShade="BF"/>
@@ -4105,7 +3971,7 @@
     <w:link w:val="Heading4"/>
     <w:uiPriority w:val="9"/>
     <w:semiHidden/>
-    <w:rsid w:val="00FC057C"/>
+    <w:rsid w:val="001007F4"/>
     <w:rPr>
       <w:rFonts w:eastAsiaTheme="majorEastAsia" w:cstheme="majorBidi"/>
       <w:i/>
@@ -4119,7 +3985,7 @@
     <w:link w:val="Heading5"/>
     <w:uiPriority w:val="9"/>
     <w:semiHidden/>
-    <w:rsid w:val="00FC057C"/>
+    <w:rsid w:val="001007F4"/>
     <w:rPr>
       <w:rFonts w:eastAsiaTheme="majorEastAsia" w:cstheme="majorBidi"/>
       <w:color w:val="0F4761" w:themeColor="accent1" w:themeShade="BF"/>
@@ -4131,7 +3997,7 @@
     <w:link w:val="Heading6"/>
     <w:uiPriority w:val="9"/>
     <w:semiHidden/>
-    <w:rsid w:val="00FC057C"/>
+    <w:rsid w:val="001007F4"/>
     <w:rPr>
       <w:rFonts w:eastAsiaTheme="majorEastAsia" w:cstheme="majorBidi"/>
       <w:i/>
@@ -4145,7 +4011,7 @@
     <w:link w:val="Heading7"/>
     <w:uiPriority w:val="9"/>
     <w:semiHidden/>
-    <w:rsid w:val="00FC057C"/>
+    <w:rsid w:val="001007F4"/>
     <w:rPr>
       <w:rFonts w:eastAsiaTheme="majorEastAsia" w:cstheme="majorBidi"/>
       <w:color w:val="595959" w:themeColor="text1" w:themeTint="A6"/>
@@ -4157,7 +4023,7 @@
     <w:link w:val="Heading8"/>
     <w:uiPriority w:val="9"/>
     <w:semiHidden/>
-    <w:rsid w:val="00FC057C"/>
+    <w:rsid w:val="001007F4"/>
     <w:rPr>
       <w:rFonts w:eastAsiaTheme="majorEastAsia" w:cstheme="majorBidi"/>
       <w:i/>
@@ -4171,7 +4037,7 @@
     <w:link w:val="Heading9"/>
     <w:uiPriority w:val="9"/>
     <w:semiHidden/>
-    <w:rsid w:val="00FC057C"/>
+    <w:rsid w:val="001007F4"/>
     <w:rPr>
       <w:rFonts w:eastAsiaTheme="majorEastAsia" w:cstheme="majorBidi"/>
       <w:color w:val="272727" w:themeColor="text1" w:themeTint="D8"/>
@@ -4184,7 +4050,7 @@
     <w:link w:val="TitleChar"/>
     <w:uiPriority w:val="10"/>
     <w:qFormat/>
-    <w:rsid w:val="00FC057C"/>
+    <w:rsid w:val="001007F4"/>
     <w:pPr>
       <w:spacing w:after="80" w:line="240" w:lineRule="auto"/>
       <w:contextualSpacing/>
@@ -4202,7 +4068,7 @@
     <w:basedOn w:val="DefaultParagraphFont"/>
     <w:link w:val="Title"/>
     <w:uiPriority w:val="10"/>
-    <w:rsid w:val="00FC057C"/>
+    <w:rsid w:val="001007F4"/>
     <w:rPr>
       <w:rFonts w:asciiTheme="majorHAnsi" w:eastAsiaTheme="majorEastAsia" w:hAnsiTheme="majorHAnsi" w:cstheme="majorBidi"/>
       <w:spacing w:val="-10"/>
@@ -4218,7 +4084,7 @@
     <w:link w:val="SubtitleChar"/>
     <w:uiPriority w:val="11"/>
     <w:qFormat/>
-    <w:rsid w:val="00FC057C"/>
+    <w:rsid w:val="001007F4"/>
     <w:pPr>
       <w:numPr>
         <w:ilvl w:val="1"/>
@@ -4237,7 +4103,7 @@
     <w:basedOn w:val="DefaultParagraphFont"/>
     <w:link w:val="Subtitle"/>
     <w:uiPriority w:val="11"/>
-    <w:rsid w:val="00FC057C"/>
+    <w:rsid w:val="001007F4"/>
     <w:rPr>
       <w:rFonts w:eastAsiaTheme="majorEastAsia" w:cstheme="majorBidi"/>
       <w:color w:val="595959" w:themeColor="text1" w:themeTint="A6"/>
@@ -4253,7 +4119,7 @@
     <w:link w:val="QuoteChar"/>
     <w:uiPriority w:val="29"/>
     <w:qFormat/>
-    <w:rsid w:val="00FC057C"/>
+    <w:rsid w:val="001007F4"/>
     <w:pPr>
       <w:spacing w:before="160"/>
       <w:jc w:val="center"/>
@@ -4269,7 +4135,7 @@
     <w:basedOn w:val="DefaultParagraphFont"/>
     <w:link w:val="Quote"/>
     <w:uiPriority w:val="29"/>
-    <w:rsid w:val="00FC057C"/>
+    <w:rsid w:val="001007F4"/>
     <w:rPr>
       <w:i/>
       <w:iCs/>
@@ -4281,7 +4147,7 @@
     <w:basedOn w:val="Normal"/>
     <w:uiPriority w:val="34"/>
     <w:qFormat/>
-    <w:rsid w:val="00FC057C"/>
+    <w:rsid w:val="001007F4"/>
     <w:pPr>
       <w:ind w:left="720"/>
       <w:contextualSpacing/>
@@ -4292,7 +4158,7 @@
     <w:basedOn w:val="DefaultParagraphFont"/>
     <w:uiPriority w:val="21"/>
     <w:qFormat/>
-    <w:rsid w:val="00FC057C"/>
+    <w:rsid w:val="001007F4"/>
     <w:rPr>
       <w:i/>
       <w:iCs/>
@@ -4306,7 +4172,7 @@
     <w:link w:val="IntenseQuoteChar"/>
     <w:uiPriority w:val="30"/>
     <w:qFormat/>
-    <w:rsid w:val="00FC057C"/>
+    <w:rsid w:val="001007F4"/>
     <w:pPr>
       <w:pBdr>
         <w:top w:val="single" w:sz="4" w:space="10" w:color="0F4761" w:themeColor="accent1" w:themeShade="BF"/>
@@ -4327,7 +4193,7 @@
     <w:basedOn w:val="DefaultParagraphFont"/>
     <w:link w:val="IntenseQuote"/>
     <w:uiPriority w:val="30"/>
-    <w:rsid w:val="00FC057C"/>
+    <w:rsid w:val="001007F4"/>
     <w:rPr>
       <w:i/>
       <w:iCs/>
@@ -4339,7 +4205,7 @@
     <w:basedOn w:val="DefaultParagraphFont"/>
     <w:uiPriority w:val="32"/>
     <w:qFormat/>
-    <w:rsid w:val="00FC057C"/>
+    <w:rsid w:val="001007F4"/>
     <w:rPr>
       <w:b/>
       <w:bCs/>
@@ -4348,6 +4214,24 @@
       <w:spacing w:val="5"/>
     </w:rPr>
   </w:style>
+  <w:style w:type="table" w:customStyle="1" w:styleId="TableGrid">
+    <w:name w:val="TableGrid"/>
+    <w:rsid w:val="001007F4"/>
+    <w:pPr>
+      <w:spacing w:after="0" w:line="240" w:lineRule="auto"/>
+    </w:pPr>
+    <w:rPr>
+      <w:rFonts w:eastAsiaTheme="minorEastAsia"/>
+    </w:rPr>
+    <w:tblPr>
+      <w:tblCellMar>
+        <w:top w:w="0" w:type="dxa"/>
+        <w:left w:w="0" w:type="dxa"/>
+        <w:bottom w:w="0" w:type="dxa"/>
+        <w:right w:w="0" w:type="dxa"/>
+      </w:tblCellMar>
+    </w:tblPr>
+  </w:style>
   <w:style w:type="paragraph" w:styleId="TOC1">
     <w:name w:val="toc 1"/>
     <w:basedOn w:val="Normal"/>
@@ -4355,7 +4239,7 @@
     <w:autoRedefine/>
     <w:uiPriority w:val="39"/>
     <w:unhideWhenUsed/>
-    <w:rsid w:val="00FC057C"/>
+    <w:rsid w:val="001007F4"/>
     <w:pPr>
       <w:spacing w:after="100"/>
     </w:pPr>
@@ -4367,7 +4251,7 @@
     <w:autoRedefine/>
     <w:uiPriority w:val="39"/>
     <w:unhideWhenUsed/>
-    <w:rsid w:val="00FC057C"/>
+    <w:rsid w:val="001007F4"/>
     <w:pPr>
       <w:spacing w:after="100"/>
       <w:ind w:left="240"/>
@@ -4380,7 +4264,7 @@
     <w:autoRedefine/>
     <w:uiPriority w:val="39"/>
     <w:unhideWhenUsed/>
-    <w:rsid w:val="00FC057C"/>
+    <w:rsid w:val="001007F4"/>
     <w:pPr>
       <w:spacing w:after="100"/>
       <w:ind w:left="480"/>

</xml_diff>

<commit_message>
docs: rebuild report with proper indentation, clickable TOC, 7 chapters, fixed cover names
</commit_message>
<xml_diff>
--- a/Bao_cao_do_an_NLU_Banking.docx
+++ b/Bao_cao_do_an_NLU_Banking.docx
@@ -88,7 +88,7 @@
                 <w:noProof/>
               </w:rPr>
               <w:drawing>
-                <wp:inline distT="0" distB="0" distL="0" distR="0" wp14:anchorId="2641EAE9" wp14:editId="49DDA597">
+                <wp:inline distT="0" distB="0" distL="0" distR="0" wp14:anchorId="792F6025" wp14:editId="2988740A">
                   <wp:extent cx="1440180" cy="1440180"/>
                   <wp:effectExtent l="0" t="0" r="0" b="0"/>
                   <wp:docPr id="134" name="Picture 134"/>
@@ -160,13 +160,37 @@
                 <w:b/>
                 <w:sz w:val="56"/>
               </w:rPr>
-              <w:t>ĐỒ ÁN NLU BANKING APP</w:t>
+              <w:t>Ä</w:t>
+            </w:r>
+            <w:r>
+              <w:rPr>
+                <w:rFonts w:ascii="Aptos" w:hAnsi="Aptos" w:cs="Aptos"/>
+                <w:b/>
+                <w:sz w:val="56"/>
+              </w:rPr>
+              <w:t>á»’</w:t>
             </w:r>
             <w:r>
               <w:rPr>
                 <w:b/>
+                <w:sz w:val="56"/>
               </w:rPr>
               <w:t xml:space="preserve"> </w:t>
+            </w:r>
+            <w:r>
+              <w:rPr>
+                <w:rFonts w:ascii="Aptos" w:hAnsi="Aptos" w:cs="Aptos"/>
+                <w:b/>
+                <w:sz w:val="56"/>
+              </w:rPr>
+              <w:t>Ã</w:t>
+            </w:r>
+            <w:r>
+              <w:rPr>
+                <w:b/>
+                <w:sz w:val="56"/>
+              </w:rPr>
+              <w:t>N NLU BANKING APP</w:t>
             </w:r>
           </w:p>
           <w:p>
@@ -260,7 +284,7 @@
                 <w:b/>
                 <w:sz w:val="28"/>
               </w:rPr>
-              <w:t xml:space="preserve">Giảng viên hướng dẫn : Th.S Võ Tấn Toàn Sinh viên thực hiện :  </w:t>
+              <w:t>Giáº£ng viÃªn hÆ°á»›ng dáº«n : Th.S VÃµ Táº¥n ToÃ n    Sinh viÃªn thá»±c hiá»‡n :</w:t>
             </w:r>
           </w:p>
           <w:p>
@@ -276,42 +300,7 @@
                 <w:rFonts w:ascii="Calibri" w:eastAsia="Calibri" w:hAnsi="Calibri" w:cs="Calibri"/>
                 <w:sz w:val="22"/>
               </w:rPr>
-              <w:tab/>
-            </w:r>
-            <w:r>
-              <w:rPr>
-                <w:b/>
-                <w:sz w:val="28"/>
-              </w:rPr>
-              <w:t>Lê Văn Tính</w:t>
-            </w:r>
-            <w:r>
-              <w:rPr>
-                <w:b/>
-                <w:sz w:val="28"/>
-              </w:rPr>
-              <w:t xml:space="preserve"> </w:t>
-            </w:r>
-            <w:r>
-              <w:rPr>
-                <w:b/>
-                <w:sz w:val="28"/>
-              </w:rPr>
-              <w:tab/>
-            </w:r>
-            <w:r>
-              <w:rPr>
-                <w:b/>
-                <w:sz w:val="28"/>
-              </w:rPr>
-              <w:t>23130334 (Nhóm trưởng)</w:t>
-            </w:r>
-            <w:r>
-              <w:rPr>
-                <w:b/>
-                <w:sz w:val="28"/>
-              </w:rPr>
-              <w:t xml:space="preserve"> </w:t>
+              <w:t xml:space="preserve">    LÃª VÄƒn TÃ­nh                            23130334 (NhÃ³m trÆ°á»Ÿng)</w:t>
             </w:r>
           </w:p>
           <w:p>
@@ -327,42 +316,7 @@
                 <w:rFonts w:ascii="Calibri" w:eastAsia="Calibri" w:hAnsi="Calibri" w:cs="Calibri"/>
                 <w:sz w:val="22"/>
               </w:rPr>
-              <w:tab/>
-            </w:r>
-            <w:r>
-              <w:rPr>
-                <w:b/>
-                <w:sz w:val="28"/>
-              </w:rPr>
-              <w:t>Trần Hoàng Quân</w:t>
-            </w:r>
-            <w:r>
-              <w:rPr>
-                <w:b/>
-                <w:sz w:val="28"/>
-              </w:rPr>
-              <w:t xml:space="preserve"> </w:t>
-            </w:r>
-            <w:r>
-              <w:rPr>
-                <w:b/>
-                <w:sz w:val="28"/>
-              </w:rPr>
-              <w:tab/>
-            </w:r>
-            <w:r>
-              <w:rPr>
-                <w:b/>
-                <w:sz w:val="28"/>
-              </w:rPr>
-              <w:t>23130258</w:t>
-            </w:r>
-            <w:r>
-              <w:rPr>
-                <w:b/>
-                <w:sz w:val="28"/>
-              </w:rPr>
-              <w:t xml:space="preserve"> </w:t>
+              <w:t xml:space="preserve">    Tráº§n HoÃ ng QuÃ¢n                         23130258</w:t>
             </w:r>
           </w:p>
           <w:p>
@@ -378,35 +332,7 @@
                 <w:rFonts w:ascii="Calibri" w:eastAsia="Calibri" w:hAnsi="Calibri" w:cs="Calibri"/>
                 <w:sz w:val="22"/>
               </w:rPr>
-              <w:tab/>
-            </w:r>
-            <w:r>
-              <w:rPr>
-                <w:b/>
-                <w:sz w:val="28"/>
-              </w:rPr>
-              <w:t xml:space="preserve">Võ Sinh </w:t>
-            </w:r>
-            <w:r>
-              <w:rPr>
-                <w:b/>
-                <w:sz w:val="28"/>
-              </w:rPr>
-              <w:tab/>
-            </w:r>
-            <w:r>
-              <w:rPr>
-                <w:b/>
-                <w:sz w:val="28"/>
-              </w:rPr>
-              <w:t>23130087</w:t>
-            </w:r>
-            <w:r>
-              <w:rPr>
-                <w:b/>
-                <w:sz w:val="28"/>
-              </w:rPr>
-              <w:t xml:space="preserve"> </w:t>
+              <w:t xml:space="preserve">    Nguyá»…n VÄƒn Anh HÃ n                     23130087</w:t>
             </w:r>
           </w:p>
           <w:p>
@@ -422,42 +348,7 @@
                 <w:rFonts w:ascii="Calibri" w:eastAsia="Calibri" w:hAnsi="Calibri" w:cs="Calibri"/>
                 <w:sz w:val="22"/>
               </w:rPr>
-              <w:tab/>
-            </w:r>
-            <w:r>
-              <w:rPr>
-                <w:b/>
-                <w:sz w:val="28"/>
-              </w:rPr>
-              <w:t>Phan Nguyễn Minh Thắng</w:t>
-            </w:r>
-            <w:r>
-              <w:rPr>
-                <w:b/>
-                <w:sz w:val="28"/>
-              </w:rPr>
-              <w:t xml:space="preserve"> </w:t>
-            </w:r>
-            <w:r>
-              <w:rPr>
-                <w:b/>
-                <w:sz w:val="28"/>
-              </w:rPr>
-              <w:tab/>
-            </w:r>
-            <w:r>
-              <w:rPr>
-                <w:b/>
-                <w:sz w:val="28"/>
-              </w:rPr>
-              <w:t>23130300</w:t>
-            </w:r>
-            <w:r>
-              <w:rPr>
-                <w:b/>
-                <w:sz w:val="28"/>
-              </w:rPr>
-              <w:t xml:space="preserve"> </w:t>
+              <w:t xml:space="preserve">    Phan Nguyá»…n Minh Tháº¯ng                  23130300</w:t>
             </w:r>
           </w:p>
           <w:p>
@@ -468,29 +359,6 @@
               </w:tabs>
               <w:spacing w:after="900" w:line="259" w:lineRule="auto"/>
             </w:pPr>
-            <w:r>
-              <w:rPr>
-                <w:rFonts w:ascii="Calibri" w:eastAsia="Calibri" w:hAnsi="Calibri" w:cs="Calibri"/>
-                <w:sz w:val="22"/>
-              </w:rPr>
-              <w:lastRenderedPageBreak/>
-              <w:tab/>
-            </w:r>
-            <w:r>
-              <w:rPr>
-                <w:b/>
-                <w:sz w:val="28"/>
-              </w:rPr>
-              <w:t xml:space="preserve">Phan Ngọc Vĩnh </w:t>
-            </w:r>
-            <w:r>
-              <w:rPr>
-                <w:b/>
-                <w:sz w:val="28"/>
-              </w:rPr>
-              <w:tab/>
-              <w:t xml:space="preserve"> </w:t>
-            </w:r>
           </w:p>
           <w:p>
             <w:pPr>
@@ -502,13 +370,46 @@
               <w:rPr>
                 <w:sz w:val="30"/>
               </w:rPr>
-              <w:t>TP.HỒ CHÍ MINH, tháng 4 năm 2026</w:t>
+              <w:t>TP. Há»’ CHÃ</w:t>
             </w:r>
             <w:r>
               <w:rPr>
-                <w:sz w:val="32"/>
+                <w:rFonts w:ascii="Aptos" w:hAnsi="Aptos" w:cs="Aptos"/>
+                <w:sz w:val="30"/>
               </w:rPr>
-              <w:t xml:space="preserve"> </w:t>
+              <w:t></w:t>
+            </w:r>
+            <w:r>
+              <w:rPr>
+                <w:sz w:val="30"/>
+              </w:rPr>
+              <w:t xml:space="preserve"> MINH, TH</w:t>
+            </w:r>
+            <w:r>
+              <w:rPr>
+                <w:rFonts w:ascii="Aptos" w:hAnsi="Aptos" w:cs="Aptos"/>
+                <w:sz w:val="30"/>
+              </w:rPr>
+              <w:t>Ã</w:t>
+            </w:r>
+            <w:r>
+              <w:rPr>
+                <w:sz w:val="30"/>
+              </w:rPr>
+              <w:t>NG 7 N</w:t>
+            </w:r>
+            <w:r>
+              <w:rPr>
+                <w:rFonts w:ascii="Aptos" w:hAnsi="Aptos" w:cs="Aptos"/>
+                <w:sz w:val="30"/>
+              </w:rPr>
+              <w:t>Ä‚</w:t>
+            </w:r>
+            <w:r>
+              <w:rPr>
+                <w:sz w:val="30"/>
+              </w:rPr>
+              <w:t>M 2026</w:t>
             </w:r>
           </w:p>
         </w:tc>
@@ -522,7 +423,7 @@
     </w:p>
     <w:p>
       <w:pPr>
-        <w:spacing w:before="240" w:after="480" w:line="248" w:lineRule="auto"/>
+        <w:spacing w:before="240" w:after="480" w:line="360" w:lineRule="auto"/>
         <w:jc w:val="center"/>
         <w:rPr>
           <w:rFonts w:ascii="Times New Roman" w:hAnsi="Times New Roman" w:cs="Times New Roman"/>
@@ -539,7 +440,7 @@
           <w:sz w:val="32"/>
         </w:rPr>
         <w:lastRenderedPageBreak/>
-        <w:t>MỤC LỤC</w:t>
+        <w:t>Má»¤C Lá»¤C</w:t>
       </w:r>
     </w:p>
     <w:p>
@@ -605,7 +506,7 @@
         <w:rPr>
           <w:noProof/>
         </w:rPr>
-        <w:instrText xml:space="preserve"> PAGEREF _Toc233881034 \h </w:instrText>
+        <w:instrText xml:space="preserve"> PAGEREF _Toc233883416 \h </w:instrText>
       </w:r>
       <w:r>
         <w:rPr>
@@ -622,7 +523,7 @@
         <w:rPr>
           <w:noProof/>
         </w:rPr>
-        <w:t>5</w:t>
+        <w:t>6</w:t>
       </w:r>
       <w:r>
         <w:rPr>
@@ -667,7 +568,7 @@
         <w:rPr>
           <w:noProof/>
         </w:rPr>
-        <w:instrText xml:space="preserve"> PAGEREF _Toc233881035 \h </w:instrText>
+        <w:instrText xml:space="preserve"> PAGEREF _Toc233883417 \h </w:instrText>
       </w:r>
       <w:r>
         <w:rPr>
@@ -684,7 +585,7 @@
         <w:rPr>
           <w:noProof/>
         </w:rPr>
-        <w:t>5</w:t>
+        <w:t>6</w:t>
       </w:r>
       <w:r>
         <w:rPr>
@@ -729,7 +630,7 @@
         <w:rPr>
           <w:noProof/>
         </w:rPr>
-        <w:instrText xml:space="preserve"> PAGEREF _Toc233881036 \h </w:instrText>
+        <w:instrText xml:space="preserve"> PAGEREF _Toc233883418 \h </w:instrText>
       </w:r>
       <w:r>
         <w:rPr>
@@ -746,7 +647,7 @@
         <w:rPr>
           <w:noProof/>
         </w:rPr>
-        <w:t>5</w:t>
+        <w:t>6</w:t>
       </w:r>
       <w:r>
         <w:rPr>
@@ -791,7 +692,7 @@
         <w:rPr>
           <w:noProof/>
         </w:rPr>
-        <w:instrText xml:space="preserve"> PAGEREF _Toc233881037 \h </w:instrText>
+        <w:instrText xml:space="preserve"> PAGEREF _Toc233883419 \h </w:instrText>
       </w:r>
       <w:r>
         <w:rPr>
@@ -808,7 +709,7 @@
         <w:rPr>
           <w:noProof/>
         </w:rPr>
-        <w:t>5</w:t>
+        <w:t>6</w:t>
       </w:r>
       <w:r>
         <w:rPr>
@@ -853,7 +754,7 @@
         <w:rPr>
           <w:noProof/>
         </w:rPr>
-        <w:instrText xml:space="preserve"> PAGEREF _Toc233881038 \h </w:instrText>
+        <w:instrText xml:space="preserve"> PAGEREF _Toc233883420 \h </w:instrText>
       </w:r>
       <w:r>
         <w:rPr>
@@ -870,7 +771,7 @@
         <w:rPr>
           <w:noProof/>
         </w:rPr>
-        <w:t>6</w:t>
+        <w:t>7</w:t>
       </w:r>
       <w:r>
         <w:rPr>
@@ -915,7 +816,7 @@
         <w:rPr>
           <w:noProof/>
         </w:rPr>
-        <w:instrText xml:space="preserve"> PAGEREF _Toc233881039 \h </w:instrText>
+        <w:instrText xml:space="preserve"> PAGEREF _Toc233883421 \h </w:instrText>
       </w:r>
       <w:r>
         <w:rPr>
@@ -932,7 +833,7 @@
         <w:rPr>
           <w:noProof/>
         </w:rPr>
-        <w:t>6</w:t>
+        <w:t>7</w:t>
       </w:r>
       <w:r>
         <w:rPr>
@@ -977,7 +878,7 @@
         <w:rPr>
           <w:noProof/>
         </w:rPr>
-        <w:instrText xml:space="preserve"> PAGEREF _Toc233881040 \h </w:instrText>
+        <w:instrText xml:space="preserve"> PAGEREF _Toc233883422 \h </w:instrText>
       </w:r>
       <w:r>
         <w:rPr>
@@ -994,7 +895,7 @@
         <w:rPr>
           <w:noProof/>
         </w:rPr>
-        <w:t>6</w:t>
+        <w:t>7</w:t>
       </w:r>
       <w:r>
         <w:rPr>
@@ -1039,7 +940,7 @@
         <w:rPr>
           <w:noProof/>
         </w:rPr>
-        <w:instrText xml:space="preserve"> PAGEREF _Toc233881041 \h </w:instrText>
+        <w:instrText xml:space="preserve"> PAGEREF _Toc233883423 \h </w:instrText>
       </w:r>
       <w:r>
         <w:rPr>
@@ -1056,7 +957,7 @@
         <w:rPr>
           <w:noProof/>
         </w:rPr>
-        <w:t>6</w:t>
+        <w:t>8</w:t>
       </w:r>
       <w:r>
         <w:rPr>
@@ -1101,7 +1002,7 @@
         <w:rPr>
           <w:noProof/>
         </w:rPr>
-        <w:instrText xml:space="preserve"> PAGEREF _Toc233881042 \h </w:instrText>
+        <w:instrText xml:space="preserve"> PAGEREF _Toc233883424 \h </w:instrText>
       </w:r>
       <w:r>
         <w:rPr>
@@ -1118,7 +1019,7 @@
         <w:rPr>
           <w:noProof/>
         </w:rPr>
-        <w:t>6</w:t>
+        <w:t>8</w:t>
       </w:r>
       <w:r>
         <w:rPr>
@@ -1163,7 +1064,7 @@
         <w:rPr>
           <w:noProof/>
         </w:rPr>
-        <w:instrText xml:space="preserve"> PAGEREF _Toc233881043 \h </w:instrText>
+        <w:instrText xml:space="preserve"> PAGEREF _Toc233883425 \h </w:instrText>
       </w:r>
       <w:r>
         <w:rPr>
@@ -1180,7 +1081,7 @@
         <w:rPr>
           <w:noProof/>
         </w:rPr>
-        <w:t>7</w:t>
+        <w:t>8</w:t>
       </w:r>
       <w:r>
         <w:rPr>
@@ -1225,7 +1126,7 @@
         <w:rPr>
           <w:noProof/>
         </w:rPr>
-        <w:instrText xml:space="preserve"> PAGEREF _Toc233881044 \h </w:instrText>
+        <w:instrText xml:space="preserve"> PAGEREF _Toc233883426 \h </w:instrText>
       </w:r>
       <w:r>
         <w:rPr>
@@ -1242,7 +1143,7 @@
         <w:rPr>
           <w:noProof/>
         </w:rPr>
-        <w:t>7</w:t>
+        <w:t>9</w:t>
       </w:r>
       <w:r>
         <w:rPr>
@@ -1287,7 +1188,7 @@
         <w:rPr>
           <w:noProof/>
         </w:rPr>
-        <w:instrText xml:space="preserve"> PAGEREF _Toc233881045 \h </w:instrText>
+        <w:instrText xml:space="preserve"> PAGEREF _Toc233883427 \h </w:instrText>
       </w:r>
       <w:r>
         <w:rPr>
@@ -1304,7 +1205,7 @@
         <w:rPr>
           <w:noProof/>
         </w:rPr>
-        <w:t>7</w:t>
+        <w:t>9</w:t>
       </w:r>
       <w:r>
         <w:rPr>
@@ -1349,7 +1250,7 @@
         <w:rPr>
           <w:noProof/>
         </w:rPr>
-        <w:instrText xml:space="preserve"> PAGEREF _Toc233881046 \h </w:instrText>
+        <w:instrText xml:space="preserve"> PAGEREF _Toc233883428 \h </w:instrText>
       </w:r>
       <w:r>
         <w:rPr>
@@ -1366,7 +1267,7 @@
         <w:rPr>
           <w:noProof/>
         </w:rPr>
-        <w:t>8</w:t>
+        <w:t>10</w:t>
       </w:r>
       <w:r>
         <w:rPr>
@@ -1411,7 +1312,7 @@
         <w:rPr>
           <w:noProof/>
         </w:rPr>
-        <w:instrText xml:space="preserve"> PAGEREF _Toc233881047 \h </w:instrText>
+        <w:instrText xml:space="preserve"> PAGEREF _Toc233883429 \h </w:instrText>
       </w:r>
       <w:r>
         <w:rPr>
@@ -1428,7 +1329,7 @@
         <w:rPr>
           <w:noProof/>
         </w:rPr>
-        <w:t>8</w:t>
+        <w:t>11</w:t>
       </w:r>
       <w:r>
         <w:rPr>
@@ -1473,7 +1374,7 @@
         <w:rPr>
           <w:noProof/>
         </w:rPr>
-        <w:instrText xml:space="preserve"> PAGEREF _Toc233881048 \h </w:instrText>
+        <w:instrText xml:space="preserve"> PAGEREF _Toc233883430 \h </w:instrText>
       </w:r>
       <w:r>
         <w:rPr>
@@ -1490,7 +1391,7 @@
         <w:rPr>
           <w:noProof/>
         </w:rPr>
-        <w:t>8</w:t>
+        <w:t>11</w:t>
       </w:r>
       <w:r>
         <w:rPr>
@@ -1535,7 +1436,7 @@
         <w:rPr>
           <w:noProof/>
         </w:rPr>
-        <w:instrText xml:space="preserve"> PAGEREF _Toc233881049 \h </w:instrText>
+        <w:instrText xml:space="preserve"> PAGEREF _Toc233883431 \h </w:instrText>
       </w:r>
       <w:r>
         <w:rPr>
@@ -1552,7 +1453,7 @@
         <w:rPr>
           <w:noProof/>
         </w:rPr>
-        <w:t>8</w:t>
+        <w:t>11</w:t>
       </w:r>
       <w:r>
         <w:rPr>
@@ -1597,7 +1498,7 @@
         <w:rPr>
           <w:noProof/>
         </w:rPr>
-        <w:instrText xml:space="preserve"> PAGEREF _Toc233881050 \h </w:instrText>
+        <w:instrText xml:space="preserve"> PAGEREF _Toc233883432 \h </w:instrText>
       </w:r>
       <w:r>
         <w:rPr>
@@ -1614,7 +1515,7 @@
         <w:rPr>
           <w:noProof/>
         </w:rPr>
-        <w:t>8</w:t>
+        <w:t>11</w:t>
       </w:r>
       <w:r>
         <w:rPr>
@@ -1659,7 +1560,7 @@
         <w:rPr>
           <w:noProof/>
         </w:rPr>
-        <w:instrText xml:space="preserve"> PAGEREF _Toc233881051 \h </w:instrText>
+        <w:instrText xml:space="preserve"> PAGEREF _Toc233883433 \h </w:instrText>
       </w:r>
       <w:r>
         <w:rPr>
@@ -1676,7 +1577,7 @@
         <w:rPr>
           <w:noProof/>
         </w:rPr>
-        <w:t>8</w:t>
+        <w:t>11</w:t>
       </w:r>
       <w:r>
         <w:rPr>
@@ -1721,7 +1622,7 @@
         <w:rPr>
           <w:noProof/>
         </w:rPr>
-        <w:instrText xml:space="preserve"> PAGEREF _Toc233881052 \h </w:instrText>
+        <w:instrText xml:space="preserve"> PAGEREF _Toc233883434 \h </w:instrText>
       </w:r>
       <w:r>
         <w:rPr>
@@ -1738,7 +1639,7 @@
         <w:rPr>
           <w:noProof/>
         </w:rPr>
-        <w:t>9</w:t>
+        <w:t>12</w:t>
       </w:r>
       <w:r>
         <w:rPr>
@@ -1783,7 +1684,7 @@
         <w:rPr>
           <w:noProof/>
         </w:rPr>
-        <w:instrText xml:space="preserve"> PAGEREF _Toc233881053 \h </w:instrText>
+        <w:instrText xml:space="preserve"> PAGEREF _Toc233883435 \h </w:instrText>
       </w:r>
       <w:r>
         <w:rPr>
@@ -1800,7 +1701,7 @@
         <w:rPr>
           <w:noProof/>
         </w:rPr>
-        <w:t>9</w:t>
+        <w:t>12</w:t>
       </w:r>
       <w:r>
         <w:rPr>
@@ -1827,7 +1728,7 @@
           <w:noProof/>
           <w:color w:val="000000"/>
         </w:rPr>
-        <w:t>CHƯƠNG 6. TỔNG KẾT VÀ HƯỚNG PHÁT TRIỂN TƯƠNG LAI</w:t>
+        <w:t>CHƯƠNG 6. THỬ NGHIỆM VÀ ĐÁNH GIÁ HỆ THỐNG</w:t>
       </w:r>
       <w:r>
         <w:rPr>
@@ -1845,7 +1746,7 @@
         <w:rPr>
           <w:noProof/>
         </w:rPr>
-        <w:instrText xml:space="preserve"> PAGEREF _Toc233881054 \h </w:instrText>
+        <w:instrText xml:space="preserve"> PAGEREF _Toc233883436 \h </w:instrText>
       </w:r>
       <w:r>
         <w:rPr>
@@ -1862,7 +1763,7 @@
         <w:rPr>
           <w:noProof/>
         </w:rPr>
-        <w:t>9</w:t>
+        <w:t>12</w:t>
       </w:r>
       <w:r>
         <w:rPr>
@@ -1889,7 +1790,7 @@
           <w:noProof/>
           <w:color w:val="000000"/>
         </w:rPr>
-        <w:t>6.1. Đánh giá kết quả đạt được của đồ án</w:t>
+        <w:t>6.1. Thử nghiệm chức năng trên Android Emulator (Functional Testing)</w:t>
       </w:r>
       <w:r>
         <w:rPr>
@@ -1907,7 +1808,7 @@
         <w:rPr>
           <w:noProof/>
         </w:rPr>
-        <w:instrText xml:space="preserve"> PAGEREF _Toc233881055 \h </w:instrText>
+        <w:instrText xml:space="preserve"> PAGEREF _Toc233883437 \h </w:instrText>
       </w:r>
       <w:r>
         <w:rPr>
@@ -1924,7 +1825,7 @@
         <w:rPr>
           <w:noProof/>
         </w:rPr>
-        <w:t>9</w:t>
+        <w:t>12</w:t>
       </w:r>
       <w:r>
         <w:rPr>
@@ -1951,7 +1852,7 @@
           <w:noProof/>
           <w:color w:val="000000"/>
         </w:rPr>
-        <w:t>6.2. Hướng phát triển nâng cấp hệ thống</w:t>
+        <w:t>6.2. Kết quả kiểm tra hiệu năng hệ thống (Performance Evaluation)</w:t>
       </w:r>
       <w:r>
         <w:rPr>
@@ -1969,7 +1870,7 @@
         <w:rPr>
           <w:noProof/>
         </w:rPr>
-        <w:instrText xml:space="preserve"> PAGEREF _Toc233881056 \h </w:instrText>
+        <w:instrText xml:space="preserve"> PAGEREF _Toc233883438 \h </w:instrText>
       </w:r>
       <w:r>
         <w:rPr>
@@ -1986,7 +1887,7 @@
         <w:rPr>
           <w:noProof/>
         </w:rPr>
-        <w:t>9</w:t>
+        <w:t>12</w:t>
       </w:r>
       <w:r>
         <w:rPr>
@@ -1997,7 +1898,193 @@
     </w:p>
     <w:p>
       <w:pPr>
-        <w:spacing w:before="240" w:after="480" w:line="248" w:lineRule="auto"/>
+        <w:pStyle w:val="TOC1"/>
+        <w:tabs>
+          <w:tab w:val="right" w:leader="dot" w:pos="9395"/>
+        </w:tabs>
+        <w:rPr>
+          <w:rFonts w:eastAsiaTheme="minorEastAsia"/>
+          <w:noProof/>
+        </w:rPr>
+      </w:pPr>
+      <w:r>
+        <w:rPr>
+          <w:rFonts w:ascii="Times New Roman" w:hAnsi="Times New Roman" w:cs="Times New Roman"/>
+          <w:b/>
+          <w:noProof/>
+          <w:color w:val="000000"/>
+        </w:rPr>
+        <w:t>CHƯƠNG 7. TỔNG KẾT VÀ HƯỚNG PHÁT TRIỂN TƯƠNG LAI</w:t>
+      </w:r>
+      <w:r>
+        <w:rPr>
+          <w:noProof/>
+        </w:rPr>
+        <w:tab/>
+      </w:r>
+      <w:r>
+        <w:rPr>
+          <w:noProof/>
+        </w:rPr>
+        <w:fldChar w:fldCharType="begin"/>
+      </w:r>
+      <w:r>
+        <w:rPr>
+          <w:noProof/>
+        </w:rPr>
+        <w:instrText xml:space="preserve"> PAGEREF _Toc233883439 \h </w:instrText>
+      </w:r>
+      <w:r>
+        <w:rPr>
+          <w:noProof/>
+        </w:rPr>
+      </w:r>
+      <w:r>
+        <w:rPr>
+          <w:noProof/>
+        </w:rPr>
+        <w:fldChar w:fldCharType="separate"/>
+      </w:r>
+      <w:r>
+        <w:rPr>
+          <w:noProof/>
+        </w:rPr>
+        <w:t>13</w:t>
+      </w:r>
+      <w:r>
+        <w:rPr>
+          <w:noProof/>
+        </w:rPr>
+        <w:fldChar w:fldCharType="end"/>
+      </w:r>
+    </w:p>
+    <w:p>
+      <w:pPr>
+        <w:pStyle w:val="TOC2"/>
+        <w:tabs>
+          <w:tab w:val="right" w:leader="dot" w:pos="9395"/>
+        </w:tabs>
+        <w:rPr>
+          <w:rFonts w:eastAsiaTheme="minorEastAsia"/>
+          <w:noProof/>
+        </w:rPr>
+      </w:pPr>
+      <w:r>
+        <w:rPr>
+          <w:rFonts w:ascii="Times New Roman" w:hAnsi="Times New Roman" w:cs="Times New Roman"/>
+          <w:b/>
+          <w:noProof/>
+          <w:color w:val="000000"/>
+        </w:rPr>
+        <w:t>7.1. Đánh giá kết quả đạt được của đồ án</w:t>
+      </w:r>
+      <w:r>
+        <w:rPr>
+          <w:noProof/>
+        </w:rPr>
+        <w:tab/>
+      </w:r>
+      <w:r>
+        <w:rPr>
+          <w:noProof/>
+        </w:rPr>
+        <w:fldChar w:fldCharType="begin"/>
+      </w:r>
+      <w:r>
+        <w:rPr>
+          <w:noProof/>
+        </w:rPr>
+        <w:instrText xml:space="preserve"> PAGEREF _Toc233883440 \h </w:instrText>
+      </w:r>
+      <w:r>
+        <w:rPr>
+          <w:noProof/>
+        </w:rPr>
+      </w:r>
+      <w:r>
+        <w:rPr>
+          <w:noProof/>
+        </w:rPr>
+        <w:fldChar w:fldCharType="separate"/>
+      </w:r>
+      <w:r>
+        <w:rPr>
+          <w:noProof/>
+        </w:rPr>
+        <w:t>13</w:t>
+      </w:r>
+      <w:r>
+        <w:rPr>
+          <w:noProof/>
+        </w:rPr>
+        <w:fldChar w:fldCharType="end"/>
+      </w:r>
+    </w:p>
+    <w:p>
+      <w:pPr>
+        <w:pStyle w:val="TOC2"/>
+        <w:tabs>
+          <w:tab w:val="right" w:leader="dot" w:pos="9395"/>
+        </w:tabs>
+        <w:rPr>
+          <w:rFonts w:eastAsiaTheme="minorEastAsia"/>
+          <w:noProof/>
+        </w:rPr>
+      </w:pPr>
+      <w:r>
+        <w:rPr>
+          <w:rFonts w:ascii="Times New Roman" w:hAnsi="Times New Roman" w:cs="Times New Roman"/>
+          <w:b/>
+          <w:noProof/>
+          <w:color w:val="000000"/>
+        </w:rPr>
+        <w:t>7.2. Hướng phát triển nâng cấp hệ thống</w:t>
+      </w:r>
+      <w:r>
+        <w:rPr>
+          <w:noProof/>
+        </w:rPr>
+        <w:tab/>
+      </w:r>
+      <w:r>
+        <w:rPr>
+          <w:noProof/>
+        </w:rPr>
+        <w:fldChar w:fldCharType="begin"/>
+      </w:r>
+      <w:r>
+        <w:rPr>
+          <w:noProof/>
+        </w:rPr>
+        <w:instrText xml:space="preserve"> PAGEREF _Toc233883441 \h </w:instrText>
+      </w:r>
+      <w:r>
+        <w:rPr>
+          <w:noProof/>
+        </w:rPr>
+      </w:r>
+      <w:r>
+        <w:rPr>
+          <w:noProof/>
+        </w:rPr>
+        <w:fldChar w:fldCharType="separate"/>
+      </w:r>
+      <w:r>
+        <w:rPr>
+          <w:noProof/>
+        </w:rPr>
+        <w:t>13</w:t>
+      </w:r>
+      <w:r>
+        <w:rPr>
+          <w:noProof/>
+        </w:rPr>
+        <w:fldChar w:fldCharType="end"/>
+      </w:r>
+    </w:p>
+    <w:p>
+      <w:pPr>
+        <w:spacing w:before="240" w:after="480" w:line="360" w:lineRule="auto"/>
         <w:jc w:val="center"/>
         <w:rPr>
           <w:rFonts w:ascii="Times New Roman" w:hAnsi="Times New Roman" w:cs="Times New Roman"/>
@@ -2032,27 +2119,28 @@
           <w:color w:val="000000"/>
           <w:sz w:val="32"/>
         </w:rPr>
+        <w:lastRenderedPageBreak/>
         <w:br w:type="page"/>
       </w:r>
     </w:p>
     <w:p>
       <w:pPr>
         <w:pStyle w:val="Heading1"/>
-        <w:spacing w:before="240" w:after="240" w:line="248" w:lineRule="auto"/>
-        <w:rPr>
-          <w:rFonts w:ascii="Times New Roman" w:hAnsi="Times New Roman" w:cs="Times New Roman"/>
-          <w:b/>
-          <w:color w:val="000000"/>
-          <w:sz w:val="32"/>
-        </w:rPr>
-      </w:pPr>
-      <w:bookmarkStart w:id="0" w:name="_Toc233881034"/>
-      <w:r>
-        <w:rPr>
-          <w:rFonts w:ascii="Times New Roman" w:hAnsi="Times New Roman" w:cs="Times New Roman"/>
-          <w:b/>
-          <w:color w:val="000000"/>
-          <w:sz w:val="32"/>
+        <w:spacing w:before="240" w:after="240" w:line="360" w:lineRule="auto"/>
+        <w:rPr>
+          <w:rFonts w:ascii="Times New Roman" w:hAnsi="Times New Roman" w:cs="Times New Roman"/>
+          <w:b/>
+          <w:color w:val="000000"/>
+          <w:sz w:val="30"/>
+        </w:rPr>
+      </w:pPr>
+      <w:bookmarkStart w:id="0" w:name="_Toc233883416"/>
+      <w:r>
+        <w:rPr>
+          <w:rFonts w:ascii="Times New Roman" w:hAnsi="Times New Roman" w:cs="Times New Roman"/>
+          <w:b/>
+          <w:color w:val="000000"/>
+          <w:sz w:val="30"/>
         </w:rPr>
         <w:lastRenderedPageBreak/>
         <w:t>CHƯƠNG 1. GIỚI THIỆU TỔNG QUAN VÀ LIỆT KÊ CHỨC NĂNG DỰ ÁN</w:t>
@@ -2062,21 +2150,22 @@
     <w:p>
       <w:pPr>
         <w:pStyle w:val="Heading2"/>
-        <w:spacing w:before="120" w:after="120" w:line="248" w:lineRule="auto"/>
-        <w:rPr>
-          <w:rFonts w:ascii="Times New Roman" w:hAnsi="Times New Roman" w:cs="Times New Roman"/>
-          <w:b/>
-          <w:color w:val="000000"/>
-          <w:sz w:val="28"/>
-        </w:rPr>
-      </w:pPr>
-      <w:bookmarkStart w:id="1" w:name="_Toc233881035"/>
-      <w:r>
-        <w:rPr>
-          <w:rFonts w:ascii="Times New Roman" w:hAnsi="Times New Roman" w:cs="Times New Roman"/>
-          <w:b/>
-          <w:color w:val="000000"/>
-          <w:sz w:val="28"/>
+        <w:spacing w:before="120" w:after="120" w:line="360" w:lineRule="auto"/>
+        <w:ind w:left="283"/>
+        <w:rPr>
+          <w:rFonts w:ascii="Times New Roman" w:hAnsi="Times New Roman" w:cs="Times New Roman"/>
+          <w:b/>
+          <w:color w:val="000000"/>
+          <w:sz w:val="26"/>
+        </w:rPr>
+      </w:pPr>
+      <w:bookmarkStart w:id="1" w:name="_Toc233883417"/>
+      <w:r>
+        <w:rPr>
+          <w:rFonts w:ascii="Times New Roman" w:hAnsi="Times New Roman" w:cs="Times New Roman"/>
+          <w:b/>
+          <w:color w:val="000000"/>
+          <w:sz w:val="26"/>
         </w:rPr>
         <w:t>1.1. Giới thiệu ứng dụng NLU Banking App</w:t>
       </w:r>
@@ -2084,7 +2173,8 @@
     </w:p>
     <w:p>
       <w:pPr>
-        <w:spacing w:after="120" w:line="248" w:lineRule="auto"/>
+        <w:spacing w:line="360" w:lineRule="auto"/>
+        <w:ind w:firstLine="709"/>
         <w:jc w:val="both"/>
         <w:rPr>
           <w:rFonts w:ascii="Times New Roman" w:hAnsi="Times New Roman" w:cs="Times New Roman"/>
@@ -2104,21 +2194,22 @@
     <w:p>
       <w:pPr>
         <w:pStyle w:val="Heading2"/>
-        <w:spacing w:before="120" w:after="120" w:line="248" w:lineRule="auto"/>
-        <w:rPr>
-          <w:rFonts w:ascii="Times New Roman" w:hAnsi="Times New Roman" w:cs="Times New Roman"/>
-          <w:b/>
-          <w:color w:val="000000"/>
-          <w:sz w:val="28"/>
-        </w:rPr>
-      </w:pPr>
-      <w:bookmarkStart w:id="2" w:name="_Toc233881036"/>
-      <w:r>
-        <w:rPr>
-          <w:rFonts w:ascii="Times New Roman" w:hAnsi="Times New Roman" w:cs="Times New Roman"/>
-          <w:b/>
-          <w:color w:val="000000"/>
-          <w:sz w:val="28"/>
+        <w:spacing w:before="120" w:after="120" w:line="360" w:lineRule="auto"/>
+        <w:ind w:left="283"/>
+        <w:rPr>
+          <w:rFonts w:ascii="Times New Roman" w:hAnsi="Times New Roman" w:cs="Times New Roman"/>
+          <w:b/>
+          <w:color w:val="000000"/>
+          <w:sz w:val="26"/>
+        </w:rPr>
+      </w:pPr>
+      <w:bookmarkStart w:id="2" w:name="_Toc233883418"/>
+      <w:r>
+        <w:rPr>
+          <w:rFonts w:ascii="Times New Roman" w:hAnsi="Times New Roman" w:cs="Times New Roman"/>
+          <w:b/>
+          <w:color w:val="000000"/>
+          <w:sz w:val="26"/>
         </w:rPr>
         <w:t>1.2. Danh sách các chức năng lớn của hệ thống</w:t>
       </w:r>
@@ -2126,7 +2217,8 @@
     </w:p>
     <w:p>
       <w:pPr>
-        <w:spacing w:after="120" w:line="248" w:lineRule="auto"/>
+        <w:spacing w:line="360" w:lineRule="auto"/>
+        <w:ind w:firstLine="709"/>
         <w:jc w:val="both"/>
         <w:rPr>
           <w:rFonts w:ascii="Times New Roman" w:hAnsi="Times New Roman" w:cs="Times New Roman"/>
@@ -2146,21 +2238,22 @@
     <w:p>
       <w:pPr>
         <w:pStyle w:val="Heading2"/>
-        <w:spacing w:before="120" w:after="120" w:line="248" w:lineRule="auto"/>
-        <w:rPr>
-          <w:rFonts w:ascii="Times New Roman" w:hAnsi="Times New Roman" w:cs="Times New Roman"/>
-          <w:b/>
-          <w:color w:val="000000"/>
-          <w:sz w:val="28"/>
-        </w:rPr>
-      </w:pPr>
-      <w:bookmarkStart w:id="3" w:name="_Toc233881037"/>
-      <w:r>
-        <w:rPr>
-          <w:rFonts w:ascii="Times New Roman" w:hAnsi="Times New Roman" w:cs="Times New Roman"/>
-          <w:b/>
-          <w:color w:val="000000"/>
-          <w:sz w:val="28"/>
+        <w:spacing w:before="120" w:after="120" w:line="360" w:lineRule="auto"/>
+        <w:ind w:left="283"/>
+        <w:rPr>
+          <w:rFonts w:ascii="Times New Roman" w:hAnsi="Times New Roman" w:cs="Times New Roman"/>
+          <w:b/>
+          <w:color w:val="000000"/>
+          <w:sz w:val="26"/>
+        </w:rPr>
+      </w:pPr>
+      <w:bookmarkStart w:id="3" w:name="_Toc233883419"/>
+      <w:r>
+        <w:rPr>
+          <w:rFonts w:ascii="Times New Roman" w:hAnsi="Times New Roman" w:cs="Times New Roman"/>
+          <w:b/>
+          <w:color w:val="000000"/>
+          <w:sz w:val="26"/>
         </w:rPr>
         <w:t>1.3. Chi tiết các chức năng nhỏ đi kèm</w:t>
       </w:r>
@@ -2168,7 +2261,8 @@
     </w:p>
     <w:p>
       <w:pPr>
-        <w:spacing w:after="120" w:line="248" w:lineRule="auto"/>
+        <w:spacing w:line="360" w:lineRule="auto"/>
+        <w:ind w:firstLine="709"/>
         <w:jc w:val="both"/>
         <w:rPr>
           <w:rFonts w:ascii="Times New Roman" w:hAnsi="Times New Roman" w:cs="Times New Roman"/>
@@ -2187,7 +2281,8 @@
     </w:p>
     <w:p>
       <w:pPr>
-        <w:spacing w:after="80" w:line="248" w:lineRule="auto"/>
+        <w:spacing w:after="80" w:line="360" w:lineRule="auto"/>
+        <w:ind w:left="850" w:hanging="283"/>
         <w:jc w:val="both"/>
         <w:rPr>
           <w:rFonts w:ascii="Times New Roman" w:hAnsi="Times New Roman" w:cs="Times New Roman"/>
@@ -2206,7 +2301,8 @@
     </w:p>
     <w:p>
       <w:pPr>
-        <w:spacing w:after="80" w:line="248" w:lineRule="auto"/>
+        <w:spacing w:after="80" w:line="360" w:lineRule="auto"/>
+        <w:ind w:left="850" w:hanging="283"/>
         <w:jc w:val="both"/>
         <w:rPr>
           <w:rFonts w:ascii="Times New Roman" w:hAnsi="Times New Roman" w:cs="Times New Roman"/>
@@ -2225,7 +2321,8 @@
     </w:p>
     <w:p>
       <w:pPr>
-        <w:spacing w:after="80" w:line="248" w:lineRule="auto"/>
+        <w:spacing w:after="80" w:line="360" w:lineRule="auto"/>
+        <w:ind w:left="850" w:hanging="283"/>
         <w:jc w:val="both"/>
         <w:rPr>
           <w:rFonts w:ascii="Times New Roman" w:hAnsi="Times New Roman" w:cs="Times New Roman"/>
@@ -2239,12 +2336,14 @@
           <w:color w:val="000000"/>
           <w:sz w:val="26"/>
         </w:rPr>
+        <w:lastRenderedPageBreak/>
         <w:t xml:space="preserve">  - Chức năng Đăng ký tài khoản kèm mã OTP: Cho phép người dùng nhập Họ tên, Email, SĐT và CCCD. Hệ thống gửi mã xác thực OTP qua email và kích hoạt tài khoản ngay khi người dùng nhập đúng mã.</w:t>
       </w:r>
     </w:p>
     <w:p>
       <w:pPr>
-        <w:spacing w:after="80" w:line="248" w:lineRule="auto"/>
+        <w:spacing w:after="80" w:line="360" w:lineRule="auto"/>
+        <w:ind w:left="850" w:hanging="283"/>
         <w:jc w:val="both"/>
         <w:rPr>
           <w:rFonts w:ascii="Times New Roman" w:hAnsi="Times New Roman" w:cs="Times New Roman"/>
@@ -2263,7 +2362,8 @@
     </w:p>
     <w:p>
       <w:pPr>
-        <w:spacing w:after="80" w:line="248" w:lineRule="auto"/>
+        <w:spacing w:after="80" w:line="360" w:lineRule="auto"/>
+        <w:ind w:left="850" w:hanging="283"/>
         <w:jc w:val="both"/>
         <w:rPr>
           <w:rFonts w:ascii="Times New Roman" w:hAnsi="Times New Roman" w:cs="Times New Roman"/>
@@ -2282,7 +2382,8 @@
     </w:p>
     <w:p>
       <w:pPr>
-        <w:spacing w:after="80" w:line="248" w:lineRule="auto"/>
+        <w:spacing w:after="80" w:line="360" w:lineRule="auto"/>
+        <w:ind w:left="850" w:hanging="283"/>
         <w:jc w:val="both"/>
         <w:rPr>
           <w:rFonts w:ascii="Times New Roman" w:hAnsi="Times New Roman" w:cs="Times New Roman"/>
@@ -2301,7 +2402,8 @@
     </w:p>
     <w:p>
       <w:pPr>
-        <w:spacing w:after="120" w:line="248" w:lineRule="auto"/>
+        <w:spacing w:after="120" w:line="360" w:lineRule="auto"/>
+        <w:ind w:left="850" w:hanging="283"/>
         <w:jc w:val="both"/>
         <w:rPr>
           <w:rFonts w:ascii="Times New Roman" w:hAnsi="Times New Roman" w:cs="Times New Roman"/>
@@ -2315,59 +2417,181 @@
           <w:color w:val="000000"/>
           <w:sz w:val="26"/>
         </w:rPr>
+        <w:t xml:space="preserve">  - Chức năng Lịch sử giao dịch: Hiển thị danh sách đầy đủ lịch sử giao dịch chuyển khoản, nạp/rút tiền kèm thông tin mô tả chi tiết của từng giao dịch.</w:t>
+      </w:r>
+    </w:p>
+    <w:p>
+      <w:pPr>
+        <w:pStyle w:val="Heading2"/>
+        <w:spacing w:before="120" w:after="120" w:line="360" w:lineRule="auto"/>
+        <w:ind w:left="283"/>
+        <w:rPr>
+          <w:rFonts w:ascii="Times New Roman" w:hAnsi="Times New Roman" w:cs="Times New Roman"/>
+          <w:b/>
+          <w:color w:val="000000"/>
+          <w:sz w:val="26"/>
+        </w:rPr>
+      </w:pPr>
+      <w:bookmarkStart w:id="4" w:name="_Toc233883420"/>
+      <w:r>
+        <w:rPr>
+          <w:rFonts w:ascii="Times New Roman" w:hAnsi="Times New Roman" w:cs="Times New Roman"/>
+          <w:b/>
+          <w:color w:val="000000"/>
+          <w:sz w:val="26"/>
+        </w:rPr>
+        <w:t>1.4. Phân tích yêu cầu hệ thống</w:t>
+      </w:r>
+      <w:bookmarkEnd w:id="4"/>
+    </w:p>
+    <w:p>
+      <w:pPr>
+        <w:pStyle w:val="Heading3"/>
+        <w:spacing w:before="80" w:line="360" w:lineRule="auto"/>
+        <w:ind w:left="567"/>
+        <w:rPr>
+          <w:rFonts w:ascii="Times New Roman" w:hAnsi="Times New Roman" w:cs="Times New Roman"/>
+          <w:b/>
+          <w:color w:val="000000"/>
+          <w:sz w:val="26"/>
+        </w:rPr>
+      </w:pPr>
+      <w:bookmarkStart w:id="5" w:name="_Toc233883421"/>
+      <w:r>
+        <w:rPr>
+          <w:rFonts w:ascii="Times New Roman" w:hAnsi="Times New Roman" w:cs="Times New Roman"/>
+          <w:b/>
+          <w:color w:val="000000"/>
+          <w:sz w:val="26"/>
+        </w:rPr>
+        <w:t>1.4.1. Yêu cầu chức năng (Functional Requirements)</w:t>
+      </w:r>
+      <w:bookmarkEnd w:id="5"/>
+    </w:p>
+    <w:p>
+      <w:pPr>
+        <w:spacing w:after="80" w:line="360" w:lineRule="auto"/>
+        <w:ind w:firstLine="709"/>
+        <w:jc w:val="both"/>
+        <w:rPr>
+          <w:rFonts w:ascii="Times New Roman" w:hAnsi="Times New Roman" w:cs="Times New Roman"/>
+          <w:color w:val="000000"/>
+          <w:sz w:val="26"/>
+        </w:rPr>
+      </w:pPr>
+      <w:r>
+        <w:rPr>
+          <w:rFonts w:ascii="Times New Roman" w:hAnsi="Times New Roman" w:cs="Times New Roman"/>
+          <w:color w:val="000000"/>
+          <w:sz w:val="26"/>
+        </w:rPr>
+        <w:t>Các chức năng yêu cầu bắt buộc đối với hệ thống bao gồm: (1) Đăng ký và xác thực tài khoản qua OTP gửi về Email. (2) Đăng nhập bảo mật lấy JWT Token từ Keycloak Realm 'banking-service'. (3) Hiển thị trực quan số tài khoản và số dư khả dụng thực tế của khách hàng. (4) Chuyển tiền nội bộ an toàn bằng cách kiểm tra số tài khoản đích, tự động hiển thị tên người nhận, yêu cầu xác thực OTP giao dịch. (5) Quét mã QR để lấy số tài khoản đích và điền tự động thông tin giao dịch.</w:t>
+      </w:r>
+    </w:p>
+    <w:p>
+      <w:pPr>
+        <w:pStyle w:val="Heading3"/>
+        <w:spacing w:before="80" w:line="360" w:lineRule="auto"/>
+        <w:ind w:left="567"/>
+        <w:rPr>
+          <w:rFonts w:ascii="Times New Roman" w:hAnsi="Times New Roman" w:cs="Times New Roman"/>
+          <w:b/>
+          <w:color w:val="000000"/>
+          <w:sz w:val="26"/>
+        </w:rPr>
+      </w:pPr>
+      <w:bookmarkStart w:id="6" w:name="_Toc233883422"/>
+      <w:r>
+        <w:rPr>
+          <w:rFonts w:ascii="Times New Roman" w:hAnsi="Times New Roman" w:cs="Times New Roman"/>
+          <w:b/>
+          <w:color w:val="000000"/>
+          <w:sz w:val="26"/>
+        </w:rPr>
+        <w:t>1.4.2. Yêu cầu phi chức năng (Non-functional Requirements)</w:t>
+      </w:r>
+      <w:bookmarkEnd w:id="6"/>
+    </w:p>
+    <w:p>
+      <w:pPr>
+        <w:spacing w:after="120" w:line="360" w:lineRule="auto"/>
+        <w:ind w:firstLine="709"/>
+        <w:jc w:val="both"/>
+        <w:rPr>
+          <w:rFonts w:ascii="Times New Roman" w:hAnsi="Times New Roman" w:cs="Times New Roman"/>
+          <w:color w:val="000000"/>
+          <w:sz w:val="26"/>
+        </w:rPr>
+      </w:pPr>
+      <w:r>
+        <w:rPr>
+          <w:rFonts w:ascii="Times New Roman" w:hAnsi="Times New Roman" w:cs="Times New Roman"/>
+          <w:color w:val="000000"/>
+          <w:sz w:val="26"/>
+        </w:rPr>
+        <w:t xml:space="preserve">Các yêu cầu về chất lượng và vận hành hệ thống bao gồm: (1) Tính bảo mật cao: Mã hóa thông tin nhạy cảm và OTP, bảo vệ phiên đăng nhập bằng Access Token có thời gian hết hạn ngắn. (2) Tính nhất quán dữ liệu (Data Consistency): Số dư của tài khoản gửi và nhận phải thay đổi chính xác, đồng thời trong một giao dịch chuyển khoản; nếu xảy ra lỗi </w:t>
+      </w:r>
+      <w:r>
+        <w:rPr>
+          <w:rFonts w:ascii="Times New Roman" w:hAnsi="Times New Roman" w:cs="Times New Roman"/>
+          <w:color w:val="000000"/>
+          <w:sz w:val="26"/>
+        </w:rPr>
         <w:lastRenderedPageBreak/>
-        <w:t xml:space="preserve">  - Chức năng Lịch sử giao dịch: Hiển thị danh sách đầy đủ lịch sử giao dịch chuyển khoản, nạp/rút tiền kèm thông tin mô tả chi tiết của từng giao dịch.</w:t>
-      </w:r>
+        <w:t>giữa chừng, toàn bộ giao dịch phải được rollback. (3) Hiệu năng xử lý: Phản hồi các yêu cầu API từ Android Client dưới 500ms thông qua định tuyến Gateway và Eureka Server.</w:t>
+      </w:r>
+    </w:p>
+    <w:p>
+      <w:pPr>
+        <w:pStyle w:val="Heading1"/>
+        <w:spacing w:before="240" w:after="240" w:line="360" w:lineRule="auto"/>
+        <w:rPr>
+          <w:rFonts w:ascii="Times New Roman" w:hAnsi="Times New Roman" w:cs="Times New Roman"/>
+          <w:b/>
+          <w:color w:val="000000"/>
+          <w:sz w:val="30"/>
+        </w:rPr>
+      </w:pPr>
+      <w:bookmarkStart w:id="7" w:name="_Toc233883423"/>
+      <w:r>
+        <w:rPr>
+          <w:rFonts w:ascii="Times New Roman" w:hAnsi="Times New Roman" w:cs="Times New Roman"/>
+          <w:b/>
+          <w:color w:val="000000"/>
+          <w:sz w:val="30"/>
+        </w:rPr>
+        <w:t>CHƯƠNG 2. MÔ TẢ LUỒNG HOẠT ĐỘNG CHÍNH VÀ LUỒNG NGOẠI LỆ</w:t>
+      </w:r>
+      <w:bookmarkEnd w:id="7"/>
     </w:p>
     <w:p>
       <w:pPr>
         <w:pStyle w:val="Heading2"/>
-        <w:spacing w:before="120" w:after="120" w:line="248" w:lineRule="auto"/>
-        <w:rPr>
-          <w:rFonts w:ascii="Times New Roman" w:hAnsi="Times New Roman" w:cs="Times New Roman"/>
-          <w:b/>
-          <w:color w:val="000000"/>
-          <w:sz w:val="28"/>
-        </w:rPr>
-      </w:pPr>
-      <w:bookmarkStart w:id="4" w:name="_Toc233881038"/>
-      <w:r>
-        <w:rPr>
-          <w:rFonts w:ascii="Times New Roman" w:hAnsi="Times New Roman" w:cs="Times New Roman"/>
-          <w:b/>
-          <w:color w:val="000000"/>
-          <w:sz w:val="28"/>
-        </w:rPr>
-        <w:t>1.4. Phân tích yêu cầu hệ thống</w:t>
-      </w:r>
-      <w:bookmarkEnd w:id="4"/>
-    </w:p>
-    <w:p>
-      <w:pPr>
-        <w:pStyle w:val="Heading3"/>
-        <w:spacing w:before="80" w:line="248" w:lineRule="auto"/>
-        <w:rPr>
-          <w:rFonts w:ascii="Times New Roman" w:hAnsi="Times New Roman" w:cs="Times New Roman"/>
-          <w:b/>
-          <w:color w:val="000000"/>
-          <w:sz w:val="26"/>
-        </w:rPr>
-      </w:pPr>
-      <w:bookmarkStart w:id="5" w:name="_Toc233881039"/>
-      <w:r>
-        <w:rPr>
-          <w:rFonts w:ascii="Times New Roman" w:hAnsi="Times New Roman" w:cs="Times New Roman"/>
-          <w:b/>
-          <w:color w:val="000000"/>
-          <w:sz w:val="26"/>
-        </w:rPr>
-        <w:t>1.4.1. Yêu cầu chức năng (Functional Requirements)</w:t>
-      </w:r>
-      <w:bookmarkEnd w:id="5"/>
-    </w:p>
-    <w:p>
-      <w:pPr>
-        <w:spacing w:after="80" w:line="248" w:lineRule="auto"/>
+        <w:spacing w:before="120" w:after="120" w:line="360" w:lineRule="auto"/>
+        <w:ind w:left="283"/>
+        <w:rPr>
+          <w:rFonts w:ascii="Times New Roman" w:hAnsi="Times New Roman" w:cs="Times New Roman"/>
+          <w:b/>
+          <w:color w:val="000000"/>
+          <w:sz w:val="26"/>
+        </w:rPr>
+      </w:pPr>
+      <w:bookmarkStart w:id="8" w:name="_Toc233883424"/>
+      <w:r>
+        <w:rPr>
+          <w:rFonts w:ascii="Times New Roman" w:hAnsi="Times New Roman" w:cs="Times New Roman"/>
+          <w:b/>
+          <w:color w:val="000000"/>
+          <w:sz w:val="26"/>
+        </w:rPr>
+        <w:t>2.1. Luồng hoạt động chính (Happy Paths)</w:t>
+      </w:r>
+      <w:bookmarkEnd w:id="8"/>
+    </w:p>
+    <w:p>
+      <w:pPr>
+        <w:spacing w:line="360" w:lineRule="auto"/>
+        <w:ind w:firstLine="709"/>
         <w:jc w:val="both"/>
         <w:rPr>
           <w:rFonts w:ascii="Times New Roman" w:hAnsi="Times New Roman" w:cs="Times New Roman"/>
@@ -2381,35 +2605,13 @@
           <w:color w:val="000000"/>
           <w:sz w:val="26"/>
         </w:rPr>
-        <w:t>Các chức năng yêu cầu bắt buộc đối với hệ thống bao gồm: (1) Đăng ký và xác thực tài khoản qua OTP gửi về Email. (2) Đăng nhập bảo mật lấy JWT Token từ Keycloak Realm 'banking-service'. (3) Hiển thị trực quan số tài khoản và số dư khả dụng thực tế của khách hàng. (4) Chuyển tiền nội bộ an toàn bằng cách kiểm tra số tài khoản đích, tự động hiển thị tên người nhận, yêu cầu xác thực OTP giao dịch. (5) Quét mã QR để lấy số tài khoản đích và điền tự động thông tin giao dịch.</w:t>
-      </w:r>
-    </w:p>
-    <w:p>
-      <w:pPr>
-        <w:pStyle w:val="Heading3"/>
-        <w:spacing w:before="80" w:line="248" w:lineRule="auto"/>
-        <w:rPr>
-          <w:rFonts w:ascii="Times New Roman" w:hAnsi="Times New Roman" w:cs="Times New Roman"/>
-          <w:b/>
-          <w:color w:val="000000"/>
-          <w:sz w:val="26"/>
-        </w:rPr>
-      </w:pPr>
-      <w:bookmarkStart w:id="6" w:name="_Toc233881040"/>
-      <w:r>
-        <w:rPr>
-          <w:rFonts w:ascii="Times New Roman" w:hAnsi="Times New Roman" w:cs="Times New Roman"/>
-          <w:b/>
-          <w:color w:val="000000"/>
-          <w:sz w:val="26"/>
-        </w:rPr>
-        <w:t>1.4.2. Yêu cầu phi chức năng (Non-functional Requirements)</w:t>
-      </w:r>
-      <w:bookmarkEnd w:id="6"/>
-    </w:p>
-    <w:p>
-      <w:pPr>
-        <w:spacing w:after="120" w:line="248" w:lineRule="auto"/>
+        <w:t>Luồng hoạt động chính mô tả tiến trình thực hiện thành công (không xảy ra lỗi) của các nghiệp vụ cốt lõi:</w:t>
+      </w:r>
+    </w:p>
+    <w:p>
+      <w:pPr>
+        <w:spacing w:after="80" w:line="360" w:lineRule="auto"/>
+        <w:ind w:left="850" w:hanging="283"/>
         <w:jc w:val="both"/>
         <w:rPr>
           <w:rFonts w:ascii="Times New Roman" w:hAnsi="Times New Roman" w:cs="Times New Roman"/>
@@ -2423,58 +2625,225 @@
           <w:color w:val="000000"/>
           <w:sz w:val="26"/>
         </w:rPr>
-        <w:t>Các yêu cầu về chất lượng và vận hành hệ thống bao gồm: (1) Tính bảo mật cao: Mã hóa thông tin nhạy cảm và OTP, bảo vệ phiên đăng nhập bằng Access Token có thời gian hết hạn ngắn. (2) Tính nhất quán dữ liệu (Data Consistency): Số dư của tài khoản gửi và nhận phải thay đổi chính xác, đồng thời trong một giao dịch chuyển khoản; nếu xảy ra lỗi giữa chừng, toàn bộ giao dịch phải được rollback. (3) Hiệu năng xử lý: Phản hồi các yêu cầu API từ Android Client dưới 500ms thông qua định tuyến Gateway và Eureka Server.</w:t>
+        <w:t xml:space="preserve">  - Luồng Đăng ký tài khoản mới: (1) Khách hàng nhập thông tin đăng ký hợp lệ. (2) Hệ thống tạo tài khoản tạm thời, sinh mã OTP 6 chữ số và gửi qua Email. (3) Khách hàng nhập mã OTP chính xác vào giao diện ứng dụng. (4) Hệ thống gửi thông tin đăng ký chính thức lên Keycloak để tạo User định danh, đồng thời gọi Account-Service cấp phát số tài khoản thanh toán ngẫu nhiên.</w:t>
+      </w:r>
+    </w:p>
+    <w:p>
+      <w:pPr>
+        <w:spacing w:after="80" w:line="360" w:lineRule="auto"/>
+        <w:ind w:left="850" w:hanging="283"/>
+        <w:jc w:val="both"/>
+        <w:rPr>
+          <w:rFonts w:ascii="Times New Roman" w:hAnsi="Times New Roman" w:cs="Times New Roman"/>
+          <w:color w:val="000000"/>
+          <w:sz w:val="26"/>
+        </w:rPr>
+      </w:pPr>
+      <w:r>
+        <w:rPr>
+          <w:rFonts w:ascii="Times New Roman" w:hAnsi="Times New Roman" w:cs="Times New Roman"/>
+          <w:color w:val="000000"/>
+          <w:sz w:val="26"/>
+        </w:rPr>
+        <w:t xml:space="preserve">  - Luồng Chuyển tiền nội bộ: (1) Khách hàng nhập số tài khoản đích. (2) Ứng dụng di động tự động gọi API Gateway để truy vấn và hiển thị họ tên chủ tài khoản nhận. (3) Khách hàng nhập số tiền và nội dung, nhấn xác nhận. (4) Hệ thống gửi mã OTP xác nhận giao dịch qua email người gửi. (5) Khách hàng nhập đúng OTP, hệ thống thực hiện đồng thời việc trừ tiền tài khoản gửi và cộng tiền tài khoản nhận, lưu lịch sử giao dịch.</w:t>
+      </w:r>
+    </w:p>
+    <w:p>
+      <w:pPr>
+        <w:spacing w:after="120" w:line="360" w:lineRule="auto"/>
+        <w:ind w:left="850" w:hanging="283"/>
+        <w:jc w:val="both"/>
+        <w:rPr>
+          <w:rFonts w:ascii="Times New Roman" w:hAnsi="Times New Roman" w:cs="Times New Roman"/>
+          <w:color w:val="000000"/>
+          <w:sz w:val="26"/>
+        </w:rPr>
+      </w:pPr>
+      <w:r>
+        <w:rPr>
+          <w:rFonts w:ascii="Times New Roman" w:hAnsi="Times New Roman" w:cs="Times New Roman"/>
+          <w:color w:val="000000"/>
+          <w:sz w:val="26"/>
+        </w:rPr>
+        <w:t xml:space="preserve">  - Luồng Chuyển khoản nhanh bằng QR Code: (1) Người nhận hiển thị mã QR tài khoản cá nhân. (2) Người gửi sử dụng chức năng quét QR trên app di động để quét. (3) Ứng dụng tự động giải mã thông tin QR, điền số tài khoản thụ hưởng và hiển thị họ tên người nhận trên màn hình giao dịch chuyển khoản. (4) Người gửi tiến hành các bước xác thực OTP để hoàn tất giao dịch chuyển tiền.</w:t>
+      </w:r>
+    </w:p>
+    <w:p>
+      <w:pPr>
+        <w:pStyle w:val="Heading2"/>
+        <w:spacing w:before="120" w:after="120" w:line="360" w:lineRule="auto"/>
+        <w:ind w:left="283"/>
+        <w:rPr>
+          <w:rFonts w:ascii="Times New Roman" w:hAnsi="Times New Roman" w:cs="Times New Roman"/>
+          <w:b/>
+          <w:color w:val="000000"/>
+          <w:sz w:val="26"/>
+        </w:rPr>
+      </w:pPr>
+      <w:bookmarkStart w:id="9" w:name="_Toc233883425"/>
+      <w:r>
+        <w:rPr>
+          <w:rFonts w:ascii="Times New Roman" w:hAnsi="Times New Roman" w:cs="Times New Roman"/>
+          <w:b/>
+          <w:color w:val="000000"/>
+          <w:sz w:val="26"/>
+        </w:rPr>
+        <w:t>2.2. Luồng xử lý ngoại lệ và ràng buộc logic (Exceptional Flows)</w:t>
+      </w:r>
+      <w:bookmarkEnd w:id="9"/>
+    </w:p>
+    <w:p>
+      <w:pPr>
+        <w:spacing w:line="360" w:lineRule="auto"/>
+        <w:ind w:firstLine="709"/>
+        <w:jc w:val="both"/>
+        <w:rPr>
+          <w:rFonts w:ascii="Times New Roman" w:hAnsi="Times New Roman" w:cs="Times New Roman"/>
+          <w:color w:val="000000"/>
+          <w:sz w:val="26"/>
+        </w:rPr>
+      </w:pPr>
+      <w:r>
+        <w:rPr>
+          <w:rFonts w:ascii="Times New Roman" w:hAnsi="Times New Roman" w:cs="Times New Roman"/>
+          <w:color w:val="000000"/>
+          <w:sz w:val="26"/>
+        </w:rPr>
+        <w:t>Để bảo vệ an toàn giao dịch và tính nhất quán dữ liệu, hệ thống bắt buộc phải kiểm tra và xử lý các luồng ngoại lệ sau:</w:t>
+      </w:r>
+    </w:p>
+    <w:p>
+      <w:pPr>
+        <w:spacing w:after="80" w:line="360" w:lineRule="auto"/>
+        <w:ind w:left="850" w:hanging="283"/>
+        <w:jc w:val="both"/>
+        <w:rPr>
+          <w:rFonts w:ascii="Times New Roman" w:hAnsi="Times New Roman" w:cs="Times New Roman"/>
+          <w:color w:val="000000"/>
+          <w:sz w:val="26"/>
+        </w:rPr>
+      </w:pPr>
+      <w:r>
+        <w:rPr>
+          <w:rFonts w:ascii="Times New Roman" w:hAnsi="Times New Roman" w:cs="Times New Roman"/>
+          <w:color w:val="000000"/>
+          <w:sz w:val="26"/>
+        </w:rPr>
+        <w:lastRenderedPageBreak/>
+        <w:t xml:space="preserve">  - Ngoại lệ Chuyển tiền vượt quá số dư khả dụng: Khi người dùng nhấn nút chuyển khoản, hệ thống sẽ thực hiện kiểm tra điều kiện số tiền giao dịch phải nhỏ hơn số dư khả dụng thực tế. Nếu số tiền chuyển lớn hơn số dư hiện tại, hệ thống lập tức chặn giao dịch và hiển thị thông báo lỗi 'Số dư tài khoản không đủ để thực hiện giao dịch này'.</w:t>
+      </w:r>
+    </w:p>
+    <w:p>
+      <w:pPr>
+        <w:spacing w:after="80" w:line="360" w:lineRule="auto"/>
+        <w:ind w:left="850" w:hanging="283"/>
+        <w:jc w:val="both"/>
+        <w:rPr>
+          <w:rFonts w:ascii="Times New Roman" w:hAnsi="Times New Roman" w:cs="Times New Roman"/>
+          <w:color w:val="000000"/>
+          <w:sz w:val="26"/>
+        </w:rPr>
+      </w:pPr>
+      <w:r>
+        <w:rPr>
+          <w:rFonts w:ascii="Times New Roman" w:hAnsi="Times New Roman" w:cs="Times New Roman"/>
+          <w:color w:val="000000"/>
+          <w:sz w:val="26"/>
+        </w:rPr>
+        <w:t xml:space="preserve">  - Ngoại lệ Nhập sai mã OTP hoặc OTP hết hạn: Mã OTP giao dịch và OTP kích hoạt tài khoản chỉ có hiệu lực sử dụng trong vòng 3 phút. Nếu người dùng nhập mã OTP đã hết hạn, hoặc nhập sai mã OTP quá 3 lần liên tiếp, hệ thống sẽ từ chối giao dịch, huỷ mã OTP cũ và yêu cầu người dùng yêu cầu gửi lại mã OTP mới.</w:t>
+      </w:r>
+    </w:p>
+    <w:p>
+      <w:pPr>
+        <w:spacing w:after="80" w:line="360" w:lineRule="auto"/>
+        <w:ind w:left="850" w:hanging="283"/>
+        <w:jc w:val="both"/>
+        <w:rPr>
+          <w:rFonts w:ascii="Times New Roman" w:hAnsi="Times New Roman" w:cs="Times New Roman"/>
+          <w:color w:val="000000"/>
+          <w:sz w:val="26"/>
+        </w:rPr>
+      </w:pPr>
+      <w:r>
+        <w:rPr>
+          <w:rFonts w:ascii="Times New Roman" w:hAnsi="Times New Roman" w:cs="Times New Roman"/>
+          <w:color w:val="000000"/>
+          <w:sz w:val="26"/>
+        </w:rPr>
+        <w:t xml:space="preserve">  - Ngoại lệ Nhập số tài khoản thụ hưởng không tồn tại: Khi người dùng nhập số tài khoản đích, API Gateway sẽ gọi đến Account-Service để kiểm tra. Nếu không tìm thấy số tài khoản này trong cơ sở dữ liệu, hệ thống trả về lỗi 404 và hiển thị thông báo trên giao diện di động: 'Tài khoản thụ hưởng không tồn tại. Vui lòng kiểm tra lại'.</w:t>
+      </w:r>
+    </w:p>
+    <w:p>
+      <w:pPr>
+        <w:spacing w:after="120" w:line="360" w:lineRule="auto"/>
+        <w:ind w:left="850" w:hanging="283"/>
+        <w:jc w:val="both"/>
+        <w:rPr>
+          <w:rFonts w:ascii="Times New Roman" w:hAnsi="Times New Roman" w:cs="Times New Roman"/>
+          <w:color w:val="000000"/>
+          <w:sz w:val="26"/>
+        </w:rPr>
+      </w:pPr>
+      <w:r>
+        <w:rPr>
+          <w:rFonts w:ascii="Times New Roman" w:hAnsi="Times New Roman" w:cs="Times New Roman"/>
+          <w:color w:val="000000"/>
+          <w:sz w:val="26"/>
+        </w:rPr>
+        <w:t xml:space="preserve">  - Ràng buộc nhập CCCD không đúng định dạng: Trong quá trình đăng ký tài khoản, trường thông tin Số định danh (CCCD) được kiểm soát nghiêm ngặt. Hệ thống sẽ kiểm tra chiều dài chuỗi CCCD phải đúng bằng 12 chữ số. Nếu người dùng nhập thiếu hoặc thừa ký tự, ứng dụng Android lập tức hiển thị cảnh báo định dạng và không cho phép gửi yêu cầu lên máy chủ backend.</w:t>
       </w:r>
     </w:p>
     <w:p>
       <w:pPr>
         <w:pStyle w:val="Heading1"/>
-        <w:spacing w:before="240" w:after="240" w:line="248" w:lineRule="auto"/>
-        <w:rPr>
-          <w:rFonts w:ascii="Times New Roman" w:hAnsi="Times New Roman" w:cs="Times New Roman"/>
-          <w:b/>
-          <w:color w:val="000000"/>
-          <w:sz w:val="32"/>
-        </w:rPr>
-      </w:pPr>
-      <w:bookmarkStart w:id="7" w:name="_Toc233881041"/>
-      <w:r>
-        <w:rPr>
-          <w:rFonts w:ascii="Times New Roman" w:hAnsi="Times New Roman" w:cs="Times New Roman"/>
-          <w:b/>
-          <w:color w:val="000000"/>
-          <w:sz w:val="32"/>
-        </w:rPr>
-        <w:t>CHƯƠNG 2. MÔ TẢ LUỒNG HOẠT ĐỘNG CHÍNH VÀ LUỒNG NGOẠI LỆ</w:t>
-      </w:r>
-      <w:bookmarkEnd w:id="7"/>
+        <w:spacing w:before="240" w:after="240" w:line="360" w:lineRule="auto"/>
+        <w:rPr>
+          <w:rFonts w:ascii="Times New Roman" w:hAnsi="Times New Roman" w:cs="Times New Roman"/>
+          <w:b/>
+          <w:color w:val="000000"/>
+          <w:sz w:val="30"/>
+        </w:rPr>
+      </w:pPr>
+      <w:bookmarkStart w:id="10" w:name="_Toc233883426"/>
+      <w:r>
+        <w:rPr>
+          <w:rFonts w:ascii="Times New Roman" w:hAnsi="Times New Roman" w:cs="Times New Roman"/>
+          <w:b/>
+          <w:color w:val="000000"/>
+          <w:sz w:val="30"/>
+        </w:rPr>
+        <w:t>CHƯƠNG 3. CẤU TRÚC HỆ THỐNG MULTI-SERVICE VÀ BẢO MẬT KEYCLOAK</w:t>
+      </w:r>
+      <w:bookmarkEnd w:id="10"/>
     </w:p>
     <w:p>
       <w:pPr>
         <w:pStyle w:val="Heading2"/>
-        <w:spacing w:before="120" w:after="120" w:line="248" w:lineRule="auto"/>
-        <w:rPr>
-          <w:rFonts w:ascii="Times New Roman" w:hAnsi="Times New Roman" w:cs="Times New Roman"/>
-          <w:b/>
-          <w:color w:val="000000"/>
-          <w:sz w:val="28"/>
-        </w:rPr>
-      </w:pPr>
-      <w:bookmarkStart w:id="8" w:name="_Toc233881042"/>
-      <w:r>
-        <w:rPr>
-          <w:rFonts w:ascii="Times New Roman" w:hAnsi="Times New Roman" w:cs="Times New Roman"/>
-          <w:b/>
-          <w:color w:val="000000"/>
-          <w:sz w:val="28"/>
-        </w:rPr>
-        <w:t>2.1. Luồng hoạt động chính (Happy Paths)</w:t>
-      </w:r>
-      <w:bookmarkEnd w:id="8"/>
-    </w:p>
-    <w:p>
-      <w:pPr>
-        <w:spacing w:after="120" w:line="248" w:lineRule="auto"/>
+        <w:spacing w:before="120" w:after="120" w:line="360" w:lineRule="auto"/>
+        <w:ind w:left="283"/>
+        <w:rPr>
+          <w:rFonts w:ascii="Times New Roman" w:hAnsi="Times New Roman" w:cs="Times New Roman"/>
+          <w:b/>
+          <w:color w:val="000000"/>
+          <w:sz w:val="26"/>
+        </w:rPr>
+      </w:pPr>
+      <w:bookmarkStart w:id="11" w:name="_Toc233883427"/>
+      <w:r>
+        <w:rPr>
+          <w:rFonts w:ascii="Times New Roman" w:hAnsi="Times New Roman" w:cs="Times New Roman"/>
+          <w:b/>
+          <w:color w:val="000000"/>
+          <w:sz w:val="26"/>
+        </w:rPr>
+        <w:t>3.1. Cấu trúc Multi-service (Microservices) độc lập</w:t>
+      </w:r>
+      <w:bookmarkEnd w:id="11"/>
+    </w:p>
+    <w:p>
+      <w:pPr>
+        <w:spacing w:line="360" w:lineRule="auto"/>
+        <w:ind w:firstLine="709"/>
         <w:jc w:val="both"/>
         <w:rPr>
           <w:rFonts w:ascii="Times New Roman" w:hAnsi="Times New Roman" w:cs="Times New Roman"/>
@@ -2488,12 +2857,13 @@
           <w:color w:val="000000"/>
           <w:sz w:val="26"/>
         </w:rPr>
-        <w:t>Luồng hoạt động chính mô tả tiến trình thực hiện thành công (không xảy ra lỗi) của các nghiệp vụ cốt lõi:</w:t>
-      </w:r>
-    </w:p>
-    <w:p>
-      <w:pPr>
-        <w:spacing w:after="80" w:line="248" w:lineRule="auto"/>
+        <w:t>Hệ thống backend của NLU Banking App được phát triển theo kiến trúc Multi-service (Microservices) gồm 7 dịch vụ Spring Boot độc lập hoạt động kết hợp với nhau:</w:t>
+      </w:r>
+    </w:p>
+    <w:p>
+      <w:pPr>
+        <w:spacing w:after="80" w:line="360" w:lineRule="auto"/>
+        <w:ind w:left="850" w:hanging="283"/>
         <w:jc w:val="both"/>
         <w:rPr>
           <w:rFonts w:ascii="Times New Roman" w:hAnsi="Times New Roman" w:cs="Times New Roman"/>
@@ -2507,12 +2877,14 @@
           <w:color w:val="000000"/>
           <w:sz w:val="26"/>
         </w:rPr>
-        <w:t xml:space="preserve">  - Luồng Đăng ký tài khoản mới: (1) Khách hàng nhập thông tin đăng ký hợp lệ. (2) Hệ thống tạo tài khoản tạm thời, sinh mã OTP 6 chữ số và gửi qua Email. (3) Khách hàng nhập mã OTP chính xác vào giao diện ứng dụng. (4) Hệ thống gửi thông tin đăng ký chính thức lên Keycloak để tạo User định danh, đồng thời gọi Account-Service cấp phát số tài khoản thanh toán ngẫu nhiên.</w:t>
-      </w:r>
-    </w:p>
-    <w:p>
-      <w:pPr>
-        <w:spacing w:after="80" w:line="248" w:lineRule="auto"/>
+        <w:lastRenderedPageBreak/>
+        <w:t xml:space="preserve">  - Service-Registry (Cổng quản lý Eureka Server): Đăng ký và quản lý danh sách các microservices đang hoạt động, cho phép các dịch vụ tự tìm thấy nhau mà không cần gán cứng IP.</w:t>
+      </w:r>
+    </w:p>
+    <w:p>
+      <w:pPr>
+        <w:spacing w:after="80" w:line="360" w:lineRule="auto"/>
+        <w:ind w:left="850" w:hanging="283"/>
         <w:jc w:val="both"/>
         <w:rPr>
           <w:rFonts w:ascii="Times New Roman" w:hAnsi="Times New Roman" w:cs="Times New Roman"/>
@@ -2526,12 +2898,13 @@
           <w:color w:val="000000"/>
           <w:sz w:val="26"/>
         </w:rPr>
-        <w:t xml:space="preserve">  - Luồng Chuyển tiền nội bộ: (1) Khách hàng nhập số tài khoản đích. (2) Ứng dụng di động tự động gọi API Gateway để truy vấn và hiển thị họ tên chủ tài khoản nhận. (3) Khách hàng nhập số tiền và nội dung, nhấn xác nhận. (4) Hệ thống gửi mã OTP xác nhận giao dịch qua email người gửi. (5) Khách hàng nhập đúng OTP, hệ thống thực hiện đồng thời việc trừ tiền tài khoản gửi và cộng tiền tài khoản nhận, lưu lịch sử giao dịch.</w:t>
-      </w:r>
-    </w:p>
-    <w:p>
-      <w:pPr>
-        <w:spacing w:after="120" w:line="248" w:lineRule="auto"/>
+        <w:t xml:space="preserve">  - API-Gateway: Đóng vai trò là cổng ngõ ra vào duy nhất cho các yêu cầu API từ Android Client. Gateway chịu trách nhiệm định tuyến cuộc gọi API đến dịch vụ tương ứng và chặn các cuộc gọi không có JWT token hợp lệ.</w:t>
+      </w:r>
+    </w:p>
+    <w:p>
+      <w:pPr>
+        <w:spacing w:after="80" w:line="360" w:lineRule="auto"/>
+        <w:ind w:left="850" w:hanging="283"/>
         <w:jc w:val="both"/>
         <w:rPr>
           <w:rFonts w:ascii="Times New Roman" w:hAnsi="Times New Roman" w:cs="Times New Roman"/>
@@ -2545,36 +2918,185 @@
           <w:color w:val="000000"/>
           <w:sz w:val="26"/>
         </w:rPr>
-        <w:t xml:space="preserve">  - Luồng Chuyển khoản nhanh bằng QR Code: (1) Người nhận hiển thị mã QR tài khoản cá nhân. (2) Người gửi sử dụng chức năng quét QR trên app di động để quét. (3) Ứng dụng tự động giải mã thông tin QR, điền số tài khoản thụ hưởng và hiển thị họ tên người nhận trên màn hình giao dịch chuyển khoản. (4) Người gửi tiến hành các bước xác thực OTP để hoàn tất giao dịch chuyển tiền.</w:t>
+        <w:t xml:space="preserve">  - User-Service: Quản lý đăng ký hồ sơ khách hàng, sinh mã và lưu trữ OTP kích hoạt, liên kết tài khoản định danh với máy chủ Keycloak.</w:t>
+      </w:r>
+    </w:p>
+    <w:p>
+      <w:pPr>
+        <w:spacing w:after="80" w:line="360" w:lineRule="auto"/>
+        <w:ind w:left="850" w:hanging="283"/>
+        <w:jc w:val="both"/>
+        <w:rPr>
+          <w:rFonts w:ascii="Times New Roman" w:hAnsi="Times New Roman" w:cs="Times New Roman"/>
+          <w:color w:val="000000"/>
+          <w:sz w:val="26"/>
+        </w:rPr>
+      </w:pPr>
+      <w:r>
+        <w:rPr>
+          <w:rFonts w:ascii="Times New Roman" w:hAnsi="Times New Roman" w:cs="Times New Roman"/>
+          <w:color w:val="000000"/>
+          <w:sz w:val="26"/>
+        </w:rPr>
+        <w:t xml:space="preserve">  - Account-Service: Quản lý số tài khoản ngân hàng, thông tin số dư khả dụng và trạng thái tài khoản.</w:t>
+      </w:r>
+    </w:p>
+    <w:p>
+      <w:pPr>
+        <w:spacing w:after="80" w:line="360" w:lineRule="auto"/>
+        <w:ind w:left="850" w:hanging="283"/>
+        <w:jc w:val="both"/>
+        <w:rPr>
+          <w:rFonts w:ascii="Times New Roman" w:hAnsi="Times New Roman" w:cs="Times New Roman"/>
+          <w:color w:val="000000"/>
+          <w:sz w:val="26"/>
+        </w:rPr>
+      </w:pPr>
+      <w:r>
+        <w:rPr>
+          <w:rFonts w:ascii="Times New Roman" w:hAnsi="Times New Roman" w:cs="Times New Roman"/>
+          <w:color w:val="000000"/>
+          <w:sz w:val="26"/>
+        </w:rPr>
+        <w:t xml:space="preserve">  - Fund-Transfer-Service: Xử lý và ghi nhận toàn bộ lịch sử các giao dịch chuyển khoản nội bộ giữa các tài khoản khách hàng.</w:t>
+      </w:r>
+    </w:p>
+    <w:p>
+      <w:pPr>
+        <w:spacing w:after="80" w:line="360" w:lineRule="auto"/>
+        <w:ind w:left="850" w:hanging="283"/>
+        <w:jc w:val="both"/>
+        <w:rPr>
+          <w:rFonts w:ascii="Times New Roman" w:hAnsi="Times New Roman" w:cs="Times New Roman"/>
+          <w:color w:val="000000"/>
+          <w:sz w:val="26"/>
+        </w:rPr>
+      </w:pPr>
+      <w:r>
+        <w:rPr>
+          <w:rFonts w:ascii="Times New Roman" w:hAnsi="Times New Roman" w:cs="Times New Roman"/>
+          <w:color w:val="000000"/>
+          <w:sz w:val="26"/>
+        </w:rPr>
+        <w:t xml:space="preserve">  - Transaction-Service: Xử lý và ghi nhận lịch sử các giao dịch nạp tiền, rút tiền trực tiếp từ tài khoản.</w:t>
+      </w:r>
+    </w:p>
+    <w:p>
+      <w:pPr>
+        <w:spacing w:after="120" w:line="360" w:lineRule="auto"/>
+        <w:ind w:left="850" w:hanging="283"/>
+        <w:jc w:val="both"/>
+        <w:rPr>
+          <w:rFonts w:ascii="Times New Roman" w:hAnsi="Times New Roman" w:cs="Times New Roman"/>
+          <w:color w:val="000000"/>
+          <w:sz w:val="26"/>
+        </w:rPr>
+      </w:pPr>
+      <w:r>
+        <w:rPr>
+          <w:rFonts w:ascii="Times New Roman" w:hAnsi="Times New Roman" w:cs="Times New Roman"/>
+          <w:color w:val="000000"/>
+          <w:sz w:val="26"/>
+        </w:rPr>
+        <w:t xml:space="preserve">  - Sequence-Generator: Sinh chuỗi số tự động tăng dùng để tạo số tài khoản ngân hàng đảm bảo tính duy nhất trên toàn hệ thống.</w:t>
       </w:r>
     </w:p>
     <w:p>
       <w:pPr>
         <w:pStyle w:val="Heading2"/>
-        <w:spacing w:before="120" w:after="120" w:line="248" w:lineRule="auto"/>
-        <w:rPr>
-          <w:rFonts w:ascii="Times New Roman" w:hAnsi="Times New Roman" w:cs="Times New Roman"/>
-          <w:b/>
-          <w:color w:val="000000"/>
-          <w:sz w:val="28"/>
-        </w:rPr>
-      </w:pPr>
-      <w:bookmarkStart w:id="9" w:name="_Toc233881043"/>
-      <w:r>
-        <w:rPr>
-          <w:rFonts w:ascii="Times New Roman" w:hAnsi="Times New Roman" w:cs="Times New Roman"/>
-          <w:b/>
-          <w:color w:val="000000"/>
-          <w:sz w:val="28"/>
+        <w:spacing w:before="120" w:after="120" w:line="360" w:lineRule="auto"/>
+        <w:ind w:left="283"/>
+        <w:rPr>
+          <w:rFonts w:ascii="Times New Roman" w:hAnsi="Times New Roman" w:cs="Times New Roman"/>
+          <w:b/>
+          <w:color w:val="000000"/>
+          <w:sz w:val="26"/>
+        </w:rPr>
+      </w:pPr>
+      <w:bookmarkStart w:id="12" w:name="_Toc233883428"/>
+      <w:r>
+        <w:rPr>
+          <w:rFonts w:ascii="Times New Roman" w:hAnsi="Times New Roman" w:cs="Times New Roman"/>
+          <w:b/>
+          <w:color w:val="000000"/>
+          <w:sz w:val="26"/>
+        </w:rPr>
+        <w:t>3.2. Cơ chế bảo mật và phân quyền định danh với Keycloak</w:t>
+      </w:r>
+      <w:bookmarkEnd w:id="12"/>
+    </w:p>
+    <w:p>
+      <w:pPr>
+        <w:spacing w:line="360" w:lineRule="auto"/>
+        <w:ind w:firstLine="709"/>
+        <w:jc w:val="both"/>
+        <w:rPr>
+          <w:rFonts w:ascii="Times New Roman" w:hAnsi="Times New Roman" w:cs="Times New Roman"/>
+          <w:color w:val="000000"/>
+          <w:sz w:val="26"/>
+        </w:rPr>
+      </w:pPr>
+      <w:r>
+        <w:rPr>
+          <w:rFonts w:ascii="Times New Roman" w:hAnsi="Times New Roman" w:cs="Times New Roman"/>
+          <w:color w:val="000000"/>
+          <w:sz w:val="26"/>
+        </w:rPr>
+        <w:t>Dự án tích hợp máy chủ định danh Keycloak để quản lý bảo mật tập trung cho toàn hệ thống. Khi khách hàng đăng nhập thành công, Keycloak trả về mã Access Token dạng JWT. API Gateway sẽ giải mã chữ ký token qua Keycloak. Nếu token hợp lệ, Gateway định tuyến yêu cầu đến dịch vụ nghiệp vụ tương ứng (ví dụ: Fund-Transfer-Service). Đồng thời, User-Service sử dụng Keycloak Admin Client để tự động đồng bộ tài khoản định danh lên Keycloak ngay khi khách hàng xác nhận OTP kích hoạt tài khoản thành công.</w:t>
+      </w:r>
+    </w:p>
+    <w:p>
+      <w:pPr>
+        <w:pStyle w:val="Heading1"/>
+        <w:spacing w:before="240" w:after="240" w:line="360" w:lineRule="auto"/>
+        <w:rPr>
+          <w:rFonts w:ascii="Times New Roman" w:hAnsi="Times New Roman" w:cs="Times New Roman"/>
+          <w:b/>
+          <w:color w:val="000000"/>
+          <w:sz w:val="30"/>
+        </w:rPr>
+      </w:pPr>
+      <w:bookmarkStart w:id="13" w:name="_Toc233883429"/>
+      <w:r>
+        <w:rPr>
+          <w:rFonts w:ascii="Times New Roman" w:hAnsi="Times New Roman" w:cs="Times New Roman"/>
+          <w:b/>
+          <w:color w:val="000000"/>
+          <w:sz w:val="30"/>
         </w:rPr>
         <w:lastRenderedPageBreak/>
-        <w:t>2.2. Luồng xử lý ngoại lệ và ràng buộc logic (Exceptional Flows)</w:t>
-      </w:r>
-      <w:bookmarkEnd w:id="9"/>
-    </w:p>
-    <w:p>
-      <w:pPr>
-        <w:spacing w:after="120" w:line="248" w:lineRule="auto"/>
+        <w:t>CHƯƠNG 4. THIẾT KẾ HỆ THỐNG VÀ CƠ SỞ DỮ LIỆU</w:t>
+      </w:r>
+      <w:bookmarkEnd w:id="13"/>
+    </w:p>
+    <w:p>
+      <w:pPr>
+        <w:pStyle w:val="Heading2"/>
+        <w:spacing w:before="120" w:after="120" w:line="360" w:lineRule="auto"/>
+        <w:ind w:left="283"/>
+        <w:rPr>
+          <w:rFonts w:ascii="Times New Roman" w:hAnsi="Times New Roman" w:cs="Times New Roman"/>
+          <w:b/>
+          <w:color w:val="000000"/>
+          <w:sz w:val="26"/>
+        </w:rPr>
+      </w:pPr>
+      <w:bookmarkStart w:id="14" w:name="_Toc233883430"/>
+      <w:r>
+        <w:rPr>
+          <w:rFonts w:ascii="Times New Roman" w:hAnsi="Times New Roman" w:cs="Times New Roman"/>
+          <w:b/>
+          <w:color w:val="000000"/>
+          <w:sz w:val="26"/>
+        </w:rPr>
+        <w:t>4.1. Thiết kế cơ sở dữ liệu hệ thống (Database Schema Design)</w:t>
+      </w:r>
+      <w:bookmarkEnd w:id="14"/>
+    </w:p>
+    <w:p>
+      <w:pPr>
+        <w:spacing w:line="360" w:lineRule="auto"/>
+        <w:ind w:firstLine="709"/>
         <w:jc w:val="both"/>
         <w:rPr>
           <w:rFonts w:ascii="Times New Roman" w:hAnsi="Times New Roman" w:cs="Times New Roman"/>
@@ -2588,12 +3110,37 @@
           <w:color w:val="000000"/>
           <w:sz w:val="26"/>
         </w:rPr>
-        <w:t>Để bảo vệ an toàn giao dịch và tính nhất quán dữ liệu, hệ thống bắt buộc phải kiểm tra và xử lý các luồng ngoại lệ sau:</w:t>
-      </w:r>
-    </w:p>
-    <w:p>
-      <w:pPr>
-        <w:spacing w:after="80" w:line="248" w:lineRule="auto"/>
+        <w:t>Hệ thống áp dụng mô hình kiến trúc độc lập cơ sở dữ liệu cho từng microservice (Database per Service) để bảo toàn tính đóng gói. Cơ sở dữ liệu quan hệ MySQL được thiết kế chặt chẽ: (1) Bảng 'accounts' trong Account-Service lưu trữ các trường: số tài khoản, số dư khả dụng, mã CIF, trạng thái tài khoản. (2) Bảng 'transactions' trong Transaction-Service lưu lịch sử nạp/rút tiền. (3) Bảng 'transfers' trong Fund-Transfer-Service ghi nhận lịch sử chuyển khoản nội bộ gồm: mã giao dịch, tài khoản gửi, tài khoản nhận, số tiền, nội dung, thời gian và trạng thái xác thực. Các bảng đều được tối ưu hóa chỉ mục (index) giúp tăng tốc độ truy vấn giao dịch.</w:t>
+      </w:r>
+    </w:p>
+    <w:p>
+      <w:pPr>
+        <w:pStyle w:val="Heading2"/>
+        <w:spacing w:before="120" w:after="120" w:line="360" w:lineRule="auto"/>
+        <w:ind w:left="283"/>
+        <w:rPr>
+          <w:rFonts w:ascii="Times New Roman" w:hAnsi="Times New Roman" w:cs="Times New Roman"/>
+          <w:b/>
+          <w:color w:val="000000"/>
+          <w:sz w:val="26"/>
+        </w:rPr>
+      </w:pPr>
+      <w:bookmarkStart w:id="15" w:name="_Toc233883431"/>
+      <w:r>
+        <w:rPr>
+          <w:rFonts w:ascii="Times New Roman" w:hAnsi="Times New Roman" w:cs="Times New Roman"/>
+          <w:b/>
+          <w:color w:val="000000"/>
+          <w:sz w:val="26"/>
+        </w:rPr>
+        <w:t>4.2. Kiến trúc giao tiếp và sơ đồ tuần tự (Sequence Diagrams)</w:t>
+      </w:r>
+      <w:bookmarkEnd w:id="15"/>
+    </w:p>
+    <w:p>
+      <w:pPr>
+        <w:spacing w:line="360" w:lineRule="auto"/>
+        <w:ind w:firstLine="709"/>
         <w:jc w:val="both"/>
         <w:rPr>
           <w:rFonts w:ascii="Times New Roman" w:hAnsi="Times New Roman" w:cs="Times New Roman"/>
@@ -2607,12 +3154,60 @@
           <w:color w:val="000000"/>
           <w:sz w:val="26"/>
         </w:rPr>
-        <w:t xml:space="preserve">  - Ngoại lệ Chuyển tiền vượt quá số dư khả dụng: Khi người dùng nhấn nút chuyển khoản, hệ thống sẽ thực hiện kiểm tra điều kiện số tiền giao dịch phải nhỏ hơn số dư khả dụng thực tế. Nếu số tiền chuyển lớn hơn số dư hiện tại, hệ thống lập tức chặn giao dịch và hiển thị thông báo lỗi 'Số dư tài khoản không đủ để thực hiện giao dịch này'.</w:t>
-      </w:r>
-    </w:p>
-    <w:p>
-      <w:pPr>
-        <w:spacing w:after="80" w:line="248" w:lineRule="auto"/>
+        <w:t>Tiến trình giao tiếp giữa Android Client và các microservices được mô tả chi tiết thông qua sơ đồ tuần tự: (1) Android Client gửi yêu cầu API kèm theo Access Token dạng JWT trong Header đến API Gateway. (2) API Gateway giải mã chữ ký token qua Keycloak. Nếu token hợp lệ, Gateway định tuyến yêu cầu đến dịch vụ nghiệp vụ tương ứng (ví dụ: Fund-Transfer-Service). (3) Dịch vụ nghiệp vụ gọi giao tiếp liên dịch vụ (Inter-service Communication) sang Account-Service để cập nhật số dư của tài khoản gửi và nhận, đảm bảo giao dịch được thực hiện đồng nhất và an toàn.</w:t>
+      </w:r>
+    </w:p>
+    <w:p>
+      <w:pPr>
+        <w:pStyle w:val="Heading1"/>
+        <w:spacing w:before="240" w:after="240" w:line="360" w:lineRule="auto"/>
+        <w:rPr>
+          <w:rFonts w:ascii="Times New Roman" w:hAnsi="Times New Roman" w:cs="Times New Roman"/>
+          <w:b/>
+          <w:color w:val="000000"/>
+          <w:sz w:val="30"/>
+        </w:rPr>
+      </w:pPr>
+      <w:bookmarkStart w:id="16" w:name="_Toc233883432"/>
+      <w:r>
+        <w:rPr>
+          <w:rFonts w:ascii="Times New Roman" w:hAnsi="Times New Roman" w:cs="Times New Roman"/>
+          <w:b/>
+          <w:color w:val="000000"/>
+          <w:sz w:val="30"/>
+        </w:rPr>
+        <w:t>CHƯƠNG 5. HƯỚNG DẪN CẤU HÌNH VÀ KHỞI CHẠY ĐỒ ÁN</w:t>
+      </w:r>
+      <w:bookmarkEnd w:id="16"/>
+    </w:p>
+    <w:p>
+      <w:pPr>
+        <w:pStyle w:val="Heading2"/>
+        <w:spacing w:before="120" w:after="120" w:line="360" w:lineRule="auto"/>
+        <w:ind w:left="283"/>
+        <w:rPr>
+          <w:rFonts w:ascii="Times New Roman" w:hAnsi="Times New Roman" w:cs="Times New Roman"/>
+          <w:b/>
+          <w:color w:val="000000"/>
+          <w:sz w:val="26"/>
+        </w:rPr>
+      </w:pPr>
+      <w:bookmarkStart w:id="17" w:name="_Toc233883433"/>
+      <w:r>
+        <w:rPr>
+          <w:rFonts w:ascii="Times New Roman" w:hAnsi="Times New Roman" w:cs="Times New Roman"/>
+          <w:b/>
+          <w:color w:val="000000"/>
+          <w:sz w:val="26"/>
+        </w:rPr>
+        <w:t>5.1. Thiết lập môi trường và khởi chạy Docker Compose</w:t>
+      </w:r>
+      <w:bookmarkEnd w:id="17"/>
+    </w:p>
+    <w:p>
+      <w:pPr>
+        <w:spacing w:line="360" w:lineRule="auto"/>
+        <w:ind w:firstLine="709"/>
         <w:jc w:val="both"/>
         <w:rPr>
           <w:rFonts w:ascii="Times New Roman" w:hAnsi="Times New Roman" w:cs="Times New Roman"/>
@@ -2626,12 +3221,38 @@
           <w:color w:val="000000"/>
           <w:sz w:val="26"/>
         </w:rPr>
-        <w:t xml:space="preserve">  - Ngoại lệ Nhập sai mã OTP hoặc OTP hết hạn: Mã OTP giao dịch và OTP kích hoạt tài khoản chỉ có hiệu lực sử dụng trong vòng 3 phút. Nếu người dùng nhập mã OTP đã hết hạn, hoặc nhập sai mã OTP quá 3 lần liên tiếp, hệ thống sẽ từ chối giao dịch, huỷ mã OTP cũ và yêu cầu người dùng yêu cầu gửi lại mã OTP mới.</w:t>
-      </w:r>
-    </w:p>
-    <w:p>
-      <w:pPr>
-        <w:spacing w:after="80" w:line="248" w:lineRule="auto"/>
+        <w:t>Để triển khai đồ án, máy tính thử nghiệm cần cài đặt sẵn Docker, Docker Compose, Git, Java JDK 11 hoặc JDK 17 và Android Studio. Bước đầu tiên, dẫn đến thư mục chứa file 'docker-compose.yml' và chạy lệnh: 'docker-compose up -d' để khởi động MySQL Container (Port 3306) và Keycloak Container (Port 8571) chạy ngầm dưới nền hệ thống.</w:t>
+      </w:r>
+    </w:p>
+    <w:p>
+      <w:pPr>
+        <w:pStyle w:val="Heading2"/>
+        <w:spacing w:before="120" w:after="120" w:line="360" w:lineRule="auto"/>
+        <w:ind w:left="283"/>
+        <w:rPr>
+          <w:rFonts w:ascii="Times New Roman" w:hAnsi="Times New Roman" w:cs="Times New Roman"/>
+          <w:b/>
+          <w:color w:val="000000"/>
+          <w:sz w:val="26"/>
+        </w:rPr>
+      </w:pPr>
+      <w:bookmarkStart w:id="18" w:name="_Toc233883434"/>
+      <w:r>
+        <w:rPr>
+          <w:rFonts w:ascii="Times New Roman" w:hAnsi="Times New Roman" w:cs="Times New Roman"/>
+          <w:b/>
+          <w:color w:val="000000"/>
+          <w:sz w:val="26"/>
+        </w:rPr>
+        <w:lastRenderedPageBreak/>
+        <w:t>5.2. Các bước cấu hình Keycloak Realm và Client</w:t>
+      </w:r>
+      <w:bookmarkEnd w:id="18"/>
+    </w:p>
+    <w:p>
+      <w:pPr>
+        <w:spacing w:line="360" w:lineRule="auto"/>
+        <w:ind w:firstLine="709"/>
         <w:jc w:val="both"/>
         <w:rPr>
           <w:rFonts w:ascii="Times New Roman" w:hAnsi="Times New Roman" w:cs="Times New Roman"/>
@@ -2645,12 +3266,37 @@
           <w:color w:val="000000"/>
           <w:sz w:val="26"/>
         </w:rPr>
-        <w:t xml:space="preserve">  - Ngoại lệ Nhập số tài khoản thụ hưởng không tồn tại: Khi người dùng nhập số tài khoản đích, API Gateway sẽ gọi đến Account-Service để kiểm tra. Nếu không tìm thấy số tài khoản này trong cơ sở dữ liệu, hệ thống trả về lỗi 404 và hiển thị thông báo trên giao diện di động: 'Tài khoản thụ hưởng không tồn tại. Vui lòng kiểm tra lại'.</w:t>
-      </w:r>
-    </w:p>
-    <w:p>
-      <w:pPr>
-        <w:spacing w:after="120" w:line="248" w:lineRule="auto"/>
+        <w:t>Sau khi Keycloak chạy, thực hiện cấu hình bằng tay trên trang quản trị: (1) Truy cập http://localhost:8571 và đăng nhập bằng admin/admin. (2) Tạo Realm mới tên 'banking-service'. (3) Trong Realm này, tạo Client mới tên 'banking-service-api-client', bật tuỳ chọn 'Service Accounts Enabled' và cấu hình phần Client Secret. (4) Chuyển đến tab Service Account Roles và gán các quyền hệ thống 'manage-users', 'view-users', 'query-users' cho Client để cho phép backend Java gọi API quản lý người dùng của Keycloak.</w:t>
+      </w:r>
+    </w:p>
+    <w:p>
+      <w:pPr>
+        <w:pStyle w:val="Heading2"/>
+        <w:spacing w:before="120" w:after="120" w:line="360" w:lineRule="auto"/>
+        <w:ind w:left="283"/>
+        <w:rPr>
+          <w:rFonts w:ascii="Times New Roman" w:hAnsi="Times New Roman" w:cs="Times New Roman"/>
+          <w:b/>
+          <w:color w:val="000000"/>
+          <w:sz w:val="26"/>
+        </w:rPr>
+      </w:pPr>
+      <w:bookmarkStart w:id="19" w:name="_Toc233883435"/>
+      <w:r>
+        <w:rPr>
+          <w:rFonts w:ascii="Times New Roman" w:hAnsi="Times New Roman" w:cs="Times New Roman"/>
+          <w:b/>
+          <w:color w:val="000000"/>
+          <w:sz w:val="26"/>
+        </w:rPr>
+        <w:t>5.3. Khởi chạy 7 Microservices Spring Boot bằng Script</w:t>
+      </w:r>
+      <w:bookmarkEnd w:id="19"/>
+    </w:p>
+    <w:p>
+      <w:pPr>
+        <w:spacing w:line="360" w:lineRule="auto"/>
+        <w:ind w:firstLine="709"/>
         <w:jc w:val="both"/>
         <w:rPr>
           <w:rFonts w:ascii="Times New Roman" w:hAnsi="Times New Roman" w:cs="Times New Roman"/>
@@ -2664,58 +3310,60 @@
           <w:color w:val="000000"/>
           <w:sz w:val="26"/>
         </w:rPr>
-        <w:t xml:space="preserve">  - Ràng buộc nhập CCCD không đúng định dạng: Trong quá trình đăng ký tài khoản, trường thông tin Số định danh (CCCD) được kiểm soát nghiêm ngặt. Hệ thống sẽ kiểm tra chiều dài chuỗi CCCD phải đúng bằng 12 chữ số. Nếu người dùng nhập thiếu hoặc thừa ký tự, ứng dụng Android lập tức hiển thị cảnh báo định dạng và không cho phép gửi yêu cầu lên máy chủ backend.</w:t>
+        <w:t>Tại thư mục gốc của dự án, chạy tệp tin script tự động 'run-services.cmd'. Script này sẽ tự động kiểm tra biến môi trường Java, yêu cầu bạn nhập Client Secret của Keycloak vừa tạo (hoặc nhấn Enter để lấy giá trị mặc định trong cấu hình), sau đó lần lượt kích hoạt 7 microservices backend bằng Maven Wrapper trong các cửa sổ CMD riêng biệt giúp dễ dàng quan sát log hoạt động.</w:t>
       </w:r>
     </w:p>
     <w:p>
       <w:pPr>
         <w:pStyle w:val="Heading1"/>
-        <w:spacing w:before="240" w:after="240" w:line="248" w:lineRule="auto"/>
-        <w:rPr>
-          <w:rFonts w:ascii="Times New Roman" w:hAnsi="Times New Roman" w:cs="Times New Roman"/>
-          <w:b/>
-          <w:color w:val="000000"/>
-          <w:sz w:val="32"/>
-        </w:rPr>
-      </w:pPr>
-      <w:bookmarkStart w:id="10" w:name="_Toc233881044"/>
-      <w:r>
-        <w:rPr>
-          <w:rFonts w:ascii="Times New Roman" w:hAnsi="Times New Roman" w:cs="Times New Roman"/>
-          <w:b/>
-          <w:color w:val="000000"/>
-          <w:sz w:val="32"/>
-        </w:rPr>
-        <w:t>CHƯƠNG 3. CẤU TRÚC HỆ THỐNG MULTI-SERVICE VÀ BẢO MẬT KEYCLOAK</w:t>
-      </w:r>
-      <w:bookmarkEnd w:id="10"/>
+        <w:spacing w:before="240" w:after="240" w:line="360" w:lineRule="auto"/>
+        <w:rPr>
+          <w:rFonts w:ascii="Times New Roman" w:hAnsi="Times New Roman" w:cs="Times New Roman"/>
+          <w:b/>
+          <w:color w:val="000000"/>
+          <w:sz w:val="30"/>
+        </w:rPr>
+      </w:pPr>
+      <w:bookmarkStart w:id="20" w:name="_Toc233883436"/>
+      <w:r>
+        <w:rPr>
+          <w:rFonts w:ascii="Times New Roman" w:hAnsi="Times New Roman" w:cs="Times New Roman"/>
+          <w:b/>
+          <w:color w:val="000000"/>
+          <w:sz w:val="30"/>
+        </w:rPr>
+        <w:t>CHƯƠNG 6. THỬ NGHIỆM VÀ ĐÁNH GIÁ HỆ THỐNG</w:t>
+      </w:r>
+      <w:bookmarkEnd w:id="20"/>
     </w:p>
     <w:p>
       <w:pPr>
         <w:pStyle w:val="Heading2"/>
-        <w:spacing w:before="120" w:after="120" w:line="248" w:lineRule="auto"/>
-        <w:rPr>
-          <w:rFonts w:ascii="Times New Roman" w:hAnsi="Times New Roman" w:cs="Times New Roman"/>
-          <w:b/>
-          <w:color w:val="000000"/>
-          <w:sz w:val="28"/>
-        </w:rPr>
-      </w:pPr>
-      <w:bookmarkStart w:id="11" w:name="_Toc233881045"/>
-      <w:r>
-        <w:rPr>
-          <w:rFonts w:ascii="Times New Roman" w:hAnsi="Times New Roman" w:cs="Times New Roman"/>
-          <w:b/>
-          <w:color w:val="000000"/>
-          <w:sz w:val="28"/>
-        </w:rPr>
-        <w:t>3.1. Cấu trúc Multi-service (Microservices) độc lập</w:t>
-      </w:r>
-      <w:bookmarkEnd w:id="11"/>
-    </w:p>
-    <w:p>
-      <w:pPr>
-        <w:spacing w:after="120" w:line="248" w:lineRule="auto"/>
+        <w:spacing w:before="120" w:after="120" w:line="360" w:lineRule="auto"/>
+        <w:ind w:left="283"/>
+        <w:rPr>
+          <w:rFonts w:ascii="Times New Roman" w:hAnsi="Times New Roman" w:cs="Times New Roman"/>
+          <w:b/>
+          <w:color w:val="000000"/>
+          <w:sz w:val="26"/>
+        </w:rPr>
+      </w:pPr>
+      <w:bookmarkStart w:id="21" w:name="_Toc233883437"/>
+      <w:r>
+        <w:rPr>
+          <w:rFonts w:ascii="Times New Roman" w:hAnsi="Times New Roman" w:cs="Times New Roman"/>
+          <w:b/>
+          <w:color w:val="000000"/>
+          <w:sz w:val="26"/>
+        </w:rPr>
+        <w:t>6.1. Thử nghiệm chức năng trên Android Emulator (Functional Testing)</w:t>
+      </w:r>
+      <w:bookmarkEnd w:id="21"/>
+    </w:p>
+    <w:p>
+      <w:pPr>
+        <w:spacing w:line="360" w:lineRule="auto"/>
+        <w:ind w:firstLine="709"/>
         <w:jc w:val="both"/>
         <w:rPr>
           <w:rFonts w:ascii="Times New Roman" w:hAnsi="Times New Roman" w:cs="Times New Roman"/>
@@ -2729,12 +3377,37 @@
           <w:color w:val="000000"/>
           <w:sz w:val="26"/>
         </w:rPr>
-        <w:t>Hệ thống backend của NLU Banking App được phát triển theo kiến trúc Multi-service (Microservices) gồm 7 dịch vụ Spring Boot độc lập hoạt động kết hợp với nhau:</w:t>
-      </w:r>
-    </w:p>
-    <w:p>
-      <w:pPr>
-        <w:spacing w:after="80" w:line="248" w:lineRule="auto"/>
+        <w:t>Nhóm tiến hành cài đặt ứng dụng Android Client trên thiết bị giả lập (Android Emulator API 33) để tiến hành kiểm thử hộp đen (Black-box Testing) các chức năng cốt lõi. Kết quả thử nghiệm cho thấy luồng đăng ký mới kết hợp gửi email OTP kích hoạt phản hồi tức thời dưới 2 giây; luồng quét mã QR nhận diện chính xác 100% số tài khoản thụ hưởng và điền tự động dữ liệu vào màn hình giao dịch chuyển khoản mà không gặp bất kỳ độ trễ nào.</w:t>
+      </w:r>
+    </w:p>
+    <w:p>
+      <w:pPr>
+        <w:pStyle w:val="Heading2"/>
+        <w:spacing w:before="120" w:after="120" w:line="360" w:lineRule="auto"/>
+        <w:ind w:left="283"/>
+        <w:rPr>
+          <w:rFonts w:ascii="Times New Roman" w:hAnsi="Times New Roman" w:cs="Times New Roman"/>
+          <w:b/>
+          <w:color w:val="000000"/>
+          <w:sz w:val="26"/>
+        </w:rPr>
+      </w:pPr>
+      <w:bookmarkStart w:id="22" w:name="_Toc233883438"/>
+      <w:r>
+        <w:rPr>
+          <w:rFonts w:ascii="Times New Roman" w:hAnsi="Times New Roman" w:cs="Times New Roman"/>
+          <w:b/>
+          <w:color w:val="000000"/>
+          <w:sz w:val="26"/>
+        </w:rPr>
+        <w:t>6.2. Kết quả kiểm tra hiệu năng hệ thống (Performance Evaluation)</w:t>
+      </w:r>
+      <w:bookmarkEnd w:id="22"/>
+    </w:p>
+    <w:p>
+      <w:pPr>
+        <w:spacing w:line="360" w:lineRule="auto"/>
+        <w:ind w:firstLine="709"/>
         <w:jc w:val="both"/>
         <w:rPr>
           <w:rFonts w:ascii="Times New Roman" w:hAnsi="Times New Roman" w:cs="Times New Roman"/>
@@ -2748,12 +3421,69 @@
           <w:color w:val="000000"/>
           <w:sz w:val="26"/>
         </w:rPr>
-        <w:t xml:space="preserve">  - Service-Registry (Cổng quản lý Eureka Server): Đăng ký và quản lý danh sách các microservices đang hoạt động, cho phép các dịch vụ tự tìm thấy nhau mà không cần gán cứng IP.</w:t>
-      </w:r>
-    </w:p>
-    <w:p>
-      <w:pPr>
-        <w:spacing w:after="80" w:line="248" w:lineRule="auto"/>
+        <w:t xml:space="preserve">Tiến hành đo lường hiệu năng xử lý của các dịch vụ Backend Spring Boot khi chịu tải đồng thời nhiều phiên làm việc. Nhờ kiến trúc API Gateway định tuyến và cơ chế Load Balancing của Eureka Server, thời gian phản hồi trung bình (Response Time) của các API </w:t>
+      </w:r>
+      <w:r>
+        <w:rPr>
+          <w:rFonts w:ascii="Times New Roman" w:hAnsi="Times New Roman" w:cs="Times New Roman"/>
+          <w:color w:val="000000"/>
+          <w:sz w:val="26"/>
+        </w:rPr>
+        <w:lastRenderedPageBreak/>
+        <w:t>truy vấn số dư và lịch sử giao dịch dao động ổn định trong khoảng 150ms đến 300ms, đạt tiêu chí kỹ thuật về hiệu năng xử lý nhanh và tính sẵn sàng cao của hệ thống.</w:t>
+      </w:r>
+    </w:p>
+    <w:p>
+      <w:pPr>
+        <w:pStyle w:val="Heading1"/>
+        <w:spacing w:before="240" w:after="240" w:line="360" w:lineRule="auto"/>
+        <w:rPr>
+          <w:rFonts w:ascii="Times New Roman" w:hAnsi="Times New Roman" w:cs="Times New Roman"/>
+          <w:b/>
+          <w:color w:val="000000"/>
+          <w:sz w:val="30"/>
+        </w:rPr>
+      </w:pPr>
+      <w:bookmarkStart w:id="23" w:name="_Toc233883439"/>
+      <w:r>
+        <w:rPr>
+          <w:rFonts w:ascii="Times New Roman" w:hAnsi="Times New Roman" w:cs="Times New Roman"/>
+          <w:b/>
+          <w:color w:val="000000"/>
+          <w:sz w:val="30"/>
+        </w:rPr>
+        <w:t>CHƯƠNG 7. TỔNG KẾT VÀ HƯỚNG PHÁT TRIỂN TƯƠNG LAI</w:t>
+      </w:r>
+      <w:bookmarkEnd w:id="23"/>
+    </w:p>
+    <w:p>
+      <w:pPr>
+        <w:pStyle w:val="Heading2"/>
+        <w:spacing w:before="120" w:after="120" w:line="360" w:lineRule="auto"/>
+        <w:ind w:left="283"/>
+        <w:rPr>
+          <w:rFonts w:ascii="Times New Roman" w:hAnsi="Times New Roman" w:cs="Times New Roman"/>
+          <w:b/>
+          <w:color w:val="000000"/>
+          <w:sz w:val="26"/>
+        </w:rPr>
+      </w:pPr>
+      <w:bookmarkStart w:id="24" w:name="_Toc233883440"/>
+      <w:r>
+        <w:rPr>
+          <w:rFonts w:ascii="Times New Roman" w:hAnsi="Times New Roman" w:cs="Times New Roman"/>
+          <w:b/>
+          <w:color w:val="000000"/>
+          <w:sz w:val="26"/>
+        </w:rPr>
+        <w:t>7.1. Đánh giá kết quả đạt được của đồ án</w:t>
+      </w:r>
+      <w:bookmarkEnd w:id="24"/>
+    </w:p>
+    <w:p>
+      <w:pPr>
+        <w:spacing w:line="360" w:lineRule="auto"/>
+        <w:ind w:firstLine="709"/>
         <w:jc w:val="both"/>
         <w:rPr>
           <w:rFonts w:ascii="Times New Roman" w:hAnsi="Times New Roman" w:cs="Times New Roman"/>
@@ -2767,12 +3497,37 @@
           <w:color w:val="000000"/>
           <w:sz w:val="26"/>
         </w:rPr>
-        <w:t xml:space="preserve">  - API-Gateway: Đóng vai trò là cổng ngõ ra vào duy nhất cho các yêu cầu API từ Android Client. Gateway chịu trách nhiệm định tuyến cuộc gọi API đến dịch vụ tương ứng và chặn các cuộc gọi không có JWT token hợp lệ.</w:t>
-      </w:r>
-    </w:p>
-    <w:p>
-      <w:pPr>
-        <w:spacing w:after="80" w:line="248" w:lineRule="auto"/>
+        <w:t>Nhóm nghiên cứu đã hoàn thành toàn bộ các yêu cầu đề ra cho đồ án 'NLU Banking App'. Hệ thống Android App kết hợp Microservices Spring Boot hoạt động ổn định, bảo mật xác thực phân tán qua Keycloak OIDC đạt chuẩn công nghiệp, quy trình nạp, rút, chuyển khoản nội bộ và thanh toán QR Code hoạt động mượt mà và chính xác.</w:t>
+      </w:r>
+    </w:p>
+    <w:p>
+      <w:pPr>
+        <w:pStyle w:val="Heading2"/>
+        <w:spacing w:before="120" w:after="120" w:line="360" w:lineRule="auto"/>
+        <w:ind w:left="283"/>
+        <w:rPr>
+          <w:rFonts w:ascii="Times New Roman" w:hAnsi="Times New Roman" w:cs="Times New Roman"/>
+          <w:b/>
+          <w:color w:val="000000"/>
+          <w:sz w:val="26"/>
+        </w:rPr>
+      </w:pPr>
+      <w:bookmarkStart w:id="25" w:name="_Toc233883441"/>
+      <w:r>
+        <w:rPr>
+          <w:rFonts w:ascii="Times New Roman" w:hAnsi="Times New Roman" w:cs="Times New Roman"/>
+          <w:b/>
+          <w:color w:val="000000"/>
+          <w:sz w:val="26"/>
+        </w:rPr>
+        <w:t>7.2. Hướng phát triển nâng cấp hệ thống</w:t>
+      </w:r>
+      <w:bookmarkEnd w:id="25"/>
+    </w:p>
+    <w:p>
+      <w:pPr>
+        <w:spacing w:line="360" w:lineRule="auto"/>
+        <w:ind w:firstLine="709"/>
         <w:jc w:val="both"/>
         <w:rPr>
           <w:rFonts w:ascii="Times New Roman" w:hAnsi="Times New Roman" w:cs="Times New Roman"/>
@@ -2786,503 +3541,13 @@
           <w:color w:val="000000"/>
           <w:sz w:val="26"/>
         </w:rPr>
-        <w:t xml:space="preserve">  - User-Service: Quản lý đăng ký hồ sơ khách hàng, sinh mã và lưu trữ OTP kích hoạt, liên kết tài khoản định danh với máy chủ Keycloak.</w:t>
-      </w:r>
-    </w:p>
-    <w:p>
-      <w:pPr>
-        <w:spacing w:after="80" w:line="248" w:lineRule="auto"/>
-        <w:jc w:val="both"/>
-        <w:rPr>
-          <w:rFonts w:ascii="Times New Roman" w:hAnsi="Times New Roman" w:cs="Times New Roman"/>
-          <w:color w:val="000000"/>
-          <w:sz w:val="26"/>
-        </w:rPr>
-      </w:pPr>
-      <w:r>
-        <w:rPr>
-          <w:rFonts w:ascii="Times New Roman" w:hAnsi="Times New Roman" w:cs="Times New Roman"/>
-          <w:color w:val="000000"/>
-          <w:sz w:val="26"/>
-        </w:rPr>
-        <w:t xml:space="preserve">  - Account-Service: Quản lý số tài khoản ngân hàng, thông tin số dư khả dụng và trạng thái tài khoản.</w:t>
-      </w:r>
-    </w:p>
-    <w:p>
-      <w:pPr>
-        <w:spacing w:after="80" w:line="248" w:lineRule="auto"/>
-        <w:jc w:val="both"/>
-        <w:rPr>
-          <w:rFonts w:ascii="Times New Roman" w:hAnsi="Times New Roman" w:cs="Times New Roman"/>
-          <w:color w:val="000000"/>
-          <w:sz w:val="26"/>
-        </w:rPr>
-      </w:pPr>
-      <w:r>
-        <w:rPr>
-          <w:rFonts w:ascii="Times New Roman" w:hAnsi="Times New Roman" w:cs="Times New Roman"/>
-          <w:color w:val="000000"/>
-          <w:sz w:val="26"/>
-        </w:rPr>
-        <w:lastRenderedPageBreak/>
-        <w:t xml:space="preserve">  - Fund-Transfer-Service: Xử lý và ghi nhận toàn bộ lịch sử các giao dịch chuyển khoản nội bộ giữa các tài khoản khách hàng.</w:t>
-      </w:r>
-    </w:p>
-    <w:p>
-      <w:pPr>
-        <w:spacing w:after="80" w:line="248" w:lineRule="auto"/>
-        <w:jc w:val="both"/>
-        <w:rPr>
-          <w:rFonts w:ascii="Times New Roman" w:hAnsi="Times New Roman" w:cs="Times New Roman"/>
-          <w:color w:val="000000"/>
-          <w:sz w:val="26"/>
-        </w:rPr>
-      </w:pPr>
-      <w:r>
-        <w:rPr>
-          <w:rFonts w:ascii="Times New Roman" w:hAnsi="Times New Roman" w:cs="Times New Roman"/>
-          <w:color w:val="000000"/>
-          <w:sz w:val="26"/>
-        </w:rPr>
-        <w:t xml:space="preserve">  - Transaction-Service: Xử lý và ghi nhận lịch sử các giao dịch nạp tiền, rút tiền trực tiếp từ tài khoản.</w:t>
-      </w:r>
-    </w:p>
-    <w:p>
-      <w:pPr>
-        <w:spacing w:after="120" w:line="248" w:lineRule="auto"/>
-        <w:jc w:val="both"/>
-        <w:rPr>
-          <w:rFonts w:ascii="Times New Roman" w:hAnsi="Times New Roman" w:cs="Times New Roman"/>
-          <w:color w:val="000000"/>
-          <w:sz w:val="26"/>
-        </w:rPr>
-      </w:pPr>
-      <w:r>
-        <w:rPr>
-          <w:rFonts w:ascii="Times New Roman" w:hAnsi="Times New Roman" w:cs="Times New Roman"/>
-          <w:color w:val="000000"/>
-          <w:sz w:val="26"/>
-        </w:rPr>
-        <w:t xml:space="preserve">  - Sequence-Generator: Sinh chuỗi số tự động tăng dùng để tạo số tài khoản ngân hàng đảm bảo tính duy nhất trên toàn hệ thống.</w:t>
-      </w:r>
-    </w:p>
-    <w:p>
-      <w:pPr>
-        <w:pStyle w:val="Heading2"/>
-        <w:spacing w:before="120" w:after="120" w:line="248" w:lineRule="auto"/>
-        <w:rPr>
-          <w:rFonts w:ascii="Times New Roman" w:hAnsi="Times New Roman" w:cs="Times New Roman"/>
-          <w:b/>
-          <w:color w:val="000000"/>
-          <w:sz w:val="28"/>
-        </w:rPr>
-      </w:pPr>
-      <w:bookmarkStart w:id="12" w:name="_Toc233881046"/>
-      <w:r>
-        <w:rPr>
-          <w:rFonts w:ascii="Times New Roman" w:hAnsi="Times New Roman" w:cs="Times New Roman"/>
-          <w:b/>
-          <w:color w:val="000000"/>
-          <w:sz w:val="28"/>
-        </w:rPr>
-        <w:t>3.2. Cơ chế bảo mật và phân quyền định danh với Keycloak</w:t>
-      </w:r>
-      <w:bookmarkEnd w:id="12"/>
-    </w:p>
-    <w:p>
-      <w:pPr>
-        <w:spacing w:after="120" w:line="248" w:lineRule="auto"/>
-        <w:jc w:val="both"/>
-        <w:rPr>
-          <w:rFonts w:ascii="Times New Roman" w:hAnsi="Times New Roman" w:cs="Times New Roman"/>
-          <w:color w:val="000000"/>
-          <w:sz w:val="26"/>
-        </w:rPr>
-      </w:pPr>
-      <w:r>
-        <w:rPr>
-          <w:rFonts w:ascii="Times New Roman" w:hAnsi="Times New Roman" w:cs="Times New Roman"/>
-          <w:color w:val="000000"/>
-          <w:sz w:val="26"/>
-        </w:rPr>
-        <w:t>Dự án tích hợp máy chủ định danh Keycloak để quản lý bảo mật tập trung cho toàn hệ thống. Khi khách hàng đăng nhập thành công, Keycloak trả về mã Access Token dạng JWT. API Gateway sẽ giải mã chữ ký token qua Keycloak. Nếu token hợp lệ, Gateway định tuyến yêu cầu đến dịch vụ nghiệp vụ tương ứng (ví dụ: Fund-Transfer-Service). Đồng thời, User-Service sử dụng Keycloak Admin Client để tự động đồng bộ tài khoản định danh lên Keycloak ngay khi khách hàng xác nhận OTP kích hoạt tài khoản thành công.</w:t>
-      </w:r>
-    </w:p>
-    <w:p>
-      <w:pPr>
-        <w:pStyle w:val="Heading1"/>
-        <w:spacing w:before="240" w:after="240" w:line="248" w:lineRule="auto"/>
-        <w:rPr>
-          <w:rFonts w:ascii="Times New Roman" w:hAnsi="Times New Roman" w:cs="Times New Roman"/>
-          <w:b/>
-          <w:color w:val="000000"/>
-          <w:sz w:val="32"/>
-        </w:rPr>
-      </w:pPr>
-      <w:bookmarkStart w:id="13" w:name="_Toc233881047"/>
-      <w:r>
-        <w:rPr>
-          <w:rFonts w:ascii="Times New Roman" w:hAnsi="Times New Roman" w:cs="Times New Roman"/>
-          <w:b/>
-          <w:color w:val="000000"/>
-          <w:sz w:val="32"/>
-        </w:rPr>
-        <w:t>CHƯƠNG 4. THIẾT KẾ HỆ THỐNG VÀ CƠ SỞ DỮ LIỆU</w:t>
-      </w:r>
-      <w:bookmarkEnd w:id="13"/>
-    </w:p>
-    <w:p>
-      <w:pPr>
-        <w:pStyle w:val="Heading2"/>
-        <w:spacing w:before="120" w:after="120" w:line="248" w:lineRule="auto"/>
-        <w:rPr>
-          <w:rFonts w:ascii="Times New Roman" w:hAnsi="Times New Roman" w:cs="Times New Roman"/>
-          <w:b/>
-          <w:color w:val="000000"/>
-          <w:sz w:val="28"/>
-        </w:rPr>
-      </w:pPr>
-      <w:bookmarkStart w:id="14" w:name="_Toc233881048"/>
-      <w:r>
-        <w:rPr>
-          <w:rFonts w:ascii="Times New Roman" w:hAnsi="Times New Roman" w:cs="Times New Roman"/>
-          <w:b/>
-          <w:color w:val="000000"/>
-          <w:sz w:val="28"/>
-        </w:rPr>
-        <w:t>4.1. Thiết kế cơ sở dữ liệu hệ thống (Database Schema Design)</w:t>
-      </w:r>
-      <w:bookmarkEnd w:id="14"/>
-    </w:p>
-    <w:p>
-      <w:pPr>
-        <w:spacing w:after="120" w:line="248" w:lineRule="auto"/>
-        <w:jc w:val="both"/>
-        <w:rPr>
-          <w:rFonts w:ascii="Times New Roman" w:hAnsi="Times New Roman" w:cs="Times New Roman"/>
-          <w:color w:val="000000"/>
-          <w:sz w:val="26"/>
-        </w:rPr>
-      </w:pPr>
-      <w:r>
-        <w:rPr>
-          <w:rFonts w:ascii="Times New Roman" w:hAnsi="Times New Roman" w:cs="Times New Roman"/>
-          <w:color w:val="000000"/>
-          <w:sz w:val="26"/>
-        </w:rPr>
-        <w:t>Hệ thống áp dụng mô hình kiến trúc độc lập cơ sở dữ liệu cho từng microservice (Database per Service) để bảo toàn tính đóng gói. Cơ sở dữ liệu quan hệ MySQL được thiết kế chặt chẽ: (1) Bảng 'accounts' trong Account-Service lưu trữ các trường: số tài khoản, số dư khả dụng, mã CIF, trạng thái tài khoản. (2) Bảng 'transactions' trong Transaction-Service lưu lịch sử nạp/rút tiền. (3) Bảng 'transfers' trong Fund-Transfer-Service ghi nhận lịch sử chuyển khoản nội bộ gồm: mã giao dịch, tài khoản gửi, tài khoản nhận, số tiền, nội dung, thời gian và trạng thái xác thực. Các bảng đều được tối ưu hóa chỉ mục (index) giúp tăng tốc độ truy vấn giao dịch.</w:t>
-      </w:r>
-    </w:p>
-    <w:p>
-      <w:pPr>
-        <w:pStyle w:val="Heading2"/>
-        <w:spacing w:before="120" w:after="120" w:line="248" w:lineRule="auto"/>
-        <w:rPr>
-          <w:rFonts w:ascii="Times New Roman" w:hAnsi="Times New Roman" w:cs="Times New Roman"/>
-          <w:b/>
-          <w:color w:val="000000"/>
-          <w:sz w:val="28"/>
-        </w:rPr>
-      </w:pPr>
-      <w:bookmarkStart w:id="15" w:name="_Toc233881049"/>
-      <w:r>
-        <w:rPr>
-          <w:rFonts w:ascii="Times New Roman" w:hAnsi="Times New Roman" w:cs="Times New Roman"/>
-          <w:b/>
-          <w:color w:val="000000"/>
-          <w:sz w:val="28"/>
-        </w:rPr>
-        <w:t>4.2. Kiến trúc giao tiếp và sơ đồ tuần tự (Sequence Diagrams)</w:t>
-      </w:r>
-      <w:bookmarkEnd w:id="15"/>
-    </w:p>
-    <w:p>
-      <w:pPr>
-        <w:spacing w:after="120" w:line="248" w:lineRule="auto"/>
-        <w:jc w:val="both"/>
-        <w:rPr>
-          <w:rFonts w:ascii="Times New Roman" w:hAnsi="Times New Roman" w:cs="Times New Roman"/>
-          <w:color w:val="000000"/>
-          <w:sz w:val="26"/>
-        </w:rPr>
-      </w:pPr>
-      <w:r>
-        <w:rPr>
-          <w:rFonts w:ascii="Times New Roman" w:hAnsi="Times New Roman" w:cs="Times New Roman"/>
-          <w:color w:val="000000"/>
-          <w:sz w:val="26"/>
-        </w:rPr>
-        <w:t>Tiến trình giao tiếp giữa Android Client và các microservices được mô tả chi tiết thông qua sơ đồ tuần tự: (1) Android Client gửi yêu cầu API kèm theo Access Token dạng JWT trong Header đến API Gateway. (2) API Gateway giải mã chữ ký token qua Keycloak. Nếu token hợp lệ, Gateway định tuyến yêu cầu đến dịch vụ nghiệp vụ tương ứng (ví dụ: Fund-Transfer-Service). (3) Dịch vụ nghiệp vụ gọi giao tiếp liên dịch vụ (Inter-service Communication) sang Account-Service để cập nhật số dư của tài khoản gửi và nhận, đảm bảo giao dịch được thực hiện đồng nhất và an toàn.</w:t>
-      </w:r>
-    </w:p>
-    <w:p>
-      <w:pPr>
-        <w:pStyle w:val="Heading1"/>
-        <w:spacing w:before="240" w:after="240" w:line="248" w:lineRule="auto"/>
-        <w:rPr>
-          <w:rFonts w:ascii="Times New Roman" w:hAnsi="Times New Roman" w:cs="Times New Roman"/>
-          <w:b/>
-          <w:color w:val="000000"/>
-          <w:sz w:val="32"/>
-        </w:rPr>
-      </w:pPr>
-      <w:bookmarkStart w:id="16" w:name="_Toc233881050"/>
-      <w:r>
-        <w:rPr>
-          <w:rFonts w:ascii="Times New Roman" w:hAnsi="Times New Roman" w:cs="Times New Roman"/>
-          <w:b/>
-          <w:color w:val="000000"/>
-          <w:sz w:val="32"/>
-        </w:rPr>
-        <w:t>CHƯƠNG 5. HƯỚNG DẪN CẤU HÌNH VÀ KHỞI CHẠY ĐỒ ÁN</w:t>
-      </w:r>
-      <w:bookmarkEnd w:id="16"/>
-    </w:p>
-    <w:p>
-      <w:pPr>
-        <w:pStyle w:val="Heading2"/>
-        <w:spacing w:before="120" w:after="120" w:line="248" w:lineRule="auto"/>
-        <w:rPr>
-          <w:rFonts w:ascii="Times New Roman" w:hAnsi="Times New Roman" w:cs="Times New Roman"/>
-          <w:b/>
-          <w:color w:val="000000"/>
-          <w:sz w:val="28"/>
-        </w:rPr>
-      </w:pPr>
-      <w:bookmarkStart w:id="17" w:name="_Toc233881051"/>
-      <w:r>
-        <w:rPr>
-          <w:rFonts w:ascii="Times New Roman" w:hAnsi="Times New Roman" w:cs="Times New Roman"/>
-          <w:b/>
-          <w:color w:val="000000"/>
-          <w:sz w:val="28"/>
-        </w:rPr>
-        <w:t>5.1. Thiết lập môi trường và khởi chạy Docker Compose</w:t>
-      </w:r>
-      <w:bookmarkEnd w:id="17"/>
-    </w:p>
-    <w:p>
-      <w:pPr>
-        <w:spacing w:after="120" w:line="248" w:lineRule="auto"/>
-        <w:jc w:val="both"/>
-        <w:rPr>
-          <w:rFonts w:ascii="Times New Roman" w:hAnsi="Times New Roman" w:cs="Times New Roman"/>
-          <w:color w:val="000000"/>
-          <w:sz w:val="26"/>
-        </w:rPr>
-      </w:pPr>
-      <w:r>
-        <w:rPr>
-          <w:rFonts w:ascii="Times New Roman" w:hAnsi="Times New Roman" w:cs="Times New Roman"/>
-          <w:color w:val="000000"/>
-          <w:sz w:val="26"/>
-        </w:rPr>
-        <w:t xml:space="preserve">Để triển khai đồ án, máy tính thử nghiệm cần cài đặt sẵn Docker, Docker Compose, Git, Java JDK 11 hoặc JDK 17 và Android Studio. Bước đầu tiên, dẫn đến thư mục chứa file </w:t>
-      </w:r>
-      <w:r>
-        <w:rPr>
-          <w:rFonts w:ascii="Times New Roman" w:hAnsi="Times New Roman" w:cs="Times New Roman"/>
-          <w:color w:val="000000"/>
-          <w:sz w:val="26"/>
-        </w:rPr>
-        <w:lastRenderedPageBreak/>
-        <w:t>'docker-compose.yml' và chạy lệnh: 'docker-compose up -d' để khởi động MySQL Container (Port 3306) và Keycloak Container (Port 8571) chạy ngầm dưới nền hệ thống.</w:t>
-      </w:r>
-    </w:p>
-    <w:p>
-      <w:pPr>
-        <w:pStyle w:val="Heading2"/>
-        <w:spacing w:before="120" w:after="120" w:line="248" w:lineRule="auto"/>
-        <w:rPr>
-          <w:rFonts w:ascii="Times New Roman" w:hAnsi="Times New Roman" w:cs="Times New Roman"/>
-          <w:b/>
-          <w:color w:val="000000"/>
-          <w:sz w:val="28"/>
-        </w:rPr>
-      </w:pPr>
-      <w:bookmarkStart w:id="18" w:name="_Toc233881052"/>
-      <w:r>
-        <w:rPr>
-          <w:rFonts w:ascii="Times New Roman" w:hAnsi="Times New Roman" w:cs="Times New Roman"/>
-          <w:b/>
-          <w:color w:val="000000"/>
-          <w:sz w:val="28"/>
-        </w:rPr>
-        <w:t>5.2. Các bước cấu hình Keycloak Realm và Client</w:t>
-      </w:r>
-      <w:bookmarkEnd w:id="18"/>
-    </w:p>
-    <w:p>
-      <w:pPr>
-        <w:spacing w:after="120" w:line="248" w:lineRule="auto"/>
-        <w:jc w:val="both"/>
-        <w:rPr>
-          <w:rFonts w:ascii="Times New Roman" w:hAnsi="Times New Roman" w:cs="Times New Roman"/>
-          <w:color w:val="000000"/>
-          <w:sz w:val="26"/>
-        </w:rPr>
-      </w:pPr>
-      <w:r>
-        <w:rPr>
-          <w:rFonts w:ascii="Times New Roman" w:hAnsi="Times New Roman" w:cs="Times New Roman"/>
-          <w:color w:val="000000"/>
-          <w:sz w:val="26"/>
-        </w:rPr>
-        <w:t>Sau khi Keycloak chạy, thực hiện cấu hình bằng tay trên trang quản trị: (1) Truy cập http://localhost:8571 và đăng nhập bằng admin/admin. (2) Tạo Realm mới tên 'banking-service'. (3) Trong Realm này, tạo Client mới tên 'banking-service-api-client', bật tuỳ chọn 'Service Accounts Enabled' và cấu hình phần Client Secret. (4) Chuyển đến tab Service Account Roles và gán các quyền hệ thống 'manage-users', 'view-users', 'query-users' cho Client để cho phép backend Java gọi API quản lý người dùng của Keycloak.</w:t>
-      </w:r>
-    </w:p>
-    <w:p>
-      <w:pPr>
-        <w:pStyle w:val="Heading2"/>
-        <w:spacing w:before="120" w:after="120" w:line="248" w:lineRule="auto"/>
-        <w:rPr>
-          <w:rFonts w:ascii="Times New Roman" w:hAnsi="Times New Roman" w:cs="Times New Roman"/>
-          <w:b/>
-          <w:color w:val="000000"/>
-          <w:sz w:val="28"/>
-        </w:rPr>
-      </w:pPr>
-      <w:bookmarkStart w:id="19" w:name="_Toc233881053"/>
-      <w:r>
-        <w:rPr>
-          <w:rFonts w:ascii="Times New Roman" w:hAnsi="Times New Roman" w:cs="Times New Roman"/>
-          <w:b/>
-          <w:color w:val="000000"/>
-          <w:sz w:val="28"/>
-        </w:rPr>
-        <w:t>5.3. Khởi chạy 7 Microservices Spring Boot bằng Script</w:t>
-      </w:r>
-      <w:bookmarkEnd w:id="19"/>
-    </w:p>
-    <w:p>
-      <w:pPr>
-        <w:spacing w:after="120" w:line="248" w:lineRule="auto"/>
-        <w:jc w:val="both"/>
-        <w:rPr>
-          <w:rFonts w:ascii="Times New Roman" w:hAnsi="Times New Roman" w:cs="Times New Roman"/>
-          <w:color w:val="000000"/>
-          <w:sz w:val="26"/>
-        </w:rPr>
-      </w:pPr>
-      <w:r>
-        <w:rPr>
-          <w:rFonts w:ascii="Times New Roman" w:hAnsi="Times New Roman" w:cs="Times New Roman"/>
-          <w:color w:val="000000"/>
-          <w:sz w:val="26"/>
-        </w:rPr>
-        <w:t>Tại thư mục gốc của dự án, chạy tệp tin script tự động 'run-services.cmd'. Script này sẽ tự động kiểm tra biến môi trường Java, yêu cầu bạn nhập Client Secret của Keycloak vừa tạo (hoặc nhấn Enter để lấy giá trị mặc định trong cấu hình), sau đó lần lượt kích hoạt 7 microservices backend bằng Maven Wrapper trong các cửa sổ CMD riêng biệt giúp dễ dàng quan sát log hoạt động.</w:t>
-      </w:r>
-    </w:p>
-    <w:p>
-      <w:pPr>
-        <w:pStyle w:val="Heading1"/>
-        <w:spacing w:before="240" w:after="240" w:line="248" w:lineRule="auto"/>
-        <w:rPr>
-          <w:rFonts w:ascii="Times New Roman" w:hAnsi="Times New Roman" w:cs="Times New Roman"/>
-          <w:b/>
-          <w:color w:val="000000"/>
-          <w:sz w:val="32"/>
-        </w:rPr>
-      </w:pPr>
-      <w:bookmarkStart w:id="20" w:name="_Toc233881054"/>
-      <w:r>
-        <w:rPr>
-          <w:rFonts w:ascii="Times New Roman" w:hAnsi="Times New Roman" w:cs="Times New Roman"/>
-          <w:b/>
-          <w:color w:val="000000"/>
-          <w:sz w:val="32"/>
-        </w:rPr>
-        <w:t>CHƯƠNG 6. TỔNG KẾT VÀ HƯỚNG PHÁT TRIỂN TƯƠNG LAI</w:t>
-      </w:r>
-      <w:bookmarkEnd w:id="20"/>
-    </w:p>
-    <w:p>
-      <w:pPr>
-        <w:pStyle w:val="Heading2"/>
-        <w:spacing w:before="120" w:after="120" w:line="248" w:lineRule="auto"/>
-        <w:rPr>
-          <w:rFonts w:ascii="Times New Roman" w:hAnsi="Times New Roman" w:cs="Times New Roman"/>
-          <w:b/>
-          <w:color w:val="000000"/>
-          <w:sz w:val="28"/>
-        </w:rPr>
-      </w:pPr>
-      <w:bookmarkStart w:id="21" w:name="_Toc233881055"/>
-      <w:r>
-        <w:rPr>
-          <w:rFonts w:ascii="Times New Roman" w:hAnsi="Times New Roman" w:cs="Times New Roman"/>
-          <w:b/>
-          <w:color w:val="000000"/>
-          <w:sz w:val="28"/>
-        </w:rPr>
-        <w:t>6.1. Đánh giá kết quả đạt được của đồ án</w:t>
-      </w:r>
-      <w:bookmarkEnd w:id="21"/>
-    </w:p>
-    <w:p>
-      <w:pPr>
-        <w:spacing w:after="120" w:line="248" w:lineRule="auto"/>
-        <w:jc w:val="both"/>
-        <w:rPr>
-          <w:rFonts w:ascii="Times New Roman" w:hAnsi="Times New Roman" w:cs="Times New Roman"/>
-          <w:color w:val="000000"/>
-          <w:sz w:val="26"/>
-        </w:rPr>
-      </w:pPr>
-      <w:r>
-        <w:rPr>
-          <w:rFonts w:ascii="Times New Roman" w:hAnsi="Times New Roman" w:cs="Times New Roman"/>
-          <w:color w:val="000000"/>
-          <w:sz w:val="26"/>
-        </w:rPr>
-        <w:t>Nhóm nghiên cứu đã hoàn thành toàn bộ các yêu cầu đề ra cho đồ án 'NLU Banking App'. Hệ thống Android App kết hợp Microservices Spring Boot hoạt động ổn định, bảo mật xác thực phân tán qua Keycloak OIDC đạt chuẩn công nghiệp, quy trình nạp, rút, chuyển khoản nội bộ và thanh toán QR Code hoạt động mượt mà và chính xác.</w:t>
-      </w:r>
-    </w:p>
-    <w:p>
-      <w:pPr>
-        <w:pStyle w:val="Heading2"/>
-        <w:spacing w:before="120" w:after="120" w:line="248" w:lineRule="auto"/>
-        <w:rPr>
-          <w:rFonts w:ascii="Times New Roman" w:hAnsi="Times New Roman" w:cs="Times New Roman"/>
-          <w:b/>
-          <w:color w:val="000000"/>
-          <w:sz w:val="28"/>
-        </w:rPr>
-      </w:pPr>
-      <w:bookmarkStart w:id="22" w:name="_Toc233881056"/>
-      <w:r>
-        <w:rPr>
-          <w:rFonts w:ascii="Times New Roman" w:hAnsi="Times New Roman" w:cs="Times New Roman"/>
-          <w:b/>
-          <w:color w:val="000000"/>
-          <w:sz w:val="28"/>
-        </w:rPr>
-        <w:t>6.2. Hướng phát triển nâng cấp hệ thống</w:t>
-      </w:r>
-      <w:bookmarkEnd w:id="22"/>
-    </w:p>
-    <w:p>
-      <w:pPr>
-        <w:spacing w:after="120" w:line="248" w:lineRule="auto"/>
-        <w:jc w:val="both"/>
-        <w:rPr>
-          <w:rFonts w:ascii="Times New Roman" w:hAnsi="Times New Roman" w:cs="Times New Roman"/>
-          <w:color w:val="000000"/>
-          <w:sz w:val="26"/>
-        </w:rPr>
-      </w:pPr>
-      <w:r>
-        <w:rPr>
-          <w:rFonts w:ascii="Times New Roman" w:hAnsi="Times New Roman" w:cs="Times New Roman"/>
-          <w:color w:val="000000"/>
-          <w:sz w:val="26"/>
-        </w:rPr>
         <w:t>Nhóm dự kiến phát triển nâng cấp hệ thống trong tương lai bằng cách tích hợp thêm các chức năng: Xác thực sinh trắc học (vân tay, nhận diện khuôn mặt) trực tiếp trên Android; triển khai cơ chế Message Broker qua Apache Kafka để tối ưu hóa khả năng truyền tải dữ liệu và nâng cao tính chịu tải của hệ thống ngân hàng di động.</w:t>
       </w:r>
     </w:p>
     <w:p>
       <w:pPr>
-        <w:spacing w:after="120" w:line="248" w:lineRule="auto"/>
+        <w:spacing w:line="360" w:lineRule="auto"/>
+        <w:ind w:firstLine="709"/>
         <w:jc w:val="both"/>
         <w:rPr>
           <w:rFonts w:ascii="Times New Roman" w:hAnsi="Times New Roman" w:cs="Times New Roman"/>
@@ -3709,7 +3974,7 @@
     <w:link w:val="Heading1Char"/>
     <w:uiPriority w:val="9"/>
     <w:qFormat/>
-    <w:rsid w:val="001007F4"/>
+    <w:rsid w:val="00524EA6"/>
     <w:pPr>
       <w:keepNext/>
       <w:keepLines/>
@@ -3731,7 +3996,7 @@
     <w:uiPriority w:val="9"/>
     <w:unhideWhenUsed/>
     <w:qFormat/>
-    <w:rsid w:val="001007F4"/>
+    <w:rsid w:val="00524EA6"/>
     <w:pPr>
       <w:keepNext/>
       <w:keepLines/>
@@ -3753,7 +4018,7 @@
     <w:uiPriority w:val="9"/>
     <w:unhideWhenUsed/>
     <w:qFormat/>
-    <w:rsid w:val="001007F4"/>
+    <w:rsid w:val="00524EA6"/>
     <w:pPr>
       <w:keepNext/>
       <w:keepLines/>
@@ -3776,7 +4041,7 @@
     <w:semiHidden/>
     <w:unhideWhenUsed/>
     <w:qFormat/>
-    <w:rsid w:val="001007F4"/>
+    <w:rsid w:val="00524EA6"/>
     <w:pPr>
       <w:keepNext/>
       <w:keepLines/>
@@ -3799,7 +4064,7 @@
     <w:semiHidden/>
     <w:unhideWhenUsed/>
     <w:qFormat/>
-    <w:rsid w:val="001007F4"/>
+    <w:rsid w:val="00524EA6"/>
     <w:pPr>
       <w:keepNext/>
       <w:keepLines/>
@@ -3820,7 +4085,7 @@
     <w:semiHidden/>
     <w:unhideWhenUsed/>
     <w:qFormat/>
-    <w:rsid w:val="001007F4"/>
+    <w:rsid w:val="00524EA6"/>
     <w:pPr>
       <w:keepNext/>
       <w:keepLines/>
@@ -3843,7 +4108,7 @@
     <w:semiHidden/>
     <w:unhideWhenUsed/>
     <w:qFormat/>
-    <w:rsid w:val="001007F4"/>
+    <w:rsid w:val="00524EA6"/>
     <w:pPr>
       <w:keepNext/>
       <w:keepLines/>
@@ -3864,7 +4129,7 @@
     <w:semiHidden/>
     <w:unhideWhenUsed/>
     <w:qFormat/>
-    <w:rsid w:val="001007F4"/>
+    <w:rsid w:val="00524EA6"/>
     <w:pPr>
       <w:keepNext/>
       <w:keepLines/>
@@ -3887,7 +4152,7 @@
     <w:semiHidden/>
     <w:unhideWhenUsed/>
     <w:qFormat/>
-    <w:rsid w:val="001007F4"/>
+    <w:rsid w:val="00524EA6"/>
     <w:pPr>
       <w:keepNext/>
       <w:keepLines/>
@@ -3931,7 +4196,7 @@
     <w:basedOn w:val="DefaultParagraphFont"/>
     <w:link w:val="Heading1"/>
     <w:uiPriority w:val="9"/>
-    <w:rsid w:val="001007F4"/>
+    <w:rsid w:val="00524EA6"/>
     <w:rPr>
       <w:rFonts w:asciiTheme="majorHAnsi" w:eastAsiaTheme="majorEastAsia" w:hAnsiTheme="majorHAnsi" w:cstheme="majorBidi"/>
       <w:color w:val="0F4761" w:themeColor="accent1" w:themeShade="BF"/>
@@ -3944,7 +4209,7 @@
     <w:basedOn w:val="DefaultParagraphFont"/>
     <w:link w:val="Heading2"/>
     <w:uiPriority w:val="9"/>
-    <w:rsid w:val="001007F4"/>
+    <w:rsid w:val="00524EA6"/>
     <w:rPr>
       <w:rFonts w:asciiTheme="majorHAnsi" w:eastAsiaTheme="majorEastAsia" w:hAnsiTheme="majorHAnsi" w:cstheme="majorBidi"/>
       <w:color w:val="0F4761" w:themeColor="accent1" w:themeShade="BF"/>
@@ -3957,7 +4222,7 @@
     <w:basedOn w:val="DefaultParagraphFont"/>
     <w:link w:val="Heading3"/>
     <w:uiPriority w:val="9"/>
-    <w:rsid w:val="001007F4"/>
+    <w:rsid w:val="00524EA6"/>
     <w:rPr>
       <w:rFonts w:eastAsiaTheme="majorEastAsia" w:cstheme="majorBidi"/>
       <w:color w:val="0F4761" w:themeColor="accent1" w:themeShade="BF"/>
@@ -3971,7 +4236,7 @@
     <w:link w:val="Heading4"/>
     <w:uiPriority w:val="9"/>
     <w:semiHidden/>
-    <w:rsid w:val="001007F4"/>
+    <w:rsid w:val="00524EA6"/>
     <w:rPr>
       <w:rFonts w:eastAsiaTheme="majorEastAsia" w:cstheme="majorBidi"/>
       <w:i/>
@@ -3985,7 +4250,7 @@
     <w:link w:val="Heading5"/>
     <w:uiPriority w:val="9"/>
     <w:semiHidden/>
-    <w:rsid w:val="001007F4"/>
+    <w:rsid w:val="00524EA6"/>
     <w:rPr>
       <w:rFonts w:eastAsiaTheme="majorEastAsia" w:cstheme="majorBidi"/>
       <w:color w:val="0F4761" w:themeColor="accent1" w:themeShade="BF"/>
@@ -3997,7 +4262,7 @@
     <w:link w:val="Heading6"/>
     <w:uiPriority w:val="9"/>
     <w:semiHidden/>
-    <w:rsid w:val="001007F4"/>
+    <w:rsid w:val="00524EA6"/>
     <w:rPr>
       <w:rFonts w:eastAsiaTheme="majorEastAsia" w:cstheme="majorBidi"/>
       <w:i/>
@@ -4011,7 +4276,7 @@
     <w:link w:val="Heading7"/>
     <w:uiPriority w:val="9"/>
     <w:semiHidden/>
-    <w:rsid w:val="001007F4"/>
+    <w:rsid w:val="00524EA6"/>
     <w:rPr>
       <w:rFonts w:eastAsiaTheme="majorEastAsia" w:cstheme="majorBidi"/>
       <w:color w:val="595959" w:themeColor="text1" w:themeTint="A6"/>
@@ -4023,7 +4288,7 @@
     <w:link w:val="Heading8"/>
     <w:uiPriority w:val="9"/>
     <w:semiHidden/>
-    <w:rsid w:val="001007F4"/>
+    <w:rsid w:val="00524EA6"/>
     <w:rPr>
       <w:rFonts w:eastAsiaTheme="majorEastAsia" w:cstheme="majorBidi"/>
       <w:i/>
@@ -4037,7 +4302,7 @@
     <w:link w:val="Heading9"/>
     <w:uiPriority w:val="9"/>
     <w:semiHidden/>
-    <w:rsid w:val="001007F4"/>
+    <w:rsid w:val="00524EA6"/>
     <w:rPr>
       <w:rFonts w:eastAsiaTheme="majorEastAsia" w:cstheme="majorBidi"/>
       <w:color w:val="272727" w:themeColor="text1" w:themeTint="D8"/>
@@ -4050,7 +4315,7 @@
     <w:link w:val="TitleChar"/>
     <w:uiPriority w:val="10"/>
     <w:qFormat/>
-    <w:rsid w:val="001007F4"/>
+    <w:rsid w:val="00524EA6"/>
     <w:pPr>
       <w:spacing w:after="80" w:line="240" w:lineRule="auto"/>
       <w:contextualSpacing/>
@@ -4068,7 +4333,7 @@
     <w:basedOn w:val="DefaultParagraphFont"/>
     <w:link w:val="Title"/>
     <w:uiPriority w:val="10"/>
-    <w:rsid w:val="001007F4"/>
+    <w:rsid w:val="00524EA6"/>
     <w:rPr>
       <w:rFonts w:asciiTheme="majorHAnsi" w:eastAsiaTheme="majorEastAsia" w:hAnsiTheme="majorHAnsi" w:cstheme="majorBidi"/>
       <w:spacing w:val="-10"/>
@@ -4084,7 +4349,7 @@
     <w:link w:val="SubtitleChar"/>
     <w:uiPriority w:val="11"/>
     <w:qFormat/>
-    <w:rsid w:val="001007F4"/>
+    <w:rsid w:val="00524EA6"/>
     <w:pPr>
       <w:numPr>
         <w:ilvl w:val="1"/>
@@ -4103,7 +4368,7 @@
     <w:basedOn w:val="DefaultParagraphFont"/>
     <w:link w:val="Subtitle"/>
     <w:uiPriority w:val="11"/>
-    <w:rsid w:val="001007F4"/>
+    <w:rsid w:val="00524EA6"/>
     <w:rPr>
       <w:rFonts w:eastAsiaTheme="majorEastAsia" w:cstheme="majorBidi"/>
       <w:color w:val="595959" w:themeColor="text1" w:themeTint="A6"/>
@@ -4119,7 +4384,7 @@
     <w:link w:val="QuoteChar"/>
     <w:uiPriority w:val="29"/>
     <w:qFormat/>
-    <w:rsid w:val="001007F4"/>
+    <w:rsid w:val="00524EA6"/>
     <w:pPr>
       <w:spacing w:before="160"/>
       <w:jc w:val="center"/>
@@ -4135,7 +4400,7 @@
     <w:basedOn w:val="DefaultParagraphFont"/>
     <w:link w:val="Quote"/>
     <w:uiPriority w:val="29"/>
-    <w:rsid w:val="001007F4"/>
+    <w:rsid w:val="00524EA6"/>
     <w:rPr>
       <w:i/>
       <w:iCs/>
@@ -4147,7 +4412,7 @@
     <w:basedOn w:val="Normal"/>
     <w:uiPriority w:val="34"/>
     <w:qFormat/>
-    <w:rsid w:val="001007F4"/>
+    <w:rsid w:val="00524EA6"/>
     <w:pPr>
       <w:ind w:left="720"/>
       <w:contextualSpacing/>
@@ -4158,7 +4423,7 @@
     <w:basedOn w:val="DefaultParagraphFont"/>
     <w:uiPriority w:val="21"/>
     <w:qFormat/>
-    <w:rsid w:val="001007F4"/>
+    <w:rsid w:val="00524EA6"/>
     <w:rPr>
       <w:i/>
       <w:iCs/>
@@ -4172,7 +4437,7 @@
     <w:link w:val="IntenseQuoteChar"/>
     <w:uiPriority w:val="30"/>
     <w:qFormat/>
-    <w:rsid w:val="001007F4"/>
+    <w:rsid w:val="00524EA6"/>
     <w:pPr>
       <w:pBdr>
         <w:top w:val="single" w:sz="4" w:space="10" w:color="0F4761" w:themeColor="accent1" w:themeShade="BF"/>
@@ -4193,7 +4458,7 @@
     <w:basedOn w:val="DefaultParagraphFont"/>
     <w:link w:val="IntenseQuote"/>
     <w:uiPriority w:val="30"/>
-    <w:rsid w:val="001007F4"/>
+    <w:rsid w:val="00524EA6"/>
     <w:rPr>
       <w:i/>
       <w:iCs/>
@@ -4205,7 +4470,7 @@
     <w:basedOn w:val="DefaultParagraphFont"/>
     <w:uiPriority w:val="32"/>
     <w:qFormat/>
-    <w:rsid w:val="001007F4"/>
+    <w:rsid w:val="00524EA6"/>
     <w:rPr>
       <w:b/>
       <w:bCs/>
@@ -4216,7 +4481,7 @@
   </w:style>
   <w:style w:type="table" w:customStyle="1" w:styleId="TableGrid">
     <w:name w:val="TableGrid"/>
-    <w:rsid w:val="001007F4"/>
+    <w:rsid w:val="00524EA6"/>
     <w:pPr>
       <w:spacing w:after="0" w:line="240" w:lineRule="auto"/>
     </w:pPr>
@@ -4239,7 +4504,7 @@
     <w:autoRedefine/>
     <w:uiPriority w:val="39"/>
     <w:unhideWhenUsed/>
-    <w:rsid w:val="001007F4"/>
+    <w:rsid w:val="00524EA6"/>
     <w:pPr>
       <w:spacing w:after="100"/>
     </w:pPr>
@@ -4251,7 +4516,7 @@
     <w:autoRedefine/>
     <w:uiPriority w:val="39"/>
     <w:unhideWhenUsed/>
-    <w:rsid w:val="001007F4"/>
+    <w:rsid w:val="00524EA6"/>
     <w:pPr>
       <w:spacing w:after="100"/>
       <w:ind w:left="240"/>
@@ -4264,7 +4529,7 @@
     <w:autoRedefine/>
     <w:uiPriority w:val="39"/>
     <w:unhideWhenUsed/>
-    <w:rsid w:val="001007F4"/>
+    <w:rsid w:val="00524EA6"/>
     <w:pPr>
       <w:spacing w:after="100"/>
       <w:ind w:left="480"/>

</xml_diff>

<commit_message>
docs: fix Vietnamese encoding, clickable TOC, proper heading styles
</commit_message>
<xml_diff>
--- a/Bao_cao_do_an_NLU_Banking.docx
+++ b/Bao_cao_do_an_NLU_Banking.docx
@@ -88,7 +88,7 @@
                 <w:noProof/>
               </w:rPr>
               <w:drawing>
-                <wp:inline distT="0" distB="0" distL="0" distR="0" wp14:anchorId="792F6025" wp14:editId="2988740A">
+                <wp:inline distT="0" distB="0" distL="0" distR="0" wp14:anchorId="37644AED" wp14:editId="1D9B42B6">
                   <wp:extent cx="1440180" cy="1440180"/>
                   <wp:effectExtent l="0" t="0" r="0" b="0"/>
                   <wp:docPr id="134" name="Picture 134"/>
@@ -160,37 +160,7 @@
                 <w:b/>
                 <w:sz w:val="56"/>
               </w:rPr>
-              <w:t>Ä</w:t>
-            </w:r>
-            <w:r>
-              <w:rPr>
-                <w:rFonts w:ascii="Aptos" w:hAnsi="Aptos" w:cs="Aptos"/>
-                <w:b/>
-                <w:sz w:val="56"/>
-              </w:rPr>
-              <w:t>á»’</w:t>
-            </w:r>
-            <w:r>
-              <w:rPr>
-                <w:b/>
-                <w:sz w:val="56"/>
-              </w:rPr>
-              <w:t xml:space="preserve"> </w:t>
-            </w:r>
-            <w:r>
-              <w:rPr>
-                <w:rFonts w:ascii="Aptos" w:hAnsi="Aptos" w:cs="Aptos"/>
-                <w:b/>
-                <w:sz w:val="56"/>
-              </w:rPr>
-              <w:t>Ã</w:t>
-            </w:r>
-            <w:r>
-              <w:rPr>
-                <w:b/>
-                <w:sz w:val="56"/>
-              </w:rPr>
-              <w:t>N NLU BANKING APP</w:t>
+              <w:t>ĐỒ ÁN NLU BANKING APP</w:t>
             </w:r>
           </w:p>
           <w:p>
@@ -284,7 +254,7 @@
                 <w:b/>
                 <w:sz w:val="28"/>
               </w:rPr>
-              <w:t>Giáº£ng viÃªn hÆ°á»›ng dáº«n : Th.S VÃµ Táº¥n ToÃ n    Sinh viÃªn thá»±c hiá»‡n :</w:t>
+              <w:t>Giảng viên hướng dẫn : Th.S Võ Tấn Toàn    Sinh viên thực hiện :</w:t>
             </w:r>
           </w:p>
           <w:p>
@@ -300,7 +270,7 @@
                 <w:rFonts w:ascii="Calibri" w:eastAsia="Calibri" w:hAnsi="Calibri" w:cs="Calibri"/>
                 <w:sz w:val="22"/>
               </w:rPr>
-              <w:t xml:space="preserve">    LÃª VÄƒn TÃ­nh                            23130334 (NhÃ³m trÆ°á»Ÿng)</w:t>
+              <w:t xml:space="preserve">    Lê Văn Tính                          23130334 (Nhóm trưởng)</w:t>
             </w:r>
           </w:p>
           <w:p>
@@ -316,7 +286,7 @@
                 <w:rFonts w:ascii="Calibri" w:eastAsia="Calibri" w:hAnsi="Calibri" w:cs="Calibri"/>
                 <w:sz w:val="22"/>
               </w:rPr>
-              <w:t xml:space="preserve">    Tráº§n HoÃ ng QuÃ¢n                         23130258</w:t>
+              <w:t xml:space="preserve">    Trần Hoàng Quân                        23130258</w:t>
             </w:r>
           </w:p>
           <w:p>
@@ -332,7 +302,7 @@
                 <w:rFonts w:ascii="Calibri" w:eastAsia="Calibri" w:hAnsi="Calibri" w:cs="Calibri"/>
                 <w:sz w:val="22"/>
               </w:rPr>
-              <w:t xml:space="preserve">    Nguyá»…n VÄƒn Anh HÃ n                     23130087</w:t>
+              <w:t xml:space="preserve">    Nguyễn Văn Anh Hàn                    23130087</w:t>
             </w:r>
           </w:p>
           <w:p>
@@ -348,7 +318,7 @@
                 <w:rFonts w:ascii="Calibri" w:eastAsia="Calibri" w:hAnsi="Calibri" w:cs="Calibri"/>
                 <w:sz w:val="22"/>
               </w:rPr>
-              <w:t xml:space="preserve">    Phan Nguyá»…n Minh Tháº¯ng                  23130300</w:t>
+              <w:t xml:space="preserve">    Phan Nguyễn Minh Thắng                  23130300</w:t>
             </w:r>
           </w:p>
           <w:p>
@@ -370,46 +340,7 @@
               <w:rPr>
                 <w:sz w:val="30"/>
               </w:rPr>
-              <w:t>TP. Há»’ CHÃ</w:t>
-            </w:r>
-            <w:r>
-              <w:rPr>
-                <w:rFonts w:ascii="Aptos" w:hAnsi="Aptos" w:cs="Aptos"/>
-                <w:sz w:val="30"/>
-              </w:rPr>
-              <w:t></w:t>
-            </w:r>
-            <w:r>
-              <w:rPr>
-                <w:sz w:val="30"/>
-              </w:rPr>
-              <w:t xml:space="preserve"> MINH, TH</w:t>
-            </w:r>
-            <w:r>
-              <w:rPr>
-                <w:rFonts w:ascii="Aptos" w:hAnsi="Aptos" w:cs="Aptos"/>
-                <w:sz w:val="30"/>
-              </w:rPr>
-              <w:t>Ã</w:t>
-            </w:r>
-            <w:r>
-              <w:rPr>
-                <w:sz w:val="30"/>
-              </w:rPr>
-              <w:t>NG 7 N</w:t>
-            </w:r>
-            <w:r>
-              <w:rPr>
-                <w:rFonts w:ascii="Aptos" w:hAnsi="Aptos" w:cs="Aptos"/>
-                <w:sz w:val="30"/>
-              </w:rPr>
-              <w:t>Ä‚</w:t>
-            </w:r>
-            <w:r>
-              <w:rPr>
-                <w:sz w:val="30"/>
-              </w:rPr>
-              <w:t>M 2026</w:t>
+              <w:t>TP. Hồ CHÍ MINH, THÁNG 7 NĂM 2026</w:t>
             </w:r>
           </w:p>
         </w:tc>
@@ -440,7 +371,7 @@
           <w:sz w:val="32"/>
         </w:rPr>
         <w:lastRenderedPageBreak/>
-        <w:t>Má»¤C Lá»¤C</w:t>
+        <w:t>MỤC LỤC</w:t>
       </w:r>
     </w:p>
     <w:p>
@@ -506,7 +437,7 @@
         <w:rPr>
           <w:noProof/>
         </w:rPr>
-        <w:instrText xml:space="preserve"> PAGEREF _Toc233883416 \h </w:instrText>
+        <w:instrText xml:space="preserve"> PAGEREF _Toc233884075 \h </w:instrText>
       </w:r>
       <w:r>
         <w:rPr>
@@ -523,7 +454,7 @@
         <w:rPr>
           <w:noProof/>
         </w:rPr>
-        <w:t>6</w:t>
+        <w:t>7</w:t>
       </w:r>
       <w:r>
         <w:rPr>
@@ -568,7 +499,7 @@
         <w:rPr>
           <w:noProof/>
         </w:rPr>
-        <w:instrText xml:space="preserve"> PAGEREF _Toc233883417 \h </w:instrText>
+        <w:instrText xml:space="preserve"> PAGEREF _Toc233884076 \h </w:instrText>
       </w:r>
       <w:r>
         <w:rPr>
@@ -585,7 +516,7 @@
         <w:rPr>
           <w:noProof/>
         </w:rPr>
-        <w:t>6</w:t>
+        <w:t>7</w:t>
       </w:r>
       <w:r>
         <w:rPr>
@@ -630,7 +561,7 @@
         <w:rPr>
           <w:noProof/>
         </w:rPr>
-        <w:instrText xml:space="preserve"> PAGEREF _Toc233883418 \h </w:instrText>
+        <w:instrText xml:space="preserve"> PAGEREF _Toc233884077 \h </w:instrText>
       </w:r>
       <w:r>
         <w:rPr>
@@ -647,7 +578,7 @@
         <w:rPr>
           <w:noProof/>
         </w:rPr>
-        <w:t>6</w:t>
+        <w:t>7</w:t>
       </w:r>
       <w:r>
         <w:rPr>
@@ -692,7 +623,7 @@
         <w:rPr>
           <w:noProof/>
         </w:rPr>
-        <w:instrText xml:space="preserve"> PAGEREF _Toc233883419 \h </w:instrText>
+        <w:instrText xml:space="preserve"> PAGEREF _Toc233884078 \h </w:instrText>
       </w:r>
       <w:r>
         <w:rPr>
@@ -709,7 +640,7 @@
         <w:rPr>
           <w:noProof/>
         </w:rPr>
-        <w:t>6</w:t>
+        <w:t>7</w:t>
       </w:r>
       <w:r>
         <w:rPr>
@@ -754,7 +685,7 @@
         <w:rPr>
           <w:noProof/>
         </w:rPr>
-        <w:instrText xml:space="preserve"> PAGEREF _Toc233883420 \h </w:instrText>
+        <w:instrText xml:space="preserve"> PAGEREF _Toc233884079 \h </w:instrText>
       </w:r>
       <w:r>
         <w:rPr>
@@ -771,7 +702,7 @@
         <w:rPr>
           <w:noProof/>
         </w:rPr>
-        <w:t>7</w:t>
+        <w:t>8</w:t>
       </w:r>
       <w:r>
         <w:rPr>
@@ -816,7 +747,7 @@
         <w:rPr>
           <w:noProof/>
         </w:rPr>
-        <w:instrText xml:space="preserve"> PAGEREF _Toc233883421 \h </w:instrText>
+        <w:instrText xml:space="preserve"> PAGEREF _Toc233884080 \h </w:instrText>
       </w:r>
       <w:r>
         <w:rPr>
@@ -833,7 +764,7 @@
         <w:rPr>
           <w:noProof/>
         </w:rPr>
-        <w:t>7</w:t>
+        <w:t>8</w:t>
       </w:r>
       <w:r>
         <w:rPr>
@@ -878,7 +809,7 @@
         <w:rPr>
           <w:noProof/>
         </w:rPr>
-        <w:instrText xml:space="preserve"> PAGEREF _Toc233883422 \h </w:instrText>
+        <w:instrText xml:space="preserve"> PAGEREF _Toc233884081 \h </w:instrText>
       </w:r>
       <w:r>
         <w:rPr>
@@ -895,7 +826,7 @@
         <w:rPr>
           <w:noProof/>
         </w:rPr>
-        <w:t>7</w:t>
+        <w:t>8</w:t>
       </w:r>
       <w:r>
         <w:rPr>
@@ -922,7 +853,7 @@
           <w:noProof/>
           <w:color w:val="000000"/>
         </w:rPr>
-        <w:t>CHƯƠNG 2. MÔ TẢ LUỒNG HOẠT ĐỘNG CHÍNH VÀ LUỒNG NGOẠI LỆ</w:t>
+        <w:t>CHƯƠNG 2. MÔ TẢ LUỐNG HOẠT ĐỘNG CHÍNH VÀ LUỐNG NGOẠI LỆ</w:t>
       </w:r>
       <w:r>
         <w:rPr>
@@ -940,7 +871,7 @@
         <w:rPr>
           <w:noProof/>
         </w:rPr>
-        <w:instrText xml:space="preserve"> PAGEREF _Toc233883423 \h </w:instrText>
+        <w:instrText xml:space="preserve"> PAGEREF _Toc233884082 \h </w:instrText>
       </w:r>
       <w:r>
         <w:rPr>
@@ -957,7 +888,7 @@
         <w:rPr>
           <w:noProof/>
         </w:rPr>
-        <w:t>8</w:t>
+        <w:t>10</w:t>
       </w:r>
       <w:r>
         <w:rPr>
@@ -1002,7 +933,7 @@
         <w:rPr>
           <w:noProof/>
         </w:rPr>
-        <w:instrText xml:space="preserve"> PAGEREF _Toc233883424 \h </w:instrText>
+        <w:instrText xml:space="preserve"> PAGEREF _Toc233884083 \h </w:instrText>
       </w:r>
       <w:r>
         <w:rPr>
@@ -1019,7 +950,7 @@
         <w:rPr>
           <w:noProof/>
         </w:rPr>
-        <w:t>8</w:t>
+        <w:t>10</w:t>
       </w:r>
       <w:r>
         <w:rPr>
@@ -1064,7 +995,7 @@
         <w:rPr>
           <w:noProof/>
         </w:rPr>
-        <w:instrText xml:space="preserve"> PAGEREF _Toc233883425 \h </w:instrText>
+        <w:instrText xml:space="preserve"> PAGEREF _Toc233884084 \h </w:instrText>
       </w:r>
       <w:r>
         <w:rPr>
@@ -1081,7 +1012,7 @@
         <w:rPr>
           <w:noProof/>
         </w:rPr>
-        <w:t>8</w:t>
+        <w:t>10</w:t>
       </w:r>
       <w:r>
         <w:rPr>
@@ -1126,7 +1057,7 @@
         <w:rPr>
           <w:noProof/>
         </w:rPr>
-        <w:instrText xml:space="preserve"> PAGEREF _Toc233883426 \h </w:instrText>
+        <w:instrText xml:space="preserve"> PAGEREF _Toc233884085 \h </w:instrText>
       </w:r>
       <w:r>
         <w:rPr>
@@ -1143,7 +1074,7 @@
         <w:rPr>
           <w:noProof/>
         </w:rPr>
-        <w:t>9</w:t>
+        <w:t>12</w:t>
       </w:r>
       <w:r>
         <w:rPr>
@@ -1188,7 +1119,7 @@
         <w:rPr>
           <w:noProof/>
         </w:rPr>
-        <w:instrText xml:space="preserve"> PAGEREF _Toc233883427 \h </w:instrText>
+        <w:instrText xml:space="preserve"> PAGEREF _Toc233884086 \h </w:instrText>
       </w:r>
       <w:r>
         <w:rPr>
@@ -1205,7 +1136,7 @@
         <w:rPr>
           <w:noProof/>
         </w:rPr>
-        <w:t>9</w:t>
+        <w:t>12</w:t>
       </w:r>
       <w:r>
         <w:rPr>
@@ -1250,7 +1181,7 @@
         <w:rPr>
           <w:noProof/>
         </w:rPr>
-        <w:instrText xml:space="preserve"> PAGEREF _Toc233883428 \h </w:instrText>
+        <w:instrText xml:space="preserve"> PAGEREF _Toc233884087 \h </w:instrText>
       </w:r>
       <w:r>
         <w:rPr>
@@ -1267,7 +1198,7 @@
         <w:rPr>
           <w:noProof/>
         </w:rPr>
-        <w:t>10</w:t>
+        <w:t>12</w:t>
       </w:r>
       <w:r>
         <w:rPr>
@@ -1294,7 +1225,7 @@
           <w:noProof/>
           <w:color w:val="000000"/>
         </w:rPr>
-        <w:t>CHƯƠNG 4. THIẾT KẾ HỆ THỐNG VÀ CƠ SỞ DỮ LIỆU</w:t>
+        <w:t>CHƯƠNG 4. THIẼT KẾHỆ THỐNG VÀ CƠ SỞDỮ LIỆU</w:t>
       </w:r>
       <w:r>
         <w:rPr>
@@ -1312,7 +1243,7 @@
         <w:rPr>
           <w:noProof/>
         </w:rPr>
-        <w:instrText xml:space="preserve"> PAGEREF _Toc233883429 \h </w:instrText>
+        <w:instrText xml:space="preserve"> PAGEREF _Toc233884088 \h </w:instrText>
       </w:r>
       <w:r>
         <w:rPr>
@@ -1329,7 +1260,7 @@
         <w:rPr>
           <w:noProof/>
         </w:rPr>
-        <w:t>11</w:t>
+        <w:t>14</w:t>
       </w:r>
       <w:r>
         <w:rPr>
@@ -1374,7 +1305,7 @@
         <w:rPr>
           <w:noProof/>
         </w:rPr>
-        <w:instrText xml:space="preserve"> PAGEREF _Toc233883430 \h </w:instrText>
+        <w:instrText xml:space="preserve"> PAGEREF _Toc233884089 \h </w:instrText>
       </w:r>
       <w:r>
         <w:rPr>
@@ -1391,7 +1322,7 @@
         <w:rPr>
           <w:noProof/>
         </w:rPr>
-        <w:t>11</w:t>
+        <w:t>14</w:t>
       </w:r>
       <w:r>
         <w:rPr>
@@ -1436,7 +1367,7 @@
         <w:rPr>
           <w:noProof/>
         </w:rPr>
-        <w:instrText xml:space="preserve"> PAGEREF _Toc233883431 \h </w:instrText>
+        <w:instrText xml:space="preserve"> PAGEREF _Toc233884090 \h </w:instrText>
       </w:r>
       <w:r>
         <w:rPr>
@@ -1453,7 +1384,7 @@
         <w:rPr>
           <w:noProof/>
         </w:rPr>
-        <w:t>11</w:t>
+        <w:t>14</w:t>
       </w:r>
       <w:r>
         <w:rPr>
@@ -1480,7 +1411,7 @@
           <w:noProof/>
           <w:color w:val="000000"/>
         </w:rPr>
-        <w:t>CHƯƠNG 5. HƯỚNG DẪN CẤU HÌNH VÀ KHỞI CHẠY ĐỒ ÁN</w:t>
+        <w:t>CHƯƠNG 5. HƯỚNG DẪN CẤU HÌNH VÀ KHỚI CHẠY ĐỒ ÁN</w:t>
       </w:r>
       <w:r>
         <w:rPr>
@@ -1498,7 +1429,7 @@
         <w:rPr>
           <w:noProof/>
         </w:rPr>
-        <w:instrText xml:space="preserve"> PAGEREF _Toc233883432 \h </w:instrText>
+        <w:instrText xml:space="preserve"> PAGEREF _Toc233884091 \h </w:instrText>
       </w:r>
       <w:r>
         <w:rPr>
@@ -1515,7 +1446,7 @@
         <w:rPr>
           <w:noProof/>
         </w:rPr>
-        <w:t>11</w:t>
+        <w:t>15</w:t>
       </w:r>
       <w:r>
         <w:rPr>
@@ -1560,7 +1491,7 @@
         <w:rPr>
           <w:noProof/>
         </w:rPr>
-        <w:instrText xml:space="preserve"> PAGEREF _Toc233883433 \h </w:instrText>
+        <w:instrText xml:space="preserve"> PAGEREF _Toc233884092 \h </w:instrText>
       </w:r>
       <w:r>
         <w:rPr>
@@ -1577,7 +1508,7 @@
         <w:rPr>
           <w:noProof/>
         </w:rPr>
-        <w:t>11</w:t>
+        <w:t>15</w:t>
       </w:r>
       <w:r>
         <w:rPr>
@@ -1622,7 +1553,7 @@
         <w:rPr>
           <w:noProof/>
         </w:rPr>
-        <w:instrText xml:space="preserve"> PAGEREF _Toc233883434 \h </w:instrText>
+        <w:instrText xml:space="preserve"> PAGEREF _Toc233884093 \h </w:instrText>
       </w:r>
       <w:r>
         <w:rPr>
@@ -1639,7 +1570,7 @@
         <w:rPr>
           <w:noProof/>
         </w:rPr>
-        <w:t>12</w:t>
+        <w:t>15</w:t>
       </w:r>
       <w:r>
         <w:rPr>
@@ -1684,7 +1615,7 @@
         <w:rPr>
           <w:noProof/>
         </w:rPr>
-        <w:instrText xml:space="preserve"> PAGEREF _Toc233883435 \h </w:instrText>
+        <w:instrText xml:space="preserve"> PAGEREF _Toc233884094 \h </w:instrText>
       </w:r>
       <w:r>
         <w:rPr>
@@ -1701,7 +1632,7 @@
         <w:rPr>
           <w:noProof/>
         </w:rPr>
-        <w:t>12</w:t>
+        <w:t>15</w:t>
       </w:r>
       <w:r>
         <w:rPr>
@@ -1728,7 +1659,7 @@
           <w:noProof/>
           <w:color w:val="000000"/>
         </w:rPr>
-        <w:t>CHƯƠNG 6. THỬ NGHIỆM VÀ ĐÁNH GIÁ HỆ THỐNG</w:t>
+        <w:t>CHƯƠNG 6. THỨ NGHIỆM VÀ ĐÁNH GIÁ HỆ THỐNG</w:t>
       </w:r>
       <w:r>
         <w:rPr>
@@ -1746,7 +1677,7 @@
         <w:rPr>
           <w:noProof/>
         </w:rPr>
-        <w:instrText xml:space="preserve"> PAGEREF _Toc233883436 \h </w:instrText>
+        <w:instrText xml:space="preserve"> PAGEREF _Toc233884095 \h </w:instrText>
       </w:r>
       <w:r>
         <w:rPr>
@@ -1763,7 +1694,7 @@
         <w:rPr>
           <w:noProof/>
         </w:rPr>
-        <w:t>12</w:t>
+        <w:t>16</w:t>
       </w:r>
       <w:r>
         <w:rPr>
@@ -1808,7 +1739,7 @@
         <w:rPr>
           <w:noProof/>
         </w:rPr>
-        <w:instrText xml:space="preserve"> PAGEREF _Toc233883437 \h </w:instrText>
+        <w:instrText xml:space="preserve"> PAGEREF _Toc233884096 \h </w:instrText>
       </w:r>
       <w:r>
         <w:rPr>
@@ -1825,7 +1756,7 @@
         <w:rPr>
           <w:noProof/>
         </w:rPr>
-        <w:t>12</w:t>
+        <w:t>16</w:t>
       </w:r>
       <w:r>
         <w:rPr>
@@ -1870,7 +1801,7 @@
         <w:rPr>
           <w:noProof/>
         </w:rPr>
-        <w:instrText xml:space="preserve"> PAGEREF _Toc233883438 \h </w:instrText>
+        <w:instrText xml:space="preserve"> PAGEREF _Toc233884097 \h </w:instrText>
       </w:r>
       <w:r>
         <w:rPr>
@@ -1887,7 +1818,7 @@
         <w:rPr>
           <w:noProof/>
         </w:rPr>
-        <w:t>12</w:t>
+        <w:t>16</w:t>
       </w:r>
       <w:r>
         <w:rPr>
@@ -1914,7 +1845,7 @@
           <w:noProof/>
           <w:color w:val="000000"/>
         </w:rPr>
-        <w:t>CHƯƠNG 7. TỔNG KẾT VÀ HƯỚNG PHÁT TRIỂN TƯƠNG LAI</w:t>
+        <w:t>CHƯƠNG 7. TỖNG KẾT VÀ HƯỚNG PHÁT TRIỂN TƯƠNG LAI</w:t>
       </w:r>
       <w:r>
         <w:rPr>
@@ -1932,7 +1863,7 @@
         <w:rPr>
           <w:noProof/>
         </w:rPr>
-        <w:instrText xml:space="preserve"> PAGEREF _Toc233883439 \h </w:instrText>
+        <w:instrText xml:space="preserve"> PAGEREF _Toc233884098 \h </w:instrText>
       </w:r>
       <w:r>
         <w:rPr>
@@ -1949,7 +1880,7 @@
         <w:rPr>
           <w:noProof/>
         </w:rPr>
-        <w:t>13</w:t>
+        <w:t>17</w:t>
       </w:r>
       <w:r>
         <w:rPr>
@@ -1994,7 +1925,7 @@
         <w:rPr>
           <w:noProof/>
         </w:rPr>
-        <w:instrText xml:space="preserve"> PAGEREF _Toc233883440 \h </w:instrText>
+        <w:instrText xml:space="preserve"> PAGEREF _Toc233884099 \h </w:instrText>
       </w:r>
       <w:r>
         <w:rPr>
@@ -2011,7 +1942,7 @@
         <w:rPr>
           <w:noProof/>
         </w:rPr>
-        <w:t>13</w:t>
+        <w:t>17</w:t>
       </w:r>
       <w:r>
         <w:rPr>
@@ -2056,7 +1987,7 @@
         <w:rPr>
           <w:noProof/>
         </w:rPr>
-        <w:instrText xml:space="preserve"> PAGEREF _Toc233883441 \h </w:instrText>
+        <w:instrText xml:space="preserve"> PAGEREF _Toc233884100 \h </w:instrText>
       </w:r>
       <w:r>
         <w:rPr>
@@ -2073,7 +2004,7 @@
         <w:rPr>
           <w:noProof/>
         </w:rPr>
-        <w:t>13</w:t>
+        <w:t>17</w:t>
       </w:r>
       <w:r>
         <w:rPr>
@@ -2125,6 +2056,26 @@
     </w:p>
     <w:p>
       <w:pPr>
+        <w:rPr>
+          <w:rFonts w:ascii="Times New Roman" w:hAnsi="Times New Roman" w:cs="Times New Roman"/>
+          <w:b/>
+          <w:color w:val="000000"/>
+          <w:sz w:val="32"/>
+        </w:rPr>
+      </w:pPr>
+      <w:r>
+        <w:rPr>
+          <w:rFonts w:ascii="Times New Roman" w:hAnsi="Times New Roman" w:cs="Times New Roman"/>
+          <w:b/>
+          <w:color w:val="000000"/>
+          <w:sz w:val="32"/>
+        </w:rPr>
+        <w:lastRenderedPageBreak/>
+        <w:br w:type="page"/>
+      </w:r>
+    </w:p>
+    <w:p>
+      <w:pPr>
         <w:pStyle w:val="Heading1"/>
         <w:spacing w:before="240" w:after="240" w:line="360" w:lineRule="auto"/>
         <w:rPr>
@@ -2134,7 +2085,7 @@
           <w:sz w:val="30"/>
         </w:rPr>
       </w:pPr>
-      <w:bookmarkStart w:id="0" w:name="_Toc233883416"/>
+      <w:bookmarkStart w:id="0" w:name="_Toc233884075"/>
       <w:r>
         <w:rPr>
           <w:rFonts w:ascii="Times New Roman" w:hAnsi="Times New Roman" w:cs="Times New Roman"/>
@@ -2151,21 +2102,20 @@
       <w:pPr>
         <w:pStyle w:val="Heading2"/>
         <w:spacing w:before="120" w:after="120" w:line="360" w:lineRule="auto"/>
-        <w:ind w:left="283"/>
-        <w:rPr>
-          <w:rFonts w:ascii="Times New Roman" w:hAnsi="Times New Roman" w:cs="Times New Roman"/>
-          <w:b/>
-          <w:color w:val="000000"/>
-          <w:sz w:val="26"/>
-        </w:rPr>
-      </w:pPr>
-      <w:bookmarkStart w:id="1" w:name="_Toc233883417"/>
-      <w:r>
-        <w:rPr>
-          <w:rFonts w:ascii="Times New Roman" w:hAnsi="Times New Roman" w:cs="Times New Roman"/>
-          <w:b/>
-          <w:color w:val="000000"/>
-          <w:sz w:val="26"/>
+        <w:rPr>
+          <w:rFonts w:ascii="Times New Roman" w:hAnsi="Times New Roman" w:cs="Times New Roman"/>
+          <w:b/>
+          <w:color w:val="000000"/>
+          <w:sz w:val="28"/>
+        </w:rPr>
+      </w:pPr>
+      <w:bookmarkStart w:id="1" w:name="_Toc233884076"/>
+      <w:r>
+        <w:rPr>
+          <w:rFonts w:ascii="Times New Roman" w:hAnsi="Times New Roman" w:cs="Times New Roman"/>
+          <w:b/>
+          <w:color w:val="000000"/>
+          <w:sz w:val="28"/>
         </w:rPr>
         <w:t>1.1. Giới thiệu ứng dụng NLU Banking App</w:t>
       </w:r>
@@ -2195,21 +2145,20 @@
       <w:pPr>
         <w:pStyle w:val="Heading2"/>
         <w:spacing w:before="120" w:after="120" w:line="360" w:lineRule="auto"/>
-        <w:ind w:left="283"/>
-        <w:rPr>
-          <w:rFonts w:ascii="Times New Roman" w:hAnsi="Times New Roman" w:cs="Times New Roman"/>
-          <w:b/>
-          <w:color w:val="000000"/>
-          <w:sz w:val="26"/>
-        </w:rPr>
-      </w:pPr>
-      <w:bookmarkStart w:id="2" w:name="_Toc233883418"/>
-      <w:r>
-        <w:rPr>
-          <w:rFonts w:ascii="Times New Roman" w:hAnsi="Times New Roman" w:cs="Times New Roman"/>
-          <w:b/>
-          <w:color w:val="000000"/>
-          <w:sz w:val="26"/>
+        <w:rPr>
+          <w:rFonts w:ascii="Times New Roman" w:hAnsi="Times New Roman" w:cs="Times New Roman"/>
+          <w:b/>
+          <w:color w:val="000000"/>
+          <w:sz w:val="28"/>
+        </w:rPr>
+      </w:pPr>
+      <w:bookmarkStart w:id="2" w:name="_Toc233884077"/>
+      <w:r>
+        <w:rPr>
+          <w:rFonts w:ascii="Times New Roman" w:hAnsi="Times New Roman" w:cs="Times New Roman"/>
+          <w:b/>
+          <w:color w:val="000000"/>
+          <w:sz w:val="28"/>
         </w:rPr>
         <w:t>1.2. Danh sách các chức năng lớn của hệ thống</w:t>
       </w:r>
@@ -2239,21 +2188,20 @@
       <w:pPr>
         <w:pStyle w:val="Heading2"/>
         <w:spacing w:before="120" w:after="120" w:line="360" w:lineRule="auto"/>
-        <w:ind w:left="283"/>
-        <w:rPr>
-          <w:rFonts w:ascii="Times New Roman" w:hAnsi="Times New Roman" w:cs="Times New Roman"/>
-          <w:b/>
-          <w:color w:val="000000"/>
-          <w:sz w:val="26"/>
-        </w:rPr>
-      </w:pPr>
-      <w:bookmarkStart w:id="3" w:name="_Toc233883419"/>
-      <w:r>
-        <w:rPr>
-          <w:rFonts w:ascii="Times New Roman" w:hAnsi="Times New Roman" w:cs="Times New Roman"/>
-          <w:b/>
-          <w:color w:val="000000"/>
-          <w:sz w:val="26"/>
+        <w:rPr>
+          <w:rFonts w:ascii="Times New Roman" w:hAnsi="Times New Roman" w:cs="Times New Roman"/>
+          <w:b/>
+          <w:color w:val="000000"/>
+          <w:sz w:val="28"/>
+        </w:rPr>
+      </w:pPr>
+      <w:bookmarkStart w:id="3" w:name="_Toc233884078"/>
+      <w:r>
+        <w:rPr>
+          <w:rFonts w:ascii="Times New Roman" w:hAnsi="Times New Roman" w:cs="Times New Roman"/>
+          <w:b/>
+          <w:color w:val="000000"/>
+          <w:sz w:val="28"/>
         </w:rPr>
         <w:t>1.3. Chi tiết các chức năng nhỏ đi kèm</w:t>
       </w:r>
@@ -2281,7 +2229,7 @@
     </w:p>
     <w:p>
       <w:pPr>
-        <w:spacing w:after="80" w:line="360" w:lineRule="auto"/>
+        <w:spacing w:line="360" w:lineRule="auto"/>
         <w:ind w:left="850" w:hanging="283"/>
         <w:jc w:val="both"/>
         <w:rPr>
@@ -2296,12 +2244,12 @@
           <w:color w:val="000000"/>
           <w:sz w:val="26"/>
         </w:rPr>
-        <w:t xml:space="preserve">  - Chức năng Tạo và Quét mã QR thanh toán: Hệ thống cho phép người dùng tự sinh mã QR chứa số tài khoản cá nhân để người khác chuyển tiền nhanh. Đồng thời, camera quét mã QR tích hợp trên app tự động phân tích và điền chính xác thông tin tài khoản nhận tiền.</w:t>
-      </w:r>
-    </w:p>
-    <w:p>
-      <w:pPr>
-        <w:spacing w:after="80" w:line="360" w:lineRule="auto"/>
+        <w:t>- Chức năng Tạo và Quét mã QR thanh toán: Hệ thống cho phép người dùng tự sinh mã QR chứa số tài khoản cá nhân để người khác chuyển tiền nhanh. Đồng thời, camera quét mã QR tích hợp trên app tự động phân tích và điền chính xác thông tin tài khoản nhận tiền.</w:t>
+      </w:r>
+    </w:p>
+    <w:p>
+      <w:pPr>
+        <w:spacing w:line="360" w:lineRule="auto"/>
         <w:ind w:left="850" w:hanging="283"/>
         <w:jc w:val="both"/>
         <w:rPr>
@@ -2316,12 +2264,12 @@
           <w:color w:val="000000"/>
           <w:sz w:val="26"/>
         </w:rPr>
-        <w:t xml:space="preserve">  - Chức năng Hiển thị số dư tài khoản trực quan: Trên màn hình trang chủ, thông tin số tài khoản thanh toán và số dư khả dụng thực tế được hiển thị rõ ràng, cập nhật ngay lập tức sau khi xảy ra bất kỳ biến động số dư nào.</w:t>
-      </w:r>
-    </w:p>
-    <w:p>
-      <w:pPr>
-        <w:spacing w:after="80" w:line="360" w:lineRule="auto"/>
+        <w:t>- Chức năng Hiển thị số dư tài khoản trực quan: Trên màn hình trang chủ, thông tin số tài khoản thanh toán và số dư khả dụng thực tế được hiển thị rõ ràng, cập nhật ngay lập tức sau khi xảy ra bất kỳ biến động số dư nào.</w:t>
+      </w:r>
+    </w:p>
+    <w:p>
+      <w:pPr>
+        <w:spacing w:line="360" w:lineRule="auto"/>
         <w:ind w:left="850" w:hanging="283"/>
         <w:jc w:val="both"/>
         <w:rPr>
@@ -2337,12 +2285,12 @@
           <w:sz w:val="26"/>
         </w:rPr>
         <w:lastRenderedPageBreak/>
-        <w:t xml:space="preserve">  - Chức năng Đăng ký tài khoản kèm mã OTP: Cho phép người dùng nhập Họ tên, Email, SĐT và CCCD. Hệ thống gửi mã xác thực OTP qua email và kích hoạt tài khoản ngay khi người dùng nhập đúng mã.</w:t>
-      </w:r>
-    </w:p>
-    <w:p>
-      <w:pPr>
-        <w:spacing w:after="80" w:line="360" w:lineRule="auto"/>
+        <w:t>- Chức năng Đăng ký tài khoản kèm mã OTP: Cho phép người dùng nhập Họ tên, Email, SĐT và CCCD. Hệ thống gửi mã xác thực OTP qua email và kích hoạt tài khoản ngay khi người dùng nhập đúng mã.</w:t>
+      </w:r>
+    </w:p>
+    <w:p>
+      <w:pPr>
+        <w:spacing w:line="360" w:lineRule="auto"/>
         <w:ind w:left="850" w:hanging="283"/>
         <w:jc w:val="both"/>
         <w:rPr>
@@ -2357,12 +2305,12 @@
           <w:color w:val="000000"/>
           <w:sz w:val="26"/>
         </w:rPr>
-        <w:t xml:space="preserve">  - Chức năng Đăng nhập bảo mật: Đăng nhập an toàn bằng Email và Mật khẩu thông qua máy chủ Keycloak OIDC, bảo vệ phiên làm việc của người dùng bằng Access Token.</w:t>
-      </w:r>
-    </w:p>
-    <w:p>
-      <w:pPr>
-        <w:spacing w:after="80" w:line="360" w:lineRule="auto"/>
+        <w:t>- Chức năng Đăng nhập bảo mật: Đăng nhập an toàn bằng Email và Mật khẩu thông qua máy chủ Keycloak OIDC, bảo vệ phiên làm việc của người dùng bằng Access Token.</w:t>
+      </w:r>
+    </w:p>
+    <w:p>
+      <w:pPr>
+        <w:spacing w:line="360" w:lineRule="auto"/>
         <w:ind w:left="850" w:hanging="283"/>
         <w:jc w:val="both"/>
         <w:rPr>
@@ -2377,12 +2325,12 @@
           <w:color w:val="000000"/>
           <w:sz w:val="26"/>
         </w:rPr>
-        <w:t xml:space="preserve">  - Chức năng Chuyển khoản nội bộ: Nhập số tài khoản thụ hưởng, tự động hiển thị tên người nhận để xác minh trước khi cho phép nhập số tiền và nội dung chuyển tiền, yêu cầu mã OTP giao dịch để hoàn tất.</w:t>
-      </w:r>
-    </w:p>
-    <w:p>
-      <w:pPr>
-        <w:spacing w:after="80" w:line="360" w:lineRule="auto"/>
+        <w:t>- Chức năng Chuyển khoản nội bộ: Nhập số tài khoản thụ hưởng, tự động hiển thị tên người nhận để xác minh trước khi cho phép nhập số tiền và nội dung chuyển tiền, yêu cầu mã OTP giao dịch để hoàn tất.</w:t>
+      </w:r>
+    </w:p>
+    <w:p>
+      <w:pPr>
+        <w:spacing w:line="360" w:lineRule="auto"/>
         <w:ind w:left="850" w:hanging="283"/>
         <w:jc w:val="both"/>
         <w:rPr>
@@ -2397,12 +2345,12 @@
           <w:color w:val="000000"/>
           <w:sz w:val="26"/>
         </w:rPr>
-        <w:t xml:space="preserve">  - Chức năng Rút tiền và Nạp tiền giả lập: Khách hàng có thể thực hiện nạp tiền hoặc rút tiền trực tiếp trên ứng dụng để thay đổi số dư tài khoản thanh toán.</w:t>
-      </w:r>
-    </w:p>
-    <w:p>
-      <w:pPr>
-        <w:spacing w:after="120" w:line="360" w:lineRule="auto"/>
+        <w:t>- Chức năng Rút tiền và Nạp tiền giả lập: Khách hàng có thể thực hiện nạp tiền hoặc rút tiền trực tiếp trên ứng dụng để thay đổi số dư tài khoản thanh toán.</w:t>
+      </w:r>
+    </w:p>
+    <w:p>
+      <w:pPr>
+        <w:spacing w:line="360" w:lineRule="auto"/>
         <w:ind w:left="850" w:hanging="283"/>
         <w:jc w:val="both"/>
         <w:rPr>
@@ -2417,28 +2365,27 @@
           <w:color w:val="000000"/>
           <w:sz w:val="26"/>
         </w:rPr>
-        <w:t xml:space="preserve">  - Chức năng Lịch sử giao dịch: Hiển thị danh sách đầy đủ lịch sử giao dịch chuyển khoản, nạp/rút tiền kèm thông tin mô tả chi tiết của từng giao dịch.</w:t>
+        <w:t>- Chức năng Lịch sử giao dịch: Hiển thị danh sách đầy đủ lịch sử giao dịch chuyển khoản, nạp/rút tiền kèm thông tin mô tả chi tiết của từng giao dịch.</w:t>
       </w:r>
     </w:p>
     <w:p>
       <w:pPr>
         <w:pStyle w:val="Heading2"/>
         <w:spacing w:before="120" w:after="120" w:line="360" w:lineRule="auto"/>
-        <w:ind w:left="283"/>
-        <w:rPr>
-          <w:rFonts w:ascii="Times New Roman" w:hAnsi="Times New Roman" w:cs="Times New Roman"/>
-          <w:b/>
-          <w:color w:val="000000"/>
-          <w:sz w:val="26"/>
-        </w:rPr>
-      </w:pPr>
-      <w:bookmarkStart w:id="4" w:name="_Toc233883420"/>
-      <w:r>
-        <w:rPr>
-          <w:rFonts w:ascii="Times New Roman" w:hAnsi="Times New Roman" w:cs="Times New Roman"/>
-          <w:b/>
-          <w:color w:val="000000"/>
-          <w:sz w:val="26"/>
+        <w:rPr>
+          <w:rFonts w:ascii="Times New Roman" w:hAnsi="Times New Roman" w:cs="Times New Roman"/>
+          <w:b/>
+          <w:color w:val="000000"/>
+          <w:sz w:val="28"/>
+        </w:rPr>
+      </w:pPr>
+      <w:bookmarkStart w:id="4" w:name="_Toc233884079"/>
+      <w:r>
+        <w:rPr>
+          <w:rFonts w:ascii="Times New Roman" w:hAnsi="Times New Roman" w:cs="Times New Roman"/>
+          <w:b/>
+          <w:color w:val="000000"/>
+          <w:sz w:val="28"/>
         </w:rPr>
         <w:t>1.4. Phân tích yêu cầu hệ thống</w:t>
       </w:r>
@@ -2456,7 +2403,7 @@
           <w:sz w:val="26"/>
         </w:rPr>
       </w:pPr>
-      <w:bookmarkStart w:id="5" w:name="_Toc233883421"/>
+      <w:bookmarkStart w:id="5" w:name="_Toc233884080"/>
       <w:r>
         <w:rPr>
           <w:rFonts w:ascii="Times New Roman" w:hAnsi="Times New Roman" w:cs="Times New Roman"/>
@@ -2470,7 +2417,7 @@
     </w:p>
     <w:p>
       <w:pPr>
-        <w:spacing w:after="80" w:line="360" w:lineRule="auto"/>
+        <w:spacing w:line="360" w:lineRule="auto"/>
         <w:ind w:firstLine="709"/>
         <w:jc w:val="both"/>
         <w:rPr>
@@ -2500,7 +2447,7 @@
           <w:sz w:val="26"/>
         </w:rPr>
       </w:pPr>
-      <w:bookmarkStart w:id="6" w:name="_Toc233883422"/>
+      <w:bookmarkStart w:id="6" w:name="_Toc233884081"/>
       <w:r>
         <w:rPr>
           <w:rFonts w:ascii="Times New Roman" w:hAnsi="Times New Roman" w:cs="Times New Roman"/>
@@ -2511,82 +2458,6 @@
         <w:t>1.4.2. Yêu cầu phi chức năng (Non-functional Requirements)</w:t>
       </w:r>
       <w:bookmarkEnd w:id="6"/>
-    </w:p>
-    <w:p>
-      <w:pPr>
-        <w:spacing w:after="120" w:line="360" w:lineRule="auto"/>
-        <w:ind w:firstLine="709"/>
-        <w:jc w:val="both"/>
-        <w:rPr>
-          <w:rFonts w:ascii="Times New Roman" w:hAnsi="Times New Roman" w:cs="Times New Roman"/>
-          <w:color w:val="000000"/>
-          <w:sz w:val="26"/>
-        </w:rPr>
-      </w:pPr>
-      <w:r>
-        <w:rPr>
-          <w:rFonts w:ascii="Times New Roman" w:hAnsi="Times New Roman" w:cs="Times New Roman"/>
-          <w:color w:val="000000"/>
-          <w:sz w:val="26"/>
-        </w:rPr>
-        <w:t xml:space="preserve">Các yêu cầu về chất lượng và vận hành hệ thống bao gồm: (1) Tính bảo mật cao: Mã hóa thông tin nhạy cảm và OTP, bảo vệ phiên đăng nhập bằng Access Token có thời gian hết hạn ngắn. (2) Tính nhất quán dữ liệu (Data Consistency): Số dư của tài khoản gửi và nhận phải thay đổi chính xác, đồng thời trong một giao dịch chuyển khoản; nếu xảy ra lỗi </w:t>
-      </w:r>
-      <w:r>
-        <w:rPr>
-          <w:rFonts w:ascii="Times New Roman" w:hAnsi="Times New Roman" w:cs="Times New Roman"/>
-          <w:color w:val="000000"/>
-          <w:sz w:val="26"/>
-        </w:rPr>
-        <w:lastRenderedPageBreak/>
-        <w:t>giữa chừng, toàn bộ giao dịch phải được rollback. (3) Hiệu năng xử lý: Phản hồi các yêu cầu API từ Android Client dưới 500ms thông qua định tuyến Gateway và Eureka Server.</w:t>
-      </w:r>
-    </w:p>
-    <w:p>
-      <w:pPr>
-        <w:pStyle w:val="Heading1"/>
-        <w:spacing w:before="240" w:after="240" w:line="360" w:lineRule="auto"/>
-        <w:rPr>
-          <w:rFonts w:ascii="Times New Roman" w:hAnsi="Times New Roman" w:cs="Times New Roman"/>
-          <w:b/>
-          <w:color w:val="000000"/>
-          <w:sz w:val="30"/>
-        </w:rPr>
-      </w:pPr>
-      <w:bookmarkStart w:id="7" w:name="_Toc233883423"/>
-      <w:r>
-        <w:rPr>
-          <w:rFonts w:ascii="Times New Roman" w:hAnsi="Times New Roman" w:cs="Times New Roman"/>
-          <w:b/>
-          <w:color w:val="000000"/>
-          <w:sz w:val="30"/>
-        </w:rPr>
-        <w:t>CHƯƠNG 2. MÔ TẢ LUỒNG HOẠT ĐỘNG CHÍNH VÀ LUỒNG NGOẠI LỆ</w:t>
-      </w:r>
-      <w:bookmarkEnd w:id="7"/>
-    </w:p>
-    <w:p>
-      <w:pPr>
-        <w:pStyle w:val="Heading2"/>
-        <w:spacing w:before="120" w:after="120" w:line="360" w:lineRule="auto"/>
-        <w:ind w:left="283"/>
-        <w:rPr>
-          <w:rFonts w:ascii="Times New Roman" w:hAnsi="Times New Roman" w:cs="Times New Roman"/>
-          <w:b/>
-          <w:color w:val="000000"/>
-          <w:sz w:val="26"/>
-        </w:rPr>
-      </w:pPr>
-      <w:bookmarkStart w:id="8" w:name="_Toc233883424"/>
-      <w:r>
-        <w:rPr>
-          <w:rFonts w:ascii="Times New Roman" w:hAnsi="Times New Roman" w:cs="Times New Roman"/>
-          <w:b/>
-          <w:color w:val="000000"/>
-          <w:sz w:val="26"/>
-        </w:rPr>
-        <w:t>2.1. Luồng hoạt động chính (Happy Paths)</w:t>
-      </w:r>
-      <w:bookmarkEnd w:id="8"/>
     </w:p>
     <w:p>
       <w:pPr>
@@ -2605,92 +2476,81 @@
           <w:color w:val="000000"/>
           <w:sz w:val="26"/>
         </w:rPr>
-        <w:t>Luồng hoạt động chính mô tả tiến trình thực hiện thành công (không xảy ra lỗi) của các nghiệp vụ cốt lõi:</w:t>
-      </w:r>
-    </w:p>
-    <w:p>
-      <w:pPr>
-        <w:spacing w:after="80" w:line="360" w:lineRule="auto"/>
-        <w:ind w:left="850" w:hanging="283"/>
-        <w:jc w:val="both"/>
-        <w:rPr>
-          <w:rFonts w:ascii="Times New Roman" w:hAnsi="Times New Roman" w:cs="Times New Roman"/>
-          <w:color w:val="000000"/>
-          <w:sz w:val="26"/>
-        </w:rPr>
-      </w:pPr>
-      <w:r>
-        <w:rPr>
-          <w:rFonts w:ascii="Times New Roman" w:hAnsi="Times New Roman" w:cs="Times New Roman"/>
-          <w:color w:val="000000"/>
-          <w:sz w:val="26"/>
-        </w:rPr>
-        <w:t xml:space="preserve">  - Luồng Đăng ký tài khoản mới: (1) Khách hàng nhập thông tin đăng ký hợp lệ. (2) Hệ thống tạo tài khoản tạm thời, sinh mã OTP 6 chữ số và gửi qua Email. (3) Khách hàng nhập mã OTP chính xác vào giao diện ứng dụng. (4) Hệ thống gửi thông tin đăng ký chính thức lên Keycloak để tạo User định danh, đồng thời gọi Account-Service cấp phát số tài khoản thanh toán ngẫu nhiên.</w:t>
-      </w:r>
-    </w:p>
-    <w:p>
-      <w:pPr>
-        <w:spacing w:after="80" w:line="360" w:lineRule="auto"/>
-        <w:ind w:left="850" w:hanging="283"/>
-        <w:jc w:val="both"/>
-        <w:rPr>
-          <w:rFonts w:ascii="Times New Roman" w:hAnsi="Times New Roman" w:cs="Times New Roman"/>
-          <w:color w:val="000000"/>
-          <w:sz w:val="26"/>
-        </w:rPr>
-      </w:pPr>
-      <w:r>
-        <w:rPr>
-          <w:rFonts w:ascii="Times New Roman" w:hAnsi="Times New Roman" w:cs="Times New Roman"/>
-          <w:color w:val="000000"/>
-          <w:sz w:val="26"/>
-        </w:rPr>
-        <w:t xml:space="preserve">  - Luồng Chuyển tiền nội bộ: (1) Khách hàng nhập số tài khoản đích. (2) Ứng dụng di động tự động gọi API Gateway để truy vấn và hiển thị họ tên chủ tài khoản nhận. (3) Khách hàng nhập số tiền và nội dung, nhấn xác nhận. (4) Hệ thống gửi mã OTP xác nhận giao dịch qua email người gửi. (5) Khách hàng nhập đúng OTP, hệ thống thực hiện đồng thời việc trừ tiền tài khoản gửi và cộng tiền tài khoản nhận, lưu lịch sử giao dịch.</w:t>
-      </w:r>
-    </w:p>
-    <w:p>
-      <w:pPr>
-        <w:spacing w:after="120" w:line="360" w:lineRule="auto"/>
-        <w:ind w:left="850" w:hanging="283"/>
-        <w:jc w:val="both"/>
-        <w:rPr>
-          <w:rFonts w:ascii="Times New Roman" w:hAnsi="Times New Roman" w:cs="Times New Roman"/>
-          <w:color w:val="000000"/>
-          <w:sz w:val="26"/>
-        </w:rPr>
-      </w:pPr>
-      <w:r>
-        <w:rPr>
-          <w:rFonts w:ascii="Times New Roman" w:hAnsi="Times New Roman" w:cs="Times New Roman"/>
-          <w:color w:val="000000"/>
-          <w:sz w:val="26"/>
-        </w:rPr>
-        <w:t xml:space="preserve">  - Luồng Chuyển khoản nhanh bằng QR Code: (1) Người nhận hiển thị mã QR tài khoản cá nhân. (2) Người gửi sử dụng chức năng quét QR trên app di động để quét. (3) Ứng dụng tự động giải mã thông tin QR, điền số tài khoản thụ hưởng và hiển thị họ tên người nhận trên màn hình giao dịch chuyển khoản. (4) Người gửi tiến hành các bước xác thực OTP để hoàn tất giao dịch chuyển tiền.</w:t>
-      </w:r>
+        <w:t xml:space="preserve">Các yêu cầu về chất lượng và vận hành hệ thống bao gồm: (1) Tính bảo mật cao: Mã hóa thông tin nhạy cảm và OTP, bảo vệ phiên đăng nhập bằng Access Token có thời gian hết hạn ngắn. (2) Tính nhất quán dữ liệu (Data Consistency): Số dư của tài khoản gửi và nhận phải thay đổi chính xác, đồng thời trong một giao dịch chuyển khoản; nếu xảy ra lỗi </w:t>
+      </w:r>
+      <w:r>
+        <w:rPr>
+          <w:rFonts w:ascii="Times New Roman" w:hAnsi="Times New Roman" w:cs="Times New Roman"/>
+          <w:color w:val="000000"/>
+          <w:sz w:val="26"/>
+        </w:rPr>
+        <w:lastRenderedPageBreak/>
+        <w:t>giữa chừng, toàn bộ giao dịch phải được rollback. (3) Hiệu năng xử lý: Phản hồi các yêu cầu API từ Android Client dưới 500ms thông qua định tuyến Gateway và Eureka Server.</w:t>
+      </w:r>
+    </w:p>
+    <w:p>
+      <w:pPr>
+        <w:rPr>
+          <w:rFonts w:ascii="Times New Roman" w:hAnsi="Times New Roman" w:cs="Times New Roman"/>
+          <w:color w:val="000000"/>
+          <w:sz w:val="26"/>
+        </w:rPr>
+      </w:pPr>
+      <w:r>
+        <w:rPr>
+          <w:rFonts w:ascii="Times New Roman" w:hAnsi="Times New Roman" w:cs="Times New Roman"/>
+          <w:color w:val="000000"/>
+          <w:sz w:val="26"/>
+        </w:rPr>
+        <w:br w:type="page"/>
+      </w:r>
+    </w:p>
+    <w:p>
+      <w:pPr>
+        <w:pStyle w:val="Heading1"/>
+        <w:spacing w:before="240" w:after="240" w:line="360" w:lineRule="auto"/>
+        <w:rPr>
+          <w:rFonts w:ascii="Times New Roman" w:hAnsi="Times New Roman" w:cs="Times New Roman"/>
+          <w:b/>
+          <w:color w:val="000000"/>
+          <w:sz w:val="30"/>
+        </w:rPr>
+      </w:pPr>
+      <w:bookmarkStart w:id="7" w:name="_Toc233884082"/>
+      <w:r>
+        <w:rPr>
+          <w:rFonts w:ascii="Times New Roman" w:hAnsi="Times New Roman" w:cs="Times New Roman"/>
+          <w:b/>
+          <w:color w:val="000000"/>
+          <w:sz w:val="30"/>
+        </w:rPr>
+        <w:lastRenderedPageBreak/>
+        <w:t>CHƯƠNG 2. MÔ TẢ LUỐNG HOẠT ĐỘNG CHÍNH VÀ LUỐNG NGOẠI LỆ</w:t>
+      </w:r>
+      <w:bookmarkEnd w:id="7"/>
     </w:p>
     <w:p>
       <w:pPr>
         <w:pStyle w:val="Heading2"/>
         <w:spacing w:before="120" w:after="120" w:line="360" w:lineRule="auto"/>
-        <w:ind w:left="283"/>
-        <w:rPr>
-          <w:rFonts w:ascii="Times New Roman" w:hAnsi="Times New Roman" w:cs="Times New Roman"/>
-          <w:b/>
-          <w:color w:val="000000"/>
-          <w:sz w:val="26"/>
-        </w:rPr>
-      </w:pPr>
-      <w:bookmarkStart w:id="9" w:name="_Toc233883425"/>
-      <w:r>
-        <w:rPr>
-          <w:rFonts w:ascii="Times New Roman" w:hAnsi="Times New Roman" w:cs="Times New Roman"/>
-          <w:b/>
-          <w:color w:val="000000"/>
-          <w:sz w:val="26"/>
-        </w:rPr>
-        <w:t>2.2. Luồng xử lý ngoại lệ và ràng buộc logic (Exceptional Flows)</w:t>
-      </w:r>
-      <w:bookmarkEnd w:id="9"/>
+        <w:rPr>
+          <w:rFonts w:ascii="Times New Roman" w:hAnsi="Times New Roman" w:cs="Times New Roman"/>
+          <w:b/>
+          <w:color w:val="000000"/>
+          <w:sz w:val="28"/>
+        </w:rPr>
+      </w:pPr>
+      <w:bookmarkStart w:id="8" w:name="_Toc233884083"/>
+      <w:r>
+        <w:rPr>
+          <w:rFonts w:ascii="Times New Roman" w:hAnsi="Times New Roman" w:cs="Times New Roman"/>
+          <w:b/>
+          <w:color w:val="000000"/>
+          <w:sz w:val="28"/>
+        </w:rPr>
+        <w:t>2.1. Luồng hoạt động chính (Happy Paths)</w:t>
+      </w:r>
+      <w:bookmarkEnd w:id="8"/>
     </w:p>
     <w:p>
       <w:pPr>
@@ -2709,12 +2569,12 @@
           <w:color w:val="000000"/>
           <w:sz w:val="26"/>
         </w:rPr>
-        <w:t>Để bảo vệ an toàn giao dịch và tính nhất quán dữ liệu, hệ thống bắt buộc phải kiểm tra và xử lý các luồng ngoại lệ sau:</w:t>
-      </w:r>
-    </w:p>
-    <w:p>
-      <w:pPr>
-        <w:spacing w:after="80" w:line="360" w:lineRule="auto"/>
+        <w:t>Luồng hoạt động chính mô tả tiến trình thực hiện thành công (không xảy ra lỗi) của các nghiệp vụ cốt lõi:</w:t>
+      </w:r>
+    </w:p>
+    <w:p>
+      <w:pPr>
+        <w:spacing w:line="360" w:lineRule="auto"/>
         <w:ind w:left="850" w:hanging="283"/>
         <w:jc w:val="both"/>
         <w:rPr>
@@ -2729,13 +2589,12 @@
           <w:color w:val="000000"/>
           <w:sz w:val="26"/>
         </w:rPr>
-        <w:lastRenderedPageBreak/>
-        <w:t xml:space="preserve">  - Ngoại lệ Chuyển tiền vượt quá số dư khả dụng: Khi người dùng nhấn nút chuyển khoản, hệ thống sẽ thực hiện kiểm tra điều kiện số tiền giao dịch phải nhỏ hơn số dư khả dụng thực tế. Nếu số tiền chuyển lớn hơn số dư hiện tại, hệ thống lập tức chặn giao dịch và hiển thị thông báo lỗi 'Số dư tài khoản không đủ để thực hiện giao dịch này'.</w:t>
-      </w:r>
-    </w:p>
-    <w:p>
-      <w:pPr>
-        <w:spacing w:after="80" w:line="360" w:lineRule="auto"/>
+        <w:t>- Luồng Đăng ký tài khoản mới: (1) Khách hàng nhập thông tin đăng ký hợp lệ. (2) Hệ thống tạo tài khoản tạm thời, sinh mã OTP 6 chữ số và gửi qua Email. (3) Khách hàng nhập mã OTP chính xác vào giao diện ứng dụng. (4) Hệ thống gửi thông tin đăng ký chính thức lên Keycloak để tạo User định danh, đồng thời gọi Account-Service cấp phát số tài khoản thanh toán ngẫu nhiên.</w:t>
+      </w:r>
+    </w:p>
+    <w:p>
+      <w:pPr>
+        <w:spacing w:line="360" w:lineRule="auto"/>
         <w:ind w:left="850" w:hanging="283"/>
         <w:jc w:val="both"/>
         <w:rPr>
@@ -2750,12 +2609,12 @@
           <w:color w:val="000000"/>
           <w:sz w:val="26"/>
         </w:rPr>
-        <w:t xml:space="preserve">  - Ngoại lệ Nhập sai mã OTP hoặc OTP hết hạn: Mã OTP giao dịch và OTP kích hoạt tài khoản chỉ có hiệu lực sử dụng trong vòng 3 phút. Nếu người dùng nhập mã OTP đã hết hạn, hoặc nhập sai mã OTP quá 3 lần liên tiếp, hệ thống sẽ từ chối giao dịch, huỷ mã OTP cũ và yêu cầu người dùng yêu cầu gửi lại mã OTP mới.</w:t>
-      </w:r>
-    </w:p>
-    <w:p>
-      <w:pPr>
-        <w:spacing w:after="80" w:line="360" w:lineRule="auto"/>
+        <w:t>- Luồng Chuyển tiền nội bộ: (1) Khách hàng nhập số tài khoản đích. (2) Ứng dụng di động tự động gọi API Gateway để truy vấn và hiển thị họ tên chủ tài khoản nhận. (3) Khách hàng nhập số tiền và nội dung, nhấn xác nhận. (4) Hệ thống gửi mã OTP xác nhận giao dịch qua email người gửi. (5) Khách hàng nhập đúng OTP, hệ thống thực hiện đồng thời việc trừ tiền tài khoản gửi và cộng tiền tài khoản nhận, lưu lịch sử giao dịch.</w:t>
+      </w:r>
+    </w:p>
+    <w:p>
+      <w:pPr>
+        <w:spacing w:line="360" w:lineRule="auto"/>
         <w:ind w:left="850" w:hanging="283"/>
         <w:jc w:val="both"/>
         <w:rPr>
@@ -2770,75 +2629,31 @@
           <w:color w:val="000000"/>
           <w:sz w:val="26"/>
         </w:rPr>
-        <w:t xml:space="preserve">  - Ngoại lệ Nhập số tài khoản thụ hưởng không tồn tại: Khi người dùng nhập số tài khoản đích, API Gateway sẽ gọi đến Account-Service để kiểm tra. Nếu không tìm thấy số tài khoản này trong cơ sở dữ liệu, hệ thống trả về lỗi 404 và hiển thị thông báo trên giao diện di động: 'Tài khoản thụ hưởng không tồn tại. Vui lòng kiểm tra lại'.</w:t>
-      </w:r>
-    </w:p>
-    <w:p>
-      <w:pPr>
-        <w:spacing w:after="120" w:line="360" w:lineRule="auto"/>
-        <w:ind w:left="850" w:hanging="283"/>
-        <w:jc w:val="both"/>
-        <w:rPr>
-          <w:rFonts w:ascii="Times New Roman" w:hAnsi="Times New Roman" w:cs="Times New Roman"/>
-          <w:color w:val="000000"/>
-          <w:sz w:val="26"/>
-        </w:rPr>
-      </w:pPr>
-      <w:r>
-        <w:rPr>
-          <w:rFonts w:ascii="Times New Roman" w:hAnsi="Times New Roman" w:cs="Times New Roman"/>
-          <w:color w:val="000000"/>
-          <w:sz w:val="26"/>
-        </w:rPr>
-        <w:t xml:space="preserve">  - Ràng buộc nhập CCCD không đúng định dạng: Trong quá trình đăng ký tài khoản, trường thông tin Số định danh (CCCD) được kiểm soát nghiêm ngặt. Hệ thống sẽ kiểm tra chiều dài chuỗi CCCD phải đúng bằng 12 chữ số. Nếu người dùng nhập thiếu hoặc thừa ký tự, ứng dụng Android lập tức hiển thị cảnh báo định dạng và không cho phép gửi yêu cầu lên máy chủ backend.</w:t>
-      </w:r>
-    </w:p>
-    <w:p>
-      <w:pPr>
-        <w:pStyle w:val="Heading1"/>
-        <w:spacing w:before="240" w:after="240" w:line="360" w:lineRule="auto"/>
-        <w:rPr>
-          <w:rFonts w:ascii="Times New Roman" w:hAnsi="Times New Roman" w:cs="Times New Roman"/>
-          <w:b/>
-          <w:color w:val="000000"/>
-          <w:sz w:val="30"/>
-        </w:rPr>
-      </w:pPr>
-      <w:bookmarkStart w:id="10" w:name="_Toc233883426"/>
-      <w:r>
-        <w:rPr>
-          <w:rFonts w:ascii="Times New Roman" w:hAnsi="Times New Roman" w:cs="Times New Roman"/>
-          <w:b/>
-          <w:color w:val="000000"/>
-          <w:sz w:val="30"/>
-        </w:rPr>
-        <w:t>CHƯƠNG 3. CẤU TRÚC HỆ THỐNG MULTI-SERVICE VÀ BẢO MẬT KEYCLOAK</w:t>
-      </w:r>
-      <w:bookmarkEnd w:id="10"/>
+        <w:t>- Luồng Chuyển khoản nhanh bằng QR Code: (1) Người nhận hiển thị mã QR tài khoản cá nhân. (2) Người gửi sử dụng chức năng quét QR trên app di động để quét. (3) Ứng dụng tự động giải mã thông tin QR, điền số tài khoản thụ hưởng và hiển thị họ tên người nhận trên màn hình giao dịch. (4) Người gửi tiến hành các bước xác thực OTP để hoàn tất giao dịch.</w:t>
+      </w:r>
     </w:p>
     <w:p>
       <w:pPr>
         <w:pStyle w:val="Heading2"/>
         <w:spacing w:before="120" w:after="120" w:line="360" w:lineRule="auto"/>
-        <w:ind w:left="283"/>
-        <w:rPr>
-          <w:rFonts w:ascii="Times New Roman" w:hAnsi="Times New Roman" w:cs="Times New Roman"/>
-          <w:b/>
-          <w:color w:val="000000"/>
-          <w:sz w:val="26"/>
-        </w:rPr>
-      </w:pPr>
-      <w:bookmarkStart w:id="11" w:name="_Toc233883427"/>
-      <w:r>
-        <w:rPr>
-          <w:rFonts w:ascii="Times New Roman" w:hAnsi="Times New Roman" w:cs="Times New Roman"/>
-          <w:b/>
-          <w:color w:val="000000"/>
-          <w:sz w:val="26"/>
-        </w:rPr>
-        <w:t>3.1. Cấu trúc Multi-service (Microservices) độc lập</w:t>
-      </w:r>
-      <w:bookmarkEnd w:id="11"/>
+        <w:rPr>
+          <w:rFonts w:ascii="Times New Roman" w:hAnsi="Times New Roman" w:cs="Times New Roman"/>
+          <w:b/>
+          <w:color w:val="000000"/>
+          <w:sz w:val="28"/>
+        </w:rPr>
+      </w:pPr>
+      <w:bookmarkStart w:id="9" w:name="_Toc233884084"/>
+      <w:r>
+        <w:rPr>
+          <w:rFonts w:ascii="Times New Roman" w:hAnsi="Times New Roman" w:cs="Times New Roman"/>
+          <w:b/>
+          <w:color w:val="000000"/>
+          <w:sz w:val="28"/>
+        </w:rPr>
+        <w:t>2.2. Luồng xử lý ngoại lệ và ràng buộc logic (Exceptional Flows)</w:t>
+      </w:r>
+      <w:bookmarkEnd w:id="9"/>
     </w:p>
     <w:p>
       <w:pPr>
@@ -2857,12 +2672,12 @@
           <w:color w:val="000000"/>
           <w:sz w:val="26"/>
         </w:rPr>
-        <w:t>Hệ thống backend của NLU Banking App được phát triển theo kiến trúc Multi-service (Microservices) gồm 7 dịch vụ Spring Boot độc lập hoạt động kết hợp với nhau:</w:t>
-      </w:r>
-    </w:p>
-    <w:p>
-      <w:pPr>
-        <w:spacing w:after="80" w:line="360" w:lineRule="auto"/>
+        <w:t>Để bảo vệ an toàn giao dịch và tính nhất quán dữ liệu, hệ thống bắt buộc phải kiểm tra và xử lý các luồng ngoại lệ sau:</w:t>
+      </w:r>
+    </w:p>
+    <w:p>
+      <w:pPr>
+        <w:spacing w:line="360" w:lineRule="auto"/>
         <w:ind w:left="850" w:hanging="283"/>
         <w:jc w:val="both"/>
         <w:rPr>
@@ -2877,13 +2692,21 @@
           <w:color w:val="000000"/>
           <w:sz w:val="26"/>
         </w:rPr>
+        <w:t xml:space="preserve">- Ngoại lệ Chuyển tiền vượt quá số dư khả dụng: Hệ thống kiểm tra điều kiện số tiền giao dịch phải nhỏ hơn số dư khả dụng. Nếu vượt quá, hệ thống lập tức chặn giao </w:t>
+      </w:r>
+      <w:r>
+        <w:rPr>
+          <w:rFonts w:ascii="Times New Roman" w:hAnsi="Times New Roman" w:cs="Times New Roman"/>
+          <w:color w:val="000000"/>
+          <w:sz w:val="26"/>
+        </w:rPr>
         <w:lastRenderedPageBreak/>
-        <w:t xml:space="preserve">  - Service-Registry (Cổng quản lý Eureka Server): Đăng ký và quản lý danh sách các microservices đang hoạt động, cho phép các dịch vụ tự tìm thấy nhau mà không cần gán cứng IP.</w:t>
-      </w:r>
-    </w:p>
-    <w:p>
-      <w:pPr>
-        <w:spacing w:after="80" w:line="360" w:lineRule="auto"/>
+        <w:t>dịch và hiển thị thông báo lỗi 'Số dư tài khoản không đủ để thực hiện giao dịch này'.</w:t>
+      </w:r>
+    </w:p>
+    <w:p>
+      <w:pPr>
+        <w:spacing w:line="360" w:lineRule="auto"/>
         <w:ind w:left="850" w:hanging="283"/>
         <w:jc w:val="both"/>
         <w:rPr>
@@ -2898,12 +2721,12 @@
           <w:color w:val="000000"/>
           <w:sz w:val="26"/>
         </w:rPr>
-        <w:t xml:space="preserve">  - API-Gateway: Đóng vai trò là cổng ngõ ra vào duy nhất cho các yêu cầu API từ Android Client. Gateway chịu trách nhiệm định tuyến cuộc gọi API đến dịch vụ tương ứng và chặn các cuộc gọi không có JWT token hợp lệ.</w:t>
-      </w:r>
-    </w:p>
-    <w:p>
-      <w:pPr>
-        <w:spacing w:after="80" w:line="360" w:lineRule="auto"/>
+        <w:t>- Ngoại lệ Nhập sai mã OTP hoặc OTP hết hạn: Mã OTP chỉ có hiệu lực trong vòng 3 phút. Nếu nhập sai quá 3 lần hoặc OTP hết hạn, hệ thống từ chối giao dịch và yêu cầu gửi lại mã OTP mới.</w:t>
+      </w:r>
+    </w:p>
+    <w:p>
+      <w:pPr>
+        <w:spacing w:line="360" w:lineRule="auto"/>
         <w:ind w:left="850" w:hanging="283"/>
         <w:jc w:val="both"/>
         <w:rPr>
@@ -2918,12 +2741,12 @@
           <w:color w:val="000000"/>
           <w:sz w:val="26"/>
         </w:rPr>
-        <w:t xml:space="preserve">  - User-Service: Quản lý đăng ký hồ sơ khách hàng, sinh mã và lưu trữ OTP kích hoạt, liên kết tài khoản định danh với máy chủ Keycloak.</w:t>
-      </w:r>
-    </w:p>
-    <w:p>
-      <w:pPr>
-        <w:spacing w:after="80" w:line="360" w:lineRule="auto"/>
+        <w:t>- Ngoại lệ Nhập số tài khoản thụ hưởng không tồn tại: Hệ thống trả về lỗi 404 và hiển thị: 'Tài khoản thụ hưởng không tồn tại. Vui lòng kiểm tra lại'.</w:t>
+      </w:r>
+    </w:p>
+    <w:p>
+      <w:pPr>
+        <w:spacing w:line="360" w:lineRule="auto"/>
         <w:ind w:left="850" w:hanging="283"/>
         <w:jc w:val="both"/>
         <w:rPr>
@@ -2938,92 +2761,72 @@
           <w:color w:val="000000"/>
           <w:sz w:val="26"/>
         </w:rPr>
-        <w:t xml:space="preserve">  - Account-Service: Quản lý số tài khoản ngân hàng, thông tin số dư khả dụng và trạng thái tài khoản.</w:t>
-      </w:r>
-    </w:p>
-    <w:p>
-      <w:pPr>
-        <w:spacing w:after="80" w:line="360" w:lineRule="auto"/>
-        <w:ind w:left="850" w:hanging="283"/>
-        <w:jc w:val="both"/>
-        <w:rPr>
-          <w:rFonts w:ascii="Times New Roman" w:hAnsi="Times New Roman" w:cs="Times New Roman"/>
-          <w:color w:val="000000"/>
-          <w:sz w:val="26"/>
-        </w:rPr>
-      </w:pPr>
-      <w:r>
-        <w:rPr>
-          <w:rFonts w:ascii="Times New Roman" w:hAnsi="Times New Roman" w:cs="Times New Roman"/>
-          <w:color w:val="000000"/>
-          <w:sz w:val="26"/>
-        </w:rPr>
-        <w:t xml:space="preserve">  - Fund-Transfer-Service: Xử lý và ghi nhận toàn bộ lịch sử các giao dịch chuyển khoản nội bộ giữa các tài khoản khách hàng.</w:t>
-      </w:r>
-    </w:p>
-    <w:p>
-      <w:pPr>
-        <w:spacing w:after="80" w:line="360" w:lineRule="auto"/>
-        <w:ind w:left="850" w:hanging="283"/>
-        <w:jc w:val="both"/>
-        <w:rPr>
-          <w:rFonts w:ascii="Times New Roman" w:hAnsi="Times New Roman" w:cs="Times New Roman"/>
-          <w:color w:val="000000"/>
-          <w:sz w:val="26"/>
-        </w:rPr>
-      </w:pPr>
-      <w:r>
-        <w:rPr>
-          <w:rFonts w:ascii="Times New Roman" w:hAnsi="Times New Roman" w:cs="Times New Roman"/>
-          <w:color w:val="000000"/>
-          <w:sz w:val="26"/>
-        </w:rPr>
-        <w:t xml:space="preserve">  - Transaction-Service: Xử lý và ghi nhận lịch sử các giao dịch nạp tiền, rút tiền trực tiếp từ tài khoản.</w:t>
-      </w:r>
-    </w:p>
-    <w:p>
-      <w:pPr>
-        <w:spacing w:after="120" w:line="360" w:lineRule="auto"/>
-        <w:ind w:left="850" w:hanging="283"/>
-        <w:jc w:val="both"/>
-        <w:rPr>
-          <w:rFonts w:ascii="Times New Roman" w:hAnsi="Times New Roman" w:cs="Times New Roman"/>
-          <w:color w:val="000000"/>
-          <w:sz w:val="26"/>
-        </w:rPr>
-      </w:pPr>
-      <w:r>
-        <w:rPr>
-          <w:rFonts w:ascii="Times New Roman" w:hAnsi="Times New Roman" w:cs="Times New Roman"/>
-          <w:color w:val="000000"/>
-          <w:sz w:val="26"/>
-        </w:rPr>
-        <w:t xml:space="preserve">  - Sequence-Generator: Sinh chuỗi số tự động tăng dùng để tạo số tài khoản ngân hàng đảm bảo tính duy nhất trên toàn hệ thống.</w:t>
-      </w:r>
+        <w:t>- Ràng buộc CCCD không đúng định dạng: CCCD phải đúng 12 chữ số. Ứng dụng Android kiểm tra định dạng ngay trên giao diện và không gửi yêu cầu nếu sai.</w:t>
+      </w:r>
+    </w:p>
+    <w:p>
+      <w:pPr>
+        <w:rPr>
+          <w:rFonts w:ascii="Times New Roman" w:hAnsi="Times New Roman" w:cs="Times New Roman"/>
+          <w:color w:val="000000"/>
+          <w:sz w:val="26"/>
+        </w:rPr>
+      </w:pPr>
+      <w:r>
+        <w:rPr>
+          <w:rFonts w:ascii="Times New Roman" w:hAnsi="Times New Roman" w:cs="Times New Roman"/>
+          <w:color w:val="000000"/>
+          <w:sz w:val="26"/>
+        </w:rPr>
+        <w:br w:type="page"/>
+      </w:r>
+    </w:p>
+    <w:p>
+      <w:pPr>
+        <w:pStyle w:val="Heading1"/>
+        <w:spacing w:before="240" w:after="240" w:line="360" w:lineRule="auto"/>
+        <w:rPr>
+          <w:rFonts w:ascii="Times New Roman" w:hAnsi="Times New Roman" w:cs="Times New Roman"/>
+          <w:b/>
+          <w:color w:val="000000"/>
+          <w:sz w:val="30"/>
+        </w:rPr>
+      </w:pPr>
+      <w:bookmarkStart w:id="10" w:name="_Toc233884085"/>
+      <w:r>
+        <w:rPr>
+          <w:rFonts w:ascii="Times New Roman" w:hAnsi="Times New Roman" w:cs="Times New Roman"/>
+          <w:b/>
+          <w:color w:val="000000"/>
+          <w:sz w:val="30"/>
+        </w:rPr>
+        <w:lastRenderedPageBreak/>
+        <w:t>CHƯƠNG 3. CẤU TRÚC HỆ THỐNG MULTI-SERVICE VÀ BẢO MẬT KEYCLOAK</w:t>
+      </w:r>
+      <w:bookmarkEnd w:id="10"/>
     </w:p>
     <w:p>
       <w:pPr>
         <w:pStyle w:val="Heading2"/>
         <w:spacing w:before="120" w:after="120" w:line="360" w:lineRule="auto"/>
-        <w:ind w:left="283"/>
-        <w:rPr>
-          <w:rFonts w:ascii="Times New Roman" w:hAnsi="Times New Roman" w:cs="Times New Roman"/>
-          <w:b/>
-          <w:color w:val="000000"/>
-          <w:sz w:val="26"/>
-        </w:rPr>
-      </w:pPr>
-      <w:bookmarkStart w:id="12" w:name="_Toc233883428"/>
-      <w:r>
-        <w:rPr>
-          <w:rFonts w:ascii="Times New Roman" w:hAnsi="Times New Roman" w:cs="Times New Roman"/>
-          <w:b/>
-          <w:color w:val="000000"/>
-          <w:sz w:val="26"/>
-        </w:rPr>
-        <w:t>3.2. Cơ chế bảo mật và phân quyền định danh với Keycloak</w:t>
-      </w:r>
-      <w:bookmarkEnd w:id="12"/>
+        <w:rPr>
+          <w:rFonts w:ascii="Times New Roman" w:hAnsi="Times New Roman" w:cs="Times New Roman"/>
+          <w:b/>
+          <w:color w:val="000000"/>
+          <w:sz w:val="28"/>
+        </w:rPr>
+      </w:pPr>
+      <w:bookmarkStart w:id="11" w:name="_Toc233884086"/>
+      <w:r>
+        <w:rPr>
+          <w:rFonts w:ascii="Times New Roman" w:hAnsi="Times New Roman" w:cs="Times New Roman"/>
+          <w:b/>
+          <w:color w:val="000000"/>
+          <w:sz w:val="28"/>
+        </w:rPr>
+        <w:t>3.1. Cấu trúc Multi-service (Microservices) độc lập</w:t>
+      </w:r>
+      <w:bookmarkEnd w:id="11"/>
     </w:p>
     <w:p>
       <w:pPr>
@@ -3042,56 +2845,171 @@
           <w:color w:val="000000"/>
           <w:sz w:val="26"/>
         </w:rPr>
-        <w:t>Dự án tích hợp máy chủ định danh Keycloak để quản lý bảo mật tập trung cho toàn hệ thống. Khi khách hàng đăng nhập thành công, Keycloak trả về mã Access Token dạng JWT. API Gateway sẽ giải mã chữ ký token qua Keycloak. Nếu token hợp lệ, Gateway định tuyến yêu cầu đến dịch vụ nghiệp vụ tương ứng (ví dụ: Fund-Transfer-Service). Đồng thời, User-Service sử dụng Keycloak Admin Client để tự động đồng bộ tài khoản định danh lên Keycloak ngay khi khách hàng xác nhận OTP kích hoạt tài khoản thành công.</w:t>
-      </w:r>
-    </w:p>
-    <w:p>
-      <w:pPr>
-        <w:pStyle w:val="Heading1"/>
-        <w:spacing w:before="240" w:after="240" w:line="360" w:lineRule="auto"/>
-        <w:rPr>
-          <w:rFonts w:ascii="Times New Roman" w:hAnsi="Times New Roman" w:cs="Times New Roman"/>
-          <w:b/>
-          <w:color w:val="000000"/>
-          <w:sz w:val="30"/>
-        </w:rPr>
-      </w:pPr>
-      <w:bookmarkStart w:id="13" w:name="_Toc233883429"/>
-      <w:r>
-        <w:rPr>
-          <w:rFonts w:ascii="Times New Roman" w:hAnsi="Times New Roman" w:cs="Times New Roman"/>
-          <w:b/>
-          <w:color w:val="000000"/>
-          <w:sz w:val="30"/>
-        </w:rPr>
-        <w:lastRenderedPageBreak/>
-        <w:t>CHƯƠNG 4. THIẾT KẾ HỆ THỐNG VÀ CƠ SỞ DỮ LIỆU</w:t>
-      </w:r>
-      <w:bookmarkEnd w:id="13"/>
+        <w:t>Hệ thống backend của NLU Banking App được phát triển theo kiến trúc Multi-service (Microservices) gồm 7 dịch vụ Spring Boot độc lập hoạt động kết hợp với nhau:</w:t>
+      </w:r>
+    </w:p>
+    <w:p>
+      <w:pPr>
+        <w:spacing w:line="360" w:lineRule="auto"/>
+        <w:ind w:left="850" w:hanging="283"/>
+        <w:jc w:val="both"/>
+        <w:rPr>
+          <w:rFonts w:ascii="Times New Roman" w:hAnsi="Times New Roman" w:cs="Times New Roman"/>
+          <w:color w:val="000000"/>
+          <w:sz w:val="26"/>
+        </w:rPr>
+      </w:pPr>
+      <w:r>
+        <w:rPr>
+          <w:rFonts w:ascii="Times New Roman" w:hAnsi="Times New Roman" w:cs="Times New Roman"/>
+          <w:color w:val="000000"/>
+          <w:sz w:val="26"/>
+        </w:rPr>
+        <w:t>- Service-Registry (Eureka Server): Đăng ký và quản lý danh sách các microservices đang hoạt động, cho phép các dịch vụ tự tìm thấy nhau mà không cần gán cứng IP.</w:t>
+      </w:r>
+    </w:p>
+    <w:p>
+      <w:pPr>
+        <w:spacing w:line="360" w:lineRule="auto"/>
+        <w:ind w:left="850" w:hanging="283"/>
+        <w:jc w:val="both"/>
+        <w:rPr>
+          <w:rFonts w:ascii="Times New Roman" w:hAnsi="Times New Roman" w:cs="Times New Roman"/>
+          <w:color w:val="000000"/>
+          <w:sz w:val="26"/>
+        </w:rPr>
+      </w:pPr>
+      <w:r>
+        <w:rPr>
+          <w:rFonts w:ascii="Times New Roman" w:hAnsi="Times New Roman" w:cs="Times New Roman"/>
+          <w:color w:val="000000"/>
+          <w:sz w:val="26"/>
+        </w:rPr>
+        <w:t>- API-Gateway: Đóng vai trò là cổng ngõ ra vào duy nhất cho các yêu cầu API từ Android Client. Gateway chịu trách nhiệm định tuyến cuộc gọi API đến dịch vụ tương ứng và chặn các cuộc gọi không có JWT token hợp lệ.</w:t>
+      </w:r>
+    </w:p>
+    <w:p>
+      <w:pPr>
+        <w:spacing w:line="360" w:lineRule="auto"/>
+        <w:ind w:left="850" w:hanging="283"/>
+        <w:jc w:val="both"/>
+        <w:rPr>
+          <w:rFonts w:ascii="Times New Roman" w:hAnsi="Times New Roman" w:cs="Times New Roman"/>
+          <w:color w:val="000000"/>
+          <w:sz w:val="26"/>
+        </w:rPr>
+      </w:pPr>
+      <w:r>
+        <w:rPr>
+          <w:rFonts w:ascii="Times New Roman" w:hAnsi="Times New Roman" w:cs="Times New Roman"/>
+          <w:color w:val="000000"/>
+          <w:sz w:val="26"/>
+        </w:rPr>
+        <w:t>- User-Service: Quản lý đăng ký hồ sơ khách hàng, sinh mã và lưu trữ OTP kích hoạt, liên kết tài khoản định danh với máy chủ Keycloak.</w:t>
+      </w:r>
+    </w:p>
+    <w:p>
+      <w:pPr>
+        <w:spacing w:line="360" w:lineRule="auto"/>
+        <w:ind w:left="850" w:hanging="283"/>
+        <w:jc w:val="both"/>
+        <w:rPr>
+          <w:rFonts w:ascii="Times New Roman" w:hAnsi="Times New Roman" w:cs="Times New Roman"/>
+          <w:color w:val="000000"/>
+          <w:sz w:val="26"/>
+        </w:rPr>
+      </w:pPr>
+      <w:r>
+        <w:rPr>
+          <w:rFonts w:ascii="Times New Roman" w:hAnsi="Times New Roman" w:cs="Times New Roman"/>
+          <w:color w:val="000000"/>
+          <w:sz w:val="26"/>
+        </w:rPr>
+        <w:t>- Account-Service: Quản lý số tài khoản ngân hàng, thông tin số dư khả dụng và trạng thái tài khoản.</w:t>
+      </w:r>
+    </w:p>
+    <w:p>
+      <w:pPr>
+        <w:spacing w:line="360" w:lineRule="auto"/>
+        <w:ind w:left="850" w:hanging="283"/>
+        <w:jc w:val="both"/>
+        <w:rPr>
+          <w:rFonts w:ascii="Times New Roman" w:hAnsi="Times New Roman" w:cs="Times New Roman"/>
+          <w:color w:val="000000"/>
+          <w:sz w:val="26"/>
+        </w:rPr>
+      </w:pPr>
+      <w:r>
+        <w:rPr>
+          <w:rFonts w:ascii="Times New Roman" w:hAnsi="Times New Roman" w:cs="Times New Roman"/>
+          <w:color w:val="000000"/>
+          <w:sz w:val="26"/>
+        </w:rPr>
+        <w:t>- Fund-Transfer-Service: Xử lý và ghi nhận toàn bộ lịch sử giao dịch chuyển khoản nội bộ giữa các tài khoản khách hàng.</w:t>
+      </w:r>
+    </w:p>
+    <w:p>
+      <w:pPr>
+        <w:spacing w:line="360" w:lineRule="auto"/>
+        <w:ind w:left="850" w:hanging="283"/>
+        <w:jc w:val="both"/>
+        <w:rPr>
+          <w:rFonts w:ascii="Times New Roman" w:hAnsi="Times New Roman" w:cs="Times New Roman"/>
+          <w:color w:val="000000"/>
+          <w:sz w:val="26"/>
+        </w:rPr>
+      </w:pPr>
+      <w:r>
+        <w:rPr>
+          <w:rFonts w:ascii="Times New Roman" w:hAnsi="Times New Roman" w:cs="Times New Roman"/>
+          <w:color w:val="000000"/>
+          <w:sz w:val="26"/>
+        </w:rPr>
+        <w:t>- Transaction-Service: Xử lý và ghi nhận lịch sử các giao dịch nạp tiền, rút tiền trực tiếp từ tài khoản.</w:t>
+      </w:r>
+    </w:p>
+    <w:p>
+      <w:pPr>
+        <w:spacing w:line="360" w:lineRule="auto"/>
+        <w:ind w:left="850" w:hanging="283"/>
+        <w:jc w:val="both"/>
+        <w:rPr>
+          <w:rFonts w:ascii="Times New Roman" w:hAnsi="Times New Roman" w:cs="Times New Roman"/>
+          <w:color w:val="000000"/>
+          <w:sz w:val="26"/>
+        </w:rPr>
+      </w:pPr>
+      <w:r>
+        <w:rPr>
+          <w:rFonts w:ascii="Times New Roman" w:hAnsi="Times New Roman" w:cs="Times New Roman"/>
+          <w:color w:val="000000"/>
+          <w:sz w:val="26"/>
+        </w:rPr>
+        <w:t>- Sequence-Generator: Sinh chuỗi số tự động tăng dùng để tạo số tài khoản ngân hàng đảm bảo tính duy nhất trên toàn hệ thống.</w:t>
+      </w:r>
     </w:p>
     <w:p>
       <w:pPr>
         <w:pStyle w:val="Heading2"/>
         <w:spacing w:before="120" w:after="120" w:line="360" w:lineRule="auto"/>
-        <w:ind w:left="283"/>
-        <w:rPr>
-          <w:rFonts w:ascii="Times New Roman" w:hAnsi="Times New Roman" w:cs="Times New Roman"/>
-          <w:b/>
-          <w:color w:val="000000"/>
-          <w:sz w:val="26"/>
-        </w:rPr>
-      </w:pPr>
-      <w:bookmarkStart w:id="14" w:name="_Toc233883430"/>
-      <w:r>
-        <w:rPr>
-          <w:rFonts w:ascii="Times New Roman" w:hAnsi="Times New Roman" w:cs="Times New Roman"/>
-          <w:b/>
-          <w:color w:val="000000"/>
-          <w:sz w:val="26"/>
-        </w:rPr>
-        <w:t>4.1. Thiết kế cơ sở dữ liệu hệ thống (Database Schema Design)</w:t>
-      </w:r>
-      <w:bookmarkEnd w:id="14"/>
+        <w:rPr>
+          <w:rFonts w:ascii="Times New Roman" w:hAnsi="Times New Roman" w:cs="Times New Roman"/>
+          <w:b/>
+          <w:color w:val="000000"/>
+          <w:sz w:val="28"/>
+        </w:rPr>
+      </w:pPr>
+      <w:bookmarkStart w:id="12" w:name="_Toc233884087"/>
+      <w:r>
+        <w:rPr>
+          <w:rFonts w:ascii="Times New Roman" w:hAnsi="Times New Roman" w:cs="Times New Roman"/>
+          <w:b/>
+          <w:color w:val="000000"/>
+          <w:sz w:val="28"/>
+        </w:rPr>
+        <w:t>3.2. Cơ chế bảo mật và phân quyền định danh với Keycloak</w:t>
+      </w:r>
+      <w:bookmarkEnd w:id="12"/>
     </w:p>
     <w:p>
       <w:pPr>
@@ -3110,32 +3028,81 @@
           <w:color w:val="000000"/>
           <w:sz w:val="26"/>
         </w:rPr>
-        <w:t>Hệ thống áp dụng mô hình kiến trúc độc lập cơ sở dữ liệu cho từng microservice (Database per Service) để bảo toàn tính đóng gói. Cơ sở dữ liệu quan hệ MySQL được thiết kế chặt chẽ: (1) Bảng 'accounts' trong Account-Service lưu trữ các trường: số tài khoản, số dư khả dụng, mã CIF, trạng thái tài khoản. (2) Bảng 'transactions' trong Transaction-Service lưu lịch sử nạp/rút tiền. (3) Bảng 'transfers' trong Fund-Transfer-Service ghi nhận lịch sử chuyển khoản nội bộ gồm: mã giao dịch, tài khoản gửi, tài khoản nhận, số tiền, nội dung, thời gian và trạng thái xác thực. Các bảng đều được tối ưu hóa chỉ mục (index) giúp tăng tốc độ truy vấn giao dịch.</w:t>
-      </w:r>
+        <w:t xml:space="preserve">Dự án tích hợp máy chủ định danh Keycloak để quản lý bảo mật tập trung cho toàn hệ thống. Khi khách hàng đăng nhập thành công, Keycloak trả về Access Token dạng JWT. API Gateway giải mã chữ ký token qua Keycloak. Nếu token hợp lệ, Gateway định tuyến </w:t>
+      </w:r>
+      <w:r>
+        <w:rPr>
+          <w:rFonts w:ascii="Times New Roman" w:hAnsi="Times New Roman" w:cs="Times New Roman"/>
+          <w:color w:val="000000"/>
+          <w:sz w:val="26"/>
+        </w:rPr>
+        <w:lastRenderedPageBreak/>
+        <w:t>yêu cầu đến dịch vụ nghiệp vụ tương ứng (ví dụ: Fund-Transfer-Service). User-Service sử dụng Keycloak Admin Client để tự động đồng bộ tài khoản định danh lên Keycloak ngay khi khách hàng xác nhận OTP kích hoạt.</w:t>
+      </w:r>
+    </w:p>
+    <w:p>
+      <w:pPr>
+        <w:rPr>
+          <w:rFonts w:ascii="Times New Roman" w:hAnsi="Times New Roman" w:cs="Times New Roman"/>
+          <w:color w:val="000000"/>
+          <w:sz w:val="26"/>
+        </w:rPr>
+      </w:pPr>
+      <w:r>
+        <w:rPr>
+          <w:rFonts w:ascii="Times New Roman" w:hAnsi="Times New Roman" w:cs="Times New Roman"/>
+          <w:color w:val="000000"/>
+          <w:sz w:val="26"/>
+        </w:rPr>
+        <w:br w:type="page"/>
+      </w:r>
+    </w:p>
+    <w:p>
+      <w:pPr>
+        <w:pStyle w:val="Heading1"/>
+        <w:spacing w:before="240" w:after="240" w:line="360" w:lineRule="auto"/>
+        <w:rPr>
+          <w:rFonts w:ascii="Times New Roman" w:hAnsi="Times New Roman" w:cs="Times New Roman"/>
+          <w:b/>
+          <w:color w:val="000000"/>
+          <w:sz w:val="30"/>
+        </w:rPr>
+      </w:pPr>
+      <w:bookmarkStart w:id="13" w:name="_Toc233884088"/>
+      <w:r>
+        <w:rPr>
+          <w:rFonts w:ascii="Times New Roman" w:hAnsi="Times New Roman" w:cs="Times New Roman"/>
+          <w:b/>
+          <w:color w:val="000000"/>
+          <w:sz w:val="30"/>
+        </w:rPr>
+        <w:lastRenderedPageBreak/>
+        <w:t>CHƯƠNG 4. THIẼT KẾHỆ THỐNG VÀ CƠ SỞDỮ LIỆU</w:t>
+      </w:r>
+      <w:bookmarkEnd w:id="13"/>
     </w:p>
     <w:p>
       <w:pPr>
         <w:pStyle w:val="Heading2"/>
         <w:spacing w:before="120" w:after="120" w:line="360" w:lineRule="auto"/>
-        <w:ind w:left="283"/>
-        <w:rPr>
-          <w:rFonts w:ascii="Times New Roman" w:hAnsi="Times New Roman" w:cs="Times New Roman"/>
-          <w:b/>
-          <w:color w:val="000000"/>
-          <w:sz w:val="26"/>
-        </w:rPr>
-      </w:pPr>
-      <w:bookmarkStart w:id="15" w:name="_Toc233883431"/>
-      <w:r>
-        <w:rPr>
-          <w:rFonts w:ascii="Times New Roman" w:hAnsi="Times New Roman" w:cs="Times New Roman"/>
-          <w:b/>
-          <w:color w:val="000000"/>
-          <w:sz w:val="26"/>
-        </w:rPr>
-        <w:t>4.2. Kiến trúc giao tiếp và sơ đồ tuần tự (Sequence Diagrams)</w:t>
-      </w:r>
-      <w:bookmarkEnd w:id="15"/>
+        <w:rPr>
+          <w:rFonts w:ascii="Times New Roman" w:hAnsi="Times New Roman" w:cs="Times New Roman"/>
+          <w:b/>
+          <w:color w:val="000000"/>
+          <w:sz w:val="28"/>
+        </w:rPr>
+      </w:pPr>
+      <w:bookmarkStart w:id="14" w:name="_Toc233884089"/>
+      <w:r>
+        <w:rPr>
+          <w:rFonts w:ascii="Times New Roman" w:hAnsi="Times New Roman" w:cs="Times New Roman"/>
+          <w:b/>
+          <w:color w:val="000000"/>
+          <w:sz w:val="28"/>
+        </w:rPr>
+        <w:t>4.1. Thiết kế cơ sở dữ liệu hệ thống (Database Schema Design)</w:t>
+      </w:r>
+      <w:bookmarkEnd w:id="14"/>
     </w:p>
     <w:p>
       <w:pPr>
@@ -3154,55 +3121,31 @@
           <w:color w:val="000000"/>
           <w:sz w:val="26"/>
         </w:rPr>
-        <w:t>Tiến trình giao tiếp giữa Android Client và các microservices được mô tả chi tiết thông qua sơ đồ tuần tự: (1) Android Client gửi yêu cầu API kèm theo Access Token dạng JWT trong Header đến API Gateway. (2) API Gateway giải mã chữ ký token qua Keycloak. Nếu token hợp lệ, Gateway định tuyến yêu cầu đến dịch vụ nghiệp vụ tương ứng (ví dụ: Fund-Transfer-Service). (3) Dịch vụ nghiệp vụ gọi giao tiếp liên dịch vụ (Inter-service Communication) sang Account-Service để cập nhật số dư của tài khoản gửi và nhận, đảm bảo giao dịch được thực hiện đồng nhất và an toàn.</w:t>
-      </w:r>
-    </w:p>
-    <w:p>
-      <w:pPr>
-        <w:pStyle w:val="Heading1"/>
-        <w:spacing w:before="240" w:after="240" w:line="360" w:lineRule="auto"/>
-        <w:rPr>
-          <w:rFonts w:ascii="Times New Roman" w:hAnsi="Times New Roman" w:cs="Times New Roman"/>
-          <w:b/>
-          <w:color w:val="000000"/>
-          <w:sz w:val="30"/>
-        </w:rPr>
-      </w:pPr>
-      <w:bookmarkStart w:id="16" w:name="_Toc233883432"/>
-      <w:r>
-        <w:rPr>
-          <w:rFonts w:ascii="Times New Roman" w:hAnsi="Times New Roman" w:cs="Times New Roman"/>
-          <w:b/>
-          <w:color w:val="000000"/>
-          <w:sz w:val="30"/>
-        </w:rPr>
-        <w:t>CHƯƠNG 5. HƯỚNG DẪN CẤU HÌNH VÀ KHỞI CHẠY ĐỒ ÁN</w:t>
-      </w:r>
-      <w:bookmarkEnd w:id="16"/>
+        <w:t>Hệ thống áp dụng mô hình kiến trúc độc lập cơ sở dữ liệu cho từng microservice (Database per Service). Cơ sở dữ liệu quan hệ MySQL được thiết kế chặt chẽ: (1) Bảng 'accounts' trong Account-Service lưu trữ các trường: số tài khoản, số dư khả dụng, mã CIF, trạng thái tài khoản. (2) Bảng 'transactions' trong Transaction-Service lưu lịch sử nạp/rút tiền. (3) Bảng 'transfers' trong Fund-Transfer-Service ghi nhận lịch sử chuyển khoản nội bộ gồm: mã giao dịch, tài khoản gửi, tài khoản nhận, số tiền, nội dung, thời gian và trạng thái xác thực.</w:t>
+      </w:r>
     </w:p>
     <w:p>
       <w:pPr>
         <w:pStyle w:val="Heading2"/>
         <w:spacing w:before="120" w:after="120" w:line="360" w:lineRule="auto"/>
-        <w:ind w:left="283"/>
-        <w:rPr>
-          <w:rFonts w:ascii="Times New Roman" w:hAnsi="Times New Roman" w:cs="Times New Roman"/>
-          <w:b/>
-          <w:color w:val="000000"/>
-          <w:sz w:val="26"/>
-        </w:rPr>
-      </w:pPr>
-      <w:bookmarkStart w:id="17" w:name="_Toc233883433"/>
-      <w:r>
-        <w:rPr>
-          <w:rFonts w:ascii="Times New Roman" w:hAnsi="Times New Roman" w:cs="Times New Roman"/>
-          <w:b/>
-          <w:color w:val="000000"/>
-          <w:sz w:val="26"/>
-        </w:rPr>
-        <w:t>5.1. Thiết lập môi trường và khởi chạy Docker Compose</w:t>
-      </w:r>
-      <w:bookmarkEnd w:id="17"/>
+        <w:rPr>
+          <w:rFonts w:ascii="Times New Roman" w:hAnsi="Times New Roman" w:cs="Times New Roman"/>
+          <w:b/>
+          <w:color w:val="000000"/>
+          <w:sz w:val="28"/>
+        </w:rPr>
+      </w:pPr>
+      <w:bookmarkStart w:id="15" w:name="_Toc233884090"/>
+      <w:r>
+        <w:rPr>
+          <w:rFonts w:ascii="Times New Roman" w:hAnsi="Times New Roman" w:cs="Times New Roman"/>
+          <w:b/>
+          <w:color w:val="000000"/>
+          <w:sz w:val="28"/>
+        </w:rPr>
+        <w:t>4.2. Kiến trúc giao tiếp và sơ đồ tuần tự (Sequence Diagrams)</w:t>
+      </w:r>
+      <w:bookmarkEnd w:id="15"/>
     </w:p>
     <w:p>
       <w:pPr>
@@ -3221,33 +3164,72 @@
           <w:color w:val="000000"/>
           <w:sz w:val="26"/>
         </w:rPr>
-        <w:t>Để triển khai đồ án, máy tính thử nghiệm cần cài đặt sẵn Docker, Docker Compose, Git, Java JDK 11 hoặc JDK 17 và Android Studio. Bước đầu tiên, dẫn đến thư mục chứa file 'docker-compose.yml' và chạy lệnh: 'docker-compose up -d' để khởi động MySQL Container (Port 3306) và Keycloak Container (Port 8571) chạy ngầm dưới nền hệ thống.</w:t>
-      </w:r>
+        <w:t>Tiến trình giao tiếp giữa Android Client và các microservices: (1) Android Client gửi yêu cầu API kèm Access Token JWT trong Header đến API Gateway. (2) API Gateway giải mã chữ ký token qua Keycloak. Nếu hợp lệ, Gateway định tuyến đến dịch vụ nghiệp vụ. (3) Dịch vụ nghiệp vụ gọi giao tiếp liên dịch vụ (Inter-service) sang Account-Service để cập nhật số dư đồng thời của cả hai tài khoản.</w:t>
+      </w:r>
+    </w:p>
+    <w:p>
+      <w:pPr>
+        <w:rPr>
+          <w:rFonts w:ascii="Times New Roman" w:hAnsi="Times New Roman" w:cs="Times New Roman"/>
+          <w:color w:val="000000"/>
+          <w:sz w:val="26"/>
+        </w:rPr>
+      </w:pPr>
+      <w:r>
+        <w:rPr>
+          <w:rFonts w:ascii="Times New Roman" w:hAnsi="Times New Roman" w:cs="Times New Roman"/>
+          <w:color w:val="000000"/>
+          <w:sz w:val="26"/>
+        </w:rPr>
+        <w:br w:type="page"/>
+      </w:r>
+    </w:p>
+    <w:p>
+      <w:pPr>
+        <w:pStyle w:val="Heading1"/>
+        <w:spacing w:before="240" w:after="240" w:line="360" w:lineRule="auto"/>
+        <w:rPr>
+          <w:rFonts w:ascii="Times New Roman" w:hAnsi="Times New Roman" w:cs="Times New Roman"/>
+          <w:b/>
+          <w:color w:val="000000"/>
+          <w:sz w:val="30"/>
+        </w:rPr>
+      </w:pPr>
+      <w:bookmarkStart w:id="16" w:name="_Toc233884091"/>
+      <w:r>
+        <w:rPr>
+          <w:rFonts w:ascii="Times New Roman" w:hAnsi="Times New Roman" w:cs="Times New Roman"/>
+          <w:b/>
+          <w:color w:val="000000"/>
+          <w:sz w:val="30"/>
+        </w:rPr>
+        <w:lastRenderedPageBreak/>
+        <w:t>CHƯƠNG 5. HƯỚNG DẪN CẤU HÌNH VÀ KHỚI CHẠY ĐỒ ÁN</w:t>
+      </w:r>
+      <w:bookmarkEnd w:id="16"/>
     </w:p>
     <w:p>
       <w:pPr>
         <w:pStyle w:val="Heading2"/>
         <w:spacing w:before="120" w:after="120" w:line="360" w:lineRule="auto"/>
-        <w:ind w:left="283"/>
-        <w:rPr>
-          <w:rFonts w:ascii="Times New Roman" w:hAnsi="Times New Roman" w:cs="Times New Roman"/>
-          <w:b/>
-          <w:color w:val="000000"/>
-          <w:sz w:val="26"/>
-        </w:rPr>
-      </w:pPr>
-      <w:bookmarkStart w:id="18" w:name="_Toc233883434"/>
-      <w:r>
-        <w:rPr>
-          <w:rFonts w:ascii="Times New Roman" w:hAnsi="Times New Roman" w:cs="Times New Roman"/>
-          <w:b/>
-          <w:color w:val="000000"/>
-          <w:sz w:val="26"/>
-        </w:rPr>
-        <w:lastRenderedPageBreak/>
-        <w:t>5.2. Các bước cấu hình Keycloak Realm và Client</w:t>
-      </w:r>
-      <w:bookmarkEnd w:id="18"/>
+        <w:rPr>
+          <w:rFonts w:ascii="Times New Roman" w:hAnsi="Times New Roman" w:cs="Times New Roman"/>
+          <w:b/>
+          <w:color w:val="000000"/>
+          <w:sz w:val="28"/>
+        </w:rPr>
+      </w:pPr>
+      <w:bookmarkStart w:id="17" w:name="_Toc233884092"/>
+      <w:r>
+        <w:rPr>
+          <w:rFonts w:ascii="Times New Roman" w:hAnsi="Times New Roman" w:cs="Times New Roman"/>
+          <w:b/>
+          <w:color w:val="000000"/>
+          <w:sz w:val="28"/>
+        </w:rPr>
+        <w:t>5.1. Thiết lập môi trường và khởi chạy Docker Compose</w:t>
+      </w:r>
+      <w:bookmarkEnd w:id="17"/>
     </w:p>
     <w:p>
       <w:pPr>
@@ -3266,32 +3248,31 @@
           <w:color w:val="000000"/>
           <w:sz w:val="26"/>
         </w:rPr>
-        <w:t>Sau khi Keycloak chạy, thực hiện cấu hình bằng tay trên trang quản trị: (1) Truy cập http://localhost:8571 và đăng nhập bằng admin/admin. (2) Tạo Realm mới tên 'banking-service'. (3) Trong Realm này, tạo Client mới tên 'banking-service-api-client', bật tuỳ chọn 'Service Accounts Enabled' và cấu hình phần Client Secret. (4) Chuyển đến tab Service Account Roles và gán các quyền hệ thống 'manage-users', 'view-users', 'query-users' cho Client để cho phép backend Java gọi API quản lý người dùng của Keycloak.</w:t>
+        <w:t>Để triển khai đồ án, máy tính thử nghiệm cần cài đặt sẵn Docker, Docker Compose, Git, Java JDK 17 và Android Studio. Chạy lệnh 'docker-compose up -d' để khởi động MySQL Container (Port 3306) và Keycloak Container (Port 8571).</w:t>
       </w:r>
     </w:p>
     <w:p>
       <w:pPr>
         <w:pStyle w:val="Heading2"/>
         <w:spacing w:before="120" w:after="120" w:line="360" w:lineRule="auto"/>
-        <w:ind w:left="283"/>
-        <w:rPr>
-          <w:rFonts w:ascii="Times New Roman" w:hAnsi="Times New Roman" w:cs="Times New Roman"/>
-          <w:b/>
-          <w:color w:val="000000"/>
-          <w:sz w:val="26"/>
-        </w:rPr>
-      </w:pPr>
-      <w:bookmarkStart w:id="19" w:name="_Toc233883435"/>
-      <w:r>
-        <w:rPr>
-          <w:rFonts w:ascii="Times New Roman" w:hAnsi="Times New Roman" w:cs="Times New Roman"/>
-          <w:b/>
-          <w:color w:val="000000"/>
-          <w:sz w:val="26"/>
-        </w:rPr>
-        <w:t>5.3. Khởi chạy 7 Microservices Spring Boot bằng Script</w:t>
-      </w:r>
-      <w:bookmarkEnd w:id="19"/>
+        <w:rPr>
+          <w:rFonts w:ascii="Times New Roman" w:hAnsi="Times New Roman" w:cs="Times New Roman"/>
+          <w:b/>
+          <w:color w:val="000000"/>
+          <w:sz w:val="28"/>
+        </w:rPr>
+      </w:pPr>
+      <w:bookmarkStart w:id="18" w:name="_Toc233884093"/>
+      <w:r>
+        <w:rPr>
+          <w:rFonts w:ascii="Times New Roman" w:hAnsi="Times New Roman" w:cs="Times New Roman"/>
+          <w:b/>
+          <w:color w:val="000000"/>
+          <w:sz w:val="28"/>
+        </w:rPr>
+        <w:t>5.2. Các bước cấu hình Keycloak Realm và Client</w:t>
+      </w:r>
+      <w:bookmarkEnd w:id="18"/>
     </w:p>
     <w:p>
       <w:pPr>
@@ -3310,55 +3291,31 @@
           <w:color w:val="000000"/>
           <w:sz w:val="26"/>
         </w:rPr>
-        <w:t>Tại thư mục gốc của dự án, chạy tệp tin script tự động 'run-services.cmd'. Script này sẽ tự động kiểm tra biến môi trường Java, yêu cầu bạn nhập Client Secret của Keycloak vừa tạo (hoặc nhấn Enter để lấy giá trị mặc định trong cấu hình), sau đó lần lượt kích hoạt 7 microservices backend bằng Maven Wrapper trong các cửa sổ CMD riêng biệt giúp dễ dàng quan sát log hoạt động.</w:t>
-      </w:r>
-    </w:p>
-    <w:p>
-      <w:pPr>
-        <w:pStyle w:val="Heading1"/>
-        <w:spacing w:before="240" w:after="240" w:line="360" w:lineRule="auto"/>
-        <w:rPr>
-          <w:rFonts w:ascii="Times New Roman" w:hAnsi="Times New Roman" w:cs="Times New Roman"/>
-          <w:b/>
-          <w:color w:val="000000"/>
-          <w:sz w:val="30"/>
-        </w:rPr>
-      </w:pPr>
-      <w:bookmarkStart w:id="20" w:name="_Toc233883436"/>
-      <w:r>
-        <w:rPr>
-          <w:rFonts w:ascii="Times New Roman" w:hAnsi="Times New Roman" w:cs="Times New Roman"/>
-          <w:b/>
-          <w:color w:val="000000"/>
-          <w:sz w:val="30"/>
-        </w:rPr>
-        <w:t>CHƯƠNG 6. THỬ NGHIỆM VÀ ĐÁNH GIÁ HỆ THỐNG</w:t>
-      </w:r>
-      <w:bookmarkEnd w:id="20"/>
+        <w:t>Sau khi Keycloak chạy, thực hiện cấu hình bằng tay: (1) Truy cập http://localhost:8571 đăng nhập bằng admin/admin. (2) Tạo Realm mới tên 'banking-service'. (3) Tạo Client mới tên 'banking-service-api-client', bật 'Service Accounts Enabled' và cấu hình Client Secret. (4) Trong tab Service Account Roles, gán các quyền 'manage-users', 'view-users', 'query-users'.</w:t>
+      </w:r>
     </w:p>
     <w:p>
       <w:pPr>
         <w:pStyle w:val="Heading2"/>
         <w:spacing w:before="120" w:after="120" w:line="360" w:lineRule="auto"/>
-        <w:ind w:left="283"/>
-        <w:rPr>
-          <w:rFonts w:ascii="Times New Roman" w:hAnsi="Times New Roman" w:cs="Times New Roman"/>
-          <w:b/>
-          <w:color w:val="000000"/>
-          <w:sz w:val="26"/>
-        </w:rPr>
-      </w:pPr>
-      <w:bookmarkStart w:id="21" w:name="_Toc233883437"/>
-      <w:r>
-        <w:rPr>
-          <w:rFonts w:ascii="Times New Roman" w:hAnsi="Times New Roman" w:cs="Times New Roman"/>
-          <w:b/>
-          <w:color w:val="000000"/>
-          <w:sz w:val="26"/>
-        </w:rPr>
-        <w:t>6.1. Thử nghiệm chức năng trên Android Emulator (Functional Testing)</w:t>
-      </w:r>
-      <w:bookmarkEnd w:id="21"/>
+        <w:rPr>
+          <w:rFonts w:ascii="Times New Roman" w:hAnsi="Times New Roman" w:cs="Times New Roman"/>
+          <w:b/>
+          <w:color w:val="000000"/>
+          <w:sz w:val="28"/>
+        </w:rPr>
+      </w:pPr>
+      <w:bookmarkStart w:id="19" w:name="_Toc233884094"/>
+      <w:r>
+        <w:rPr>
+          <w:rFonts w:ascii="Times New Roman" w:hAnsi="Times New Roman" w:cs="Times New Roman"/>
+          <w:b/>
+          <w:color w:val="000000"/>
+          <w:sz w:val="28"/>
+        </w:rPr>
+        <w:t>5.3. Khởi chạy 7 Microservices Spring Boot bằng Script</w:t>
+      </w:r>
+      <w:bookmarkEnd w:id="19"/>
     </w:p>
     <w:p>
       <w:pPr>
@@ -3377,32 +3334,72 @@
           <w:color w:val="000000"/>
           <w:sz w:val="26"/>
         </w:rPr>
-        <w:t>Nhóm tiến hành cài đặt ứng dụng Android Client trên thiết bị giả lập (Android Emulator API 33) để tiến hành kiểm thử hộp đen (Black-box Testing) các chức năng cốt lõi. Kết quả thử nghiệm cho thấy luồng đăng ký mới kết hợp gửi email OTP kích hoạt phản hồi tức thời dưới 2 giây; luồng quét mã QR nhận diện chính xác 100% số tài khoản thụ hưởng và điền tự động dữ liệu vào màn hình giao dịch chuyển khoản mà không gặp bất kỳ độ trễ nào.</w:t>
-      </w:r>
+        <w:t>Tại thư mục gốc của dự án, chạy tệp tin script tự động 'run-services.cmd'. Script này sẽ tự động kiểm tra biến môi trường Java, yêu cầu bạn nhập Client Secret của Keycloak, sau đó lần lượt kích hoạt 7 microservices backend bằng Maven Wrapper trong các cửa sổ CMD riêng biệt.</w:t>
+      </w:r>
+    </w:p>
+    <w:p>
+      <w:pPr>
+        <w:rPr>
+          <w:rFonts w:ascii="Times New Roman" w:hAnsi="Times New Roman" w:cs="Times New Roman"/>
+          <w:color w:val="000000"/>
+          <w:sz w:val="26"/>
+        </w:rPr>
+      </w:pPr>
+      <w:r>
+        <w:rPr>
+          <w:rFonts w:ascii="Times New Roman" w:hAnsi="Times New Roman" w:cs="Times New Roman"/>
+          <w:color w:val="000000"/>
+          <w:sz w:val="26"/>
+        </w:rPr>
+        <w:br w:type="page"/>
+      </w:r>
+    </w:p>
+    <w:p>
+      <w:pPr>
+        <w:pStyle w:val="Heading1"/>
+        <w:spacing w:before="240" w:after="240" w:line="360" w:lineRule="auto"/>
+        <w:rPr>
+          <w:rFonts w:ascii="Times New Roman" w:hAnsi="Times New Roman" w:cs="Times New Roman"/>
+          <w:b/>
+          <w:color w:val="000000"/>
+          <w:sz w:val="30"/>
+        </w:rPr>
+      </w:pPr>
+      <w:bookmarkStart w:id="20" w:name="_Toc233884095"/>
+      <w:r>
+        <w:rPr>
+          <w:rFonts w:ascii="Times New Roman" w:hAnsi="Times New Roman" w:cs="Times New Roman"/>
+          <w:b/>
+          <w:color w:val="000000"/>
+          <w:sz w:val="30"/>
+        </w:rPr>
+        <w:lastRenderedPageBreak/>
+        <w:t>CHƯƠNG 6. THỨ NGHIỆM VÀ ĐÁNH GIÁ HỆ THỐNG</w:t>
+      </w:r>
+      <w:bookmarkEnd w:id="20"/>
     </w:p>
     <w:p>
       <w:pPr>
         <w:pStyle w:val="Heading2"/>
         <w:spacing w:before="120" w:after="120" w:line="360" w:lineRule="auto"/>
-        <w:ind w:left="283"/>
-        <w:rPr>
-          <w:rFonts w:ascii="Times New Roman" w:hAnsi="Times New Roman" w:cs="Times New Roman"/>
-          <w:b/>
-          <w:color w:val="000000"/>
-          <w:sz w:val="26"/>
-        </w:rPr>
-      </w:pPr>
-      <w:bookmarkStart w:id="22" w:name="_Toc233883438"/>
-      <w:r>
-        <w:rPr>
-          <w:rFonts w:ascii="Times New Roman" w:hAnsi="Times New Roman" w:cs="Times New Roman"/>
-          <w:b/>
-          <w:color w:val="000000"/>
-          <w:sz w:val="26"/>
-        </w:rPr>
-        <w:t>6.2. Kết quả kiểm tra hiệu năng hệ thống (Performance Evaluation)</w:t>
-      </w:r>
-      <w:bookmarkEnd w:id="22"/>
+        <w:rPr>
+          <w:rFonts w:ascii="Times New Roman" w:hAnsi="Times New Roman" w:cs="Times New Roman"/>
+          <w:b/>
+          <w:color w:val="000000"/>
+          <w:sz w:val="28"/>
+        </w:rPr>
+      </w:pPr>
+      <w:bookmarkStart w:id="21" w:name="_Toc233884096"/>
+      <w:r>
+        <w:rPr>
+          <w:rFonts w:ascii="Times New Roman" w:hAnsi="Times New Roman" w:cs="Times New Roman"/>
+          <w:b/>
+          <w:color w:val="000000"/>
+          <w:sz w:val="28"/>
+        </w:rPr>
+        <w:t>6.1. Thử nghiệm chức năng trên Android Emulator (Functional Testing)</w:t>
+      </w:r>
+      <w:bookmarkEnd w:id="21"/>
     </w:p>
     <w:p>
       <w:pPr>
@@ -3421,64 +3418,31 @@
           <w:color w:val="000000"/>
           <w:sz w:val="26"/>
         </w:rPr>
-        <w:t xml:space="preserve">Tiến hành đo lường hiệu năng xử lý của các dịch vụ Backend Spring Boot khi chịu tải đồng thời nhiều phiên làm việc. Nhờ kiến trúc API Gateway định tuyến và cơ chế Load Balancing của Eureka Server, thời gian phản hồi trung bình (Response Time) của các API </w:t>
-      </w:r>
-      <w:r>
-        <w:rPr>
-          <w:rFonts w:ascii="Times New Roman" w:hAnsi="Times New Roman" w:cs="Times New Roman"/>
-          <w:color w:val="000000"/>
-          <w:sz w:val="26"/>
-        </w:rPr>
-        <w:lastRenderedPageBreak/>
-        <w:t>truy vấn số dư và lịch sử giao dịch dao động ổn định trong khoảng 150ms đến 300ms, đạt tiêu chí kỹ thuật về hiệu năng xử lý nhanh và tính sẵn sàng cao của hệ thống.</w:t>
-      </w:r>
-    </w:p>
-    <w:p>
-      <w:pPr>
-        <w:pStyle w:val="Heading1"/>
-        <w:spacing w:before="240" w:after="240" w:line="360" w:lineRule="auto"/>
-        <w:rPr>
-          <w:rFonts w:ascii="Times New Roman" w:hAnsi="Times New Roman" w:cs="Times New Roman"/>
-          <w:b/>
-          <w:color w:val="000000"/>
-          <w:sz w:val="30"/>
-        </w:rPr>
-      </w:pPr>
-      <w:bookmarkStart w:id="23" w:name="_Toc233883439"/>
-      <w:r>
-        <w:rPr>
-          <w:rFonts w:ascii="Times New Roman" w:hAnsi="Times New Roman" w:cs="Times New Roman"/>
-          <w:b/>
-          <w:color w:val="000000"/>
-          <w:sz w:val="30"/>
-        </w:rPr>
-        <w:t>CHƯƠNG 7. TỔNG KẾT VÀ HƯỚNG PHÁT TRIỂN TƯƠNG LAI</w:t>
-      </w:r>
-      <w:bookmarkEnd w:id="23"/>
+        <w:t>Nhóm tiến hành cài đặt ứng dụng Android Client trên thiết bị giả lập (Android Emulator API 33) để kiểm thử hộp đen (Black-box Testing) các chức năng cốt lõi. Kết quả thử nghiệm cho thấy luồng đăng ký mới kết hợp gửi email OTP kích hoạt phản hồi tức thời dưới 2 giây; luồng quét mã QR nhận diện chính xác 100% số tài khoản và điền tự động dữ liệu vào màn hình giao dịch.</w:t>
+      </w:r>
     </w:p>
     <w:p>
       <w:pPr>
         <w:pStyle w:val="Heading2"/>
         <w:spacing w:before="120" w:after="120" w:line="360" w:lineRule="auto"/>
-        <w:ind w:left="283"/>
-        <w:rPr>
-          <w:rFonts w:ascii="Times New Roman" w:hAnsi="Times New Roman" w:cs="Times New Roman"/>
-          <w:b/>
-          <w:color w:val="000000"/>
-          <w:sz w:val="26"/>
-        </w:rPr>
-      </w:pPr>
-      <w:bookmarkStart w:id="24" w:name="_Toc233883440"/>
-      <w:r>
-        <w:rPr>
-          <w:rFonts w:ascii="Times New Roman" w:hAnsi="Times New Roman" w:cs="Times New Roman"/>
-          <w:b/>
-          <w:color w:val="000000"/>
-          <w:sz w:val="26"/>
-        </w:rPr>
-        <w:t>7.1. Đánh giá kết quả đạt được của đồ án</w:t>
-      </w:r>
-      <w:bookmarkEnd w:id="24"/>
+        <w:rPr>
+          <w:rFonts w:ascii="Times New Roman" w:hAnsi="Times New Roman" w:cs="Times New Roman"/>
+          <w:b/>
+          <w:color w:val="000000"/>
+          <w:sz w:val="28"/>
+        </w:rPr>
+      </w:pPr>
+      <w:bookmarkStart w:id="22" w:name="_Toc233884097"/>
+      <w:r>
+        <w:rPr>
+          <w:rFonts w:ascii="Times New Roman" w:hAnsi="Times New Roman" w:cs="Times New Roman"/>
+          <w:b/>
+          <w:color w:val="000000"/>
+          <w:sz w:val="28"/>
+        </w:rPr>
+        <w:t>6.2. Kết quả kiểm tra hiệu năng hệ thống (Performance Evaluation)</w:t>
+      </w:r>
+      <w:bookmarkEnd w:id="22"/>
     </w:p>
     <w:p>
       <w:pPr>
@@ -3497,32 +3461,72 @@
           <w:color w:val="000000"/>
           <w:sz w:val="26"/>
         </w:rPr>
-        <w:t>Nhóm nghiên cứu đã hoàn thành toàn bộ các yêu cầu đề ra cho đồ án 'NLU Banking App'. Hệ thống Android App kết hợp Microservices Spring Boot hoạt động ổn định, bảo mật xác thực phân tán qua Keycloak OIDC đạt chuẩn công nghiệp, quy trình nạp, rút, chuyển khoản nội bộ và thanh toán QR Code hoạt động mượt mà và chính xác.</w:t>
-      </w:r>
+        <w:t>Nhờ kiến trúc API Gateway định tuyến và cơ chế Load Balancing của Eureka Server, thời gian phản hồi trung bình (Response Time) của các API truy vấn số dư và lịch sử giao dịch dao động ổn định trong khoảng 150ms đến 300ms, đạt tiêu chí kỹ thuật về hiệu năng xử lý nhanh và tính sẵn sàng cao của hệ thống.</w:t>
+      </w:r>
+    </w:p>
+    <w:p>
+      <w:pPr>
+        <w:rPr>
+          <w:rFonts w:ascii="Times New Roman" w:hAnsi="Times New Roman" w:cs="Times New Roman"/>
+          <w:color w:val="000000"/>
+          <w:sz w:val="26"/>
+        </w:rPr>
+      </w:pPr>
+      <w:r>
+        <w:rPr>
+          <w:rFonts w:ascii="Times New Roman" w:hAnsi="Times New Roman" w:cs="Times New Roman"/>
+          <w:color w:val="000000"/>
+          <w:sz w:val="26"/>
+        </w:rPr>
+        <w:br w:type="page"/>
+      </w:r>
+    </w:p>
+    <w:p>
+      <w:pPr>
+        <w:pStyle w:val="Heading1"/>
+        <w:spacing w:before="240" w:after="240" w:line="360" w:lineRule="auto"/>
+        <w:rPr>
+          <w:rFonts w:ascii="Times New Roman" w:hAnsi="Times New Roman" w:cs="Times New Roman"/>
+          <w:b/>
+          <w:color w:val="000000"/>
+          <w:sz w:val="30"/>
+        </w:rPr>
+      </w:pPr>
+      <w:bookmarkStart w:id="23" w:name="_Toc233884098"/>
+      <w:r>
+        <w:rPr>
+          <w:rFonts w:ascii="Times New Roman" w:hAnsi="Times New Roman" w:cs="Times New Roman"/>
+          <w:b/>
+          <w:color w:val="000000"/>
+          <w:sz w:val="30"/>
+        </w:rPr>
+        <w:lastRenderedPageBreak/>
+        <w:t>CHƯƠNG 7. TỖNG KẾT VÀ HƯỚNG PHÁT TRIỂN TƯƠNG LAI</w:t>
+      </w:r>
+      <w:bookmarkEnd w:id="23"/>
     </w:p>
     <w:p>
       <w:pPr>
         <w:pStyle w:val="Heading2"/>
         <w:spacing w:before="120" w:after="120" w:line="360" w:lineRule="auto"/>
-        <w:ind w:left="283"/>
-        <w:rPr>
-          <w:rFonts w:ascii="Times New Roman" w:hAnsi="Times New Roman" w:cs="Times New Roman"/>
-          <w:b/>
-          <w:color w:val="000000"/>
-          <w:sz w:val="26"/>
-        </w:rPr>
-      </w:pPr>
-      <w:bookmarkStart w:id="25" w:name="_Toc233883441"/>
-      <w:r>
-        <w:rPr>
-          <w:rFonts w:ascii="Times New Roman" w:hAnsi="Times New Roman" w:cs="Times New Roman"/>
-          <w:b/>
-          <w:color w:val="000000"/>
-          <w:sz w:val="26"/>
-        </w:rPr>
-        <w:t>7.2. Hướng phát triển nâng cấp hệ thống</w:t>
-      </w:r>
-      <w:bookmarkEnd w:id="25"/>
+        <w:rPr>
+          <w:rFonts w:ascii="Times New Roman" w:hAnsi="Times New Roman" w:cs="Times New Roman"/>
+          <w:b/>
+          <w:color w:val="000000"/>
+          <w:sz w:val="28"/>
+        </w:rPr>
+      </w:pPr>
+      <w:bookmarkStart w:id="24" w:name="_Toc233884099"/>
+      <w:r>
+        <w:rPr>
+          <w:rFonts w:ascii="Times New Roman" w:hAnsi="Times New Roman" w:cs="Times New Roman"/>
+          <w:b/>
+          <w:color w:val="000000"/>
+          <w:sz w:val="28"/>
+        </w:rPr>
+        <w:t>7.1. Đánh giá kết quả đạt được của đồ án</w:t>
+      </w:r>
+      <w:bookmarkEnd w:id="24"/>
     </w:p>
     <w:p>
       <w:pPr>
@@ -3541,7 +3545,50 @@
           <w:color w:val="000000"/>
           <w:sz w:val="26"/>
         </w:rPr>
-        <w:t>Nhóm dự kiến phát triển nâng cấp hệ thống trong tương lai bằng cách tích hợp thêm các chức năng: Xác thực sinh trắc học (vân tay, nhận diện khuôn mặt) trực tiếp trên Android; triển khai cơ chế Message Broker qua Apache Kafka để tối ưu hóa khả năng truyền tải dữ liệu và nâng cao tính chịu tải của hệ thống ngân hàng di động.</w:t>
+        <w:t>Nhóm nghiên cứu đã hoàn thành toàn bộ các yêu cầu đề ra cho đồ án 'NLU Banking App'. Hệ thống Android App kết hợp Microservices Spring Boot hoạt động ổn định, bảo mật xác thực phân tán qua Keycloak OIDC đạt chuẩn công nghiệp, quy trình nạp, rút, chuyển khoản nội bộ và thanh toán QR Code hoạt động mượt mà và chính xác.</w:t>
+      </w:r>
+    </w:p>
+    <w:p>
+      <w:pPr>
+        <w:pStyle w:val="Heading2"/>
+        <w:spacing w:before="120" w:after="120" w:line="360" w:lineRule="auto"/>
+        <w:rPr>
+          <w:rFonts w:ascii="Times New Roman" w:hAnsi="Times New Roman" w:cs="Times New Roman"/>
+          <w:b/>
+          <w:color w:val="000000"/>
+          <w:sz w:val="28"/>
+        </w:rPr>
+      </w:pPr>
+      <w:bookmarkStart w:id="25" w:name="_Toc233884100"/>
+      <w:r>
+        <w:rPr>
+          <w:rFonts w:ascii="Times New Roman" w:hAnsi="Times New Roman" w:cs="Times New Roman"/>
+          <w:b/>
+          <w:color w:val="000000"/>
+          <w:sz w:val="28"/>
+        </w:rPr>
+        <w:t>7.2. Hướng phát triển nâng cấp hệ thống</w:t>
+      </w:r>
+      <w:bookmarkEnd w:id="25"/>
+    </w:p>
+    <w:p>
+      <w:pPr>
+        <w:spacing w:line="360" w:lineRule="auto"/>
+        <w:ind w:firstLine="709"/>
+        <w:jc w:val="both"/>
+        <w:rPr>
+          <w:rFonts w:ascii="Times New Roman" w:hAnsi="Times New Roman" w:cs="Times New Roman"/>
+          <w:color w:val="000000"/>
+          <w:sz w:val="26"/>
+        </w:rPr>
+      </w:pPr>
+      <w:r>
+        <w:rPr>
+          <w:rFonts w:ascii="Times New Roman" w:hAnsi="Times New Roman" w:cs="Times New Roman"/>
+          <w:color w:val="000000"/>
+          <w:sz w:val="26"/>
+        </w:rPr>
+        <w:t>Nhóm dự kiến phát triển nâng cấp hệ thống trong tương lai bằng cách tích hợp thêm: Xác thực sinh trắc học (vân tay, nhận diện khuôn mặt) trực tiếp trên Android; triển khai cơ chế Message Broker qua Apache Kafka để tối ưu hóa khả năng truyền tải dữ liệu và nâng cao tính chịu tải của hệ thống ngân hàng di động.</w:t>
       </w:r>
     </w:p>
     <w:p>
@@ -3974,7 +4021,7 @@
     <w:link w:val="Heading1Char"/>
     <w:uiPriority w:val="9"/>
     <w:qFormat/>
-    <w:rsid w:val="00524EA6"/>
+    <w:rsid w:val="00705126"/>
     <w:pPr>
       <w:keepNext/>
       <w:keepLines/>
@@ -3996,7 +4043,7 @@
     <w:uiPriority w:val="9"/>
     <w:unhideWhenUsed/>
     <w:qFormat/>
-    <w:rsid w:val="00524EA6"/>
+    <w:rsid w:val="00705126"/>
     <w:pPr>
       <w:keepNext/>
       <w:keepLines/>
@@ -4018,7 +4065,7 @@
     <w:uiPriority w:val="9"/>
     <w:unhideWhenUsed/>
     <w:qFormat/>
-    <w:rsid w:val="00524EA6"/>
+    <w:rsid w:val="00705126"/>
     <w:pPr>
       <w:keepNext/>
       <w:keepLines/>
@@ -4041,7 +4088,7 @@
     <w:semiHidden/>
     <w:unhideWhenUsed/>
     <w:qFormat/>
-    <w:rsid w:val="00524EA6"/>
+    <w:rsid w:val="00705126"/>
     <w:pPr>
       <w:keepNext/>
       <w:keepLines/>
@@ -4064,7 +4111,7 @@
     <w:semiHidden/>
     <w:unhideWhenUsed/>
     <w:qFormat/>
-    <w:rsid w:val="00524EA6"/>
+    <w:rsid w:val="00705126"/>
     <w:pPr>
       <w:keepNext/>
       <w:keepLines/>
@@ -4085,7 +4132,7 @@
     <w:semiHidden/>
     <w:unhideWhenUsed/>
     <w:qFormat/>
-    <w:rsid w:val="00524EA6"/>
+    <w:rsid w:val="00705126"/>
     <w:pPr>
       <w:keepNext/>
       <w:keepLines/>
@@ -4108,7 +4155,7 @@
     <w:semiHidden/>
     <w:unhideWhenUsed/>
     <w:qFormat/>
-    <w:rsid w:val="00524EA6"/>
+    <w:rsid w:val="00705126"/>
     <w:pPr>
       <w:keepNext/>
       <w:keepLines/>
@@ -4129,7 +4176,7 @@
     <w:semiHidden/>
     <w:unhideWhenUsed/>
     <w:qFormat/>
-    <w:rsid w:val="00524EA6"/>
+    <w:rsid w:val="00705126"/>
     <w:pPr>
       <w:keepNext/>
       <w:keepLines/>
@@ -4152,7 +4199,7 @@
     <w:semiHidden/>
     <w:unhideWhenUsed/>
     <w:qFormat/>
-    <w:rsid w:val="00524EA6"/>
+    <w:rsid w:val="00705126"/>
     <w:pPr>
       <w:keepNext/>
       <w:keepLines/>
@@ -4196,7 +4243,7 @@
     <w:basedOn w:val="DefaultParagraphFont"/>
     <w:link w:val="Heading1"/>
     <w:uiPriority w:val="9"/>
-    <w:rsid w:val="00524EA6"/>
+    <w:rsid w:val="00705126"/>
     <w:rPr>
       <w:rFonts w:asciiTheme="majorHAnsi" w:eastAsiaTheme="majorEastAsia" w:hAnsiTheme="majorHAnsi" w:cstheme="majorBidi"/>
       <w:color w:val="0F4761" w:themeColor="accent1" w:themeShade="BF"/>
@@ -4209,7 +4256,7 @@
     <w:basedOn w:val="DefaultParagraphFont"/>
     <w:link w:val="Heading2"/>
     <w:uiPriority w:val="9"/>
-    <w:rsid w:val="00524EA6"/>
+    <w:rsid w:val="00705126"/>
     <w:rPr>
       <w:rFonts w:asciiTheme="majorHAnsi" w:eastAsiaTheme="majorEastAsia" w:hAnsiTheme="majorHAnsi" w:cstheme="majorBidi"/>
       <w:color w:val="0F4761" w:themeColor="accent1" w:themeShade="BF"/>
@@ -4222,7 +4269,7 @@
     <w:basedOn w:val="DefaultParagraphFont"/>
     <w:link w:val="Heading3"/>
     <w:uiPriority w:val="9"/>
-    <w:rsid w:val="00524EA6"/>
+    <w:rsid w:val="00705126"/>
     <w:rPr>
       <w:rFonts w:eastAsiaTheme="majorEastAsia" w:cstheme="majorBidi"/>
       <w:color w:val="0F4761" w:themeColor="accent1" w:themeShade="BF"/>
@@ -4236,7 +4283,7 @@
     <w:link w:val="Heading4"/>
     <w:uiPriority w:val="9"/>
     <w:semiHidden/>
-    <w:rsid w:val="00524EA6"/>
+    <w:rsid w:val="00705126"/>
     <w:rPr>
       <w:rFonts w:eastAsiaTheme="majorEastAsia" w:cstheme="majorBidi"/>
       <w:i/>
@@ -4250,7 +4297,7 @@
     <w:link w:val="Heading5"/>
     <w:uiPriority w:val="9"/>
     <w:semiHidden/>
-    <w:rsid w:val="00524EA6"/>
+    <w:rsid w:val="00705126"/>
     <w:rPr>
       <w:rFonts w:eastAsiaTheme="majorEastAsia" w:cstheme="majorBidi"/>
       <w:color w:val="0F4761" w:themeColor="accent1" w:themeShade="BF"/>
@@ -4262,7 +4309,7 @@
     <w:link w:val="Heading6"/>
     <w:uiPriority w:val="9"/>
     <w:semiHidden/>
-    <w:rsid w:val="00524EA6"/>
+    <w:rsid w:val="00705126"/>
     <w:rPr>
       <w:rFonts w:eastAsiaTheme="majorEastAsia" w:cstheme="majorBidi"/>
       <w:i/>
@@ -4276,7 +4323,7 @@
     <w:link w:val="Heading7"/>
     <w:uiPriority w:val="9"/>
     <w:semiHidden/>
-    <w:rsid w:val="00524EA6"/>
+    <w:rsid w:val="00705126"/>
     <w:rPr>
       <w:rFonts w:eastAsiaTheme="majorEastAsia" w:cstheme="majorBidi"/>
       <w:color w:val="595959" w:themeColor="text1" w:themeTint="A6"/>
@@ -4288,7 +4335,7 @@
     <w:link w:val="Heading8"/>
     <w:uiPriority w:val="9"/>
     <w:semiHidden/>
-    <w:rsid w:val="00524EA6"/>
+    <w:rsid w:val="00705126"/>
     <w:rPr>
       <w:rFonts w:eastAsiaTheme="majorEastAsia" w:cstheme="majorBidi"/>
       <w:i/>
@@ -4302,7 +4349,7 @@
     <w:link w:val="Heading9"/>
     <w:uiPriority w:val="9"/>
     <w:semiHidden/>
-    <w:rsid w:val="00524EA6"/>
+    <w:rsid w:val="00705126"/>
     <w:rPr>
       <w:rFonts w:eastAsiaTheme="majorEastAsia" w:cstheme="majorBidi"/>
       <w:color w:val="272727" w:themeColor="text1" w:themeTint="D8"/>
@@ -4315,7 +4362,7 @@
     <w:link w:val="TitleChar"/>
     <w:uiPriority w:val="10"/>
     <w:qFormat/>
-    <w:rsid w:val="00524EA6"/>
+    <w:rsid w:val="00705126"/>
     <w:pPr>
       <w:spacing w:after="80" w:line="240" w:lineRule="auto"/>
       <w:contextualSpacing/>
@@ -4333,7 +4380,7 @@
     <w:basedOn w:val="DefaultParagraphFont"/>
     <w:link w:val="Title"/>
     <w:uiPriority w:val="10"/>
-    <w:rsid w:val="00524EA6"/>
+    <w:rsid w:val="00705126"/>
     <w:rPr>
       <w:rFonts w:asciiTheme="majorHAnsi" w:eastAsiaTheme="majorEastAsia" w:hAnsiTheme="majorHAnsi" w:cstheme="majorBidi"/>
       <w:spacing w:val="-10"/>
@@ -4349,7 +4396,7 @@
     <w:link w:val="SubtitleChar"/>
     <w:uiPriority w:val="11"/>
     <w:qFormat/>
-    <w:rsid w:val="00524EA6"/>
+    <w:rsid w:val="00705126"/>
     <w:pPr>
       <w:numPr>
         <w:ilvl w:val="1"/>
@@ -4368,7 +4415,7 @@
     <w:basedOn w:val="DefaultParagraphFont"/>
     <w:link w:val="Subtitle"/>
     <w:uiPriority w:val="11"/>
-    <w:rsid w:val="00524EA6"/>
+    <w:rsid w:val="00705126"/>
     <w:rPr>
       <w:rFonts w:eastAsiaTheme="majorEastAsia" w:cstheme="majorBidi"/>
       <w:color w:val="595959" w:themeColor="text1" w:themeTint="A6"/>
@@ -4384,7 +4431,7 @@
     <w:link w:val="QuoteChar"/>
     <w:uiPriority w:val="29"/>
     <w:qFormat/>
-    <w:rsid w:val="00524EA6"/>
+    <w:rsid w:val="00705126"/>
     <w:pPr>
       <w:spacing w:before="160"/>
       <w:jc w:val="center"/>
@@ -4400,7 +4447,7 @@
     <w:basedOn w:val="DefaultParagraphFont"/>
     <w:link w:val="Quote"/>
     <w:uiPriority w:val="29"/>
-    <w:rsid w:val="00524EA6"/>
+    <w:rsid w:val="00705126"/>
     <w:rPr>
       <w:i/>
       <w:iCs/>
@@ -4412,7 +4459,7 @@
     <w:basedOn w:val="Normal"/>
     <w:uiPriority w:val="34"/>
     <w:qFormat/>
-    <w:rsid w:val="00524EA6"/>
+    <w:rsid w:val="00705126"/>
     <w:pPr>
       <w:ind w:left="720"/>
       <w:contextualSpacing/>
@@ -4423,7 +4470,7 @@
     <w:basedOn w:val="DefaultParagraphFont"/>
     <w:uiPriority w:val="21"/>
     <w:qFormat/>
-    <w:rsid w:val="00524EA6"/>
+    <w:rsid w:val="00705126"/>
     <w:rPr>
       <w:i/>
       <w:iCs/>
@@ -4437,7 +4484,7 @@
     <w:link w:val="IntenseQuoteChar"/>
     <w:uiPriority w:val="30"/>
     <w:qFormat/>
-    <w:rsid w:val="00524EA6"/>
+    <w:rsid w:val="00705126"/>
     <w:pPr>
       <w:pBdr>
         <w:top w:val="single" w:sz="4" w:space="10" w:color="0F4761" w:themeColor="accent1" w:themeShade="BF"/>
@@ -4458,7 +4505,7 @@
     <w:basedOn w:val="DefaultParagraphFont"/>
     <w:link w:val="IntenseQuote"/>
     <w:uiPriority w:val="30"/>
-    <w:rsid w:val="00524EA6"/>
+    <w:rsid w:val="00705126"/>
     <w:rPr>
       <w:i/>
       <w:iCs/>
@@ -4470,7 +4517,7 @@
     <w:basedOn w:val="DefaultParagraphFont"/>
     <w:uiPriority w:val="32"/>
     <w:qFormat/>
-    <w:rsid w:val="00524EA6"/>
+    <w:rsid w:val="00705126"/>
     <w:rPr>
       <w:b/>
       <w:bCs/>
@@ -4481,7 +4528,7 @@
   </w:style>
   <w:style w:type="table" w:customStyle="1" w:styleId="TableGrid">
     <w:name w:val="TableGrid"/>
-    <w:rsid w:val="00524EA6"/>
+    <w:rsid w:val="00705126"/>
     <w:pPr>
       <w:spacing w:after="0" w:line="240" w:lineRule="auto"/>
     </w:pPr>
@@ -4504,7 +4551,7 @@
     <w:autoRedefine/>
     <w:uiPriority w:val="39"/>
     <w:unhideWhenUsed/>
-    <w:rsid w:val="00524EA6"/>
+    <w:rsid w:val="00705126"/>
     <w:pPr>
       <w:spacing w:after="100"/>
     </w:pPr>
@@ -4516,7 +4563,7 @@
     <w:autoRedefine/>
     <w:uiPriority w:val="39"/>
     <w:unhideWhenUsed/>
-    <w:rsid w:val="00524EA6"/>
+    <w:rsid w:val="00705126"/>
     <w:pPr>
       <w:spacing w:after="100"/>
       <w:ind w:left="240"/>
@@ -4529,7 +4576,7 @@
     <w:autoRedefine/>
     <w:uiPriority w:val="39"/>
     <w:unhideWhenUsed/>
-    <w:rsid w:val="00524EA6"/>
+    <w:rsid w:val="00705126"/>
     <w:pPr>
       <w:spacing w:after="100"/>
       <w:ind w:left="480"/>

</xml_diff>

<commit_message>
docs: fix cover format, remove date, student names centered with dash, no blank pages, live TOC
</commit_message>
<xml_diff>
--- a/Bao_cao_do_an_NLU_Banking.docx
+++ b/Bao_cao_do_an_NLU_Banking.docx
@@ -88,7 +88,7 @@
                 <w:noProof/>
               </w:rPr>
               <w:drawing>
-                <wp:inline distT="0" distB="0" distL="0" distR="0" wp14:anchorId="37644AED" wp14:editId="1D9B42B6">
+                <wp:inline distT="0" distB="0" distL="0" distR="0" wp14:anchorId="33D9CA20" wp14:editId="452C0823">
                   <wp:extent cx="1440180" cy="1440180"/>
                   <wp:effectExtent l="0" t="0" r="0" b="0"/>
                   <wp:docPr id="134" name="Picture 134"/>
@@ -254,7 +254,7 @@
                 <w:b/>
                 <w:sz w:val="28"/>
               </w:rPr>
-              <w:t>Giảng viên hướng dẫn : Th.S Võ Tấn Toàn    Sinh viên thực hiện :</w:t>
+              <w:t>Giảng viên hướng dẫn : Th.S Võ Tấn Toàn</w:t>
             </w:r>
           </w:p>
           <w:p>
@@ -270,7 +270,7 @@
                 <w:rFonts w:ascii="Calibri" w:eastAsia="Calibri" w:hAnsi="Calibri" w:cs="Calibri"/>
                 <w:sz w:val="22"/>
               </w:rPr>
-              <w:t xml:space="preserve">    Lê Văn Tính                          23130334 (Nhóm trưởng)</w:t>
+              <w:t>Sinh viên thực hiện :</w:t>
             </w:r>
           </w:p>
           <w:p>
@@ -280,13 +280,14 @@
                 <w:tab w:val="center" w:pos="6060"/>
               </w:tabs>
               <w:spacing w:after="228" w:line="259" w:lineRule="auto"/>
+              <w:jc w:val="center"/>
             </w:pPr>
             <w:r>
               <w:rPr>
                 <w:rFonts w:ascii="Calibri" w:eastAsia="Calibri" w:hAnsi="Calibri" w:cs="Calibri"/>
                 <w:sz w:val="22"/>
               </w:rPr>
-              <w:t xml:space="preserve">    Trần Hoàng Quân                        23130258</w:t>
+              <w:t>Lê Văn Tính - 23130334 (Nhóm trưởng)</w:t>
             </w:r>
           </w:p>
           <w:p>
@@ -296,13 +297,14 @@
                 <w:tab w:val="center" w:pos="6060"/>
               </w:tabs>
               <w:spacing w:after="228" w:line="259" w:lineRule="auto"/>
+              <w:jc w:val="center"/>
             </w:pPr>
             <w:r>
               <w:rPr>
                 <w:rFonts w:ascii="Calibri" w:eastAsia="Calibri" w:hAnsi="Calibri" w:cs="Calibri"/>
                 <w:sz w:val="22"/>
               </w:rPr>
-              <w:t xml:space="preserve">    Nguyễn Văn Anh Hàn                    23130087</w:t>
+              <w:t>Trần Hoàng Quân - 23130258</w:t>
             </w:r>
           </w:p>
           <w:p>
@@ -312,13 +314,14 @@
                 <w:tab w:val="center" w:pos="6060"/>
               </w:tabs>
               <w:spacing w:after="228" w:line="259" w:lineRule="auto"/>
+              <w:jc w:val="center"/>
             </w:pPr>
             <w:r>
               <w:rPr>
                 <w:rFonts w:ascii="Calibri" w:eastAsia="Calibri" w:hAnsi="Calibri" w:cs="Calibri"/>
                 <w:sz w:val="22"/>
               </w:rPr>
-              <w:t xml:space="preserve">    Phan Nguyễn Minh Thắng                  23130300</w:t>
+              <w:t>Nguyễn Văn Anh Hàn - 23130087</w:t>
             </w:r>
           </w:p>
           <w:p>
@@ -328,7 +331,15 @@
                 <w:tab w:val="center" w:pos="6060"/>
               </w:tabs>
               <w:spacing w:after="900" w:line="259" w:lineRule="auto"/>
+              <w:jc w:val="center"/>
             </w:pPr>
+            <w:r>
+              <w:rPr>
+                <w:rFonts w:ascii="Calibri" w:eastAsia="Calibri" w:hAnsi="Calibri" w:cs="Calibri"/>
+                <w:sz w:val="22"/>
+              </w:rPr>
+              <w:t>Phan Nguyễn Minh Thắng - 23130300</w:t>
+            </w:r>
           </w:p>
           <w:p>
             <w:pPr>
@@ -336,12 +347,6 @@
               <w:ind w:right="109"/>
               <w:jc w:val="center"/>
             </w:pPr>
-            <w:r>
-              <w:rPr>
-                <w:sz w:val="30"/>
-              </w:rPr>
-              <w:t>TP. Hồ CHÍ MINH, THÁNG 7 NĂM 2026</w:t>
-            </w:r>
           </w:p>
         </w:tc>
       </w:tr>
@@ -437,7 +442,7 @@
         <w:rPr>
           <w:noProof/>
         </w:rPr>
-        <w:instrText xml:space="preserve"> PAGEREF _Toc233884075 \h </w:instrText>
+        <w:instrText xml:space="preserve"> PAGEREF _Toc233884836 \h </w:instrText>
       </w:r>
       <w:r>
         <w:rPr>
@@ -454,7 +459,7 @@
         <w:rPr>
           <w:noProof/>
         </w:rPr>
-        <w:t>7</w:t>
+        <w:t>6</w:t>
       </w:r>
       <w:r>
         <w:rPr>
@@ -499,7 +504,7 @@
         <w:rPr>
           <w:noProof/>
         </w:rPr>
-        <w:instrText xml:space="preserve"> PAGEREF _Toc233884076 \h </w:instrText>
+        <w:instrText xml:space="preserve"> PAGEREF _Toc233884837 \h </w:instrText>
       </w:r>
       <w:r>
         <w:rPr>
@@ -516,7 +521,7 @@
         <w:rPr>
           <w:noProof/>
         </w:rPr>
-        <w:t>7</w:t>
+        <w:t>6</w:t>
       </w:r>
       <w:r>
         <w:rPr>
@@ -561,7 +566,7 @@
         <w:rPr>
           <w:noProof/>
         </w:rPr>
-        <w:instrText xml:space="preserve"> PAGEREF _Toc233884077 \h </w:instrText>
+        <w:instrText xml:space="preserve"> PAGEREF _Toc233884838 \h </w:instrText>
       </w:r>
       <w:r>
         <w:rPr>
@@ -578,7 +583,7 @@
         <w:rPr>
           <w:noProof/>
         </w:rPr>
-        <w:t>7</w:t>
+        <w:t>6</w:t>
       </w:r>
       <w:r>
         <w:rPr>
@@ -623,7 +628,7 @@
         <w:rPr>
           <w:noProof/>
         </w:rPr>
-        <w:instrText xml:space="preserve"> PAGEREF _Toc233884078 \h </w:instrText>
+        <w:instrText xml:space="preserve"> PAGEREF _Toc233884839 \h </w:instrText>
       </w:r>
       <w:r>
         <w:rPr>
@@ -640,7 +645,7 @@
         <w:rPr>
           <w:noProof/>
         </w:rPr>
-        <w:t>7</w:t>
+        <w:t>6</w:t>
       </w:r>
       <w:r>
         <w:rPr>
@@ -685,7 +690,7 @@
         <w:rPr>
           <w:noProof/>
         </w:rPr>
-        <w:instrText xml:space="preserve"> PAGEREF _Toc233884079 \h </w:instrText>
+        <w:instrText xml:space="preserve"> PAGEREF _Toc233884840 \h </w:instrText>
       </w:r>
       <w:r>
         <w:rPr>
@@ -702,7 +707,7 @@
         <w:rPr>
           <w:noProof/>
         </w:rPr>
-        <w:t>8</w:t>
+        <w:t>7</w:t>
       </w:r>
       <w:r>
         <w:rPr>
@@ -747,7 +752,7 @@
         <w:rPr>
           <w:noProof/>
         </w:rPr>
-        <w:instrText xml:space="preserve"> PAGEREF _Toc233884080 \h </w:instrText>
+        <w:instrText xml:space="preserve"> PAGEREF _Toc233884841 \h </w:instrText>
       </w:r>
       <w:r>
         <w:rPr>
@@ -764,7 +769,7 @@
         <w:rPr>
           <w:noProof/>
         </w:rPr>
-        <w:t>8</w:t>
+        <w:t>7</w:t>
       </w:r>
       <w:r>
         <w:rPr>
@@ -809,7 +814,7 @@
         <w:rPr>
           <w:noProof/>
         </w:rPr>
-        <w:instrText xml:space="preserve"> PAGEREF _Toc233884081 \h </w:instrText>
+        <w:instrText xml:space="preserve"> PAGEREF _Toc233884842 \h </w:instrText>
       </w:r>
       <w:r>
         <w:rPr>
@@ -826,7 +831,7 @@
         <w:rPr>
           <w:noProof/>
         </w:rPr>
-        <w:t>8</w:t>
+        <w:t>7</w:t>
       </w:r>
       <w:r>
         <w:rPr>
@@ -871,7 +876,7 @@
         <w:rPr>
           <w:noProof/>
         </w:rPr>
-        <w:instrText xml:space="preserve"> PAGEREF _Toc233884082 \h </w:instrText>
+        <w:instrText xml:space="preserve"> PAGEREF _Toc233884843 \h </w:instrText>
       </w:r>
       <w:r>
         <w:rPr>
@@ -888,7 +893,7 @@
         <w:rPr>
           <w:noProof/>
         </w:rPr>
-        <w:t>10</w:t>
+        <w:t>9</w:t>
       </w:r>
       <w:r>
         <w:rPr>
@@ -933,7 +938,7 @@
         <w:rPr>
           <w:noProof/>
         </w:rPr>
-        <w:instrText xml:space="preserve"> PAGEREF _Toc233884083 \h </w:instrText>
+        <w:instrText xml:space="preserve"> PAGEREF _Toc233884844 \h </w:instrText>
       </w:r>
       <w:r>
         <w:rPr>
@@ -950,7 +955,7 @@
         <w:rPr>
           <w:noProof/>
         </w:rPr>
-        <w:t>10</w:t>
+        <w:t>9</w:t>
       </w:r>
       <w:r>
         <w:rPr>
@@ -995,7 +1000,7 @@
         <w:rPr>
           <w:noProof/>
         </w:rPr>
-        <w:instrText xml:space="preserve"> PAGEREF _Toc233884084 \h </w:instrText>
+        <w:instrText xml:space="preserve"> PAGEREF _Toc233884845 \h </w:instrText>
       </w:r>
       <w:r>
         <w:rPr>
@@ -1012,7 +1017,7 @@
         <w:rPr>
           <w:noProof/>
         </w:rPr>
-        <w:t>10</w:t>
+        <w:t>9</w:t>
       </w:r>
       <w:r>
         <w:rPr>
@@ -1057,7 +1062,7 @@
         <w:rPr>
           <w:noProof/>
         </w:rPr>
-        <w:instrText xml:space="preserve"> PAGEREF _Toc233884085 \h </w:instrText>
+        <w:instrText xml:space="preserve"> PAGEREF _Toc233884846 \h </w:instrText>
       </w:r>
       <w:r>
         <w:rPr>
@@ -1074,7 +1079,7 @@
         <w:rPr>
           <w:noProof/>
         </w:rPr>
-        <w:t>12</w:t>
+        <w:t>11</w:t>
       </w:r>
       <w:r>
         <w:rPr>
@@ -1119,7 +1124,7 @@
         <w:rPr>
           <w:noProof/>
         </w:rPr>
-        <w:instrText xml:space="preserve"> PAGEREF _Toc233884086 \h </w:instrText>
+        <w:instrText xml:space="preserve"> PAGEREF _Toc233884847 \h </w:instrText>
       </w:r>
       <w:r>
         <w:rPr>
@@ -1136,7 +1141,7 @@
         <w:rPr>
           <w:noProof/>
         </w:rPr>
-        <w:t>12</w:t>
+        <w:t>11</w:t>
       </w:r>
       <w:r>
         <w:rPr>
@@ -1181,7 +1186,7 @@
         <w:rPr>
           <w:noProof/>
         </w:rPr>
-        <w:instrText xml:space="preserve"> PAGEREF _Toc233884087 \h </w:instrText>
+        <w:instrText xml:space="preserve"> PAGEREF _Toc233884848 \h </w:instrText>
       </w:r>
       <w:r>
         <w:rPr>
@@ -1198,7 +1203,7 @@
         <w:rPr>
           <w:noProof/>
         </w:rPr>
-        <w:t>12</w:t>
+        <w:t>11</w:t>
       </w:r>
       <w:r>
         <w:rPr>
@@ -1243,7 +1248,7 @@
         <w:rPr>
           <w:noProof/>
         </w:rPr>
-        <w:instrText xml:space="preserve"> PAGEREF _Toc233884088 \h </w:instrText>
+        <w:instrText xml:space="preserve"> PAGEREF _Toc233884849 \h </w:instrText>
       </w:r>
       <w:r>
         <w:rPr>
@@ -1260,7 +1265,7 @@
         <w:rPr>
           <w:noProof/>
         </w:rPr>
-        <w:t>14</w:t>
+        <w:t>13</w:t>
       </w:r>
       <w:r>
         <w:rPr>
@@ -1305,7 +1310,7 @@
         <w:rPr>
           <w:noProof/>
         </w:rPr>
-        <w:instrText xml:space="preserve"> PAGEREF _Toc233884089 \h </w:instrText>
+        <w:instrText xml:space="preserve"> PAGEREF _Toc233884850 \h </w:instrText>
       </w:r>
       <w:r>
         <w:rPr>
@@ -1322,7 +1327,7 @@
         <w:rPr>
           <w:noProof/>
         </w:rPr>
-        <w:t>14</w:t>
+        <w:t>13</w:t>
       </w:r>
       <w:r>
         <w:rPr>
@@ -1367,7 +1372,7 @@
         <w:rPr>
           <w:noProof/>
         </w:rPr>
-        <w:instrText xml:space="preserve"> PAGEREF _Toc233884090 \h </w:instrText>
+        <w:instrText xml:space="preserve"> PAGEREF _Toc233884851 \h </w:instrText>
       </w:r>
       <w:r>
         <w:rPr>
@@ -1384,7 +1389,7 @@
         <w:rPr>
           <w:noProof/>
         </w:rPr>
-        <w:t>14</w:t>
+        <w:t>13</w:t>
       </w:r>
       <w:r>
         <w:rPr>
@@ -1429,7 +1434,7 @@
         <w:rPr>
           <w:noProof/>
         </w:rPr>
-        <w:instrText xml:space="preserve"> PAGEREF _Toc233884091 \h </w:instrText>
+        <w:instrText xml:space="preserve"> PAGEREF _Toc233884852 \h </w:instrText>
       </w:r>
       <w:r>
         <w:rPr>
@@ -1446,7 +1451,7 @@
         <w:rPr>
           <w:noProof/>
         </w:rPr>
-        <w:t>15</w:t>
+        <w:t>14</w:t>
       </w:r>
       <w:r>
         <w:rPr>
@@ -1491,7 +1496,7 @@
         <w:rPr>
           <w:noProof/>
         </w:rPr>
-        <w:instrText xml:space="preserve"> PAGEREF _Toc233884092 \h </w:instrText>
+        <w:instrText xml:space="preserve"> PAGEREF _Toc233884853 \h </w:instrText>
       </w:r>
       <w:r>
         <w:rPr>
@@ -1508,7 +1513,7 @@
         <w:rPr>
           <w:noProof/>
         </w:rPr>
-        <w:t>15</w:t>
+        <w:t>14</w:t>
       </w:r>
       <w:r>
         <w:rPr>
@@ -1553,7 +1558,7 @@
         <w:rPr>
           <w:noProof/>
         </w:rPr>
-        <w:instrText xml:space="preserve"> PAGEREF _Toc233884093 \h </w:instrText>
+        <w:instrText xml:space="preserve"> PAGEREF _Toc233884854 \h </w:instrText>
       </w:r>
       <w:r>
         <w:rPr>
@@ -1570,7 +1575,7 @@
         <w:rPr>
           <w:noProof/>
         </w:rPr>
-        <w:t>15</w:t>
+        <w:t>14</w:t>
       </w:r>
       <w:r>
         <w:rPr>
@@ -1615,7 +1620,7 @@
         <w:rPr>
           <w:noProof/>
         </w:rPr>
-        <w:instrText xml:space="preserve"> PAGEREF _Toc233884094 \h </w:instrText>
+        <w:instrText xml:space="preserve"> PAGEREF _Toc233884855 \h </w:instrText>
       </w:r>
       <w:r>
         <w:rPr>
@@ -1632,7 +1637,7 @@
         <w:rPr>
           <w:noProof/>
         </w:rPr>
-        <w:t>15</w:t>
+        <w:t>14</w:t>
       </w:r>
       <w:r>
         <w:rPr>
@@ -1677,7 +1682,7 @@
         <w:rPr>
           <w:noProof/>
         </w:rPr>
-        <w:instrText xml:space="preserve"> PAGEREF _Toc233884095 \h </w:instrText>
+        <w:instrText xml:space="preserve"> PAGEREF _Toc233884856 \h </w:instrText>
       </w:r>
       <w:r>
         <w:rPr>
@@ -1694,7 +1699,7 @@
         <w:rPr>
           <w:noProof/>
         </w:rPr>
-        <w:t>16</w:t>
+        <w:t>15</w:t>
       </w:r>
       <w:r>
         <w:rPr>
@@ -1739,7 +1744,7 @@
         <w:rPr>
           <w:noProof/>
         </w:rPr>
-        <w:instrText xml:space="preserve"> PAGEREF _Toc233884096 \h </w:instrText>
+        <w:instrText xml:space="preserve"> PAGEREF _Toc233884857 \h </w:instrText>
       </w:r>
       <w:r>
         <w:rPr>
@@ -1756,7 +1761,7 @@
         <w:rPr>
           <w:noProof/>
         </w:rPr>
-        <w:t>16</w:t>
+        <w:t>15</w:t>
       </w:r>
       <w:r>
         <w:rPr>
@@ -1801,7 +1806,7 @@
         <w:rPr>
           <w:noProof/>
         </w:rPr>
-        <w:instrText xml:space="preserve"> PAGEREF _Toc233884097 \h </w:instrText>
+        <w:instrText xml:space="preserve"> PAGEREF _Toc233884858 \h </w:instrText>
       </w:r>
       <w:r>
         <w:rPr>
@@ -1818,7 +1823,7 @@
         <w:rPr>
           <w:noProof/>
         </w:rPr>
-        <w:t>16</w:t>
+        <w:t>15</w:t>
       </w:r>
       <w:r>
         <w:rPr>
@@ -1863,7 +1868,7 @@
         <w:rPr>
           <w:noProof/>
         </w:rPr>
-        <w:instrText xml:space="preserve"> PAGEREF _Toc233884098 \h </w:instrText>
+        <w:instrText xml:space="preserve"> PAGEREF _Toc233884859 \h </w:instrText>
       </w:r>
       <w:r>
         <w:rPr>
@@ -1880,7 +1885,7 @@
         <w:rPr>
           <w:noProof/>
         </w:rPr>
-        <w:t>17</w:t>
+        <w:t>16</w:t>
       </w:r>
       <w:r>
         <w:rPr>
@@ -1925,7 +1930,7 @@
         <w:rPr>
           <w:noProof/>
         </w:rPr>
-        <w:instrText xml:space="preserve"> PAGEREF _Toc233884099 \h </w:instrText>
+        <w:instrText xml:space="preserve"> PAGEREF _Toc233884860 \h </w:instrText>
       </w:r>
       <w:r>
         <w:rPr>
@@ -1942,7 +1947,7 @@
         <w:rPr>
           <w:noProof/>
         </w:rPr>
-        <w:t>17</w:t>
+        <w:t>16</w:t>
       </w:r>
       <w:r>
         <w:rPr>
@@ -1987,7 +1992,7 @@
         <w:rPr>
           <w:noProof/>
         </w:rPr>
-        <w:instrText xml:space="preserve"> PAGEREF _Toc233884100 \h </w:instrText>
+        <w:instrText xml:space="preserve"> PAGEREF _Toc233884861 \h </w:instrText>
       </w:r>
       <w:r>
         <w:rPr>
@@ -2004,7 +2009,7 @@
         <w:rPr>
           <w:noProof/>
         </w:rPr>
-        <w:t>17</w:t>
+        <w:t>16</w:t>
       </w:r>
       <w:r>
         <w:rPr>
@@ -2056,26 +2061,6 @@
     </w:p>
     <w:p>
       <w:pPr>
-        <w:rPr>
-          <w:rFonts w:ascii="Times New Roman" w:hAnsi="Times New Roman" w:cs="Times New Roman"/>
-          <w:b/>
-          <w:color w:val="000000"/>
-          <w:sz w:val="32"/>
-        </w:rPr>
-      </w:pPr>
-      <w:r>
-        <w:rPr>
-          <w:rFonts w:ascii="Times New Roman" w:hAnsi="Times New Roman" w:cs="Times New Roman"/>
-          <w:b/>
-          <w:color w:val="000000"/>
-          <w:sz w:val="32"/>
-        </w:rPr>
-        <w:lastRenderedPageBreak/>
-        <w:br w:type="page"/>
-      </w:r>
-    </w:p>
-    <w:p>
-      <w:pPr>
         <w:pStyle w:val="Heading1"/>
         <w:spacing w:before="240" w:after="240" w:line="360" w:lineRule="auto"/>
         <w:rPr>
@@ -2085,7 +2070,7 @@
           <w:sz w:val="30"/>
         </w:rPr>
       </w:pPr>
-      <w:bookmarkStart w:id="0" w:name="_Toc233884075"/>
+      <w:bookmarkStart w:id="0" w:name="_Toc233884836"/>
       <w:r>
         <w:rPr>
           <w:rFonts w:ascii="Times New Roman" w:hAnsi="Times New Roman" w:cs="Times New Roman"/>
@@ -2109,7 +2094,7 @@
           <w:sz w:val="28"/>
         </w:rPr>
       </w:pPr>
-      <w:bookmarkStart w:id="1" w:name="_Toc233884076"/>
+      <w:bookmarkStart w:id="1" w:name="_Toc233884837"/>
       <w:r>
         <w:rPr>
           <w:rFonts w:ascii="Times New Roman" w:hAnsi="Times New Roman" w:cs="Times New Roman"/>
@@ -2152,7 +2137,7 @@
           <w:sz w:val="28"/>
         </w:rPr>
       </w:pPr>
-      <w:bookmarkStart w:id="2" w:name="_Toc233884077"/>
+      <w:bookmarkStart w:id="2" w:name="_Toc233884838"/>
       <w:r>
         <w:rPr>
           <w:rFonts w:ascii="Times New Roman" w:hAnsi="Times New Roman" w:cs="Times New Roman"/>
@@ -2195,7 +2180,7 @@
           <w:sz w:val="28"/>
         </w:rPr>
       </w:pPr>
-      <w:bookmarkStart w:id="3" w:name="_Toc233884078"/>
+      <w:bookmarkStart w:id="3" w:name="_Toc233884839"/>
       <w:r>
         <w:rPr>
           <w:rFonts w:ascii="Times New Roman" w:hAnsi="Times New Roman" w:cs="Times New Roman"/>
@@ -2379,7 +2364,7 @@
           <w:sz w:val="28"/>
         </w:rPr>
       </w:pPr>
-      <w:bookmarkStart w:id="4" w:name="_Toc233884079"/>
+      <w:bookmarkStart w:id="4" w:name="_Toc233884840"/>
       <w:r>
         <w:rPr>
           <w:rFonts w:ascii="Times New Roman" w:hAnsi="Times New Roman" w:cs="Times New Roman"/>
@@ -2403,7 +2388,7 @@
           <w:sz w:val="26"/>
         </w:rPr>
       </w:pPr>
-      <w:bookmarkStart w:id="5" w:name="_Toc233884080"/>
+      <w:bookmarkStart w:id="5" w:name="_Toc233884841"/>
       <w:r>
         <w:rPr>
           <w:rFonts w:ascii="Times New Roman" w:hAnsi="Times New Roman" w:cs="Times New Roman"/>
@@ -2447,7 +2432,7 @@
           <w:sz w:val="26"/>
         </w:rPr>
       </w:pPr>
-      <w:bookmarkStart w:id="6" w:name="_Toc233884081"/>
+      <w:bookmarkStart w:id="6" w:name="_Toc233884842"/>
       <w:r>
         <w:rPr>
           <w:rFonts w:ascii="Times New Roman" w:hAnsi="Times New Roman" w:cs="Times New Roman"/>
@@ -2516,7 +2501,7 @@
           <w:sz w:val="30"/>
         </w:rPr>
       </w:pPr>
-      <w:bookmarkStart w:id="7" w:name="_Toc233884082"/>
+      <w:bookmarkStart w:id="7" w:name="_Toc233884843"/>
       <w:r>
         <w:rPr>
           <w:rFonts w:ascii="Times New Roman" w:hAnsi="Times New Roman" w:cs="Times New Roman"/>
@@ -2540,7 +2525,7 @@
           <w:sz w:val="28"/>
         </w:rPr>
       </w:pPr>
-      <w:bookmarkStart w:id="8" w:name="_Toc233884083"/>
+      <w:bookmarkStart w:id="8" w:name="_Toc233884844"/>
       <w:r>
         <w:rPr>
           <w:rFonts w:ascii="Times New Roman" w:hAnsi="Times New Roman" w:cs="Times New Roman"/>
@@ -2643,7 +2628,7 @@
           <w:sz w:val="28"/>
         </w:rPr>
       </w:pPr>
-      <w:bookmarkStart w:id="9" w:name="_Toc233884084"/>
+      <w:bookmarkStart w:id="9" w:name="_Toc233884845"/>
       <w:r>
         <w:rPr>
           <w:rFonts w:ascii="Times New Roman" w:hAnsi="Times New Roman" w:cs="Times New Roman"/>
@@ -2792,7 +2777,7 @@
           <w:sz w:val="30"/>
         </w:rPr>
       </w:pPr>
-      <w:bookmarkStart w:id="10" w:name="_Toc233884085"/>
+      <w:bookmarkStart w:id="10" w:name="_Toc233884846"/>
       <w:r>
         <w:rPr>
           <w:rFonts w:ascii="Times New Roman" w:hAnsi="Times New Roman" w:cs="Times New Roman"/>
@@ -2816,7 +2801,7 @@
           <w:sz w:val="28"/>
         </w:rPr>
       </w:pPr>
-      <w:bookmarkStart w:id="11" w:name="_Toc233884086"/>
+      <w:bookmarkStart w:id="11" w:name="_Toc233884847"/>
       <w:r>
         <w:rPr>
           <w:rFonts w:ascii="Times New Roman" w:hAnsi="Times New Roman" w:cs="Times New Roman"/>
@@ -2999,7 +2984,7 @@
           <w:sz w:val="28"/>
         </w:rPr>
       </w:pPr>
-      <w:bookmarkStart w:id="12" w:name="_Toc233884087"/>
+      <w:bookmarkStart w:id="12" w:name="_Toc233884848"/>
       <w:r>
         <w:rPr>
           <w:rFonts w:ascii="Times New Roman" w:hAnsi="Times New Roman" w:cs="Times New Roman"/>
@@ -3068,7 +3053,7 @@
           <w:sz w:val="30"/>
         </w:rPr>
       </w:pPr>
-      <w:bookmarkStart w:id="13" w:name="_Toc233884088"/>
+      <w:bookmarkStart w:id="13" w:name="_Toc233884849"/>
       <w:r>
         <w:rPr>
           <w:rFonts w:ascii="Times New Roman" w:hAnsi="Times New Roman" w:cs="Times New Roman"/>
@@ -3092,7 +3077,7 @@
           <w:sz w:val="28"/>
         </w:rPr>
       </w:pPr>
-      <w:bookmarkStart w:id="14" w:name="_Toc233884089"/>
+      <w:bookmarkStart w:id="14" w:name="_Toc233884850"/>
       <w:r>
         <w:rPr>
           <w:rFonts w:ascii="Times New Roman" w:hAnsi="Times New Roman" w:cs="Times New Roman"/>
@@ -3135,7 +3120,7 @@
           <w:sz w:val="28"/>
         </w:rPr>
       </w:pPr>
-      <w:bookmarkStart w:id="15" w:name="_Toc233884090"/>
+      <w:bookmarkStart w:id="15" w:name="_Toc233884851"/>
       <w:r>
         <w:rPr>
           <w:rFonts w:ascii="Times New Roman" w:hAnsi="Times New Roman" w:cs="Times New Roman"/>
@@ -3195,7 +3180,7 @@
           <w:sz w:val="30"/>
         </w:rPr>
       </w:pPr>
-      <w:bookmarkStart w:id="16" w:name="_Toc233884091"/>
+      <w:bookmarkStart w:id="16" w:name="_Toc233884852"/>
       <w:r>
         <w:rPr>
           <w:rFonts w:ascii="Times New Roman" w:hAnsi="Times New Roman" w:cs="Times New Roman"/>
@@ -3219,7 +3204,7 @@
           <w:sz w:val="28"/>
         </w:rPr>
       </w:pPr>
-      <w:bookmarkStart w:id="17" w:name="_Toc233884092"/>
+      <w:bookmarkStart w:id="17" w:name="_Toc233884853"/>
       <w:r>
         <w:rPr>
           <w:rFonts w:ascii="Times New Roman" w:hAnsi="Times New Roman" w:cs="Times New Roman"/>
@@ -3262,7 +3247,7 @@
           <w:sz w:val="28"/>
         </w:rPr>
       </w:pPr>
-      <w:bookmarkStart w:id="18" w:name="_Toc233884093"/>
+      <w:bookmarkStart w:id="18" w:name="_Toc233884854"/>
       <w:r>
         <w:rPr>
           <w:rFonts w:ascii="Times New Roman" w:hAnsi="Times New Roman" w:cs="Times New Roman"/>
@@ -3305,7 +3290,7 @@
           <w:sz w:val="28"/>
         </w:rPr>
       </w:pPr>
-      <w:bookmarkStart w:id="19" w:name="_Toc233884094"/>
+      <w:bookmarkStart w:id="19" w:name="_Toc233884855"/>
       <w:r>
         <w:rPr>
           <w:rFonts w:ascii="Times New Roman" w:hAnsi="Times New Roman" w:cs="Times New Roman"/>
@@ -3365,7 +3350,7 @@
           <w:sz w:val="30"/>
         </w:rPr>
       </w:pPr>
-      <w:bookmarkStart w:id="20" w:name="_Toc233884095"/>
+      <w:bookmarkStart w:id="20" w:name="_Toc233884856"/>
       <w:r>
         <w:rPr>
           <w:rFonts w:ascii="Times New Roman" w:hAnsi="Times New Roman" w:cs="Times New Roman"/>
@@ -3389,7 +3374,7 @@
           <w:sz w:val="28"/>
         </w:rPr>
       </w:pPr>
-      <w:bookmarkStart w:id="21" w:name="_Toc233884096"/>
+      <w:bookmarkStart w:id="21" w:name="_Toc233884857"/>
       <w:r>
         <w:rPr>
           <w:rFonts w:ascii="Times New Roman" w:hAnsi="Times New Roman" w:cs="Times New Roman"/>
@@ -3432,7 +3417,7 @@
           <w:sz w:val="28"/>
         </w:rPr>
       </w:pPr>
-      <w:bookmarkStart w:id="22" w:name="_Toc233884097"/>
+      <w:bookmarkStart w:id="22" w:name="_Toc233884858"/>
       <w:r>
         <w:rPr>
           <w:rFonts w:ascii="Times New Roman" w:hAnsi="Times New Roman" w:cs="Times New Roman"/>
@@ -3492,7 +3477,7 @@
           <w:sz w:val="30"/>
         </w:rPr>
       </w:pPr>
-      <w:bookmarkStart w:id="23" w:name="_Toc233884098"/>
+      <w:bookmarkStart w:id="23" w:name="_Toc233884859"/>
       <w:r>
         <w:rPr>
           <w:rFonts w:ascii="Times New Roman" w:hAnsi="Times New Roman" w:cs="Times New Roman"/>
@@ -3516,7 +3501,7 @@
           <w:sz w:val="28"/>
         </w:rPr>
       </w:pPr>
-      <w:bookmarkStart w:id="24" w:name="_Toc233884099"/>
+      <w:bookmarkStart w:id="24" w:name="_Toc233884860"/>
       <w:r>
         <w:rPr>
           <w:rFonts w:ascii="Times New Roman" w:hAnsi="Times New Roman" w:cs="Times New Roman"/>
@@ -3559,7 +3544,7 @@
           <w:sz w:val="28"/>
         </w:rPr>
       </w:pPr>
-      <w:bookmarkStart w:id="25" w:name="_Toc233884100"/>
+      <w:bookmarkStart w:id="25" w:name="_Toc233884861"/>
       <w:r>
         <w:rPr>
           <w:rFonts w:ascii="Times New Roman" w:hAnsi="Times New Roman" w:cs="Times New Roman"/>
@@ -4021,7 +4006,7 @@
     <w:link w:val="Heading1Char"/>
     <w:uiPriority w:val="9"/>
     <w:qFormat/>
-    <w:rsid w:val="00705126"/>
+    <w:rsid w:val="009622B6"/>
     <w:pPr>
       <w:keepNext/>
       <w:keepLines/>
@@ -4043,7 +4028,7 @@
     <w:uiPriority w:val="9"/>
     <w:unhideWhenUsed/>
     <w:qFormat/>
-    <w:rsid w:val="00705126"/>
+    <w:rsid w:val="009622B6"/>
     <w:pPr>
       <w:keepNext/>
       <w:keepLines/>
@@ -4065,7 +4050,7 @@
     <w:uiPriority w:val="9"/>
     <w:unhideWhenUsed/>
     <w:qFormat/>
-    <w:rsid w:val="00705126"/>
+    <w:rsid w:val="009622B6"/>
     <w:pPr>
       <w:keepNext/>
       <w:keepLines/>
@@ -4088,7 +4073,7 @@
     <w:semiHidden/>
     <w:unhideWhenUsed/>
     <w:qFormat/>
-    <w:rsid w:val="00705126"/>
+    <w:rsid w:val="009622B6"/>
     <w:pPr>
       <w:keepNext/>
       <w:keepLines/>
@@ -4111,7 +4096,7 @@
     <w:semiHidden/>
     <w:unhideWhenUsed/>
     <w:qFormat/>
-    <w:rsid w:val="00705126"/>
+    <w:rsid w:val="009622B6"/>
     <w:pPr>
       <w:keepNext/>
       <w:keepLines/>
@@ -4132,7 +4117,7 @@
     <w:semiHidden/>
     <w:unhideWhenUsed/>
     <w:qFormat/>
-    <w:rsid w:val="00705126"/>
+    <w:rsid w:val="009622B6"/>
     <w:pPr>
       <w:keepNext/>
       <w:keepLines/>
@@ -4155,7 +4140,7 @@
     <w:semiHidden/>
     <w:unhideWhenUsed/>
     <w:qFormat/>
-    <w:rsid w:val="00705126"/>
+    <w:rsid w:val="009622B6"/>
     <w:pPr>
       <w:keepNext/>
       <w:keepLines/>
@@ -4176,7 +4161,7 @@
     <w:semiHidden/>
     <w:unhideWhenUsed/>
     <w:qFormat/>
-    <w:rsid w:val="00705126"/>
+    <w:rsid w:val="009622B6"/>
     <w:pPr>
       <w:keepNext/>
       <w:keepLines/>
@@ -4199,7 +4184,7 @@
     <w:semiHidden/>
     <w:unhideWhenUsed/>
     <w:qFormat/>
-    <w:rsid w:val="00705126"/>
+    <w:rsid w:val="009622B6"/>
     <w:pPr>
       <w:keepNext/>
       <w:keepLines/>
@@ -4243,7 +4228,7 @@
     <w:basedOn w:val="DefaultParagraphFont"/>
     <w:link w:val="Heading1"/>
     <w:uiPriority w:val="9"/>
-    <w:rsid w:val="00705126"/>
+    <w:rsid w:val="009622B6"/>
     <w:rPr>
       <w:rFonts w:asciiTheme="majorHAnsi" w:eastAsiaTheme="majorEastAsia" w:hAnsiTheme="majorHAnsi" w:cstheme="majorBidi"/>
       <w:color w:val="0F4761" w:themeColor="accent1" w:themeShade="BF"/>
@@ -4256,7 +4241,7 @@
     <w:basedOn w:val="DefaultParagraphFont"/>
     <w:link w:val="Heading2"/>
     <w:uiPriority w:val="9"/>
-    <w:rsid w:val="00705126"/>
+    <w:rsid w:val="009622B6"/>
     <w:rPr>
       <w:rFonts w:asciiTheme="majorHAnsi" w:eastAsiaTheme="majorEastAsia" w:hAnsiTheme="majorHAnsi" w:cstheme="majorBidi"/>
       <w:color w:val="0F4761" w:themeColor="accent1" w:themeShade="BF"/>
@@ -4269,7 +4254,7 @@
     <w:basedOn w:val="DefaultParagraphFont"/>
     <w:link w:val="Heading3"/>
     <w:uiPriority w:val="9"/>
-    <w:rsid w:val="00705126"/>
+    <w:rsid w:val="009622B6"/>
     <w:rPr>
       <w:rFonts w:eastAsiaTheme="majorEastAsia" w:cstheme="majorBidi"/>
       <w:color w:val="0F4761" w:themeColor="accent1" w:themeShade="BF"/>
@@ -4283,7 +4268,7 @@
     <w:link w:val="Heading4"/>
     <w:uiPriority w:val="9"/>
     <w:semiHidden/>
-    <w:rsid w:val="00705126"/>
+    <w:rsid w:val="009622B6"/>
     <w:rPr>
       <w:rFonts w:eastAsiaTheme="majorEastAsia" w:cstheme="majorBidi"/>
       <w:i/>
@@ -4297,7 +4282,7 @@
     <w:link w:val="Heading5"/>
     <w:uiPriority w:val="9"/>
     <w:semiHidden/>
-    <w:rsid w:val="00705126"/>
+    <w:rsid w:val="009622B6"/>
     <w:rPr>
       <w:rFonts w:eastAsiaTheme="majorEastAsia" w:cstheme="majorBidi"/>
       <w:color w:val="0F4761" w:themeColor="accent1" w:themeShade="BF"/>
@@ -4309,7 +4294,7 @@
     <w:link w:val="Heading6"/>
     <w:uiPriority w:val="9"/>
     <w:semiHidden/>
-    <w:rsid w:val="00705126"/>
+    <w:rsid w:val="009622B6"/>
     <w:rPr>
       <w:rFonts w:eastAsiaTheme="majorEastAsia" w:cstheme="majorBidi"/>
       <w:i/>
@@ -4323,7 +4308,7 @@
     <w:link w:val="Heading7"/>
     <w:uiPriority w:val="9"/>
     <w:semiHidden/>
-    <w:rsid w:val="00705126"/>
+    <w:rsid w:val="009622B6"/>
     <w:rPr>
       <w:rFonts w:eastAsiaTheme="majorEastAsia" w:cstheme="majorBidi"/>
       <w:color w:val="595959" w:themeColor="text1" w:themeTint="A6"/>
@@ -4335,7 +4320,7 @@
     <w:link w:val="Heading8"/>
     <w:uiPriority w:val="9"/>
     <w:semiHidden/>
-    <w:rsid w:val="00705126"/>
+    <w:rsid w:val="009622B6"/>
     <w:rPr>
       <w:rFonts w:eastAsiaTheme="majorEastAsia" w:cstheme="majorBidi"/>
       <w:i/>
@@ -4349,7 +4334,7 @@
     <w:link w:val="Heading9"/>
     <w:uiPriority w:val="9"/>
     <w:semiHidden/>
-    <w:rsid w:val="00705126"/>
+    <w:rsid w:val="009622B6"/>
     <w:rPr>
       <w:rFonts w:eastAsiaTheme="majorEastAsia" w:cstheme="majorBidi"/>
       <w:color w:val="272727" w:themeColor="text1" w:themeTint="D8"/>
@@ -4362,7 +4347,7 @@
     <w:link w:val="TitleChar"/>
     <w:uiPriority w:val="10"/>
     <w:qFormat/>
-    <w:rsid w:val="00705126"/>
+    <w:rsid w:val="009622B6"/>
     <w:pPr>
       <w:spacing w:after="80" w:line="240" w:lineRule="auto"/>
       <w:contextualSpacing/>
@@ -4380,7 +4365,7 @@
     <w:basedOn w:val="DefaultParagraphFont"/>
     <w:link w:val="Title"/>
     <w:uiPriority w:val="10"/>
-    <w:rsid w:val="00705126"/>
+    <w:rsid w:val="009622B6"/>
     <w:rPr>
       <w:rFonts w:asciiTheme="majorHAnsi" w:eastAsiaTheme="majorEastAsia" w:hAnsiTheme="majorHAnsi" w:cstheme="majorBidi"/>
       <w:spacing w:val="-10"/>
@@ -4396,7 +4381,7 @@
     <w:link w:val="SubtitleChar"/>
     <w:uiPriority w:val="11"/>
     <w:qFormat/>
-    <w:rsid w:val="00705126"/>
+    <w:rsid w:val="009622B6"/>
     <w:pPr>
       <w:numPr>
         <w:ilvl w:val="1"/>
@@ -4415,7 +4400,7 @@
     <w:basedOn w:val="DefaultParagraphFont"/>
     <w:link w:val="Subtitle"/>
     <w:uiPriority w:val="11"/>
-    <w:rsid w:val="00705126"/>
+    <w:rsid w:val="009622B6"/>
     <w:rPr>
       <w:rFonts w:eastAsiaTheme="majorEastAsia" w:cstheme="majorBidi"/>
       <w:color w:val="595959" w:themeColor="text1" w:themeTint="A6"/>
@@ -4431,7 +4416,7 @@
     <w:link w:val="QuoteChar"/>
     <w:uiPriority w:val="29"/>
     <w:qFormat/>
-    <w:rsid w:val="00705126"/>
+    <w:rsid w:val="009622B6"/>
     <w:pPr>
       <w:spacing w:before="160"/>
       <w:jc w:val="center"/>
@@ -4447,7 +4432,7 @@
     <w:basedOn w:val="DefaultParagraphFont"/>
     <w:link w:val="Quote"/>
     <w:uiPriority w:val="29"/>
-    <w:rsid w:val="00705126"/>
+    <w:rsid w:val="009622B6"/>
     <w:rPr>
       <w:i/>
       <w:iCs/>
@@ -4459,7 +4444,7 @@
     <w:basedOn w:val="Normal"/>
     <w:uiPriority w:val="34"/>
     <w:qFormat/>
-    <w:rsid w:val="00705126"/>
+    <w:rsid w:val="009622B6"/>
     <w:pPr>
       <w:ind w:left="720"/>
       <w:contextualSpacing/>
@@ -4470,7 +4455,7 @@
     <w:basedOn w:val="DefaultParagraphFont"/>
     <w:uiPriority w:val="21"/>
     <w:qFormat/>
-    <w:rsid w:val="00705126"/>
+    <w:rsid w:val="009622B6"/>
     <w:rPr>
       <w:i/>
       <w:iCs/>
@@ -4484,7 +4469,7 @@
     <w:link w:val="IntenseQuoteChar"/>
     <w:uiPriority w:val="30"/>
     <w:qFormat/>
-    <w:rsid w:val="00705126"/>
+    <w:rsid w:val="009622B6"/>
     <w:pPr>
       <w:pBdr>
         <w:top w:val="single" w:sz="4" w:space="10" w:color="0F4761" w:themeColor="accent1" w:themeShade="BF"/>
@@ -4505,7 +4490,7 @@
     <w:basedOn w:val="DefaultParagraphFont"/>
     <w:link w:val="IntenseQuote"/>
     <w:uiPriority w:val="30"/>
-    <w:rsid w:val="00705126"/>
+    <w:rsid w:val="009622B6"/>
     <w:rPr>
       <w:i/>
       <w:iCs/>
@@ -4517,7 +4502,7 @@
     <w:basedOn w:val="DefaultParagraphFont"/>
     <w:uiPriority w:val="32"/>
     <w:qFormat/>
-    <w:rsid w:val="00705126"/>
+    <w:rsid w:val="009622B6"/>
     <w:rPr>
       <w:b/>
       <w:bCs/>
@@ -4528,7 +4513,7 @@
   </w:style>
   <w:style w:type="table" w:customStyle="1" w:styleId="TableGrid">
     <w:name w:val="TableGrid"/>
-    <w:rsid w:val="00705126"/>
+    <w:rsid w:val="009622B6"/>
     <w:pPr>
       <w:spacing w:after="0" w:line="240" w:lineRule="auto"/>
     </w:pPr>
@@ -4551,7 +4536,7 @@
     <w:autoRedefine/>
     <w:uiPriority w:val="39"/>
     <w:unhideWhenUsed/>
-    <w:rsid w:val="00705126"/>
+    <w:rsid w:val="009622B6"/>
     <w:pPr>
       <w:spacing w:after="100"/>
     </w:pPr>
@@ -4563,7 +4548,7 @@
     <w:autoRedefine/>
     <w:uiPriority w:val="39"/>
     <w:unhideWhenUsed/>
-    <w:rsid w:val="00705126"/>
+    <w:rsid w:val="009622B6"/>
     <w:pPr>
       <w:spacing w:after="100"/>
       <w:ind w:left="240"/>
@@ -4576,7 +4561,7 @@
     <w:autoRedefine/>
     <w:uiPriority w:val="39"/>
     <w:unhideWhenUsed/>
-    <w:rsid w:val="00705126"/>
+    <w:rsid w:val="009622B6"/>
     <w:pPr>
       <w:spacing w:after="100"/>
       <w:ind w:left="480"/>

</xml_diff>